<commit_message>
Fix eliminasi tanda tanya TTE watermark dan standarisasi istilah baku KBBI
</commit_message>
<xml_diff>
--- a/DOKUMENTASI_SISTEM_TRISULA_TNI_AD.docx
+++ b/DOKUMENTASI_SISTEM_TRISULA_TNI_AD.docx
@@ -1,6 +1,6 @@
 
 <file path=word/document.xml><?xml version="1.0" encoding="UTF-8" standalone="yes"?>
-<w:document xmlns:ve="http://schemas.openxmlformats.org/markup-compatibility/2006" xmlns:o="urn:schemas-microsoft-com:office:office" xmlns:r="http://schemas.openxmlformats.org/officeDocument/2006/relationships" xmlns:m="http://schemas.openxmlformats.org/officeDocument/2006/math" xmlns:v="urn:schemas-microsoft-com:vml" xmlns:wp="http://schemas.openxmlformats.org/drawingml/2006/wordprocessingDrawing" xmlns:w10="urn:schemas-microsoft-com:office:word" xmlns:w="http://schemas.openxmlformats.org/wordprocessingml/2006/main" xmlns:wne="http://schemas.microsoft.com/office/word/2006/wordml"><w:body><w:p><w:pPr><w:jc w:val="center"/><w:spacing w:after="60"/></w:pPr><w:r><w:rPr><w:rFonts w:ascii="Times New Roman" w:hAnsi="Times New Roman" w:eastAsia="Times New Roman" w:cs="Times New Roman"/><w:sz w:val="24"/><w:szCs w:val="24"/><w:b w:val="1"/><w:bCs w:val="1"/></w:rPr><w:t xml:space="preserve">MARKAS BESAR TNI ANGKATAN DARAT</w:t></w:r></w:p><w:p><w:pPr><w:jc w:val="center"/><w:spacing w:after="60"/></w:pPr><w:r><w:rPr><w:rFonts w:ascii="Times New Roman" w:hAnsi="Times New Roman" w:eastAsia="Times New Roman" w:cs="Times New Roman"/><w:sz w:val="24"/><w:szCs w:val="24"/><w:b w:val="1"/><w:bCs w:val="1"/></w:rPr><w:t xml:space="preserve">DINAS INFORMASI DAN PENGOLAHAN DATA</w:t></w:r></w:p><w:p/><w:p/><w:p><w:pPr><w:jc w:val="center"/></w:pPr><w:r><w:pict><v:shape type="#_x0000_t75" stroked="f" style="width:110pt; height:110pt; margin-left:0pt; margin-top:10pt; mso-position-horizontal:left; mso-position-vertical:top; mso-position-horizontal-relative:char; mso-position-vertical-relative:line;"><w10:wrap type="inline"/><v:imagedata r:id="rId7" o:title=""/></v:shape></w:pict></w:r></w:p><w:p/><w:p/><w:p><w:pPr><w:jc w:val="center"/><w:spacing w:after="60"/></w:pPr><w:r><w:rPr><w:rFonts w:ascii="Times New Roman" w:hAnsi="Times New Roman" w:eastAsia="Times New Roman" w:cs="Times New Roman"/><w:sz w:val="30"/><w:szCs w:val="30"/><w:b w:val="1"/><w:bCs w:val="1"/></w:rPr><w:t xml:space="preserve">DOKUMENTASI SISTEM PROGRAM APLIKASI</w:t></w:r></w:p><w:p/><w:p><w:pPr><w:jc w:val="center"/><w:spacing w:after="60"/></w:pPr><w:r><w:rPr><w:rFonts w:ascii="Times New Roman" w:hAnsi="Times New Roman" w:eastAsia="Times New Roman" w:cs="Times New Roman"/><w:color w:val="224222"/><w:sz w:val="40"/><w:szCs w:val="40"/><w:b w:val="1"/><w:bCs w:val="1"/></w:rPr><w:t xml:space="preserve">TRISULA TNI AD</w:t></w:r></w:p><w:p><w:pPr><w:jc w:val="center"/><w:spacing w:after="60"/></w:pPr><w:r><w:rPr><w:rFonts w:ascii="Times New Roman" w:hAnsi="Times New Roman" w:eastAsia="Times New Roman" w:cs="Times New Roman"/><w:sz w:val="24"/><w:szCs w:val="24"/><w:b w:val="1"/><w:bCs w:val="1"/><w:i w:val="1"/><w:iCs w:val="1"/></w:rPr><w:t xml:space="preserve">(TATA KELOLA REKAM INFORMASI, SISTEMATIKA, & UNDUHAN LENGKAP ARSIP)</w:t></w:r></w:p><w:p/><w:p><w:pPr><w:jc w:val="center"/><w:spacing w:after="60"/></w:pPr><w:r><w:rPr><w:rFonts w:ascii="Times New Roman" w:hAnsi="Times New Roman" w:eastAsia="Times New Roman" w:cs="Times New Roman"/><w:sz w:val="22"/><w:szCs w:val="22"/><w:i w:val="1"/><w:iCs w:val="1"/></w:rPr><w:t xml:space="preserve">Sistem Dosir Elektronik, Digitalisasi 33 Berkas Baku Induk, Verifikasi Berjenjang, dan Otentikasi Tanda Tangan Elektronik (TTE) Personel Militer & PNS TNI AD</w:t></w:r></w:p><w:p/><w:p/><w:p/><w:p/><w:p><w:pPr><w:jc w:val="center"/><w:spacing w:after="60"/></w:pPr><w:r><w:rPr><w:rFonts w:ascii="Times New Roman" w:hAnsi="Times New Roman" w:eastAsia="Times New Roman" w:cs="Times New Roman"/><w:sz w:val="22"/><w:szCs w:val="22"/></w:rPr><w:t xml:space="preserve">Disusun Sebagai Dokumentasi Teknis dan Operasional Pembinaan Sistem Informasi TNI AD</w:t></w:r></w:p><w:p><w:pPr><w:jc w:val="center"/><w:spacing w:after="60"/></w:pPr><w:r><w:rPr><w:rFonts w:ascii="Times New Roman" w:hAnsi="Times New Roman" w:eastAsia="Times New Roman" w:cs="Times New Roman"/><w:sz w:val="21"/><w:szCs w:val="21"/><w:b w:val="1"/><w:bCs w:val="1"/></w:rPr><w:t xml:space="preserve">Berdasarkan Naskah Sekolah Kadisinfolahtad Nomor: 61 - A – 009 (KEP/23/IV/2022)</w:t></w:r></w:p><w:p/><w:p/><w:p/><w:p><w:pPr><w:jc w:val="center"/><w:spacing w:after="60"/></w:pPr><w:r><w:rPr><w:rFonts w:ascii="Times New Roman" w:hAnsi="Times New Roman" w:eastAsia="Times New Roman" w:cs="Times New Roman"/><w:sz w:val="23"/><w:szCs w:val="23"/><w:b w:val="1"/><w:bCs w:val="1"/></w:rPr><w:t xml:space="preserve">Disusun Oleh :</w:t></w:r></w:p><w:p><w:pPr><w:jc w:val="center"/><w:spacing w:after="60"/></w:pPr><w:r><w:rPr><w:rFonts w:ascii="Times New Roman" w:hAnsi="Times New Roman" w:eastAsia="Times New Roman" w:cs="Times New Roman"/><w:sz w:val="24"/><w:szCs w:val="24"/><w:b w:val="1"/><w:bCs w:val="1"/></w:rPr><w:t xml:space="preserve">LETDA CZI FRIS WARDANI</w:t></w:r></w:p><w:p><w:pPr><w:jc w:val="center"/><w:spacing w:after="60"/></w:pPr><w:r><w:rPr><w:rFonts w:ascii="Times New Roman" w:hAnsi="Times New Roman" w:eastAsia="Times New Roman" w:cs="Times New Roman"/><w:sz w:val="23"/><w:szCs w:val="23"/><w:i w:val="1"/><w:iCs w:val="1"/></w:rPr><w:t xml:space="preserve">Perwira Pertama Korps Zeni TNI Angkatan Darat</w:t></w:r></w:p><w:p/><w:p/><w:p><w:pPr><w:jc w:val="center"/><w:spacing w:after="60"/></w:pPr><w:r><w:rPr><w:rFonts w:ascii="Times New Roman" w:hAnsi="Times New Roman" w:eastAsia="Times New Roman" w:cs="Times New Roman"/><w:sz w:val="23"/><w:szCs w:val="23"/><w:b w:val="1"/><w:bCs w:val="1"/></w:rPr><w:t xml:space="preserve">JAKARTA</w:t></w:r></w:p><w:p><w:pPr><w:jc w:val="center"/><w:spacing w:after="60"/></w:pPr><w:r><w:rPr><w:rFonts w:ascii="Times New Roman" w:hAnsi="Times New Roman" w:eastAsia="Times New Roman" w:cs="Times New Roman"/><w:sz w:val="23"/><w:szCs w:val="23"/><w:b w:val="1"/><w:bCs w:val="1"/></w:rPr><w:t xml:space="preserve">2026</w:t></w:r></w:p><w:p><w:pPr><w:sectPr><w:headerReference w:type="default" r:id="rId8"/><w:footerReference w:type="default" r:id="rId9"/><w:pgSz w:orient="portrait" w:w="11905.511811023622" w:h="16837.79527559055"/><w:pgMar w:top="1133.8582677165352" w:right="1133.8582677165352" w:bottom="1133.8582677165352" w:left="1700.787401574803" w:header="720" w:footer="720" w:gutter="0"/><w:cols w:num="1" w:space="720"/></w:sectPr></w:pPr></w:p><w:p><w:pPr><w:jc w:val="center"/><w:spacing w:after="60"/></w:pPr><w:r><w:rPr><w:rFonts w:ascii="Times New Roman" w:hAnsi="Times New Roman" w:eastAsia="Times New Roman" w:cs="Times New Roman"/><w:sz w:val="26"/><w:szCs w:val="26"/><w:b w:val="1"/><w:bCs w:val="1"/></w:rPr><w:t xml:space="preserve">LEMBAR DOKUMENTASI PROGRAM</w:t></w:r></w:p><w:p><w:pPr><w:jc w:val="center"/><w:spacing w:after="60"/></w:pPr><w:r><w:rPr><w:rFonts w:ascii="Times New Roman" w:hAnsi="Times New Roman" w:eastAsia="Times New Roman" w:cs="Times New Roman"/><w:sz w:val="23"/><w:szCs w:val="23"/><w:i w:val="1"/><w:iCs w:val="1"/></w:rPr><w:t xml:space="preserve">Format Standar Naskah Sekolah Disinfolahtad (Gambar - 1)</w:t></w:r></w:p><w:p/><w:tbl><w:tblGrid><w:gridCol w:w="9200" w:type="dxa"/></w:tblGrid><w:tblPr><w:tblStyle w:val="BoxTable"/></w:tblPr><w:tr><w:trPr/><w:tc><w:tcPr><w:tcW w:w="9200" w:type="dxa"/><w:noWrap/></w:tcPr><w:p><w:pPr><w:jc w:val="center"/><w:spacing w:after="60"/></w:pPr><w:r><w:rPr><w:rFonts w:ascii="Times New Roman" w:hAnsi="Times New Roman" w:eastAsia="Times New Roman" w:cs="Times New Roman"/><w:sz w:val="26"/><w:szCs w:val="26"/><w:b w:val="1"/><w:bCs w:val="1"/></w:rPr><w:t xml:space="preserve">DOKUMENTASI PROGRAM</w:t></w:r></w:p><w:p/><w:tbl><w:tblGrid><w:gridCol w:w="2200" w:type="dxa"/><w:gridCol w:w="250" w:type="dxa"/><w:gridCol w:w="6400" w:type="dxa"/></w:tblGrid><w:tblPr><w:jc w:val="center"/><w:tblW w:w="0" w:type="auto"/><w:tblLayout w:type="autofit"/></w:tblPr><w:tr><w:trPr/><w:tc><w:tcPr><w:tcW w:w="2200" w:type="dxa"/><w:noWrap/></w:tcPr><w:p><w:pPr><w:jc w:val="start"/><w:spacing w:after="60"/></w:pPr><w:r><w:rPr><w:rFonts w:ascii="Times New Roman" w:hAnsi="Times New Roman" w:eastAsia="Times New Roman" w:cs="Times New Roman"/><w:sz w:val="23"/><w:szCs w:val="23"/><w:b w:val="1"/><w:bCs w:val="1"/></w:rPr><w:t xml:space="preserve">NAMA APLIKASI</w:t></w:r></w:p></w:tc><w:tc><w:tcPr><w:tcW w:w="250" w:type="dxa"/><w:noWrap/></w:tcPr><w:p><w:pPr><w:jc w:val="center"/><w:spacing w:after="60"/></w:pPr><w:r><w:rPr><w:rFonts w:ascii="Times New Roman" w:hAnsi="Times New Roman" w:eastAsia="Times New Roman" w:cs="Times New Roman"/><w:sz w:val="23"/><w:szCs w:val="23"/><w:b w:val="1"/><w:bCs w:val="1"/></w:rPr><w:t xml:space="preserve">:</w:t></w:r></w:p></w:tc><w:tc><w:tcPr><w:tcW w:w="6400" w:type="dxa"/><w:noWrap/></w:tcPr><w:p><w:pPr><w:jc w:val="both"/><w:spacing w:after="80" w:line="276" w:lineRule="auto"/></w:pPr><w:r><w:rPr><w:rFonts w:ascii="Times New Roman" w:hAnsi="Times New Roman" w:eastAsia="Times New Roman" w:cs="Times New Roman"/><w:sz w:val="23"/><w:szCs w:val="23"/></w:rPr><w:t xml:space="preserve">TRISULA TNI AD</w:t></w:r></w:p></w:tc></w:tr><w:tr><w:trPr/><w:tc><w:tcPr><w:tcW w:w="2200" w:type="dxa"/><w:noWrap/></w:tcPr><w:p><w:pPr><w:jc w:val="start"/><w:spacing w:after="60"/></w:pPr><w:r><w:rPr><w:rFonts w:ascii="Times New Roman" w:hAnsi="Times New Roman" w:eastAsia="Times New Roman" w:cs="Times New Roman"/><w:sz w:val="23"/><w:szCs w:val="23"/><w:b w:val="1"/><w:bCs w:val="1"/></w:rPr><w:t xml:space="preserve">NAMA PROGRAM</w:t></w:r></w:p></w:tc><w:tc><w:tcPr><w:tcW w:w="250" w:type="dxa"/><w:noWrap/></w:tcPr><w:p><w:pPr><w:jc w:val="center"/><w:spacing w:after="60"/></w:pPr><w:r><w:rPr><w:rFonts w:ascii="Times New Roman" w:hAnsi="Times New Roman" w:eastAsia="Times New Roman" w:cs="Times New Roman"/><w:sz w:val="23"/><w:szCs w:val="23"/><w:b w:val="1"/><w:bCs w:val="1"/></w:rPr><w:t xml:space="preserve">:</w:t></w:r></w:p></w:tc><w:tc><w:tcPr><w:tcW w:w="6400" w:type="dxa"/><w:noWrap/></w:tcPr><w:p><w:pPr><w:jc w:val="both"/><w:spacing w:after="80" w:line="276" w:lineRule="auto"/></w:pPr><w:r><w:rPr><w:rFonts w:ascii="Times New Roman" w:hAnsi="Times New Roman" w:eastAsia="Times New Roman" w:cs="Times New Roman"/><w:sz w:val="23"/><w:szCs w:val="23"/></w:rPr><w:t xml:space="preserve">SISTEM DOSIR ELEKTRONIK & VERIFIKASI TTE PERSONEL</w:t></w:r></w:p></w:tc></w:tr><w:tr><w:trPr/><w:tc><w:tcPr><w:tcW w:w="2200" w:type="dxa"/><w:noWrap/></w:tcPr><w:p><w:pPr><w:jc w:val="start"/><w:spacing w:after="60"/></w:pPr><w:r><w:rPr><w:rFonts w:ascii="Times New Roman" w:hAnsi="Times New Roman" w:eastAsia="Times New Roman" w:cs="Times New Roman"/><w:sz w:val="23"/><w:szCs w:val="23"/><w:b w:val="1"/><w:bCs w:val="1"/></w:rPr><w:t xml:space="preserve">FUNGSI PROGRAM</w:t></w:r></w:p></w:tc><w:tc><w:tcPr><w:tcW w:w="250" w:type="dxa"/><w:noWrap/></w:tcPr><w:p><w:pPr><w:jc w:val="center"/><w:spacing w:after="60"/></w:pPr><w:r><w:rPr><w:rFonts w:ascii="Times New Roman" w:hAnsi="Times New Roman" w:eastAsia="Times New Roman" w:cs="Times New Roman"/><w:sz w:val="23"/><w:szCs w:val="23"/><w:b w:val="1"/><w:bCs w:val="1"/></w:rPr><w:t xml:space="preserve">:</w:t></w:r></w:p></w:tc><w:tc><w:tcPr><w:tcW w:w="6400" w:type="dxa"/><w:noWrap/></w:tcPr><w:p><w:pPr><w:jc w:val="both"/><w:spacing w:after="80" w:line="276" w:lineRule="auto"/></w:pPr><w:r><w:rPr><w:rFonts w:ascii="Times New Roman" w:hAnsi="Times New Roman" w:eastAsia="Times New Roman" w:cs="Times New Roman"/><w:sz w:val="23"/><w:szCs w:val="23"/></w:rPr><w:t xml:space="preserve">Tata Kelola dan Digitalisasi 33 Jenis Dosir Baku, Verifikasi Dokumen Berjenjang, Pengesahan Tanda Tangan Elektronik (TTE) Ber-QR Code, Pemantauan Kelengkapan Dosir, Deteksi Masa Jabatan > 2 Tahun, dan Proyeksi Batas Usia Pensiun Prajurit & PNS TNI AD.</w:t></w:r></w:p></w:tc></w:tr><w:tr><w:trPr/><w:tc><w:tcPr><w:tcW w:w="2200" w:type="dxa"/><w:noWrap/></w:tcPr><w:p><w:pPr><w:jc w:val="start"/><w:spacing w:after="60"/></w:pPr><w:r><w:rPr><w:rFonts w:ascii="Times New Roman" w:hAnsi="Times New Roman" w:eastAsia="Times New Roman" w:cs="Times New Roman"/><w:sz w:val="23"/><w:szCs w:val="23"/><w:b w:val="1"/><w:bCs w:val="1"/></w:rPr><w:t xml:space="preserve">NAMA PEMROGRAM</w:t></w:r></w:p></w:tc><w:tc><w:tcPr><w:tcW w:w="250" w:type="dxa"/><w:noWrap/></w:tcPr><w:p><w:pPr><w:jc w:val="center"/><w:spacing w:after="60"/></w:pPr><w:r><w:rPr><w:rFonts w:ascii="Times New Roman" w:hAnsi="Times New Roman" w:eastAsia="Times New Roman" w:cs="Times New Roman"/><w:sz w:val="23"/><w:szCs w:val="23"/><w:b w:val="1"/><w:bCs w:val="1"/></w:rPr><w:t xml:space="preserve">:</w:t></w:r></w:p></w:tc><w:tc><w:tcPr><w:tcW w:w="6400" w:type="dxa"/><w:noWrap/></w:tcPr><w:p><w:pPr><w:jc w:val="both"/><w:spacing w:after="80" w:line="276" w:lineRule="auto"/></w:pPr><w:r><w:rPr><w:rFonts w:ascii="Times New Roman" w:hAnsi="Times New Roman" w:eastAsia="Times New Roman" w:cs="Times New Roman"/><w:sz w:val="23"/><w:szCs w:val="23"/></w:rPr><w:t xml:space="preserve">Letda Czi Fris Wardani</w:t></w:r></w:p></w:tc></w:tr><w:tr><w:trPr/><w:tc><w:tcPr><w:tcW w:w="2200" w:type="dxa"/><w:noWrap/></w:tcPr><w:p><w:pPr><w:jc w:val="start"/><w:spacing w:after="60"/></w:pPr><w:r><w:rPr><w:rFonts w:ascii="Times New Roman" w:hAnsi="Times New Roman" w:eastAsia="Times New Roman" w:cs="Times New Roman"/><w:sz w:val="23"/><w:szCs w:val="23"/><w:b w:val="1"/><w:bCs w:val="1"/></w:rPr><w:t xml:space="preserve">BAHASA PROGRAM</w:t></w:r></w:p></w:tc><w:tc><w:tcPr><w:tcW w:w="250" w:type="dxa"/><w:noWrap/></w:tcPr><w:p><w:pPr><w:jc w:val="center"/><w:spacing w:after="60"/></w:pPr><w:r><w:rPr><w:rFonts w:ascii="Times New Roman" w:hAnsi="Times New Roman" w:eastAsia="Times New Roman" w:cs="Times New Roman"/><w:sz w:val="23"/><w:szCs w:val="23"/><w:b w:val="1"/><w:bCs w:val="1"/></w:rPr><w:t xml:space="preserve">:</w:t></w:r></w:p></w:tc><w:tc><w:tcPr><w:tcW w:w="6400" w:type="dxa"/><w:noWrap/></w:tcPr><w:p><w:pPr><w:jc w:val="both"/><w:spacing w:after="80" w:line="276" w:lineRule="auto"/></w:pPr><w:r><w:rPr><w:rFonts w:ascii="Times New Roman" w:hAnsi="Times New Roman" w:eastAsia="Times New Roman" w:cs="Times New Roman"/><w:sz w:val="23"/><w:szCs w:val="23"/></w:rPr><w:t xml:space="preserve">PHP 8.3 (Native PDO), JavaScript (ES6 / jsPDF), HTML5, CSS3, MySQL</w:t></w:r></w:p></w:tc></w:tr><w:tr><w:trPr/><w:tc><w:tcPr><w:tcW w:w="2200" w:type="dxa"/><w:noWrap/></w:tcPr><w:p><w:pPr><w:jc w:val="start"/><w:spacing w:after="60"/></w:pPr><w:r><w:rPr><w:rFonts w:ascii="Times New Roman" w:hAnsi="Times New Roman" w:eastAsia="Times New Roman" w:cs="Times New Roman"/><w:sz w:val="23"/><w:szCs w:val="23"/><w:b w:val="1"/><w:bCs w:val="1"/></w:rPr><w:t xml:space="preserve">LOKASI PROGRAM</w:t></w:r></w:p></w:tc><w:tc><w:tcPr><w:tcW w:w="250" w:type="dxa"/><w:noWrap/></w:tcPr><w:p><w:pPr><w:jc w:val="center"/><w:spacing w:after="60"/></w:pPr><w:r><w:rPr><w:rFonts w:ascii="Times New Roman" w:hAnsi="Times New Roman" w:eastAsia="Times New Roman" w:cs="Times New Roman"/><w:sz w:val="23"/><w:szCs w:val="23"/><w:b w:val="1"/><w:bCs w:val="1"/></w:rPr><w:t xml:space="preserve">:</w:t></w:r></w:p></w:tc><w:tc><w:tcPr><w:tcW w:w="6400" w:type="dxa"/><w:noWrap/></w:tcPr><w:p><w:pPr><w:jc w:val="both"/><w:spacing w:after="80" w:line="276" w:lineRule="auto"/></w:pPr><w:r><w:rPr><w:rFonts w:ascii="Times New Roman" w:hAnsi="Times New Roman" w:eastAsia="Times New Roman" w:cs="Times New Roman"/><w:sz w:val="23"/><w:szCs w:val="23"/></w:rPr><w:t xml:space="preserve">d:\xampp\htdocs\edosir-tni</w:t></w:r></w:p></w:tc></w:tr><w:tr><w:trPr/><w:tc><w:tcPr><w:tcW w:w="2200" w:type="dxa"/><w:noWrap/></w:tcPr><w:p><w:pPr><w:jc w:val="start"/><w:spacing w:after="60"/></w:pPr><w:r><w:rPr><w:rFonts w:ascii="Times New Roman" w:hAnsi="Times New Roman" w:eastAsia="Times New Roman" w:cs="Times New Roman"/><w:sz w:val="23"/><w:szCs w:val="23"/><w:b w:val="1"/><w:bCs w:val="1"/></w:rPr><w:t xml:space="preserve">TANGGAL SELESAI</w:t></w:r></w:p></w:tc><w:tc><w:tcPr><w:tcW w:w="250" w:type="dxa"/><w:noWrap/></w:tcPr><w:p><w:pPr><w:jc w:val="center"/><w:spacing w:after="60"/></w:pPr><w:r><w:rPr><w:rFonts w:ascii="Times New Roman" w:hAnsi="Times New Roman" w:eastAsia="Times New Roman" w:cs="Times New Roman"/><w:sz w:val="23"/><w:szCs w:val="23"/><w:b w:val="1"/><w:bCs w:val="1"/></w:rPr><w:t xml:space="preserve">:</w:t></w:r></w:p></w:tc><w:tc><w:tcPr><w:tcW w:w="6400" w:type="dxa"/><w:noWrap/></w:tcPr><w:p><w:pPr><w:jc w:val="both"/><w:spacing w:after="80" w:line="276" w:lineRule="auto"/></w:pPr><w:r><w:rPr><w:rFonts w:ascii="Times New Roman" w:hAnsi="Times New Roman" w:eastAsia="Times New Roman" w:cs="Times New Roman"/><w:sz w:val="23"/><w:szCs w:val="23"/></w:rPr><w:t xml:space="preserve">21 September 2026</w:t></w:r></w:p></w:tc></w:tr></w:tbl><w:p/><w:p><w:pPr><w:jc w:val="start"/><w:spacing w:after="60"/></w:pPr><w:r><w:rPr><w:rFonts w:ascii="Times New Roman" w:hAnsi="Times New Roman" w:eastAsia="Times New Roman" w:cs="Times New Roman"/><w:sz w:val="23"/><w:szCs w:val="23"/><w:b w:val="1"/><w:bCs w:val="1"/></w:rPr><w:t xml:space="preserve">ISI DOKUMENTASI :</w:t></w:r></w:p><w:p><w:pPr><w:jc w:val="start"/><w:spacing w:after="60"/></w:pPr><w:r><w:rPr><w:rFonts w:ascii="Times New Roman" w:hAnsi="Times New Roman" w:eastAsia="Times New Roman" w:cs="Times New Roman"/><w:sz w:val="23"/><w:szCs w:val="23"/><w:b w:val="1"/><w:bCs w:val="1"/></w:rPr><w:t xml:space="preserve">   1. NARASI PROGRAM</w:t></w:r></w:p><w:p><w:pPr><w:jc w:val="start"/><w:spacing w:after="60"/></w:pPr><w:r><w:rPr><w:rFonts w:ascii="Times New Roman" w:hAnsi="Times New Roman" w:eastAsia="Times New Roman" w:cs="Times New Roman"/><w:sz w:val="23"/><w:szCs w:val="23"/><w:b w:val="1"/><w:bCs w:val="1"/></w:rPr><w:t xml:space="preserve">   2. DIAGRAM ARUS DATA (DFD)</w:t></w:r></w:p><w:p><w:pPr><w:jc w:val="start"/><w:spacing w:after="60"/></w:pPr><w:r><w:rPr><w:rFonts w:ascii="Times New Roman" w:hAnsi="Times New Roman" w:eastAsia="Times New Roman" w:cs="Times New Roman"/><w:sz w:val="23"/><w:szCs w:val="23"/><w:b w:val="1"/><w:bCs w:val="1"/></w:rPr><w:t xml:space="preserve">   3. DIAGRAM HUBUNGAN ENTITY (ERD)</w:t></w:r></w:p><w:p><w:pPr><w:jc w:val="start"/><w:spacing w:after="60"/></w:pPr><w:r><w:rPr><w:rFonts w:ascii="Times New Roman" w:hAnsi="Times New Roman" w:eastAsia="Times New Roman" w:cs="Times New Roman"/><w:sz w:val="23"/><w:szCs w:val="23"/><w:b w:val="1"/><w:bCs w:val="1"/></w:rPr><w:t xml:space="preserve">   4. KAMUS DATA / STRUKTUR FILE</w:t></w:r></w:p><w:p><w:pPr><w:jc w:val="start"/><w:spacing w:after="60"/></w:pPr><w:r><w:rPr><w:rFonts w:ascii="Times New Roman" w:hAnsi="Times New Roman" w:eastAsia="Times New Roman" w:cs="Times New Roman"/><w:sz w:val="23"/><w:szCs w:val="23"/><w:b w:val="1"/><w:bCs w:val="1"/></w:rPr><w:t xml:space="preserve">   5. SPESIFIKASI PROGRAM</w:t></w:r></w:p><w:p><w:pPr><w:jc w:val="start"/><w:spacing w:after="60"/></w:pPr><w:r><w:rPr><w:rFonts w:ascii="Times New Roman" w:hAnsi="Times New Roman" w:eastAsia="Times New Roman" w:cs="Times New Roman"/><w:sz w:val="23"/><w:szCs w:val="23"/><w:b w:val="1"/><w:bCs w:val="1"/></w:rPr><w:t xml:space="preserve">   6. BENTUK TAMPILAN DAN CETAKAN</w:t></w:r></w:p><w:p><w:pPr><w:jc w:val="start"/><w:spacing w:after="60"/></w:pPr><w:r><w:rPr><w:rFonts w:ascii="Times New Roman" w:hAnsi="Times New Roman" w:eastAsia="Times New Roman" w:cs="Times New Roman"/><w:sz w:val="23"/><w:szCs w:val="23"/><w:b w:val="1"/><w:bCs w:val="1"/></w:rPr><w:t xml:space="preserve">   7. LISTING PROGRAM</w:t></w:r></w:p></w:tc></w:tr></w:tbl><w:p><w:r><w:br w:type="page"/></w:r></w:p><w:p><w:pPr><w:jc w:val="center"/><w:spacing w:after="60"/></w:pPr><w:r><w:rPr><w:rFonts w:ascii="Times New Roman" w:hAnsi="Times New Roman" w:eastAsia="Times New Roman" w:cs="Times New Roman"/><w:sz w:val="26"/><w:szCs w:val="26"/><w:b w:val="1"/><w:bCs w:val="1"/></w:rPr><w:t xml:space="preserve">DAFTAR ISI</w:t></w:r></w:p><w:p/><w:tbl><w:tblGrid><w:gridCol w:w="1200" w:type="dxa"/><w:gridCol w:w="7000" w:type="dxa"/><w:gridCol w:w="1000" w:type="dxa"/></w:tblGrid><w:tblPr><w:jc w:val="center"/><w:tblW w:w="9200" w:type="auto"/><w:tblLayout w:type="autofit"/></w:tblPr><w:tr><w:trPr/><w:tc><w:tcPr><w:tcW w:w="1200" w:type="dxa"/><w:noWrap/></w:tcPr><w:p><w:pPr><w:jc w:val="start"/><w:spacing w:after="60"/></w:pPr><w:r><w:rPr><w:rFonts w:ascii="Times New Roman" w:hAnsi="Times New Roman" w:eastAsia="Times New Roman" w:cs="Times New Roman"/><w:sz w:val="23"/><w:szCs w:val="23"/><w:b w:val="1"/><w:bCs w:val="1"/></w:rPr><w:t xml:space="preserve">BAB I</w:t></w:r></w:p></w:tc><w:tc><w:tcPr><w:tcW w:w="7000" w:type="dxa"/><w:noWrap/></w:tcPr><w:p><w:pPr><w:jc w:val="start"/><w:spacing w:after="60"/></w:pPr><w:r><w:rPr><w:rFonts w:ascii="Times New Roman" w:hAnsi="Times New Roman" w:eastAsia="Times New Roman" w:cs="Times New Roman"/><w:sz w:val="23"/><w:szCs w:val="23"/><w:b w:val="1"/><w:bCs w:val="1"/></w:rPr><w:t xml:space="preserve">PENDAHULUAN</w:t></w:r></w:p></w:tc><w:tc><w:tcPr><w:tcW w:w="1000" w:type="dxa"/><w:noWrap/></w:tcPr><w:p><w:pPr><w:jc w:val="end"/><w:spacing w:after="60"/></w:pPr><w:r><w:rPr><w:rFonts w:ascii="Times New Roman" w:hAnsi="Times New Roman" w:eastAsia="Times New Roman" w:cs="Times New Roman"/><w:sz w:val="23"/><w:szCs w:val="23"/><w:b w:val="1"/><w:bCs w:val="1"/></w:rPr><w:t xml:space="preserve">1</w:t></w:r></w:p></w:tc></w:tr><w:tr><w:trPr/><w:tc><w:tcPr><w:tcW w:w="1200" w:type="dxa"/><w:noWrap/></w:tcPr><w:p><w:pPr><w:jc w:val="start"/><w:spacing w:after="60"/></w:pPr><w:r><w:rPr><w:rFonts w:ascii="Times New Roman" w:hAnsi="Times New Roman" w:eastAsia="Times New Roman" w:cs="Times New Roman"/><w:sz w:val="23"/><w:szCs w:val="23"/></w:rPr><w:t xml:space="preserve"></w:t></w:r></w:p></w:tc><w:tc><w:tcPr><w:tcW w:w="7000" w:type="dxa"/><w:noWrap/></w:tcPr><w:p><w:pPr><w:jc w:val="start"/><w:spacing w:after="60"/></w:pPr><w:r><w:rPr><w:rFonts w:ascii="Times New Roman" w:hAnsi="Times New Roman" w:eastAsia="Times New Roman" w:cs="Times New Roman"/><w:sz w:val="23"/><w:szCs w:val="23"/></w:rPr><w:t xml:space="preserve">1. Umum</w:t></w:r></w:p></w:tc><w:tc><w:tcPr><w:tcW w:w="1000" w:type="dxa"/><w:noWrap/></w:tcPr><w:p><w:pPr><w:jc w:val="end"/><w:spacing w:after="60"/></w:pPr><w:r><w:rPr><w:rFonts w:ascii="Times New Roman" w:hAnsi="Times New Roman" w:eastAsia="Times New Roman" w:cs="Times New Roman"/><w:sz w:val="23"/><w:szCs w:val="23"/></w:rPr><w:t xml:space="preserve">1</w:t></w:r></w:p></w:tc></w:tr><w:tr><w:trPr/><w:tc><w:tcPr><w:tcW w:w="1200" w:type="dxa"/><w:noWrap/></w:tcPr><w:p><w:pPr><w:jc w:val="start"/><w:spacing w:after="60"/></w:pPr><w:r><w:rPr><w:rFonts w:ascii="Times New Roman" w:hAnsi="Times New Roman" w:eastAsia="Times New Roman" w:cs="Times New Roman"/><w:sz w:val="23"/><w:szCs w:val="23"/></w:rPr><w:t xml:space="preserve"></w:t></w:r></w:p></w:tc><w:tc><w:tcPr><w:tcW w:w="7000" w:type="dxa"/><w:noWrap/></w:tcPr><w:p><w:pPr><w:jc w:val="start"/><w:spacing w:after="60"/></w:pPr><w:r><w:rPr><w:rFonts w:ascii="Times New Roman" w:hAnsi="Times New Roman" w:eastAsia="Times New Roman" w:cs="Times New Roman"/><w:sz w:val="23"/><w:szCs w:val="23"/></w:rPr><w:t xml:space="preserve">2. Maksud dan Tujuan</w:t></w:r></w:p></w:tc><w:tc><w:tcPr><w:tcW w:w="1000" w:type="dxa"/><w:noWrap/></w:tcPr><w:p><w:pPr><w:jc w:val="end"/><w:spacing w:after="60"/></w:pPr><w:r><w:rPr><w:rFonts w:ascii="Times New Roman" w:hAnsi="Times New Roman" w:eastAsia="Times New Roman" w:cs="Times New Roman"/><w:sz w:val="23"/><w:szCs w:val="23"/></w:rPr><w:t xml:space="preserve">1</w:t></w:r></w:p></w:tc></w:tr><w:tr><w:trPr/><w:tc><w:tcPr><w:tcW w:w="1200" w:type="dxa"/><w:noWrap/></w:tcPr><w:p><w:pPr><w:jc w:val="start"/><w:spacing w:after="60"/></w:pPr><w:r><w:rPr><w:rFonts w:ascii="Times New Roman" w:hAnsi="Times New Roman" w:eastAsia="Times New Roman" w:cs="Times New Roman"/><w:sz w:val="23"/><w:szCs w:val="23"/></w:rPr><w:t xml:space="preserve"></w:t></w:r></w:p></w:tc><w:tc><w:tcPr><w:tcW w:w="7000" w:type="dxa"/><w:noWrap/></w:tcPr><w:p><w:pPr><w:jc w:val="start"/><w:spacing w:after="60"/></w:pPr><w:r><w:rPr><w:rFonts w:ascii="Times New Roman" w:hAnsi="Times New Roman" w:eastAsia="Times New Roman" w:cs="Times New Roman"/><w:sz w:val="23"/><w:szCs w:val="23"/></w:rPr><w:t xml:space="preserve">3. Ruang Lingkup dan Tata Urut</w:t></w:r></w:p></w:tc><w:tc><w:tcPr><w:tcW w:w="1000" w:type="dxa"/><w:noWrap/></w:tcPr><w:p><w:pPr><w:jc w:val="end"/><w:spacing w:after="60"/></w:pPr><w:r><w:rPr><w:rFonts w:ascii="Times New Roman" w:hAnsi="Times New Roman" w:eastAsia="Times New Roman" w:cs="Times New Roman"/><w:sz w:val="23"/><w:szCs w:val="23"/></w:rPr><w:t xml:space="preserve">2</w:t></w:r></w:p></w:tc></w:tr><w:tr><w:trPr/><w:tc><w:tcPr><w:tcW w:w="1200" w:type="dxa"/><w:noWrap/></w:tcPr><w:p><w:pPr><w:jc w:val="start"/><w:spacing w:after="60"/></w:pPr><w:r><w:rPr><w:rFonts w:ascii="Times New Roman" w:hAnsi="Times New Roman" w:eastAsia="Times New Roman" w:cs="Times New Roman"/><w:sz w:val="23"/><w:szCs w:val="23"/></w:rPr><w:t xml:space="preserve"></w:t></w:r></w:p></w:tc><w:tc><w:tcPr><w:tcW w:w="7000" w:type="dxa"/><w:noWrap/></w:tcPr><w:p><w:pPr><w:jc w:val="start"/><w:spacing w:after="60"/></w:pPr><w:r><w:rPr><w:rFonts w:ascii="Times New Roman" w:hAnsi="Times New Roman" w:eastAsia="Times New Roman" w:cs="Times New Roman"/><w:sz w:val="23"/><w:szCs w:val="23"/></w:rPr><w:t xml:space="preserve">4. Referensi</w:t></w:r></w:p></w:tc><w:tc><w:tcPr><w:tcW w:w="1000" w:type="dxa"/><w:noWrap/></w:tcPr><w:p><w:pPr><w:jc w:val="end"/><w:spacing w:after="60"/></w:pPr><w:r><w:rPr><w:rFonts w:ascii="Times New Roman" w:hAnsi="Times New Roman" w:eastAsia="Times New Roman" w:cs="Times New Roman"/><w:sz w:val="23"/><w:szCs w:val="23"/></w:rPr><w:t xml:space="preserve">2</w:t></w:r></w:p></w:tc></w:tr><w:tr><w:trPr/><w:tc><w:tcPr><w:tcW w:w="1200" w:type="dxa"/><w:noWrap/></w:tcPr><w:p><w:pPr><w:jc w:val="start"/><w:spacing w:after="60"/></w:pPr><w:r><w:rPr><w:rFonts w:ascii="Times New Roman" w:hAnsi="Times New Roman" w:eastAsia="Times New Roman" w:cs="Times New Roman"/><w:sz w:val="23"/><w:szCs w:val="23"/></w:rPr><w:t xml:space="preserve"></w:t></w:r></w:p></w:tc><w:tc><w:tcPr><w:tcW w:w="7000" w:type="dxa"/><w:noWrap/></w:tcPr><w:p><w:pPr><w:jc w:val="start"/><w:spacing w:after="60"/></w:pPr><w:r><w:rPr><w:rFonts w:ascii="Times New Roman" w:hAnsi="Times New Roman" w:eastAsia="Times New Roman" w:cs="Times New Roman"/><w:sz w:val="23"/><w:szCs w:val="23"/></w:rPr><w:t xml:space="preserve">5. Pengertian</w:t></w:r></w:p></w:tc><w:tc><w:tcPr><w:tcW w:w="1000" w:type="dxa"/><w:noWrap/></w:tcPr><w:p><w:pPr><w:jc w:val="end"/><w:spacing w:after="60"/></w:pPr><w:r><w:rPr><w:rFonts w:ascii="Times New Roman" w:hAnsi="Times New Roman" w:eastAsia="Times New Roman" w:cs="Times New Roman"/><w:sz w:val="23"/><w:szCs w:val="23"/></w:rPr><w:t xml:space="preserve">2</w:t></w:r></w:p></w:tc></w:tr><w:tr><w:trPr/><w:tc><w:tcPr><w:tcW w:w="1200" w:type="dxa"/><w:noWrap/></w:tcPr><w:p><w:pPr><w:jc w:val="start"/><w:spacing w:after="60"/></w:pPr><w:r><w:rPr><w:rFonts w:ascii="Times New Roman" w:hAnsi="Times New Roman" w:eastAsia="Times New Roman" w:cs="Times New Roman"/><w:sz w:val="23"/><w:szCs w:val="23"/><w:b w:val="1"/><w:bCs w:val="1"/></w:rPr><w:t xml:space="preserve">BAB II</w:t></w:r></w:p></w:tc><w:tc><w:tcPr><w:tcW w:w="7000" w:type="dxa"/><w:noWrap/></w:tcPr><w:p><w:pPr><w:jc w:val="start"/><w:spacing w:after="60"/></w:pPr><w:r><w:rPr><w:rFonts w:ascii="Times New Roman" w:hAnsi="Times New Roman" w:eastAsia="Times New Roman" w:cs="Times New Roman"/><w:sz w:val="23"/><w:szCs w:val="23"/><w:b w:val="1"/><w:bCs w:val="1"/></w:rPr><w:t xml:space="preserve">MATERI DOKUMENTASI</w:t></w:r></w:p></w:tc><w:tc><w:tcPr><w:tcW w:w="1000" w:type="dxa"/><w:noWrap/></w:tcPr><w:p><w:pPr><w:jc w:val="end"/><w:spacing w:after="60"/></w:pPr><w:r><w:rPr><w:rFonts w:ascii="Times New Roman" w:hAnsi="Times New Roman" w:eastAsia="Times New Roman" w:cs="Times New Roman"/><w:sz w:val="23"/><w:szCs w:val="23"/><w:b w:val="1"/><w:bCs w:val="1"/></w:rPr><w:t xml:space="preserve">3</w:t></w:r></w:p></w:tc></w:tr><w:tr><w:trPr/><w:tc><w:tcPr><w:tcW w:w="1200" w:type="dxa"/><w:noWrap/></w:tcPr><w:p><w:pPr><w:jc w:val="start"/><w:spacing w:after="60"/></w:pPr><w:r><w:rPr><w:rFonts w:ascii="Times New Roman" w:hAnsi="Times New Roman" w:eastAsia="Times New Roman" w:cs="Times New Roman"/><w:sz w:val="23"/><w:szCs w:val="23"/></w:rPr><w:t xml:space="preserve"></w:t></w:r></w:p></w:tc><w:tc><w:tcPr><w:tcW w:w="7000" w:type="dxa"/><w:noWrap/></w:tcPr><w:p><w:pPr><w:jc w:val="start"/><w:spacing w:after="60"/></w:pPr><w:r><w:rPr><w:rFonts w:ascii="Times New Roman" w:hAnsi="Times New Roman" w:eastAsia="Times New Roman" w:cs="Times New Roman"/><w:sz w:val="23"/><w:szCs w:val="23"/></w:rPr><w:t xml:space="preserve">6. Umum</w:t></w:r></w:p></w:tc><w:tc><w:tcPr><w:tcW w:w="1000" w:type="dxa"/><w:noWrap/></w:tcPr><w:p><w:pPr><w:jc w:val="end"/><w:spacing w:after="60"/></w:pPr><w:r><w:rPr><w:rFonts w:ascii="Times New Roman" w:hAnsi="Times New Roman" w:eastAsia="Times New Roman" w:cs="Times New Roman"/><w:sz w:val="23"/><w:szCs w:val="23"/></w:rPr><w:t xml:space="preserve">3</w:t></w:r></w:p></w:tc></w:tr><w:tr><w:trPr/><w:tc><w:tcPr><w:tcW w:w="1200" w:type="dxa"/><w:noWrap/></w:tcPr><w:p><w:pPr><w:jc w:val="start"/><w:spacing w:after="60"/></w:pPr><w:r><w:rPr><w:rFonts w:ascii="Times New Roman" w:hAnsi="Times New Roman" w:eastAsia="Times New Roman" w:cs="Times New Roman"/><w:sz w:val="23"/><w:szCs w:val="23"/></w:rPr><w:t xml:space="preserve"></w:t></w:r></w:p></w:tc><w:tc><w:tcPr><w:tcW w:w="7000" w:type="dxa"/><w:noWrap/></w:tcPr><w:p><w:pPr><w:jc w:val="start"/><w:spacing w:after="60"/></w:pPr><w:r><w:rPr><w:rFonts w:ascii="Times New Roman" w:hAnsi="Times New Roman" w:eastAsia="Times New Roman" w:cs="Times New Roman"/><w:sz w:val="23"/><w:szCs w:val="23"/></w:rPr><w:t xml:space="preserve">7. Tujuan Pembuatan Dokumentasi Sistem</w:t></w:r></w:p></w:tc><w:tc><w:tcPr><w:tcW w:w="1000" w:type="dxa"/><w:noWrap/></w:tcPr><w:p><w:pPr><w:jc w:val="end"/><w:spacing w:after="60"/></w:pPr><w:r><w:rPr><w:rFonts w:ascii="Times New Roman" w:hAnsi="Times New Roman" w:eastAsia="Times New Roman" w:cs="Times New Roman"/><w:sz w:val="23"/><w:szCs w:val="23"/></w:rPr><w:t xml:space="preserve">3</w:t></w:r></w:p></w:tc></w:tr><w:tr><w:trPr/><w:tc><w:tcPr><w:tcW w:w="1200" w:type="dxa"/><w:noWrap/></w:tcPr><w:p><w:pPr><w:jc w:val="start"/><w:spacing w:after="60"/></w:pPr><w:r><w:rPr><w:rFonts w:ascii="Times New Roman" w:hAnsi="Times New Roman" w:eastAsia="Times New Roman" w:cs="Times New Roman"/><w:sz w:val="23"/><w:szCs w:val="23"/></w:rPr><w:t xml:space="preserve"></w:t></w:r></w:p></w:tc><w:tc><w:tcPr><w:tcW w:w="7000" w:type="dxa"/><w:noWrap/></w:tcPr><w:p><w:pPr><w:jc w:val="start"/><w:spacing w:after="60"/></w:pPr><w:r><w:rPr><w:rFonts w:ascii="Times New Roman" w:hAnsi="Times New Roman" w:eastAsia="Times New Roman" w:cs="Times New Roman"/><w:sz w:val="23"/><w:szCs w:val="23"/></w:rPr><w:t xml:space="preserve">8. Cara Pengisian</w:t></w:r></w:p></w:tc><w:tc><w:tcPr><w:tcW w:w="1000" w:type="dxa"/><w:noWrap/></w:tcPr><w:p><w:pPr><w:jc w:val="end"/><w:spacing w:after="60"/></w:pPr><w:r><w:rPr><w:rFonts w:ascii="Times New Roman" w:hAnsi="Times New Roman" w:eastAsia="Times New Roman" w:cs="Times New Roman"/><w:sz w:val="23"/><w:szCs w:val="23"/></w:rPr><w:t xml:space="preserve">3</w:t></w:r></w:p></w:tc></w:tr><w:tr><w:trPr/><w:tc><w:tcPr><w:tcW w:w="1200" w:type="dxa"/><w:noWrap/></w:tcPr><w:p><w:pPr><w:jc w:val="start"/><w:spacing w:after="60"/></w:pPr><w:r><w:rPr><w:rFonts w:ascii="Times New Roman" w:hAnsi="Times New Roman" w:eastAsia="Times New Roman" w:cs="Times New Roman"/><w:sz w:val="23"/><w:szCs w:val="23"/><w:b w:val="1"/><w:bCs w:val="1"/></w:rPr><w:t xml:space="preserve">BAB III</w:t></w:r></w:p></w:tc><w:tc><w:tcPr><w:tcW w:w="7000" w:type="dxa"/><w:noWrap/></w:tcPr><w:p><w:pPr><w:jc w:val="start"/><w:spacing w:after="60"/></w:pPr><w:r><w:rPr><w:rFonts w:ascii="Times New Roman" w:hAnsi="Times New Roman" w:eastAsia="Times New Roman" w:cs="Times New Roman"/><w:sz w:val="23"/><w:szCs w:val="23"/><w:b w:val="1"/><w:bCs w:val="1"/></w:rPr><w:t xml:space="preserve">PERILAKU TERHADAP DOKUMEN / KETENTUAN DOKUMEN</w:t></w:r></w:p></w:tc><w:tc><w:tcPr><w:tcW w:w="1000" w:type="dxa"/><w:noWrap/></w:tcPr><w:p><w:pPr><w:jc w:val="end"/><w:spacing w:after="60"/></w:pPr><w:r><w:rPr><w:rFonts w:ascii="Times New Roman" w:hAnsi="Times New Roman" w:eastAsia="Times New Roman" w:cs="Times New Roman"/><w:sz w:val="23"/><w:szCs w:val="23"/><w:b w:val="1"/><w:bCs w:val="1"/></w:rPr><w:t xml:space="preserve">4</w:t></w:r></w:p></w:tc></w:tr><w:tr><w:trPr/><w:tc><w:tcPr><w:tcW w:w="1200" w:type="dxa"/><w:noWrap/></w:tcPr><w:p><w:pPr><w:jc w:val="start"/><w:spacing w:after="60"/></w:pPr><w:r><w:rPr><w:rFonts w:ascii="Times New Roman" w:hAnsi="Times New Roman" w:eastAsia="Times New Roman" w:cs="Times New Roman"/><w:sz w:val="23"/><w:szCs w:val="23"/></w:rPr><w:t xml:space="preserve"></w:t></w:r></w:p></w:tc><w:tc><w:tcPr><w:tcW w:w="7000" w:type="dxa"/><w:noWrap/></w:tcPr><w:p><w:pPr><w:jc w:val="start"/><w:spacing w:after="60"/></w:pPr><w:r><w:rPr><w:rFonts w:ascii="Times New Roman" w:hAnsi="Times New Roman" w:eastAsia="Times New Roman" w:cs="Times New Roman"/><w:sz w:val="23"/><w:szCs w:val="23"/></w:rPr><w:t xml:space="preserve">9. Umum</w:t></w:r></w:p></w:tc><w:tc><w:tcPr><w:tcW w:w="1000" w:type="dxa"/><w:noWrap/></w:tcPr><w:p><w:pPr><w:jc w:val="end"/><w:spacing w:after="60"/></w:pPr><w:r><w:rPr><w:rFonts w:ascii="Times New Roman" w:hAnsi="Times New Roman" w:eastAsia="Times New Roman" w:cs="Times New Roman"/><w:sz w:val="23"/><w:szCs w:val="23"/></w:rPr><w:t xml:space="preserve">4</w:t></w:r></w:p></w:tc></w:tr><w:tr><w:trPr/><w:tc><w:tcPr><w:tcW w:w="1200" w:type="dxa"/><w:noWrap/></w:tcPr><w:p><w:pPr><w:jc w:val="start"/><w:spacing w:after="60"/></w:pPr><w:r><w:rPr><w:rFonts w:ascii="Times New Roman" w:hAnsi="Times New Roman" w:eastAsia="Times New Roman" w:cs="Times New Roman"/><w:sz w:val="23"/><w:szCs w:val="23"/></w:rPr><w:t xml:space="preserve"></w:t></w:r></w:p></w:tc><w:tc><w:tcPr><w:tcW w:w="7000" w:type="dxa"/><w:noWrap/></w:tcPr><w:p><w:pPr><w:jc w:val="start"/><w:spacing w:after="60"/></w:pPr><w:r><w:rPr><w:rFonts w:ascii="Times New Roman" w:hAnsi="Times New Roman" w:eastAsia="Times New Roman" w:cs="Times New Roman"/><w:sz w:val="23"/><w:szCs w:val="23"/></w:rPr><w:t xml:space="preserve">10. Narasi Program</w:t></w:r></w:p></w:tc><w:tc><w:tcPr><w:tcW w:w="1000" w:type="dxa"/><w:noWrap/></w:tcPr><w:p><w:pPr><w:jc w:val="end"/><w:spacing w:after="60"/></w:pPr><w:r><w:rPr><w:rFonts w:ascii="Times New Roman" w:hAnsi="Times New Roman" w:eastAsia="Times New Roman" w:cs="Times New Roman"/><w:sz w:val="23"/><w:szCs w:val="23"/></w:rPr><w:t xml:space="preserve">4</w:t></w:r></w:p></w:tc></w:tr><w:tr><w:trPr/><w:tc><w:tcPr><w:tcW w:w="1200" w:type="dxa"/><w:noWrap/></w:tcPr><w:p><w:pPr><w:jc w:val="start"/><w:spacing w:after="60"/></w:pPr><w:r><w:rPr><w:rFonts w:ascii="Times New Roman" w:hAnsi="Times New Roman" w:eastAsia="Times New Roman" w:cs="Times New Roman"/><w:sz w:val="23"/><w:szCs w:val="23"/></w:rPr><w:t xml:space="preserve"></w:t></w:r></w:p></w:tc><w:tc><w:tcPr><w:tcW w:w="7000" w:type="dxa"/><w:noWrap/></w:tcPr><w:p><w:pPr><w:jc w:val="start"/><w:spacing w:after="60"/></w:pPr><w:r><w:rPr><w:rFonts w:ascii="Times New Roman" w:hAnsi="Times New Roman" w:eastAsia="Times New Roman" w:cs="Times New Roman"/><w:sz w:val="23"/><w:szCs w:val="23"/></w:rPr><w:t xml:space="preserve">11. Diagram Arus Data (Data Flow Diagram)</w:t></w:r></w:p></w:tc><w:tc><w:tcPr><w:tcW w:w="1000" w:type="dxa"/><w:noWrap/></w:tcPr><w:p><w:pPr><w:jc w:val="end"/><w:spacing w:after="60"/></w:pPr><w:r><w:rPr><w:rFonts w:ascii="Times New Roman" w:hAnsi="Times New Roman" w:eastAsia="Times New Roman" w:cs="Times New Roman"/><w:sz w:val="23"/><w:szCs w:val="23"/></w:rPr><w:t xml:space="preserve">6</w:t></w:r></w:p></w:tc></w:tr><w:tr><w:trPr/><w:tc><w:tcPr><w:tcW w:w="1200" w:type="dxa"/><w:noWrap/></w:tcPr><w:p><w:pPr><w:jc w:val="start"/><w:spacing w:after="60"/></w:pPr><w:r><w:rPr><w:rFonts w:ascii="Times New Roman" w:hAnsi="Times New Roman" w:eastAsia="Times New Roman" w:cs="Times New Roman"/><w:sz w:val="23"/><w:szCs w:val="23"/></w:rPr><w:t xml:space="preserve"></w:t></w:r></w:p></w:tc><w:tc><w:tcPr><w:tcW w:w="7000" w:type="dxa"/><w:noWrap/></w:tcPr><w:p><w:pPr><w:jc w:val="start"/><w:spacing w:after="60"/></w:pPr><w:r><w:rPr><w:rFonts w:ascii="Times New Roman" w:hAnsi="Times New Roman" w:eastAsia="Times New Roman" w:cs="Times New Roman"/><w:sz w:val="23"/><w:szCs w:val="23"/></w:rPr><w:t xml:space="preserve">12. Diagram Hubungan Entity (ERD)</w:t></w:r></w:p></w:tc><w:tc><w:tcPr><w:tcW w:w="1000" w:type="dxa"/><w:noWrap/></w:tcPr><w:p><w:pPr><w:jc w:val="end"/><w:spacing w:after="60"/></w:pPr><w:r><w:rPr><w:rFonts w:ascii="Times New Roman" w:hAnsi="Times New Roman" w:eastAsia="Times New Roman" w:cs="Times New Roman"/><w:sz w:val="23"/><w:szCs w:val="23"/></w:rPr><w:t xml:space="preserve">8</w:t></w:r></w:p></w:tc></w:tr><w:tr><w:trPr/><w:tc><w:tcPr><w:tcW w:w="1200" w:type="dxa"/><w:noWrap/></w:tcPr><w:p><w:pPr><w:jc w:val="start"/><w:spacing w:after="60"/></w:pPr><w:r><w:rPr><w:rFonts w:ascii="Times New Roman" w:hAnsi="Times New Roman" w:eastAsia="Times New Roman" w:cs="Times New Roman"/><w:sz w:val="23"/><w:szCs w:val="23"/></w:rPr><w:t xml:space="preserve"></w:t></w:r></w:p></w:tc><w:tc><w:tcPr><w:tcW w:w="7000" w:type="dxa"/><w:noWrap/></w:tcPr><w:p><w:pPr><w:jc w:val="start"/><w:spacing w:after="60"/></w:pPr><w:r><w:rPr><w:rFonts w:ascii="Times New Roman" w:hAnsi="Times New Roman" w:eastAsia="Times New Roman" w:cs="Times New Roman"/><w:sz w:val="23"/><w:szCs w:val="23"/></w:rPr><w:t xml:space="preserve">13. Kamus Data / Struktur File</w:t></w:r></w:p></w:tc><w:tc><w:tcPr><w:tcW w:w="1000" w:type="dxa"/><w:noWrap/></w:tcPr><w:p><w:pPr><w:jc w:val="end"/><w:spacing w:after="60"/></w:pPr><w:r><w:rPr><w:rFonts w:ascii="Times New Roman" w:hAnsi="Times New Roman" w:eastAsia="Times New Roman" w:cs="Times New Roman"/><w:sz w:val="23"/><w:szCs w:val="23"/></w:rPr><w:t xml:space="preserve">9</w:t></w:r></w:p></w:tc></w:tr><w:tr><w:trPr/><w:tc><w:tcPr><w:tcW w:w="1200" w:type="dxa"/><w:noWrap/></w:tcPr><w:p><w:pPr><w:jc w:val="start"/><w:spacing w:after="60"/></w:pPr><w:r><w:rPr><w:rFonts w:ascii="Times New Roman" w:hAnsi="Times New Roman" w:eastAsia="Times New Roman" w:cs="Times New Roman"/><w:sz w:val="23"/><w:szCs w:val="23"/></w:rPr><w:t xml:space="preserve"></w:t></w:r></w:p></w:tc><w:tc><w:tcPr><w:tcW w:w="7000" w:type="dxa"/><w:noWrap/></w:tcPr><w:p><w:pPr><w:jc w:val="start"/><w:spacing w:after="60"/></w:pPr><w:r><w:rPr><w:rFonts w:ascii="Times New Roman" w:hAnsi="Times New Roman" w:eastAsia="Times New Roman" w:cs="Times New Roman"/><w:sz w:val="23"/><w:szCs w:val="23"/></w:rPr><w:t xml:space="preserve">14. Spesifikasi Program</w:t></w:r></w:p></w:tc><w:tc><w:tcPr><w:tcW w:w="1000" w:type="dxa"/><w:noWrap/></w:tcPr><w:p><w:pPr><w:jc w:val="end"/><w:spacing w:after="60"/></w:pPr><w:r><w:rPr><w:rFonts w:ascii="Times New Roman" w:hAnsi="Times New Roman" w:eastAsia="Times New Roman" w:cs="Times New Roman"/><w:sz w:val="23"/><w:szCs w:val="23"/></w:rPr><w:t xml:space="preserve">14</w:t></w:r></w:p></w:tc></w:tr><w:tr><w:trPr/><w:tc><w:tcPr><w:tcW w:w="1200" w:type="dxa"/><w:noWrap/></w:tcPr><w:p><w:pPr><w:jc w:val="start"/><w:spacing w:after="60"/></w:pPr><w:r><w:rPr><w:rFonts w:ascii="Times New Roman" w:hAnsi="Times New Roman" w:eastAsia="Times New Roman" w:cs="Times New Roman"/><w:sz w:val="23"/><w:szCs w:val="23"/></w:rPr><w:t xml:space="preserve"></w:t></w:r></w:p></w:tc><w:tc><w:tcPr><w:tcW w:w="7000" w:type="dxa"/><w:noWrap/></w:tcPr><w:p><w:pPr><w:jc w:val="start"/><w:spacing w:after="60"/></w:pPr><w:r><w:rPr><w:rFonts w:ascii="Times New Roman" w:hAnsi="Times New Roman" w:eastAsia="Times New Roman" w:cs="Times New Roman"/><w:sz w:val="23"/><w:szCs w:val="23"/></w:rPr><w:t xml:space="preserve">15. Bentuk Tampilan dan Cetakan</w:t></w:r></w:p></w:tc><w:tc><w:tcPr><w:tcW w:w="1000" w:type="dxa"/><w:noWrap/></w:tcPr><w:p><w:pPr><w:jc w:val="end"/><w:spacing w:after="60"/></w:pPr><w:r><w:rPr><w:rFonts w:ascii="Times New Roman" w:hAnsi="Times New Roman" w:eastAsia="Times New Roman" w:cs="Times New Roman"/><w:sz w:val="23"/><w:szCs w:val="23"/></w:rPr><w:t xml:space="preserve">19</w:t></w:r></w:p></w:tc></w:tr><w:tr><w:trPr/><w:tc><w:tcPr><w:tcW w:w="1200" w:type="dxa"/><w:noWrap/></w:tcPr><w:p><w:pPr><w:jc w:val="start"/><w:spacing w:after="60"/></w:pPr><w:r><w:rPr><w:rFonts w:ascii="Times New Roman" w:hAnsi="Times New Roman" w:eastAsia="Times New Roman" w:cs="Times New Roman"/><w:sz w:val="23"/><w:szCs w:val="23"/></w:rPr><w:t xml:space="preserve"></w:t></w:r></w:p></w:tc><w:tc><w:tcPr><w:tcW w:w="7000" w:type="dxa"/><w:noWrap/></w:tcPr><w:p><w:pPr><w:jc w:val="start"/><w:spacing w:after="60"/></w:pPr><w:r><w:rPr><w:rFonts w:ascii="Times New Roman" w:hAnsi="Times New Roman" w:eastAsia="Times New Roman" w:cs="Times New Roman"/><w:sz w:val="23"/><w:szCs w:val="23"/></w:rPr><w:t xml:space="preserve">16. Listing Program</w:t></w:r></w:p></w:tc><w:tc><w:tcPr><w:tcW w:w="1000" w:type="dxa"/><w:noWrap/></w:tcPr><w:p><w:pPr><w:jc w:val="end"/><w:spacing w:after="60"/></w:pPr><w:r><w:rPr><w:rFonts w:ascii="Times New Roman" w:hAnsi="Times New Roman" w:eastAsia="Times New Roman" w:cs="Times New Roman"/><w:sz w:val="23"/><w:szCs w:val="23"/></w:rPr><w:t xml:space="preserve">23</w:t></w:r></w:p></w:tc></w:tr><w:tr><w:trPr/><w:tc><w:tcPr><w:tcW w:w="1200" w:type="dxa"/><w:noWrap/></w:tcPr><w:p><w:pPr><w:jc w:val="start"/><w:spacing w:after="60"/></w:pPr><w:r><w:rPr><w:rFonts w:ascii="Times New Roman" w:hAnsi="Times New Roman" w:eastAsia="Times New Roman" w:cs="Times New Roman"/><w:sz w:val="23"/><w:szCs w:val="23"/><w:b w:val="1"/><w:bCs w:val="1"/></w:rPr><w:t xml:space="preserve">BAB IV</w:t></w:r></w:p></w:tc><w:tc><w:tcPr><w:tcW w:w="7000" w:type="dxa"/><w:noWrap/></w:tcPr><w:p><w:pPr><w:jc w:val="start"/><w:spacing w:after="60"/></w:pPr><w:r><w:rPr><w:rFonts w:ascii="Times New Roman" w:hAnsi="Times New Roman" w:eastAsia="Times New Roman" w:cs="Times New Roman"/><w:sz w:val="23"/><w:szCs w:val="23"/><w:b w:val="1"/><w:bCs w:val="1"/></w:rPr><w:t xml:space="preserve">PENUTUP</w:t></w:r></w:p></w:tc><w:tc><w:tcPr><w:tcW w:w="1000" w:type="dxa"/><w:noWrap/></w:tcPr><w:p><w:pPr><w:jc w:val="end"/><w:spacing w:after="60"/></w:pPr><w:r><w:rPr><w:rFonts w:ascii="Times New Roman" w:hAnsi="Times New Roman" w:eastAsia="Times New Roman" w:cs="Times New Roman"/><w:sz w:val="23"/><w:szCs w:val="23"/><w:b w:val="1"/><w:bCs w:val="1"/></w:rPr><w:t xml:space="preserve">28</w:t></w:r></w:p></w:tc></w:tr><w:tr><w:trPr/><w:tc><w:tcPr><w:tcW w:w="1200" w:type="dxa"/><w:noWrap/></w:tcPr><w:p><w:pPr><w:jc w:val="start"/><w:spacing w:after="60"/></w:pPr><w:r><w:rPr><w:rFonts w:ascii="Times New Roman" w:hAnsi="Times New Roman" w:eastAsia="Times New Roman" w:cs="Times New Roman"/><w:sz w:val="23"/><w:szCs w:val="23"/></w:rPr><w:t xml:space="preserve"></w:t></w:r></w:p></w:tc><w:tc><w:tcPr><w:tcW w:w="7000" w:type="dxa"/><w:noWrap/></w:tcPr><w:p><w:pPr><w:jc w:val="start"/><w:spacing w:after="60"/></w:pPr><w:r><w:rPr><w:rFonts w:ascii="Times New Roman" w:hAnsi="Times New Roman" w:eastAsia="Times New Roman" w:cs="Times New Roman"/><w:sz w:val="23"/><w:szCs w:val="23"/></w:rPr><w:t xml:space="preserve">17. Penutup</w:t></w:r></w:p></w:tc><w:tc><w:tcPr><w:tcW w:w="1000" w:type="dxa"/><w:noWrap/></w:tcPr><w:p><w:pPr><w:jc w:val="end"/><w:spacing w:after="60"/></w:pPr><w:r><w:rPr><w:rFonts w:ascii="Times New Roman" w:hAnsi="Times New Roman" w:eastAsia="Times New Roman" w:cs="Times New Roman"/><w:sz w:val="23"/><w:szCs w:val="23"/></w:rPr><w:t xml:space="preserve">28</w:t></w:r></w:p></w:tc></w:tr></w:tbl><w:p><w:r><w:br w:type="page"/></w:r></w:p><w:p><w:pPr><w:jc w:val="center"/><w:spacing w:after="60"/></w:pPr><w:r><w:rPr><w:rFonts w:ascii="Times New Roman" w:hAnsi="Times New Roman" w:eastAsia="Times New Roman" w:cs="Times New Roman"/><w:sz w:val="26"/><w:szCs w:val="26"/><w:b w:val="1"/><w:bCs w:val="1"/></w:rPr><w:t xml:space="preserve">BAB I</w:t></w:r></w:p><w:p><w:pPr><w:jc w:val="center"/><w:spacing w:after="60"/></w:pPr><w:r><w:rPr><w:rFonts w:ascii="Times New Roman" w:hAnsi="Times New Roman" w:eastAsia="Times New Roman" w:cs="Times New Roman"/><w:sz w:val="26"/><w:szCs w:val="26"/><w:b w:val="1"/><w:bCs w:val="1"/></w:rPr><w:t xml:space="preserve">PENDAHULUAN</w:t></w:r></w:p><w:p/><w:p><w:pPr><w:jc w:val="start"/><w:spacing w:after="60"/></w:pPr><w:r><w:rPr><w:rFonts w:ascii="Times New Roman" w:hAnsi="Times New Roman" w:eastAsia="Times New Roman" w:cs="Times New Roman"/><w:sz w:val="24"/><w:szCs w:val="24"/><w:b w:val="1"/><w:bCs w:val="1"/></w:rPr><w:t xml:space="preserve">1.   Umum.</w:t></w:r></w:p><w:p><w:pPr><w:jc w:val="both"/><w:spacing w:after="80" w:line="276" w:lineRule="auto"/></w:pPr><w:r><w:rPr><w:rFonts w:ascii="Times New Roman" w:hAnsi="Times New Roman" w:eastAsia="Times New Roman" w:cs="Times New Roman"/><w:sz w:val="23"/><w:szCs w:val="23"/></w:rPr><w:t xml:space="preserve">a.   Dokumentasi sistem merupakan salah satu kegiatan fundamental dalam penyelenggaraan pembinaan sistem informasi di lingkungan TNI AD pada setiap tahapan daur hidup pengembangan perangkat lunak (System Development Life Cycle). Dokumentasi sistem dirancang secara kolaboratif oleh Analis Sistem (Nalsis) dan Pemrogram, selanjutnya dihimpun menjadi satu berkas terstruktur yang menjadi tanggung jawab resmi Pemrogram guna menjamin transparansi, akuntabilitas, dan keterpeliharaan sistem.</w:t></w:r></w:p><w:p><w:pPr><w:jc w:val="both"/><w:spacing w:after="80" w:line="276" w:lineRule="auto"/></w:pPr><w:r><w:rPr><w:rFonts w:ascii="Times New Roman" w:hAnsi="Times New Roman" w:eastAsia="Times New Roman" w:cs="Times New Roman"/><w:sz w:val="23"/><w:szCs w:val="23"/></w:rPr><w:t xml:space="preserve">b.   Prajurit dan Pegawai Negeri Sipil (PNS) TNI Angkatan Darat dalam pelaksanaan dinas keprajuritan memiliki 33 (tiga puluh tiga) jenis dokumen induk administrasi atau dosir wajib. Selama ini, tata kelola dosir fisik menghadapi kerentanan risiko kerusakan fisik akibat lapuk, kelembapan, bencana alam, serta lambatnya proses pencarian berkas saat pengusulan kenaikan pangkat (UKP), penugasan operasi, maupun persiapan masa purna tugas.</w:t></w:r></w:p><w:p><w:pPr><w:jc w:val="both"/><w:spacing w:after="80" w:line="276" w:lineRule="auto"/></w:pPr><w:r><w:rPr><w:rFonts w:ascii="Times New Roman" w:hAnsi="Times New Roman" w:eastAsia="Times New Roman" w:cs="Times New Roman"/><w:sz w:val="23"/><w:szCs w:val="23"/></w:rPr><w:t xml:space="preserve">c.   Untuk mengatasi tantangan tersebut, dibangun sistem TRISULA TNI AD (Tata Kelola Rekam Informasi, Sistematika, & Unduhan Lengkap Arsip). Sistem ini mendigitalisasi seluruh 33 dosir prajurit, memfasilitasi pemindaian langsung melalui kamera perangkat bergerak, menerapkan verifikasi administratif bertingkat oleh Staf Personel, serta mengesahkan dokumen melalui Tanda Tangan Elektronik (TTE) ber-QR Code dengan verifikasi integritas cryptographic hash SHA-256.</w:t></w:r></w:p><w:p><w:pPr><w:jc w:val="both"/><w:spacing w:after="80" w:line="276" w:lineRule="auto"/></w:pPr><w:r><w:rPr><w:rFonts w:ascii="Times New Roman" w:hAnsi="Times New Roman" w:eastAsia="Times New Roman" w:cs="Times New Roman"/><w:sz w:val="23"/><w:szCs w:val="23"/></w:rPr><w:t xml:space="preserve">d.   Agar operasional, pengawasan, pemeliharaan (*har*), dan pengembangan aplikasi TRISULA TNI AD dapat berjalan secara berkelanjutan dan berdaya guna, maka disusunlah Buku Dokumentasi Sistem ini dengan berpedoman pada kaidah resmi pembinaan sistem informasi TNI Angkatan Darat.</w:t></w:r></w:p><w:p/><w:p><w:pPr><w:jc w:val="start"/><w:spacing w:after="60"/></w:pPr><w:r><w:rPr><w:rFonts w:ascii="Times New Roman" w:hAnsi="Times New Roman" w:eastAsia="Times New Roman" w:cs="Times New Roman"/><w:sz w:val="24"/><w:szCs w:val="24"/><w:b w:val="1"/><w:bCs w:val="1"/></w:rPr><w:t xml:space="preserve">2.   Maksud dan Tujuan.</w:t></w:r></w:p><w:p><w:pPr><w:jc w:val="both"/><w:spacing w:after="80" w:line="276" w:lineRule="auto"/></w:pPr><w:r><w:rPr><w:rFonts w:ascii="Times New Roman" w:hAnsi="Times New Roman" w:eastAsia="Times New Roman" w:cs="Times New Roman"/><w:sz w:val="23"/><w:szCs w:val="23"/></w:rPr><w:t xml:space="preserve">a.   Maksud. Dokumentasi Sistem Program Aplikasi TRISULA TNI AD ini disusun dengan maksud untuk memberikan gambaran, uraian teknis, logika pemrograman, arsitektur basis data, serta spesifikasi modul sistem secara utuh dan transparan.</w:t></w:r></w:p><w:p><w:pPr><w:jc w:val="both"/><w:spacing w:after="80" w:line="276" w:lineRule="auto"/></w:pPr><w:r><w:rPr><w:rFonts w:ascii="Times New Roman" w:hAnsi="Times New Roman" w:eastAsia="Times New Roman" w:cs="Times New Roman"/><w:sz w:val="23"/><w:szCs w:val="23"/></w:rPr><w:t xml:space="preserve">b.   Tujuan. Dokumentasi ini disusun dengan tujuan sebagai pedoman baku bagi Analis Sistem, Pemrogram, Administrator Satuan (Staf Personel/Infolahta), Teknisi Komputer, Auditor Inspektorat, serta pimpinan satuan dalam mengoperasikan, mengevaluasi, memelihara, dan mengembangkan aplikasi TRISULA TNI AD di masa depan.</w:t></w:r></w:p><w:p/><w:p><w:pPr><w:jc w:val="start"/><w:spacing w:after="60"/></w:pPr><w:r><w:rPr><w:rFonts w:ascii="Times New Roman" w:hAnsi="Times New Roman" w:eastAsia="Times New Roman" w:cs="Times New Roman"/><w:sz w:val="24"/><w:szCs w:val="24"/><w:b w:val="1"/><w:bCs w:val="1"/></w:rPr><w:t xml:space="preserve">3.   Ruang Lingkup dan Tata Urut.</w:t></w:r></w:p><w:p><w:pPr><w:jc w:val="both"/><w:spacing w:after="80" w:line="276" w:lineRule="auto"/></w:pPr><w:r><w:rPr><w:rFonts w:ascii="Times New Roman" w:hAnsi="Times New Roman" w:eastAsia="Times New Roman" w:cs="Times New Roman"/><w:sz w:val="23"/><w:szCs w:val="23"/></w:rPr><w:t xml:space="preserve">a.   Ruang Lingkup. Dokumentasi ini mencakup keseluruhan daur rancang bangun aplikasi TRISULA TNI AD, meliputi narasi logika fungsional, diagram arus data (DFD), model hubungan entitas (ERD), kamus data terinci, spesifikasi form dan prosedur pengolahan, bentuk tampilan visual dan cetakan laporan kedinasan, serta potongan kode program inti (core source code).</w:t></w:r></w:p><w:p><w:pPr><w:jc w:val="both"/><w:spacing w:after="80" w:line="276" w:lineRule="auto"/></w:pPr><w:r><w:rPr><w:rFonts w:ascii="Times New Roman" w:hAnsi="Times New Roman" w:eastAsia="Times New Roman" w:cs="Times New Roman"/><w:sz w:val="23"/><w:szCs w:val="23"/></w:rPr><w:t xml:space="preserve">b.   Tata Urut. Naskah dokumentasi sistem ini disusun dengan tata urut sebagai berikut :</w:t></w:r></w:p><w:p><w:pPr><w:jc w:val="start"/><w:spacing w:after="60"/></w:pPr><w:r><w:rPr><w:rFonts w:ascii="Times New Roman" w:hAnsi="Times New Roman" w:eastAsia="Times New Roman" w:cs="Times New Roman"/><w:sz w:val="23"/><w:szCs w:val="23"/><w:b w:val="1"/><w:bCs w:val="1"/></w:rPr><w:t xml:space="preserve">     1)   BAB I     PENDAHULUAN</w:t></w:r></w:p><w:p><w:pPr><w:jc w:val="start"/><w:spacing w:after="60"/></w:pPr><w:r><w:rPr><w:rFonts w:ascii="Times New Roman" w:hAnsi="Times New Roman" w:eastAsia="Times New Roman" w:cs="Times New Roman"/><w:sz w:val="23"/><w:szCs w:val="23"/><w:b w:val="1"/><w:bCs w:val="1"/></w:rPr><w:t xml:space="preserve">     2)   BAB II    MATERI DOKUMENTASI</w:t></w:r></w:p><w:p><w:pPr><w:jc w:val="start"/><w:spacing w:after="60"/></w:pPr><w:r><w:rPr><w:rFonts w:ascii="Times New Roman" w:hAnsi="Times New Roman" w:eastAsia="Times New Roman" w:cs="Times New Roman"/><w:sz w:val="23"/><w:szCs w:val="23"/><w:b w:val="1"/><w:bCs w:val="1"/></w:rPr><w:t xml:space="preserve">     3)   BAB III   PERILAKU TERHADAP DOKUMEN / KETENTUAN DOKUMEN</w:t></w:r></w:p><w:p><w:pPr><w:jc w:val="start"/><w:spacing w:after="60"/></w:pPr><w:r><w:rPr><w:rFonts w:ascii="Times New Roman" w:hAnsi="Times New Roman" w:eastAsia="Times New Roman" w:cs="Times New Roman"/><w:sz w:val="23"/><w:szCs w:val="23"/><w:b w:val="1"/><w:bCs w:val="1"/></w:rPr><w:t xml:space="preserve">     4)   BAB IV    PENUTUP</w:t></w:r></w:p><w:p/><w:p><w:pPr><w:jc w:val="start"/><w:spacing w:after="60"/></w:pPr><w:r><w:rPr><w:rFonts w:ascii="Times New Roman" w:hAnsi="Times New Roman" w:eastAsia="Times New Roman" w:cs="Times New Roman"/><w:sz w:val="24"/><w:szCs w:val="24"/><w:b w:val="1"/><w:bCs w:val="1"/></w:rPr><w:t xml:space="preserve">4.   Referensi.</w:t></w:r></w:p><w:p><w:pPr><w:jc w:val="both"/><w:spacing w:after="80" w:line="276" w:lineRule="auto"/></w:pPr><w:r><w:rPr><w:rFonts w:ascii="Times New Roman" w:hAnsi="Times New Roman" w:eastAsia="Times New Roman" w:cs="Times New Roman"/><w:sz w:val="23"/><w:szCs w:val="23"/></w:rPr><w:t xml:space="preserve">Penyusunan dokumentasi sistem ini didasarkan pada rujukan resmi kedinasan :</w:t></w:r></w:p><w:p><w:pPr><w:jc w:val="both"/><w:spacing w:after="80" w:line="276" w:lineRule="auto"/></w:pPr><w:r><w:rPr><w:rFonts w:ascii="Times New Roman" w:hAnsi="Times New Roman" w:eastAsia="Times New Roman" w:cs="Times New Roman"/><w:sz w:val="23"/><w:szCs w:val="23"/></w:rPr><w:t xml:space="preserve">a.   Surat Keputusan Kasad Nomor Skep/45/II/2005 tanggal 14 Maret 2005 tentang Buku Petunjuk Teknik Penyusunan Dokumentasi Sistem.</w:t></w:r></w:p><w:p><w:pPr><w:jc w:val="both"/><w:spacing w:after="80" w:line="276" w:lineRule="auto"/></w:pPr><w:r><w:rPr><w:rFonts w:ascii="Times New Roman" w:hAnsi="Times New Roman" w:eastAsia="Times New Roman" w:cs="Times New Roman"/><w:sz w:val="23"/><w:szCs w:val="23"/></w:rPr><w:t xml:space="preserve">b.   Keputusan Kadisinfolahtad Nomor Kep/23/IV/2022 tanggal 4 April 2022 tentang Naskah Sekolah Pengetahuan Dokumentasi Program Aplikasi untuk Pendidikan Perwira TNI AD Nomor Kode: 61 - A – 009.</w:t></w:r></w:p><w:p><w:pPr><w:jc w:val="both"/><w:spacing w:after="80" w:line="276" w:lineRule="auto"/></w:pPr><w:r><w:rPr><w:rFonts w:ascii="Times New Roman" w:hAnsi="Times New Roman" w:eastAsia="Times New Roman" w:cs="Times New Roman"/><w:sz w:val="23"/><w:szCs w:val="23"/></w:rPr><w:t xml:space="preserve">c.   Keputusan Kasad Nomor Kep/548/VI/2016 tanggal 24 Juni 2016 tentang Buku Petunjuk Teknis Tulisan Dinas di Lingkungan TNI Angkatan Darat.</w:t></w:r></w:p><w:p><w:pPr><w:jc w:val="both"/><w:spacing w:after="80" w:line="276" w:lineRule="auto"/></w:pPr><w:r><w:rPr><w:rFonts w:ascii="Times New Roman" w:hAnsi="Times New Roman" w:eastAsia="Times New Roman" w:cs="Times New Roman"/><w:sz w:val="23"/><w:szCs w:val="23"/></w:rPr><w:t xml:space="preserve">d.   Buku Petunjuk Teknis TNI AD tentang Pembinaan Karier dan Administrasi Dosir Prajurit Angkatan Darat.</w:t></w:r></w:p><w:p/><w:p><w:pPr><w:jc w:val="start"/><w:spacing w:after="60"/></w:pPr><w:r><w:rPr><w:rFonts w:ascii="Times New Roman" w:hAnsi="Times New Roman" w:eastAsia="Times New Roman" w:cs="Times New Roman"/><w:sz w:val="24"/><w:szCs w:val="24"/><w:b w:val="1"/><w:bCs w:val="1"/></w:rPr><w:t xml:space="preserve">5.   Pengertian.</w:t></w:r></w:p><w:p><w:pPr><w:jc w:val="both"/><w:spacing w:after="80" w:line="276" w:lineRule="auto"/></w:pPr><w:r><w:rPr><w:rFonts w:ascii="Times New Roman" w:hAnsi="Times New Roman" w:eastAsia="Times New Roman" w:cs="Times New Roman"/><w:sz w:val="23"/><w:szCs w:val="23"/></w:rPr><w:t xml:space="preserve">a.   Narasi Program adalah penjelasan terstruktur mengenai fungsi program, file input, urutan proses pengolahan, algoritma perhitungan, dan keluaran yang dihasilkan sistem.</w:t></w:r></w:p><w:p><w:pPr><w:jc w:val="both"/><w:spacing w:after="80" w:line="276" w:lineRule="auto"/></w:pPr><w:r><w:rPr><w:rFonts w:ascii="Times New Roman" w:hAnsi="Times New Roman" w:eastAsia="Times New Roman" w:cs="Times New Roman"/><w:sz w:val="23"/><w:szCs w:val="23"/></w:rPr><w:t xml:space="preserve">b.   Input adalah data atau berkas yang dimasukkan ke dalam sistem, baik berupa data identitas pokok prajurit maupun berkas digital PDF 33 jenis dosir.</w:t></w:r></w:p><w:p><w:pPr><w:jc w:val="both"/><w:spacing w:after="80" w:line="276" w:lineRule="auto"/></w:pPr><w:r><w:rPr><w:rFonts w:ascii="Times New Roman" w:hAnsi="Times New Roman" w:eastAsia="Times New Roman" w:cs="Times New Roman"/><w:sz w:val="23"/><w:szCs w:val="23"/></w:rPr><w:t xml:space="preserve">c.   Output adalah keluaran hasil olahan sistem, baik berupa tampilan antarmuka visual (display), berkas PDF ber-TTE resmi, maupun lembar laporan siap cetak berkop dinas.</w:t></w:r></w:p><w:p><w:pPr><w:jc w:val="both"/><w:spacing w:after="80" w:line="276" w:lineRule="auto"/></w:pPr><w:r><w:rPr><w:rFonts w:ascii="Times New Roman" w:hAnsi="Times New Roman" w:eastAsia="Times New Roman" w:cs="Times New Roman"/><w:sz w:val="23"/><w:szCs w:val="23"/></w:rPr><w:t xml:space="preserve">d.   Dosir Elektronik adalah kumpulan naskah/dokumen digital autentik riwayat hidup prajurit yang dihimpun secara sistematis dari awal pengangkatan hingga purna tugas.</w:t></w:r></w:p><w:p><w:pPr><w:jc w:val="both"/><w:spacing w:after="80" w:line="276" w:lineRule="auto"/></w:pPr><w:r><w:rPr><w:rFonts w:ascii="Times New Roman" w:hAnsi="Times New Roman" w:eastAsia="Times New Roman" w:cs="Times New Roman"/><w:sz w:val="23"/><w:szCs w:val="23"/></w:rPr><w:t xml:space="preserve">e.   Tanda Tangan Elektronik (TTE) adalah tanda tangan yang terdiri atas informasi elektronik yang dilekatkan, terasosiasi atau terkait dengan informasi elektronik lainnya sebagai alat verifikasi dan autentikasi keabsahan dokumen dinas.</w:t></w:r></w:p><w:p><w:r><w:br w:type="page"/></w:r></w:p><w:p><w:pPr><w:jc w:val="center"/><w:spacing w:after="60"/></w:pPr><w:r><w:rPr><w:rFonts w:ascii="Times New Roman" w:hAnsi="Times New Roman" w:eastAsia="Times New Roman" w:cs="Times New Roman"/><w:sz w:val="26"/><w:szCs w:val="26"/><w:b w:val="1"/><w:bCs w:val="1"/></w:rPr><w:t xml:space="preserve">BAB II</w:t></w:r></w:p><w:p><w:pPr><w:jc w:val="center"/><w:spacing w:after="60"/></w:pPr><w:r><w:rPr><w:rFonts w:ascii="Times New Roman" w:hAnsi="Times New Roman" w:eastAsia="Times New Roman" w:cs="Times New Roman"/><w:sz w:val="26"/><w:szCs w:val="26"/><w:b w:val="1"/><w:bCs w:val="1"/></w:rPr><w:t xml:space="preserve">MATERI DOKUMENTASI</w:t></w:r></w:p><w:p/><w:p><w:pPr><w:jc w:val="start"/><w:spacing w:after="60"/></w:pPr><w:r><w:rPr><w:rFonts w:ascii="Times New Roman" w:hAnsi="Times New Roman" w:eastAsia="Times New Roman" w:cs="Times New Roman"/><w:sz w:val="24"/><w:szCs w:val="24"/><w:b w:val="1"/><w:bCs w:val="1"/></w:rPr><w:t xml:space="preserve">6.   Umum.</w:t></w:r></w:p><w:p><w:pPr><w:jc w:val="both"/><w:spacing w:after="80" w:line="276" w:lineRule="auto"/></w:pPr><w:r><w:rPr><w:rFonts w:ascii="Times New Roman" w:hAnsi="Times New Roman" w:eastAsia="Times New Roman" w:cs="Times New Roman"/><w:sz w:val="23"/><w:szCs w:val="23"/></w:rPr><w:t xml:space="preserve">Materi dokumentasi diberi judul resmi "DOKUMENTASI PROGRAM", yang terdiri atas 2 (dua) bagian utama terpadu :</w:t></w:r></w:p><w:p><w:pPr><w:jc w:val="both"/><w:spacing w:after="80" w:line="276" w:lineRule="auto"/></w:pPr><w:r><w:rPr><w:rFonts w:ascii="Times New Roman" w:hAnsi="Times New Roman" w:eastAsia="Times New Roman" w:cs="Times New Roman"/><w:sz w:val="23"/><w:szCs w:val="23"/></w:rPr><w:t xml:space="preserve">a.   Bagian 1 : Keterangan-Keterangan tentang Program. Berisi ringkasan identitas manajerial sistem informasi meliputi nama aplikasi, nama modul program, fungsi ringkas, penanggung jawab/pemrogram, bahasa dan lingkungan pemrograman, direktori instalasi, dan tanggal selesai pengembangan.</w:t></w:r></w:p><w:p><w:pPr><w:jc w:val="both"/><w:spacing w:after="80" w:line="276" w:lineRule="auto"/></w:pPr><w:r><w:rPr><w:rFonts w:ascii="Times New Roman" w:hAnsi="Times New Roman" w:eastAsia="Times New Roman" w:cs="Times New Roman"/><w:sz w:val="23"/><w:szCs w:val="23"/></w:rPr><w:t xml:space="preserve">b.   Bagian 2 : Ketentuan Dokumen / Isi Dokumen. Merupakan inti materi teknis yang memuat narasi program, diagram arus data, diagram hubungan entitas, kamus data struktur tabel, formulir spesifikasi program, bentuk tampilan dan cetakan, serta listing program.</w:t></w:r></w:p><w:p/><w:p><w:pPr><w:jc w:val="start"/><w:spacing w:after="60"/></w:pPr><w:r><w:rPr><w:rFonts w:ascii="Times New Roman" w:hAnsi="Times New Roman" w:eastAsia="Times New Roman" w:cs="Times New Roman"/><w:sz w:val="24"/><w:szCs w:val="24"/><w:b w:val="1"/><w:bCs w:val="1"/></w:rPr><w:t xml:space="preserve">7.   Tujuan Pembuatan Dokumentasi Sistem.</w:t></w:r></w:p><w:p><w:pPr><w:jc w:val="both"/><w:spacing w:after="80" w:line="276" w:lineRule="auto"/></w:pPr><w:r><w:rPr><w:rFonts w:ascii="Times New Roman" w:hAnsi="Times New Roman" w:eastAsia="Times New Roman" w:cs="Times New Roman"/><w:sz w:val="23"/><w:szCs w:val="23"/></w:rPr><w:t xml:space="preserve">Berdasarkan doktrin pembinaan sistem informasi TNI AD, ada 3 (tiga) tujuan strategis pembuatan dokumentasi sistem :</w:t></w:r></w:p><w:p><w:pPr><w:jc w:val="both"/><w:spacing w:after="80" w:line="276" w:lineRule="auto"/></w:pPr><w:r><w:rPr><w:rFonts w:ascii="Times New Roman" w:hAnsi="Times New Roman" w:eastAsia="Times New Roman" w:cs="Times New Roman"/><w:sz w:val="23"/><w:szCs w:val="23"/></w:rPr><w:t xml:space="preserve">a.   Untuk Menjelaskan Cara Kerja Sistem. Dokumentasi menyederhanakan sistem pengolahan data dosir yang kompleks (melibatkan penomoran otomatis 33 berkas, cryptographic hashing, dan watermarking) menjadi uraian yang mudah dipahami dalam waktu singkat oleh staf manajerial maupun teknisi baru.</w:t></w:r></w:p><w:p><w:pPr><w:jc w:val="both"/><w:spacing w:after="80" w:line="276" w:lineRule="auto"/></w:pPr><w:r><w:rPr><w:rFonts w:ascii="Times New Roman" w:hAnsi="Times New Roman" w:eastAsia="Times New Roman" w:cs="Times New Roman"/><w:sz w:val="23"/><w:szCs w:val="23"/></w:rPr><w:t xml:space="preserve">b.   Sebagai Alat dalam Merancang dan Mengembangkan Sistem. Rancangan arsitektur dan relasi basis data yang terdokumentasi rapi mencegah hilangnya memori institusional, mempermudah koordinasi antar pemrogram militer, serta menjamin kelancaran modifikasi sistem di masa mendatang.</w:t></w:r></w:p><w:p><w:pPr><w:jc w:val="both"/><w:spacing w:after="80" w:line="276" w:lineRule="auto"/></w:pPr><w:r><w:rPr><w:rFonts w:ascii="Times New Roman" w:hAnsi="Times New Roman" w:eastAsia="Times New Roman" w:cs="Times New Roman"/><w:sz w:val="23"/><w:szCs w:val="23"/></w:rPr><w:t xml:space="preserve">c.   Sebagai Alat bagi Auditor dan Pengawas Internal. Memberikan dasar pijakan bagi Inspektorat (Itjenad/Itdam) dan Staf Intelijen/Sandi dalam mengevaluasi kepatuhan sistem terhadap prosedur pengendalian internal (internal control), keamanan data personel, dan integritas legalitas TTE.</w:t></w:r></w:p><w:p/><w:p><w:pPr><w:jc w:val="start"/><w:spacing w:after="60"/></w:pPr><w:r><w:rPr><w:rFonts w:ascii="Times New Roman" w:hAnsi="Times New Roman" w:eastAsia="Times New Roman" w:cs="Times New Roman"/><w:sz w:val="24"/><w:szCs w:val="24"/><w:b w:val="1"/><w:bCs w:val="1"/></w:rPr><w:t xml:space="preserve">8.   Cara Pengisian.</w:t></w:r></w:p><w:p><w:pPr><w:jc w:val="both"/><w:spacing w:after="80" w:line="276" w:lineRule="auto"/></w:pPr><w:r><w:rPr><w:rFonts w:ascii="Times New Roman" w:hAnsi="Times New Roman" w:eastAsia="Times New Roman" w:cs="Times New Roman"/><w:sz w:val="23"/><w:szCs w:val="23"/></w:rPr><w:t xml:space="preserve">Ketentuan pengisian formulir dokumentasi Bagian 1 dilaksanakan sebagai berikut :</w:t></w:r></w:p><w:p><w:pPr><w:jc w:val="both"/><w:spacing w:after="80" w:line="276" w:lineRule="auto"/></w:pPr><w:r><w:rPr><w:rFonts w:ascii="Times New Roman" w:hAnsi="Times New Roman" w:eastAsia="Times New Roman" w:cs="Times New Roman"/><w:sz w:val="23"/><w:szCs w:val="23"/></w:rPr><w:t xml:space="preserve">a.   Nama Aplikasi : Diisi dengan nama resmi aplikasi, yaitu "TRISULA TNI AD" (Tata Kelola Rekam Informasi, Sistematika, & Unduhan Lengkap Arsip).</w:t></w:r></w:p><w:p><w:pPr><w:jc w:val="both"/><w:spacing w:after="80" w:line="276" w:lineRule="auto"/></w:pPr><w:r><w:rPr><w:rFonts w:ascii="Times New Roman" w:hAnsi="Times New Roman" w:eastAsia="Times New Roman" w:cs="Times New Roman"/><w:sz w:val="23"/><w:szCs w:val="23"/></w:rPr><w:t xml:space="preserve">b.   Nama Program : Diisi nama komponen fungsional yang dibangun, yaitu "SISTEM DOSIR ELEKTRONIK & VERIFIKASI TTE PERSONEL".</w:t></w:r></w:p><w:p><w:pPr><w:jc w:val="both"/><w:spacing w:after="80" w:line="276" w:lineRule="auto"/></w:pPr><w:r><w:rPr><w:rFonts w:ascii="Times New Roman" w:hAnsi="Times New Roman" w:eastAsia="Times New Roman" w:cs="Times New Roman"/><w:sz w:val="23"/><w:szCs w:val="23"/></w:rPr><w:t xml:space="preserve">c.   Fungsi Program : Menguraikan secara komprehensif kemampuan sistem dalam digitalisasi 33 dosir, verifikasi bertingkat, penandatanganan elektronik, deteksi pensiun, serta rotasi jabatan.</w:t></w:r></w:p><w:p><w:pPr><w:jc w:val="both"/><w:spacing w:after="80" w:line="276" w:lineRule="auto"/></w:pPr><w:r><w:rPr><w:rFonts w:ascii="Times New Roman" w:hAnsi="Times New Roman" w:eastAsia="Times New Roman" w:cs="Times New Roman"/><w:sz w:val="23"/><w:szCs w:val="23"/></w:rPr><w:t xml:space="preserve">d.   Nama Pemrogram : Diisi personel yang ditunjuk dan bertanggung jawab dalam perancangan kode, yaitu Letda Czi Fris Wardani.</w:t></w:r></w:p><w:p><w:pPr><w:jc w:val="both"/><w:spacing w:after="80" w:line="276" w:lineRule="auto"/></w:pPr><w:r><w:rPr><w:rFonts w:ascii="Times New Roman" w:hAnsi="Times New Roman" w:eastAsia="Times New Roman" w:cs="Times New Roman"/><w:sz w:val="23"/><w:szCs w:val="23"/></w:rPr><w:t xml:space="preserve">e.   Bahasa Program : Diisi lingkungan teknologi yang digunakan, yaitu PHP 8.3 Native PDO, JavaScript, HTML5, CSS3, dan MySQL.</w:t></w:r></w:p><w:p><w:pPr><w:jc w:val="both"/><w:spacing w:after="80" w:line="276" w:lineRule="auto"/></w:pPr><w:r><w:rPr><w:rFonts w:ascii="Times New Roman" w:hAnsi="Times New Roman" w:eastAsia="Times New Roman" w:cs="Times New Roman"/><w:sz w:val="23"/><w:szCs w:val="23"/></w:rPr><w:t xml:space="preserve">f.   Lokasi Program : Diisi direktori penyimpanan aplikasi di peladen (web server), yaitu "d:\xampp\htdocs\edosir-tni".</w:t></w:r></w:p><w:p><w:pPr><w:jc w:val="both"/><w:spacing w:after="80" w:line="276" w:lineRule="auto"/></w:pPr><w:r><w:rPr><w:rFonts w:ascii="Times New Roman" w:hAnsi="Times New Roman" w:eastAsia="Times New Roman" w:cs="Times New Roman"/><w:sz w:val="23"/><w:szCs w:val="23"/></w:rPr><w:t xml:space="preserve">g.   Tanggal Selesai : Diisi tanggal finalisasi uji fungsi dan penerbitan sistem, yaitu 21 September 2026.</w:t></w:r></w:p><w:p><w:r><w:br w:type="page"/></w:r></w:p><w:p><w:pPr><w:jc w:val="center"/><w:spacing w:after="60"/></w:pPr><w:r><w:rPr><w:rFonts w:ascii="Times New Roman" w:hAnsi="Times New Roman" w:eastAsia="Times New Roman" w:cs="Times New Roman"/><w:sz w:val="26"/><w:szCs w:val="26"/><w:b w:val="1"/><w:bCs w:val="1"/></w:rPr><w:t xml:space="preserve">BAB III</w:t></w:r></w:p><w:p><w:pPr><w:jc w:val="center"/><w:spacing w:after="60"/></w:pPr><w:r><w:rPr><w:rFonts w:ascii="Times New Roman" w:hAnsi="Times New Roman" w:eastAsia="Times New Roman" w:cs="Times New Roman"/><w:sz w:val="26"/><w:szCs w:val="26"/><w:b w:val="1"/><w:bCs w:val="1"/></w:rPr><w:t xml:space="preserve">PERILAKU TERHADAP DOKUMEN / KETENTUAN DOKUMEN</w:t></w:r></w:p><w:p/><w:p><w:pPr><w:jc w:val="start"/><w:spacing w:after="60"/></w:pPr><w:r><w:rPr><w:rFonts w:ascii="Times New Roman" w:hAnsi="Times New Roman" w:eastAsia="Times New Roman" w:cs="Times New Roman"/><w:sz w:val="24"/><w:szCs w:val="24"/><w:b w:val="1"/><w:bCs w:val="1"/></w:rPr><w:t xml:space="preserve">9.   Umum.</w:t></w:r></w:p><w:p><w:pPr><w:jc w:val="both"/><w:spacing w:after="80" w:line="276" w:lineRule="auto"/></w:pPr><w:r><w:rPr><w:rFonts w:ascii="Times New Roman" w:hAnsi="Times New Roman" w:eastAsia="Times New Roman" w:cs="Times New Roman"/><w:sz w:val="23"/><w:szCs w:val="23"/></w:rPr><w:t xml:space="preserve">Isi dokumentasi program TRISULA TNI AD merupakan kumpulan dokumen teknis terpadu yang memuat 7 (tujuh) instrumen pokok rancang bangun perangkat lunak, yang diuraikan secara mendalam pada pasal-pasal berikut.</w:t></w:r></w:p><w:p/><w:p><w:pPr><w:jc w:val="start"/><w:spacing w:after="60"/></w:pPr><w:r><w:rPr><w:rFonts w:ascii="Times New Roman" w:hAnsi="Times New Roman" w:eastAsia="Times New Roman" w:cs="Times New Roman"/><w:sz w:val="24"/><w:szCs w:val="24"/><w:b w:val="1"/><w:bCs w:val="1"/></w:rPr><w:t xml:space="preserve">10.  Narasi Program.</w:t></w:r></w:p><w:p><w:pPr><w:jc w:val="both"/><w:spacing w:after="80" w:line="276" w:lineRule="auto"/></w:pPr><w:r><w:rPr><w:rFonts w:ascii="Times New Roman" w:hAnsi="Times New Roman" w:eastAsia="Times New Roman" w:cs="Times New Roman"/><w:sz w:val="23"/><w:szCs w:val="23"/></w:rPr><w:t xml:space="preserve">Narasi program memberikan gambaran menyeluruh tentang fungsi, file input, rincian proses, dan keluaran sistem aplikasi TRISULA TNI AD :</w:t></w:r></w:p><w:p><w:pPr><w:jc w:val="start"/><w:spacing w:after="60"/></w:pPr><w:r><w:rPr><w:rFonts w:ascii="Times New Roman" w:hAnsi="Times New Roman" w:eastAsia="Times New Roman" w:cs="Times New Roman"/><w:sz w:val="24"/><w:szCs w:val="24"/><w:b w:val="1"/><w:bCs w:val="1"/></w:rPr><w:t xml:space="preserve">a.   Fungsi Program.</w:t></w:r></w:p><w:p><w:pPr><w:jc w:val="both"/><w:spacing w:after="80" w:line="276" w:lineRule="auto"/></w:pPr><w:r><w:rPr><w:rFonts w:ascii="Times New Roman" w:hAnsi="Times New Roman" w:eastAsia="Times New Roman" w:cs="Times New Roman"/><w:sz w:val="23"/><w:szCs w:val="23"/></w:rPr><w:t xml:space="preserve">Program aplikasi TRISULA TNI AD berfungsi sebagai sarana terpadu pembinaan administrasi personel militer dan PNS di jajaran TNI Angkatan Darat melalui mekanisme digitalisasi warkat induk dosir. Fungsi utama sistem mencakup :</w:t></w:r></w:p><w:p><w:pPr><w:jc w:val="both"/><w:spacing w:after="80" w:line="276" w:lineRule="auto"/></w:pPr><w:r><w:rPr><w:rFonts w:ascii="Times New Roman" w:hAnsi="Times New Roman" w:eastAsia="Times New Roman" w:cs="Times New Roman"/><w:sz w:val="23"/><w:szCs w:val="23"/></w:rPr><w:t xml:space="preserve">     1)   Pendaftaran akun personel secara mandiri berbasis NRP/NIP dengan kontrol persetujuan bertingkat oleh Administrator Satuan.</w:t></w:r></w:p><w:p><w:pPr><w:jc w:val="both"/><w:spacing w:after="80" w:line="276" w:lineRule="auto"/></w:pPr><w:r><w:rPr><w:rFonts w:ascii="Times New Roman" w:hAnsi="Times New Roman" w:eastAsia="Times New Roman" w:cs="Times New Roman"/><w:sz w:val="23"/><w:szCs w:val="23"/></w:rPr><w:t xml:space="preserve">     2)   Pengelolaan 33 jenis dosir baku personel TNI AD dari Dosir 01 (Surat Lamaran) hingga Dosir 33 (Foto dinas terbaru).</w:t></w:r></w:p><w:p><w:pPr><w:jc w:val="both"/><w:spacing w:after="80" w:line="276" w:lineRule="auto"/></w:pPr><w:r><w:rPr><w:rFonts w:ascii="Times New Roman" w:hAnsi="Times New Roman" w:eastAsia="Times New Roman" w:cs="Times New Roman"/><w:sz w:val="23"/><w:szCs w:val="23"/></w:rPr><w:t xml:space="preserve">     3)   Standarisasi penamaan berkas fisik otomatis berformat "{NRP}_{KODE}[abjad].pdf" yang tersimpan pada struktur folder terisolasi "uploads/FOLDER 01" s.d. "FOLDER 33".</w:t></w:r></w:p><w:p><w:pPr><w:jc w:val="both"/><w:spacing w:after="80" w:line="276" w:lineRule="auto"/></w:pPr><w:r><w:rPr><w:rFonts w:ascii="Times New Roman" w:hAnsi="Times New Roman" w:eastAsia="Times New Roman" w:cs="Times New Roman"/><w:sz w:val="23"/><w:szCs w:val="23"/></w:rPr><w:t xml:space="preserve">     4)   Pemindaian dokumen langsung menggunakan kamera gawai/komputer (camera scan) dengan konversi otomatis citra multi-halaman menjadi satu file PDF standar.</w:t></w:r></w:p><w:p><w:pPr><w:jc w:val="both"/><w:spacing w:after="80" w:line="276" w:lineRule="auto"/></w:pPr><w:r><w:rPr><w:rFonts w:ascii="Times New Roman" w:hAnsi="Times New Roman" w:eastAsia="Times New Roman" w:cs="Times New Roman"/><w:sz w:val="23"/><w:szCs w:val="23"/></w:rPr><w:t xml:space="preserve">     5)   Verifikasi berkas oleh Administrator dengan pembubuhan Sertifikasi Tanda Tangan Elektronik (TTE) ber-QR Code dan tanda air (watermark) dinamis.</w:t></w:r></w:p><w:p><w:pPr><w:jc w:val="both"/><w:spacing w:after="80" w:line="276" w:lineRule="auto"/></w:pPr><w:r><w:rPr><w:rFonts w:ascii="Times New Roman" w:hAnsi="Times New Roman" w:eastAsia="Times New Roman" w:cs="Times New Roman"/><w:sz w:val="23"/><w:szCs w:val="23"/></w:rPr><w:t xml:space="preserve">     6)   Layanan publik pemeriksaan keaslian dokumen secara cepat melalui pemindaian QR Code pada portal publik (verify.php).</w:t></w:r></w:p><w:p><w:pPr><w:jc w:val="both"/><w:spacing w:after="80" w:line="276" w:lineRule="auto"/></w:pPr><w:r><w:rPr><w:rFonts w:ascii="Times New Roman" w:hAnsi="Times New Roman" w:eastAsia="Times New Roman" w:cs="Times New Roman"/><w:sz w:val="23"/><w:szCs w:val="23"/></w:rPr><w:t xml:space="preserve">     7)   Pemantauan persentase kelengkapan dosir personel secara real-time dan rekapitulasi rata-rata satuan.</w:t></w:r></w:p><w:p><w:pPr><w:jc w:val="both"/><w:spacing w:after="80" w:line="276" w:lineRule="auto"/></w:pPr><w:r><w:rPr><w:rFonts w:ascii="Times New Roman" w:hAnsi="Times New Roman" w:eastAsia="Times New Roman" w:cs="Times New Roman"/><w:sz w:val="23"/><w:szCs w:val="23"/></w:rPr><w:t xml:space="preserve">     8)   Kalkulasi cerdas batas usia pensiun (BUP) otomatis berdasarkan golongan kepangkatan (Perwira 58 th, Bintara/Tamtama 56 th, PNS 60 th).</w:t></w:r></w:p><w:p><w:pPr><w:jc w:val="both"/><w:spacing w:after="80" w:line="276" w:lineRule="auto"/></w:pPr><w:r><w:rPr><w:rFonts w:ascii="Times New Roman" w:hAnsi="Times New Roman" w:eastAsia="Times New Roman" w:cs="Times New Roman"/><w:sz w:val="23"/><w:szCs w:val="23"/></w:rPr><w:t xml:space="preserve">     9)   Deteksi dini prajurit yang telah menduduki jabatan lebih dari 2 (dua) tahun guna mendukung perencanaan Tour of Duty dan Tour of Area (TOD/TOA).</w:t></w:r></w:p><w:p><w:pPr><w:jc w:val="both"/><w:spacing w:after="80" w:line="276" w:lineRule="auto"/></w:pPr><w:r><w:rPr><w:rFonts w:ascii="Times New Roman" w:hAnsi="Times New Roman" w:eastAsia="Times New Roman" w:cs="Times New Roman"/><w:sz w:val="23"/><w:szCs w:val="23"/></w:rPr><w:t xml:space="preserve">     10)  Pengunduhan massal (bulk download) berkas dosir per satuan/personel dalam satu arsip terkompresi ZIP berstruktur rapi.</w:t></w:r></w:p><w:p><w:pPr><w:jc w:val="both"/><w:spacing w:after="80" w:line="276" w:lineRule="auto"/></w:pPr><w:r><w:rPr><w:rFonts w:ascii="Times New Roman" w:hAnsi="Times New Roman" w:eastAsia="Times New Roman" w:cs="Times New Roman"/><w:sz w:val="23"/><w:szCs w:val="23"/></w:rPr><w:t xml:space="preserve">     11)  Penerbitan laporan resmi siap cetak berkop dinas staf personel lengkap dengan kolom tanda tangan komando.</w:t></w:r></w:p><w:p><w:pPr><w:jc w:val="both"/><w:spacing w:after="80" w:line="276" w:lineRule="auto"/></w:pPr><w:r><w:rPr><w:rFonts w:ascii="Times New Roman" w:hAnsi="Times New Roman" w:eastAsia="Times New Roman" w:cs="Times New Roman"/><w:sz w:val="23"/><w:szCs w:val="23"/></w:rPr><w:t xml:space="preserve">     12)  Pencadangan pangkalan data (mysqldump) dan berkas digital secara mandiri disertai pencatatan riwayat audit (audit trail log).</w:t></w:r></w:p><w:p/><w:p><w:pPr><w:jc w:val="start"/><w:spacing w:after="60"/></w:pPr><w:r><w:rPr><w:rFonts w:ascii="Times New Roman" w:hAnsi="Times New Roman" w:eastAsia="Times New Roman" w:cs="Times New Roman"/><w:sz w:val="24"/><w:szCs w:val="24"/><w:b w:val="1"/><w:bCs w:val="1"/></w:rPr><w:t xml:space="preserve">b.   Input Program.</w:t></w:r></w:p><w:p><w:pPr><w:jc w:val="both"/><w:spacing w:after="80" w:line="276" w:lineRule="auto"/></w:pPr><w:r><w:rPr><w:rFonts w:ascii="Times New Roman" w:hAnsi="Times New Roman" w:eastAsia="Times New Roman" w:cs="Times New Roman"/><w:sz w:val="23"/><w:szCs w:val="23"/></w:rPr><w:t xml:space="preserve">File dan tabel basis data yang menjadi masukan bagi sistem TRISULA TNI AD meliputi :</w:t></w:r></w:p><w:tbl><w:tblGrid><w:gridCol w:w="500" w:type="dxa"/><w:gridCol w:w="2200" w:type="dxa"/><w:gridCol w:w="2000" w:type="dxa"/><w:gridCol w:w="1500" w:type="dxa"/><w:gridCol w:w="3000" w:type="dxa"/></w:tblGrid><w:tblPr><w:tblStyle w:val="MilitaryTable"/></w:tblPr><w:tr><w:trPr/><w:tc><w:tcPr><w:tcW w:w="500" w:type="dxa"/><w:shd w:val="clear" w:fill="EAEAEA"/><w:noWrap/></w:tcPr><w:p><w:pPr><w:jc w:val="center"/><w:spacing w:after="60"/></w:pPr><w:r><w:rPr><w:rFonts w:ascii="Times New Roman" w:hAnsi="Times New Roman" w:eastAsia="Times New Roman" w:cs="Times New Roman"/><w:sz w:val="20"/><w:szCs w:val="20"/><w:b w:val="1"/><w:bCs w:val="1"/></w:rPr><w:t xml:space="preserve">No</w:t></w:r></w:p></w:tc><w:tc><w:tcPr><w:tcW w:w="2200" w:type="dxa"/><w:shd w:val="clear" w:fill="EAEAEA"/><w:noWrap/></w:tcPr><w:p><w:pPr><w:jc w:val="center"/><w:spacing w:after="60"/></w:pPr><w:r><w:rPr><w:rFonts w:ascii="Times New Roman" w:hAnsi="Times New Roman" w:eastAsia="Times New Roman" w:cs="Times New Roman"/><w:sz w:val="20"/><w:szCs w:val="20"/><w:b w:val="1"/><w:bCs w:val="1"/></w:rPr><w:t xml:space="preserve">Nama File / Tabel</w:t></w:r></w:p></w:tc><w:tc><w:tcPr><w:tcW w:w="2000" w:type="dxa"/><w:shd w:val="clear" w:fill="EAEAEA"/><w:noWrap/></w:tcPr><w:p><w:pPr><w:jc w:val="center"/><w:spacing w:after="60"/></w:pPr><w:r><w:rPr><w:rFonts w:ascii="Times New Roman" w:hAnsi="Times New Roman" w:eastAsia="Times New Roman" w:cs="Times New Roman"/><w:sz w:val="20"/><w:szCs w:val="20"/><w:b w:val="1"/><w:bCs w:val="1"/></w:rPr><w:t xml:space="preserve">Media Simpan</w:t></w:r></w:p></w:tc><w:tc><w:tcPr><w:tcW w:w="1500" w:type="dxa"/><w:shd w:val="clear" w:fill="EAEAEA"/><w:noWrap/></w:tcPr><w:p><w:pPr><w:jc w:val="center"/><w:spacing w:after="60"/></w:pPr><w:r><w:rPr><w:rFonts w:ascii="Times New Roman" w:hAnsi="Times New Roman" w:eastAsia="Times New Roman" w:cs="Times New Roman"/><w:sz w:val="20"/><w:szCs w:val="20"/><w:b w:val="1"/><w:bCs w:val="1"/></w:rPr><w:t xml:space="preserve">Panjang Record</w:t></w:r></w:p></w:tc><w:tc><w:tcPr><w:tcW w:w="3000" w:type="dxa"/><w:shd w:val="clear" w:fill="EAEAEA"/><w:noWrap/></w:tcPr><w:p><w:pPr><w:jc w:val="center"/><w:spacing w:after="60"/></w:pPr><w:r><w:rPr><w:rFonts w:ascii="Times New Roman" w:hAnsi="Times New Roman" w:eastAsia="Times New Roman" w:cs="Times New Roman"/><w:sz w:val="20"/><w:szCs w:val="20"/><w:b w:val="1"/><w:bCs w:val="1"/></w:rPr><w:t xml:space="preserve">Keterangan / Fungsi Masukan</w:t></w:r></w:p></w:tc></w:tr><w:tr><w:trPr/><w:tc><w:tcPr><w:tcW w:w="500" w:type="dxa"/><w:noWrap/></w:tcPr><w:p><w:pPr><w:jc w:val="center"/><w:spacing w:after="60"/></w:pPr><w:r><w:rPr><w:rFonts w:ascii="Times New Roman" w:hAnsi="Times New Roman" w:eastAsia="Times New Roman" w:cs="Times New Roman"/><w:sz w:val="19"/><w:szCs w:val="19"/></w:rPr><w:t xml:space="preserve">1</w:t></w:r></w:p></w:tc><w:tc><w:tcPr><w:tcW w:w="2200" w:type="dxa"/><w:noWrap/></w:tcPr><w:p><w:pPr><w:jc w:val="start"/><w:spacing w:after="60"/></w:pPr><w:r><w:rPr><w:rFonts w:ascii="Times New Roman" w:hAnsi="Times New Roman" w:eastAsia="Times New Roman" w:cs="Times New Roman"/><w:sz w:val="19"/><w:szCs w:val="19"/><w:b w:val="1"/><w:bCs w:val="1"/></w:rPr><w:t xml:space="preserve">personel</w:t></w:r></w:p></w:tc><w:tc><w:tcPr><w:tcW w:w="2000" w:type="dxa"/><w:noWrap/></w:tcPr><w:p><w:pPr><w:jc w:val="start"/><w:spacing w:after="60"/></w:pPr><w:r><w:rPr><w:rFonts w:ascii="Times New Roman" w:hAnsi="Times New Roman" w:eastAsia="Times New Roman" w:cs="Times New Roman"/><w:sz w:val="19"/><w:szCs w:val="19"/></w:rPr><w:t xml:space="preserve">Harddisk (MySQL DB)</w:t></w:r></w:p></w:tc><w:tc><w:tcPr><w:tcW w:w="1500" w:type="dxa"/><w:noWrap/></w:tcPr><w:p><w:pPr><w:jc w:val="center"/><w:spacing w:after="60"/></w:pPr><w:r><w:rPr><w:rFonts w:ascii="Times New Roman" w:hAnsi="Times New Roman" w:eastAsia="Times New Roman" w:cs="Times New Roman"/><w:sz w:val="19"/><w:szCs w:val="19"/></w:rPr><w:t xml:space="preserve">1.250 Byte</w:t></w:r></w:p></w:tc><w:tc><w:tcPr><w:tcW w:w="3000" w:type="dxa"/><w:noWrap/></w:tcPr><w:p><w:pPr><w:jc w:val="start"/><w:spacing w:after="60"/></w:pPr><w:r><w:rPr><w:rFonts w:ascii="Times New Roman" w:hAnsi="Times New Roman" w:eastAsia="Times New Roman" w:cs="Times New Roman"/><w:sz w:val="19"/><w:szCs w:val="19"/></w:rPr><w:t xml:space="preserve">Data induk identitas prajurit/PNS (NRP, Nama, Pangkat, Korps, Satuan, Jabatan, TMT, Tgl Lahir)</w:t></w:r></w:p></w:tc></w:tr><w:tr><w:trPr/><w:tc><w:tcPr><w:tcW w:w="500" w:type="dxa"/><w:noWrap/></w:tcPr><w:p><w:pPr><w:jc w:val="center"/><w:spacing w:after="60"/></w:pPr><w:r><w:rPr><w:rFonts w:ascii="Times New Roman" w:hAnsi="Times New Roman" w:eastAsia="Times New Roman" w:cs="Times New Roman"/><w:sz w:val="19"/><w:szCs w:val="19"/></w:rPr><w:t xml:space="preserve">2</w:t></w:r></w:p></w:tc><w:tc><w:tcPr><w:tcW w:w="2200" w:type="dxa"/><w:noWrap/></w:tcPr><w:p><w:pPr><w:jc w:val="start"/><w:spacing w:after="60"/></w:pPr><w:r><w:rPr><w:rFonts w:ascii="Times New Roman" w:hAnsi="Times New Roman" w:eastAsia="Times New Roman" w:cs="Times New Roman"/><w:sz w:val="19"/><w:szCs w:val="19"/><w:b w:val="1"/><w:bCs w:val="1"/></w:rPr><w:t xml:space="preserve">users</w:t></w:r></w:p></w:tc><w:tc><w:tcPr><w:tcW w:w="2000" w:type="dxa"/><w:noWrap/></w:tcPr><w:p><w:pPr><w:jc w:val="start"/><w:spacing w:after="60"/></w:pPr><w:r><w:rPr><w:rFonts w:ascii="Times New Roman" w:hAnsi="Times New Roman" w:eastAsia="Times New Roman" w:cs="Times New Roman"/><w:sz w:val="19"/><w:szCs w:val="19"/></w:rPr><w:t xml:space="preserve">Harddisk (MySQL DB)</w:t></w:r></w:p></w:tc><w:tc><w:tcPr><w:tcW w:w="1500" w:type="dxa"/><w:noWrap/></w:tcPr><w:p><w:pPr><w:jc w:val="center"/><w:spacing w:after="60"/></w:pPr><w:r><w:rPr><w:rFonts w:ascii="Times New Roman" w:hAnsi="Times New Roman" w:eastAsia="Times New Roman" w:cs="Times New Roman"/><w:sz w:val="19"/><w:szCs w:val="19"/></w:rPr><w:t xml:space="preserve">420 Byte</w:t></w:r></w:p></w:tc><w:tc><w:tcPr><w:tcW w:w="3000" w:type="dxa"/><w:noWrap/></w:tcPr><w:p><w:pPr><w:jc w:val="start"/><w:spacing w:after="60"/></w:pPr><w:r><w:rPr><w:rFonts w:ascii="Times New Roman" w:hAnsi="Times New Roman" w:eastAsia="Times New Roman" w:cs="Times New Roman"/><w:sz w:val="19"/><w:szCs w:val="19"/></w:rPr><w:t xml:space="preserve">Data kredensial akun, hash password bcrypt, role (admin/personel), status approval</w:t></w:r></w:p></w:tc></w:tr><w:tr><w:trPr/><w:tc><w:tcPr><w:tcW w:w="500" w:type="dxa"/><w:noWrap/></w:tcPr><w:p><w:pPr><w:jc w:val="center"/><w:spacing w:after="60"/></w:pPr><w:r><w:rPr><w:rFonts w:ascii="Times New Roman" w:hAnsi="Times New Roman" w:eastAsia="Times New Roman" w:cs="Times New Roman"/><w:sz w:val="19"/><w:szCs w:val="19"/></w:rPr><w:t xml:space="preserve">3</w:t></w:r></w:p></w:tc><w:tc><w:tcPr><w:tcW w:w="2200" w:type="dxa"/><w:noWrap/></w:tcPr><w:p><w:pPr><w:jc w:val="start"/><w:spacing w:after="60"/></w:pPr><w:r><w:rPr><w:rFonts w:ascii="Times New Roman" w:hAnsi="Times New Roman" w:eastAsia="Times New Roman" w:cs="Times New Roman"/><w:sz w:val="19"/><w:szCs w:val="19"/><w:b w:val="1"/><w:bCs w:val="1"/></w:rPr><w:t xml:space="preserve">dosir_master</w:t></w:r></w:p></w:tc><w:tc><w:tcPr><w:tcW w:w="2000" w:type="dxa"/><w:noWrap/></w:tcPr><w:p><w:pPr><w:jc w:val="start"/><w:spacing w:after="60"/></w:pPr><w:r><w:rPr><w:rFonts w:ascii="Times New Roman" w:hAnsi="Times New Roman" w:eastAsia="Times New Roman" w:cs="Times New Roman"/><w:sz w:val="19"/><w:szCs w:val="19"/></w:rPr><w:t xml:space="preserve">Harddisk (MySQL DB)</w:t></w:r></w:p></w:tc><w:tc><w:tcPr><w:tcW w:w="1500" w:type="dxa"/><w:noWrap/></w:tcPr><w:p><w:pPr><w:jc w:val="center"/><w:spacing w:after="60"/></w:pPr><w:r><w:rPr><w:rFonts w:ascii="Times New Roman" w:hAnsi="Times New Roman" w:eastAsia="Times New Roman" w:cs="Times New Roman"/><w:sz w:val="19"/><w:szCs w:val="19"/></w:rPr><w:t xml:space="preserve">240 Byte</w:t></w:r></w:p></w:tc><w:tc><w:tcPr><w:tcW w:w="3000" w:type="dxa"/><w:noWrap/></w:tcPr><w:p><w:pPr><w:jc w:val="start"/><w:spacing w:after="60"/></w:pPr><w:r><w:rPr><w:rFonts w:ascii="Times New Roman" w:hAnsi="Times New Roman" w:eastAsia="Times New Roman" w:cs="Times New Roman"/><w:sz w:val="19"/><w:szCs w:val="19"/></w:rPr><w:t xml:space="preserve">Tabel referensi baku 33 jenis dosir (Kode 01 s.d. 33, nama berkas, status wajib)</w:t></w:r></w:p></w:tc></w:tr><w:tr><w:trPr/><w:tc><w:tcPr><w:tcW w:w="500" w:type="dxa"/><w:noWrap/></w:tcPr><w:p><w:pPr><w:jc w:val="center"/><w:spacing w:after="60"/></w:pPr><w:r><w:rPr><w:rFonts w:ascii="Times New Roman" w:hAnsi="Times New Roman" w:eastAsia="Times New Roman" w:cs="Times New Roman"/><w:sz w:val="19"/><w:szCs w:val="19"/></w:rPr><w:t xml:space="preserve">4</w:t></w:r></w:p></w:tc><w:tc><w:tcPr><w:tcW w:w="2200" w:type="dxa"/><w:noWrap/></w:tcPr><w:p><w:pPr><w:jc w:val="start"/><w:spacing w:after="60"/></w:pPr><w:r><w:rPr><w:rFonts w:ascii="Times New Roman" w:hAnsi="Times New Roman" w:eastAsia="Times New Roman" w:cs="Times New Roman"/><w:sz w:val="19"/><w:szCs w:val="19"/><w:b w:val="1"/><w:bCs w:val="1"/></w:rPr><w:t xml:space="preserve">dosir_files</w:t></w:r></w:p></w:tc><w:tc><w:tcPr><w:tcW w:w="2000" w:type="dxa"/><w:noWrap/></w:tcPr><w:p><w:pPr><w:jc w:val="start"/><w:spacing w:after="60"/></w:pPr><w:r><w:rPr><w:rFonts w:ascii="Times New Roman" w:hAnsi="Times New Roman" w:eastAsia="Times New Roman" w:cs="Times New Roman"/><w:sz w:val="19"/><w:szCs w:val="19"/></w:rPr><w:t xml:space="preserve">Harddisk (MySQL DB)</w:t></w:r></w:p></w:tc><w:tc><w:tcPr><w:tcW w:w="1500" w:type="dxa"/><w:noWrap/></w:tcPr><w:p><w:pPr><w:jc w:val="center"/><w:spacing w:after="60"/></w:pPr><w:r><w:rPr><w:rFonts w:ascii="Times New Roman" w:hAnsi="Times New Roman" w:eastAsia="Times New Roman" w:cs="Times New Roman"/><w:sz w:val="19"/><w:szCs w:val="19"/></w:rPr><w:t xml:space="preserve">980 Byte</w:t></w:r></w:p></w:tc><w:tc><w:tcPr><w:tcW w:w="3000" w:type="dxa"/><w:noWrap/></w:tcPr><w:p><w:pPr><w:jc w:val="start"/><w:spacing w:after="60"/></w:pPr><w:r><w:rPr><w:rFonts w:ascii="Times New Roman" w:hAnsi="Times New Roman" w:eastAsia="Times New Roman" w:cs="Times New Roman"/><w:sz w:val="19"/><w:szCs w:val="19"/></w:rPr><w:t xml:space="preserve">Metadata berkas terunggah, status verifikasi, hash SHA-256, kode TTE, catatan verifikasi</w:t></w:r></w:p></w:tc></w:tr><w:tr><w:trPr/><w:tc><w:tcPr><w:tcW w:w="500" w:type="dxa"/><w:noWrap/></w:tcPr><w:p><w:pPr><w:jc w:val="center"/><w:spacing w:after="60"/></w:pPr><w:r><w:rPr><w:rFonts w:ascii="Times New Roman" w:hAnsi="Times New Roman" w:eastAsia="Times New Roman" w:cs="Times New Roman"/><w:sz w:val="19"/><w:szCs w:val="19"/></w:rPr><w:t xml:space="preserve">5</w:t></w:r></w:p></w:tc><w:tc><w:tcPr><w:tcW w:w="2200" w:type="dxa"/><w:noWrap/></w:tcPr><w:p><w:pPr><w:jc w:val="start"/><w:spacing w:after="60"/></w:pPr><w:r><w:rPr><w:rFonts w:ascii="Times New Roman" w:hAnsi="Times New Roman" w:eastAsia="Times New Roman" w:cs="Times New Roman"/><w:sz w:val="19"/><w:szCs w:val="19"/><w:b w:val="1"/><w:bCs w:val="1"/></w:rPr><w:t xml:space="preserve">uploads/FOLDER 01..33</w:t></w:r></w:p></w:tc><w:tc><w:tcPr><w:tcW w:w="2000" w:type="dxa"/><w:noWrap/></w:tcPr><w:p><w:pPr><w:jc w:val="start"/><w:spacing w:after="60"/></w:pPr><w:r><w:rPr><w:rFonts w:ascii="Times New Roman" w:hAnsi="Times New Roman" w:eastAsia="Times New Roman" w:cs="Times New Roman"/><w:sz w:val="19"/><w:szCs w:val="19"/></w:rPr><w:t xml:space="preserve">Harddisk (Storage PDF)</w:t></w:r></w:p></w:tc><w:tc><w:tcPr><w:tcW w:w="1500" w:type="dxa"/><w:noWrap/></w:tcPr><w:p><w:pPr><w:jc w:val="center"/><w:spacing w:after="60"/></w:pPr><w:r><w:rPr><w:rFonts w:ascii="Times New Roman" w:hAnsi="Times New Roman" w:eastAsia="Times New Roman" w:cs="Times New Roman"/><w:sz w:val="19"/><w:szCs w:val="19"/></w:rPr><w:t xml:space="preserve">Variabel (s.d. 10 MB)</w:t></w:r></w:p></w:tc><w:tc><w:tcPr><w:tcW w:w="3000" w:type="dxa"/><w:noWrap/></w:tcPr><w:p><w:pPr><w:jc w:val="start"/><w:spacing w:after="60"/></w:pPr><w:r><w:rPr><w:rFonts w:ascii="Times New Roman" w:hAnsi="Times New Roman" w:eastAsia="Times New Roman" w:cs="Times New Roman"/><w:sz w:val="19"/><w:szCs w:val="19"/></w:rPr><w:t xml:space="preserve">File fisik digital PDF dokumen 33 dosir hasil unggahan/scan kamera prajurit</w:t></w:r></w:p></w:tc></w:tr><w:tr><w:trPr/><w:tc><w:tcPr><w:tcW w:w="500" w:type="dxa"/><w:noWrap/></w:tcPr><w:p><w:pPr><w:jc w:val="center"/><w:spacing w:after="60"/></w:pPr><w:r><w:rPr><w:rFonts w:ascii="Times New Roman" w:hAnsi="Times New Roman" w:eastAsia="Times New Roman" w:cs="Times New Roman"/><w:sz w:val="19"/><w:szCs w:val="19"/></w:rPr><w:t xml:space="preserve">6</w:t></w:r></w:p></w:tc><w:tc><w:tcPr><w:tcW w:w="2200" w:type="dxa"/><w:noWrap/></w:tcPr><w:p><w:pPr><w:jc w:val="start"/><w:spacing w:after="60"/></w:pPr><w:r><w:rPr><w:rFonts w:ascii="Times New Roman" w:hAnsi="Times New Roman" w:eastAsia="Times New Roman" w:cs="Times New Roman"/><w:sz w:val="19"/><w:szCs w:val="19"/><w:b w:val="1"/><w:bCs w:val="1"/></w:rPr><w:t xml:space="preserve">settings</w:t></w:r></w:p></w:tc><w:tc><w:tcPr><w:tcW w:w="2000" w:type="dxa"/><w:noWrap/></w:tcPr><w:p><w:pPr><w:jc w:val="start"/><w:spacing w:after="60"/></w:pPr><w:r><w:rPr><w:rFonts w:ascii="Times New Roman" w:hAnsi="Times New Roman" w:eastAsia="Times New Roman" w:cs="Times New Roman"/><w:sz w:val="19"/><w:szCs w:val="19"/></w:rPr><w:t xml:space="preserve">Harddisk (MySQL DB)</w:t></w:r></w:p></w:tc><w:tc><w:tcPr><w:tcW w:w="1500" w:type="dxa"/><w:noWrap/></w:tcPr><w:p><w:pPr><w:jc w:val="center"/><w:spacing w:after="60"/></w:pPr><w:r><w:rPr><w:rFonts w:ascii="Times New Roman" w:hAnsi="Times New Roman" w:eastAsia="Times New Roman" w:cs="Times New Roman"/><w:sz w:val="19"/><w:szCs w:val="19"/></w:rPr><w:t xml:space="preserve">280 Byte</w:t></w:r></w:p></w:tc><w:tc><w:tcPr><w:tcW w:w="3000" w:type="dxa"/><w:noWrap/></w:tcPr><w:p><w:pPr><w:jc w:val="start"/><w:spacing w:after="60"/></w:pPr><w:r><w:rPr><w:rFonts w:ascii="Times New Roman" w:hAnsi="Times New Roman" w:eastAsia="Times New Roman" w:cs="Times New Roman"/><w:sz w:val="19"/><w:szCs w:val="19"/></w:rPr><w:t xml:space="preserve">Pengaturan dinamis identitas aplikasi, brand, watermark, logo, dan batas tahun jabatan</w:t></w:r></w:p></w:tc></w:tr><w:tr><w:trPr/><w:tc><w:tcPr><w:tcW w:w="500" w:type="dxa"/><w:noWrap/></w:tcPr><w:p><w:pPr><w:jc w:val="center"/><w:spacing w:after="60"/></w:pPr><w:r><w:rPr><w:rFonts w:ascii="Times New Roman" w:hAnsi="Times New Roman" w:eastAsia="Times New Roman" w:cs="Times New Roman"/><w:sz w:val="19"/><w:szCs w:val="19"/></w:rPr><w:t xml:space="preserve">7</w:t></w:r></w:p></w:tc><w:tc><w:tcPr><w:tcW w:w="2200" w:type="dxa"/><w:noWrap/></w:tcPr><w:p><w:pPr><w:jc w:val="start"/><w:spacing w:after="60"/></w:pPr><w:r><w:rPr><w:rFonts w:ascii="Times New Roman" w:hAnsi="Times New Roman" w:eastAsia="Times New Roman" w:cs="Times New Roman"/><w:sz w:val="19"/><w:szCs w:val="19"/><w:b w:val="1"/><w:bCs w:val="1"/></w:rPr><w:t xml:space="preserve">activity_log</w:t></w:r></w:p></w:tc><w:tc><w:tcPr><w:tcW w:w="2000" w:type="dxa"/><w:noWrap/></w:tcPr><w:p><w:pPr><w:jc w:val="start"/><w:spacing w:after="60"/></w:pPr><w:r><w:rPr><w:rFonts w:ascii="Times New Roman" w:hAnsi="Times New Roman" w:eastAsia="Times New Roman" w:cs="Times New Roman"/><w:sz w:val="19"/><w:szCs w:val="19"/></w:rPr><w:t xml:space="preserve">Harddisk (MySQL DB)</w:t></w:r></w:p></w:tc><w:tc><w:tcPr><w:tcW w:w="1500" w:type="dxa"/><w:noWrap/></w:tcPr><w:p><w:pPr><w:jc w:val="center"/><w:spacing w:after="60"/></w:pPr><w:r><w:rPr><w:rFonts w:ascii="Times New Roman" w:hAnsi="Times New Roman" w:eastAsia="Times New Roman" w:cs="Times New Roman"/><w:sz w:val="19"/><w:szCs w:val="19"/></w:rPr><w:t xml:space="preserve">360 Byte</w:t></w:r></w:p></w:tc><w:tc><w:tcPr><w:tcW w:w="3000" w:type="dxa"/><w:noWrap/></w:tcPr><w:p><w:pPr><w:jc w:val="start"/><w:spacing w:after="60"/></w:pPr><w:r><w:rPr><w:rFonts w:ascii="Times New Roman" w:hAnsi="Times New Roman" w:eastAsia="Times New Roman" w:cs="Times New Roman"/><w:sz w:val="19"/><w:szCs w:val="19"/></w:rPr><w:t xml:space="preserve">Perekaman log audit seluruh aksi mutasi data, login, approval, dan verifikasi berkas</w:t></w:r></w:p></w:tc></w:tr><w:tr><w:trPr/><w:tc><w:tcPr><w:tcW w:w="500" w:type="dxa"/><w:noWrap/></w:tcPr><w:p><w:pPr><w:jc w:val="center"/><w:spacing w:after="60"/></w:pPr><w:r><w:rPr><w:rFonts w:ascii="Times New Roman" w:hAnsi="Times New Roman" w:eastAsia="Times New Roman" w:cs="Times New Roman"/><w:sz w:val="19"/><w:szCs w:val="19"/></w:rPr><w:t xml:space="preserve">8</w:t></w:r></w:p></w:tc><w:tc><w:tcPr><w:tcW w:w="2200" w:type="dxa"/><w:noWrap/></w:tcPr><w:p><w:pPr><w:jc w:val="start"/><w:spacing w:after="60"/></w:pPr><w:r><w:rPr><w:rFonts w:ascii="Times New Roman" w:hAnsi="Times New Roman" w:eastAsia="Times New Roman" w:cs="Times New Roman"/><w:sz w:val="19"/><w:szCs w:val="19"/><w:b w:val="1"/><w:bCs w:val="1"/></w:rPr><w:t xml:space="preserve">login_attempts</w:t></w:r></w:p></w:tc><w:tc><w:tcPr><w:tcW w:w="2000" w:type="dxa"/><w:noWrap/></w:tcPr><w:p><w:pPr><w:jc w:val="start"/><w:spacing w:after="60"/></w:pPr><w:r><w:rPr><w:rFonts w:ascii="Times New Roman" w:hAnsi="Times New Roman" w:eastAsia="Times New Roman" w:cs="Times New Roman"/><w:sz w:val="19"/><w:szCs w:val="19"/></w:rPr><w:t xml:space="preserve">Harddisk (MySQL DB)</w:t></w:r></w:p></w:tc><w:tc><w:tcPr><w:tcW w:w="1500" w:type="dxa"/><w:noWrap/></w:tcPr><w:p><w:pPr><w:jc w:val="center"/><w:spacing w:after="60"/></w:pPr><w:r><w:rPr><w:rFonts w:ascii="Times New Roman" w:hAnsi="Times New Roman" w:eastAsia="Times New Roman" w:cs="Times New Roman"/><w:sz w:val="19"/><w:szCs w:val="19"/></w:rPr><w:t xml:space="preserve">160 Byte</w:t></w:r></w:p></w:tc><w:tc><w:tcPr><w:tcW w:w="3000" w:type="dxa"/><w:noWrap/></w:tcPr><w:p><w:pPr><w:jc w:val="start"/><w:spacing w:after="60"/></w:pPr><w:r><w:rPr><w:rFonts w:ascii="Times New Roman" w:hAnsi="Times New Roman" w:eastAsia="Times New Roman" w:cs="Times New Roman"/><w:sz w:val="19"/><w:szCs w:val="19"/></w:rPr><w:t xml:space="preserve">Perekaman log percobaan login untuk proteksi keamanan brute-force attack</w:t></w:r></w:p></w:tc></w:tr></w:tbl><w:p/><w:p><w:pPr><w:jc w:val="start"/><w:spacing w:after="60"/></w:pPr><w:r><w:rPr><w:rFonts w:ascii="Times New Roman" w:hAnsi="Times New Roman" w:eastAsia="Times New Roman" w:cs="Times New Roman"/><w:sz w:val="24"/><w:szCs w:val="24"/><w:b w:val="1"/><w:bCs w:val="1"/></w:rPr><w:t xml:space="preserve">c.   Proses Pengolahan.</w:t></w:r></w:p><w:p><w:pPr><w:jc w:val="both"/><w:spacing w:after="80" w:line="276" w:lineRule="auto"/></w:pPr><w:r><w:rPr><w:rFonts w:ascii="Times New Roman" w:hAnsi="Times New Roman" w:eastAsia="Times New Roman" w:cs="Times New Roman"/><w:sz w:val="23"/><w:szCs w:val="23"/></w:rPr><w:t xml:space="preserve">Rangkaian tahapan pengolahan data yang diselenggarakan oleh aplikasi TRISULA TNI AD dijabarkan sebagai berikut :</w:t></w:r></w:p><w:p><w:pPr><w:jc w:val="both"/><w:spacing w:after="80" w:line="276" w:lineRule="auto"/></w:pPr><w:r><w:rPr><w:rFonts w:ascii="Times New Roman" w:hAnsi="Times New Roman" w:eastAsia="Times New Roman" w:cs="Times New Roman"/><w:sz w:val="23"/><w:szCs w:val="23"/></w:rPr><w:t xml:space="preserve">     1)   Tahap Registrasi & Approval : Personel mengisi formulir pendaftaran. Sistem memvalidasi format NRP dan mencegah duplikasi data. Rekord personel tersimpan dan akun pengguna otomatis dibuat dengan status "pending". Administrator melakukan telaah dan persetujuan (approval) sehingga akun aktif.</w:t></w:r></w:p><w:p><w:pPr><w:jc w:val="both"/><w:spacing w:after="80" w:line="276" w:lineRule="auto"/></w:pPr><w:r><w:rPr><w:rFonts w:ascii="Times New Roman" w:hAnsi="Times New Roman" w:eastAsia="Times New Roman" w:cs="Times New Roman"/><w:sz w:val="23"/><w:szCs w:val="23"/></w:rPr><w:t xml:space="preserve">     2)   Tahap Pengunggahan / Pemindaian Dosir : Personel memilih jenis dosir dari 33 pilihan baku. Berkas diunggah dalam format PDF atau dipindai langsung lewat kamera. Sistem memeriksa ekstensi file, MIME type (application/pdf), serta batas ukuran maksimal (10 MB). File master bersih disimpan pada raw_file_path.</w:t></w:r></w:p><w:p><w:pPr><w:jc w:val="both"/><w:spacing w:after="80" w:line="276" w:lineRule="auto"/></w:pPr><w:r><w:rPr><w:rFonts w:ascii="Times New Roman" w:hAnsi="Times New Roman" w:eastAsia="Times New Roman" w:cs="Times New Roman"/><w:sz w:val="23"/><w:szCs w:val="23"/></w:rPr><w:t xml:space="preserve">     3)   Tahap Penamaan File & Struktur Direktori Otomatis : Sistem membentuk nama file baku "{NRP}_{KODE}.pdf". Apabila personel mengunggah lebih dari satu berkas pada jenis dosir yang sama (misalnya sertifikat dikmil lanjutan), sistem secara otomatis memberikan indeks abjad "{NRP}_{KODE}a.pdf", "{NRP}_{KODE}b.pdf", dst., dan menempatkannya ke dalam folder fisik "uploads/FOLDER {kode}/".</w:t></w:r></w:p><w:p><w:pPr><w:jc w:val="both"/><w:spacing w:after="80" w:line="276" w:lineRule="auto"/></w:pPr><w:r><w:rPr><w:rFonts w:ascii="Times New Roman" w:hAnsi="Times New Roman" w:eastAsia="Times New Roman" w:cs="Times New Roman"/><w:sz w:val="23"/><w:szCs w:val="23"/></w:rPr><w:t xml:space="preserve">     4)   Tahap Watermarking Pra-Verifikasi : Sebelum berkas disetujui, sistem membubuhkan tanda air visual status "PENDING APPROVAL" dan catatan kaki peninjauan agar dokumen belum memiliki kekuatan hukum sebelum divalidasi.</w:t></w:r></w:p><w:p><w:pPr><w:jc w:val="both"/><w:spacing w:after="80" w:line="276" w:lineRule="auto"/></w:pPr><w:r><w:rPr><w:rFonts w:ascii="Times New Roman" w:hAnsi="Times New Roman" w:eastAsia="Times New Roman" w:cs="Times New Roman"/><w:sz w:val="23"/><w:szCs w:val="23"/></w:rPr><w:t xml:space="preserve">     5)   Tahap Verifikasi & Penerbitan TTE : Administrator meneliti keabsahan isi berkas. Jika disetujui (Approved), sistem mengambil berkas master bersih, mengkalkulasi cryptographic hash SHA-256 dokumen, men-generate kode unik TTE resmi ("TTE-TRISULA-YYYYMM-ID-TOKEN"), menyusun tautan QR Code verifikasi publik, serta menyematkan running header dan stempel digital TTE pada halaman terakhir PDF menggunakan pustaka FPDI dan TCPDF.</w:t></w:r></w:p><w:p><w:pPr><w:jc w:val="both"/><w:spacing w:after="80" w:line="276" w:lineRule="auto"/></w:pPr><w:r><w:rPr><w:rFonts w:ascii="Times New Roman" w:hAnsi="Times New Roman" w:eastAsia="Times New Roman" w:cs="Times New Roman"/><w:sz w:val="23"/><w:szCs w:val="23"/></w:rPr><w:t xml:space="preserve">     6)   Tahap Analitik & Monitoring : Sistem menghitung rasio kelengkapan berkas personel (Approved / 33 * 100%). Menghitung selisih tahun antara TMT Jabatan dengan tanggal sekarang; jika > 2 tahun, ditandai sebagai kandidat rotasi jabatan. Menghitung tanggal lahir terhadap batas usia pensiun sesuai golongan guna memproyeksikan TMT Pensiun.</w:t></w:r></w:p><w:p><w:pPr><w:jc w:val="both"/><w:spacing w:after="80" w:line="276" w:lineRule="auto"/></w:pPr><w:r><w:rPr><w:rFonts w:ascii="Times New Roman" w:hAnsi="Times New Roman" w:eastAsia="Times New Roman" w:cs="Times New Roman"/><w:sz w:val="23"/><w:szCs w:val="23"/></w:rPr><w:t xml:space="preserve">     7)   Tahap Pelaporan & Ekspor : Mengompilasi data dalam format cetak standar militer berkop dinas Staf Personel serta menyediakan layanan pengemasan bulk download ZIP per prajurit.</w:t></w:r></w:p><w:p/><w:p><w:pPr><w:jc w:val="start"/><w:spacing w:after="60"/></w:pPr><w:r><w:rPr><w:rFonts w:ascii="Times New Roman" w:hAnsi="Times New Roman" w:eastAsia="Times New Roman" w:cs="Times New Roman"/><w:sz w:val="24"/><w:szCs w:val="24"/><w:b w:val="1"/><w:bCs w:val="1"/></w:rPr><w:t xml:space="preserve">d.   Output Program.</w:t></w:r></w:p><w:p><w:pPr><w:jc w:val="both"/><w:spacing w:after="80" w:line="276" w:lineRule="auto"/></w:pPr><w:r><w:rPr><w:rFonts w:ascii="Times New Roman" w:hAnsi="Times New Roman" w:eastAsia="Times New Roman" w:cs="Times New Roman"/><w:sz w:val="23"/><w:szCs w:val="23"/></w:rPr><w:t xml:space="preserve">Keluaran yang diproduksi oleh program aplikasi TRISULA TNI AD terdiri atas :</w:t></w:r></w:p><w:p><w:pPr><w:jc w:val="start"/><w:spacing w:after="60"/></w:pPr><w:r><w:rPr><w:rFonts w:ascii="Times New Roman" w:hAnsi="Times New Roman" w:eastAsia="Times New Roman" w:cs="Times New Roman"/><w:sz w:val="23"/><w:szCs w:val="23"/><w:b w:val="1"/><w:bCs w:val="1"/></w:rPr><w:t xml:space="preserve">     1)   Keluaran Tampilan Layar (Display) :</w:t></w:r></w:p><w:p><w:pPr><w:jc w:val="both"/><w:spacing w:after="80" w:line="276" w:lineRule="auto"/></w:pPr><w:r><w:rPr><w:rFonts w:ascii="Times New Roman" w:hAnsi="Times New Roman" w:eastAsia="Times New Roman" w:cs="Times New Roman"/><w:sz w:val="23"/><w:szCs w:val="23"/></w:rPr><w:t xml:space="preserve">          a)   Dashboard Personel : Visualisasi progress bar kelengkapan 33 dosir, status verifikasi tiap berkas (Pending, Approved, Rejected), dan rincian data prajurit.</w:t></w:r></w:p><w:p><w:pPr><w:jc w:val="both"/><w:spacing w:after="80" w:line="276" w:lineRule="auto"/></w:pPr><w:r><w:rPr><w:rFonts w:ascii="Times New Roman" w:hAnsi="Times New Roman" w:eastAsia="Times New Roman" w:cs="Times New Roman"/><w:sz w:val="23"/><w:szCs w:val="23"/></w:rPr><w:t xml:space="preserve">          b)   Dashboard Administrator : Statistik rekapitulasi total personel, rata-rata persentase kelengkapan satuan, daftar tunggu approval akun, daftar berkas pending verifikasi, daftar prajurit siap rotasi (> 2 tahun), dan proyeksi pensiun tahun berjalan.</w:t></w:r></w:p><w:p><w:pPr><w:jc w:val="both"/><w:spacing w:after="80" w:line="276" w:lineRule="auto"/></w:pPr><w:r><w:rPr><w:rFonts w:ascii="Times New Roman" w:hAnsi="Times New Roman" w:eastAsia="Times New Roman" w:cs="Times New Roman"/><w:sz w:val="23"/><w:szCs w:val="23"/></w:rPr><w:t xml:space="preserve">          c)   Halaman Verifikasi Publik (verify.php) : Tampilan sertifikasi keabsahan dokumen digital saat QR Code dipindai, memuat rincian nama pemilik berkas, jenis dosir, nama dan pangkat pejabat verifikator, waktu pengesahan, dan hash integritas SHA-256.</w:t></w:r></w:p><w:p><w:pPr><w:jc w:val="start"/><w:spacing w:after="60"/></w:pPr><w:r><w:rPr><w:rFonts w:ascii="Times New Roman" w:hAnsi="Times New Roman" w:eastAsia="Times New Roman" w:cs="Times New Roman"/><w:sz w:val="23"/><w:szCs w:val="23"/><w:b w:val="1"/><w:bCs w:val="1"/></w:rPr><w:t xml:space="preserve">     2)   Keluaran Cetakan (Print Out) & Berkas Digital :</w:t></w:r></w:p><w:p><w:pPr><w:jc w:val="both"/><w:spacing w:after="80" w:line="276" w:lineRule="auto"/></w:pPr><w:r><w:rPr><w:rFonts w:ascii="Times New Roman" w:hAnsi="Times New Roman" w:eastAsia="Times New Roman" w:cs="Times New Roman"/><w:sz w:val="23"/><w:szCs w:val="23"/></w:rPr><w:t xml:space="preserve">          a)   Berkas Dokumen PDF Ber-TTE Resmi : File PDF asli yang telah dibubuhi stempel digital dinas, running header pengesahan, kode registrasi TTE, dan QR Code keabsahan.</w:t></w:r></w:p><w:p><w:pPr><w:jc w:val="both"/><w:spacing w:after="80" w:line="276" w:lineRule="auto"/></w:pPr><w:r><w:rPr><w:rFonts w:ascii="Times New Roman" w:hAnsi="Times New Roman" w:eastAsia="Times New Roman" w:cs="Times New Roman"/><w:sz w:val="23"/><w:szCs w:val="23"/></w:rPr><w:t xml:space="preserve">          b)   Laporan Resmi Rekapitulasi Kelengkapan Dosir Satuan siap cetak (Kop Staf Personel & Kolom Tanda Tangan Komandan).</w:t></w:r></w:p><w:p><w:pPr><w:jc w:val="both"/><w:spacing w:after="80" w:line="276" w:lineRule="auto"/></w:pPr><w:r><w:rPr><w:rFonts w:ascii="Times New Roman" w:hAnsi="Times New Roman" w:eastAsia="Times New Roman" w:cs="Times New Roman"/><w:sz w:val="23"/><w:szCs w:val="23"/></w:rPr><w:t xml:space="preserve">          c)   Laporan Proyeksi Pensiun Prajurit & PNS TNI AD siap cetak.</w:t></w:r></w:p><w:p><w:pPr><w:jc w:val="both"/><w:spacing w:after="80" w:line="276" w:lineRule="auto"/></w:pPr><w:r><w:rPr><w:rFonts w:ascii="Times New Roman" w:hAnsi="Times New Roman" w:eastAsia="Times New Roman" w:cs="Times New Roman"/><w:sz w:val="23"/><w:szCs w:val="23"/></w:rPr><w:t xml:space="preserve">          d)   Laporan Masa Jabatan Personel (> 2 Tahun) siap cetak.</w:t></w:r></w:p><w:p><w:pPr><w:jc w:val="both"/><w:spacing w:after="80" w:line="276" w:lineRule="auto"/></w:pPr><w:r><w:rPr><w:rFonts w:ascii="Times New Roman" w:hAnsi="Times New Roman" w:eastAsia="Times New Roman" w:cs="Times New Roman"/><w:sz w:val="23"/><w:szCs w:val="23"/></w:rPr><w:t xml:space="preserve">          e)   Berkas Arsip ZIP Hasil Unduh Massal (Bulk Download) berisi folder-folder terstruktur dosir per prajurit.</w:t></w:r></w:p><w:p><w:r><w:br w:type="page"/></w:r></w:p><w:p><w:pPr><w:jc w:val="start"/><w:spacing w:after="60"/></w:pPr><w:r><w:rPr><w:rFonts w:ascii="Times New Roman" w:hAnsi="Times New Roman" w:eastAsia="Times New Roman" w:cs="Times New Roman"/><w:sz w:val="24"/><w:szCs w:val="24"/><w:b w:val="1"/><w:bCs w:val="1"/></w:rPr><w:t xml:space="preserve">11.  Diagram Arus Data (Data Flow Diagram).</w:t></w:r></w:p><w:p><w:pPr><w:jc w:val="both"/><w:spacing w:after="80" w:line="276" w:lineRule="auto"/></w:pPr><w:r><w:rPr><w:rFonts w:ascii="Times New Roman" w:hAnsi="Times New Roman" w:eastAsia="Times New Roman" w:cs="Times New Roman"/><w:sz w:val="23"/><w:szCs w:val="23"/></w:rPr><w:t xml:space="preserve">Diagram arus data menggambarkan asal sumber perolehan data, proses transformasi komputasi, penyimpanan pada tabel basis data, serta distribusi informasi kepada para pengguna yang berhak.</w:t></w:r></w:p><w:p/><w:p><w:pPr><w:jc w:val="start"/><w:spacing w:after="60"/></w:pPr><w:r><w:rPr><w:rFonts w:ascii="Times New Roman" w:hAnsi="Times New Roman" w:eastAsia="Times New Roman" w:cs="Times New Roman"/><w:sz w:val="24"/><w:szCs w:val="24"/><w:b w:val="1"/><w:bCs w:val="1"/></w:rPr><w:t xml:space="preserve">a.   Diagram Konteks (Context Diagram / DFD Level 0).</w:t></w:r></w:p><w:p><w:pPr><w:jc w:val="both"/><w:spacing w:after="80" w:line="276" w:lineRule="auto"/></w:pPr><w:r><w:rPr><w:rFonts w:ascii="Times New Roman" w:hAnsi="Times New Roman" w:eastAsia="Times New Roman" w:cs="Times New Roman"/><w:sz w:val="23"/><w:szCs w:val="23"/></w:rPr><w:t xml:space="preserve">Pada tingkat konteks, sistem TRISULA TNI AD berinteraksi dengan 4 (empat) entitas eksternal :</w:t></w:r></w:p><w:tbl><w:tblGrid><w:gridCol w:w="2200" w:type="dxa"/><w:gridCol w:w="3500" w:type="dxa"/><w:gridCol w:w="3500" w:type="dxa"/></w:tblGrid><w:tblPr><w:tblStyle w:val="MilitaryTable"/></w:tblPr><w:tr><w:trPr/><w:tc><w:tcPr><w:tcW w:w="2200" w:type="dxa"/><w:shd w:val="clear" w:fill="EAEAEA"/><w:noWrap/></w:tcPr><w:p><w:pPr><w:jc w:val="center"/><w:spacing w:after="60"/></w:pPr><w:r><w:rPr><w:rFonts w:ascii="Times New Roman" w:hAnsi="Times New Roman" w:eastAsia="Times New Roman" w:cs="Times New Roman"/><w:sz w:val="20"/><w:szCs w:val="20"/><w:b w:val="1"/><w:bCs w:val="1"/></w:rPr><w:t xml:space="preserve">Entitas Luar</w:t></w:r></w:p></w:tc><w:tc><w:tcPr><w:tcW w:w="3500" w:type="dxa"/><w:shd w:val="clear" w:fill="EAEAEA"/><w:noWrap/></w:tcPr><w:p><w:pPr><w:jc w:val="center"/><w:spacing w:after="60"/></w:pPr><w:r><w:rPr><w:rFonts w:ascii="Times New Roman" w:hAnsi="Times New Roman" w:eastAsia="Times New Roman" w:cs="Times New Roman"/><w:sz w:val="20"/><w:szCs w:val="20"/><w:b w:val="1"/><w:bCs w:val="1"/></w:rPr><w:t xml:space="preserve">Arus Data Masukan (Input)</w:t></w:r></w:p></w:tc><w:tc><w:tcPr><w:tcW w:w="3500" w:type="dxa"/><w:shd w:val="clear" w:fill="EAEAEA"/><w:noWrap/></w:tcPr><w:p><w:pPr><w:jc w:val="center"/><w:spacing w:after="60"/></w:pPr><w:r><w:rPr><w:rFonts w:ascii="Times New Roman" w:hAnsi="Times New Roman" w:eastAsia="Times New Roman" w:cs="Times New Roman"/><w:sz w:val="20"/><w:szCs w:val="20"/><w:b w:val="1"/><w:bCs w:val="1"/></w:rPr><w:t xml:space="preserve">Arus Data Keluaran (Output)</w:t></w:r></w:p></w:tc></w:tr><w:tr><w:trPr/><w:tc><w:tcPr><w:tcW w:w="2200" w:type="dxa"/><w:noWrap/></w:tcPr><w:p><w:pPr><w:jc w:val="start"/><w:spacing w:after="60"/></w:pPr><w:r><w:rPr><w:rFonts w:ascii="Times New Roman" w:hAnsi="Times New Roman" w:eastAsia="Times New Roman" w:cs="Times New Roman"/><w:sz w:val="19"/><w:szCs w:val="19"/><w:b w:val="1"/><w:bCs w:val="1"/></w:rPr><w:t xml:space="preserve">Personel Prajurit / PNS TNI AD</w:t></w:r></w:p></w:tc><w:tc><w:tcPr><w:tcW w:w="3500" w:type="dxa"/><w:noWrap/></w:tcPr><w:p><w:pPr><w:jc w:val="start"/><w:spacing w:after="60"/></w:pPr><w:r><w:rPr><w:rFonts w:ascii="Times New Roman" w:hAnsi="Times New Roman" w:eastAsia="Times New Roman" w:cs="Times New Roman"/><w:sz w:val="19"/><w:szCs w:val="19"/></w:rPr><w:t xml:space="preserve">Data diri registrasi, Berkas 33 dosir PDF, Hasil foto scan kamera, Kredensial login, Pembaruan profil</w:t></w:r></w:p></w:tc><w:tc><w:tcPr><w:tcW w:w="3500" w:type="dxa"/><w:noWrap/></w:tcPr><w:p><w:pPr><w:jc w:val="start"/><w:spacing w:after="60"/></w:pPr><w:r><w:rPr><w:rFonts w:ascii="Times New Roman" w:hAnsi="Times New Roman" w:eastAsia="Times New Roman" w:cs="Times New Roman"/><w:sz w:val="19"/><w:szCs w:val="19"/></w:rPr><w:t xml:space="preserve">Status persetujuan akun, Dashboard progres 33 dosir, Catatan revisi verifikasi, Dokumen PDF sah ber-TTE</w:t></w:r></w:p></w:tc></w:tr><w:tr><w:trPr/><w:tc><w:tcPr><w:tcW w:w="2200" w:type="dxa"/><w:noWrap/></w:tcPr><w:p><w:pPr><w:jc w:val="start"/><w:spacing w:after="60"/></w:pPr><w:r><w:rPr><w:rFonts w:ascii="Times New Roman" w:hAnsi="Times New Roman" w:eastAsia="Times New Roman" w:cs="Times New Roman"/><w:sz w:val="19"/><w:szCs w:val="19"/><w:b w:val="1"/><w:bCs w:val="1"/></w:rPr><w:t xml:space="preserve">Administrator Satuan (Spers / Infolahta)</w:t></w:r></w:p></w:tc><w:tc><w:tcPr><w:tcW w:w="3500" w:type="dxa"/><w:noWrap/></w:tcPr><w:p><w:pPr><w:jc w:val="start"/><w:spacing w:after="60"/></w:pPr><w:r><w:rPr><w:rFonts w:ascii="Times New Roman" w:hAnsi="Times New Roman" w:eastAsia="Times New Roman" w:cs="Times New Roman"/><w:sz w:val="19"/><w:szCs w:val="19"/></w:rPr><w:t xml:space="preserve">Persetujuan akun pengguna, Keputusan verifikasi berkas (Approve/Reject), Catatan verifikasi, Parameter setting sistem</w:t></w:r></w:p></w:tc><w:tc><w:tcPr><w:tcW w:w="3500" w:type="dxa"/><w:noWrap/></w:tcPr><w:p><w:pPr><w:jc w:val="start"/><w:spacing w:after="60"/></w:pPr><w:r><w:rPr><w:rFonts w:ascii="Times New Roman" w:hAnsi="Times New Roman" w:eastAsia="Times New Roman" w:cs="Times New Roman"/><w:sz w:val="19"/><w:szCs w:val="19"/></w:rPr><w:t xml:space="preserve">Statistik satuan, Berkas antrean verifikasi, Notifikasi masa jabatan > 2 th & pensiun, Laporan resmi cetak, File backup ZIP</w:t></w:r></w:p></w:tc></w:tr><w:tr><w:trPr/><w:tc><w:tcPr><w:tcW w:w="2200" w:type="dxa"/><w:noWrap/></w:tcPr><w:p><w:pPr><w:jc w:val="start"/><w:spacing w:after="60"/></w:pPr><w:r><w:rPr><w:rFonts w:ascii="Times New Roman" w:hAnsi="Times New Roman" w:eastAsia="Times New Roman" w:cs="Times New Roman"/><w:sz w:val="19"/><w:szCs w:val="19"/><w:b w:val="1"/><w:bCs w:val="1"/></w:rPr><w:t xml:space="preserve">Pimpinan Satuan / Komandan</w:t></w:r></w:p></w:tc><w:tc><w:tcPr><w:tcW w:w="3500" w:type="dxa"/><w:noWrap/></w:tcPr><w:p><w:pPr><w:jc w:val="start"/><w:spacing w:after="60"/></w:pPr><w:r><w:rPr><w:rFonts w:ascii="Times New Roman" w:hAnsi="Times New Roman" w:eastAsia="Times New Roman" w:cs="Times New Roman"/><w:sz w:val="19"/><w:szCs w:val="19"/></w:rPr><w:t xml:space="preserve">Permintaan laporan analisis kelengkapan dosir dan perencanaan personel</w:t></w:r></w:p></w:tc><w:tc><w:tcPr><w:tcW w:w="3500" w:type="dxa"/><w:noWrap/></w:tcPr><w:p><w:pPr><w:jc w:val="start"/><w:spacing w:after="60"/></w:pPr><w:r><w:rPr><w:rFonts w:ascii="Times New Roman" w:hAnsi="Times New Roman" w:eastAsia="Times New Roman" w:cs="Times New Roman"/><w:sz w:val="19"/><w:szCs w:val="19"/></w:rPr><w:t xml:space="preserve">Laporan kelengkapan dosir satuan siap cetak, Daftar nominatif pensiun, Daftar proyeksi mutasi jabatan (TOD/TOA)</w:t></w:r></w:p></w:tc></w:tr><w:tr><w:trPr/><w:tc><w:tcPr><w:tcW w:w="2200" w:type="dxa"/><w:noWrap/></w:tcPr><w:p><w:pPr><w:jc w:val="start"/><w:spacing w:after="60"/></w:pPr><w:r><w:rPr><w:rFonts w:ascii="Times New Roman" w:hAnsi="Times New Roman" w:eastAsia="Times New Roman" w:cs="Times New Roman"/><w:sz w:val="19"/><w:szCs w:val="19"/><w:b w:val="1"/><w:bCs w:val="1"/></w:rPr><w:t xml:space="preserve">Publik / Pemeriksa Dokumen</w:t></w:r></w:p></w:tc><w:tc><w:tcPr><w:tcW w:w="3500" w:type="dxa"/><w:noWrap/></w:tcPr><w:p><w:pPr><w:jc w:val="start"/><w:spacing w:after="60"/></w:pPr><w:r><w:rPr><w:rFonts w:ascii="Times New Roman" w:hAnsi="Times New Roman" w:eastAsia="Times New Roman" w:cs="Times New Roman"/><w:sz w:val="19"/><w:szCs w:val="19"/></w:rPr><w:t xml:space="preserve">Pemindaian QR Code dokumen melalui kamera gawai (HTTP Request GET kode TTE)</w:t></w:r></w:p></w:tc><w:tc><w:tcPr><w:tcW w:w="3500" w:type="dxa"/><w:noWrap/></w:tcPr><w:p><w:pPr><w:jc w:val="start"/><w:spacing w:after="60"/></w:pPr><w:r><w:rPr><w:rFonts w:ascii="Times New Roman" w:hAnsi="Times New Roman" w:eastAsia="Times New Roman" w:cs="Times New Roman"/><w:sz w:val="19"/><w:szCs w:val="19"/></w:rPr><w:t xml:space="preserve">Informasi sertifikasi digital keabsahan dokumen, Nama personel, Pejabat penandatangan, Waktu pengesahan, Hash SHA-256</w:t></w:r></w:p></w:tc></w:tr></w:tbl><w:p/><w:p><w:pPr><w:jc w:val="start"/><w:spacing w:after="60"/></w:pPr><w:r><w:rPr><w:rFonts w:ascii="Times New Roman" w:hAnsi="Times New Roman" w:eastAsia="Times New Roman" w:cs="Times New Roman"/><w:sz w:val="23"/><w:szCs w:val="23"/><w:i w:val="1"/><w:iCs w:val="1"/></w:rPr><w:t xml:space="preserve">Bagan Konseptual Aliran Arus Data (DFD Level 0) :</w:t></w:r></w:p><w:tbl><w:tblGrid><w:gridCol w:w="9200" w:type="dxa"/></w:tblGrid><w:tblPr><w:tblStyle w:val="BoxTable"/></w:tblPr><w:tr><w:trPr/><w:tc><w:tcPr><w:tcW w:w="9200" w:type="dxa"/><w:shd w:val="clear" w:fill="F2F6F2"/><w:noWrap/></w:tcPr><w:p><w:pPr><w:jc w:val="center"/><w:spacing w:after="60"/></w:pPr><w:r><w:rPr><w:rFonts w:ascii="Consolas" w:hAnsi="Consolas" w:eastAsia="Consolas" w:cs="Consolas"/><w:sz w:val="17"/><w:szCs w:val="17"/></w:rPr><w:t xml:space="preserve">┌───────────────────────────┐                     ┌───────────────────────────┐</w:t></w:r></w:p><w:p><w:pPr><w:jc w:val="center"/><w:spacing w:after="60"/></w:pPr><w:r><w:rPr><w:rFonts w:ascii="Consolas" w:hAnsi="Consolas" w:eastAsia="Consolas" w:cs="Consolas"/><w:sz w:val="17"/><w:szCs w:val="17"/></w:rPr><w:t xml:space="preserve">│      PERSONEL TNI AD      │──(Data Registrasi/──>│                           │</w:t></w:r></w:p><w:p><w:pPr><w:jc w:val="center"/><w:spacing w:after="60"/></w:pPr><w:r><w:rPr><w:rFonts w:ascii="Consolas" w:hAnsi="Consolas" w:eastAsia="Consolas" w:cs="Consolas"/><w:sz w:val="17"/><w:szCs w:val="17"/></w:rPr><w:t xml:space="preserve">│  (Prajurit & PNS Militer) │   Unggah 33 Dosir)   │                           │</w:t></w:r></w:p><w:p><w:pPr><w:jc w:val="center"/><w:spacing w:after="60"/></w:pPr><w:r><w:rPr><w:rFonts w:ascii="Consolas" w:hAnsi="Consolas" w:eastAsia="Consolas" w:cs="Consolas"/><w:sz w:val="17"/><w:szCs w:val="17"/></w:rPr><w:t xml:space="preserve">│                           │<─(Status/Progress/───│                           │</w:t></w:r></w:p><w:p><w:pPr><w:jc w:val="center"/><w:spacing w:after="60"/></w:pPr><w:r><w:rPr><w:rFonts w:ascii="Consolas" w:hAnsi="Consolas" w:eastAsia="Consolas" w:cs="Consolas"/><w:sz w:val="17"/><w:szCs w:val="17"/></w:rPr><w:t xml:space="preserve">└───────────────────────────┘   Dokumen Ber-TTE)   │       SISTEM UTAMA        │</w:t></w:r></w:p><w:p><w:pPr><w:jc w:val="center"/><w:spacing w:after="60"/></w:pPr><w:r><w:rPr><w:rFonts w:ascii="Consolas" w:hAnsi="Consolas" w:eastAsia="Consolas" w:cs="Consolas"/><w:sz w:val="17"/><w:szCs w:val="17"/></w:rPr><w:t xml:space="preserve">                                                   │      TRISULA TNI AD       │</w:t></w:r></w:p><w:p><w:pPr><w:jc w:val="center"/><w:spacing w:after="60"/></w:pPr><w:r><w:rPr><w:rFonts w:ascii="Consolas" w:hAnsi="Consolas" w:eastAsia="Consolas" w:cs="Consolas"/><w:sz w:val="17"/><w:szCs w:val="17"/></w:rPr><w:t xml:space="preserve">┌───────────────────────────┐                      │                           │</w:t></w:r></w:p><w:p><w:pPr><w:jc w:val="center"/><w:spacing w:after="60"/></w:pPr><w:r><w:rPr><w:rFonts w:ascii="Consolas" w:hAnsi="Consolas" w:eastAsia="Consolas" w:cs="Consolas"/><w:sz w:val="17"/><w:szCs w:val="17"/></w:rPr><w:t xml:space="preserve">│    ADMINISTRATOR PERS     │──(Approval/Verifikasi│  Tata Kelola Rekam        │</w:t></w:r></w:p><w:p><w:pPr><w:jc w:val="center"/><w:spacing w:after="60"/></w:pPr><w:r><w:rPr><w:rFonts w:ascii="Consolas" w:hAnsi="Consolas" w:eastAsia="Consolas" w:cs="Consolas"/><w:sz w:val="17"/><w:szCs w:val="17"/></w:rPr><w:t xml:space="preserve">│   (Spers / Infolahtad)    │   Parameter Setting)─>  Informasi, Sistematika,  │</w:t></w:r></w:p><w:p><w:pPr><w:jc w:val="center"/><w:spacing w:after="60"/></w:pPr><w:r><w:rPr><w:rFonts w:ascii="Consolas" w:hAnsi="Consolas" w:eastAsia="Consolas" w:cs="Consolas"/><w:sz w:val="17"/><w:szCs w:val="17"/></w:rPr><w:t xml:space="preserve">│                           │<─(Laporan/Bulk ZIP/──│  & Unduhan Lengkap Arsip  │</w:t></w:r></w:p><w:p><w:pPr><w:jc w:val="center"/><w:spacing w:after="60"/></w:pPr><w:r><w:rPr><w:rFonts w:ascii="Consolas" w:hAnsi="Consolas" w:eastAsia="Consolas" w:cs="Consolas"/><w:sz w:val="17"/><w:szCs w:val="17"/></w:rPr><w:t xml:space="preserve">└───────────────────────────┘   Monitoring Satuan) │                           │</w:t></w:r></w:p><w:p><w:pPr><w:jc w:val="center"/><w:spacing w:after="60"/></w:pPr><w:r><w:rPr><w:rFonts w:ascii="Consolas" w:hAnsi="Consolas" w:eastAsia="Consolas" w:cs="Consolas"/><w:sz w:val="17"/><w:szCs w:val="17"/></w:rPr><w:t xml:space="preserve">                                                   │                           │</w:t></w:r></w:p><w:p><w:pPr><w:jc w:val="center"/><w:spacing w:after="60"/></w:pPr><w:r><w:rPr><w:rFonts w:ascii="Consolas" w:hAnsi="Consolas" w:eastAsia="Consolas" w:cs="Consolas"/><w:sz w:val="17"/><w:szCs w:val="17"/></w:rPr><w:t xml:space="preserve">┌───────────────────────────┐                      │                           │</w:t></w:r></w:p><w:p><w:pPr><w:jc w:val="center"/><w:spacing w:after="60"/></w:pPr><w:r><w:rPr><w:rFonts w:ascii="Consolas" w:hAnsi="Consolas" w:eastAsia="Consolas" w:cs="Consolas"/><w:sz w:val="17"/><w:szCs w:val="17"/></w:rPr><w:t xml:space="preserve">│   PUBLIK / PEMERIKSA QR   │──(Scan QR Code TTE)─>│                           │</w:t></w:r></w:p><w:p><w:pPr><w:jc w:val="center"/><w:spacing w:after="60"/></w:pPr><w:r><w:rPr><w:rFonts w:ascii="Consolas" w:hAnsi="Consolas" w:eastAsia="Consolas" w:cs="Consolas"/><w:sz w:val="17"/><w:szCs w:val="17"/></w:rPr><w:t xml:space="preserve">│                           │<─(Sertifikasi Sah)───│                           │</w:t></w:r></w:p><w:p><w:pPr><w:jc w:val="center"/><w:spacing w:after="60"/></w:pPr><w:r><w:rPr><w:rFonts w:ascii="Consolas" w:hAnsi="Consolas" w:eastAsia="Consolas" w:cs="Consolas"/><w:sz w:val="17"/><w:szCs w:val="17"/></w:rPr><w:t xml:space="preserve">└───────────────────────────┘                     └───────────────────────────┘</w:t></w:r></w:p></w:tc></w:tr></w:tbl><w:p/><w:p><w:pPr><w:jc w:val="start"/><w:spacing w:after="60"/></w:pPr><w:r><w:rPr><w:rFonts w:ascii="Times New Roman" w:hAnsi="Times New Roman" w:eastAsia="Times New Roman" w:cs="Times New Roman"/><w:sz w:val="24"/><w:szCs w:val="24"/><w:b w:val="1"/><w:bCs w:val="1"/></w:rPr><w:t xml:space="preserve">b.   Diagram Arus Data Rinci (DFD Level 1).</w:t></w:r></w:p><w:p><w:pPr><w:jc w:val="both"/><w:spacing w:after="80" w:line="276" w:lineRule="auto"/></w:pPr><w:r><w:rPr><w:rFonts w:ascii="Times New Roman" w:hAnsi="Times New Roman" w:eastAsia="Times New Roman" w:cs="Times New Roman"/><w:sz w:val="23"/><w:szCs w:val="23"/></w:rPr><w:t xml:space="preserve">Proses utama dipecah menjadi 7 (tujuh) sub-proses fungsional terintegrasi :</w:t></w:r></w:p><w:p><w:pPr><w:jc w:val="both"/><w:spacing w:after="80" w:line="276" w:lineRule="auto"/></w:pPr><w:r><w:rPr><w:rFonts w:ascii="Times New Roman" w:hAnsi="Times New Roman" w:eastAsia="Times New Roman" w:cs="Times New Roman"/><w:sz w:val="23"/><w:szCs w:val="23"/></w:rPr><w:t xml:space="preserve">     1)   Proses 1.0 : Autentikasi Pengguna & Sesi Keamanan (Validasi NRP/Password, Rate Limiting, Pengendalian Hak Akses Role).</w:t></w:r></w:p><w:p><w:pPr><w:jc w:val="both"/><w:spacing w:after="80" w:line="276" w:lineRule="auto"/></w:pPr><w:r><w:rPr><w:rFonts w:ascii="Times New Roman" w:hAnsi="Times New Roman" w:eastAsia="Times New Roman" w:cs="Times New Roman"/><w:sz w:val="23"/><w:szCs w:val="23"/></w:rPr><w:t xml:space="preserve">     2)   Proses 2.0 : Pengelolaan Pendaftaran & Persetujuan Akun (Pencatatan data personel, validasi NRP unik, otorisasi Admin).</w:t></w:r></w:p><w:p><w:pPr><w:jc w:val="both"/><w:spacing w:after="80" w:line="276" w:lineRule="auto"/></w:pPr><w:r><w:rPr><w:rFonts w:ascii="Times New Roman" w:hAnsi="Times New Roman" w:eastAsia="Times New Roman" w:cs="Times New Roman"/><w:sz w:val="23"/><w:szCs w:val="23"/></w:rPr><w:t xml:space="preserve">     3)   Proses 3.0 : Unggah & Pemindaian 33 Dosir (Validasi PDF, pembagian sub-folder fisik, penamaan otomatis indeks abjad).</w:t></w:r></w:p><w:p><w:pPr><w:jc w:val="both"/><w:spacing w:after="80" w:line="276" w:lineRule="auto"/></w:pPr><w:r><w:rPr><w:rFonts w:ascii="Times New Roman" w:hAnsi="Times New Roman" w:eastAsia="Times New Roman" w:cs="Times New Roman"/><w:sz w:val="23"/><w:szCs w:val="23"/></w:rPr><w:t xml:space="preserve">     4)   Proses 4.0 : Verifikasi Berkas & Pembubuhan TTE (Pemeriksaan admin, kalkulasi SHA-256, penerbitan QR Code, watermarking).</w:t></w:r></w:p><w:p><w:pPr><w:jc w:val="both"/><w:spacing w:after="80" w:line="276" w:lineRule="auto"/></w:pPr><w:r><w:rPr><w:rFonts w:ascii="Times New Roman" w:hAnsi="Times New Roman" w:eastAsia="Times New Roman" w:cs="Times New Roman"/><w:sz w:val="23"/><w:szCs w:val="23"/></w:rPr><w:t xml:space="preserve">     5)   Proses 5.0 : Layanan Verifikasi Dokumen Publik (Pencarian kode TTE, validasi integritas hash, penampilan sertifikat keabsahan).</w:t></w:r></w:p><w:p><w:pPr><w:jc w:val="both"/><w:spacing w:after="80" w:line="276" w:lineRule="auto"/></w:pPr><w:r><w:rPr><w:rFonts w:ascii="Times New Roman" w:hAnsi="Times New Roman" w:eastAsia="Times New Roman" w:cs="Times New Roman"/><w:sz w:val="23"/><w:szCs w:val="23"/></w:rPr><w:t xml:space="preserve">     6)   Proses 6.0 : Analitik Monitoring Personel (Perhitungan rasio kelengkapan, deteksi masa jabatan > 2 th, proyeksi pensiun).</w:t></w:r></w:p><w:p><w:pPr><w:jc w:val="both"/><w:spacing w:after="80" w:line="276" w:lineRule="auto"/></w:pPr><w:r><w:rPr><w:rFonts w:ascii="Times New Roman" w:hAnsi="Times New Roman" w:eastAsia="Times New Roman" w:cs="Times New Roman"/><w:sz w:val="23"/><w:szCs w:val="23"/></w:rPr><w:t xml:space="preserve">     7)   Proses 7.0 : Pelaporan & Pemeliharaan Sistem (Ekspor print out dinas, kompresi bulk ZIP, pencadangan basis data, audit log).</w:t></w:r></w:p><w:p><w:r><w:br w:type="page"/></w:r></w:p><w:p><w:pPr><w:jc w:val="start"/><w:spacing w:after="60"/></w:pPr><w:r><w:rPr><w:rFonts w:ascii="Times New Roman" w:hAnsi="Times New Roman" w:eastAsia="Times New Roman" w:cs="Times New Roman"/><w:sz w:val="24"/><w:szCs w:val="24"/><w:b w:val="1"/><w:bCs w:val="1"/></w:rPr><w:t xml:space="preserve">12.  Diagram Hubungan Entity (Entity Relationship Diagram - ERD).</w:t></w:r></w:p><w:p><w:pPr><w:jc w:val="both"/><w:spacing w:after="80" w:line="276" w:lineRule="auto"/></w:pPr><w:r><w:rPr><w:rFonts w:ascii="Times New Roman" w:hAnsi="Times New Roman" w:eastAsia="Times New Roman" w:cs="Times New Roman"/><w:sz w:val="23"/><w:szCs w:val="23"/></w:rPr><w:t xml:space="preserve">Diagram hubungan entitas memetakan arsitektur relasional pangkalan data (database) sistem TRISULA TNI AD, yang mengikat entitas personel, akun sistem, berkas dosir, master referensi, serta log audit keamanan.</w:t></w:r></w:p><w:p/><w:tbl><w:tblGrid><w:gridCol w:w="9200" w:type="dxa"/></w:tblGrid><w:tblPr><w:tblStyle w:val="BoxTable"/></w:tblPr><w:tr><w:trPr/><w:tc><w:tcPr><w:tcW w:w="9200" w:type="dxa"/><w:shd w:val="clear" w:fill="F2F6F2"/><w:noWrap/></w:tcPr><w:p><w:pPr><w:jc w:val="center"/><w:spacing w:after="60"/></w:pPr><w:r><w:rPr><w:rFonts w:ascii="Consolas" w:hAnsi="Consolas" w:eastAsia="Consolas" w:cs="Consolas"/><w:sz w:val="17"/><w:szCs w:val="17"/></w:rPr><w:t xml:space="preserve">┌────────────────────────┐          1:1          ┌────────────────────────┐</w:t></w:r></w:p><w:p><w:pPr><w:jc w:val="center"/><w:spacing w:after="60"/></w:pPr><w:r><w:rPr><w:rFonts w:ascii="Consolas" w:hAnsi="Consolas" w:eastAsia="Consolas" w:cs="Consolas"/><w:sz w:val="17"/><w:szCs w:val="17"/></w:rPr><w:t xml:space="preserve">│        PERSONEL        │◄─────────────────────►│         USERS          │</w:t></w:r></w:p><w:p><w:pPr><w:jc w:val="center"/><w:spacing w:after="60"/></w:pPr><w:r><w:rPr><w:rFonts w:ascii="Consolas" w:hAnsi="Consolas" w:eastAsia="Consolas" w:cs="Consolas"/><w:sz w:val="17"/><w:szCs w:val="17"/></w:rPr><w:t xml:space="preserve">│────────────────────────│                       │────────────────────────│</w:t></w:r></w:p><w:p><w:pPr><w:jc w:val="center"/><w:spacing w:after="60"/></w:pPr><w:r><w:rPr><w:rFonts w:ascii="Consolas" w:hAnsi="Consolas" w:eastAsia="Consolas" w:cs="Consolas"/><w:sz w:val="17"/><w:szCs w:val="17"/></w:rPr><w:t xml:space="preserve">│ PK : id                │                       │ PK : id                │</w:t></w:r></w:p><w:p><w:pPr><w:jc w:val="center"/><w:spacing w:after="60"/></w:pPr><w:r><w:rPr><w:rFonts w:ascii="Consolas" w:hAnsi="Consolas" w:eastAsia="Consolas" w:cs="Consolas"/><w:sz w:val="17"/><w:szCs w:val="17"/></w:rPr><w:t xml:space="preserve">│      nrp (UNIQUE)      │                       │      username (UNIQUE) │</w:t></w:r></w:p><w:p><w:pPr><w:jc w:val="center"/><w:spacing w:after="60"/></w:pPr><w:r><w:rPr><w:rFonts w:ascii="Consolas" w:hAnsi="Consolas" w:eastAsia="Consolas" w:cs="Consolas"/><w:sz w:val="17"/><w:szCs w:val="17"/></w:rPr><w:t xml:space="preserve">│      nama              │                       │      password (HASH)   │</w:t></w:r></w:p><w:p><w:pPr><w:jc w:val="center"/><w:spacing w:after="60"/></w:pPr><w:r><w:rPr><w:rFonts w:ascii="Consolas" w:hAnsi="Consolas" w:eastAsia="Consolas" w:cs="Consolas"/><w:sz w:val="17"/><w:szCs w:val="17"/></w:rPr><w:t xml:space="preserve">│      golongan          │                       │      role (admin/pers) │</w:t></w:r></w:p><w:p><w:pPr><w:jc w:val="center"/><w:spacing w:after="60"/></w:pPr><w:r><w:rPr><w:rFonts w:ascii="Consolas" w:hAnsi="Consolas" w:eastAsia="Consolas" w:cs="Consolas"/><w:sz w:val="17"/><w:szCs w:val="17"/></w:rPr><w:t xml:space="preserve">│      pangkat, korp     │                       │ FK : personel_id (UNIQ)│</w:t></w:r></w:p><w:p><w:pPr><w:jc w:val="center"/><w:spacing w:after="60"/></w:pPr><w:r><w:rPr><w:rFonts w:ascii="Consolas" w:hAnsi="Consolas" w:eastAsia="Consolas" w:cs="Consolas"/><w:sz w:val="17"/><w:szCs w:val="17"/></w:rPr><w:t xml:space="preserve">│      satuan, jabatan   │                       │      status (approval) │</w:t></w:r></w:p><w:p><w:pPr><w:jc w:val="center"/><w:spacing w:after="60"/></w:pPr><w:r><w:rPr><w:rFonts w:ascii="Consolas" w:hAnsi="Consolas" w:eastAsia="Consolas" w:cs="Consolas"/><w:sz w:val="17"/><w:szCs w:val="17"/></w:rPr><w:t xml:space="preserve">│      tmt_jabatan       │                       └───────────┬────────────┘</w:t></w:r></w:p><w:p><w:pPr><w:jc w:val="center"/><w:spacing w:after="60"/></w:pPr><w:r><w:rPr><w:rFonts w:ascii="Consolas" w:hAnsi="Consolas" w:eastAsia="Consolas" w:cs="Consolas"/><w:sz w:val="17"/><w:szCs w:val="17"/></w:rPr><w:t xml:space="preserve">│      tanggal_lahir     │                                   │             </w:t></w:r></w:p><w:p><w:pPr><w:jc w:val="center"/><w:spacing w:after="60"/></w:pPr><w:r><w:rPr><w:rFonts w:ascii="Consolas" w:hAnsi="Consolas" w:eastAsia="Consolas" w:cs="Consolas"/><w:sz w:val="17"/><w:szCs w:val="17"/></w:rPr><w:t xml:space="preserve">└───────────┬────────────┘                                   │ 1:N         </w:t></w:r></w:p><w:p><w:pPr><w:jc w:val="center"/><w:spacing w:after="60"/></w:pPr><w:r><w:rPr><w:rFonts w:ascii="Consolas" w:hAnsi="Consolas" w:eastAsia="Consolas" w:cs="Consolas"/><w:sz w:val="17"/><w:szCs w:val="17"/></w:rPr><w:t xml:space="preserve">            │                                                +────────────┐</w:t></w:r></w:p><w:p><w:pPr><w:jc w:val="center"/><w:spacing w:after="60"/></w:pPr><w:r><w:rPr><w:rFonts w:ascii="Consolas" w:hAnsi="Consolas" w:eastAsia="Consolas" w:cs="Consolas"/><w:sz w:val="17"/><w:szCs w:val="17"/></w:rPr><w:t xml:space="preserve">            │ 1:N                                            │            │</w:t></w:r></w:p><w:p><w:pPr><w:jc w:val="center"/><w:spacing w:after="60"/></w:pPr><w:r><w:rPr><w:rFonts w:ascii="Consolas" w:hAnsi="Consolas" w:eastAsia="Consolas" w:cs="Consolas"/><w:sz w:val="17"/><w:szCs w:val="17"/></w:rPr><w:t xml:space="preserve">            ▼                                                ▼            ▼</w:t></w:r></w:p><w:p><w:pPr><w:jc w:val="center"/><w:spacing w:after="60"/></w:pPr><w:r><w:rPr><w:rFonts w:ascii="Consolas" w:hAnsi="Consolas" w:eastAsia="Consolas" w:cs="Consolas"/><w:sz w:val="17"/><w:szCs w:val="17"/></w:rPr><w:t xml:space="preserve">┌────────────────────────┐                           ┌──────────────┐ ┌──────────────┐</w:t></w:r></w:p><w:p><w:pPr><w:jc w:val="center"/><w:spacing w:after="60"/></w:pPr><w:r><w:rPr><w:rFonts w:ascii="Consolas" w:hAnsi="Consolas" w:eastAsia="Consolas" w:cs="Consolas"/><w:sz w:val="17"/><w:szCs w:val="17"/></w:rPr><w:t xml:space="preserve">│      DOSIR_FILES       │                           │ ACTIVITY_LOG │ │  BACKUP_LOG  │</w:t></w:r></w:p><w:p><w:pPr><w:jc w:val="center"/><w:spacing w:after="60"/></w:pPr><w:r><w:rPr><w:rFonts w:ascii="Consolas" w:hAnsi="Consolas" w:eastAsia="Consolas" w:cs="Consolas"/><w:sz w:val="17"/><w:szCs w:val="17"/></w:rPr><w:t xml:space="preserve">│────────────────────────│                           │──────────────│ │──────────────│</w:t></w:r></w:p><w:p><w:pPr><w:jc w:val="center"/><w:spacing w:after="60"/></w:pPr><w:r><w:rPr><w:rFonts w:ascii="Consolas" w:hAnsi="Consolas" w:eastAsia="Consolas" w:cs="Consolas"/><w:sz w:val="17"/><w:szCs w:val="17"/></w:rPr><w:t xml:space="preserve">│ PK : id                │                           │ PK : id      │ │ PK : id      │</w:t></w:r></w:p><w:p><w:pPr><w:jc w:val="center"/><w:spacing w:after="60"/></w:pPr><w:r><w:rPr><w:rFonts w:ascii="Consolas" w:hAnsi="Consolas" w:eastAsia="Consolas" w:cs="Consolas"/><w:sz w:val="17"/><w:szCs w:val="17"/></w:rPr><w:t xml:space="preserve">│ FK : personel_id       │                           │ FK : user_id │ │ FK:created_by│</w:t></w:r></w:p><w:p><w:pPr><w:jc w:val="center"/><w:spacing w:after="60"/></w:pPr><w:r><w:rPr><w:rFonts w:ascii="Consolas" w:hAnsi="Consolas" w:eastAsia="Consolas" w:cs="Consolas"/><w:sz w:val="17"/><w:szCs w:val="17"/></w:rPr><w:t xml:space="preserve">│ FK : dosir_kode ───────┼───────────┐               │    aktivitas │ │    file_name │</w:t></w:r></w:p><w:p><w:pPr><w:jc w:val="center"/><w:spacing w:after="60"/></w:pPr><w:r><w:rPr><w:rFonts w:ascii="Consolas" w:hAnsi="Consolas" w:eastAsia="Consolas" w:cs="Consolas"/><w:sz w:val="17"/><w:szCs w:val="17"/></w:rPr><w:t xml:space="preserve">│      abjad             │           │               │    ip_address│ │    size_bytes│</w:t></w:r></w:p><w:p><w:pPr><w:jc w:val="center"/><w:spacing w:after="60"/></w:pPr><w:r><w:rPr><w:rFonts w:ascii="Consolas" w:hAnsi="Consolas" w:eastAsia="Consolas" w:cs="Consolas"/><w:sz w:val="17"/><w:szCs w:val="17"/></w:rPr><w:t xml:space="preserve">│      file_name         │           │ N:1           │    created_at│ │    created_at│</w:t></w:r></w:p><w:p><w:pPr><w:jc w:val="center"/><w:spacing w:after="60"/></w:pPr><w:r><w:rPr><w:rFonts w:ascii="Consolas" w:hAnsi="Consolas" w:eastAsia="Consolas" w:cs="Consolas"/><w:sz w:val="17"/><w:szCs w:val="17"/></w:rPr><w:t xml:space="preserve">│      file_path         │           ▼               └──────────────┘ └──────────────┘</w:t></w:r></w:p><w:p><w:pPr><w:jc w:val="center"/><w:spacing w:after="60"/></w:pPr><w:r><w:rPr><w:rFonts w:ascii="Consolas" w:hAnsi="Consolas" w:eastAsia="Consolas" w:cs="Consolas"/><w:sz w:val="17"/><w:szCs w:val="17"/></w:rPr><w:t xml:space="preserve">│      raw_file_path     │ ┌───────────────────┐     ┌──────────────┐</w:t></w:r></w:p><w:p><w:pPr><w:jc w:val="center"/><w:spacing w:after="60"/></w:pPr><w:r><w:rPr><w:rFonts w:ascii="Consolas" w:hAnsi="Consolas" w:eastAsia="Consolas" w:cs="Consolas"/><w:sz w:val="17"/><w:szCs w:val="17"/></w:rPr><w:t xml:space="preserve">│      status            │ │   DOSIR_MASTER    │     │LOGIN_ATTEMPTS│</w:t></w:r></w:p><w:p><w:pPr><w:jc w:val="center"/><w:spacing w:after="60"/></w:pPr><w:r><w:rPr><w:rFonts w:ascii="Consolas" w:hAnsi="Consolas" w:eastAsia="Consolas" w:cs="Consolas"/><w:sz w:val="17"/><w:szCs w:val="17"/></w:rPr><w:t xml:space="preserve">│      signature_code    │ │───────────────────│     │──────────────│</w:t></w:r></w:p><w:p><w:pPr><w:jc w:val="center"/><w:spacing w:after="60"/></w:pPr><w:r><w:rPr><w:rFonts w:ascii="Consolas" w:hAnsi="Consolas" w:eastAsia="Consolas" w:cs="Consolas"/><w:sz w:val="17"/><w:szCs w:val="17"/></w:rPr><w:t xml:space="preserve">│      signature_hash    │ │ PK : kode (01..33)│     │ PK : id      │</w:t></w:r></w:p><w:p><w:pPr><w:jc w:val="center"/><w:spacing w:after="60"/></w:pPr><w:r><w:rPr><w:rFonts w:ascii="Consolas" w:hAnsi="Consolas" w:eastAsia="Consolas" w:cs="Consolas"/><w:sz w:val="17"/><w:szCs w:val="17"/></w:rPr><w:t xml:space="preserve">│ FK : uploaded_by ──────┼─┼────────────────────────►│    ip_address│</w:t></w:r></w:p><w:p><w:pPr><w:jc w:val="center"/><w:spacing w:after="60"/></w:pPr><w:r><w:rPr><w:rFonts w:ascii="Consolas" w:hAnsi="Consolas" w:eastAsia="Consolas" w:cs="Consolas"/><w:sz w:val="17"/><w:szCs w:val="17"/></w:rPr><w:t xml:space="preserve">│ FK : verified_by ──────┼─┼────────────────────────►│    username  │</w:t></w:r></w:p><w:p><w:pPr><w:jc w:val="center"/><w:spacing w:after="60"/></w:pPr><w:r><w:rPr><w:rFonts w:ascii="Consolas" w:hAnsi="Consolas" w:eastAsia="Consolas" w:cs="Consolas"/><w:sz w:val="17"/><w:szCs w:val="17"/></w:rPr><w:t xml:space="preserve">│      verified_at       │ │      nama_dosir   │     │    attempt   │</w:t></w:r></w:p><w:p><w:pPr><w:jc w:val="center"/><w:spacing w:after="60"/></w:pPr><w:r><w:rPr><w:rFonts w:ascii="Consolas" w:hAnsi="Consolas" w:eastAsia="Consolas" w:cs="Consolas"/><w:sz w:val="17"/><w:szCs w:val="17"/></w:rPr><w:t xml:space="preserve">└────────────────────────┘ │      urutan, wajib│     └──────────────┘</w:t></w:r></w:p><w:p><w:pPr><w:jc w:val="center"/><w:spacing w:after="60"/></w:pPr><w:r><w:rPr><w:rFonts w:ascii="Consolas" w:hAnsi="Consolas" w:eastAsia="Consolas" w:cs="Consolas"/><w:sz w:val="17"/><w:szCs w:val="17"/></w:rPr><w:t xml:space="preserve">                           └───────────────────┘                     </w:t></w:r></w:p></w:tc></w:tr></w:tbl><w:p/><w:p><w:pPr><w:jc w:val="start"/><w:spacing w:after="60"/></w:pPr><w:r><w:rPr><w:rFonts w:ascii="Times New Roman" w:hAnsi="Times New Roman" w:eastAsia="Times New Roman" w:cs="Times New Roman"/><w:sz w:val="24"/><w:szCs w:val="24"/><w:b w:val="1"/><w:bCs w:val="1"/></w:rPr><w:t xml:space="preserve">Penjelasan Kardinalitas Relasi Antar Tabel :</w:t></w:r></w:p><w:p><w:pPr><w:jc w:val="both"/><w:spacing w:after="80" w:line="276" w:lineRule="auto"/></w:pPr><w:r><w:rPr><w:rFonts w:ascii="Times New Roman" w:hAnsi="Times New Roman" w:eastAsia="Times New Roman" w:cs="Times New Roman"/><w:sz w:val="23"/><w:szCs w:val="23"/></w:rPr><w:t xml:space="preserve">1.   Tabel "personel" berelasi Satu ke Satu (1:1) dengan tabel "users" melalui foreign key `users.personel_id` dengan konstrain UNIQUE. Setiap personel memiliki satu akun login resmi.</w:t></w:r></w:p><w:p><w:pPr><w:jc w:val="both"/><w:spacing w:after="80" w:line="276" w:lineRule="auto"/></w:pPr><w:r><w:rPr><w:rFonts w:ascii="Times New Roman" w:hAnsi="Times New Roman" w:eastAsia="Times New Roman" w:cs="Times New Roman"/><w:sz w:val="23"/><w:szCs w:val="23"/></w:rPr><w:t xml:space="preserve">2.   Tabel "personel" berelasi Satu ke Banyak (1:N) dengan tabel "dosir_files" melalui foreign key `dosir_files.personel_id` dengan kaskade ON DELETE CASCADE.</w:t></w:r></w:p><w:p><w:pPr><w:jc w:val="both"/><w:spacing w:after="80" w:line="276" w:lineRule="auto"/></w:pPr><w:r><w:rPr><w:rFonts w:ascii="Times New Roman" w:hAnsi="Times New Roman" w:eastAsia="Times New Roman" w:cs="Times New Roman"/><w:sz w:val="23"/><w:szCs w:val="23"/></w:rPr><w:t xml:space="preserve">3.   Tabel "dosir_master" berelasi Satu ke Banyak (1:N) dengan tabel "dosir_files" melalui foreign key `dosir_files.dosir_kode` dengan ON UPDATE CASCADE ON DELETE RESTRICT.</w:t></w:r></w:p><w:p><w:pPr><w:jc w:val="both"/><w:spacing w:after="80" w:line="276" w:lineRule="auto"/></w:pPr><w:r><w:rPr><w:rFonts w:ascii="Times New Roman" w:hAnsi="Times New Roman" w:eastAsia="Times New Roman" w:cs="Times New Roman"/><w:sz w:val="23"/><w:szCs w:val="23"/></w:rPr><w:t xml:space="preserve">4.   Tabel "users" berelasi Satu ke Banyak (1:N) dengan tabel "dosir_files" sebagai pengunggah (`dosir_files.uploaded_by`) dan sebagai verifikator TTE (`dosir_files.verified_by`).</w:t></w:r></w:p><w:p><w:pPr><w:jc w:val="both"/><w:spacing w:after="80" w:line="276" w:lineRule="auto"/></w:pPr><w:r><w:rPr><w:rFonts w:ascii="Times New Roman" w:hAnsi="Times New Roman" w:eastAsia="Times New Roman" w:cs="Times New Roman"/><w:sz w:val="23"/><w:szCs w:val="23"/></w:rPr><w:t xml:space="preserve">5.   Tabel "users" berelasi Satu ke Banyak (1:N) dengan tabel "activity_log" (`activity_log.user_id`) untuk merekam seluruh tindakan audit trail pengguna.</w:t></w:r></w:p><w:p><w:pPr><w:jc w:val="both"/><w:spacing w:after="80" w:line="276" w:lineRule="auto"/></w:pPr><w:r><w:rPr><w:rFonts w:ascii="Times New Roman" w:hAnsi="Times New Roman" w:eastAsia="Times New Roman" w:cs="Times New Roman"/><w:sz w:val="23"/><w:szCs w:val="23"/></w:rPr><w:t xml:space="preserve">6.   Tabel "users" berelasi Satu ke Banyak (1:N) dengan tabel "backup_log" (`backup_log.created_by`) untuk mencatat pembuat cadangan data.</w:t></w:r></w:p><w:p><w:pPr><w:jc w:val="both"/><w:spacing w:after="80" w:line="276" w:lineRule="auto"/></w:pPr><w:r><w:rPr><w:rFonts w:ascii="Times New Roman" w:hAnsi="Times New Roman" w:eastAsia="Times New Roman" w:cs="Times New Roman"/><w:sz w:val="23"/><w:szCs w:val="23"/></w:rPr><w:t xml:space="preserve">7.   Tabel "settings" dan "login_attempts" beroperasi sebagai tabel penunjang sistem keamanan dan parameter operasional global.</w:t></w:r></w:p><w:p><w:r><w:br w:type="page"/></w:r></w:p><w:p><w:pPr><w:jc w:val="start"/><w:spacing w:after="60"/></w:pPr><w:r><w:rPr><w:rFonts w:ascii="Times New Roman" w:hAnsi="Times New Roman" w:eastAsia="Times New Roman" w:cs="Times New Roman"/><w:sz w:val="24"/><w:szCs w:val="24"/><w:b w:val="1"/><w:bCs w:val="1"/></w:rPr><w:t xml:space="preserve">13.  Kamus Data / Struktur File.</w:t></w:r></w:p><w:p><w:pPr><w:jc w:val="both"/><w:spacing w:after="80" w:line="276" w:lineRule="auto"/></w:pPr><w:r><w:rPr><w:rFonts w:ascii="Times New Roman" w:hAnsi="Times New Roman" w:eastAsia="Times New Roman" w:cs="Times New Roman"/><w:sz w:val="23"/><w:szCs w:val="23"/></w:rPr><w:t xml:space="preserve">Kamus data memberikan spesifikasi teknis terperinci mengenai struktur tabel pangkalan data (MySQL), meliputi nama medan (field), uraian sebutan, tipe data, lebar/panjang memori, serta keterangan integritas kunci (Primary Key / Foreign Key).</w:t></w:r></w:p><w:p/><w:p><w:pPr><w:spacing w:after="40"/></w:pPr><w:r><w:rPr><w:rFonts w:ascii="Times New Roman" w:hAnsi="Times New Roman" w:eastAsia="Times New Roman" w:cs="Times New Roman"/><w:sz w:val="22"/><w:szCs w:val="22"/><w:b w:val="1"/><w:bCs w:val="1"/></w:rPr><w:t xml:space="preserve">a.   Struktur File / Tabel: PERSONEL (Data Induk Prajurit & PNS)</w:t></w:r></w:p><w:tbl><w:tblGrid><w:gridCol w:w="500" w:type="dxa"/><w:gridCol w:w="2200" w:type="dxa"/><w:gridCol w:w="3000" w:type="dxa"/><w:gridCol w:w="1300" w:type="dxa"/><w:gridCol w:w="1100" w:type="dxa"/><w:gridCol w:w="1100" w:type="dxa"/></w:tblGrid><w:tblPr><w:tblStyle w:val="MilitaryTable"/></w:tblPr><w:tr><w:trPr/><w:tc><w:tcPr><w:tcW w:w="500" w:type="dxa"/><w:shd w:val="clear" w:fill="EAEAEA"/><w:noWrap/></w:tcPr><w:p><w:pPr><w:jc w:val="center"/></w:pPr><w:r><w:rPr><w:rFonts w:ascii="Times New Roman" w:hAnsi="Times New Roman" w:eastAsia="Times New Roman" w:cs="Times New Roman"/><w:sz w:val="20"/><w:szCs w:val="20"/><w:b w:val="1"/><w:bCs w:val="1"/></w:rPr><w:t xml:space="preserve">No</w:t></w:r></w:p></w:tc><w:tc><w:tcPr><w:tcW w:w="2200" w:type="dxa"/><w:shd w:val="clear" w:fill="EAEAEA"/><w:noWrap/></w:tcPr><w:p><w:pPr><w:jc w:val="center"/></w:pPr><w:r><w:rPr><w:rFonts w:ascii="Times New Roman" w:hAnsi="Times New Roman" w:eastAsia="Times New Roman" w:cs="Times New Roman"/><w:sz w:val="20"/><w:szCs w:val="20"/><w:b w:val="1"/><w:bCs w:val="1"/></w:rPr><w:t xml:space="preserve">Nama Field</w:t></w:r></w:p></w:tc><w:tc><w:tcPr><w:tcW w:w="3000" w:type="dxa"/><w:shd w:val="clear" w:fill="EAEAEA"/><w:noWrap/></w:tcPr><w:p><w:pPr><w:jc w:val="center"/></w:pPr><w:r><w:rPr><w:rFonts w:ascii="Times New Roman" w:hAnsi="Times New Roman" w:eastAsia="Times New Roman" w:cs="Times New Roman"/><w:sz w:val="20"/><w:szCs w:val="20"/><w:b w:val="1"/><w:bCs w:val="1"/></w:rPr><w:t xml:space="preserve">Uraian / Sebutan</w:t></w:r></w:p></w:tc><w:tc><w:tcPr><w:tcW w:w="1300" w:type="dxa"/><w:shd w:val="clear" w:fill="EAEAEA"/><w:noWrap/></w:tcPr><w:p><w:pPr><w:jc w:val="center"/></w:pPr><w:r><w:rPr><w:rFonts w:ascii="Times New Roman" w:hAnsi="Times New Roman" w:eastAsia="Times New Roman" w:cs="Times New Roman"/><w:sz w:val="20"/><w:szCs w:val="20"/><w:b w:val="1"/><w:bCs w:val="1"/></w:rPr><w:t xml:space="preserve">Type</w:t></w:r></w:p></w:tc><w:tc><w:tcPr><w:tcW w:w="1100" w:type="dxa"/><w:shd w:val="clear" w:fill="EAEAEA"/><w:noWrap/></w:tcPr><w:p><w:pPr><w:jc w:val="center"/></w:pPr><w:r><w:rPr><w:rFonts w:ascii="Times New Roman" w:hAnsi="Times New Roman" w:eastAsia="Times New Roman" w:cs="Times New Roman"/><w:sz w:val="20"/><w:szCs w:val="20"/><w:b w:val="1"/><w:bCs w:val="1"/></w:rPr><w:t xml:space="preserve">Lebar</w:t></w:r></w:p></w:tc><w:tc><w:tcPr><w:tcW w:w="1100" w:type="dxa"/><w:shd w:val="clear" w:fill="EAEAEA"/><w:noWrap/></w:tcPr><w:p><w:pPr><w:jc w:val="center"/></w:pPr><w:r><w:rPr><w:rFonts w:ascii="Times New Roman" w:hAnsi="Times New Roman" w:eastAsia="Times New Roman" w:cs="Times New Roman"/><w:sz w:val="20"/><w:szCs w:val="20"/><w:b w:val="1"/><w:bCs w:val="1"/></w:rPr><w:t xml:space="preserve">Ket</w:t></w:r></w:p></w:tc></w:tr><w:tr><w:trPr/><w:tc><w:tcPr><w:tcW w:w="500" w:type="dxa"/><w:noWrap/></w:tcPr><w:p><w:pPr><w:jc w:val="center"/></w:pPr><w:r><w:rPr><w:rFonts w:ascii="Times New Roman" w:hAnsi="Times New Roman" w:eastAsia="Times New Roman" w:cs="Times New Roman"/><w:sz w:val="19"/><w:szCs w:val="19"/></w:rPr><w:t xml:space="preserve">1</w:t></w:r></w:p></w:tc><w:tc><w:tcPr><w:tcW w:w="2200" w:type="dxa"/><w:noWrap/></w:tcPr><w:p><w:pPr><w:jc w:val="start"/></w:pPr><w:r><w:rPr><w:rFonts w:ascii="Times New Roman" w:hAnsi="Times New Roman" w:eastAsia="Times New Roman" w:cs="Times New Roman"/><w:sz w:val="19"/><w:szCs w:val="19"/><w:b w:val="1"/><w:bCs w:val="1"/></w:rPr><w:t xml:space="preserve">id</w:t></w:r></w:p></w:tc><w:tc><w:tcPr><w:tcW w:w="3000" w:type="dxa"/><w:noWrap/></w:tcPr><w:p><w:pPr><w:jc w:val="start"/></w:pPr><w:r><w:rPr><w:rFonts w:ascii="Times New Roman" w:hAnsi="Times New Roman" w:eastAsia="Times New Roman" w:cs="Times New Roman"/><w:sz w:val="19"/><w:szCs w:val="19"/></w:rPr><w:t xml:space="preserve">Nomor Urut Indeks Unik</w:t></w:r></w:p></w:tc><w:tc><w:tcPr><w:tcW w:w="1300" w:type="dxa"/><w:noWrap/></w:tcPr><w:p><w:pPr><w:jc w:val="center"/></w:pPr><w:r><w:rPr><w:rFonts w:ascii="Times New Roman" w:hAnsi="Times New Roman" w:eastAsia="Times New Roman" w:cs="Times New Roman"/><w:sz w:val="19"/><w:szCs w:val="19"/></w:rPr><w:t xml:space="preserve">INT</w:t></w:r></w:p></w:tc><w:tc><w:tcPr><w:tcW w:w="1100" w:type="dxa"/><w:noWrap/></w:tcPr><w:p><w:pPr><w:jc w:val="center"/></w:pPr><w:r><w:rPr><w:rFonts w:ascii="Times New Roman" w:hAnsi="Times New Roman" w:eastAsia="Times New Roman" w:cs="Times New Roman"/><w:sz w:val="19"/><w:szCs w:val="19"/></w:rPr><w:t xml:space="preserve">11</w:t></w:r></w:p></w:tc><w:tc><w:tcPr><w:tcW w:w="1100" w:type="dxa"/><w:noWrap/></w:tcPr><w:p><w:pPr><w:jc w:val="center"/></w:pPr><w:r><w:rPr><w:rFonts w:ascii="Times New Roman" w:hAnsi="Times New Roman" w:eastAsia="Times New Roman" w:cs="Times New Roman"/><w:sz w:val="19"/><w:szCs w:val="19"/></w:rPr><w:t xml:space="preserve">PK, Auto</w:t></w:r></w:p></w:tc></w:tr><w:tr><w:trPr/><w:tc><w:tcPr><w:tcW w:w="500" w:type="dxa"/><w:noWrap/></w:tcPr><w:p><w:pPr><w:jc w:val="center"/></w:pPr><w:r><w:rPr><w:rFonts w:ascii="Times New Roman" w:hAnsi="Times New Roman" w:eastAsia="Times New Roman" w:cs="Times New Roman"/><w:sz w:val="19"/><w:szCs w:val="19"/></w:rPr><w:t xml:space="preserve">2</w:t></w:r></w:p></w:tc><w:tc><w:tcPr><w:tcW w:w="2200" w:type="dxa"/><w:noWrap/></w:tcPr><w:p><w:pPr><w:jc w:val="start"/></w:pPr><w:r><w:rPr><w:rFonts w:ascii="Times New Roman" w:hAnsi="Times New Roman" w:eastAsia="Times New Roman" w:cs="Times New Roman"/><w:sz w:val="19"/><w:szCs w:val="19"/><w:b w:val="1"/><w:bCs w:val="1"/></w:rPr><w:t xml:space="preserve">nrp</w:t></w:r></w:p></w:tc><w:tc><w:tcPr><w:tcW w:w="3000" w:type="dxa"/><w:noWrap/></w:tcPr><w:p><w:pPr><w:jc w:val="start"/></w:pPr><w:r><w:rPr><w:rFonts w:ascii="Times New Roman" w:hAnsi="Times New Roman" w:eastAsia="Times New Roman" w:cs="Times New Roman"/><w:sz w:val="19"/><w:szCs w:val="19"/></w:rPr><w:t xml:space="preserve">Nomor Registrasi Pokok / NIP</w:t></w:r></w:p></w:tc><w:tc><w:tcPr><w:tcW w:w="1300" w:type="dxa"/><w:noWrap/></w:tcPr><w:p><w:pPr><w:jc w:val="center"/></w:pPr><w:r><w:rPr><w:rFonts w:ascii="Times New Roman" w:hAnsi="Times New Roman" w:eastAsia="Times New Roman" w:cs="Times New Roman"/><w:sz w:val="19"/><w:szCs w:val="19"/></w:rPr><w:t xml:space="preserve">VARCHAR</w:t></w:r></w:p></w:tc><w:tc><w:tcPr><w:tcW w:w="1100" w:type="dxa"/><w:noWrap/></w:tcPr><w:p><w:pPr><w:jc w:val="center"/></w:pPr><w:r><w:rPr><w:rFonts w:ascii="Times New Roman" w:hAnsi="Times New Roman" w:eastAsia="Times New Roman" w:cs="Times New Roman"/><w:sz w:val="19"/><w:szCs w:val="19"/></w:rPr><w:t xml:space="preserve">20</w:t></w:r></w:p></w:tc><w:tc><w:tcPr><w:tcW w:w="1100" w:type="dxa"/><w:noWrap/></w:tcPr><w:p><w:pPr><w:jc w:val="center"/></w:pPr><w:r><w:rPr><w:rFonts w:ascii="Times New Roman" w:hAnsi="Times New Roman" w:eastAsia="Times New Roman" w:cs="Times New Roman"/><w:sz w:val="19"/><w:szCs w:val="19"/></w:rPr><w:t xml:space="preserve">UNIQUE</w:t></w:r></w:p></w:tc></w:tr><w:tr><w:trPr/><w:tc><w:tcPr><w:tcW w:w="500" w:type="dxa"/><w:noWrap/></w:tcPr><w:p><w:pPr><w:jc w:val="center"/></w:pPr><w:r><w:rPr><w:rFonts w:ascii="Times New Roman" w:hAnsi="Times New Roman" w:eastAsia="Times New Roman" w:cs="Times New Roman"/><w:sz w:val="19"/><w:szCs w:val="19"/></w:rPr><w:t xml:space="preserve">3</w:t></w:r></w:p></w:tc><w:tc><w:tcPr><w:tcW w:w="2200" w:type="dxa"/><w:noWrap/></w:tcPr><w:p><w:pPr><w:jc w:val="start"/></w:pPr><w:r><w:rPr><w:rFonts w:ascii="Times New Roman" w:hAnsi="Times New Roman" w:eastAsia="Times New Roman" w:cs="Times New Roman"/><w:sz w:val="19"/><w:szCs w:val="19"/><w:b w:val="1"/><w:bCs w:val="1"/></w:rPr><w:t xml:space="preserve">nama</w:t></w:r></w:p></w:tc><w:tc><w:tcPr><w:tcW w:w="3000" w:type="dxa"/><w:noWrap/></w:tcPr><w:p><w:pPr><w:jc w:val="start"/></w:pPr><w:r><w:rPr><w:rFonts w:ascii="Times New Roman" w:hAnsi="Times New Roman" w:eastAsia="Times New Roman" w:cs="Times New Roman"/><w:sz w:val="19"/><w:szCs w:val="19"/></w:rPr><w:t xml:space="preserve">Nama Lengkap Prajurit / PNS</w:t></w:r></w:p></w:tc><w:tc><w:tcPr><w:tcW w:w="1300" w:type="dxa"/><w:noWrap/></w:tcPr><w:p><w:pPr><w:jc w:val="center"/></w:pPr><w:r><w:rPr><w:rFonts w:ascii="Times New Roman" w:hAnsi="Times New Roman" w:eastAsia="Times New Roman" w:cs="Times New Roman"/><w:sz w:val="19"/><w:szCs w:val="19"/></w:rPr><w:t xml:space="preserve">VARCHAR</w:t></w:r></w:p></w:tc><w:tc><w:tcPr><w:tcW w:w="1100" w:type="dxa"/><w:noWrap/></w:tcPr><w:p><w:pPr><w:jc w:val="center"/></w:pPr><w:r><w:rPr><w:rFonts w:ascii="Times New Roman" w:hAnsi="Times New Roman" w:eastAsia="Times New Roman" w:cs="Times New Roman"/><w:sz w:val="19"/><w:szCs w:val="19"/></w:rPr><w:t xml:space="preserve">120</w:t></w:r></w:p></w:tc><w:tc><w:tcPr><w:tcW w:w="1100" w:type="dxa"/><w:noWrap/></w:tcPr><w:p><w:pPr><w:jc w:val="center"/></w:pPr><w:r><w:rPr><w:rFonts w:ascii="Times New Roman" w:hAnsi="Times New Roman" w:eastAsia="Times New Roman" w:cs="Times New Roman"/><w:sz w:val="19"/><w:szCs w:val="19"/></w:rPr><w:t xml:space="preserve">Not Null</w:t></w:r></w:p></w:tc></w:tr><w:tr><w:trPr/><w:tc><w:tcPr><w:tcW w:w="500" w:type="dxa"/><w:noWrap/></w:tcPr><w:p><w:pPr><w:jc w:val="center"/></w:pPr><w:r><w:rPr><w:rFonts w:ascii="Times New Roman" w:hAnsi="Times New Roman" w:eastAsia="Times New Roman" w:cs="Times New Roman"/><w:sz w:val="19"/><w:szCs w:val="19"/></w:rPr><w:t xml:space="preserve">4</w:t></w:r></w:p></w:tc><w:tc><w:tcPr><w:tcW w:w="2200" w:type="dxa"/><w:noWrap/></w:tcPr><w:p><w:pPr><w:jc w:val="start"/></w:pPr><w:r><w:rPr><w:rFonts w:ascii="Times New Roman" w:hAnsi="Times New Roman" w:eastAsia="Times New Roman" w:cs="Times New Roman"/><w:sz w:val="19"/><w:szCs w:val="19"/><w:b w:val="1"/><w:bCs w:val="1"/></w:rPr><w:t xml:space="preserve">golongan</w:t></w:r></w:p></w:tc><w:tc><w:tcPr><w:tcW w:w="3000" w:type="dxa"/><w:noWrap/></w:tcPr><w:p><w:pPr><w:jc w:val="start"/></w:pPr><w:r><w:rPr><w:rFonts w:ascii="Times New Roman" w:hAnsi="Times New Roman" w:eastAsia="Times New Roman" w:cs="Times New Roman"/><w:sz w:val="19"/><w:szCs w:val="19"/></w:rPr><w:t xml:space="preserve">Golongan (Perwira/Bintara/Tamtama/PNS)</w:t></w:r></w:p></w:tc><w:tc><w:tcPr><w:tcW w:w="1300" w:type="dxa"/><w:noWrap/></w:tcPr><w:p><w:pPr><w:jc w:val="center"/></w:pPr><w:r><w:rPr><w:rFonts w:ascii="Times New Roman" w:hAnsi="Times New Roman" w:eastAsia="Times New Roman" w:cs="Times New Roman"/><w:sz w:val="19"/><w:szCs w:val="19"/></w:rPr><w:t xml:space="preserve">ENUM</w:t></w:r></w:p></w:tc><w:tc><w:tcPr><w:tcW w:w="1100" w:type="dxa"/><w:noWrap/></w:tcPr><w:p><w:pPr><w:jc w:val="center"/></w:pPr><w:r><w:rPr><w:rFonts w:ascii="Times New Roman" w:hAnsi="Times New Roman" w:eastAsia="Times New Roman" w:cs="Times New Roman"/><w:sz w:val="19"/><w:szCs w:val="19"/></w:rPr><w:t xml:space="preserve">15</w:t></w:r></w:p></w:tc><w:tc><w:tcPr><w:tcW w:w="1100" w:type="dxa"/><w:noWrap/></w:tcPr><w:p><w:pPr><w:jc w:val="center"/></w:pPr><w:r><w:rPr><w:rFonts w:ascii="Times New Roman" w:hAnsi="Times New Roman" w:eastAsia="Times New Roman" w:cs="Times New Roman"/><w:sz w:val="19"/><w:szCs w:val="19"/></w:rPr><w:t xml:space="preserve">Not Null</w:t></w:r></w:p></w:tc></w:tr><w:tr><w:trPr/><w:tc><w:tcPr><w:tcW w:w="500" w:type="dxa"/><w:noWrap/></w:tcPr><w:p><w:pPr><w:jc w:val="center"/></w:pPr><w:r><w:rPr><w:rFonts w:ascii="Times New Roman" w:hAnsi="Times New Roman" w:eastAsia="Times New Roman" w:cs="Times New Roman"/><w:sz w:val="19"/><w:szCs w:val="19"/></w:rPr><w:t xml:space="preserve">5</w:t></w:r></w:p></w:tc><w:tc><w:tcPr><w:tcW w:w="2200" w:type="dxa"/><w:noWrap/></w:tcPr><w:p><w:pPr><w:jc w:val="start"/></w:pPr><w:r><w:rPr><w:rFonts w:ascii="Times New Roman" w:hAnsi="Times New Roman" w:eastAsia="Times New Roman" w:cs="Times New Roman"/><w:sz w:val="19"/><w:szCs w:val="19"/><w:b w:val="1"/><w:bCs w:val="1"/></w:rPr><w:t xml:space="preserve">pangkat</w:t></w:r></w:p></w:tc><w:tc><w:tcPr><w:tcW w:w="3000" w:type="dxa"/><w:noWrap/></w:tcPr><w:p><w:pPr><w:jc w:val="start"/></w:pPr><w:r><w:rPr><w:rFonts w:ascii="Times New Roman" w:hAnsi="Times New Roman" w:eastAsia="Times New Roman" w:cs="Times New Roman"/><w:sz w:val="19"/><w:szCs w:val="19"/></w:rPr><w:t xml:space="preserve">Pangkat Terkini</w:t></w:r></w:p></w:tc><w:tc><w:tcPr><w:tcW w:w="1300" w:type="dxa"/><w:noWrap/></w:tcPr><w:p><w:pPr><w:jc w:val="center"/></w:pPr><w:r><w:rPr><w:rFonts w:ascii="Times New Roman" w:hAnsi="Times New Roman" w:eastAsia="Times New Roman" w:cs="Times New Roman"/><w:sz w:val="19"/><w:szCs w:val="19"/></w:rPr><w:t xml:space="preserve">VARCHAR</w:t></w:r></w:p></w:tc><w:tc><w:tcPr><w:tcW w:w="1100" w:type="dxa"/><w:noWrap/></w:tcPr><w:p><w:pPr><w:jc w:val="center"/></w:pPr><w:r><w:rPr><w:rFonts w:ascii="Times New Roman" w:hAnsi="Times New Roman" w:eastAsia="Times New Roman" w:cs="Times New Roman"/><w:sz w:val="19"/><w:szCs w:val="19"/></w:rPr><w:t xml:space="preserve">50</w:t></w:r></w:p></w:tc><w:tc><w:tcPr><w:tcW w:w="1100" w:type="dxa"/><w:noWrap/></w:tcPr><w:p><w:pPr><w:jc w:val="center"/></w:pPr><w:r><w:rPr><w:rFonts w:ascii="Times New Roman" w:hAnsi="Times New Roman" w:eastAsia="Times New Roman" w:cs="Times New Roman"/><w:sz w:val="19"/><w:szCs w:val="19"/></w:rPr><w:t xml:space="preserve">Nullable</w:t></w:r></w:p></w:tc></w:tr><w:tr><w:trPr/><w:tc><w:tcPr><w:tcW w:w="500" w:type="dxa"/><w:noWrap/></w:tcPr><w:p><w:pPr><w:jc w:val="center"/></w:pPr><w:r><w:rPr><w:rFonts w:ascii="Times New Roman" w:hAnsi="Times New Roman" w:eastAsia="Times New Roman" w:cs="Times New Roman"/><w:sz w:val="19"/><w:szCs w:val="19"/></w:rPr><w:t xml:space="preserve">6</w:t></w:r></w:p></w:tc><w:tc><w:tcPr><w:tcW w:w="2200" w:type="dxa"/><w:noWrap/></w:tcPr><w:p><w:pPr><w:jc w:val="start"/></w:pPr><w:r><w:rPr><w:rFonts w:ascii="Times New Roman" w:hAnsi="Times New Roman" w:eastAsia="Times New Roman" w:cs="Times New Roman"/><w:sz w:val="19"/><w:szCs w:val="19"/><w:b w:val="1"/><w:bCs w:val="1"/></w:rPr><w:t xml:space="preserve">korp</w:t></w:r></w:p></w:tc><w:tc><w:tcPr><w:tcW w:w="3000" w:type="dxa"/><w:noWrap/></w:tcPr><w:p><w:pPr><w:jc w:val="start"/></w:pPr><w:r><w:rPr><w:rFonts w:ascii="Times New Roman" w:hAnsi="Times New Roman" w:eastAsia="Times New Roman" w:cs="Times New Roman"/><w:sz w:val="19"/><w:szCs w:val="19"/></w:rPr><w:t xml:space="preserve">Korps Kecabangan (Czi, Inf, Kav, dll)</w:t></w:r></w:p></w:tc><w:tc><w:tcPr><w:tcW w:w="1300" w:type="dxa"/><w:noWrap/></w:tcPr><w:p><w:pPr><w:jc w:val="center"/></w:pPr><w:r><w:rPr><w:rFonts w:ascii="Times New Roman" w:hAnsi="Times New Roman" w:eastAsia="Times New Roman" w:cs="Times New Roman"/><w:sz w:val="19"/><w:szCs w:val="19"/></w:rPr><w:t xml:space="preserve">VARCHAR</w:t></w:r></w:p></w:tc><w:tc><w:tcPr><w:tcW w:w="1100" w:type="dxa"/><w:noWrap/></w:tcPr><w:p><w:pPr><w:jc w:val="center"/></w:pPr><w:r><w:rPr><w:rFonts w:ascii="Times New Roman" w:hAnsi="Times New Roman" w:eastAsia="Times New Roman" w:cs="Times New Roman"/><w:sz w:val="19"/><w:szCs w:val="19"/></w:rPr><w:t xml:space="preserve">50</w:t></w:r></w:p></w:tc><w:tc><w:tcPr><w:tcW w:w="1100" w:type="dxa"/><w:noWrap/></w:tcPr><w:p><w:pPr><w:jc w:val="center"/></w:pPr><w:r><w:rPr><w:rFonts w:ascii="Times New Roman" w:hAnsi="Times New Roman" w:eastAsia="Times New Roman" w:cs="Times New Roman"/><w:sz w:val="19"/><w:szCs w:val="19"/></w:rPr><w:t xml:space="preserve">Nullable</w:t></w:r></w:p></w:tc></w:tr><w:tr><w:trPr/><w:tc><w:tcPr><w:tcW w:w="500" w:type="dxa"/><w:noWrap/></w:tcPr><w:p><w:pPr><w:jc w:val="center"/></w:pPr><w:r><w:rPr><w:rFonts w:ascii="Times New Roman" w:hAnsi="Times New Roman" w:eastAsia="Times New Roman" w:cs="Times New Roman"/><w:sz w:val="19"/><w:szCs w:val="19"/></w:rPr><w:t xml:space="preserve">7</w:t></w:r></w:p></w:tc><w:tc><w:tcPr><w:tcW w:w="2200" w:type="dxa"/><w:noWrap/></w:tcPr><w:p><w:pPr><w:jc w:val="start"/></w:pPr><w:r><w:rPr><w:rFonts w:ascii="Times New Roman" w:hAnsi="Times New Roman" w:eastAsia="Times New Roman" w:cs="Times New Roman"/><w:sz w:val="19"/><w:szCs w:val="19"/><w:b w:val="1"/><w:bCs w:val="1"/></w:rPr><w:t xml:space="preserve">satuan</w:t></w:r></w:p></w:tc><w:tc><w:tcPr><w:tcW w:w="3000" w:type="dxa"/><w:noWrap/></w:tcPr><w:p><w:pPr><w:jc w:val="start"/></w:pPr><w:r><w:rPr><w:rFonts w:ascii="Times New Roman" w:hAnsi="Times New Roman" w:eastAsia="Times New Roman" w:cs="Times New Roman"/><w:sz w:val="19"/><w:szCs w:val="19"/></w:rPr><w:t xml:space="preserve">Nama Satuan Kerja Saat Ini</w:t></w:r></w:p></w:tc><w:tc><w:tcPr><w:tcW w:w="1300" w:type="dxa"/><w:noWrap/></w:tcPr><w:p><w:pPr><w:jc w:val="center"/></w:pPr><w:r><w:rPr><w:rFonts w:ascii="Times New Roman" w:hAnsi="Times New Roman" w:eastAsia="Times New Roman" w:cs="Times New Roman"/><w:sz w:val="19"/><w:szCs w:val="19"/></w:rPr><w:t xml:space="preserve">VARCHAR</w:t></w:r></w:p></w:tc><w:tc><w:tcPr><w:tcW w:w="1100" w:type="dxa"/><w:noWrap/></w:tcPr><w:p><w:pPr><w:jc w:val="center"/></w:pPr><w:r><w:rPr><w:rFonts w:ascii="Times New Roman" w:hAnsi="Times New Roman" w:eastAsia="Times New Roman" w:cs="Times New Roman"/><w:sz w:val="19"/><w:szCs w:val="19"/></w:rPr><w:t xml:space="preserve">150</w:t></w:r></w:p></w:tc><w:tc><w:tcPr><w:tcW w:w="1100" w:type="dxa"/><w:noWrap/></w:tcPr><w:p><w:pPr><w:jc w:val="center"/></w:pPr><w:r><w:rPr><w:rFonts w:ascii="Times New Roman" w:hAnsi="Times New Roman" w:eastAsia="Times New Roman" w:cs="Times New Roman"/><w:sz w:val="19"/><w:szCs w:val="19"/></w:rPr><w:t xml:space="preserve">Nullable</w:t></w:r></w:p></w:tc></w:tr><w:tr><w:trPr/><w:tc><w:tcPr><w:tcW w:w="500" w:type="dxa"/><w:noWrap/></w:tcPr><w:p><w:pPr><w:jc w:val="center"/></w:pPr><w:r><w:rPr><w:rFonts w:ascii="Times New Roman" w:hAnsi="Times New Roman" w:eastAsia="Times New Roman" w:cs="Times New Roman"/><w:sz w:val="19"/><w:szCs w:val="19"/></w:rPr><w:t xml:space="preserve">8</w:t></w:r></w:p></w:tc><w:tc><w:tcPr><w:tcW w:w="2200" w:type="dxa"/><w:noWrap/></w:tcPr><w:p><w:pPr><w:jc w:val="start"/></w:pPr><w:r><w:rPr><w:rFonts w:ascii="Times New Roman" w:hAnsi="Times New Roman" w:eastAsia="Times New Roman" w:cs="Times New Roman"/><w:sz w:val="19"/><w:szCs w:val="19"/><w:b w:val="1"/><w:bCs w:val="1"/></w:rPr><w:t xml:space="preserve">kotama</w:t></w:r></w:p></w:tc><w:tc><w:tcPr><w:tcW w:w="3000" w:type="dxa"/><w:noWrap/></w:tcPr><w:p><w:pPr><w:jc w:val="start"/></w:pPr><w:r><w:rPr><w:rFonts w:ascii="Times New Roman" w:hAnsi="Times New Roman" w:eastAsia="Times New Roman" w:cs="Times New Roman"/><w:sz w:val="19"/><w:szCs w:val="19"/></w:rPr><w:t xml:space="preserve">Komando Utama Pembina (Kodam/Korp)</w:t></w:r></w:p></w:tc><w:tc><w:tcPr><w:tcW w:w="1300" w:type="dxa"/><w:noWrap/></w:tcPr><w:p><w:pPr><w:jc w:val="center"/></w:pPr><w:r><w:rPr><w:rFonts w:ascii="Times New Roman" w:hAnsi="Times New Roman" w:eastAsia="Times New Roman" w:cs="Times New Roman"/><w:sz w:val="19"/><w:szCs w:val="19"/></w:rPr><w:t xml:space="preserve">VARCHAR</w:t></w:r></w:p></w:tc><w:tc><w:tcPr><w:tcW w:w="1100" w:type="dxa"/><w:noWrap/></w:tcPr><w:p><w:pPr><w:jc w:val="center"/></w:pPr><w:r><w:rPr><w:rFonts w:ascii="Times New Roman" w:hAnsi="Times New Roman" w:eastAsia="Times New Roman" w:cs="Times New Roman"/><w:sz w:val="19"/><w:szCs w:val="19"/></w:rPr><w:t xml:space="preserve">150</w:t></w:r></w:p></w:tc><w:tc><w:tcPr><w:tcW w:w="1100" w:type="dxa"/><w:noWrap/></w:tcPr><w:p><w:pPr><w:jc w:val="center"/></w:pPr><w:r><w:rPr><w:rFonts w:ascii="Times New Roman" w:hAnsi="Times New Roman" w:eastAsia="Times New Roman" w:cs="Times New Roman"/><w:sz w:val="19"/><w:szCs w:val="19"/></w:rPr><w:t xml:space="preserve">Nullable</w:t></w:r></w:p></w:tc></w:tr><w:tr><w:trPr/><w:tc><w:tcPr><w:tcW w:w="500" w:type="dxa"/><w:noWrap/></w:tcPr><w:p><w:pPr><w:jc w:val="center"/></w:pPr><w:r><w:rPr><w:rFonts w:ascii="Times New Roman" w:hAnsi="Times New Roman" w:eastAsia="Times New Roman" w:cs="Times New Roman"/><w:sz w:val="19"/><w:szCs w:val="19"/></w:rPr><w:t xml:space="preserve">9</w:t></w:r></w:p></w:tc><w:tc><w:tcPr><w:tcW w:w="2200" w:type="dxa"/><w:noWrap/></w:tcPr><w:p><w:pPr><w:jc w:val="start"/></w:pPr><w:r><w:rPr><w:rFonts w:ascii="Times New Roman" w:hAnsi="Times New Roman" w:eastAsia="Times New Roman" w:cs="Times New Roman"/><w:sz w:val="19"/><w:szCs w:val="19"/><w:b w:val="1"/><w:bCs w:val="1"/></w:rPr><w:t xml:space="preserve">jabatan</w:t></w:r></w:p></w:tc><w:tc><w:tcPr><w:tcW w:w="3000" w:type="dxa"/><w:noWrap/></w:tcPr><w:p><w:pPr><w:jc w:val="start"/></w:pPr><w:r><w:rPr><w:rFonts w:ascii="Times New Roman" w:hAnsi="Times New Roman" w:eastAsia="Times New Roman" w:cs="Times New Roman"/><w:sz w:val="19"/><w:szCs w:val="19"/></w:rPr><w:t xml:space="preserve">Jabatan Dinas yang Diduduki</w:t></w:r></w:p></w:tc><w:tc><w:tcPr><w:tcW w:w="1300" w:type="dxa"/><w:noWrap/></w:tcPr><w:p><w:pPr><w:jc w:val="center"/></w:pPr><w:r><w:rPr><w:rFonts w:ascii="Times New Roman" w:hAnsi="Times New Roman" w:eastAsia="Times New Roman" w:cs="Times New Roman"/><w:sz w:val="19"/><w:szCs w:val="19"/></w:rPr><w:t xml:space="preserve">VARCHAR</w:t></w:r></w:p></w:tc><w:tc><w:tcPr><w:tcW w:w="1100" w:type="dxa"/><w:noWrap/></w:tcPr><w:p><w:pPr><w:jc w:val="center"/></w:pPr><w:r><w:rPr><w:rFonts w:ascii="Times New Roman" w:hAnsi="Times New Roman" w:eastAsia="Times New Roman" w:cs="Times New Roman"/><w:sz w:val="19"/><w:szCs w:val="19"/></w:rPr><w:t xml:space="preserve">150</w:t></w:r></w:p></w:tc><w:tc><w:tcPr><w:tcW w:w="1100" w:type="dxa"/><w:noWrap/></w:tcPr><w:p><w:pPr><w:jc w:val="center"/></w:pPr><w:r><w:rPr><w:rFonts w:ascii="Times New Roman" w:hAnsi="Times New Roman" w:eastAsia="Times New Roman" w:cs="Times New Roman"/><w:sz w:val="19"/><w:szCs w:val="19"/></w:rPr><w:t xml:space="preserve">Nullable</w:t></w:r></w:p></w:tc></w:tr><w:tr><w:trPr/><w:tc><w:tcPr><w:tcW w:w="500" w:type="dxa"/><w:noWrap/></w:tcPr><w:p><w:pPr><w:jc w:val="center"/></w:pPr><w:r><w:rPr><w:rFonts w:ascii="Times New Roman" w:hAnsi="Times New Roman" w:eastAsia="Times New Roman" w:cs="Times New Roman"/><w:sz w:val="19"/><w:szCs w:val="19"/></w:rPr><w:t xml:space="preserve">10</w:t></w:r></w:p></w:tc><w:tc><w:tcPr><w:tcW w:w="2200" w:type="dxa"/><w:noWrap/></w:tcPr><w:p><w:pPr><w:jc w:val="start"/></w:pPr><w:r><w:rPr><w:rFonts w:ascii="Times New Roman" w:hAnsi="Times New Roman" w:eastAsia="Times New Roman" w:cs="Times New Roman"/><w:sz w:val="19"/><w:szCs w:val="19"/><w:b w:val="1"/><w:bCs w:val="1"/></w:rPr><w:t xml:space="preserve">tmt_jabatan</w:t></w:r></w:p></w:tc><w:tc><w:tcPr><w:tcW w:w="3000" w:type="dxa"/><w:noWrap/></w:tcPr><w:p><w:pPr><w:jc w:val="start"/></w:pPr><w:r><w:rPr><w:rFonts w:ascii="Times New Roman" w:hAnsi="Times New Roman" w:eastAsia="Times New Roman" w:cs="Times New Roman"/><w:sz w:val="19"/><w:szCs w:val="19"/></w:rPr><w:t xml:space="preserve">TMT Mulai Menjabat</w:t></w:r></w:p></w:tc><w:tc><w:tcPr><w:tcW w:w="1300" w:type="dxa"/><w:noWrap/></w:tcPr><w:p><w:pPr><w:jc w:val="center"/></w:pPr><w:r><w:rPr><w:rFonts w:ascii="Times New Roman" w:hAnsi="Times New Roman" w:eastAsia="Times New Roman" w:cs="Times New Roman"/><w:sz w:val="19"/><w:szCs w:val="19"/></w:rPr><w:t xml:space="preserve">DATE</w:t></w:r></w:p></w:tc><w:tc><w:tcPr><w:tcW w:w="1100" w:type="dxa"/><w:noWrap/></w:tcPr><w:p><w:pPr><w:jc w:val="center"/></w:pPr><w:r><w:rPr><w:rFonts w:ascii="Times New Roman" w:hAnsi="Times New Roman" w:eastAsia="Times New Roman" w:cs="Times New Roman"/><w:sz w:val="19"/><w:szCs w:val="19"/></w:rPr><w:t xml:space="preserve">10</w:t></w:r></w:p></w:tc><w:tc><w:tcPr><w:tcW w:w="1100" w:type="dxa"/><w:noWrap/></w:tcPr><w:p><w:pPr><w:jc w:val="center"/></w:pPr><w:r><w:rPr><w:rFonts w:ascii="Times New Roman" w:hAnsi="Times New Roman" w:eastAsia="Times New Roman" w:cs="Times New Roman"/><w:sz w:val="19"/><w:szCs w:val="19"/></w:rPr><w:t xml:space="preserve">Nullable</w:t></w:r></w:p></w:tc></w:tr><w:tr><w:trPr/><w:tc><w:tcPr><w:tcW w:w="500" w:type="dxa"/><w:noWrap/></w:tcPr><w:p><w:pPr><w:jc w:val="center"/></w:pPr><w:r><w:rPr><w:rFonts w:ascii="Times New Roman" w:hAnsi="Times New Roman" w:eastAsia="Times New Roman" w:cs="Times New Roman"/><w:sz w:val="19"/><w:szCs w:val="19"/></w:rPr><w:t xml:space="preserve">11</w:t></w:r></w:p></w:tc><w:tc><w:tcPr><w:tcW w:w="2200" w:type="dxa"/><w:noWrap/></w:tcPr><w:p><w:pPr><w:jc w:val="start"/></w:pPr><w:r><w:rPr><w:rFonts w:ascii="Times New Roman" w:hAnsi="Times New Roman" w:eastAsia="Times New Roman" w:cs="Times New Roman"/><w:sz w:val="19"/><w:szCs w:val="19"/><w:b w:val="1"/><w:bCs w:val="1"/></w:rPr><w:t xml:space="preserve">tmt_pangkat</w:t></w:r></w:p></w:tc><w:tc><w:tcPr><w:tcW w:w="3000" w:type="dxa"/><w:noWrap/></w:tcPr><w:p><w:pPr><w:jc w:val="start"/></w:pPr><w:r><w:rPr><w:rFonts w:ascii="Times New Roman" w:hAnsi="Times New Roman" w:eastAsia="Times New Roman" w:cs="Times New Roman"/><w:sz w:val="19"/><w:szCs w:val="19"/></w:rPr><w:t xml:space="preserve">TMT Pangkat Terkini</w:t></w:r></w:p></w:tc><w:tc><w:tcPr><w:tcW w:w="1300" w:type="dxa"/><w:noWrap/></w:tcPr><w:p><w:pPr><w:jc w:val="center"/></w:pPr><w:r><w:rPr><w:rFonts w:ascii="Times New Roman" w:hAnsi="Times New Roman" w:eastAsia="Times New Roman" w:cs="Times New Roman"/><w:sz w:val="19"/><w:szCs w:val="19"/></w:rPr><w:t xml:space="preserve">DATE</w:t></w:r></w:p></w:tc><w:tc><w:tcPr><w:tcW w:w="1100" w:type="dxa"/><w:noWrap/></w:tcPr><w:p><w:pPr><w:jc w:val="center"/></w:pPr><w:r><w:rPr><w:rFonts w:ascii="Times New Roman" w:hAnsi="Times New Roman" w:eastAsia="Times New Roman" w:cs="Times New Roman"/><w:sz w:val="19"/><w:szCs w:val="19"/></w:rPr><w:t xml:space="preserve">10</w:t></w:r></w:p></w:tc><w:tc><w:tcPr><w:tcW w:w="1100" w:type="dxa"/><w:noWrap/></w:tcPr><w:p><w:pPr><w:jc w:val="center"/></w:pPr><w:r><w:rPr><w:rFonts w:ascii="Times New Roman" w:hAnsi="Times New Roman" w:eastAsia="Times New Roman" w:cs="Times New Roman"/><w:sz w:val="19"/><w:szCs w:val="19"/></w:rPr><w:t xml:space="preserve">Nullable</w:t></w:r></w:p></w:tc></w:tr><w:tr><w:trPr/><w:tc><w:tcPr><w:tcW w:w="500" w:type="dxa"/><w:noWrap/></w:tcPr><w:p><w:pPr><w:jc w:val="center"/></w:pPr><w:r><w:rPr><w:rFonts w:ascii="Times New Roman" w:hAnsi="Times New Roman" w:eastAsia="Times New Roman" w:cs="Times New Roman"/><w:sz w:val="19"/><w:szCs w:val="19"/></w:rPr><w:t xml:space="preserve">12</w:t></w:r></w:p></w:tc><w:tc><w:tcPr><w:tcW w:w="2200" w:type="dxa"/><w:noWrap/></w:tcPr><w:p><w:pPr><w:jc w:val="start"/></w:pPr><w:r><w:rPr><w:rFonts w:ascii="Times New Roman" w:hAnsi="Times New Roman" w:eastAsia="Times New Roman" w:cs="Times New Roman"/><w:sz w:val="19"/><w:szCs w:val="19"/><w:b w:val="1"/><w:bCs w:val="1"/></w:rPr><w:t xml:space="preserve">tanggal_lahir</w:t></w:r></w:p></w:tc><w:tc><w:tcPr><w:tcW w:w="3000" w:type="dxa"/><w:noWrap/></w:tcPr><w:p><w:pPr><w:jc w:val="start"/></w:pPr><w:r><w:rPr><w:rFonts w:ascii="Times New Roman" w:hAnsi="Times New Roman" w:eastAsia="Times New Roman" w:cs="Times New Roman"/><w:sz w:val="19"/><w:szCs w:val="19"/></w:rPr><w:t xml:space="preserve">Tanggal Lahir Prajurit</w:t></w:r></w:p></w:tc><w:tc><w:tcPr><w:tcW w:w="1300" w:type="dxa"/><w:noWrap/></w:tcPr><w:p><w:pPr><w:jc w:val="center"/></w:pPr><w:r><w:rPr><w:rFonts w:ascii="Times New Roman" w:hAnsi="Times New Roman" w:eastAsia="Times New Roman" w:cs="Times New Roman"/><w:sz w:val="19"/><w:szCs w:val="19"/></w:rPr><w:t xml:space="preserve">DATE</w:t></w:r></w:p></w:tc><w:tc><w:tcPr><w:tcW w:w="1100" w:type="dxa"/><w:noWrap/></w:tcPr><w:p><w:pPr><w:jc w:val="center"/></w:pPr><w:r><w:rPr><w:rFonts w:ascii="Times New Roman" w:hAnsi="Times New Roman" w:eastAsia="Times New Roman" w:cs="Times New Roman"/><w:sz w:val="19"/><w:szCs w:val="19"/></w:rPr><w:t xml:space="preserve">10</w:t></w:r></w:p></w:tc><w:tc><w:tcPr><w:tcW w:w="1100" w:type="dxa"/><w:noWrap/></w:tcPr><w:p><w:pPr><w:jc w:val="center"/></w:pPr><w:r><w:rPr><w:rFonts w:ascii="Times New Roman" w:hAnsi="Times New Roman" w:eastAsia="Times New Roman" w:cs="Times New Roman"/><w:sz w:val="19"/><w:szCs w:val="19"/></w:rPr><w:t xml:space="preserve">Nullable</w:t></w:r></w:p></w:tc></w:tr><w:tr><w:trPr/><w:tc><w:tcPr><w:tcW w:w="500" w:type="dxa"/><w:noWrap/></w:tcPr><w:p><w:pPr><w:jc w:val="center"/></w:pPr><w:r><w:rPr><w:rFonts w:ascii="Times New Roman" w:hAnsi="Times New Roman" w:eastAsia="Times New Roman" w:cs="Times New Roman"/><w:sz w:val="19"/><w:szCs w:val="19"/></w:rPr><w:t xml:space="preserve">13</w:t></w:r></w:p></w:tc><w:tc><w:tcPr><w:tcW w:w="2200" w:type="dxa"/><w:noWrap/></w:tcPr><w:p><w:pPr><w:jc w:val="start"/></w:pPr><w:r><w:rPr><w:rFonts w:ascii="Times New Roman" w:hAnsi="Times New Roman" w:eastAsia="Times New Roman" w:cs="Times New Roman"/><w:sz w:val="19"/><w:szCs w:val="19"/><w:b w:val="1"/><w:bCs w:val="1"/></w:rPr><w:t xml:space="preserve">tempat_lahir</w:t></w:r></w:p></w:tc><w:tc><w:tcPr><w:tcW w:w="3000" w:type="dxa"/><w:noWrap/></w:tcPr><w:p><w:pPr><w:jc w:val="start"/></w:pPr><w:r><w:rPr><w:rFonts w:ascii="Times New Roman" w:hAnsi="Times New Roman" w:eastAsia="Times New Roman" w:cs="Times New Roman"/><w:sz w:val="19"/><w:szCs w:val="19"/></w:rPr><w:t xml:space="preserve">Tempat / Kota Kelahiran</w:t></w:r></w:p></w:tc><w:tc><w:tcPr><w:tcW w:w="1300" w:type="dxa"/><w:noWrap/></w:tcPr><w:p><w:pPr><w:jc w:val="center"/></w:pPr><w:r><w:rPr><w:rFonts w:ascii="Times New Roman" w:hAnsi="Times New Roman" w:eastAsia="Times New Roman" w:cs="Times New Roman"/><w:sz w:val="19"/><w:szCs w:val="19"/></w:rPr><w:t xml:space="preserve">VARCHAR</w:t></w:r></w:p></w:tc><w:tc><w:tcPr><w:tcW w:w="1100" w:type="dxa"/><w:noWrap/></w:tcPr><w:p><w:pPr><w:jc w:val="center"/></w:pPr><w:r><w:rPr><w:rFonts w:ascii="Times New Roman" w:hAnsi="Times New Roman" w:eastAsia="Times New Roman" w:cs="Times New Roman"/><w:sz w:val="19"/><w:szCs w:val="19"/></w:rPr><w:t xml:space="preserve">100</w:t></w:r></w:p></w:tc><w:tc><w:tcPr><w:tcW w:w="1100" w:type="dxa"/><w:noWrap/></w:tcPr><w:p><w:pPr><w:jc w:val="center"/></w:pPr><w:r><w:rPr><w:rFonts w:ascii="Times New Roman" w:hAnsi="Times New Roman" w:eastAsia="Times New Roman" w:cs="Times New Roman"/><w:sz w:val="19"/><w:szCs w:val="19"/></w:rPr><w:t xml:space="preserve">Nullable</w:t></w:r></w:p></w:tc></w:tr><w:tr><w:trPr/><w:tc><w:tcPr><w:tcW w:w="500" w:type="dxa"/><w:noWrap/></w:tcPr><w:p><w:pPr><w:jc w:val="center"/></w:pPr><w:r><w:rPr><w:rFonts w:ascii="Times New Roman" w:hAnsi="Times New Roman" w:eastAsia="Times New Roman" w:cs="Times New Roman"/><w:sz w:val="19"/><w:szCs w:val="19"/></w:rPr><w:t xml:space="preserve">14</w:t></w:r></w:p></w:tc><w:tc><w:tcPr><w:tcW w:w="2200" w:type="dxa"/><w:noWrap/></w:tcPr><w:p><w:pPr><w:jc w:val="start"/></w:pPr><w:r><w:rPr><w:rFonts w:ascii="Times New Roman" w:hAnsi="Times New Roman" w:eastAsia="Times New Roman" w:cs="Times New Roman"/><w:sz w:val="19"/><w:szCs w:val="19"/><w:b w:val="1"/><w:bCs w:val="1"/></w:rPr><w:t xml:space="preserve">jenis_kelamin</w:t></w:r></w:p></w:tc><w:tc><w:tcPr><w:tcW w:w="3000" w:type="dxa"/><w:noWrap/></w:tcPr><w:p><w:pPr><w:jc w:val="start"/></w:pPr><w:r><w:rPr><w:rFonts w:ascii="Times New Roman" w:hAnsi="Times New Roman" w:eastAsia="Times New Roman" w:cs="Times New Roman"/><w:sz w:val="19"/><w:szCs w:val="19"/></w:rPr><w:t xml:space="preserve">Jenis Kelamin (L / P)</w:t></w:r></w:p></w:tc><w:tc><w:tcPr><w:tcW w:w="1300" w:type="dxa"/><w:noWrap/></w:tcPr><w:p><w:pPr><w:jc w:val="center"/></w:pPr><w:r><w:rPr><w:rFonts w:ascii="Times New Roman" w:hAnsi="Times New Roman" w:eastAsia="Times New Roman" w:cs="Times New Roman"/><w:sz w:val="19"/><w:szCs w:val="19"/></w:rPr><w:t xml:space="preserve">ENUM</w:t></w:r></w:p></w:tc><w:tc><w:tcPr><w:tcW w:w="1100" w:type="dxa"/><w:noWrap/></w:tcPr><w:p><w:pPr><w:jc w:val="center"/></w:pPr><w:r><w:rPr><w:rFonts w:ascii="Times New Roman" w:hAnsi="Times New Roman" w:eastAsia="Times New Roman" w:cs="Times New Roman"/><w:sz w:val="19"/><w:szCs w:val="19"/></w:rPr><w:t xml:space="preserve">1</w:t></w:r></w:p></w:tc><w:tc><w:tcPr><w:tcW w:w="1100" w:type="dxa"/><w:noWrap/></w:tcPr><w:p><w:pPr><w:jc w:val="center"/></w:pPr><w:r><w:rPr><w:rFonts w:ascii="Times New Roman" w:hAnsi="Times New Roman" w:eastAsia="Times New Roman" w:cs="Times New Roman"/><w:sz w:val="19"/><w:szCs w:val="19"/></w:rPr><w:t xml:space="preserve">Default L</w:t></w:r></w:p></w:tc></w:tr><w:tr><w:trPr/><w:tc><w:tcPr><w:tcW w:w="500" w:type="dxa"/><w:noWrap/></w:tcPr><w:p><w:pPr><w:jc w:val="center"/></w:pPr><w:r><w:rPr><w:rFonts w:ascii="Times New Roman" w:hAnsi="Times New Roman" w:eastAsia="Times New Roman" w:cs="Times New Roman"/><w:sz w:val="19"/><w:szCs w:val="19"/></w:rPr><w:t xml:space="preserve">15</w:t></w:r></w:p></w:tc><w:tc><w:tcPr><w:tcW w:w="2200" w:type="dxa"/><w:noWrap/></w:tcPr><w:p><w:pPr><w:jc w:val="start"/></w:pPr><w:r><w:rPr><w:rFonts w:ascii="Times New Roman" w:hAnsi="Times New Roman" w:eastAsia="Times New Roman" w:cs="Times New Roman"/><w:sz w:val="19"/><w:szCs w:val="19"/><w:b w:val="1"/><w:bCs w:val="1"/></w:rPr><w:t xml:space="preserve">agama</w:t></w:r></w:p></w:tc><w:tc><w:tcPr><w:tcW w:w="3000" w:type="dxa"/><w:noWrap/></w:tcPr><w:p><w:pPr><w:jc w:val="start"/></w:pPr><w:r><w:rPr><w:rFonts w:ascii="Times New Roman" w:hAnsi="Times New Roman" w:eastAsia="Times New Roman" w:cs="Times New Roman"/><w:sz w:val="19"/><w:szCs w:val="19"/></w:rPr><w:t xml:space="preserve">Agama yang Dianut</w:t></w:r></w:p></w:tc><w:tc><w:tcPr><w:tcW w:w="1300" w:type="dxa"/><w:noWrap/></w:tcPr><w:p><w:pPr><w:jc w:val="center"/></w:pPr><w:r><w:rPr><w:rFonts w:ascii="Times New Roman" w:hAnsi="Times New Roman" w:eastAsia="Times New Roman" w:cs="Times New Roman"/><w:sz w:val="19"/><w:szCs w:val="19"/></w:rPr><w:t xml:space="preserve">VARCHAR</w:t></w:r></w:p></w:tc><w:tc><w:tcPr><w:tcW w:w="1100" w:type="dxa"/><w:noWrap/></w:tcPr><w:p><w:pPr><w:jc w:val="center"/></w:pPr><w:r><w:rPr><w:rFonts w:ascii="Times New Roman" w:hAnsi="Times New Roman" w:eastAsia="Times New Roman" w:cs="Times New Roman"/><w:sz w:val="19"/><w:szCs w:val="19"/></w:rPr><w:t xml:space="preserve">30</w:t></w:r></w:p></w:tc><w:tc><w:tcPr><w:tcW w:w="1100" w:type="dxa"/><w:noWrap/></w:tcPr><w:p><w:pPr><w:jc w:val="center"/></w:pPr><w:r><w:rPr><w:rFonts w:ascii="Times New Roman" w:hAnsi="Times New Roman" w:eastAsia="Times New Roman" w:cs="Times New Roman"/><w:sz w:val="19"/><w:szCs w:val="19"/></w:rPr><w:t xml:space="preserve">Nullable</w:t></w:r></w:p></w:tc></w:tr><w:tr><w:trPr/><w:tc><w:tcPr><w:tcW w:w="500" w:type="dxa"/><w:noWrap/></w:tcPr><w:p><w:pPr><w:jc w:val="center"/></w:pPr><w:r><w:rPr><w:rFonts w:ascii="Times New Roman" w:hAnsi="Times New Roman" w:eastAsia="Times New Roman" w:cs="Times New Roman"/><w:sz w:val="19"/><w:szCs w:val="19"/></w:rPr><w:t xml:space="preserve">16</w:t></w:r></w:p></w:tc><w:tc><w:tcPr><w:tcW w:w="2200" w:type="dxa"/><w:noWrap/></w:tcPr><w:p><w:pPr><w:jc w:val="start"/></w:pPr><w:r><w:rPr><w:rFonts w:ascii="Times New Roman" w:hAnsi="Times New Roman" w:eastAsia="Times New Roman" w:cs="Times New Roman"/><w:sz w:val="19"/><w:szCs w:val="19"/><w:b w:val="1"/><w:bCs w:val="1"/></w:rPr><w:t xml:space="preserve">status_kawin</w:t></w:r></w:p></w:tc><w:tc><w:tcPr><w:tcW w:w="3000" w:type="dxa"/><w:noWrap/></w:tcPr><w:p><w:pPr><w:jc w:val="start"/></w:pPr><w:r><w:rPr><w:rFonts w:ascii="Times New Roman" w:hAnsi="Times New Roman" w:eastAsia="Times New Roman" w:cs="Times New Roman"/><w:sz w:val="19"/><w:szCs w:val="19"/></w:rPr><w:t xml:space="preserve">Status Pernikahan</w:t></w:r></w:p></w:tc><w:tc><w:tcPr><w:tcW w:w="1300" w:type="dxa"/><w:noWrap/></w:tcPr><w:p><w:pPr><w:jc w:val="center"/></w:pPr><w:r><w:rPr><w:rFonts w:ascii="Times New Roman" w:hAnsi="Times New Roman" w:eastAsia="Times New Roman" w:cs="Times New Roman"/><w:sz w:val="19"/><w:szCs w:val="19"/></w:rPr><w:t xml:space="preserve">VARCHAR</w:t></w:r></w:p></w:tc><w:tc><w:tcPr><w:tcW w:w="1100" w:type="dxa"/><w:noWrap/></w:tcPr><w:p><w:pPr><w:jc w:val="center"/></w:pPr><w:r><w:rPr><w:rFonts w:ascii="Times New Roman" w:hAnsi="Times New Roman" w:eastAsia="Times New Roman" w:cs="Times New Roman"/><w:sz w:val="19"/><w:szCs w:val="19"/></w:rPr><w:t xml:space="preserve">30</w:t></w:r></w:p></w:tc><w:tc><w:tcPr><w:tcW w:w="1100" w:type="dxa"/><w:noWrap/></w:tcPr><w:p><w:pPr><w:jc w:val="center"/></w:pPr><w:r><w:rPr><w:rFonts w:ascii="Times New Roman" w:hAnsi="Times New Roman" w:eastAsia="Times New Roman" w:cs="Times New Roman"/><w:sz w:val="19"/><w:szCs w:val="19"/></w:rPr><w:t xml:space="preserve">Nullable</w:t></w:r></w:p></w:tc></w:tr><w:tr><w:trPr/><w:tc><w:tcPr><w:tcW w:w="500" w:type="dxa"/><w:noWrap/></w:tcPr><w:p><w:pPr><w:jc w:val="center"/></w:pPr><w:r><w:rPr><w:rFonts w:ascii="Times New Roman" w:hAnsi="Times New Roman" w:eastAsia="Times New Roman" w:cs="Times New Roman"/><w:sz w:val="19"/><w:szCs w:val="19"/></w:rPr><w:t xml:space="preserve">17</w:t></w:r></w:p></w:tc><w:tc><w:tcPr><w:tcW w:w="2200" w:type="dxa"/><w:noWrap/></w:tcPr><w:p><w:pPr><w:jc w:val="start"/></w:pPr><w:r><w:rPr><w:rFonts w:ascii="Times New Roman" w:hAnsi="Times New Roman" w:eastAsia="Times New Roman" w:cs="Times New Roman"/><w:sz w:val="19"/><w:szCs w:val="19"/><w:b w:val="1"/><w:bCs w:val="1"/></w:rPr><w:t xml:space="preserve">alamat</w:t></w:r></w:p></w:tc><w:tc><w:tcPr><w:tcW w:w="3000" w:type="dxa"/><w:noWrap/></w:tcPr><w:p><w:pPr><w:jc w:val="start"/></w:pPr><w:r><w:rPr><w:rFonts w:ascii="Times New Roman" w:hAnsi="Times New Roman" w:eastAsia="Times New Roman" w:cs="Times New Roman"/><w:sz w:val="19"/><w:szCs w:val="19"/></w:rPr><w:t xml:space="preserve">Alamat Tempat Tinggal Resmi</w:t></w:r></w:p></w:tc><w:tc><w:tcPr><w:tcW w:w="1300" w:type="dxa"/><w:noWrap/></w:tcPr><w:p><w:pPr><w:jc w:val="center"/></w:pPr><w:r><w:rPr><w:rFonts w:ascii="Times New Roman" w:hAnsi="Times New Roman" w:eastAsia="Times New Roman" w:cs="Times New Roman"/><w:sz w:val="19"/><w:szCs w:val="19"/></w:rPr><w:t xml:space="preserve">TEXT</w:t></w:r></w:p></w:tc><w:tc><w:tcPr><w:tcW w:w="1100" w:type="dxa"/><w:noWrap/></w:tcPr><w:p><w:pPr><w:jc w:val="center"/></w:pPr><w:r><w:rPr><w:rFonts w:ascii="Times New Roman" w:hAnsi="Times New Roman" w:eastAsia="Times New Roman" w:cs="Times New Roman"/><w:sz w:val="19"/><w:szCs w:val="19"/></w:rPr><w:t xml:space="preserve">-</w:t></w:r></w:p></w:tc><w:tc><w:tcPr><w:tcW w:w="1100" w:type="dxa"/><w:noWrap/></w:tcPr><w:p><w:pPr><w:jc w:val="center"/></w:pPr><w:r><w:rPr><w:rFonts w:ascii="Times New Roman" w:hAnsi="Times New Roman" w:eastAsia="Times New Roman" w:cs="Times New Roman"/><w:sz w:val="19"/><w:szCs w:val="19"/></w:rPr><w:t xml:space="preserve">Nullable</w:t></w:r></w:p></w:tc></w:tr><w:tr><w:trPr/><w:tc><w:tcPr><w:tcW w:w="500" w:type="dxa"/><w:noWrap/></w:tcPr><w:p><w:pPr><w:jc w:val="center"/></w:pPr><w:r><w:rPr><w:rFonts w:ascii="Times New Roman" w:hAnsi="Times New Roman" w:eastAsia="Times New Roman" w:cs="Times New Roman"/><w:sz w:val="19"/><w:szCs w:val="19"/></w:rPr><w:t xml:space="preserve">18</w:t></w:r></w:p></w:tc><w:tc><w:tcPr><w:tcW w:w="2200" w:type="dxa"/><w:noWrap/></w:tcPr><w:p><w:pPr><w:jc w:val="start"/></w:pPr><w:r><w:rPr><w:rFonts w:ascii="Times New Roman" w:hAnsi="Times New Roman" w:eastAsia="Times New Roman" w:cs="Times New Roman"/><w:sz w:val="19"/><w:szCs w:val="19"/><w:b w:val="1"/><w:bCs w:val="1"/></w:rPr><w:t xml:space="preserve">no_hp</w:t></w:r></w:p></w:tc><w:tc><w:tcPr><w:tcW w:w="3000" w:type="dxa"/><w:noWrap/></w:tcPr><w:p><w:pPr><w:jc w:val="start"/></w:pPr><w:r><w:rPr><w:rFonts w:ascii="Times New Roman" w:hAnsi="Times New Roman" w:eastAsia="Times New Roman" w:cs="Times New Roman"/><w:sz w:val="19"/><w:szCs w:val="19"/></w:rPr><w:t xml:space="preserve">Nomor Kontak Telepon / WA</w:t></w:r></w:p></w:tc><w:tc><w:tcPr><w:tcW w:w="1300" w:type="dxa"/><w:noWrap/></w:tcPr><w:p><w:pPr><w:jc w:val="center"/></w:pPr><w:r><w:rPr><w:rFonts w:ascii="Times New Roman" w:hAnsi="Times New Roman" w:eastAsia="Times New Roman" w:cs="Times New Roman"/><w:sz w:val="19"/><w:szCs w:val="19"/></w:rPr><w:t xml:space="preserve">VARCHAR</w:t></w:r></w:p></w:tc><w:tc><w:tcPr><w:tcW w:w="1100" w:type="dxa"/><w:noWrap/></w:tcPr><w:p><w:pPr><w:jc w:val="center"/></w:pPr><w:r><w:rPr><w:rFonts w:ascii="Times New Roman" w:hAnsi="Times New Roman" w:eastAsia="Times New Roman" w:cs="Times New Roman"/><w:sz w:val="19"/><w:szCs w:val="19"/></w:rPr><w:t xml:space="preserve">20</w:t></w:r></w:p></w:tc><w:tc><w:tcPr><w:tcW w:w="1100" w:type="dxa"/><w:noWrap/></w:tcPr><w:p><w:pPr><w:jc w:val="center"/></w:pPr><w:r><w:rPr><w:rFonts w:ascii="Times New Roman" w:hAnsi="Times New Roman" w:eastAsia="Times New Roman" w:cs="Times New Roman"/><w:sz w:val="19"/><w:szCs w:val="19"/></w:rPr><w:t xml:space="preserve">Nullable</w:t></w:r></w:p></w:tc></w:tr><w:tr><w:trPr/><w:tc><w:tcPr><w:tcW w:w="500" w:type="dxa"/><w:noWrap/></w:tcPr><w:p><w:pPr><w:jc w:val="center"/></w:pPr><w:r><w:rPr><w:rFonts w:ascii="Times New Roman" w:hAnsi="Times New Roman" w:eastAsia="Times New Roman" w:cs="Times New Roman"/><w:sz w:val="19"/><w:szCs w:val="19"/></w:rPr><w:t xml:space="preserve">19</w:t></w:r></w:p></w:tc><w:tc><w:tcPr><w:tcW w:w="2200" w:type="dxa"/><w:noWrap/></w:tcPr><w:p><w:pPr><w:jc w:val="start"/></w:pPr><w:r><w:rPr><w:rFonts w:ascii="Times New Roman" w:hAnsi="Times New Roman" w:eastAsia="Times New Roman" w:cs="Times New Roman"/><w:sz w:val="19"/><w:szCs w:val="19"/><w:b w:val="1"/><w:bCs w:val="1"/></w:rPr><w:t xml:space="preserve">email</w:t></w:r></w:p></w:tc><w:tc><w:tcPr><w:tcW w:w="3000" w:type="dxa"/><w:noWrap/></w:tcPr><w:p><w:pPr><w:jc w:val="start"/></w:pPr><w:r><w:rPr><w:rFonts w:ascii="Times New Roman" w:hAnsi="Times New Roman" w:eastAsia="Times New Roman" w:cs="Times New Roman"/><w:sz w:val="19"/><w:szCs w:val="19"/></w:rPr><w:t xml:space="preserve">Alamat Surel Resmi</w:t></w:r></w:p></w:tc><w:tc><w:tcPr><w:tcW w:w="1300" w:type="dxa"/><w:noWrap/></w:tcPr><w:p><w:pPr><w:jc w:val="center"/></w:pPr><w:r><w:rPr><w:rFonts w:ascii="Times New Roman" w:hAnsi="Times New Roman" w:eastAsia="Times New Roman" w:cs="Times New Roman"/><w:sz w:val="19"/><w:szCs w:val="19"/></w:rPr><w:t xml:space="preserve">VARCHAR</w:t></w:r></w:p></w:tc><w:tc><w:tcPr><w:tcW w:w="1100" w:type="dxa"/><w:noWrap/></w:tcPr><w:p><w:pPr><w:jc w:val="center"/></w:pPr><w:r><w:rPr><w:rFonts w:ascii="Times New Roman" w:hAnsi="Times New Roman" w:eastAsia="Times New Roman" w:cs="Times New Roman"/><w:sz w:val="19"/><w:szCs w:val="19"/></w:rPr><w:t xml:space="preserve">100</w:t></w:r></w:p></w:tc><w:tc><w:tcPr><w:tcW w:w="1100" w:type="dxa"/><w:noWrap/></w:tcPr><w:p><w:pPr><w:jc w:val="center"/></w:pPr><w:r><w:rPr><w:rFonts w:ascii="Times New Roman" w:hAnsi="Times New Roman" w:eastAsia="Times New Roman" w:cs="Times New Roman"/><w:sz w:val="19"/><w:szCs w:val="19"/></w:rPr><w:t xml:space="preserve">Nullable</w:t></w:r></w:p></w:tc></w:tr><w:tr><w:trPr/><w:tc><w:tcPr><w:tcW w:w="500" w:type="dxa"/><w:noWrap/></w:tcPr><w:p><w:pPr><w:jc w:val="center"/></w:pPr><w:r><w:rPr><w:rFonts w:ascii="Times New Roman" w:hAnsi="Times New Roman" w:eastAsia="Times New Roman" w:cs="Times New Roman"/><w:sz w:val="19"/><w:szCs w:val="19"/></w:rPr><w:t xml:space="preserve">20</w:t></w:r></w:p></w:tc><w:tc><w:tcPr><w:tcW w:w="2200" w:type="dxa"/><w:noWrap/></w:tcPr><w:p><w:pPr><w:jc w:val="start"/></w:pPr><w:r><w:rPr><w:rFonts w:ascii="Times New Roman" w:hAnsi="Times New Roman" w:eastAsia="Times New Roman" w:cs="Times New Roman"/><w:sz w:val="19"/><w:szCs w:val="19"/><w:b w:val="1"/><w:bCs w:val="1"/></w:rPr><w:t xml:space="preserve">foto</w:t></w:r></w:p></w:tc><w:tc><w:tcPr><w:tcW w:w="3000" w:type="dxa"/><w:noWrap/></w:tcPr><w:p><w:pPr><w:jc w:val="start"/></w:pPr><w:r><w:rPr><w:rFonts w:ascii="Times New Roman" w:hAnsi="Times New Roman" w:eastAsia="Times New Roman" w:cs="Times New Roman"/><w:sz w:val="19"/><w:szCs w:val="19"/></w:rPr><w:t xml:space="preserve">Path File Foto Personel</w:t></w:r></w:p></w:tc><w:tc><w:tcPr><w:tcW w:w="1300" w:type="dxa"/><w:noWrap/></w:tcPr><w:p><w:pPr><w:jc w:val="center"/></w:pPr><w:r><w:rPr><w:rFonts w:ascii="Times New Roman" w:hAnsi="Times New Roman" w:eastAsia="Times New Roman" w:cs="Times New Roman"/><w:sz w:val="19"/><w:szCs w:val="19"/></w:rPr><w:t xml:space="preserve">VARCHAR</w:t></w:r></w:p></w:tc><w:tc><w:tcPr><w:tcW w:w="1100" w:type="dxa"/><w:noWrap/></w:tcPr><w:p><w:pPr><w:jc w:val="center"/></w:pPr><w:r><w:rPr><w:rFonts w:ascii="Times New Roman" w:hAnsi="Times New Roman" w:eastAsia="Times New Roman" w:cs="Times New Roman"/><w:sz w:val="19"/><w:szCs w:val="19"/></w:rPr><w:t xml:space="preserve">255</w:t></w:r></w:p></w:tc><w:tc><w:tcPr><w:tcW w:w="1100" w:type="dxa"/><w:noWrap/></w:tcPr><w:p><w:pPr><w:jc w:val="center"/></w:pPr><w:r><w:rPr><w:rFonts w:ascii="Times New Roman" w:hAnsi="Times New Roman" w:eastAsia="Times New Roman" w:cs="Times New Roman"/><w:sz w:val="19"/><w:szCs w:val="19"/></w:rPr><w:t xml:space="preserve">Nullable</w:t></w:r></w:p></w:tc></w:tr><w:tr><w:trPr/><w:tc><w:tcPr><w:tcW w:w="500" w:type="dxa"/><w:noWrap/></w:tcPr><w:p><w:pPr><w:jc w:val="center"/></w:pPr><w:r><w:rPr><w:rFonts w:ascii="Times New Roman" w:hAnsi="Times New Roman" w:eastAsia="Times New Roman" w:cs="Times New Roman"/><w:sz w:val="19"/><w:szCs w:val="19"/></w:rPr><w:t xml:space="preserve">21</w:t></w:r></w:p></w:tc><w:tc><w:tcPr><w:tcW w:w="2200" w:type="dxa"/><w:noWrap/></w:tcPr><w:p><w:pPr><w:jc w:val="start"/></w:pPr><w:r><w:rPr><w:rFonts w:ascii="Times New Roman" w:hAnsi="Times New Roman" w:eastAsia="Times New Roman" w:cs="Times New Roman"/><w:sz w:val="19"/><w:szCs w:val="19"/><w:b w:val="1"/><w:bCs w:val="1"/></w:rPr><w:t xml:space="preserve">status_dinas</w:t></w:r></w:p></w:tc><w:tc><w:tcPr><w:tcW w:w="3000" w:type="dxa"/><w:noWrap/></w:tcPr><w:p><w:pPr><w:jc w:val="start"/></w:pPr><w:r><w:rPr><w:rFonts w:ascii="Times New Roman" w:hAnsi="Times New Roman" w:eastAsia="Times New Roman" w:cs="Times New Roman"/><w:sz w:val="19"/><w:szCs w:val="19"/></w:rPr><w:t xml:space="preserve">Status Dinas (Aktif/Pensiun/Pindah)</w:t></w:r></w:p></w:tc><w:tc><w:tcPr><w:tcW w:w="1300" w:type="dxa"/><w:noWrap/></w:tcPr><w:p><w:pPr><w:jc w:val="center"/></w:pPr><w:r><w:rPr><w:rFonts w:ascii="Times New Roman" w:hAnsi="Times New Roman" w:eastAsia="Times New Roman" w:cs="Times New Roman"/><w:sz w:val="19"/><w:szCs w:val="19"/></w:rPr><w:t xml:space="preserve">ENUM</w:t></w:r></w:p></w:tc><w:tc><w:tcPr><w:tcW w:w="1100" w:type="dxa"/><w:noWrap/></w:tcPr><w:p><w:pPr><w:jc w:val="center"/></w:pPr><w:r><w:rPr><w:rFonts w:ascii="Times New Roman" w:hAnsi="Times New Roman" w:eastAsia="Times New Roman" w:cs="Times New Roman"/><w:sz w:val="19"/><w:szCs w:val="19"/></w:rPr><w:t xml:space="preserve">15</w:t></w:r></w:p></w:tc><w:tc><w:tcPr><w:tcW w:w="1100" w:type="dxa"/><w:noWrap/></w:tcPr><w:p><w:pPr><w:jc w:val="center"/></w:pPr><w:r><w:rPr><w:rFonts w:ascii="Times New Roman" w:hAnsi="Times New Roman" w:eastAsia="Times New Roman" w:cs="Times New Roman"/><w:sz w:val="19"/><w:szCs w:val="19"/></w:rPr><w:t xml:space="preserve">Default Aktif</w:t></w:r></w:p></w:tc></w:tr><w:tr><w:trPr/><w:tc><w:tcPr><w:tcW w:w="500" w:type="dxa"/><w:noWrap/></w:tcPr><w:p><w:pPr><w:jc w:val="center"/></w:pPr><w:r><w:rPr><w:rFonts w:ascii="Times New Roman" w:hAnsi="Times New Roman" w:eastAsia="Times New Roman" w:cs="Times New Roman"/><w:sz w:val="19"/><w:szCs w:val="19"/></w:rPr><w:t xml:space="preserve">22</w:t></w:r></w:p></w:tc><w:tc><w:tcPr><w:tcW w:w="2200" w:type="dxa"/><w:noWrap/></w:tcPr><w:p><w:pPr><w:jc w:val="start"/></w:pPr><w:r><w:rPr><w:rFonts w:ascii="Times New Roman" w:hAnsi="Times New Roman" w:eastAsia="Times New Roman" w:cs="Times New Roman"/><w:sz w:val="19"/><w:szCs w:val="19"/><w:b w:val="1"/><w:bCs w:val="1"/></w:rPr><w:t xml:space="preserve">tmt_pensiun_proyeksi</w:t></w:r></w:p></w:tc><w:tc><w:tcPr><w:tcW w:w="3000" w:type="dxa"/><w:noWrap/></w:tcPr><w:p><w:pPr><w:jc w:val="start"/></w:pPr><w:r><w:rPr><w:rFonts w:ascii="Times New Roman" w:hAnsi="Times New Roman" w:eastAsia="Times New Roman" w:cs="Times New Roman"/><w:sz w:val="19"/><w:szCs w:val="19"/></w:rPr><w:t xml:space="preserve">Proyeksi TMT Pensiun Otomatis</w:t></w:r></w:p></w:tc><w:tc><w:tcPr><w:tcW w:w="1300" w:type="dxa"/><w:noWrap/></w:tcPr><w:p><w:pPr><w:jc w:val="center"/></w:pPr><w:r><w:rPr><w:rFonts w:ascii="Times New Roman" w:hAnsi="Times New Roman" w:eastAsia="Times New Roman" w:cs="Times New Roman"/><w:sz w:val="19"/><w:szCs w:val="19"/></w:rPr><w:t xml:space="preserve">DATE</w:t></w:r></w:p></w:tc><w:tc><w:tcPr><w:tcW w:w="1100" w:type="dxa"/><w:noWrap/></w:tcPr><w:p><w:pPr><w:jc w:val="center"/></w:pPr><w:r><w:rPr><w:rFonts w:ascii="Times New Roman" w:hAnsi="Times New Roman" w:eastAsia="Times New Roman" w:cs="Times New Roman"/><w:sz w:val="19"/><w:szCs w:val="19"/></w:rPr><w:t xml:space="preserve">10</w:t></w:r></w:p></w:tc><w:tc><w:tcPr><w:tcW w:w="1100" w:type="dxa"/><w:noWrap/></w:tcPr><w:p><w:pPr><w:jc w:val="center"/></w:pPr><w:r><w:rPr><w:rFonts w:ascii="Times New Roman" w:hAnsi="Times New Roman" w:eastAsia="Times New Roman" w:cs="Times New Roman"/><w:sz w:val="19"/><w:szCs w:val="19"/></w:rPr><w:t xml:space="preserve">Nullable</w:t></w:r></w:p></w:tc></w:tr><w:tr><w:trPr/><w:tc><w:tcPr><w:tcW w:w="500" w:type="dxa"/><w:noWrap/></w:tcPr><w:p><w:pPr><w:jc w:val="center"/></w:pPr><w:r><w:rPr><w:rFonts w:ascii="Times New Roman" w:hAnsi="Times New Roman" w:eastAsia="Times New Roman" w:cs="Times New Roman"/><w:sz w:val="19"/><w:szCs w:val="19"/></w:rPr><w:t xml:space="preserve">23</w:t></w:r></w:p></w:tc><w:tc><w:tcPr><w:tcW w:w="2200" w:type="dxa"/><w:noWrap/></w:tcPr><w:p><w:pPr><w:jc w:val="start"/></w:pPr><w:r><w:rPr><w:rFonts w:ascii="Times New Roman" w:hAnsi="Times New Roman" w:eastAsia="Times New Roman" w:cs="Times New Roman"/><w:sz w:val="19"/><w:szCs w:val="19"/><w:b w:val="1"/><w:bCs w:val="1"/></w:rPr><w:t xml:space="preserve">created_at</w:t></w:r></w:p></w:tc><w:tc><w:tcPr><w:tcW w:w="3000" w:type="dxa"/><w:noWrap/></w:tcPr><w:p><w:pPr><w:jc w:val="start"/></w:pPr><w:r><w:rPr><w:rFonts w:ascii="Times New Roman" w:hAnsi="Times New Roman" w:eastAsia="Times New Roman" w:cs="Times New Roman"/><w:sz w:val="19"/><w:szCs w:val="19"/></w:rPr><w:t xml:space="preserve">Waktu Perekaman Data Pertama</w:t></w:r></w:p></w:tc><w:tc><w:tcPr><w:tcW w:w="1300" w:type="dxa"/><w:noWrap/></w:tcPr><w:p><w:pPr><w:jc w:val="center"/></w:pPr><w:r><w:rPr><w:rFonts w:ascii="Times New Roman" w:hAnsi="Times New Roman" w:eastAsia="Times New Roman" w:cs="Times New Roman"/><w:sz w:val="19"/><w:szCs w:val="19"/></w:rPr><w:t xml:space="preserve">TIMESTAMP</w:t></w:r></w:p></w:tc><w:tc><w:tcPr><w:tcW w:w="1100" w:type="dxa"/><w:noWrap/></w:tcPr><w:p><w:pPr><w:jc w:val="center"/></w:pPr><w:r><w:rPr><w:rFonts w:ascii="Times New Roman" w:hAnsi="Times New Roman" w:eastAsia="Times New Roman" w:cs="Times New Roman"/><w:sz w:val="19"/><w:szCs w:val="19"/></w:rPr><w:t xml:space="preserve">19</w:t></w:r></w:p></w:tc><w:tc><w:tcPr><w:tcW w:w="1100" w:type="dxa"/><w:noWrap/></w:tcPr><w:p><w:pPr><w:jc w:val="center"/></w:pPr><w:r><w:rPr><w:rFonts w:ascii="Times New Roman" w:hAnsi="Times New Roman" w:eastAsia="Times New Roman" w:cs="Times New Roman"/><w:sz w:val="19"/><w:szCs w:val="19"/></w:rPr><w:t xml:space="preserve">Auto Stamp</w:t></w:r></w:p></w:tc></w:tr><w:tr><w:trPr/><w:tc><w:tcPr><w:tcW w:w="500" w:type="dxa"/><w:noWrap/></w:tcPr><w:p><w:pPr><w:jc w:val="center"/></w:pPr><w:r><w:rPr><w:rFonts w:ascii="Times New Roman" w:hAnsi="Times New Roman" w:eastAsia="Times New Roman" w:cs="Times New Roman"/><w:sz w:val="19"/><w:szCs w:val="19"/></w:rPr><w:t xml:space="preserve">24</w:t></w:r></w:p></w:tc><w:tc><w:tcPr><w:tcW w:w="2200" w:type="dxa"/><w:noWrap/></w:tcPr><w:p><w:pPr><w:jc w:val="start"/></w:pPr><w:r><w:rPr><w:rFonts w:ascii="Times New Roman" w:hAnsi="Times New Roman" w:eastAsia="Times New Roman" w:cs="Times New Roman"/><w:sz w:val="19"/><w:szCs w:val="19"/><w:b w:val="1"/><w:bCs w:val="1"/></w:rPr><w:t xml:space="preserve">updated_at</w:t></w:r></w:p></w:tc><w:tc><w:tcPr><w:tcW w:w="3000" w:type="dxa"/><w:noWrap/></w:tcPr><w:p><w:pPr><w:jc w:val="start"/></w:pPr><w:r><w:rPr><w:rFonts w:ascii="Times New Roman" w:hAnsi="Times New Roman" w:eastAsia="Times New Roman" w:cs="Times New Roman"/><w:sz w:val="19"/><w:szCs w:val="19"/></w:rPr><w:t xml:space="preserve">Waktu Pembaruan Data Terakhir</w:t></w:r></w:p></w:tc><w:tc><w:tcPr><w:tcW w:w="1300" w:type="dxa"/><w:noWrap/></w:tcPr><w:p><w:pPr><w:jc w:val="center"/></w:pPr><w:r><w:rPr><w:rFonts w:ascii="Times New Roman" w:hAnsi="Times New Roman" w:eastAsia="Times New Roman" w:cs="Times New Roman"/><w:sz w:val="19"/><w:szCs w:val="19"/></w:rPr><w:t xml:space="preserve">TIMESTAMP</w:t></w:r></w:p></w:tc><w:tc><w:tcPr><w:tcW w:w="1100" w:type="dxa"/><w:noWrap/></w:tcPr><w:p><w:pPr><w:jc w:val="center"/></w:pPr><w:r><w:rPr><w:rFonts w:ascii="Times New Roman" w:hAnsi="Times New Roman" w:eastAsia="Times New Roman" w:cs="Times New Roman"/><w:sz w:val="19"/><w:szCs w:val="19"/></w:rPr><w:t xml:space="preserve">19</w:t></w:r></w:p></w:tc><w:tc><w:tcPr><w:tcW w:w="1100" w:type="dxa"/><w:noWrap/></w:tcPr><w:p><w:pPr><w:jc w:val="center"/></w:pPr><w:r><w:rPr><w:rFonts w:ascii="Times New Roman" w:hAnsi="Times New Roman" w:eastAsia="Times New Roman" w:cs="Times New Roman"/><w:sz w:val="19"/><w:szCs w:val="19"/></w:rPr><w:t xml:space="preserve">Auto Update</w:t></w:r></w:p></w:tc></w:tr></w:tbl><w:p/><w:p><w:pPr><w:spacing w:after="40"/></w:pPr><w:r><w:rPr><w:rFonts w:ascii="Times New Roman" w:hAnsi="Times New Roman" w:eastAsia="Times New Roman" w:cs="Times New Roman"/><w:sz w:val="22"/><w:szCs w:val="22"/><w:b w:val="1"/><w:bCs w:val="1"/></w:rPr><w:t xml:space="preserve">b.   Struktur File / Tabel: USERS (Kredensial dan Otorisasi Akun)</w:t></w:r></w:p><w:tbl><w:tblGrid><w:gridCol w:w="500" w:type="dxa"/><w:gridCol w:w="2200" w:type="dxa"/><w:gridCol w:w="3000" w:type="dxa"/><w:gridCol w:w="1300" w:type="dxa"/><w:gridCol w:w="1100" w:type="dxa"/><w:gridCol w:w="1100" w:type="dxa"/></w:tblGrid><w:tblPr><w:tblStyle w:val="MilitaryTable"/></w:tblPr><w:tr><w:trPr/><w:tc><w:tcPr><w:tcW w:w="500" w:type="dxa"/><w:shd w:val="clear" w:fill="EAEAEA"/><w:noWrap/></w:tcPr><w:p><w:pPr><w:jc w:val="center"/></w:pPr><w:r><w:rPr><w:rFonts w:ascii="Times New Roman" w:hAnsi="Times New Roman" w:eastAsia="Times New Roman" w:cs="Times New Roman"/><w:sz w:val="20"/><w:szCs w:val="20"/><w:b w:val="1"/><w:bCs w:val="1"/></w:rPr><w:t xml:space="preserve">No</w:t></w:r></w:p></w:tc><w:tc><w:tcPr><w:tcW w:w="2200" w:type="dxa"/><w:shd w:val="clear" w:fill="EAEAEA"/><w:noWrap/></w:tcPr><w:p><w:pPr><w:jc w:val="center"/></w:pPr><w:r><w:rPr><w:rFonts w:ascii="Times New Roman" w:hAnsi="Times New Roman" w:eastAsia="Times New Roman" w:cs="Times New Roman"/><w:sz w:val="20"/><w:szCs w:val="20"/><w:b w:val="1"/><w:bCs w:val="1"/></w:rPr><w:t xml:space="preserve">Nama Field</w:t></w:r></w:p></w:tc><w:tc><w:tcPr><w:tcW w:w="3000" w:type="dxa"/><w:shd w:val="clear" w:fill="EAEAEA"/><w:noWrap/></w:tcPr><w:p><w:pPr><w:jc w:val="center"/></w:pPr><w:r><w:rPr><w:rFonts w:ascii="Times New Roman" w:hAnsi="Times New Roman" w:eastAsia="Times New Roman" w:cs="Times New Roman"/><w:sz w:val="20"/><w:szCs w:val="20"/><w:b w:val="1"/><w:bCs w:val="1"/></w:rPr><w:t xml:space="preserve">Uraian / Sebutan</w:t></w:r></w:p></w:tc><w:tc><w:tcPr><w:tcW w:w="1300" w:type="dxa"/><w:shd w:val="clear" w:fill="EAEAEA"/><w:noWrap/></w:tcPr><w:p><w:pPr><w:jc w:val="center"/></w:pPr><w:r><w:rPr><w:rFonts w:ascii="Times New Roman" w:hAnsi="Times New Roman" w:eastAsia="Times New Roman" w:cs="Times New Roman"/><w:sz w:val="20"/><w:szCs w:val="20"/><w:b w:val="1"/><w:bCs w:val="1"/></w:rPr><w:t xml:space="preserve">Type</w:t></w:r></w:p></w:tc><w:tc><w:tcPr><w:tcW w:w="1100" w:type="dxa"/><w:shd w:val="clear" w:fill="EAEAEA"/><w:noWrap/></w:tcPr><w:p><w:pPr><w:jc w:val="center"/></w:pPr><w:r><w:rPr><w:rFonts w:ascii="Times New Roman" w:hAnsi="Times New Roman" w:eastAsia="Times New Roman" w:cs="Times New Roman"/><w:sz w:val="20"/><w:szCs w:val="20"/><w:b w:val="1"/><w:bCs w:val="1"/></w:rPr><w:t xml:space="preserve">Lebar</w:t></w:r></w:p></w:tc><w:tc><w:tcPr><w:tcW w:w="1100" w:type="dxa"/><w:shd w:val="clear" w:fill="EAEAEA"/><w:noWrap/></w:tcPr><w:p><w:pPr><w:jc w:val="center"/></w:pPr><w:r><w:rPr><w:rFonts w:ascii="Times New Roman" w:hAnsi="Times New Roman" w:eastAsia="Times New Roman" w:cs="Times New Roman"/><w:sz w:val="20"/><w:szCs w:val="20"/><w:b w:val="1"/><w:bCs w:val="1"/></w:rPr><w:t xml:space="preserve">Ket</w:t></w:r></w:p></w:tc></w:tr><w:tr><w:trPr/><w:tc><w:tcPr><w:tcW w:w="500" w:type="dxa"/><w:noWrap/></w:tcPr><w:p><w:pPr><w:jc w:val="center"/></w:pPr><w:r><w:rPr><w:rFonts w:ascii="Times New Roman" w:hAnsi="Times New Roman" w:eastAsia="Times New Roman" w:cs="Times New Roman"/><w:sz w:val="19"/><w:szCs w:val="19"/></w:rPr><w:t xml:space="preserve">1</w:t></w:r></w:p></w:tc><w:tc><w:tcPr><w:tcW w:w="2200" w:type="dxa"/><w:noWrap/></w:tcPr><w:p><w:pPr><w:jc w:val="start"/></w:pPr><w:r><w:rPr><w:rFonts w:ascii="Times New Roman" w:hAnsi="Times New Roman" w:eastAsia="Times New Roman" w:cs="Times New Roman"/><w:sz w:val="19"/><w:szCs w:val="19"/><w:b w:val="1"/><w:bCs w:val="1"/></w:rPr><w:t xml:space="preserve">id</w:t></w:r></w:p></w:tc><w:tc><w:tcPr><w:tcW w:w="3000" w:type="dxa"/><w:noWrap/></w:tcPr><w:p><w:pPr><w:jc w:val="start"/></w:pPr><w:r><w:rPr><w:rFonts w:ascii="Times New Roman" w:hAnsi="Times New Roman" w:eastAsia="Times New Roman" w:cs="Times New Roman"/><w:sz w:val="19"/><w:szCs w:val="19"/></w:rPr><w:t xml:space="preserve">Identitas Unik Pengguna</w:t></w:r></w:p></w:tc><w:tc><w:tcPr><w:tcW w:w="1300" w:type="dxa"/><w:noWrap/></w:tcPr><w:p><w:pPr><w:jc w:val="center"/></w:pPr><w:r><w:rPr><w:rFonts w:ascii="Times New Roman" w:hAnsi="Times New Roman" w:eastAsia="Times New Roman" w:cs="Times New Roman"/><w:sz w:val="19"/><w:szCs w:val="19"/></w:rPr><w:t xml:space="preserve">INT</w:t></w:r></w:p></w:tc><w:tc><w:tcPr><w:tcW w:w="1100" w:type="dxa"/><w:noWrap/></w:tcPr><w:p><w:pPr><w:jc w:val="center"/></w:pPr><w:r><w:rPr><w:rFonts w:ascii="Times New Roman" w:hAnsi="Times New Roman" w:eastAsia="Times New Roman" w:cs="Times New Roman"/><w:sz w:val="19"/><w:szCs w:val="19"/></w:rPr><w:t xml:space="preserve">11</w:t></w:r></w:p></w:tc><w:tc><w:tcPr><w:tcW w:w="1100" w:type="dxa"/><w:noWrap/></w:tcPr><w:p><w:pPr><w:jc w:val="center"/></w:pPr><w:r><w:rPr><w:rFonts w:ascii="Times New Roman" w:hAnsi="Times New Roman" w:eastAsia="Times New Roman" w:cs="Times New Roman"/><w:sz w:val="19"/><w:szCs w:val="19"/></w:rPr><w:t xml:space="preserve">PK, Auto</w:t></w:r></w:p></w:tc></w:tr><w:tr><w:trPr/><w:tc><w:tcPr><w:tcW w:w="500" w:type="dxa"/><w:noWrap/></w:tcPr><w:p><w:pPr><w:jc w:val="center"/></w:pPr><w:r><w:rPr><w:rFonts w:ascii="Times New Roman" w:hAnsi="Times New Roman" w:eastAsia="Times New Roman" w:cs="Times New Roman"/><w:sz w:val="19"/><w:szCs w:val="19"/></w:rPr><w:t xml:space="preserve">2</w:t></w:r></w:p></w:tc><w:tc><w:tcPr><w:tcW w:w="2200" w:type="dxa"/><w:noWrap/></w:tcPr><w:p><w:pPr><w:jc w:val="start"/></w:pPr><w:r><w:rPr><w:rFonts w:ascii="Times New Roman" w:hAnsi="Times New Roman" w:eastAsia="Times New Roman" w:cs="Times New Roman"/><w:sz w:val="19"/><w:szCs w:val="19"/><w:b w:val="1"/><w:bCs w:val="1"/></w:rPr><w:t xml:space="preserve">username</w:t></w:r></w:p></w:tc><w:tc><w:tcPr><w:tcW w:w="3000" w:type="dxa"/><w:noWrap/></w:tcPr><w:p><w:pPr><w:jc w:val="start"/></w:pPr><w:r><w:rPr><w:rFonts w:ascii="Times New Roman" w:hAnsi="Times New Roman" w:eastAsia="Times New Roman" w:cs="Times New Roman"/><w:sz w:val="19"/><w:szCs w:val="19"/></w:rPr><w:t xml:space="preserve">Nama Pengguna Login (NRP / Admin)</w:t></w:r></w:p></w:tc><w:tc><w:tcPr><w:tcW w:w="1300" w:type="dxa"/><w:noWrap/></w:tcPr><w:p><w:pPr><w:jc w:val="center"/></w:pPr><w:r><w:rPr><w:rFonts w:ascii="Times New Roman" w:hAnsi="Times New Roman" w:eastAsia="Times New Roman" w:cs="Times New Roman"/><w:sz w:val="19"/><w:szCs w:val="19"/></w:rPr><w:t xml:space="preserve">VARCHAR</w:t></w:r></w:p></w:tc><w:tc><w:tcPr><w:tcW w:w="1100" w:type="dxa"/><w:noWrap/></w:tcPr><w:p><w:pPr><w:jc w:val="center"/></w:pPr><w:r><w:rPr><w:rFonts w:ascii="Times New Roman" w:hAnsi="Times New Roman" w:eastAsia="Times New Roman" w:cs="Times New Roman"/><w:sz w:val="19"/><w:szCs w:val="19"/></w:rPr><w:t xml:space="preserve">50</w:t></w:r></w:p></w:tc><w:tc><w:tcPr><w:tcW w:w="1100" w:type="dxa"/><w:noWrap/></w:tcPr><w:p><w:pPr><w:jc w:val="center"/></w:pPr><w:r><w:rPr><w:rFonts w:ascii="Times New Roman" w:hAnsi="Times New Roman" w:eastAsia="Times New Roman" w:cs="Times New Roman"/><w:sz w:val="19"/><w:szCs w:val="19"/></w:rPr><w:t xml:space="preserve">UNIQUE</w:t></w:r></w:p></w:tc></w:tr><w:tr><w:trPr/><w:tc><w:tcPr><w:tcW w:w="500" w:type="dxa"/><w:noWrap/></w:tcPr><w:p><w:pPr><w:jc w:val="center"/></w:pPr><w:r><w:rPr><w:rFonts w:ascii="Times New Roman" w:hAnsi="Times New Roman" w:eastAsia="Times New Roman" w:cs="Times New Roman"/><w:sz w:val="19"/><w:szCs w:val="19"/></w:rPr><w:t xml:space="preserve">3</w:t></w:r></w:p></w:tc><w:tc><w:tcPr><w:tcW w:w="2200" w:type="dxa"/><w:noWrap/></w:tcPr><w:p><w:pPr><w:jc w:val="start"/></w:pPr><w:r><w:rPr><w:rFonts w:ascii="Times New Roman" w:hAnsi="Times New Roman" w:eastAsia="Times New Roman" w:cs="Times New Roman"/><w:sz w:val="19"/><w:szCs w:val="19"/><w:b w:val="1"/><w:bCs w:val="1"/></w:rPr><w:t xml:space="preserve">password</w:t></w:r></w:p></w:tc><w:tc><w:tcPr><w:tcW w:w="3000" w:type="dxa"/><w:noWrap/></w:tcPr><w:p><w:pPr><w:jc w:val="start"/></w:pPr><w:r><w:rPr><w:rFonts w:ascii="Times New Roman" w:hAnsi="Times New Roman" w:eastAsia="Times New Roman" w:cs="Times New Roman"/><w:sz w:val="19"/><w:szCs w:val="19"/></w:rPr><w:t xml:space="preserve">Kata Sandi Terenkripsi (bcrypt)</w:t></w:r></w:p></w:tc><w:tc><w:tcPr><w:tcW w:w="1300" w:type="dxa"/><w:noWrap/></w:tcPr><w:p><w:pPr><w:jc w:val="center"/></w:pPr><w:r><w:rPr><w:rFonts w:ascii="Times New Roman" w:hAnsi="Times New Roman" w:eastAsia="Times New Roman" w:cs="Times New Roman"/><w:sz w:val="19"/><w:szCs w:val="19"/></w:rPr><w:t xml:space="preserve">VARCHAR</w:t></w:r></w:p></w:tc><w:tc><w:tcPr><w:tcW w:w="1100" w:type="dxa"/><w:noWrap/></w:tcPr><w:p><w:pPr><w:jc w:val="center"/></w:pPr><w:r><w:rPr><w:rFonts w:ascii="Times New Roman" w:hAnsi="Times New Roman" w:eastAsia="Times New Roman" w:cs="Times New Roman"/><w:sz w:val="19"/><w:szCs w:val="19"/></w:rPr><w:t xml:space="preserve">255</w:t></w:r></w:p></w:tc><w:tc><w:tcPr><w:tcW w:w="1100" w:type="dxa"/><w:noWrap/></w:tcPr><w:p><w:pPr><w:jc w:val="center"/></w:pPr><w:r><w:rPr><w:rFonts w:ascii="Times New Roman" w:hAnsi="Times New Roman" w:eastAsia="Times New Roman" w:cs="Times New Roman"/><w:sz w:val="19"/><w:szCs w:val="19"/></w:rPr><w:t xml:space="preserve">Not Null</w:t></w:r></w:p></w:tc></w:tr><w:tr><w:trPr/><w:tc><w:tcPr><w:tcW w:w="500" w:type="dxa"/><w:noWrap/></w:tcPr><w:p><w:pPr><w:jc w:val="center"/></w:pPr><w:r><w:rPr><w:rFonts w:ascii="Times New Roman" w:hAnsi="Times New Roman" w:eastAsia="Times New Roman" w:cs="Times New Roman"/><w:sz w:val="19"/><w:szCs w:val="19"/></w:rPr><w:t xml:space="preserve">4</w:t></w:r></w:p></w:tc><w:tc><w:tcPr><w:tcW w:w="2200" w:type="dxa"/><w:noWrap/></w:tcPr><w:p><w:pPr><w:jc w:val="start"/></w:pPr><w:r><w:rPr><w:rFonts w:ascii="Times New Roman" w:hAnsi="Times New Roman" w:eastAsia="Times New Roman" w:cs="Times New Roman"/><w:sz w:val="19"/><w:szCs w:val="19"/><w:b w:val="1"/><w:bCs w:val="1"/></w:rPr><w:t xml:space="preserve">role</w:t></w:r></w:p></w:tc><w:tc><w:tcPr><w:tcW w:w="3000" w:type="dxa"/><w:noWrap/></w:tcPr><w:p><w:pPr><w:jc w:val="start"/></w:pPr><w:r><w:rPr><w:rFonts w:ascii="Times New Roman" w:hAnsi="Times New Roman" w:eastAsia="Times New Roman" w:cs="Times New Roman"/><w:sz w:val="19"/><w:szCs w:val="19"/></w:rPr><w:t xml:space="preserve">Peran Otoritas (admin / personel)</w:t></w:r></w:p></w:tc><w:tc><w:tcPr><w:tcW w:w="1300" w:type="dxa"/><w:noWrap/></w:tcPr><w:p><w:pPr><w:jc w:val="center"/></w:pPr><w:r><w:rPr><w:rFonts w:ascii="Times New Roman" w:hAnsi="Times New Roman" w:eastAsia="Times New Roman" w:cs="Times New Roman"/><w:sz w:val="19"/><w:szCs w:val="19"/></w:rPr><w:t xml:space="preserve">ENUM</w:t></w:r></w:p></w:tc><w:tc><w:tcPr><w:tcW w:w="1100" w:type="dxa"/><w:noWrap/></w:tcPr><w:p><w:pPr><w:jc w:val="center"/></w:pPr><w:r><w:rPr><w:rFonts w:ascii="Times New Roman" w:hAnsi="Times New Roman" w:eastAsia="Times New Roman" w:cs="Times New Roman"/><w:sz w:val="19"/><w:szCs w:val="19"/></w:rPr><w:t xml:space="preserve">10</w:t></w:r></w:p></w:tc><w:tc><w:tcPr><w:tcW w:w="1100" w:type="dxa"/><w:noWrap/></w:tcPr><w:p><w:pPr><w:jc w:val="center"/></w:pPr><w:r><w:rPr><w:rFonts w:ascii="Times New Roman" w:hAnsi="Times New Roman" w:eastAsia="Times New Roman" w:cs="Times New Roman"/><w:sz w:val="19"/><w:szCs w:val="19"/></w:rPr><w:t xml:space="preserve">Not Null</w:t></w:r></w:p></w:tc></w:tr><w:tr><w:trPr/><w:tc><w:tcPr><w:tcW w:w="500" w:type="dxa"/><w:noWrap/></w:tcPr><w:p><w:pPr><w:jc w:val="center"/></w:pPr><w:r><w:rPr><w:rFonts w:ascii="Times New Roman" w:hAnsi="Times New Roman" w:eastAsia="Times New Roman" w:cs="Times New Roman"/><w:sz w:val="19"/><w:szCs w:val="19"/></w:rPr><w:t xml:space="preserve">5</w:t></w:r></w:p></w:tc><w:tc><w:tcPr><w:tcW w:w="2200" w:type="dxa"/><w:noWrap/></w:tcPr><w:p><w:pPr><w:jc w:val="start"/></w:pPr><w:r><w:rPr><w:rFonts w:ascii="Times New Roman" w:hAnsi="Times New Roman" w:eastAsia="Times New Roman" w:cs="Times New Roman"/><w:sz w:val="19"/><w:szCs w:val="19"/><w:b w:val="1"/><w:bCs w:val="1"/></w:rPr><w:t xml:space="preserve">personel_id</w:t></w:r></w:p></w:tc><w:tc><w:tcPr><w:tcW w:w="3000" w:type="dxa"/><w:noWrap/></w:tcPr><w:p><w:pPr><w:jc w:val="start"/></w:pPr><w:r><w:rPr><w:rFonts w:ascii="Times New Roman" w:hAnsi="Times New Roman" w:eastAsia="Times New Roman" w:cs="Times New Roman"/><w:sz w:val="19"/><w:szCs w:val="19"/></w:rPr><w:t xml:space="preserve">Relasi ke Tabel Personel</w:t></w:r></w:p></w:tc><w:tc><w:tcPr><w:tcW w:w="1300" w:type="dxa"/><w:noWrap/></w:tcPr><w:p><w:pPr><w:jc w:val="center"/></w:pPr><w:r><w:rPr><w:rFonts w:ascii="Times New Roman" w:hAnsi="Times New Roman" w:eastAsia="Times New Roman" w:cs="Times New Roman"/><w:sz w:val="19"/><w:szCs w:val="19"/></w:rPr><w:t xml:space="preserve">INT</w:t></w:r></w:p></w:tc><w:tc><w:tcPr><w:tcW w:w="1100" w:type="dxa"/><w:noWrap/></w:tcPr><w:p><w:pPr><w:jc w:val="center"/></w:pPr><w:r><w:rPr><w:rFonts w:ascii="Times New Roman" w:hAnsi="Times New Roman" w:eastAsia="Times New Roman" w:cs="Times New Roman"/><w:sz w:val="19"/><w:szCs w:val="19"/></w:rPr><w:t xml:space="preserve">11</w:t></w:r></w:p></w:tc><w:tc><w:tcPr><w:tcW w:w="1100" w:type="dxa"/><w:noWrap/></w:tcPr><w:p><w:pPr><w:jc w:val="center"/></w:pPr><w:r><w:rPr><w:rFonts w:ascii="Times New Roman" w:hAnsi="Times New Roman" w:eastAsia="Times New Roman" w:cs="Times New Roman"/><w:sz w:val="19"/><w:szCs w:val="19"/></w:rPr><w:t xml:space="preserve">FK, UNIQUE</w:t></w:r></w:p></w:tc></w:tr><w:tr><w:trPr/><w:tc><w:tcPr><w:tcW w:w="500" w:type="dxa"/><w:noWrap/></w:tcPr><w:p><w:pPr><w:jc w:val="center"/></w:pPr><w:r><w:rPr><w:rFonts w:ascii="Times New Roman" w:hAnsi="Times New Roman" w:eastAsia="Times New Roman" w:cs="Times New Roman"/><w:sz w:val="19"/><w:szCs w:val="19"/></w:rPr><w:t xml:space="preserve">6</w:t></w:r></w:p></w:tc><w:tc><w:tcPr><w:tcW w:w="2200" w:type="dxa"/><w:noWrap/></w:tcPr><w:p><w:pPr><w:jc w:val="start"/></w:pPr><w:r><w:rPr><w:rFonts w:ascii="Times New Roman" w:hAnsi="Times New Roman" w:eastAsia="Times New Roman" w:cs="Times New Roman"/><w:sz w:val="19"/><w:szCs w:val="19"/><w:b w:val="1"/><w:bCs w:val="1"/></w:rPr><w:t xml:space="preserve">status</w:t></w:r></w:p></w:tc><w:tc><w:tcPr><w:tcW w:w="3000" w:type="dxa"/><w:noWrap/></w:tcPr><w:p><w:pPr><w:jc w:val="start"/></w:pPr><w:r><w:rPr><w:rFonts w:ascii="Times New Roman" w:hAnsi="Times New Roman" w:eastAsia="Times New Roman" w:cs="Times New Roman"/><w:sz w:val="19"/><w:szCs w:val="19"/></w:rPr><w:t xml:space="preserve">Status Akun (pending/approved)</w:t></w:r></w:p></w:tc><w:tc><w:tcPr><w:tcW w:w="1300" w:type="dxa"/><w:noWrap/></w:tcPr><w:p><w:pPr><w:jc w:val="center"/></w:pPr><w:r><w:rPr><w:rFonts w:ascii="Times New Roman" w:hAnsi="Times New Roman" w:eastAsia="Times New Roman" w:cs="Times New Roman"/><w:sz w:val="19"/><w:szCs w:val="19"/></w:rPr><w:t xml:space="preserve">ENUM</w:t></w:r></w:p></w:tc><w:tc><w:tcPr><w:tcW w:w="1100" w:type="dxa"/><w:noWrap/></w:tcPr><w:p><w:pPr><w:jc w:val="center"/></w:pPr><w:r><w:rPr><w:rFonts w:ascii="Times New Roman" w:hAnsi="Times New Roman" w:eastAsia="Times New Roman" w:cs="Times New Roman"/><w:sz w:val="19"/><w:szCs w:val="19"/></w:rPr><w:t xml:space="preserve">15</w:t></w:r></w:p></w:tc><w:tc><w:tcPr><w:tcW w:w="1100" w:type="dxa"/><w:noWrap/></w:tcPr><w:p><w:pPr><w:jc w:val="center"/></w:pPr><w:r><w:rPr><w:rFonts w:ascii="Times New Roman" w:hAnsi="Times New Roman" w:eastAsia="Times New Roman" w:cs="Times New Roman"/><w:sz w:val="19"/><w:szCs w:val="19"/></w:rPr><w:t xml:space="preserve">Def 'pending'</w:t></w:r></w:p></w:tc></w:tr><w:tr><w:trPr/><w:tc><w:tcPr><w:tcW w:w="500" w:type="dxa"/><w:noWrap/></w:tcPr><w:p><w:pPr><w:jc w:val="center"/></w:pPr><w:r><w:rPr><w:rFonts w:ascii="Times New Roman" w:hAnsi="Times New Roman" w:eastAsia="Times New Roman" w:cs="Times New Roman"/><w:sz w:val="19"/><w:szCs w:val="19"/></w:rPr><w:t xml:space="preserve">7</w:t></w:r></w:p></w:tc><w:tc><w:tcPr><w:tcW w:w="2200" w:type="dxa"/><w:noWrap/></w:tcPr><w:p><w:pPr><w:jc w:val="start"/></w:pPr><w:r><w:rPr><w:rFonts w:ascii="Times New Roman" w:hAnsi="Times New Roman" w:eastAsia="Times New Roman" w:cs="Times New Roman"/><w:sz w:val="19"/><w:szCs w:val="19"/><w:b w:val="1"/><w:bCs w:val="1"/></w:rPr><w:t xml:space="preserve">catatan_approval</w:t></w:r></w:p></w:tc><w:tc><w:tcPr><w:tcW w:w="3000" w:type="dxa"/><w:noWrap/></w:tcPr><w:p><w:pPr><w:jc w:val="start"/></w:pPr><w:r><w:rPr><w:rFonts w:ascii="Times New Roman" w:hAnsi="Times New Roman" w:eastAsia="Times New Roman" w:cs="Times New Roman"/><w:sz w:val="19"/><w:szCs w:val="19"/></w:rPr><w:t xml:space="preserve">Catatan Evaluasi Admin</w:t></w:r></w:p></w:tc><w:tc><w:tcPr><w:tcW w:w="1300" w:type="dxa"/><w:noWrap/></w:tcPr><w:p><w:pPr><w:jc w:val="center"/></w:pPr><w:r><w:rPr><w:rFonts w:ascii="Times New Roman" w:hAnsi="Times New Roman" w:eastAsia="Times New Roman" w:cs="Times New Roman"/><w:sz w:val="19"/><w:szCs w:val="19"/></w:rPr><w:t xml:space="preserve">TEXT</w:t></w:r></w:p></w:tc><w:tc><w:tcPr><w:tcW w:w="1100" w:type="dxa"/><w:noWrap/></w:tcPr><w:p><w:pPr><w:jc w:val="center"/></w:pPr><w:r><w:rPr><w:rFonts w:ascii="Times New Roman" w:hAnsi="Times New Roman" w:eastAsia="Times New Roman" w:cs="Times New Roman"/><w:sz w:val="19"/><w:szCs w:val="19"/></w:rPr><w:t xml:space="preserve">-</w:t></w:r></w:p></w:tc><w:tc><w:tcPr><w:tcW w:w="1100" w:type="dxa"/><w:noWrap/></w:tcPr><w:p><w:pPr><w:jc w:val="center"/></w:pPr><w:r><w:rPr><w:rFonts w:ascii="Times New Roman" w:hAnsi="Times New Roman" w:eastAsia="Times New Roman" w:cs="Times New Roman"/><w:sz w:val="19"/><w:szCs w:val="19"/></w:rPr><w:t xml:space="preserve">Nullable</w:t></w:r></w:p></w:tc></w:tr><w:tr><w:trPr/><w:tc><w:tcPr><w:tcW w:w="500" w:type="dxa"/><w:noWrap/></w:tcPr><w:p><w:pPr><w:jc w:val="center"/></w:pPr><w:r><w:rPr><w:rFonts w:ascii="Times New Roman" w:hAnsi="Times New Roman" w:eastAsia="Times New Roman" w:cs="Times New Roman"/><w:sz w:val="19"/><w:szCs w:val="19"/></w:rPr><w:t xml:space="preserve">8</w:t></w:r></w:p></w:tc><w:tc><w:tcPr><w:tcW w:w="2200" w:type="dxa"/><w:noWrap/></w:tcPr><w:p><w:pPr><w:jc w:val="start"/></w:pPr><w:r><w:rPr><w:rFonts w:ascii="Times New Roman" w:hAnsi="Times New Roman" w:eastAsia="Times New Roman" w:cs="Times New Roman"/><w:sz w:val="19"/><w:szCs w:val="19"/><w:b w:val="1"/><w:bCs w:val="1"/></w:rPr><w:t xml:space="preserve">last_login</w:t></w:r></w:p></w:tc><w:tc><w:tcPr><w:tcW w:w="3000" w:type="dxa"/><w:noWrap/></w:tcPr><w:p><w:pPr><w:jc w:val="start"/></w:pPr><w:r><w:rPr><w:rFonts w:ascii="Times New Roman" w:hAnsi="Times New Roman" w:eastAsia="Times New Roman" w:cs="Times New Roman"/><w:sz w:val="19"/><w:szCs w:val="19"/></w:rPr><w:t xml:space="preserve">Waktu Akses Terakhir</w:t></w:r></w:p></w:tc><w:tc><w:tcPr><w:tcW w:w="1300" w:type="dxa"/><w:noWrap/></w:tcPr><w:p><w:pPr><w:jc w:val="center"/></w:pPr><w:r><w:rPr><w:rFonts w:ascii="Times New Roman" w:hAnsi="Times New Roman" w:eastAsia="Times New Roman" w:cs="Times New Roman"/><w:sz w:val="19"/><w:szCs w:val="19"/></w:rPr><w:t xml:space="preserve">DATETIME</w:t></w:r></w:p></w:tc><w:tc><w:tcPr><w:tcW w:w="1100" w:type="dxa"/><w:noWrap/></w:tcPr><w:p><w:pPr><w:jc w:val="center"/></w:pPr><w:r><w:rPr><w:rFonts w:ascii="Times New Roman" w:hAnsi="Times New Roman" w:eastAsia="Times New Roman" w:cs="Times New Roman"/><w:sz w:val="19"/><w:szCs w:val="19"/></w:rPr><w:t xml:space="preserve">19</w:t></w:r></w:p></w:tc><w:tc><w:tcPr><w:tcW w:w="1100" w:type="dxa"/><w:noWrap/></w:tcPr><w:p><w:pPr><w:jc w:val="center"/></w:pPr><w:r><w:rPr><w:rFonts w:ascii="Times New Roman" w:hAnsi="Times New Roman" w:eastAsia="Times New Roman" w:cs="Times New Roman"/><w:sz w:val="19"/><w:szCs w:val="19"/></w:rPr><w:t xml:space="preserve">Nullable</w:t></w:r></w:p></w:tc></w:tr><w:tr><w:trPr/><w:tc><w:tcPr><w:tcW w:w="500" w:type="dxa"/><w:noWrap/></w:tcPr><w:p><w:pPr><w:jc w:val="center"/></w:pPr><w:r><w:rPr><w:rFonts w:ascii="Times New Roman" w:hAnsi="Times New Roman" w:eastAsia="Times New Roman" w:cs="Times New Roman"/><w:sz w:val="19"/><w:szCs w:val="19"/></w:rPr><w:t xml:space="preserve">9</w:t></w:r></w:p></w:tc><w:tc><w:tcPr><w:tcW w:w="2200" w:type="dxa"/><w:noWrap/></w:tcPr><w:p><w:pPr><w:jc w:val="start"/></w:pPr><w:r><w:rPr><w:rFonts w:ascii="Times New Roman" w:hAnsi="Times New Roman" w:eastAsia="Times New Roman" w:cs="Times New Roman"/><w:sz w:val="19"/><w:szCs w:val="19"/><w:b w:val="1"/><w:bCs w:val="1"/></w:rPr><w:t xml:space="preserve">theme_pref</w:t></w:r></w:p></w:tc><w:tc><w:tcPr><w:tcW w:w="3000" w:type="dxa"/><w:noWrap/></w:tcPr><w:p><w:pPr><w:jc w:val="start"/></w:pPr><w:r><w:rPr><w:rFonts w:ascii="Times New Roman" w:hAnsi="Times New Roman" w:eastAsia="Times New Roman" w:cs="Times New Roman"/><w:sz w:val="19"/><w:szCs w:val="19"/></w:rPr><w:t xml:space="preserve">Preferensi Tema (dark/light)</w:t></w:r></w:p></w:tc><w:tc><w:tcPr><w:tcW w:w="1300" w:type="dxa"/><w:noWrap/></w:tcPr><w:p><w:pPr><w:jc w:val="center"/></w:pPr><w:r><w:rPr><w:rFonts w:ascii="Times New Roman" w:hAnsi="Times New Roman" w:eastAsia="Times New Roman" w:cs="Times New Roman"/><w:sz w:val="19"/><w:szCs w:val="19"/></w:rPr><w:t xml:space="preserve">ENUM</w:t></w:r></w:p></w:tc><w:tc><w:tcPr><w:tcW w:w="1100" w:type="dxa"/><w:noWrap/></w:tcPr><w:p><w:pPr><w:jc w:val="center"/></w:pPr><w:r><w:rPr><w:rFonts w:ascii="Times New Roman" w:hAnsi="Times New Roman" w:eastAsia="Times New Roman" w:cs="Times New Roman"/><w:sz w:val="19"/><w:szCs w:val="19"/></w:rPr><w:t xml:space="preserve">5</w:t></w:r></w:p></w:tc><w:tc><w:tcPr><w:tcW w:w="1100" w:type="dxa"/><w:noWrap/></w:tcPr><w:p><w:pPr><w:jc w:val="center"/></w:pPr><w:r><w:rPr><w:rFonts w:ascii="Times New Roman" w:hAnsi="Times New Roman" w:eastAsia="Times New Roman" w:cs="Times New Roman"/><w:sz w:val="19"/><w:szCs w:val="19"/></w:rPr><w:t xml:space="preserve">Def 'dark'</w:t></w:r></w:p></w:tc></w:tr><w:tr><w:trPr/><w:tc><w:tcPr><w:tcW w:w="500" w:type="dxa"/><w:noWrap/></w:tcPr><w:p><w:pPr><w:jc w:val="center"/></w:pPr><w:r><w:rPr><w:rFonts w:ascii="Times New Roman" w:hAnsi="Times New Roman" w:eastAsia="Times New Roman" w:cs="Times New Roman"/><w:sz w:val="19"/><w:szCs w:val="19"/></w:rPr><w:t xml:space="preserve">10</w:t></w:r></w:p></w:tc><w:tc><w:tcPr><w:tcW w:w="2200" w:type="dxa"/><w:noWrap/></w:tcPr><w:p><w:pPr><w:jc w:val="start"/></w:pPr><w:r><w:rPr><w:rFonts w:ascii="Times New Roman" w:hAnsi="Times New Roman" w:eastAsia="Times New Roman" w:cs="Times New Roman"/><w:sz w:val="19"/><w:szCs w:val="19"/><w:b w:val="1"/><w:bCs w:val="1"/></w:rPr><w:t xml:space="preserve">created_at</w:t></w:r></w:p></w:tc><w:tc><w:tcPr><w:tcW w:w="3000" w:type="dxa"/><w:noWrap/></w:tcPr><w:p><w:pPr><w:jc w:val="start"/></w:pPr><w:r><w:rPr><w:rFonts w:ascii="Times New Roman" w:hAnsi="Times New Roman" w:eastAsia="Times New Roman" w:cs="Times New Roman"/><w:sz w:val="19"/><w:szCs w:val="19"/></w:rPr><w:t xml:space="preserve">Waktu Pendaftaran Akun</w:t></w:r></w:p></w:tc><w:tc><w:tcPr><w:tcW w:w="1300" w:type="dxa"/><w:noWrap/></w:tcPr><w:p><w:pPr><w:jc w:val="center"/></w:pPr><w:r><w:rPr><w:rFonts w:ascii="Times New Roman" w:hAnsi="Times New Roman" w:eastAsia="Times New Roman" w:cs="Times New Roman"/><w:sz w:val="19"/><w:szCs w:val="19"/></w:rPr><w:t xml:space="preserve">TIMESTAMP</w:t></w:r></w:p></w:tc><w:tc><w:tcPr><w:tcW w:w="1100" w:type="dxa"/><w:noWrap/></w:tcPr><w:p><w:pPr><w:jc w:val="center"/></w:pPr><w:r><w:rPr><w:rFonts w:ascii="Times New Roman" w:hAnsi="Times New Roman" w:eastAsia="Times New Roman" w:cs="Times New Roman"/><w:sz w:val="19"/><w:szCs w:val="19"/></w:rPr><w:t xml:space="preserve">19</w:t></w:r></w:p></w:tc><w:tc><w:tcPr><w:tcW w:w="1100" w:type="dxa"/><w:noWrap/></w:tcPr><w:p><w:pPr><w:jc w:val="center"/></w:pPr><w:r><w:rPr><w:rFonts w:ascii="Times New Roman" w:hAnsi="Times New Roman" w:eastAsia="Times New Roman" w:cs="Times New Roman"/><w:sz w:val="19"/><w:szCs w:val="19"/></w:rPr><w:t xml:space="preserve">Auto Stamp</w:t></w:r></w:p></w:tc></w:tr></w:tbl><w:p/><w:p><w:r><w:br w:type="page"/></w:r></w:p><w:p><w:pPr><w:spacing w:after="40"/></w:pPr><w:r><w:rPr><w:rFonts w:ascii="Times New Roman" w:hAnsi="Times New Roman" w:eastAsia="Times New Roman" w:cs="Times New Roman"/><w:sz w:val="22"/><w:szCs w:val="22"/><w:b w:val="1"/><w:bCs w:val="1"/></w:rPr><w:t xml:space="preserve">c.   Struktur File / Tabel: DOSIR_MASTER (Master 33 Jenis Dosir Baku TNI AD)</w:t></w:r></w:p><w:tbl><w:tblGrid><w:gridCol w:w="500" w:type="dxa"/><w:gridCol w:w="2200" w:type="dxa"/><w:gridCol w:w="3000" w:type="dxa"/><w:gridCol w:w="1300" w:type="dxa"/><w:gridCol w:w="1100" w:type="dxa"/><w:gridCol w:w="1100" w:type="dxa"/></w:tblGrid><w:tblPr><w:tblStyle w:val="MilitaryTable"/></w:tblPr><w:tr><w:trPr/><w:tc><w:tcPr><w:tcW w:w="500" w:type="dxa"/><w:shd w:val="clear" w:fill="EAEAEA"/><w:noWrap/></w:tcPr><w:p><w:pPr><w:jc w:val="center"/></w:pPr><w:r><w:rPr><w:rFonts w:ascii="Times New Roman" w:hAnsi="Times New Roman" w:eastAsia="Times New Roman" w:cs="Times New Roman"/><w:sz w:val="20"/><w:szCs w:val="20"/><w:b w:val="1"/><w:bCs w:val="1"/></w:rPr><w:t xml:space="preserve">No</w:t></w:r></w:p></w:tc><w:tc><w:tcPr><w:tcW w:w="2200" w:type="dxa"/><w:shd w:val="clear" w:fill="EAEAEA"/><w:noWrap/></w:tcPr><w:p><w:pPr><w:jc w:val="center"/></w:pPr><w:r><w:rPr><w:rFonts w:ascii="Times New Roman" w:hAnsi="Times New Roman" w:eastAsia="Times New Roman" w:cs="Times New Roman"/><w:sz w:val="20"/><w:szCs w:val="20"/><w:b w:val="1"/><w:bCs w:val="1"/></w:rPr><w:t xml:space="preserve">Nama Field</w:t></w:r></w:p></w:tc><w:tc><w:tcPr><w:tcW w:w="3000" w:type="dxa"/><w:shd w:val="clear" w:fill="EAEAEA"/><w:noWrap/></w:tcPr><w:p><w:pPr><w:jc w:val="center"/></w:pPr><w:r><w:rPr><w:rFonts w:ascii="Times New Roman" w:hAnsi="Times New Roman" w:eastAsia="Times New Roman" w:cs="Times New Roman"/><w:sz w:val="20"/><w:szCs w:val="20"/><w:b w:val="1"/><w:bCs w:val="1"/></w:rPr><w:t xml:space="preserve">Uraian / Sebutan</w:t></w:r></w:p></w:tc><w:tc><w:tcPr><w:tcW w:w="1300" w:type="dxa"/><w:shd w:val="clear" w:fill="EAEAEA"/><w:noWrap/></w:tcPr><w:p><w:pPr><w:jc w:val="center"/></w:pPr><w:r><w:rPr><w:rFonts w:ascii="Times New Roman" w:hAnsi="Times New Roman" w:eastAsia="Times New Roman" w:cs="Times New Roman"/><w:sz w:val="20"/><w:szCs w:val="20"/><w:b w:val="1"/><w:bCs w:val="1"/></w:rPr><w:t xml:space="preserve">Type</w:t></w:r></w:p></w:tc><w:tc><w:tcPr><w:tcW w:w="1100" w:type="dxa"/><w:shd w:val="clear" w:fill="EAEAEA"/><w:noWrap/></w:tcPr><w:p><w:pPr><w:jc w:val="center"/></w:pPr><w:r><w:rPr><w:rFonts w:ascii="Times New Roman" w:hAnsi="Times New Roman" w:eastAsia="Times New Roman" w:cs="Times New Roman"/><w:sz w:val="20"/><w:szCs w:val="20"/><w:b w:val="1"/><w:bCs w:val="1"/></w:rPr><w:t xml:space="preserve">Lebar</w:t></w:r></w:p></w:tc><w:tc><w:tcPr><w:tcW w:w="1100" w:type="dxa"/><w:shd w:val="clear" w:fill="EAEAEA"/><w:noWrap/></w:tcPr><w:p><w:pPr><w:jc w:val="center"/></w:pPr><w:r><w:rPr><w:rFonts w:ascii="Times New Roman" w:hAnsi="Times New Roman" w:eastAsia="Times New Roman" w:cs="Times New Roman"/><w:sz w:val="20"/><w:szCs w:val="20"/><w:b w:val="1"/><w:bCs w:val="1"/></w:rPr><w:t xml:space="preserve">Ket</w:t></w:r></w:p></w:tc></w:tr><w:tr><w:trPr/><w:tc><w:tcPr><w:tcW w:w="500" w:type="dxa"/><w:noWrap/></w:tcPr><w:p><w:pPr><w:jc w:val="center"/></w:pPr><w:r><w:rPr><w:rFonts w:ascii="Times New Roman" w:hAnsi="Times New Roman" w:eastAsia="Times New Roman" w:cs="Times New Roman"/><w:sz w:val="19"/><w:szCs w:val="19"/></w:rPr><w:t xml:space="preserve">1</w:t></w:r></w:p></w:tc><w:tc><w:tcPr><w:tcW w:w="2200" w:type="dxa"/><w:noWrap/></w:tcPr><w:p><w:pPr><w:jc w:val="start"/></w:pPr><w:r><w:rPr><w:rFonts w:ascii="Times New Roman" w:hAnsi="Times New Roman" w:eastAsia="Times New Roman" w:cs="Times New Roman"/><w:sz w:val="19"/><w:szCs w:val="19"/><w:b w:val="1"/><w:bCs w:val="1"/></w:rPr><w:t xml:space="preserve">kode</w:t></w:r></w:p></w:tc><w:tc><w:tcPr><w:tcW w:w="3000" w:type="dxa"/><w:noWrap/></w:tcPr><w:p><w:pPr><w:jc w:val="start"/></w:pPr><w:r><w:rPr><w:rFonts w:ascii="Times New Roman" w:hAnsi="Times New Roman" w:eastAsia="Times New Roman" w:cs="Times New Roman"/><w:sz w:val="19"/><w:szCs w:val="19"/></w:rPr><w:t xml:space="preserve">Kode Baku 2 Digit Dosir ('01'..'33')</w:t></w:r></w:p></w:tc><w:tc><w:tcPr><w:tcW w:w="1300" w:type="dxa"/><w:noWrap/></w:tcPr><w:p><w:pPr><w:jc w:val="center"/></w:pPr><w:r><w:rPr><w:rFonts w:ascii="Times New Roman" w:hAnsi="Times New Roman" w:eastAsia="Times New Roman" w:cs="Times New Roman"/><w:sz w:val="19"/><w:szCs w:val="19"/></w:rPr><w:t xml:space="preserve">VARCHAR</w:t></w:r></w:p></w:tc><w:tc><w:tcPr><w:tcW w:w="1100" w:type="dxa"/><w:noWrap/></w:tcPr><w:p><w:pPr><w:jc w:val="center"/></w:pPr><w:r><w:rPr><w:rFonts w:ascii="Times New Roman" w:hAnsi="Times New Roman" w:eastAsia="Times New Roman" w:cs="Times New Roman"/><w:sz w:val="19"/><w:szCs w:val="19"/></w:rPr><w:t xml:space="preserve">2</w:t></w:r></w:p></w:tc><w:tc><w:tcPr><w:tcW w:w="1100" w:type="dxa"/><w:noWrap/></w:tcPr><w:p><w:pPr><w:jc w:val="center"/></w:pPr><w:r><w:rPr><w:rFonts w:ascii="Times New Roman" w:hAnsi="Times New Roman" w:eastAsia="Times New Roman" w:cs="Times New Roman"/><w:sz w:val="19"/><w:szCs w:val="19"/></w:rPr><w:t xml:space="preserve">PK</w:t></w:r></w:p></w:tc></w:tr><w:tr><w:trPr/><w:tc><w:tcPr><w:tcW w:w="500" w:type="dxa"/><w:noWrap/></w:tcPr><w:p><w:pPr><w:jc w:val="center"/></w:pPr><w:r><w:rPr><w:rFonts w:ascii="Times New Roman" w:hAnsi="Times New Roman" w:eastAsia="Times New Roman" w:cs="Times New Roman"/><w:sz w:val="19"/><w:szCs w:val="19"/></w:rPr><w:t xml:space="preserve">2</w:t></w:r></w:p></w:tc><w:tc><w:tcPr><w:tcW w:w="2200" w:type="dxa"/><w:noWrap/></w:tcPr><w:p><w:pPr><w:jc w:val="start"/></w:pPr><w:r><w:rPr><w:rFonts w:ascii="Times New Roman" w:hAnsi="Times New Roman" w:eastAsia="Times New Roman" w:cs="Times New Roman"/><w:sz w:val="19"/><w:szCs w:val="19"/><w:b w:val="1"/><w:bCs w:val="1"/></w:rPr><w:t xml:space="preserve">nama_dosir</w:t></w:r></w:p></w:tc><w:tc><w:tcPr><w:tcW w:w="3000" w:type="dxa"/><w:noWrap/></w:tcPr><w:p><w:pPr><w:jc w:val="start"/></w:pPr><w:r><w:rPr><w:rFonts w:ascii="Times New Roman" w:hAnsi="Times New Roman" w:eastAsia="Times New Roman" w:cs="Times New Roman"/><w:sz w:val="19"/><w:szCs w:val="19"/></w:rPr><w:t xml:space="preserve">Nomenklatur Resmi Jenis Dokumen</w:t></w:r></w:p></w:tc><w:tc><w:tcPr><w:tcW w:w="1300" w:type="dxa"/><w:noWrap/></w:tcPr><w:p><w:pPr><w:jc w:val="center"/></w:pPr><w:r><w:rPr><w:rFonts w:ascii="Times New Roman" w:hAnsi="Times New Roman" w:eastAsia="Times New Roman" w:cs="Times New Roman"/><w:sz w:val="19"/><w:szCs w:val="19"/></w:rPr><w:t xml:space="preserve">VARCHAR</w:t></w:r></w:p></w:tc><w:tc><w:tcPr><w:tcW w:w="1100" w:type="dxa"/><w:noWrap/></w:tcPr><w:p><w:pPr><w:jc w:val="center"/></w:pPr><w:r><w:rPr><w:rFonts w:ascii="Times New Roman" w:hAnsi="Times New Roman" w:eastAsia="Times New Roman" w:cs="Times New Roman"/><w:sz w:val="19"/><w:szCs w:val="19"/></w:rPr><w:t xml:space="preserve">180</w:t></w:r></w:p></w:tc><w:tc><w:tcPr><w:tcW w:w="1100" w:type="dxa"/><w:noWrap/></w:tcPr><w:p><w:pPr><w:jc w:val="center"/></w:pPr><w:r><w:rPr><w:rFonts w:ascii="Times New Roman" w:hAnsi="Times New Roman" w:eastAsia="Times New Roman" w:cs="Times New Roman"/><w:sz w:val="19"/><w:szCs w:val="19"/></w:rPr><w:t xml:space="preserve">Not Null</w:t></w:r></w:p></w:tc></w:tr><w:tr><w:trPr/><w:tc><w:tcPr><w:tcW w:w="500" w:type="dxa"/><w:noWrap/></w:tcPr><w:p><w:pPr><w:jc w:val="center"/></w:pPr><w:r><w:rPr><w:rFonts w:ascii="Times New Roman" w:hAnsi="Times New Roman" w:eastAsia="Times New Roman" w:cs="Times New Roman"/><w:sz w:val="19"/><w:szCs w:val="19"/></w:rPr><w:t xml:space="preserve">3</w:t></w:r></w:p></w:tc><w:tc><w:tcPr><w:tcW w:w="2200" w:type="dxa"/><w:noWrap/></w:tcPr><w:p><w:pPr><w:jc w:val="start"/></w:pPr><w:r><w:rPr><w:rFonts w:ascii="Times New Roman" w:hAnsi="Times New Roman" w:eastAsia="Times New Roman" w:cs="Times New Roman"/><w:sz w:val="19"/><w:szCs w:val="19"/><w:b w:val="1"/><w:bCs w:val="1"/></w:rPr><w:t xml:space="preserve">urutan</w:t></w:r></w:p></w:tc><w:tc><w:tcPr><w:tcW w:w="3000" w:type="dxa"/><w:noWrap/></w:tcPr><w:p><w:pPr><w:jc w:val="start"/></w:pPr><w:r><w:rPr><w:rFonts w:ascii="Times New Roman" w:hAnsi="Times New Roman" w:eastAsia="Times New Roman" w:cs="Times New Roman"/><w:sz w:val="19"/><w:szCs w:val="19"/></w:rPr><w:t xml:space="preserve">Urutan Penyusunan Berkas (1 s.d. 33)</w:t></w:r></w:p></w:tc><w:tc><w:tcPr><w:tcW w:w="1300" w:type="dxa"/><w:noWrap/></w:tcPr><w:p><w:pPr><w:jc w:val="center"/></w:pPr><w:r><w:rPr><w:rFonts w:ascii="Times New Roman" w:hAnsi="Times New Roman" w:eastAsia="Times New Roman" w:cs="Times New Roman"/><w:sz w:val="19"/><w:szCs w:val="19"/></w:rPr><w:t xml:space="preserve">INT</w:t></w:r></w:p></w:tc><w:tc><w:tcPr><w:tcW w:w="1100" w:type="dxa"/><w:noWrap/></w:tcPr><w:p><w:pPr><w:jc w:val="center"/></w:pPr><w:r><w:rPr><w:rFonts w:ascii="Times New Roman" w:hAnsi="Times New Roman" w:eastAsia="Times New Roman" w:cs="Times New Roman"/><w:sz w:val="19"/><w:szCs w:val="19"/></w:rPr><w:t xml:space="preserve">3</w:t></w:r></w:p></w:tc><w:tc><w:tcPr><w:tcW w:w="1100" w:type="dxa"/><w:noWrap/></w:tcPr><w:p><w:pPr><w:jc w:val="center"/></w:pPr><w:r><w:rPr><w:rFonts w:ascii="Times New Roman" w:hAnsi="Times New Roman" w:eastAsia="Times New Roman" w:cs="Times New Roman"/><w:sz w:val="19"/><w:szCs w:val="19"/></w:rPr><w:t xml:space="preserve">Not Null</w:t></w:r></w:p></w:tc></w:tr><w:tr><w:trPr/><w:tc><w:tcPr><w:tcW w:w="500" w:type="dxa"/><w:noWrap/></w:tcPr><w:p><w:pPr><w:jc w:val="center"/></w:pPr><w:r><w:rPr><w:rFonts w:ascii="Times New Roman" w:hAnsi="Times New Roman" w:eastAsia="Times New Roman" w:cs="Times New Roman"/><w:sz w:val="19"/><w:szCs w:val="19"/></w:rPr><w:t xml:space="preserve">4</w:t></w:r></w:p></w:tc><w:tc><w:tcPr><w:tcW w:w="2200" w:type="dxa"/><w:noWrap/></w:tcPr><w:p><w:pPr><w:jc w:val="start"/></w:pPr><w:r><w:rPr><w:rFonts w:ascii="Times New Roman" w:hAnsi="Times New Roman" w:eastAsia="Times New Roman" w:cs="Times New Roman"/><w:sz w:val="19"/><w:szCs w:val="19"/><w:b w:val="1"/><w:bCs w:val="1"/></w:rPr><w:t xml:space="preserve">wajib</w:t></w:r></w:p></w:tc><w:tc><w:tcPr><w:tcW w:w="3000" w:type="dxa"/><w:noWrap/></w:tcPr><w:p><w:pPr><w:jc w:val="start"/></w:pPr><w:r><w:rPr><w:rFonts w:ascii="Times New Roman" w:hAnsi="Times New Roman" w:eastAsia="Times New Roman" w:cs="Times New Roman"/><w:sz w:val="19"/><w:szCs w:val="19"/></w:rPr><w:t xml:space="preserve">Status Wajib Administrasi (1 = Ya)</w:t></w:r></w:p></w:tc><w:tc><w:tcPr><w:tcW w:w="1300" w:type="dxa"/><w:noWrap/></w:tcPr><w:p><w:pPr><w:jc w:val="center"/></w:pPr><w:r><w:rPr><w:rFonts w:ascii="Times New Roman" w:hAnsi="Times New Roman" w:eastAsia="Times New Roman" w:cs="Times New Roman"/><w:sz w:val="19"/><w:szCs w:val="19"/></w:rPr><w:t xml:space="preserve">TINYINT</w:t></w:r></w:p></w:tc><w:tc><w:tcPr><w:tcW w:w="1100" w:type="dxa"/><w:noWrap/></w:tcPr><w:p><w:pPr><w:jc w:val="center"/></w:pPr><w:r><w:rPr><w:rFonts w:ascii="Times New Roman" w:hAnsi="Times New Roman" w:eastAsia="Times New Roman" w:cs="Times New Roman"/><w:sz w:val="19"/><w:szCs w:val="19"/></w:rPr><w:t xml:space="preserve">1</w:t></w:r></w:p></w:tc><w:tc><w:tcPr><w:tcW w:w="1100" w:type="dxa"/><w:noWrap/></w:tcPr><w:p><w:pPr><w:jc w:val="center"/></w:pPr><w:r><w:rPr><w:rFonts w:ascii="Times New Roman" w:hAnsi="Times New Roman" w:eastAsia="Times New Roman" w:cs="Times New Roman"/><w:sz w:val="19"/><w:szCs w:val="19"/></w:rPr><w:t xml:space="preserve">Default 1</w:t></w:r></w:p></w:tc></w:tr></w:tbl><w:p/><w:p><w:pPr><w:spacing w:after="40"/></w:pPr><w:r><w:rPr><w:rFonts w:ascii="Times New Roman" w:hAnsi="Times New Roman" w:eastAsia="Times New Roman" w:cs="Times New Roman"/><w:sz w:val="22"/><w:szCs w:val="22"/><w:b w:val="1"/><w:bCs w:val="1"/></w:rPr><w:t xml:space="preserve">d.   Struktur File / Tabel: DOSIR_FILES (Metadata Arsip & Sertifikasi TTE)</w:t></w:r></w:p><w:tbl><w:tblGrid><w:gridCol w:w="500" w:type="dxa"/><w:gridCol w:w="2200" w:type="dxa"/><w:gridCol w:w="3000" w:type="dxa"/><w:gridCol w:w="1300" w:type="dxa"/><w:gridCol w:w="1100" w:type="dxa"/><w:gridCol w:w="1100" w:type="dxa"/></w:tblGrid><w:tblPr><w:tblStyle w:val="MilitaryTable"/></w:tblPr><w:tr><w:trPr/><w:tc><w:tcPr><w:tcW w:w="500" w:type="dxa"/><w:shd w:val="clear" w:fill="EAEAEA"/><w:noWrap/></w:tcPr><w:p><w:pPr><w:jc w:val="center"/></w:pPr><w:r><w:rPr><w:rFonts w:ascii="Times New Roman" w:hAnsi="Times New Roman" w:eastAsia="Times New Roman" w:cs="Times New Roman"/><w:sz w:val="20"/><w:szCs w:val="20"/><w:b w:val="1"/><w:bCs w:val="1"/></w:rPr><w:t xml:space="preserve">No</w:t></w:r></w:p></w:tc><w:tc><w:tcPr><w:tcW w:w="2200" w:type="dxa"/><w:shd w:val="clear" w:fill="EAEAEA"/><w:noWrap/></w:tcPr><w:p><w:pPr><w:jc w:val="center"/></w:pPr><w:r><w:rPr><w:rFonts w:ascii="Times New Roman" w:hAnsi="Times New Roman" w:eastAsia="Times New Roman" w:cs="Times New Roman"/><w:sz w:val="20"/><w:szCs w:val="20"/><w:b w:val="1"/><w:bCs w:val="1"/></w:rPr><w:t xml:space="preserve">Nama Field</w:t></w:r></w:p></w:tc><w:tc><w:tcPr><w:tcW w:w="3000" w:type="dxa"/><w:shd w:val="clear" w:fill="EAEAEA"/><w:noWrap/></w:tcPr><w:p><w:pPr><w:jc w:val="center"/></w:pPr><w:r><w:rPr><w:rFonts w:ascii="Times New Roman" w:hAnsi="Times New Roman" w:eastAsia="Times New Roman" w:cs="Times New Roman"/><w:sz w:val="20"/><w:szCs w:val="20"/><w:b w:val="1"/><w:bCs w:val="1"/></w:rPr><w:t xml:space="preserve">Uraian / Sebutan</w:t></w:r></w:p></w:tc><w:tc><w:tcPr><w:tcW w:w="1300" w:type="dxa"/><w:shd w:val="clear" w:fill="EAEAEA"/><w:noWrap/></w:tcPr><w:p><w:pPr><w:jc w:val="center"/></w:pPr><w:r><w:rPr><w:rFonts w:ascii="Times New Roman" w:hAnsi="Times New Roman" w:eastAsia="Times New Roman" w:cs="Times New Roman"/><w:sz w:val="20"/><w:szCs w:val="20"/><w:b w:val="1"/><w:bCs w:val="1"/></w:rPr><w:t xml:space="preserve">Type</w:t></w:r></w:p></w:tc><w:tc><w:tcPr><w:tcW w:w="1100" w:type="dxa"/><w:shd w:val="clear" w:fill="EAEAEA"/><w:noWrap/></w:tcPr><w:p><w:pPr><w:jc w:val="center"/></w:pPr><w:r><w:rPr><w:rFonts w:ascii="Times New Roman" w:hAnsi="Times New Roman" w:eastAsia="Times New Roman" w:cs="Times New Roman"/><w:sz w:val="20"/><w:szCs w:val="20"/><w:b w:val="1"/><w:bCs w:val="1"/></w:rPr><w:t xml:space="preserve">Lebar</w:t></w:r></w:p></w:tc><w:tc><w:tcPr><w:tcW w:w="1100" w:type="dxa"/><w:shd w:val="clear" w:fill="EAEAEA"/><w:noWrap/></w:tcPr><w:p><w:pPr><w:jc w:val="center"/></w:pPr><w:r><w:rPr><w:rFonts w:ascii="Times New Roman" w:hAnsi="Times New Roman" w:eastAsia="Times New Roman" w:cs="Times New Roman"/><w:sz w:val="20"/><w:szCs w:val="20"/><w:b w:val="1"/><w:bCs w:val="1"/></w:rPr><w:t xml:space="preserve">Ket</w:t></w:r></w:p></w:tc></w:tr><w:tr><w:trPr/><w:tc><w:tcPr><w:tcW w:w="500" w:type="dxa"/><w:noWrap/></w:tcPr><w:p><w:pPr><w:jc w:val="center"/></w:pPr><w:r><w:rPr><w:rFonts w:ascii="Times New Roman" w:hAnsi="Times New Roman" w:eastAsia="Times New Roman" w:cs="Times New Roman"/><w:sz w:val="19"/><w:szCs w:val="19"/></w:rPr><w:t xml:space="preserve">1</w:t></w:r></w:p></w:tc><w:tc><w:tcPr><w:tcW w:w="2200" w:type="dxa"/><w:noWrap/></w:tcPr><w:p><w:pPr><w:jc w:val="start"/></w:pPr><w:r><w:rPr><w:rFonts w:ascii="Times New Roman" w:hAnsi="Times New Roman" w:eastAsia="Times New Roman" w:cs="Times New Roman"/><w:sz w:val="19"/><w:szCs w:val="19"/><w:b w:val="1"/><w:bCs w:val="1"/></w:rPr><w:t xml:space="preserve">id</w:t></w:r></w:p></w:tc><w:tc><w:tcPr><w:tcW w:w="3000" w:type="dxa"/><w:noWrap/></w:tcPr><w:p><w:pPr><w:jc w:val="start"/></w:pPr><w:r><w:rPr><w:rFonts w:ascii="Times New Roman" w:hAnsi="Times New Roman" w:eastAsia="Times New Roman" w:cs="Times New Roman"/><w:sz w:val="19"/><w:szCs w:val="19"/></w:rPr><w:t xml:space="preserve">Nomor Unik Berkas Dosir</w:t></w:r></w:p></w:tc><w:tc><w:tcPr><w:tcW w:w="1300" w:type="dxa"/><w:noWrap/></w:tcPr><w:p><w:pPr><w:jc w:val="center"/></w:pPr><w:r><w:rPr><w:rFonts w:ascii="Times New Roman" w:hAnsi="Times New Roman" w:eastAsia="Times New Roman" w:cs="Times New Roman"/><w:sz w:val="19"/><w:szCs w:val="19"/></w:rPr><w:t xml:space="preserve">INT</w:t></w:r></w:p></w:tc><w:tc><w:tcPr><w:tcW w:w="1100" w:type="dxa"/><w:noWrap/></w:tcPr><w:p><w:pPr><w:jc w:val="center"/></w:pPr><w:r><w:rPr><w:rFonts w:ascii="Times New Roman" w:hAnsi="Times New Roman" w:eastAsia="Times New Roman" w:cs="Times New Roman"/><w:sz w:val="19"/><w:szCs w:val="19"/></w:rPr><w:t xml:space="preserve">11</w:t></w:r></w:p></w:tc><w:tc><w:tcPr><w:tcW w:w="1100" w:type="dxa"/><w:noWrap/></w:tcPr><w:p><w:pPr><w:jc w:val="center"/></w:pPr><w:r><w:rPr><w:rFonts w:ascii="Times New Roman" w:hAnsi="Times New Roman" w:eastAsia="Times New Roman" w:cs="Times New Roman"/><w:sz w:val="19"/><w:szCs w:val="19"/></w:rPr><w:t xml:space="preserve">PK, Auto</w:t></w:r></w:p></w:tc></w:tr><w:tr><w:trPr/><w:tc><w:tcPr><w:tcW w:w="500" w:type="dxa"/><w:noWrap/></w:tcPr><w:p><w:pPr><w:jc w:val="center"/></w:pPr><w:r><w:rPr><w:rFonts w:ascii="Times New Roman" w:hAnsi="Times New Roman" w:eastAsia="Times New Roman" w:cs="Times New Roman"/><w:sz w:val="19"/><w:szCs w:val="19"/></w:rPr><w:t xml:space="preserve">2</w:t></w:r></w:p></w:tc><w:tc><w:tcPr><w:tcW w:w="2200" w:type="dxa"/><w:noWrap/></w:tcPr><w:p><w:pPr><w:jc w:val="start"/></w:pPr><w:r><w:rPr><w:rFonts w:ascii="Times New Roman" w:hAnsi="Times New Roman" w:eastAsia="Times New Roman" w:cs="Times New Roman"/><w:sz w:val="19"/><w:szCs w:val="19"/><w:b w:val="1"/><w:bCs w:val="1"/></w:rPr><w:t xml:space="preserve">personel_id</w:t></w:r></w:p></w:tc><w:tc><w:tcPr><w:tcW w:w="3000" w:type="dxa"/><w:noWrap/></w:tcPr><w:p><w:pPr><w:jc w:val="start"/></w:pPr><w:r><w:rPr><w:rFonts w:ascii="Times New Roman" w:hAnsi="Times New Roman" w:eastAsia="Times New Roman" w:cs="Times New Roman"/><w:sz w:val="19"/><w:szCs w:val="19"/></w:rPr><w:t xml:space="preserve">Pemilik Berkas (Relasi ke Personel)</w:t></w:r></w:p></w:tc><w:tc><w:tcPr><w:tcW w:w="1300" w:type="dxa"/><w:noWrap/></w:tcPr><w:p><w:pPr><w:jc w:val="center"/></w:pPr><w:r><w:rPr><w:rFonts w:ascii="Times New Roman" w:hAnsi="Times New Roman" w:eastAsia="Times New Roman" w:cs="Times New Roman"/><w:sz w:val="19"/><w:szCs w:val="19"/></w:rPr><w:t xml:space="preserve">INT</w:t></w:r></w:p></w:tc><w:tc><w:tcPr><w:tcW w:w="1100" w:type="dxa"/><w:noWrap/></w:tcPr><w:p><w:pPr><w:jc w:val="center"/></w:pPr><w:r><w:rPr><w:rFonts w:ascii="Times New Roman" w:hAnsi="Times New Roman" w:eastAsia="Times New Roman" w:cs="Times New Roman"/><w:sz w:val="19"/><w:szCs w:val="19"/></w:rPr><w:t xml:space="preserve">11</w:t></w:r></w:p></w:tc><w:tc><w:tcPr><w:tcW w:w="1100" w:type="dxa"/><w:noWrap/></w:tcPr><w:p><w:pPr><w:jc w:val="center"/></w:pPr><w:r><w:rPr><w:rFonts w:ascii="Times New Roman" w:hAnsi="Times New Roman" w:eastAsia="Times New Roman" w:cs="Times New Roman"/><w:sz w:val="19"/><w:szCs w:val="19"/></w:rPr><w:t xml:space="preserve">FK, Not Null</w:t></w:r></w:p></w:tc></w:tr><w:tr><w:trPr/><w:tc><w:tcPr><w:tcW w:w="500" w:type="dxa"/><w:noWrap/></w:tcPr><w:p><w:pPr><w:jc w:val="center"/></w:pPr><w:r><w:rPr><w:rFonts w:ascii="Times New Roman" w:hAnsi="Times New Roman" w:eastAsia="Times New Roman" w:cs="Times New Roman"/><w:sz w:val="19"/><w:szCs w:val="19"/></w:rPr><w:t xml:space="preserve">3</w:t></w:r></w:p></w:tc><w:tc><w:tcPr><w:tcW w:w="2200" w:type="dxa"/><w:noWrap/></w:tcPr><w:p><w:pPr><w:jc w:val="start"/></w:pPr><w:r><w:rPr><w:rFonts w:ascii="Times New Roman" w:hAnsi="Times New Roman" w:eastAsia="Times New Roman" w:cs="Times New Roman"/><w:sz w:val="19"/><w:szCs w:val="19"/><w:b w:val="1"/><w:bCs w:val="1"/></w:rPr><w:t xml:space="preserve">dosir_kode</w:t></w:r></w:p></w:tc><w:tc><w:tcPr><w:tcW w:w="3000" w:type="dxa"/><w:noWrap/></w:tcPr><w:p><w:pPr><w:jc w:val="start"/></w:pPr><w:r><w:rPr><w:rFonts w:ascii="Times New Roman" w:hAnsi="Times New Roman" w:eastAsia="Times New Roman" w:cs="Times New Roman"/><w:sz w:val="19"/><w:szCs w:val="19"/></w:rPr><w:t xml:space="preserve">Kode Jenis Dosir (Relasi Master)</w:t></w:r></w:p></w:tc><w:tc><w:tcPr><w:tcW w:w="1300" w:type="dxa"/><w:noWrap/></w:tcPr><w:p><w:pPr><w:jc w:val="center"/></w:pPr><w:r><w:rPr><w:rFonts w:ascii="Times New Roman" w:hAnsi="Times New Roman" w:eastAsia="Times New Roman" w:cs="Times New Roman"/><w:sz w:val="19"/><w:szCs w:val="19"/></w:rPr><w:t xml:space="preserve">VARCHAR</w:t></w:r></w:p></w:tc><w:tc><w:tcPr><w:tcW w:w="1100" w:type="dxa"/><w:noWrap/></w:tcPr><w:p><w:pPr><w:jc w:val="center"/></w:pPr><w:r><w:rPr><w:rFonts w:ascii="Times New Roman" w:hAnsi="Times New Roman" w:eastAsia="Times New Roman" w:cs="Times New Roman"/><w:sz w:val="19"/><w:szCs w:val="19"/></w:rPr><w:t xml:space="preserve">2</w:t></w:r></w:p></w:tc><w:tc><w:tcPr><w:tcW w:w="1100" w:type="dxa"/><w:noWrap/></w:tcPr><w:p><w:pPr><w:jc w:val="center"/></w:pPr><w:r><w:rPr><w:rFonts w:ascii="Times New Roman" w:hAnsi="Times New Roman" w:eastAsia="Times New Roman" w:cs="Times New Roman"/><w:sz w:val="19"/><w:szCs w:val="19"/></w:rPr><w:t xml:space="preserve">FK, Not Null</w:t></w:r></w:p></w:tc></w:tr><w:tr><w:trPr/><w:tc><w:tcPr><w:tcW w:w="500" w:type="dxa"/><w:noWrap/></w:tcPr><w:p><w:pPr><w:jc w:val="center"/></w:pPr><w:r><w:rPr><w:rFonts w:ascii="Times New Roman" w:hAnsi="Times New Roman" w:eastAsia="Times New Roman" w:cs="Times New Roman"/><w:sz w:val="19"/><w:szCs w:val="19"/></w:rPr><w:t xml:space="preserve">4</w:t></w:r></w:p></w:tc><w:tc><w:tcPr><w:tcW w:w="2200" w:type="dxa"/><w:noWrap/></w:tcPr><w:p><w:pPr><w:jc w:val="start"/></w:pPr><w:r><w:rPr><w:rFonts w:ascii="Times New Roman" w:hAnsi="Times New Roman" w:eastAsia="Times New Roman" w:cs="Times New Roman"/><w:sz w:val="19"/><w:szCs w:val="19"/><w:b w:val="1"/><w:bCs w:val="1"/></w:rPr><w:t xml:space="preserve">abjad</w:t></w:r></w:p></w:tc><w:tc><w:tcPr><w:tcW w:w="3000" w:type="dxa"/><w:noWrap/></w:tcPr><w:p><w:pPr><w:jc w:val="start"/></w:pPr><w:r><w:rPr><w:rFonts w:ascii="Times New Roman" w:hAnsi="Times New Roman" w:eastAsia="Times New Roman" w:cs="Times New Roman"/><w:sz w:val="19"/><w:szCs w:val="19"/></w:rPr><w:t xml:space="preserve">Indeks Berkas Lanjutan (NULL, 'a', 'b')</w:t></w:r></w:p></w:tc><w:tc><w:tcPr><w:tcW w:w="1300" w:type="dxa"/><w:noWrap/></w:tcPr><w:p><w:pPr><w:jc w:val="center"/></w:pPr><w:r><w:rPr><w:rFonts w:ascii="Times New Roman" w:hAnsi="Times New Roman" w:eastAsia="Times New Roman" w:cs="Times New Roman"/><w:sz w:val="19"/><w:szCs w:val="19"/></w:rPr><w:t xml:space="preserve">VARCHAR</w:t></w:r></w:p></w:tc><w:tc><w:tcPr><w:tcW w:w="1100" w:type="dxa"/><w:noWrap/></w:tcPr><w:p><w:pPr><w:jc w:val="center"/></w:pPr><w:r><w:rPr><w:rFonts w:ascii="Times New Roman" w:hAnsi="Times New Roman" w:eastAsia="Times New Roman" w:cs="Times New Roman"/><w:sz w:val="19"/><w:szCs w:val="19"/></w:rPr><w:t xml:space="preserve">1</w:t></w:r></w:p></w:tc><w:tc><w:tcPr><w:tcW w:w="1100" w:type="dxa"/><w:noWrap/></w:tcPr><w:p><w:pPr><w:jc w:val="center"/></w:pPr><w:r><w:rPr><w:rFonts w:ascii="Times New Roman" w:hAnsi="Times New Roman" w:eastAsia="Times New Roman" w:cs="Times New Roman"/><w:sz w:val="19"/><w:szCs w:val="19"/></w:rPr><w:t xml:space="preserve">Nullable</w:t></w:r></w:p></w:tc></w:tr><w:tr><w:trPr/><w:tc><w:tcPr><w:tcW w:w="500" w:type="dxa"/><w:noWrap/></w:tcPr><w:p><w:pPr><w:jc w:val="center"/></w:pPr><w:r><w:rPr><w:rFonts w:ascii="Times New Roman" w:hAnsi="Times New Roman" w:eastAsia="Times New Roman" w:cs="Times New Roman"/><w:sz w:val="19"/><w:szCs w:val="19"/></w:rPr><w:t xml:space="preserve">5</w:t></w:r></w:p></w:tc><w:tc><w:tcPr><w:tcW w:w="2200" w:type="dxa"/><w:noWrap/></w:tcPr><w:p><w:pPr><w:jc w:val="start"/></w:pPr><w:r><w:rPr><w:rFonts w:ascii="Times New Roman" w:hAnsi="Times New Roman" w:eastAsia="Times New Roman" w:cs="Times New Roman"/><w:sz w:val="19"/><w:szCs w:val="19"/><w:b w:val="1"/><w:bCs w:val="1"/></w:rPr><w:t xml:space="preserve">file_name</w:t></w:r></w:p></w:tc><w:tc><w:tcPr><w:tcW w:w="3000" w:type="dxa"/><w:noWrap/></w:tcPr><w:p><w:pPr><w:jc w:val="start"/></w:pPr><w:r><w:rPr><w:rFonts w:ascii="Times New Roman" w:hAnsi="Times New Roman" w:eastAsia="Times New Roman" w:cs="Times New Roman"/><w:sz w:val="19"/><w:szCs w:val="19"/></w:rPr><w:t xml:space="preserve">Nama File Fisik (NRP_KODE[abjad].pdf)</w:t></w:r></w:p></w:tc><w:tc><w:tcPr><w:tcW w:w="1300" w:type="dxa"/><w:noWrap/></w:tcPr><w:p><w:pPr><w:jc w:val="center"/></w:pPr><w:r><w:rPr><w:rFonts w:ascii="Times New Roman" w:hAnsi="Times New Roman" w:eastAsia="Times New Roman" w:cs="Times New Roman"/><w:sz w:val="19"/><w:szCs w:val="19"/></w:rPr><w:t xml:space="preserve">VARCHAR</w:t></w:r></w:p></w:tc><w:tc><w:tcPr><w:tcW w:w="1100" w:type="dxa"/><w:noWrap/></w:tcPr><w:p><w:pPr><w:jc w:val="center"/></w:pPr><w:r><w:rPr><w:rFonts w:ascii="Times New Roman" w:hAnsi="Times New Roman" w:eastAsia="Times New Roman" w:cs="Times New Roman"/><w:sz w:val="19"/><w:szCs w:val="19"/></w:rPr><w:t xml:space="preserve">150</w:t></w:r></w:p></w:tc><w:tc><w:tcPr><w:tcW w:w="1100" w:type="dxa"/><w:noWrap/></w:tcPr><w:p><w:pPr><w:jc w:val="center"/></w:pPr><w:r><w:rPr><w:rFonts w:ascii="Times New Roman" w:hAnsi="Times New Roman" w:eastAsia="Times New Roman" w:cs="Times New Roman"/><w:sz w:val="19"/><w:szCs w:val="19"/></w:rPr><w:t xml:space="preserve">Not Null</w:t></w:r></w:p></w:tc></w:tr><w:tr><w:trPr/><w:tc><w:tcPr><w:tcW w:w="500" w:type="dxa"/><w:noWrap/></w:tcPr><w:p><w:pPr><w:jc w:val="center"/></w:pPr><w:r><w:rPr><w:rFonts w:ascii="Times New Roman" w:hAnsi="Times New Roman" w:eastAsia="Times New Roman" w:cs="Times New Roman"/><w:sz w:val="19"/><w:szCs w:val="19"/></w:rPr><w:t xml:space="preserve">6</w:t></w:r></w:p></w:tc><w:tc><w:tcPr><w:tcW w:w="2200" w:type="dxa"/><w:noWrap/></w:tcPr><w:p><w:pPr><w:jc w:val="start"/></w:pPr><w:r><w:rPr><w:rFonts w:ascii="Times New Roman" w:hAnsi="Times New Roman" w:eastAsia="Times New Roman" w:cs="Times New Roman"/><w:sz w:val="19"/><w:szCs w:val="19"/><w:b w:val="1"/><w:bCs w:val="1"/></w:rPr><w:t xml:space="preserve">file_path</w:t></w:r></w:p></w:tc><w:tc><w:tcPr><w:tcW w:w="3000" w:type="dxa"/><w:noWrap/></w:tcPr><w:p><w:pPr><w:jc w:val="start"/></w:pPr><w:r><w:rPr><w:rFonts w:ascii="Times New Roman" w:hAnsi="Times New Roman" w:eastAsia="Times New Roman" w:cs="Times New Roman"/><w:sz w:val="19"/><w:szCs w:val="19"/></w:rPr><w:t xml:space="preserve">Path File Aktif Terverifikasi TTE</w:t></w:r></w:p></w:tc><w:tc><w:tcPr><w:tcW w:w="1300" w:type="dxa"/><w:noWrap/></w:tcPr><w:p><w:pPr><w:jc w:val="center"/></w:pPr><w:r><w:rPr><w:rFonts w:ascii="Times New Roman" w:hAnsi="Times New Roman" w:eastAsia="Times New Roman" w:cs="Times New Roman"/><w:sz w:val="19"/><w:szCs w:val="19"/></w:rPr><w:t xml:space="preserve">VARCHAR</w:t></w:r></w:p></w:tc><w:tc><w:tcPr><w:tcW w:w="1100" w:type="dxa"/><w:noWrap/></w:tcPr><w:p><w:pPr><w:jc w:val="center"/></w:pPr><w:r><w:rPr><w:rFonts w:ascii="Times New Roman" w:hAnsi="Times New Roman" w:eastAsia="Times New Roman" w:cs="Times New Roman"/><w:sz w:val="19"/><w:szCs w:val="19"/></w:rPr><w:t xml:space="preserve">255</w:t></w:r></w:p></w:tc><w:tc><w:tcPr><w:tcW w:w="1100" w:type="dxa"/><w:noWrap/></w:tcPr><w:p><w:pPr><w:jc w:val="center"/></w:pPr><w:r><w:rPr><w:rFonts w:ascii="Times New Roman" w:hAnsi="Times New Roman" w:eastAsia="Times New Roman" w:cs="Times New Roman"/><w:sz w:val="19"/><w:szCs w:val="19"/></w:rPr><w:t xml:space="preserve">Not Null</w:t></w:r></w:p></w:tc></w:tr><w:tr><w:trPr/><w:tc><w:tcPr><w:tcW w:w="500" w:type="dxa"/><w:noWrap/></w:tcPr><w:p><w:pPr><w:jc w:val="center"/></w:pPr><w:r><w:rPr><w:rFonts w:ascii="Times New Roman" w:hAnsi="Times New Roman" w:eastAsia="Times New Roman" w:cs="Times New Roman"/><w:sz w:val="19"/><w:szCs w:val="19"/></w:rPr><w:t xml:space="preserve">7</w:t></w:r></w:p></w:tc><w:tc><w:tcPr><w:tcW w:w="2200" w:type="dxa"/><w:noWrap/></w:tcPr><w:p><w:pPr><w:jc w:val="start"/></w:pPr><w:r><w:rPr><w:rFonts w:ascii="Times New Roman" w:hAnsi="Times New Roman" w:eastAsia="Times New Roman" w:cs="Times New Roman"/><w:sz w:val="19"/><w:szCs w:val="19"/><w:b w:val="1"/><w:bCs w:val="1"/></w:rPr><w:t xml:space="preserve">raw_file_path</w:t></w:r></w:p></w:tc><w:tc><w:tcPr><w:tcW w:w="3000" w:type="dxa"/><w:noWrap/></w:tcPr><w:p><w:pPr><w:jc w:val="start"/></w:pPr><w:r><w:rPr><w:rFonts w:ascii="Times New Roman" w:hAnsi="Times New Roman" w:eastAsia="Times New Roman" w:cs="Times New Roman"/><w:sz w:val="19"/><w:szCs w:val="19"/></w:rPr><w:t xml:space="preserve">Path File Master Asli Bersih</w:t></w:r></w:p></w:tc><w:tc><w:tcPr><w:tcW w:w="1300" w:type="dxa"/><w:noWrap/></w:tcPr><w:p><w:pPr><w:jc w:val="center"/></w:pPr><w:r><w:rPr><w:rFonts w:ascii="Times New Roman" w:hAnsi="Times New Roman" w:eastAsia="Times New Roman" w:cs="Times New Roman"/><w:sz w:val="19"/><w:szCs w:val="19"/></w:rPr><w:t xml:space="preserve">VARCHAR</w:t></w:r></w:p></w:tc><w:tc><w:tcPr><w:tcW w:w="1100" w:type="dxa"/><w:noWrap/></w:tcPr><w:p><w:pPr><w:jc w:val="center"/></w:pPr><w:r><w:rPr><w:rFonts w:ascii="Times New Roman" w:hAnsi="Times New Roman" w:eastAsia="Times New Roman" w:cs="Times New Roman"/><w:sz w:val="19"/><w:szCs w:val="19"/></w:rPr><w:t xml:space="preserve">255</w:t></w:r></w:p></w:tc><w:tc><w:tcPr><w:tcW w:w="1100" w:type="dxa"/><w:noWrap/></w:tcPr><w:p><w:pPr><w:jc w:val="center"/></w:pPr><w:r><w:rPr><w:rFonts w:ascii="Times New Roman" w:hAnsi="Times New Roman" w:eastAsia="Times New Roman" w:cs="Times New Roman"/><w:sz w:val="19"/><w:szCs w:val="19"/></w:rPr><w:t xml:space="preserve">Nullable</w:t></w:r></w:p></w:tc></w:tr><w:tr><w:trPr/><w:tc><w:tcPr><w:tcW w:w="500" w:type="dxa"/><w:noWrap/></w:tcPr><w:p><w:pPr><w:jc w:val="center"/></w:pPr><w:r><w:rPr><w:rFonts w:ascii="Times New Roman" w:hAnsi="Times New Roman" w:eastAsia="Times New Roman" w:cs="Times New Roman"/><w:sz w:val="19"/><w:szCs w:val="19"/></w:rPr><w:t xml:space="preserve">8</w:t></w:r></w:p></w:tc><w:tc><w:tcPr><w:tcW w:w="2200" w:type="dxa"/><w:noWrap/></w:tcPr><w:p><w:pPr><w:jc w:val="start"/></w:pPr><w:r><w:rPr><w:rFonts w:ascii="Times New Roman" w:hAnsi="Times New Roman" w:eastAsia="Times New Roman" w:cs="Times New Roman"/><w:sz w:val="19"/><w:szCs w:val="19"/><w:b w:val="1"/><w:bCs w:val="1"/></w:rPr><w:t xml:space="preserve">original_name</w:t></w:r></w:p></w:tc><w:tc><w:tcPr><w:tcW w:w="3000" w:type="dxa"/><w:noWrap/></w:tcPr><w:p><w:pPr><w:jc w:val="start"/></w:pPr><w:r><w:rPr><w:rFonts w:ascii="Times New Roman" w:hAnsi="Times New Roman" w:eastAsia="Times New Roman" w:cs="Times New Roman"/><w:sz w:val="19"/><w:szCs w:val="19"/></w:rPr><w:t xml:space="preserve">Nama Asli Berkas Saat Diunggah</w:t></w:r></w:p></w:tc><w:tc><w:tcPr><w:tcW w:w="1300" w:type="dxa"/><w:noWrap/></w:tcPr><w:p><w:pPr><w:jc w:val="center"/></w:pPr><w:r><w:rPr><w:rFonts w:ascii="Times New Roman" w:hAnsi="Times New Roman" w:eastAsia="Times New Roman" w:cs="Times New Roman"/><w:sz w:val="19"/><w:szCs w:val="19"/></w:rPr><w:t xml:space="preserve">VARCHAR</w:t></w:r></w:p></w:tc><w:tc><w:tcPr><w:tcW w:w="1100" w:type="dxa"/><w:noWrap/></w:tcPr><w:p><w:pPr><w:jc w:val="center"/></w:pPr><w:r><w:rPr><w:rFonts w:ascii="Times New Roman" w:hAnsi="Times New Roman" w:eastAsia="Times New Roman" w:cs="Times New Roman"/><w:sz w:val="19"/><w:szCs w:val="19"/></w:rPr><w:t xml:space="preserve">255</w:t></w:r></w:p></w:tc><w:tc><w:tcPr><w:tcW w:w="1100" w:type="dxa"/><w:noWrap/></w:tcPr><w:p><w:pPr><w:jc w:val="center"/></w:pPr><w:r><w:rPr><w:rFonts w:ascii="Times New Roman" w:hAnsi="Times New Roman" w:eastAsia="Times New Roman" w:cs="Times New Roman"/><w:sz w:val="19"/><w:szCs w:val="19"/></w:rPr><w:t xml:space="preserve">Nullable</w:t></w:r></w:p></w:tc></w:tr><w:tr><w:trPr/><w:tc><w:tcPr><w:tcW w:w="500" w:type="dxa"/><w:noWrap/></w:tcPr><w:p><w:pPr><w:jc w:val="center"/></w:pPr><w:r><w:rPr><w:rFonts w:ascii="Times New Roman" w:hAnsi="Times New Roman" w:eastAsia="Times New Roman" w:cs="Times New Roman"/><w:sz w:val="19"/><w:szCs w:val="19"/></w:rPr><w:t xml:space="preserve">9</w:t></w:r></w:p></w:tc><w:tc><w:tcPr><w:tcW w:w="2200" w:type="dxa"/><w:noWrap/></w:tcPr><w:p><w:pPr><w:jc w:val="start"/></w:pPr><w:r><w:rPr><w:rFonts w:ascii="Times New Roman" w:hAnsi="Times New Roman" w:eastAsia="Times New Roman" w:cs="Times New Roman"/><w:sz w:val="19"/><w:szCs w:val="19"/><w:b w:val="1"/><w:bCs w:val="1"/></w:rPr><w:t xml:space="preserve">keterangan</w:t></w:r></w:p></w:tc><w:tc><w:tcPr><w:tcW w:w="3000" w:type="dxa"/><w:noWrap/></w:tcPr><w:p><w:pPr><w:jc w:val="start"/></w:pPr><w:r><w:rPr><w:rFonts w:ascii="Times New Roman" w:hAnsi="Times New Roman" w:eastAsia="Times New Roman" w:cs="Times New Roman"/><w:sz w:val="19"/><w:szCs w:val="19"/></w:rPr><w:t xml:space="preserve">Keterangan Tambahan dari Personel</w:t></w:r></w:p></w:tc><w:tc><w:tcPr><w:tcW w:w="1300" w:type="dxa"/><w:noWrap/></w:tcPr><w:p><w:pPr><w:jc w:val="center"/></w:pPr><w:r><w:rPr><w:rFonts w:ascii="Times New Roman" w:hAnsi="Times New Roman" w:eastAsia="Times New Roman" w:cs="Times New Roman"/><w:sz w:val="19"/><w:szCs w:val="19"/></w:rPr><w:t xml:space="preserve">VARCHAR</w:t></w:r></w:p></w:tc><w:tc><w:tcPr><w:tcW w:w="1100" w:type="dxa"/><w:noWrap/></w:tcPr><w:p><w:pPr><w:jc w:val="center"/></w:pPr><w:r><w:rPr><w:rFonts w:ascii="Times New Roman" w:hAnsi="Times New Roman" w:eastAsia="Times New Roman" w:cs="Times New Roman"/><w:sz w:val="19"/><w:szCs w:val="19"/></w:rPr><w:t xml:space="preserve">255</w:t></w:r></w:p></w:tc><w:tc><w:tcPr><w:tcW w:w="1100" w:type="dxa"/><w:noWrap/></w:tcPr><w:p><w:pPr><w:jc w:val="center"/></w:pPr><w:r><w:rPr><w:rFonts w:ascii="Times New Roman" w:hAnsi="Times New Roman" w:eastAsia="Times New Roman" w:cs="Times New Roman"/><w:sz w:val="19"/><w:szCs w:val="19"/></w:rPr><w:t xml:space="preserve">Nullable</w:t></w:r></w:p></w:tc></w:tr><w:tr><w:trPr/><w:tc><w:tcPr><w:tcW w:w="500" w:type="dxa"/><w:noWrap/></w:tcPr><w:p><w:pPr><w:jc w:val="center"/></w:pPr><w:r><w:rPr><w:rFonts w:ascii="Times New Roman" w:hAnsi="Times New Roman" w:eastAsia="Times New Roman" w:cs="Times New Roman"/><w:sz w:val="19"/><w:szCs w:val="19"/></w:rPr><w:t xml:space="preserve">10</w:t></w:r></w:p></w:tc><w:tc><w:tcPr><w:tcW w:w="2200" w:type="dxa"/><w:noWrap/></w:tcPr><w:p><w:pPr><w:jc w:val="start"/></w:pPr><w:r><w:rPr><w:rFonts w:ascii="Times New Roman" w:hAnsi="Times New Roman" w:eastAsia="Times New Roman" w:cs="Times New Roman"/><w:sz w:val="19"/><w:szCs w:val="19"/><w:b w:val="1"/><w:bCs w:val="1"/></w:rPr><w:t xml:space="preserve">status</w:t></w:r></w:p></w:tc><w:tc><w:tcPr><w:tcW w:w="3000" w:type="dxa"/><w:noWrap/></w:tcPr><w:p><w:pPr><w:jc w:val="start"/></w:pPr><w:r><w:rPr><w:rFonts w:ascii="Times New Roman" w:hAnsi="Times New Roman" w:eastAsia="Times New Roman" w:cs="Times New Roman"/><w:sz w:val="19"/><w:szCs w:val="19"/></w:rPr><w:t xml:space="preserve">Status Verifikasi (pending/approved/rejected)</w:t></w:r></w:p></w:tc><w:tc><w:tcPr><w:tcW w:w="1300" w:type="dxa"/><w:noWrap/></w:tcPr><w:p><w:pPr><w:jc w:val="center"/></w:pPr><w:r><w:rPr><w:rFonts w:ascii="Times New Roman" w:hAnsi="Times New Roman" w:eastAsia="Times New Roman" w:cs="Times New Roman"/><w:sz w:val="19"/><w:szCs w:val="19"/></w:rPr><w:t xml:space="preserve">ENUM</w:t></w:r></w:p></w:tc><w:tc><w:tcPr><w:tcW w:w="1100" w:type="dxa"/><w:noWrap/></w:tcPr><w:p><w:pPr><w:jc w:val="center"/></w:pPr><w:r><w:rPr><w:rFonts w:ascii="Times New Roman" w:hAnsi="Times New Roman" w:eastAsia="Times New Roman" w:cs="Times New Roman"/><w:sz w:val="19"/><w:szCs w:val="19"/></w:rPr><w:t xml:space="preserve">10</w:t></w:r></w:p></w:tc><w:tc><w:tcPr><w:tcW w:w="1100" w:type="dxa"/><w:noWrap/></w:tcPr><w:p><w:pPr><w:jc w:val="center"/></w:pPr><w:r><w:rPr><w:rFonts w:ascii="Times New Roman" w:hAnsi="Times New Roman" w:eastAsia="Times New Roman" w:cs="Times New Roman"/><w:sz w:val="19"/><w:szCs w:val="19"/></w:rPr><w:t xml:space="preserve">INDEX</w:t></w:r></w:p></w:tc></w:tr><w:tr><w:trPr/><w:tc><w:tcPr><w:tcW w:w="500" w:type="dxa"/><w:noWrap/></w:tcPr><w:p><w:pPr><w:jc w:val="center"/></w:pPr><w:r><w:rPr><w:rFonts w:ascii="Times New Roman" w:hAnsi="Times New Roman" w:eastAsia="Times New Roman" w:cs="Times New Roman"/><w:sz w:val="19"/><w:szCs w:val="19"/></w:rPr><w:t xml:space="preserve">11</w:t></w:r></w:p></w:tc><w:tc><w:tcPr><w:tcW w:w="2200" w:type="dxa"/><w:noWrap/></w:tcPr><w:p><w:pPr><w:jc w:val="start"/></w:pPr><w:r><w:rPr><w:rFonts w:ascii="Times New Roman" w:hAnsi="Times New Roman" w:eastAsia="Times New Roman" w:cs="Times New Roman"/><w:sz w:val="19"/><w:szCs w:val="19"/><w:b w:val="1"/><w:bCs w:val="1"/></w:rPr><w:t xml:space="preserve">catatan_verifikasi</w:t></w:r></w:p></w:tc><w:tc><w:tcPr><w:tcW w:w="3000" w:type="dxa"/><w:noWrap/></w:tcPr><w:p><w:pPr><w:jc w:val="start"/></w:pPr><w:r><w:rPr><w:rFonts w:ascii="Times New Roman" w:hAnsi="Times New Roman" w:eastAsia="Times New Roman" w:cs="Times New Roman"/><w:sz w:val="19"/><w:szCs w:val="19"/></w:rPr><w:t xml:space="preserve">Catatan Evaluasi Verifikator</w:t></w:r></w:p></w:tc><w:tc><w:tcPr><w:tcW w:w="1300" w:type="dxa"/><w:noWrap/></w:tcPr><w:p><w:pPr><w:jc w:val="center"/></w:pPr><w:r><w:rPr><w:rFonts w:ascii="Times New Roman" w:hAnsi="Times New Roman" w:eastAsia="Times New Roman" w:cs="Times New Roman"/><w:sz w:val="19"/><w:szCs w:val="19"/></w:rPr><w:t xml:space="preserve">TEXT</w:t></w:r></w:p></w:tc><w:tc><w:tcPr><w:tcW w:w="1100" w:type="dxa"/><w:noWrap/></w:tcPr><w:p><w:pPr><w:jc w:val="center"/></w:pPr><w:r><w:rPr><w:rFonts w:ascii="Times New Roman" w:hAnsi="Times New Roman" w:eastAsia="Times New Roman" w:cs="Times New Roman"/><w:sz w:val="19"/><w:szCs w:val="19"/></w:rPr><w:t xml:space="preserve">-</w:t></w:r></w:p></w:tc><w:tc><w:tcPr><w:tcW w:w="1100" w:type="dxa"/><w:noWrap/></w:tcPr><w:p><w:pPr><w:jc w:val="center"/></w:pPr><w:r><w:rPr><w:rFonts w:ascii="Times New Roman" w:hAnsi="Times New Roman" w:eastAsia="Times New Roman" w:cs="Times New Roman"/><w:sz w:val="19"/><w:szCs w:val="19"/></w:rPr><w:t xml:space="preserve">Nullable</w:t></w:r></w:p></w:tc></w:tr><w:tr><w:trPr/><w:tc><w:tcPr><w:tcW w:w="500" w:type="dxa"/><w:noWrap/></w:tcPr><w:p><w:pPr><w:jc w:val="center"/></w:pPr><w:r><w:rPr><w:rFonts w:ascii="Times New Roman" w:hAnsi="Times New Roman" w:eastAsia="Times New Roman" w:cs="Times New Roman"/><w:sz w:val="19"/><w:szCs w:val="19"/></w:rPr><w:t xml:space="preserve">12</w:t></w:r></w:p></w:tc><w:tc><w:tcPr><w:tcW w:w="2200" w:type="dxa"/><w:noWrap/></w:tcPr><w:p><w:pPr><w:jc w:val="start"/></w:pPr><w:r><w:rPr><w:rFonts w:ascii="Times New Roman" w:hAnsi="Times New Roman" w:eastAsia="Times New Roman" w:cs="Times New Roman"/><w:sz w:val="19"/><w:szCs w:val="19"/><w:b w:val="1"/><w:bCs w:val="1"/></w:rPr><w:t xml:space="preserve">is_watermarked</w:t></w:r></w:p></w:tc><w:tc><w:tcPr><w:tcW w:w="3000" w:type="dxa"/><w:noWrap/></w:tcPr><w:p><w:pPr><w:jc w:val="start"/></w:pPr><w:r><w:rPr><w:rFonts w:ascii="Times New Roman" w:hAnsi="Times New Roman" w:eastAsia="Times New Roman" w:cs="Times New Roman"/><w:sz w:val="19"/><w:szCs w:val="19"/></w:rPr><w:t xml:space="preserve">Penanda Status Watermark Sementara</w:t></w:r></w:p></w:tc><w:tc><w:tcPr><w:tcW w:w="1300" w:type="dxa"/><w:noWrap/></w:tcPr><w:p><w:pPr><w:jc w:val="center"/></w:pPr><w:r><w:rPr><w:rFonts w:ascii="Times New Roman" w:hAnsi="Times New Roman" w:eastAsia="Times New Roman" w:cs="Times New Roman"/><w:sz w:val="19"/><w:szCs w:val="19"/></w:rPr><w:t xml:space="preserve">TINYINT</w:t></w:r></w:p></w:tc><w:tc><w:tcPr><w:tcW w:w="1100" w:type="dxa"/><w:noWrap/></w:tcPr><w:p><w:pPr><w:jc w:val="center"/></w:pPr><w:r><w:rPr><w:rFonts w:ascii="Times New Roman" w:hAnsi="Times New Roman" w:eastAsia="Times New Roman" w:cs="Times New Roman"/><w:sz w:val="19"/><w:szCs w:val="19"/></w:rPr><w:t xml:space="preserve">1</w:t></w:r></w:p></w:tc><w:tc><w:tcPr><w:tcW w:w="1100" w:type="dxa"/><w:noWrap/></w:tcPr><w:p><w:pPr><w:jc w:val="center"/></w:pPr><w:r><w:rPr><w:rFonts w:ascii="Times New Roman" w:hAnsi="Times New Roman" w:eastAsia="Times New Roman" w:cs="Times New Roman"/><w:sz w:val="19"/><w:szCs w:val="19"/></w:rPr><w:t xml:space="preserve">Default 0</w:t></w:r></w:p></w:tc></w:tr><w:tr><w:trPr/><w:tc><w:tcPr><w:tcW w:w="500" w:type="dxa"/><w:noWrap/></w:tcPr><w:p><w:pPr><w:jc w:val="center"/></w:pPr><w:r><w:rPr><w:rFonts w:ascii="Times New Roman" w:hAnsi="Times New Roman" w:eastAsia="Times New Roman" w:cs="Times New Roman"/><w:sz w:val="19"/><w:szCs w:val="19"/></w:rPr><w:t xml:space="preserve">13</w:t></w:r></w:p></w:tc><w:tc><w:tcPr><w:tcW w:w="2200" w:type="dxa"/><w:noWrap/></w:tcPr><w:p><w:pPr><w:jc w:val="start"/></w:pPr><w:r><w:rPr><w:rFonts w:ascii="Times New Roman" w:hAnsi="Times New Roman" w:eastAsia="Times New Roman" w:cs="Times New Roman"/><w:sz w:val="19"/><w:szCs w:val="19"/><w:b w:val="1"/><w:bCs w:val="1"/></w:rPr><w:t xml:space="preserve">signature_code</w:t></w:r></w:p></w:tc><w:tc><w:tcPr><w:tcW w:w="3000" w:type="dxa"/><w:noWrap/></w:tcPr><w:p><w:pPr><w:jc w:val="start"/></w:pPr><w:r><w:rPr><w:rFonts w:ascii="Times New Roman" w:hAnsi="Times New Roman" w:eastAsia="Times New Roman" w:cs="Times New Roman"/><w:sz w:val="19"/><w:szCs w:val="19"/></w:rPr><w:t xml:space="preserve">Kode Registrasi TTE (TTE-TRISULA-...)</w:t></w:r></w:p></w:tc><w:tc><w:tcPr><w:tcW w:w="1300" w:type="dxa"/><w:noWrap/></w:tcPr><w:p><w:pPr><w:jc w:val="center"/></w:pPr><w:r><w:rPr><w:rFonts w:ascii="Times New Roman" w:hAnsi="Times New Roman" w:eastAsia="Times New Roman" w:cs="Times New Roman"/><w:sz w:val="19"/><w:szCs w:val="19"/></w:rPr><w:t xml:space="preserve">VARCHAR</w:t></w:r></w:p></w:tc><w:tc><w:tcPr><w:tcW w:w="1100" w:type="dxa"/><w:noWrap/></w:tcPr><w:p><w:pPr><w:jc w:val="center"/></w:pPr><w:r><w:rPr><w:rFonts w:ascii="Times New Roman" w:hAnsi="Times New Roman" w:eastAsia="Times New Roman" w:cs="Times New Roman"/><w:sz w:val="19"/><w:szCs w:val="19"/></w:rPr><w:t xml:space="preserve">60</w:t></w:r></w:p></w:tc><w:tc><w:tcPr><w:tcW w:w="1100" w:type="dxa"/><w:noWrap/></w:tcPr><w:p><w:pPr><w:jc w:val="center"/></w:pPr><w:r><w:rPr><w:rFonts w:ascii="Times New Roman" w:hAnsi="Times New Roman" w:eastAsia="Times New Roman" w:cs="Times New Roman"/><w:sz w:val="19"/><w:szCs w:val="19"/></w:rPr><w:t xml:space="preserve">INDEX</w:t></w:r></w:p></w:tc></w:tr><w:tr><w:trPr/><w:tc><w:tcPr><w:tcW w:w="500" w:type="dxa"/><w:noWrap/></w:tcPr><w:p><w:pPr><w:jc w:val="center"/></w:pPr><w:r><w:rPr><w:rFonts w:ascii="Times New Roman" w:hAnsi="Times New Roman" w:eastAsia="Times New Roman" w:cs="Times New Roman"/><w:sz w:val="19"/><w:szCs w:val="19"/></w:rPr><w:t xml:space="preserve">14</w:t></w:r></w:p></w:tc><w:tc><w:tcPr><w:tcW w:w="2200" w:type="dxa"/><w:noWrap/></w:tcPr><w:p><w:pPr><w:jc w:val="start"/></w:pPr><w:r><w:rPr><w:rFonts w:ascii="Times New Roman" w:hAnsi="Times New Roman" w:eastAsia="Times New Roman" w:cs="Times New Roman"/><w:sz w:val="19"/><w:szCs w:val="19"/><w:b w:val="1"/><w:bCs w:val="1"/></w:rPr><w:t xml:space="preserve">signature_hash</w:t></w:r></w:p></w:tc><w:tc><w:tcPr><w:tcW w:w="3000" w:type="dxa"/><w:noWrap/></w:tcPr><w:p><w:pPr><w:jc w:val="start"/></w:pPr><w:r><w:rPr><w:rFonts w:ascii="Times New Roman" w:hAnsi="Times New Roman" w:eastAsia="Times New Roman" w:cs="Times New Roman"/><w:sz w:val="19"/><w:szCs w:val="19"/></w:rPr><w:t xml:space="preserve">Enkripsi Hash SHA-256 Integritas Berkas</w:t></w:r></w:p></w:tc><w:tc><w:tcPr><w:tcW w:w="1300" w:type="dxa"/><w:noWrap/></w:tcPr><w:p><w:pPr><w:jc w:val="center"/></w:pPr><w:r><w:rPr><w:rFonts w:ascii="Times New Roman" w:hAnsi="Times New Roman" w:eastAsia="Times New Roman" w:cs="Times New Roman"/><w:sz w:val="19"/><w:szCs w:val="19"/></w:rPr><w:t xml:space="preserve">VARCHAR</w:t></w:r></w:p></w:tc><w:tc><w:tcPr><w:tcW w:w="1100" w:type="dxa"/><w:noWrap/></w:tcPr><w:p><w:pPr><w:jc w:val="center"/></w:pPr><w:r><w:rPr><w:rFonts w:ascii="Times New Roman" w:hAnsi="Times New Roman" w:eastAsia="Times New Roman" w:cs="Times New Roman"/><w:sz w:val="19"/><w:szCs w:val="19"/></w:rPr><w:t xml:space="preserve">64</w:t></w:r></w:p></w:tc><w:tc><w:tcPr><w:tcW w:w="1100" w:type="dxa"/><w:noWrap/></w:tcPr><w:p><w:pPr><w:jc w:val="center"/></w:pPr><w:r><w:rPr><w:rFonts w:ascii="Times New Roman" w:hAnsi="Times New Roman" w:eastAsia="Times New Roman" w:cs="Times New Roman"/><w:sz w:val="19"/><w:szCs w:val="19"/></w:rPr><w:t xml:space="preserve">Nullable</w:t></w:r></w:p></w:tc></w:tr><w:tr><w:trPr/><w:tc><w:tcPr><w:tcW w:w="500" w:type="dxa"/><w:noWrap/></w:tcPr><w:p><w:pPr><w:jc w:val="center"/></w:pPr><w:r><w:rPr><w:rFonts w:ascii="Times New Roman" w:hAnsi="Times New Roman" w:eastAsia="Times New Roman" w:cs="Times New Roman"/><w:sz w:val="19"/><w:szCs w:val="19"/></w:rPr><w:t xml:space="preserve">15</w:t></w:r></w:p></w:tc><w:tc><w:tcPr><w:tcW w:w="2200" w:type="dxa"/><w:noWrap/></w:tcPr><w:p><w:pPr><w:jc w:val="start"/></w:pPr><w:r><w:rPr><w:rFonts w:ascii="Times New Roman" w:hAnsi="Times New Roman" w:eastAsia="Times New Roman" w:cs="Times New Roman"/><w:sz w:val="19"/><w:szCs w:val="19"/><w:b w:val="1"/><w:bCs w:val="1"/></w:rPr><w:t xml:space="preserve">uploaded_by</w:t></w:r></w:p></w:tc><w:tc><w:tcPr><w:tcW w:w="3000" w:type="dxa"/><w:noWrap/></w:tcPr><w:p><w:pPr><w:jc w:val="start"/></w:pPr><w:r><w:rPr><w:rFonts w:ascii="Times New Roman" w:hAnsi="Times New Roman" w:eastAsia="Times New Roman" w:cs="Times New Roman"/><w:sz w:val="19"/><w:szCs w:val="19"/></w:rPr><w:t xml:space="preserve">Relasi ke Akun Pengunggah Berkas</w:t></w:r></w:p></w:tc><w:tc><w:tcPr><w:tcW w:w="1300" w:type="dxa"/><w:noWrap/></w:tcPr><w:p><w:pPr><w:jc w:val="center"/></w:pPr><w:r><w:rPr><w:rFonts w:ascii="Times New Roman" w:hAnsi="Times New Roman" w:eastAsia="Times New Roman" w:cs="Times New Roman"/><w:sz w:val="19"/><w:szCs w:val="19"/></w:rPr><w:t xml:space="preserve">INT</w:t></w:r></w:p></w:tc><w:tc><w:tcPr><w:tcW w:w="1100" w:type="dxa"/><w:noWrap/></w:tcPr><w:p><w:pPr><w:jc w:val="center"/></w:pPr><w:r><w:rPr><w:rFonts w:ascii="Times New Roman" w:hAnsi="Times New Roman" w:eastAsia="Times New Roman" w:cs="Times New Roman"/><w:sz w:val="19"/><w:szCs w:val="19"/></w:rPr><w:t xml:space="preserve">11</w:t></w:r></w:p></w:tc><w:tc><w:tcPr><w:tcW w:w="1100" w:type="dxa"/><w:noWrap/></w:tcPr><w:p><w:pPr><w:jc w:val="center"/></w:pPr><w:r><w:rPr><w:rFonts w:ascii="Times New Roman" w:hAnsi="Times New Roman" w:eastAsia="Times New Roman" w:cs="Times New Roman"/><w:sz w:val="19"/><w:szCs w:val="19"/></w:rPr><w:t xml:space="preserve">FK, Nullable</w:t></w:r></w:p></w:tc></w:tr><w:tr><w:trPr/><w:tc><w:tcPr><w:tcW w:w="500" w:type="dxa"/><w:noWrap/></w:tcPr><w:p><w:pPr><w:jc w:val="center"/></w:pPr><w:r><w:rPr><w:rFonts w:ascii="Times New Roman" w:hAnsi="Times New Roman" w:eastAsia="Times New Roman" w:cs="Times New Roman"/><w:sz w:val="19"/><w:szCs w:val="19"/></w:rPr><w:t xml:space="preserve">16</w:t></w:r></w:p></w:tc><w:tc><w:tcPr><w:tcW w:w="2200" w:type="dxa"/><w:noWrap/></w:tcPr><w:p><w:pPr><w:jc w:val="start"/></w:pPr><w:r><w:rPr><w:rFonts w:ascii="Times New Roman" w:hAnsi="Times New Roman" w:eastAsia="Times New Roman" w:cs="Times New Roman"/><w:sz w:val="19"/><w:szCs w:val="19"/><w:b w:val="1"/><w:bCs w:val="1"/></w:rPr><w:t xml:space="preserve">uploaded_at</w:t></w:r></w:p></w:tc><w:tc><w:tcPr><w:tcW w:w="3000" w:type="dxa"/><w:noWrap/></w:tcPr><w:p><w:pPr><w:jc w:val="start"/></w:pPr><w:r><w:rPr><w:rFonts w:ascii="Times New Roman" w:hAnsi="Times New Roman" w:eastAsia="Times New Roman" w:cs="Times New Roman"/><w:sz w:val="19"/><w:szCs w:val="19"/></w:rPr><w:t xml:space="preserve">Waktu Berkas Diunggah</w:t></w:r></w:p></w:tc><w:tc><w:tcPr><w:tcW w:w="1300" w:type="dxa"/><w:noWrap/></w:tcPr><w:p><w:pPr><w:jc w:val="center"/></w:pPr><w:r><w:rPr><w:rFonts w:ascii="Times New Roman" w:hAnsi="Times New Roman" w:eastAsia="Times New Roman" w:cs="Times New Roman"/><w:sz w:val="19"/><w:szCs w:val="19"/></w:rPr><w:t xml:space="preserve">TIMESTAMP</w:t></w:r></w:p></w:tc><w:tc><w:tcPr><w:tcW w:w="1100" w:type="dxa"/><w:noWrap/></w:tcPr><w:p><w:pPr><w:jc w:val="center"/></w:pPr><w:r><w:rPr><w:rFonts w:ascii="Times New Roman" w:hAnsi="Times New Roman" w:eastAsia="Times New Roman" w:cs="Times New Roman"/><w:sz w:val="19"/><w:szCs w:val="19"/></w:rPr><w:t xml:space="preserve">19</w:t></w:r></w:p></w:tc><w:tc><w:tcPr><w:tcW w:w="1100" w:type="dxa"/><w:noWrap/></w:tcPr><w:p><w:pPr><w:jc w:val="center"/></w:pPr><w:r><w:rPr><w:rFonts w:ascii="Times New Roman" w:hAnsi="Times New Roman" w:eastAsia="Times New Roman" w:cs="Times New Roman"/><w:sz w:val="19"/><w:szCs w:val="19"/></w:rPr><w:t xml:space="preserve">Auto Stamp</w:t></w:r></w:p></w:tc></w:tr><w:tr><w:trPr/><w:tc><w:tcPr><w:tcW w:w="500" w:type="dxa"/><w:noWrap/></w:tcPr><w:p><w:pPr><w:jc w:val="center"/></w:pPr><w:r><w:rPr><w:rFonts w:ascii="Times New Roman" w:hAnsi="Times New Roman" w:eastAsia="Times New Roman" w:cs="Times New Roman"/><w:sz w:val="19"/><w:szCs w:val="19"/></w:rPr><w:t xml:space="preserve">17</w:t></w:r></w:p></w:tc><w:tc><w:tcPr><w:tcW w:w="2200" w:type="dxa"/><w:noWrap/></w:tcPr><w:p><w:pPr><w:jc w:val="start"/></w:pPr><w:r><w:rPr><w:rFonts w:ascii="Times New Roman" w:hAnsi="Times New Roman" w:eastAsia="Times New Roman" w:cs="Times New Roman"/><w:sz w:val="19"/><w:szCs w:val="19"/><w:b w:val="1"/><w:bCs w:val="1"/></w:rPr><w:t xml:space="preserve">verified_by</w:t></w:r></w:p></w:tc><w:tc><w:tcPr><w:tcW w:w="3000" w:type="dxa"/><w:noWrap/></w:tcPr><w:p><w:pPr><w:jc w:val="start"/></w:pPr><w:r><w:rPr><w:rFonts w:ascii="Times New Roman" w:hAnsi="Times New Roman" w:eastAsia="Times New Roman" w:cs="Times New Roman"/><w:sz w:val="19"/><w:szCs w:val="19"/></w:rPr><w:t xml:space="preserve">Relasi ke Akun Verifikator TTE</w:t></w:r></w:p></w:tc><w:tc><w:tcPr><w:tcW w:w="1300" w:type="dxa"/><w:noWrap/></w:tcPr><w:p><w:pPr><w:jc w:val="center"/></w:pPr><w:r><w:rPr><w:rFonts w:ascii="Times New Roman" w:hAnsi="Times New Roman" w:eastAsia="Times New Roman" w:cs="Times New Roman"/><w:sz w:val="19"/><w:szCs w:val="19"/></w:rPr><w:t xml:space="preserve">INT</w:t></w:r></w:p></w:tc><w:tc><w:tcPr><w:tcW w:w="1100" w:type="dxa"/><w:noWrap/></w:tcPr><w:p><w:pPr><w:jc w:val="center"/></w:pPr><w:r><w:rPr><w:rFonts w:ascii="Times New Roman" w:hAnsi="Times New Roman" w:eastAsia="Times New Roman" w:cs="Times New Roman"/><w:sz w:val="19"/><w:szCs w:val="19"/></w:rPr><w:t xml:space="preserve">11</w:t></w:r></w:p></w:tc><w:tc><w:tcPr><w:tcW w:w="1100" w:type="dxa"/><w:noWrap/></w:tcPr><w:p><w:pPr><w:jc w:val="center"/></w:pPr><w:r><w:rPr><w:rFonts w:ascii="Times New Roman" w:hAnsi="Times New Roman" w:eastAsia="Times New Roman" w:cs="Times New Roman"/><w:sz w:val="19"/><w:szCs w:val="19"/></w:rPr><w:t xml:space="preserve">FK, Nullable</w:t></w:r></w:p></w:tc></w:tr><w:tr><w:trPr/><w:tc><w:tcPr><w:tcW w:w="500" w:type="dxa"/><w:noWrap/></w:tcPr><w:p><w:pPr><w:jc w:val="center"/></w:pPr><w:r><w:rPr><w:rFonts w:ascii="Times New Roman" w:hAnsi="Times New Roman" w:eastAsia="Times New Roman" w:cs="Times New Roman"/><w:sz w:val="19"/><w:szCs w:val="19"/></w:rPr><w:t xml:space="preserve">18</w:t></w:r></w:p></w:tc><w:tc><w:tcPr><w:tcW w:w="2200" w:type="dxa"/><w:noWrap/></w:tcPr><w:p><w:pPr><w:jc w:val="start"/></w:pPr><w:r><w:rPr><w:rFonts w:ascii="Times New Roman" w:hAnsi="Times New Roman" w:eastAsia="Times New Roman" w:cs="Times New Roman"/><w:sz w:val="19"/><w:szCs w:val="19"/><w:b w:val="1"/><w:bCs w:val="1"/></w:rPr><w:t xml:space="preserve">verified_at</w:t></w:r></w:p></w:tc><w:tc><w:tcPr><w:tcW w:w="3000" w:type="dxa"/><w:noWrap/></w:tcPr><w:p><w:pPr><w:jc w:val="start"/></w:pPr><w:r><w:rPr><w:rFonts w:ascii="Times New Roman" w:hAnsi="Times New Roman" w:eastAsia="Times New Roman" w:cs="Times New Roman"/><w:sz w:val="19"/><w:szCs w:val="19"/></w:rPr><w:t xml:space="preserve">Waktu Pengesahan TTE Resmi</w:t></w:r></w:p></w:tc><w:tc><w:tcPr><w:tcW w:w="1300" w:type="dxa"/><w:noWrap/></w:tcPr><w:p><w:pPr><w:jc w:val="center"/></w:pPr><w:r><w:rPr><w:rFonts w:ascii="Times New Roman" w:hAnsi="Times New Roman" w:eastAsia="Times New Roman" w:cs="Times New Roman"/><w:sz w:val="19"/><w:szCs w:val="19"/></w:rPr><w:t xml:space="preserve">DATETIME</w:t></w:r></w:p></w:tc><w:tc><w:tcPr><w:tcW w:w="1100" w:type="dxa"/><w:noWrap/></w:tcPr><w:p><w:pPr><w:jc w:val="center"/></w:pPr><w:r><w:rPr><w:rFonts w:ascii="Times New Roman" w:hAnsi="Times New Roman" w:eastAsia="Times New Roman" w:cs="Times New Roman"/><w:sz w:val="19"/><w:szCs w:val="19"/></w:rPr><w:t xml:space="preserve">19</w:t></w:r></w:p></w:tc><w:tc><w:tcPr><w:tcW w:w="1100" w:type="dxa"/><w:noWrap/></w:tcPr><w:p><w:pPr><w:jc w:val="center"/></w:pPr><w:r><w:rPr><w:rFonts w:ascii="Times New Roman" w:hAnsi="Times New Roman" w:eastAsia="Times New Roman" w:cs="Times New Roman"/><w:sz w:val="19"/><w:szCs w:val="19"/></w:rPr><w:t xml:space="preserve">Nullable</w:t></w:r></w:p></w:tc></w:tr></w:tbl><w:p/><w:p><w:pPr><w:spacing w:after="40"/></w:pPr><w:r><w:rPr><w:rFonts w:ascii="Times New Roman" w:hAnsi="Times New Roman" w:eastAsia="Times New Roman" w:cs="Times New Roman"/><w:sz w:val="22"/><w:szCs w:val="22"/><w:b w:val="1"/><w:bCs w:val="1"/></w:rPr><w:t xml:space="preserve">e.   Struktur File / Tabel: SETTINGS (Parameter Operasional & Brand Aplikasi)</w:t></w:r></w:p><w:tbl><w:tblGrid><w:gridCol w:w="500" w:type="dxa"/><w:gridCol w:w="2200" w:type="dxa"/><w:gridCol w:w="3000" w:type="dxa"/><w:gridCol w:w="1300" w:type="dxa"/><w:gridCol w:w="1100" w:type="dxa"/><w:gridCol w:w="1100" w:type="dxa"/></w:tblGrid><w:tblPr><w:tblStyle w:val="MilitaryTable"/></w:tblPr><w:tr><w:trPr/><w:tc><w:tcPr><w:tcW w:w="500" w:type="dxa"/><w:shd w:val="clear" w:fill="EAEAEA"/><w:noWrap/></w:tcPr><w:p><w:pPr><w:jc w:val="center"/></w:pPr><w:r><w:rPr><w:rFonts w:ascii="Times New Roman" w:hAnsi="Times New Roman" w:eastAsia="Times New Roman" w:cs="Times New Roman"/><w:sz w:val="20"/><w:szCs w:val="20"/><w:b w:val="1"/><w:bCs w:val="1"/></w:rPr><w:t xml:space="preserve">No</w:t></w:r></w:p></w:tc><w:tc><w:tcPr><w:tcW w:w="2200" w:type="dxa"/><w:shd w:val="clear" w:fill="EAEAEA"/><w:noWrap/></w:tcPr><w:p><w:pPr><w:jc w:val="center"/></w:pPr><w:r><w:rPr><w:rFonts w:ascii="Times New Roman" w:hAnsi="Times New Roman" w:eastAsia="Times New Roman" w:cs="Times New Roman"/><w:sz w:val="20"/><w:szCs w:val="20"/><w:b w:val="1"/><w:bCs w:val="1"/></w:rPr><w:t xml:space="preserve">Nama Field</w:t></w:r></w:p></w:tc><w:tc><w:tcPr><w:tcW w:w="3000" w:type="dxa"/><w:shd w:val="clear" w:fill="EAEAEA"/><w:noWrap/></w:tcPr><w:p><w:pPr><w:jc w:val="center"/></w:pPr><w:r><w:rPr><w:rFonts w:ascii="Times New Roman" w:hAnsi="Times New Roman" w:eastAsia="Times New Roman" w:cs="Times New Roman"/><w:sz w:val="20"/><w:szCs w:val="20"/><w:b w:val="1"/><w:bCs w:val="1"/></w:rPr><w:t xml:space="preserve">Uraian / Sebutan</w:t></w:r></w:p></w:tc><w:tc><w:tcPr><w:tcW w:w="1300" w:type="dxa"/><w:shd w:val="clear" w:fill="EAEAEA"/><w:noWrap/></w:tcPr><w:p><w:pPr><w:jc w:val="center"/></w:pPr><w:r><w:rPr><w:rFonts w:ascii="Times New Roman" w:hAnsi="Times New Roman" w:eastAsia="Times New Roman" w:cs="Times New Roman"/><w:sz w:val="20"/><w:szCs w:val="20"/><w:b w:val="1"/><w:bCs w:val="1"/></w:rPr><w:t xml:space="preserve">Type</w:t></w:r></w:p></w:tc><w:tc><w:tcPr><w:tcW w:w="1100" w:type="dxa"/><w:shd w:val="clear" w:fill="EAEAEA"/><w:noWrap/></w:tcPr><w:p><w:pPr><w:jc w:val="center"/></w:pPr><w:r><w:rPr><w:rFonts w:ascii="Times New Roman" w:hAnsi="Times New Roman" w:eastAsia="Times New Roman" w:cs="Times New Roman"/><w:sz w:val="20"/><w:szCs w:val="20"/><w:b w:val="1"/><w:bCs w:val="1"/></w:rPr><w:t xml:space="preserve">Lebar</w:t></w:r></w:p></w:tc><w:tc><w:tcPr><w:tcW w:w="1100" w:type="dxa"/><w:shd w:val="clear" w:fill="EAEAEA"/><w:noWrap/></w:tcPr><w:p><w:pPr><w:jc w:val="center"/></w:pPr><w:r><w:rPr><w:rFonts w:ascii="Times New Roman" w:hAnsi="Times New Roman" w:eastAsia="Times New Roman" w:cs="Times New Roman"/><w:sz w:val="20"/><w:szCs w:val="20"/><w:b w:val="1"/><w:bCs w:val="1"/></w:rPr><w:t xml:space="preserve">Ket</w:t></w:r></w:p></w:tc></w:tr><w:tr><w:trPr/><w:tc><w:tcPr><w:tcW w:w="500" w:type="dxa"/><w:noWrap/></w:tcPr><w:p><w:pPr><w:jc w:val="center"/></w:pPr><w:r><w:rPr><w:rFonts w:ascii="Times New Roman" w:hAnsi="Times New Roman" w:eastAsia="Times New Roman" w:cs="Times New Roman"/><w:sz w:val="19"/><w:szCs w:val="19"/></w:rPr><w:t xml:space="preserve">1</w:t></w:r></w:p></w:tc><w:tc><w:tcPr><w:tcW w:w="2200" w:type="dxa"/><w:noWrap/></w:tcPr><w:p><w:pPr><w:jc w:val="start"/></w:pPr><w:r><w:rPr><w:rFonts w:ascii="Times New Roman" w:hAnsi="Times New Roman" w:eastAsia="Times New Roman" w:cs="Times New Roman"/><w:sz w:val="19"/><w:szCs w:val="19"/><w:b w:val="1"/><w:bCs w:val="1"/></w:rPr><w:t xml:space="preserve">setting_key</w:t></w:r></w:p></w:tc><w:tc><w:tcPr><w:tcW w:w="3000" w:type="dxa"/><w:noWrap/></w:tcPr><w:p><w:pPr><w:jc w:val="start"/></w:pPr><w:r><w:rPr><w:rFonts w:ascii="Times New Roman" w:hAnsi="Times New Roman" w:eastAsia="Times New Roman" w:cs="Times New Roman"/><w:sz w:val="19"/><w:szCs w:val="19"/></w:rPr><w:t xml:space="preserve">Kata Kunci Pengaturan Parameter</w:t></w:r></w:p></w:tc><w:tc><w:tcPr><w:tcW w:w="1300" w:type="dxa"/><w:noWrap/></w:tcPr><w:p><w:pPr><w:jc w:val="center"/></w:pPr><w:r><w:rPr><w:rFonts w:ascii="Times New Roman" w:hAnsi="Times New Roman" w:eastAsia="Times New Roman" w:cs="Times New Roman"/><w:sz w:val="19"/><w:szCs w:val="19"/></w:rPr><w:t xml:space="preserve">VARCHAR</w:t></w:r></w:p></w:tc><w:tc><w:tcPr><w:tcW w:w="1100" w:type="dxa"/><w:noWrap/></w:tcPr><w:p><w:pPr><w:jc w:val="center"/></w:pPr><w:r><w:rPr><w:rFonts w:ascii="Times New Roman" w:hAnsi="Times New Roman" w:eastAsia="Times New Roman" w:cs="Times New Roman"/><w:sz w:val="19"/><w:szCs w:val="19"/></w:rPr><w:t xml:space="preserve">50</w:t></w:r></w:p></w:tc><w:tc><w:tcPr><w:tcW w:w="1100" w:type="dxa"/><w:noWrap/></w:tcPr><w:p><w:pPr><w:jc w:val="center"/></w:pPr><w:r><w:rPr><w:rFonts w:ascii="Times New Roman" w:hAnsi="Times New Roman" w:eastAsia="Times New Roman" w:cs="Times New Roman"/><w:sz w:val="19"/><w:szCs w:val="19"/></w:rPr><w:t xml:space="preserve">PK</w:t></w:r></w:p></w:tc></w:tr><w:tr><w:trPr/><w:tc><w:tcPr><w:tcW w:w="500" w:type="dxa"/><w:noWrap/></w:tcPr><w:p><w:pPr><w:jc w:val="center"/></w:pPr><w:r><w:rPr><w:rFonts w:ascii="Times New Roman" w:hAnsi="Times New Roman" w:eastAsia="Times New Roman" w:cs="Times New Roman"/><w:sz w:val="19"/><w:szCs w:val="19"/></w:rPr><w:t xml:space="preserve">2</w:t></w:r></w:p></w:tc><w:tc><w:tcPr><w:tcW w:w="2200" w:type="dxa"/><w:noWrap/></w:tcPr><w:p><w:pPr><w:jc w:val="start"/></w:pPr><w:r><w:rPr><w:rFonts w:ascii="Times New Roman" w:hAnsi="Times New Roman" w:eastAsia="Times New Roman" w:cs="Times New Roman"/><w:sz w:val="19"/><w:szCs w:val="19"/><w:b w:val="1"/><w:bCs w:val="1"/></w:rPr><w:t xml:space="preserve">setting_value</w:t></w:r></w:p></w:tc><w:tc><w:tcPr><w:tcW w:w="3000" w:type="dxa"/><w:noWrap/></w:tcPr><w:p><w:pPr><w:jc w:val="start"/></w:pPr><w:r><w:rPr><w:rFonts w:ascii="Times New Roman" w:hAnsi="Times New Roman" w:eastAsia="Times New Roman" w:cs="Times New Roman"/><w:sz w:val="19"/><w:szCs w:val="19"/></w:rPr><w:t xml:space="preserve">Nilai Parameter Pengaturan</w:t></w:r></w:p></w:tc><w:tc><w:tcPr><w:tcW w:w="1300" w:type="dxa"/><w:noWrap/></w:tcPr><w:p><w:pPr><w:jc w:val="center"/></w:pPr><w:r><w:rPr><w:rFonts w:ascii="Times New Roman" w:hAnsi="Times New Roman" w:eastAsia="Times New Roman" w:cs="Times New Roman"/><w:sz w:val="19"/><w:szCs w:val="19"/></w:rPr><w:t xml:space="preserve">TEXT</w:t></w:r></w:p></w:tc><w:tc><w:tcPr><w:tcW w:w="1100" w:type="dxa"/><w:noWrap/></w:tcPr><w:p><w:pPr><w:jc w:val="center"/></w:pPr><w:r><w:rPr><w:rFonts w:ascii="Times New Roman" w:hAnsi="Times New Roman" w:eastAsia="Times New Roman" w:cs="Times New Roman"/><w:sz w:val="19"/><w:szCs w:val="19"/></w:rPr><w:t xml:space="preserve">-</w:t></w:r></w:p></w:tc><w:tc><w:tcPr><w:tcW w:w="1100" w:type="dxa"/><w:noWrap/></w:tcPr><w:p><w:pPr><w:jc w:val="center"/></w:pPr><w:r><w:rPr><w:rFonts w:ascii="Times New Roman" w:hAnsi="Times New Roman" w:eastAsia="Times New Roman" w:cs="Times New Roman"/><w:sz w:val="19"/><w:szCs w:val="19"/></w:rPr><w:t xml:space="preserve">Nullable</w:t></w:r></w:p></w:tc></w:tr><w:tr><w:trPr/><w:tc><w:tcPr><w:tcW w:w="500" w:type="dxa"/><w:noWrap/></w:tcPr><w:p><w:pPr><w:jc w:val="center"/></w:pPr><w:r><w:rPr><w:rFonts w:ascii="Times New Roman" w:hAnsi="Times New Roman" w:eastAsia="Times New Roman" w:cs="Times New Roman"/><w:sz w:val="19"/><w:szCs w:val="19"/></w:rPr><w:t xml:space="preserve">3</w:t></w:r></w:p></w:tc><w:tc><w:tcPr><w:tcW w:w="2200" w:type="dxa"/><w:noWrap/></w:tcPr><w:p><w:pPr><w:jc w:val="start"/></w:pPr><w:r><w:rPr><w:rFonts w:ascii="Times New Roman" w:hAnsi="Times New Roman" w:eastAsia="Times New Roman" w:cs="Times New Roman"/><w:sz w:val="19"/><w:szCs w:val="19"/><w:b w:val="1"/><w:bCs w:val="1"/></w:rPr><w:t xml:space="preserve">setting_group</w:t></w:r></w:p></w:tc><w:tc><w:tcPr><w:tcW w:w="3000" w:type="dxa"/><w:noWrap/></w:tcPr><w:p><w:pPr><w:jc w:val="start"/></w:pPr><w:r><w:rPr><w:rFonts w:ascii="Times New Roman" w:hAnsi="Times New Roman" w:eastAsia="Times New Roman" w:cs="Times New Roman"/><w:sz w:val="19"/><w:szCs w:val="19"/></w:rPr><w:t xml:space="preserve">Kelompok Setting (general / dosir)</w:t></w:r></w:p></w:tc><w:tc><w:tcPr><w:tcW w:w="1300" w:type="dxa"/><w:noWrap/></w:tcPr><w:p><w:pPr><w:jc w:val="center"/></w:pPr><w:r><w:rPr><w:rFonts w:ascii="Times New Roman" w:hAnsi="Times New Roman" w:eastAsia="Times New Roman" w:cs="Times New Roman"/><w:sz w:val="19"/><w:szCs w:val="19"/></w:rPr><w:t xml:space="preserve">VARCHAR</w:t></w:r></w:p></w:tc><w:tc><w:tcPr><w:tcW w:w="1100" w:type="dxa"/><w:noWrap/></w:tcPr><w:p><w:pPr><w:jc w:val="center"/></w:pPr><w:r><w:rPr><w:rFonts w:ascii="Times New Roman" w:hAnsi="Times New Roman" w:eastAsia="Times New Roman" w:cs="Times New Roman"/><w:sz w:val="19"/><w:szCs w:val="19"/></w:rPr><w:t xml:space="preserve">50</w:t></w:r></w:p></w:tc><w:tc><w:tcPr><w:tcW w:w="1100" w:type="dxa"/><w:noWrap/></w:tcPr><w:p><w:pPr><w:jc w:val="center"/></w:pPr><w:r><w:rPr><w:rFonts w:ascii="Times New Roman" w:hAnsi="Times New Roman" w:eastAsia="Times New Roman" w:cs="Times New Roman"/><w:sz w:val="19"/><w:szCs w:val="19"/></w:rPr><w:t xml:space="preserve">Default general</w:t></w:r></w:p></w:tc></w:tr><w:tr><w:trPr/><w:tc><w:tcPr><w:tcW w:w="500" w:type="dxa"/><w:noWrap/></w:tcPr><w:p><w:pPr><w:jc w:val="center"/></w:pPr><w:r><w:rPr><w:rFonts w:ascii="Times New Roman" w:hAnsi="Times New Roman" w:eastAsia="Times New Roman" w:cs="Times New Roman"/><w:sz w:val="19"/><w:szCs w:val="19"/></w:rPr><w:t xml:space="preserve">4</w:t></w:r></w:p></w:tc><w:tc><w:tcPr><w:tcW w:w="2200" w:type="dxa"/><w:noWrap/></w:tcPr><w:p><w:pPr><w:jc w:val="start"/></w:pPr><w:r><w:rPr><w:rFonts w:ascii="Times New Roman" w:hAnsi="Times New Roman" w:eastAsia="Times New Roman" w:cs="Times New Roman"/><w:sz w:val="19"/><w:szCs w:val="19"/><w:b w:val="1"/><w:bCs w:val="1"/></w:rPr><w:t xml:space="preserve">updated_at</w:t></w:r></w:p></w:tc><w:tc><w:tcPr><w:tcW w:w="3000" w:type="dxa"/><w:noWrap/></w:tcPr><w:p><w:pPr><w:jc w:val="start"/></w:pPr><w:r><w:rPr><w:rFonts w:ascii="Times New Roman" w:hAnsi="Times New Roman" w:eastAsia="Times New Roman" w:cs="Times New Roman"/><w:sz w:val="19"/><w:szCs w:val="19"/></w:rPr><w:t xml:space="preserve">Waktu Pembaruan Terakhir</w:t></w:r></w:p></w:tc><w:tc><w:tcPr><w:tcW w:w="1300" w:type="dxa"/><w:noWrap/></w:tcPr><w:p><w:pPr><w:jc w:val="center"/></w:pPr><w:r><w:rPr><w:rFonts w:ascii="Times New Roman" w:hAnsi="Times New Roman" w:eastAsia="Times New Roman" w:cs="Times New Roman"/><w:sz w:val="19"/><w:szCs w:val="19"/></w:rPr><w:t xml:space="preserve">TIMESTAMP</w:t></w:r></w:p></w:tc><w:tc><w:tcPr><w:tcW w:w="1100" w:type="dxa"/><w:noWrap/></w:tcPr><w:p><w:pPr><w:jc w:val="center"/></w:pPr><w:r><w:rPr><w:rFonts w:ascii="Times New Roman" w:hAnsi="Times New Roman" w:eastAsia="Times New Roman" w:cs="Times New Roman"/><w:sz w:val="19"/><w:szCs w:val="19"/></w:rPr><w:t xml:space="preserve">19</w:t></w:r></w:p></w:tc><w:tc><w:tcPr><w:tcW w:w="1100" w:type="dxa"/><w:noWrap/></w:tcPr><w:p><w:pPr><w:jc w:val="center"/></w:pPr><w:r><w:rPr><w:rFonts w:ascii="Times New Roman" w:hAnsi="Times New Roman" w:eastAsia="Times New Roman" w:cs="Times New Roman"/><w:sz w:val="19"/><w:szCs w:val="19"/></w:rPr><w:t xml:space="preserve">Auto Update</w:t></w:r></w:p></w:tc></w:tr></w:tbl><w:p/><w:p><w:pPr><w:spacing w:after="40"/></w:pPr><w:r><w:rPr><w:rFonts w:ascii="Times New Roman" w:hAnsi="Times New Roman" w:eastAsia="Times New Roman" w:cs="Times New Roman"/><w:sz w:val="22"/><w:szCs w:val="22"/><w:b w:val="1"/><w:bCs w:val="1"/></w:rPr><w:t xml:space="preserve">f.   Struktur File / Tabel: ACTIVITY_LOG (Jejak Rekam / Audit Trail Sistem)</w:t></w:r></w:p><w:tbl><w:tblGrid><w:gridCol w:w="500" w:type="dxa"/><w:gridCol w:w="2200" w:type="dxa"/><w:gridCol w:w="3000" w:type="dxa"/><w:gridCol w:w="1300" w:type="dxa"/><w:gridCol w:w="1100" w:type="dxa"/><w:gridCol w:w="1100" w:type="dxa"/></w:tblGrid><w:tblPr><w:tblStyle w:val="MilitaryTable"/></w:tblPr><w:tr><w:trPr/><w:tc><w:tcPr><w:tcW w:w="500" w:type="dxa"/><w:shd w:val="clear" w:fill="EAEAEA"/><w:noWrap/></w:tcPr><w:p><w:pPr><w:jc w:val="center"/></w:pPr><w:r><w:rPr><w:rFonts w:ascii="Times New Roman" w:hAnsi="Times New Roman" w:eastAsia="Times New Roman" w:cs="Times New Roman"/><w:sz w:val="20"/><w:szCs w:val="20"/><w:b w:val="1"/><w:bCs w:val="1"/></w:rPr><w:t xml:space="preserve">No</w:t></w:r></w:p></w:tc><w:tc><w:tcPr><w:tcW w:w="2200" w:type="dxa"/><w:shd w:val="clear" w:fill="EAEAEA"/><w:noWrap/></w:tcPr><w:p><w:pPr><w:jc w:val="center"/></w:pPr><w:r><w:rPr><w:rFonts w:ascii="Times New Roman" w:hAnsi="Times New Roman" w:eastAsia="Times New Roman" w:cs="Times New Roman"/><w:sz w:val="20"/><w:szCs w:val="20"/><w:b w:val="1"/><w:bCs w:val="1"/></w:rPr><w:t xml:space="preserve">Nama Field</w:t></w:r></w:p></w:tc><w:tc><w:tcPr><w:tcW w:w="3000" w:type="dxa"/><w:shd w:val="clear" w:fill="EAEAEA"/><w:noWrap/></w:tcPr><w:p><w:pPr><w:jc w:val="center"/></w:pPr><w:r><w:rPr><w:rFonts w:ascii="Times New Roman" w:hAnsi="Times New Roman" w:eastAsia="Times New Roman" w:cs="Times New Roman"/><w:sz w:val="20"/><w:szCs w:val="20"/><w:b w:val="1"/><w:bCs w:val="1"/></w:rPr><w:t xml:space="preserve">Uraian / Sebutan</w:t></w:r></w:p></w:tc><w:tc><w:tcPr><w:tcW w:w="1300" w:type="dxa"/><w:shd w:val="clear" w:fill="EAEAEA"/><w:noWrap/></w:tcPr><w:p><w:pPr><w:jc w:val="center"/></w:pPr><w:r><w:rPr><w:rFonts w:ascii="Times New Roman" w:hAnsi="Times New Roman" w:eastAsia="Times New Roman" w:cs="Times New Roman"/><w:sz w:val="20"/><w:szCs w:val="20"/><w:b w:val="1"/><w:bCs w:val="1"/></w:rPr><w:t xml:space="preserve">Type</w:t></w:r></w:p></w:tc><w:tc><w:tcPr><w:tcW w:w="1100" w:type="dxa"/><w:shd w:val="clear" w:fill="EAEAEA"/><w:noWrap/></w:tcPr><w:p><w:pPr><w:jc w:val="center"/></w:pPr><w:r><w:rPr><w:rFonts w:ascii="Times New Roman" w:hAnsi="Times New Roman" w:eastAsia="Times New Roman" w:cs="Times New Roman"/><w:sz w:val="20"/><w:szCs w:val="20"/><w:b w:val="1"/><w:bCs w:val="1"/></w:rPr><w:t xml:space="preserve">Lebar</w:t></w:r></w:p></w:tc><w:tc><w:tcPr><w:tcW w:w="1100" w:type="dxa"/><w:shd w:val="clear" w:fill="EAEAEA"/><w:noWrap/></w:tcPr><w:p><w:pPr><w:jc w:val="center"/></w:pPr><w:r><w:rPr><w:rFonts w:ascii="Times New Roman" w:hAnsi="Times New Roman" w:eastAsia="Times New Roman" w:cs="Times New Roman"/><w:sz w:val="20"/><w:szCs w:val="20"/><w:b w:val="1"/><w:bCs w:val="1"/></w:rPr><w:t xml:space="preserve">Ket</w:t></w:r></w:p></w:tc></w:tr><w:tr><w:trPr/><w:tc><w:tcPr><w:tcW w:w="500" w:type="dxa"/><w:noWrap/></w:tcPr><w:p><w:pPr><w:jc w:val="center"/></w:pPr><w:r><w:rPr><w:rFonts w:ascii="Times New Roman" w:hAnsi="Times New Roman" w:eastAsia="Times New Roman" w:cs="Times New Roman"/><w:sz w:val="19"/><w:szCs w:val="19"/></w:rPr><w:t xml:space="preserve">1</w:t></w:r></w:p></w:tc><w:tc><w:tcPr><w:tcW w:w="2200" w:type="dxa"/><w:noWrap/></w:tcPr><w:p><w:pPr><w:jc w:val="start"/></w:pPr><w:r><w:rPr><w:rFonts w:ascii="Times New Roman" w:hAnsi="Times New Roman" w:eastAsia="Times New Roman" w:cs="Times New Roman"/><w:sz w:val="19"/><w:szCs w:val="19"/><w:b w:val="1"/><w:bCs w:val="1"/></w:rPr><w:t xml:space="preserve">id</w:t></w:r></w:p></w:tc><w:tc><w:tcPr><w:tcW w:w="3000" w:type="dxa"/><w:noWrap/></w:tcPr><w:p><w:pPr><w:jc w:val="start"/></w:pPr><w:r><w:rPr><w:rFonts w:ascii="Times New Roman" w:hAnsi="Times New Roman" w:eastAsia="Times New Roman" w:cs="Times New Roman"/><w:sz w:val="19"/><w:szCs w:val="19"/></w:rPr><w:t xml:space="preserve">Nomor Unik Catatan Audit</w:t></w:r></w:p></w:tc><w:tc><w:tcPr><w:tcW w:w="1300" w:type="dxa"/><w:noWrap/></w:tcPr><w:p><w:pPr><w:jc w:val="center"/></w:pPr><w:r><w:rPr><w:rFonts w:ascii="Times New Roman" w:hAnsi="Times New Roman" w:eastAsia="Times New Roman" w:cs="Times New Roman"/><w:sz w:val="19"/><w:szCs w:val="19"/></w:rPr><w:t xml:space="preserve">INT</w:t></w:r></w:p></w:tc><w:tc><w:tcPr><w:tcW w:w="1100" w:type="dxa"/><w:noWrap/></w:tcPr><w:p><w:pPr><w:jc w:val="center"/></w:pPr><w:r><w:rPr><w:rFonts w:ascii="Times New Roman" w:hAnsi="Times New Roman" w:eastAsia="Times New Roman" w:cs="Times New Roman"/><w:sz w:val="19"/><w:szCs w:val="19"/></w:rPr><w:t xml:space="preserve">11</w:t></w:r></w:p></w:tc><w:tc><w:tcPr><w:tcW w:w="1100" w:type="dxa"/><w:noWrap/></w:tcPr><w:p><w:pPr><w:jc w:val="center"/></w:pPr><w:r><w:rPr><w:rFonts w:ascii="Times New Roman" w:hAnsi="Times New Roman" w:eastAsia="Times New Roman" w:cs="Times New Roman"/><w:sz w:val="19"/><w:szCs w:val="19"/></w:rPr><w:t xml:space="preserve">PK, Auto</w:t></w:r></w:p></w:tc></w:tr><w:tr><w:trPr/><w:tc><w:tcPr><w:tcW w:w="500" w:type="dxa"/><w:noWrap/></w:tcPr><w:p><w:pPr><w:jc w:val="center"/></w:pPr><w:r><w:rPr><w:rFonts w:ascii="Times New Roman" w:hAnsi="Times New Roman" w:eastAsia="Times New Roman" w:cs="Times New Roman"/><w:sz w:val="19"/><w:szCs w:val="19"/></w:rPr><w:t xml:space="preserve">2</w:t></w:r></w:p></w:tc><w:tc><w:tcPr><w:tcW w:w="2200" w:type="dxa"/><w:noWrap/></w:tcPr><w:p><w:pPr><w:jc w:val="start"/></w:pPr><w:r><w:rPr><w:rFonts w:ascii="Times New Roman" w:hAnsi="Times New Roman" w:eastAsia="Times New Roman" w:cs="Times New Roman"/><w:sz w:val="19"/><w:szCs w:val="19"/><w:b w:val="1"/><w:bCs w:val="1"/></w:rPr><w:t xml:space="preserve">user_id</w:t></w:r></w:p></w:tc><w:tc><w:tcPr><w:tcW w:w="3000" w:type="dxa"/><w:noWrap/></w:tcPr><w:p><w:pPr><w:jc w:val="start"/></w:pPr><w:r><w:rPr><w:rFonts w:ascii="Times New Roman" w:hAnsi="Times New Roman" w:eastAsia="Times New Roman" w:cs="Times New Roman"/><w:sz w:val="19"/><w:szCs w:val="19"/></w:rPr><w:t xml:space="preserve">Relasi ke Akun Pelaku Aksi</w:t></w:r></w:p></w:tc><w:tc><w:tcPr><w:tcW w:w="1300" w:type="dxa"/><w:noWrap/></w:tcPr><w:p><w:pPr><w:jc w:val="center"/></w:pPr><w:r><w:rPr><w:rFonts w:ascii="Times New Roman" w:hAnsi="Times New Roman" w:eastAsia="Times New Roman" w:cs="Times New Roman"/><w:sz w:val="19"/><w:szCs w:val="19"/></w:rPr><w:t xml:space="preserve">INT</w:t></w:r></w:p></w:tc><w:tc><w:tcPr><w:tcW w:w="1100" w:type="dxa"/><w:noWrap/></w:tcPr><w:p><w:pPr><w:jc w:val="center"/></w:pPr><w:r><w:rPr><w:rFonts w:ascii="Times New Roman" w:hAnsi="Times New Roman" w:eastAsia="Times New Roman" w:cs="Times New Roman"/><w:sz w:val="19"/><w:szCs w:val="19"/></w:rPr><w:t xml:space="preserve">11</w:t></w:r></w:p></w:tc><w:tc><w:tcPr><w:tcW w:w="1100" w:type="dxa"/><w:noWrap/></w:tcPr><w:p><w:pPr><w:jc w:val="center"/></w:pPr><w:r><w:rPr><w:rFonts w:ascii="Times New Roman" w:hAnsi="Times New Roman" w:eastAsia="Times New Roman" w:cs="Times New Roman"/><w:sz w:val="19"/><w:szCs w:val="19"/></w:rPr><w:t xml:space="preserve">FK, Nullable</w:t></w:r></w:p></w:tc></w:tr><w:tr><w:trPr/><w:tc><w:tcPr><w:tcW w:w="500" w:type="dxa"/><w:noWrap/></w:tcPr><w:p><w:pPr><w:jc w:val="center"/></w:pPr><w:r><w:rPr><w:rFonts w:ascii="Times New Roman" w:hAnsi="Times New Roman" w:eastAsia="Times New Roman" w:cs="Times New Roman"/><w:sz w:val="19"/><w:szCs w:val="19"/></w:rPr><w:t xml:space="preserve">3</w:t></w:r></w:p></w:tc><w:tc><w:tcPr><w:tcW w:w="2200" w:type="dxa"/><w:noWrap/></w:tcPr><w:p><w:pPr><w:jc w:val="start"/></w:pPr><w:r><w:rPr><w:rFonts w:ascii="Times New Roman" w:hAnsi="Times New Roman" w:eastAsia="Times New Roman" w:cs="Times New Roman"/><w:sz w:val="19"/><w:szCs w:val="19"/><w:b w:val="1"/><w:bCs w:val="1"/></w:rPr><w:t xml:space="preserve">aktivitas</w:t></w:r></w:p></w:tc><w:tc><w:tcPr><w:tcW w:w="3000" w:type="dxa"/><w:noWrap/></w:tcPr><w:p><w:pPr><w:jc w:val="start"/></w:pPr><w:r><w:rPr><w:rFonts w:ascii="Times New Roman" w:hAnsi="Times New Roman" w:eastAsia="Times New Roman" w:cs="Times New Roman"/><w:sz w:val="19"/><w:szCs w:val="19"/></w:rPr><w:t xml:space="preserve">Nama Tindakan (LOGIN, VERIFY, DLL)</w:t></w:r></w:p></w:tc><w:tc><w:tcPr><w:tcW w:w="1300" w:type="dxa"/><w:noWrap/></w:tcPr><w:p><w:pPr><w:jc w:val="center"/></w:pPr><w:r><w:rPr><w:rFonts w:ascii="Times New Roman" w:hAnsi="Times New Roman" w:eastAsia="Times New Roman" w:cs="Times New Roman"/><w:sz w:val="19"/><w:szCs w:val="19"/></w:rPr><w:t xml:space="preserve">VARCHAR</w:t></w:r></w:p></w:tc><w:tc><w:tcPr><w:tcW w:w="1100" w:type="dxa"/><w:noWrap/></w:tcPr><w:p><w:pPr><w:jc w:val="center"/></w:pPr><w:r><w:rPr><w:rFonts w:ascii="Times New Roman" w:hAnsi="Times New Roman" w:eastAsia="Times New Roman" w:cs="Times New Roman"/><w:sz w:val="19"/><w:szCs w:val="19"/></w:rPr><w:t xml:space="preserve">150</w:t></w:r></w:p></w:tc><w:tc><w:tcPr><w:tcW w:w="1100" w:type="dxa"/><w:noWrap/></w:tcPr><w:p><w:pPr><w:jc w:val="center"/></w:pPr><w:r><w:rPr><w:rFonts w:ascii="Times New Roman" w:hAnsi="Times New Roman" w:eastAsia="Times New Roman" w:cs="Times New Roman"/><w:sz w:val="19"/><w:szCs w:val="19"/></w:rPr><w:t xml:space="preserve">INDEX</w:t></w:r></w:p></w:tc></w:tr><w:tr><w:trPr/><w:tc><w:tcPr><w:tcW w:w="500" w:type="dxa"/><w:noWrap/></w:tcPr><w:p><w:pPr><w:jc w:val="center"/></w:pPr><w:r><w:rPr><w:rFonts w:ascii="Times New Roman" w:hAnsi="Times New Roman" w:eastAsia="Times New Roman" w:cs="Times New Roman"/><w:sz w:val="19"/><w:szCs w:val="19"/></w:rPr><w:t xml:space="preserve">4</w:t></w:r></w:p></w:tc><w:tc><w:tcPr><w:tcW w:w="2200" w:type="dxa"/><w:noWrap/></w:tcPr><w:p><w:pPr><w:jc w:val="start"/></w:pPr><w:r><w:rPr><w:rFonts w:ascii="Times New Roman" w:hAnsi="Times New Roman" w:eastAsia="Times New Roman" w:cs="Times New Roman"/><w:sz w:val="19"/><w:szCs w:val="19"/><w:b w:val="1"/><w:bCs w:val="1"/></w:rPr><w:t xml:space="preserve">keterangan</w:t></w:r></w:p></w:tc><w:tc><w:tcPr><w:tcW w:w="3000" w:type="dxa"/><w:noWrap/></w:tcPr><w:p><w:pPr><w:jc w:val="start"/></w:pPr><w:r><w:rPr><w:rFonts w:ascii="Times New Roman" w:hAnsi="Times New Roman" w:eastAsia="Times New Roman" w:cs="Times New Roman"/><w:sz w:val="19"/><w:szCs w:val="19"/></w:rPr><w:t xml:space="preserve">Rincian Catatan / Konteks Aksi</w:t></w:r></w:p></w:tc><w:tc><w:tcPr><w:tcW w:w="1300" w:type="dxa"/><w:noWrap/></w:tcPr><w:p><w:pPr><w:jc w:val="center"/></w:pPr><w:r><w:rPr><w:rFonts w:ascii="Times New Roman" w:hAnsi="Times New Roman" w:eastAsia="Times New Roman" w:cs="Times New Roman"/><w:sz w:val="19"/><w:szCs w:val="19"/></w:rPr><w:t xml:space="preserve">TEXT</w:t></w:r></w:p></w:tc><w:tc><w:tcPr><w:tcW w:w="1100" w:type="dxa"/><w:noWrap/></w:tcPr><w:p><w:pPr><w:jc w:val="center"/></w:pPr><w:r><w:rPr><w:rFonts w:ascii="Times New Roman" w:hAnsi="Times New Roman" w:eastAsia="Times New Roman" w:cs="Times New Roman"/><w:sz w:val="19"/><w:szCs w:val="19"/></w:rPr><w:t xml:space="preserve">-</w:t></w:r></w:p></w:tc><w:tc><w:tcPr><w:tcW w:w="1100" w:type="dxa"/><w:noWrap/></w:tcPr><w:p><w:pPr><w:jc w:val="center"/></w:pPr><w:r><w:rPr><w:rFonts w:ascii="Times New Roman" w:hAnsi="Times New Roman" w:eastAsia="Times New Roman" w:cs="Times New Roman"/><w:sz w:val="19"/><w:szCs w:val="19"/></w:rPr><w:t xml:space="preserve">Nullable</w:t></w:r></w:p></w:tc></w:tr><w:tr><w:trPr/><w:tc><w:tcPr><w:tcW w:w="500" w:type="dxa"/><w:noWrap/></w:tcPr><w:p><w:pPr><w:jc w:val="center"/></w:pPr><w:r><w:rPr><w:rFonts w:ascii="Times New Roman" w:hAnsi="Times New Roman" w:eastAsia="Times New Roman" w:cs="Times New Roman"/><w:sz w:val="19"/><w:szCs w:val="19"/></w:rPr><w:t xml:space="preserve">5</w:t></w:r></w:p></w:tc><w:tc><w:tcPr><w:tcW w:w="2200" w:type="dxa"/><w:noWrap/></w:tcPr><w:p><w:pPr><w:jc w:val="start"/></w:pPr><w:r><w:rPr><w:rFonts w:ascii="Times New Roman" w:hAnsi="Times New Roman" w:eastAsia="Times New Roman" w:cs="Times New Roman"/><w:sz w:val="19"/><w:szCs w:val="19"/><w:b w:val="1"/><w:bCs w:val="1"/></w:rPr><w:t xml:space="preserve">ip_address</w:t></w:r></w:p></w:tc><w:tc><w:tcPr><w:tcW w:w="3000" w:type="dxa"/><w:noWrap/></w:tcPr><w:p><w:pPr><w:jc w:val="start"/></w:pPr><w:r><w:rPr><w:rFonts w:ascii="Times New Roman" w:hAnsi="Times New Roman" w:eastAsia="Times New Roman" w:cs="Times New Roman"/><w:sz w:val="19"/><w:szCs w:val="19"/></w:rPr><w:t xml:space="preserve">Alamat IP Komputer Pengakses</w:t></w:r></w:p></w:tc><w:tc><w:tcPr><w:tcW w:w="1300" w:type="dxa"/><w:noWrap/></w:tcPr><w:p><w:pPr><w:jc w:val="center"/></w:pPr><w:r><w:rPr><w:rFonts w:ascii="Times New Roman" w:hAnsi="Times New Roman" w:eastAsia="Times New Roman" w:cs="Times New Roman"/><w:sz w:val="19"/><w:szCs w:val="19"/></w:rPr><w:t xml:space="preserve">VARCHAR</w:t></w:r></w:p></w:tc><w:tc><w:tcPr><w:tcW w:w="1100" w:type="dxa"/><w:noWrap/></w:tcPr><w:p><w:pPr><w:jc w:val="center"/></w:pPr><w:r><w:rPr><w:rFonts w:ascii="Times New Roman" w:hAnsi="Times New Roman" w:eastAsia="Times New Roman" w:cs="Times New Roman"/><w:sz w:val="19"/><w:szCs w:val="19"/></w:rPr><w:t xml:space="preserve">45</w:t></w:r></w:p></w:tc><w:tc><w:tcPr><w:tcW w:w="1100" w:type="dxa"/><w:noWrap/></w:tcPr><w:p><w:pPr><w:jc w:val="center"/></w:pPr><w:r><w:rPr><w:rFonts w:ascii="Times New Roman" w:hAnsi="Times New Roman" w:eastAsia="Times New Roman" w:cs="Times New Roman"/><w:sz w:val="19"/><w:szCs w:val="19"/></w:rPr><w:t xml:space="preserve">Nullable</w:t></w:r></w:p></w:tc></w:tr><w:tr><w:trPr/><w:tc><w:tcPr><w:tcW w:w="500" w:type="dxa"/><w:noWrap/></w:tcPr><w:p><w:pPr><w:jc w:val="center"/></w:pPr><w:r><w:rPr><w:rFonts w:ascii="Times New Roman" w:hAnsi="Times New Roman" w:eastAsia="Times New Roman" w:cs="Times New Roman"/><w:sz w:val="19"/><w:szCs w:val="19"/></w:rPr><w:t xml:space="preserve">6</w:t></w:r></w:p></w:tc><w:tc><w:tcPr><w:tcW w:w="2200" w:type="dxa"/><w:noWrap/></w:tcPr><w:p><w:pPr><w:jc w:val="start"/></w:pPr><w:r><w:rPr><w:rFonts w:ascii="Times New Roman" w:hAnsi="Times New Roman" w:eastAsia="Times New Roman" w:cs="Times New Roman"/><w:sz w:val="19"/><w:szCs w:val="19"/><w:b w:val="1"/><w:bCs w:val="1"/></w:rPr><w:t xml:space="preserve">created_at</w:t></w:r></w:p></w:tc><w:tc><w:tcPr><w:tcW w:w="3000" w:type="dxa"/><w:noWrap/></w:tcPr><w:p><w:pPr><w:jc w:val="start"/></w:pPr><w:r><w:rPr><w:rFonts w:ascii="Times New Roman" w:hAnsi="Times New Roman" w:eastAsia="Times New Roman" w:cs="Times New Roman"/><w:sz w:val="19"/><w:szCs w:val="19"/></w:rPr><w:t xml:space="preserve">Waktu Kejadian Aktivitas</w:t></w:r></w:p></w:tc><w:tc><w:tcPr><w:tcW w:w="1300" w:type="dxa"/><w:noWrap/></w:tcPr><w:p><w:pPr><w:jc w:val="center"/></w:pPr><w:r><w:rPr><w:rFonts w:ascii="Times New Roman" w:hAnsi="Times New Roman" w:eastAsia="Times New Roman" w:cs="Times New Roman"/><w:sz w:val="19"/><w:szCs w:val="19"/></w:rPr><w:t xml:space="preserve">TIMESTAMP</w:t></w:r></w:p></w:tc><w:tc><w:tcPr><w:tcW w:w="1100" w:type="dxa"/><w:noWrap/></w:tcPr><w:p><w:pPr><w:jc w:val="center"/></w:pPr><w:r><w:rPr><w:rFonts w:ascii="Times New Roman" w:hAnsi="Times New Roman" w:eastAsia="Times New Roman" w:cs="Times New Roman"/><w:sz w:val="19"/><w:szCs w:val="19"/></w:rPr><w:t xml:space="preserve">19</w:t></w:r></w:p></w:tc><w:tc><w:tcPr><w:tcW w:w="1100" w:type="dxa"/><w:noWrap/></w:tcPr><w:p><w:pPr><w:jc w:val="center"/></w:pPr><w:r><w:rPr><w:rFonts w:ascii="Times New Roman" w:hAnsi="Times New Roman" w:eastAsia="Times New Roman" w:cs="Times New Roman"/><w:sz w:val="19"/><w:szCs w:val="19"/></w:rPr><w:t xml:space="preserve">INDEX</w:t></w:r></w:p></w:tc></w:tr></w:tbl><w:p/><w:p><w:pPr><w:spacing w:after="40"/></w:pPr><w:r><w:rPr><w:rFonts w:ascii="Times New Roman" w:hAnsi="Times New Roman" w:eastAsia="Times New Roman" w:cs="Times New Roman"/><w:sz w:val="22"/><w:szCs w:val="22"/><w:b w:val="1"/><w:bCs w:val="1"/></w:rPr><w:t xml:space="preserve">g.   Struktur File / Tabel: BACKUP_LOG (Riwayat Pencadangan Pangkalan Data)</w:t></w:r></w:p><w:tbl><w:tblGrid><w:gridCol w:w="500" w:type="dxa"/><w:gridCol w:w="2200" w:type="dxa"/><w:gridCol w:w="3000" w:type="dxa"/><w:gridCol w:w="1300" w:type="dxa"/><w:gridCol w:w="1100" w:type="dxa"/><w:gridCol w:w="1100" w:type="dxa"/></w:tblGrid><w:tblPr><w:tblStyle w:val="MilitaryTable"/></w:tblPr><w:tr><w:trPr/><w:tc><w:tcPr><w:tcW w:w="500" w:type="dxa"/><w:shd w:val="clear" w:fill="EAEAEA"/><w:noWrap/></w:tcPr><w:p><w:pPr><w:jc w:val="center"/></w:pPr><w:r><w:rPr><w:rFonts w:ascii="Times New Roman" w:hAnsi="Times New Roman" w:eastAsia="Times New Roman" w:cs="Times New Roman"/><w:sz w:val="20"/><w:szCs w:val="20"/><w:b w:val="1"/><w:bCs w:val="1"/></w:rPr><w:t xml:space="preserve">No</w:t></w:r></w:p></w:tc><w:tc><w:tcPr><w:tcW w:w="2200" w:type="dxa"/><w:shd w:val="clear" w:fill="EAEAEA"/><w:noWrap/></w:tcPr><w:p><w:pPr><w:jc w:val="center"/></w:pPr><w:r><w:rPr><w:rFonts w:ascii="Times New Roman" w:hAnsi="Times New Roman" w:eastAsia="Times New Roman" w:cs="Times New Roman"/><w:sz w:val="20"/><w:szCs w:val="20"/><w:b w:val="1"/><w:bCs w:val="1"/></w:rPr><w:t xml:space="preserve">Nama Field</w:t></w:r></w:p></w:tc><w:tc><w:tcPr><w:tcW w:w="3000" w:type="dxa"/><w:shd w:val="clear" w:fill="EAEAEA"/><w:noWrap/></w:tcPr><w:p><w:pPr><w:jc w:val="center"/></w:pPr><w:r><w:rPr><w:rFonts w:ascii="Times New Roman" w:hAnsi="Times New Roman" w:eastAsia="Times New Roman" w:cs="Times New Roman"/><w:sz w:val="20"/><w:szCs w:val="20"/><w:b w:val="1"/><w:bCs w:val="1"/></w:rPr><w:t xml:space="preserve">Uraian / Sebutan</w:t></w:r></w:p></w:tc><w:tc><w:tcPr><w:tcW w:w="1300" w:type="dxa"/><w:shd w:val="clear" w:fill="EAEAEA"/><w:noWrap/></w:tcPr><w:p><w:pPr><w:jc w:val="center"/></w:pPr><w:r><w:rPr><w:rFonts w:ascii="Times New Roman" w:hAnsi="Times New Roman" w:eastAsia="Times New Roman" w:cs="Times New Roman"/><w:sz w:val="20"/><w:szCs w:val="20"/><w:b w:val="1"/><w:bCs w:val="1"/></w:rPr><w:t xml:space="preserve">Type</w:t></w:r></w:p></w:tc><w:tc><w:tcPr><w:tcW w:w="1100" w:type="dxa"/><w:shd w:val="clear" w:fill="EAEAEA"/><w:noWrap/></w:tcPr><w:p><w:pPr><w:jc w:val="center"/></w:pPr><w:r><w:rPr><w:rFonts w:ascii="Times New Roman" w:hAnsi="Times New Roman" w:eastAsia="Times New Roman" w:cs="Times New Roman"/><w:sz w:val="20"/><w:szCs w:val="20"/><w:b w:val="1"/><w:bCs w:val="1"/></w:rPr><w:t xml:space="preserve">Lebar</w:t></w:r></w:p></w:tc><w:tc><w:tcPr><w:tcW w:w="1100" w:type="dxa"/><w:shd w:val="clear" w:fill="EAEAEA"/><w:noWrap/></w:tcPr><w:p><w:pPr><w:jc w:val="center"/></w:pPr><w:r><w:rPr><w:rFonts w:ascii="Times New Roman" w:hAnsi="Times New Roman" w:eastAsia="Times New Roman" w:cs="Times New Roman"/><w:sz w:val="20"/><w:szCs w:val="20"/><w:b w:val="1"/><w:bCs w:val="1"/></w:rPr><w:t xml:space="preserve">Ket</w:t></w:r></w:p></w:tc></w:tr><w:tr><w:trPr/><w:tc><w:tcPr><w:tcW w:w="500" w:type="dxa"/><w:noWrap/></w:tcPr><w:p><w:pPr><w:jc w:val="center"/></w:pPr><w:r><w:rPr><w:rFonts w:ascii="Times New Roman" w:hAnsi="Times New Roman" w:eastAsia="Times New Roman" w:cs="Times New Roman"/><w:sz w:val="19"/><w:szCs w:val="19"/></w:rPr><w:t xml:space="preserve">1</w:t></w:r></w:p></w:tc><w:tc><w:tcPr><w:tcW w:w="2200" w:type="dxa"/><w:noWrap/></w:tcPr><w:p><w:pPr><w:jc w:val="start"/></w:pPr><w:r><w:rPr><w:rFonts w:ascii="Times New Roman" w:hAnsi="Times New Roman" w:eastAsia="Times New Roman" w:cs="Times New Roman"/><w:sz w:val="19"/><w:szCs w:val="19"/><w:b w:val="1"/><w:bCs w:val="1"/></w:rPr><w:t xml:space="preserve">id</w:t></w:r></w:p></w:tc><w:tc><w:tcPr><w:tcW w:w="3000" w:type="dxa"/><w:noWrap/></w:tcPr><w:p><w:pPr><w:jc w:val="start"/></w:pPr><w:r><w:rPr><w:rFonts w:ascii="Times New Roman" w:hAnsi="Times New Roman" w:eastAsia="Times New Roman" w:cs="Times New Roman"/><w:sz w:val="19"/><w:szCs w:val="19"/></w:rPr><w:t xml:space="preserve">Nomor Unik Log Backup</w:t></w:r></w:p></w:tc><w:tc><w:tcPr><w:tcW w:w="1300" w:type="dxa"/><w:noWrap/></w:tcPr><w:p><w:pPr><w:jc w:val="center"/></w:pPr><w:r><w:rPr><w:rFonts w:ascii="Times New Roman" w:hAnsi="Times New Roman" w:eastAsia="Times New Roman" w:cs="Times New Roman"/><w:sz w:val="19"/><w:szCs w:val="19"/></w:rPr><w:t xml:space="preserve">INT</w:t></w:r></w:p></w:tc><w:tc><w:tcPr><w:tcW w:w="1100" w:type="dxa"/><w:noWrap/></w:tcPr><w:p><w:pPr><w:jc w:val="center"/></w:pPr><w:r><w:rPr><w:rFonts w:ascii="Times New Roman" w:hAnsi="Times New Roman" w:eastAsia="Times New Roman" w:cs="Times New Roman"/><w:sz w:val="19"/><w:szCs w:val="19"/></w:rPr><w:t xml:space="preserve">11</w:t></w:r></w:p></w:tc><w:tc><w:tcPr><w:tcW w:w="1100" w:type="dxa"/><w:noWrap/></w:tcPr><w:p><w:pPr><w:jc w:val="center"/></w:pPr><w:r><w:rPr><w:rFonts w:ascii="Times New Roman" w:hAnsi="Times New Roman" w:eastAsia="Times New Roman" w:cs="Times New Roman"/><w:sz w:val="19"/><w:szCs w:val="19"/></w:rPr><w:t xml:space="preserve">PK, Auto</w:t></w:r></w:p></w:tc></w:tr><w:tr><w:trPr/><w:tc><w:tcPr><w:tcW w:w="500" w:type="dxa"/><w:noWrap/></w:tcPr><w:p><w:pPr><w:jc w:val="center"/></w:pPr><w:r><w:rPr><w:rFonts w:ascii="Times New Roman" w:hAnsi="Times New Roman" w:eastAsia="Times New Roman" w:cs="Times New Roman"/><w:sz w:val="19"/><w:szCs w:val="19"/></w:rPr><w:t xml:space="preserve">2</w:t></w:r></w:p></w:tc><w:tc><w:tcPr><w:tcW w:w="2200" w:type="dxa"/><w:noWrap/></w:tcPr><w:p><w:pPr><w:jc w:val="start"/></w:pPr><w:r><w:rPr><w:rFonts w:ascii="Times New Roman" w:hAnsi="Times New Roman" w:eastAsia="Times New Roman" w:cs="Times New Roman"/><w:sz w:val="19"/><w:szCs w:val="19"/><w:b w:val="1"/><w:bCs w:val="1"/></w:rPr><w:t xml:space="preserve">file_name</w:t></w:r></w:p></w:tc><w:tc><w:tcPr><w:tcW w:w="3000" w:type="dxa"/><w:noWrap/></w:tcPr><w:p><w:pPr><w:jc w:val="start"/></w:pPr><w:r><w:rPr><w:rFonts w:ascii="Times New Roman" w:hAnsi="Times New Roman" w:eastAsia="Times New Roman" w:cs="Times New Roman"/><w:sz w:val="19"/><w:szCs w:val="19"/></w:rPr><w:t xml:space="preserve">Nama Berkas Cadangan (.sql/.zip)</w:t></w:r></w:p></w:tc><w:tc><w:tcPr><w:tcW w:w="1300" w:type="dxa"/><w:noWrap/></w:tcPr><w:p><w:pPr><w:jc w:val="center"/></w:pPr><w:r><w:rPr><w:rFonts w:ascii="Times New Roman" w:hAnsi="Times New Roman" w:eastAsia="Times New Roman" w:cs="Times New Roman"/><w:sz w:val="19"/><w:szCs w:val="19"/></w:rPr><w:t xml:space="preserve">VARCHAR</w:t></w:r></w:p></w:tc><w:tc><w:tcPr><w:tcW w:w="1100" w:type="dxa"/><w:noWrap/></w:tcPr><w:p><w:pPr><w:jc w:val="center"/></w:pPr><w:r><w:rPr><w:rFonts w:ascii="Times New Roman" w:hAnsi="Times New Roman" w:eastAsia="Times New Roman" w:cs="Times New Roman"/><w:sz w:val="19"/><w:szCs w:val="19"/></w:rPr><w:t xml:space="preserve">255</w:t></w:r></w:p></w:tc><w:tc><w:tcPr><w:tcW w:w="1100" w:type="dxa"/><w:noWrap/></w:tcPr><w:p><w:pPr><w:jc w:val="center"/></w:pPr><w:r><w:rPr><w:rFonts w:ascii="Times New Roman" w:hAnsi="Times New Roman" w:eastAsia="Times New Roman" w:cs="Times New Roman"/><w:sz w:val="19"/><w:szCs w:val="19"/></w:rPr><w:t xml:space="preserve">Not Null</w:t></w:r></w:p></w:tc></w:tr><w:tr><w:trPr/><w:tc><w:tcPr><w:tcW w:w="500" w:type="dxa"/><w:noWrap/></w:tcPr><w:p><w:pPr><w:jc w:val="center"/></w:pPr><w:r><w:rPr><w:rFonts w:ascii="Times New Roman" w:hAnsi="Times New Roman" w:eastAsia="Times New Roman" w:cs="Times New Roman"/><w:sz w:val="19"/><w:szCs w:val="19"/></w:rPr><w:t xml:space="preserve">3</w:t></w:r></w:p></w:tc><w:tc><w:tcPr><w:tcW w:w="2200" w:type="dxa"/><w:noWrap/></w:tcPr><w:p><w:pPr><w:jc w:val="start"/></w:pPr><w:r><w:rPr><w:rFonts w:ascii="Times New Roman" w:hAnsi="Times New Roman" w:eastAsia="Times New Roman" w:cs="Times New Roman"/><w:sz w:val="19"/><w:szCs w:val="19"/><w:b w:val="1"/><w:bCs w:val="1"/></w:rPr><w:t xml:space="preserve">size_bytes</w:t></w:r></w:p></w:tc><w:tc><w:tcPr><w:tcW w:w="3000" w:type="dxa"/><w:noWrap/></w:tcPr><w:p><w:pPr><w:jc w:val="start"/></w:pPr><w:r><w:rPr><w:rFonts w:ascii="Times New Roman" w:hAnsi="Times New Roman" w:eastAsia="Times New Roman" w:cs="Times New Roman"/><w:sz w:val="19"/><w:szCs w:val="19"/></w:rPr><w:t xml:space="preserve">Ukuran Berkas Cadangan (Byte)</w:t></w:r></w:p></w:tc><w:tc><w:tcPr><w:tcW w:w="1300" w:type="dxa"/><w:noWrap/></w:tcPr><w:p><w:pPr><w:jc w:val="center"/></w:pPr><w:r><w:rPr><w:rFonts w:ascii="Times New Roman" w:hAnsi="Times New Roman" w:eastAsia="Times New Roman" w:cs="Times New Roman"/><w:sz w:val="19"/><w:szCs w:val="19"/></w:rPr><w:t xml:space="preserve">BIGINT</w:t></w:r></w:p></w:tc><w:tc><w:tcPr><w:tcW w:w="1100" w:type="dxa"/><w:noWrap/></w:tcPr><w:p><w:pPr><w:jc w:val="center"/></w:pPr><w:r><w:rPr><w:rFonts w:ascii="Times New Roman" w:hAnsi="Times New Roman" w:eastAsia="Times New Roman" w:cs="Times New Roman"/><w:sz w:val="19"/><w:szCs w:val="19"/></w:rPr><w:t xml:space="preserve">20</w:t></w:r></w:p></w:tc><w:tc><w:tcPr><w:tcW w:w="1100" w:type="dxa"/><w:noWrap/></w:tcPr><w:p><w:pPr><w:jc w:val="center"/></w:pPr><w:r><w:rPr><w:rFonts w:ascii="Times New Roman" w:hAnsi="Times New Roman" w:eastAsia="Times New Roman" w:cs="Times New Roman"/><w:sz w:val="19"/><w:szCs w:val="19"/></w:rPr><w:t xml:space="preserve">Default 0</w:t></w:r></w:p></w:tc></w:tr><w:tr><w:trPr/><w:tc><w:tcPr><w:tcW w:w="500" w:type="dxa"/><w:noWrap/></w:tcPr><w:p><w:pPr><w:jc w:val="center"/></w:pPr><w:r><w:rPr><w:rFonts w:ascii="Times New Roman" w:hAnsi="Times New Roman" w:eastAsia="Times New Roman" w:cs="Times New Roman"/><w:sz w:val="19"/><w:szCs w:val="19"/></w:rPr><w:t xml:space="preserve">4</w:t></w:r></w:p></w:tc><w:tc><w:tcPr><w:tcW w:w="2200" w:type="dxa"/><w:noWrap/></w:tcPr><w:p><w:pPr><w:jc w:val="start"/></w:pPr><w:r><w:rPr><w:rFonts w:ascii="Times New Roman" w:hAnsi="Times New Roman" w:eastAsia="Times New Roman" w:cs="Times New Roman"/><w:sz w:val="19"/><w:szCs w:val="19"/><w:b w:val="1"/><w:bCs w:val="1"/></w:rPr><w:t xml:space="preserve">jenis</w:t></w:r></w:p></w:tc><w:tc><w:tcPr><w:tcW w:w="3000" w:type="dxa"/><w:noWrap/></w:tcPr><w:p><w:pPr><w:jc w:val="start"/></w:pPr><w:r><w:rPr><w:rFonts w:ascii="Times New Roman" w:hAnsi="Times New Roman" w:eastAsia="Times New Roman" w:cs="Times New Roman"/><w:sz w:val="19"/><w:szCs w:val="19"/></w:rPr><w:t xml:space="preserve">Jenis (database/files/full)</w:t></w:r></w:p></w:tc><w:tc><w:tcPr><w:tcW w:w="1300" w:type="dxa"/><w:noWrap/></w:tcPr><w:p><w:pPr><w:jc w:val="center"/></w:pPr><w:r><w:rPr><w:rFonts w:ascii="Times New Roman" w:hAnsi="Times New Roman" w:eastAsia="Times New Roman" w:cs="Times New Roman"/><w:sz w:val="19"/><w:szCs w:val="19"/></w:rPr><w:t xml:space="preserve">ENUM</w:t></w:r></w:p></w:tc><w:tc><w:tcPr><w:tcW w:w="1100" w:type="dxa"/><w:noWrap/></w:tcPr><w:p><w:pPr><w:jc w:val="center"/></w:pPr><w:r><w:rPr><w:rFonts w:ascii="Times New Roman" w:hAnsi="Times New Roman" w:eastAsia="Times New Roman" w:cs="Times New Roman"/><w:sz w:val="19"/><w:szCs w:val="19"/></w:rPr><w:t xml:space="preserve">10</w:t></w:r></w:p></w:tc><w:tc><w:tcPr><w:tcW w:w="1100" w:type="dxa"/><w:noWrap/></w:tcPr><w:p><w:pPr><w:jc w:val="center"/></w:pPr><w:r><w:rPr><w:rFonts w:ascii="Times New Roman" w:hAnsi="Times New Roman" w:eastAsia="Times New Roman" w:cs="Times New Roman"/><w:sz w:val="19"/><w:szCs w:val="19"/></w:rPr><w:t xml:space="preserve">Def 'full'</w:t></w:r></w:p></w:tc></w:tr><w:tr><w:trPr/><w:tc><w:tcPr><w:tcW w:w="500" w:type="dxa"/><w:noWrap/></w:tcPr><w:p><w:pPr><w:jc w:val="center"/></w:pPr><w:r><w:rPr><w:rFonts w:ascii="Times New Roman" w:hAnsi="Times New Roman" w:eastAsia="Times New Roman" w:cs="Times New Roman"/><w:sz w:val="19"/><w:szCs w:val="19"/></w:rPr><w:t xml:space="preserve">5</w:t></w:r></w:p></w:tc><w:tc><w:tcPr><w:tcW w:w="2200" w:type="dxa"/><w:noWrap/></w:tcPr><w:p><w:pPr><w:jc w:val="start"/></w:pPr><w:r><w:rPr><w:rFonts w:ascii="Times New Roman" w:hAnsi="Times New Roman" w:eastAsia="Times New Roman" w:cs="Times New Roman"/><w:sz w:val="19"/><w:szCs w:val="19"/><w:b w:val="1"/><w:bCs w:val="1"/></w:rPr><w:t xml:space="preserve">created_by</w:t></w:r></w:p></w:tc><w:tc><w:tcPr><w:tcW w:w="3000" w:type="dxa"/><w:noWrap/></w:tcPr><w:p><w:pPr><w:jc w:val="start"/></w:pPr><w:r><w:rPr><w:rFonts w:ascii="Times New Roman" w:hAnsi="Times New Roman" w:eastAsia="Times New Roman" w:cs="Times New Roman"/><w:sz w:val="19"/><w:szCs w:val="19"/></w:rPr><w:t xml:space="preserve">Relasi ke Akun Pembuat Backup</w:t></w:r></w:p></w:tc><w:tc><w:tcPr><w:tcW w:w="1300" w:type="dxa"/><w:noWrap/></w:tcPr><w:p><w:pPr><w:jc w:val="center"/></w:pPr><w:r><w:rPr><w:rFonts w:ascii="Times New Roman" w:hAnsi="Times New Roman" w:eastAsia="Times New Roman" w:cs="Times New Roman"/><w:sz w:val="19"/><w:szCs w:val="19"/></w:rPr><w:t xml:space="preserve">INT</w:t></w:r></w:p></w:tc><w:tc><w:tcPr><w:tcW w:w="1100" w:type="dxa"/><w:noWrap/></w:tcPr><w:p><w:pPr><w:jc w:val="center"/></w:pPr><w:r><w:rPr><w:rFonts w:ascii="Times New Roman" w:hAnsi="Times New Roman" w:eastAsia="Times New Roman" w:cs="Times New Roman"/><w:sz w:val="19"/><w:szCs w:val="19"/></w:rPr><w:t xml:space="preserve">11</w:t></w:r></w:p></w:tc><w:tc><w:tcPr><w:tcW w:w="1100" w:type="dxa"/><w:noWrap/></w:tcPr><w:p><w:pPr><w:jc w:val="center"/></w:pPr><w:r><w:rPr><w:rFonts w:ascii="Times New Roman" w:hAnsi="Times New Roman" w:eastAsia="Times New Roman" w:cs="Times New Roman"/><w:sz w:val="19"/><w:szCs w:val="19"/></w:rPr><w:t xml:space="preserve">FK, Nullable</w:t></w:r></w:p></w:tc></w:tr><w:tr><w:trPr/><w:tc><w:tcPr><w:tcW w:w="500" w:type="dxa"/><w:noWrap/></w:tcPr><w:p><w:pPr><w:jc w:val="center"/></w:pPr><w:r><w:rPr><w:rFonts w:ascii="Times New Roman" w:hAnsi="Times New Roman" w:eastAsia="Times New Roman" w:cs="Times New Roman"/><w:sz w:val="19"/><w:szCs w:val="19"/></w:rPr><w:t xml:space="preserve">6</w:t></w:r></w:p></w:tc><w:tc><w:tcPr><w:tcW w:w="2200" w:type="dxa"/><w:noWrap/></w:tcPr><w:p><w:pPr><w:jc w:val="start"/></w:pPr><w:r><w:rPr><w:rFonts w:ascii="Times New Roman" w:hAnsi="Times New Roman" w:eastAsia="Times New Roman" w:cs="Times New Roman"/><w:sz w:val="19"/><w:szCs w:val="19"/><w:b w:val="1"/><w:bCs w:val="1"/></w:rPr><w:t xml:space="preserve">created_at</w:t></w:r></w:p></w:tc><w:tc><w:tcPr><w:tcW w:w="3000" w:type="dxa"/><w:noWrap/></w:tcPr><w:p><w:pPr><w:jc w:val="start"/></w:pPr><w:r><w:rPr><w:rFonts w:ascii="Times New Roman" w:hAnsi="Times New Roman" w:eastAsia="Times New Roman" w:cs="Times New Roman"/><w:sz w:val="19"/><w:szCs w:val="19"/></w:rPr><w:t xml:space="preserve">Waktu Pencadangan</w:t></w:r></w:p></w:tc><w:tc><w:tcPr><w:tcW w:w="1300" w:type="dxa"/><w:noWrap/></w:tcPr><w:p><w:pPr><w:jc w:val="center"/></w:pPr><w:r><w:rPr><w:rFonts w:ascii="Times New Roman" w:hAnsi="Times New Roman" w:eastAsia="Times New Roman" w:cs="Times New Roman"/><w:sz w:val="19"/><w:szCs w:val="19"/></w:rPr><w:t xml:space="preserve">TIMESTAMP</w:t></w:r></w:p></w:tc><w:tc><w:tcPr><w:tcW w:w="1100" w:type="dxa"/><w:noWrap/></w:tcPr><w:p><w:pPr><w:jc w:val="center"/></w:pPr><w:r><w:rPr><w:rFonts w:ascii="Times New Roman" w:hAnsi="Times New Roman" w:eastAsia="Times New Roman" w:cs="Times New Roman"/><w:sz w:val="19"/><w:szCs w:val="19"/></w:rPr><w:t xml:space="preserve">19</w:t></w:r></w:p></w:tc><w:tc><w:tcPr><w:tcW w:w="1100" w:type="dxa"/><w:noWrap/></w:tcPr><w:p><w:pPr><w:jc w:val="center"/></w:pPr><w:r><w:rPr><w:rFonts w:ascii="Times New Roman" w:hAnsi="Times New Roman" w:eastAsia="Times New Roman" w:cs="Times New Roman"/><w:sz w:val="19"/><w:szCs w:val="19"/></w:rPr><w:t xml:space="preserve">Auto Stamp</w:t></w:r></w:p></w:tc></w:tr></w:tbl><w:p/><w:p><w:r><w:br w:type="page"/></w:r></w:p><w:p><w:pPr><w:jc w:val="start"/><w:spacing w:after="60"/></w:pPr><w:r><w:rPr><w:rFonts w:ascii="Times New Roman" w:hAnsi="Times New Roman" w:eastAsia="Times New Roman" w:cs="Times New Roman"/><w:sz w:val="24"/><w:szCs w:val="24"/><w:b w:val="1"/><w:bCs w:val="1"/></w:rPr><w:t xml:space="preserve">14.  Spesifikasi Program.</w:t></w:r></w:p><w:p><w:pPr><w:jc w:val="both"/><w:spacing w:after="80" w:line="276" w:lineRule="auto"/></w:pPr><w:r><w:rPr><w:rFonts w:ascii="Times New Roman" w:hAnsi="Times New Roman" w:eastAsia="Times New Roman" w:cs="Times New Roman"/><w:sz w:val="23"/><w:szCs w:val="23"/></w:rPr><w:t xml:space="preserve">Spesifikasi program memuat rincian logika, masukan, form, lingkungan bahasa, serta urutan prosedur pengolahan dari masing-masing modul aplikasi TRISULA TNI AD berdasarkan standar Naskah Sekolah Gambar - 3.</w:t></w:r></w:p><w:p/><w:tbl><w:tblGrid><w:gridCol w:w="4600" w:type="dxa"/><w:gridCol w:w="4600" w:type="dxa"/></w:tblGrid><w:tblPr><w:tblStyle w:val="BoxTable"/></w:tblPr><w:tr><w:trPr/><w:tc><w:tcPr><w:tcW w:w="4600" w:type="dxa"/><w:noWrap/></w:tcPr><w:p><w:pPr/><w:r><w:rPr><w:rFonts w:ascii="Times New Roman" w:hAnsi="Times New Roman" w:eastAsia="Times New Roman" w:cs="Times New Roman"/><w:sz w:val="19"/><w:szCs w:val="19"/><w:b w:val="1"/><w:bCs w:val="1"/></w:rPr><w:t xml:space="preserve">SISTEM : APLIKASI TRISULA TNI AD</w:t></w:r></w:p></w:tc><w:tc><w:tcPr><w:tcW w:w="4600" w:type="dxa"/><w:noWrap/></w:tcPr><w:p><w:pPr/><w:r><w:rPr><w:rFonts w:ascii="Times New Roman" w:hAnsi="Times New Roman" w:eastAsia="Times New Roman" w:cs="Times New Roman"/><w:sz w:val="19"/><w:szCs w:val="19"/><w:b w:val="1"/><w:bCs w:val="1"/></w:rPr><w:t xml:space="preserve">NAMA PROGRAM : AUTH_LOGIN.PHP</w:t></w:r></w:p><w:p><w:pPr/><w:r><w:rPr><w:rFonts w:ascii="Times New Roman" w:hAnsi="Times New Roman" w:eastAsia="Times New Roman" w:cs="Times New Roman"/><w:sz w:val="19"/><w:szCs w:val="19"/><w:b w:val="1"/><w:bCs w:val="1"/></w:rPr><w:t xml:space="preserve">NAMA FORM    : FO_LOGIN_USER</w:t></w:r></w:p></w:tc></w:tr><w:tr><w:trPr/><w:tc><w:tcPr><w:tcW w:w="4600" w:type="dxa"/><w:noWrap/></w:tcPr><w:p><w:pPr/><w:r><w:rPr><w:rFonts w:ascii="Times New Roman" w:hAnsi="Times New Roman" w:eastAsia="Times New Roman" w:cs="Times New Roman"/><w:sz w:val="19"/><w:szCs w:val="19"/><w:b w:val="1"/><w:bCs w:val="1"/></w:rPr><w:t xml:space="preserve">FUNGSI PROGRAM :</w:t></w:r></w:p><w:p><w:pPr/><w:r><w:rPr><w:rFonts w:ascii="Times New Roman" w:hAnsi="Times New Roman" w:eastAsia="Times New Roman" w:cs="Times New Roman"/><w:sz w:val="19"/><w:szCs w:val="19"/></w:rPr><w:t xml:space="preserve">Autentikasi Hak Akses, Proteksi Serangan Brute Force, & Pengendalian Sesi Sesuai Role Pengguna</w:t></w:r></w:p></w:tc><w:tc><w:tcPr><w:tcW w:w="4600" w:type="dxa"/><w:noWrap/></w:tcPr><w:p><w:pPr/><w:r><w:rPr><w:rFonts w:ascii="Times New Roman" w:hAnsi="Times New Roman" w:eastAsia="Times New Roman" w:cs="Times New Roman"/><w:sz w:val="19"/><w:szCs w:val="19"/><w:b w:val="1"/><w:bCs w:val="1"/></w:rPr><w:t xml:space="preserve">BAHASA     : PHP 8.3 PDO + BCrypt</w:t></w:r></w:p><w:p><w:pPr/><w:r><w:rPr><w:rFonts w:ascii="Times New Roman" w:hAnsi="Times New Roman" w:eastAsia="Times New Roman" w:cs="Times New Roman"/><w:sz w:val="19"/><w:szCs w:val="19"/><w:b w:val="1"/><w:bCs w:val="1"/></w:rPr><w:t xml:space="preserve">DIBUAT OLEH: Letda Czi Fris Wardani</w:t></w:r></w:p></w:tc></w:tr><w:tr><w:trPr/><w:tc><w:tcPr><w:tcW w:w="9200" w:type="dxa"/><w:gridSpan w:val="2"/><w:noWrap/></w:tcPr><w:p><w:pPr><w:spacing w:after="40"/></w:pPr><w:r><w:rPr><w:rFonts w:ascii="Times New Roman" w:hAnsi="Times New Roman" w:eastAsia="Times New Roman" w:cs="Times New Roman"/><w:sz w:val="19"/><w:szCs w:val="19"/><w:b w:val="1"/><w:bCs w:val="1"/></w:rPr><w:t xml:space="preserve">PROSEDUR PENGOLAHAN :</w:t></w:r></w:p><w:p><w:pPr><w:spacing w:after="20"/></w:pPr><w:r><w:rPr><w:rFonts w:ascii="Times New Roman" w:hAnsi="Times New Roman" w:eastAsia="Times New Roman" w:cs="Times New Roman"/><w:sz w:val="19"/><w:szCs w:val="19"/></w:rPr><w:t xml:space="preserve">• Menerima masukan Username (NRP / Admin) dan Kata Sandi via POST Request.</w:t></w:r></w:p><w:p><w:pPr><w:spacing w:after="20"/></w:pPr><w:r><w:rPr><w:rFonts w:ascii="Times New Roman" w:hAnsi="Times New Roman" w:eastAsia="Times New Roman" w:cs="Times New Roman"/><w:sz w:val="19"/><w:szCs w:val="19"/></w:rPr><w:t xml:space="preserve">• Memeriksa token keamanan Cross-Site Request Forgery (CSRF).</w:t></w:r></w:p><w:p><w:pPr><w:spacing w:after="20"/></w:pPr><w:r><w:rPr><w:rFonts w:ascii="Times New Roman" w:hAnsi="Times New Roman" w:eastAsia="Times New Roman" w:cs="Times New Roman"/><w:sz w:val="19"/><w:szCs w:val="19"/></w:rPr><w:t xml:space="preserve">• Memeriksa tabel login_attempts guna mendeteksi serangan brute force (maksimal 5x gagal dalam 15 menit).</w:t></w:r></w:p><w:p><w:pPr><w:spacing w:after="20"/></w:pPr><w:r><w:rPr><w:rFonts w:ascii="Times New Roman" w:hAnsi="Times New Roman" w:eastAsia="Times New Roman" w:cs="Times New Roman"/><w:sz w:val="19"/><w:szCs w:val="19"/></w:rPr><w:t xml:space="preserve">• Melakukan pencocokan akun pada tabel users berdasarkan username yang aktif.</w:t></w:r></w:p><w:p><w:pPr><w:spacing w:after="20"/></w:pPr><w:r><w:rPr><w:rFonts w:ascii="Times New Roman" w:hAnsi="Times New Roman" w:eastAsia="Times New Roman" w:cs="Times New Roman"/><w:sz w:val="19"/><w:szCs w:val="19"/></w:rPr><w:t xml:space="preserve">• Memverifikasi hash kata sandi menggunakan fungsi password_verify() (algoritma bcrypt).</w:t></w:r></w:p><w:p><w:pPr><w:spacing w:after="20"/></w:pPr><w:r><w:rPr><w:rFonts w:ascii="Times New Roman" w:hAnsi="Times New Roman" w:eastAsia="Times New Roman" w:cs="Times New Roman"/><w:sz w:val="19"/><w:szCs w:val="19"/></w:rPr><w:t xml:space="preserve">• Memeriksa status akun; apabila berstatus "pending" atau "rejected", sistem menolak login dan menampilkan pesan edukatif.</w:t></w:r></w:p><w:p><w:pPr><w:spacing w:after="20"/></w:pPr><w:r><w:rPr><w:rFonts w:ascii="Times New Roman" w:hAnsi="Times New Roman" w:eastAsia="Times New Roman" w:cs="Times New Roman"/><w:sz w:val="19"/><w:szCs w:val="19"/></w:rPr><w:t xml:space="preserve">• Jika otentikasi berhasil: regenerasi session_id() baru, menetapkan variabel $_SESSION user, memperbarui last_login, dan mencatat log audit pada activity_log.</w:t></w:r></w:p><w:p><w:pPr><w:spacing w:after="20"/></w:pPr><w:r><w:rPr><w:rFonts w:ascii="Times New Roman" w:hAnsi="Times New Roman" w:eastAsia="Times New Roman" w:cs="Times New Roman"/><w:sz w:val="19"/><w:szCs w:val="19"/></w:rPr><w:t xml:space="preserve">• Mengarahkan (redirect) pengguna sesuai perannya: role admin ke /admin/dashboard.php, role personel ke /personel/dashboard.php.</w:t></w:r></w:p></w:tc></w:tr></w:tbl><w:p/><w:tbl><w:tblGrid><w:gridCol w:w="4600" w:type="dxa"/><w:gridCol w:w="4600" w:type="dxa"/></w:tblGrid><w:tblPr><w:tblStyle w:val="BoxTable"/></w:tblPr><w:tr><w:trPr/><w:tc><w:tcPr><w:tcW w:w="4600" w:type="dxa"/><w:noWrap/></w:tcPr><w:p><w:pPr/><w:r><w:rPr><w:rFonts w:ascii="Times New Roman" w:hAnsi="Times New Roman" w:eastAsia="Times New Roman" w:cs="Times New Roman"/><w:sz w:val="19"/><w:szCs w:val="19"/><w:b w:val="1"/><w:bCs w:val="1"/></w:rPr><w:t xml:space="preserve">SISTEM : APLIKASI TRISULA TNI AD</w:t></w:r></w:p></w:tc><w:tc><w:tcPr><w:tcW w:w="4600" w:type="dxa"/><w:noWrap/></w:tcPr><w:p><w:pPr/><w:r><w:rPr><w:rFonts w:ascii="Times New Roman" w:hAnsi="Times New Roman" w:eastAsia="Times New Roman" w:cs="Times New Roman"/><w:sz w:val="19"/><w:szCs w:val="19"/><w:b w:val="1"/><w:bCs w:val="1"/></w:rPr><w:t xml:space="preserve">NAMA PROGRAM : REGISTER_PROCESS.PHP</w:t></w:r></w:p><w:p><w:pPr/><w:r><w:rPr><w:rFonts w:ascii="Times New Roman" w:hAnsi="Times New Roman" w:eastAsia="Times New Roman" w:cs="Times New Roman"/><w:sz w:val="19"/><w:szCs w:val="19"/><w:b w:val="1"/><w:bCs w:val="1"/></w:rPr><w:t xml:space="preserve">NAMA FORM    : FO_REGISTRASI_PERSONEL</w:t></w:r></w:p></w:tc></w:tr><w:tr><w:trPr/><w:tc><w:tcPr><w:tcW w:w="4600" w:type="dxa"/><w:noWrap/></w:tcPr><w:p><w:pPr/><w:r><w:rPr><w:rFonts w:ascii="Times New Roman" w:hAnsi="Times New Roman" w:eastAsia="Times New Roman" w:cs="Times New Roman"/><w:sz w:val="19"/><w:szCs w:val="19"/><w:b w:val="1"/><w:bCs w:val="1"/></w:rPr><w:t xml:space="preserve">FUNGSI PROGRAM :</w:t></w:r></w:p><w:p><w:pPr/><w:r><w:rPr><w:rFonts w:ascii="Times New Roman" w:hAnsi="Times New Roman" w:eastAsia="Times New Roman" w:cs="Times New Roman"/><w:sz w:val="19"/><w:szCs w:val="19"/></w:rPr><w:t xml:space="preserve">Pendaftaran Mandiri Prajurit, Pembuatan Akun Otomatis Berbasis NRP, & Validasi Integritas Data</w:t></w:r></w:p></w:tc><w:tc><w:tcPr><w:tcW w:w="4600" w:type="dxa"/><w:noWrap/></w:tcPr><w:p><w:pPr/><w:r><w:rPr><w:rFonts w:ascii="Times New Roman" w:hAnsi="Times New Roman" w:eastAsia="Times New Roman" w:cs="Times New Roman"/><w:sz w:val="19"/><w:szCs w:val="19"/><w:b w:val="1"/><w:bCs w:val="1"/></w:rPr><w:t xml:space="preserve">BAHASA     : PHP 8.3 PDO + MySQL Transaction</w:t></w:r></w:p><w:p><w:pPr/><w:r><w:rPr><w:rFonts w:ascii="Times New Roman" w:hAnsi="Times New Roman" w:eastAsia="Times New Roman" w:cs="Times New Roman"/><w:sz w:val="19"/><w:szCs w:val="19"/><w:b w:val="1"/><w:bCs w:val="1"/></w:rPr><w:t xml:space="preserve">DIBUAT OLEH: Letda Czi Fris Wardani</w:t></w:r></w:p></w:tc></w:tr><w:tr><w:trPr/><w:tc><w:tcPr><w:tcW w:w="9200" w:type="dxa"/><w:gridSpan w:val="2"/><w:noWrap/></w:tcPr><w:p><w:pPr><w:spacing w:after="40"/></w:pPr><w:r><w:rPr><w:rFonts w:ascii="Times New Roman" w:hAnsi="Times New Roman" w:eastAsia="Times New Roman" w:cs="Times New Roman"/><w:sz w:val="19"/><w:szCs w:val="19"/><w:b w:val="1"/><w:bCs w:val="1"/></w:rPr><w:t xml:space="preserve">PROSEDUR PENGOLAHAN :</w:t></w:r></w:p><w:p><w:pPr><w:spacing w:after="20"/></w:pPr><w:r><w:rPr><w:rFonts w:ascii="Times New Roman" w:hAnsi="Times New Roman" w:eastAsia="Times New Roman" w:cs="Times New Roman"/><w:sz w:val="19"/><w:szCs w:val="19"/></w:rPr><w:t xml:space="preserve">• Menerima data masukan pendaftaran: NRP, Nama Lengkap, Golongan, Pangkat, Korps, Satuan, Kotama, Jabatan, TMT Jabatan, Tgl Lahir, dan Jenis Kelamin.</w:t></w:r></w:p><w:p><w:pPr><w:spacing w:after="20"/></w:pPr><w:r><w:rPr><w:rFonts w:ascii="Times New Roman" w:hAnsi="Times New Roman" w:eastAsia="Times New Roman" w:cs="Times New Roman"/><w:sz w:val="19"/><w:szCs w:val="19"/></w:rPr><w:t xml:space="preserve">• Validasi format regex NRP: hanya memperbolehkan kombinasi alfanumerik (4-30 karakter).</w:t></w:r></w:p><w:p><w:pPr><w:spacing w:after="20"/></w:pPr><w:r><w:rPr><w:rFonts w:ascii="Times New Roman" w:hAnsi="Times New Roman" w:eastAsia="Times New Roman" w:cs="Times New Roman"/><w:sz w:val="19"/><w:szCs w:val="19"/></w:rPr><w:t xml:space="preserve">• Memeriksa tabel personel dan tabel users untuk memastikan NRP belum pernah terdaftar sebelumnya.</w:t></w:r></w:p><w:p><w:pPr><w:spacing w:after="20"/></w:pPr><w:r><w:rPr><w:rFonts w:ascii="Times New Roman" w:hAnsi="Times New Roman" w:eastAsia="Times New Roman" w:cs="Times New Roman"/><w:sz w:val="19"/><w:szCs w:val="19"/></w:rPr><w:t xml:space="preserve">• Membuka transaksi basis data (PDO beginTransaction).</w:t></w:r></w:p><w:p><w:pPr><w:spacing w:after="20"/></w:pPr><w:r><w:rPr><w:rFonts w:ascii="Times New Roman" w:hAnsi="Times New Roman" w:eastAsia="Times New Roman" w:cs="Times New Roman"/><w:sz w:val="19"/><w:szCs w:val="19"/></w:rPr><w:t xml:space="preserve">• Menyimpan data identitas induk prajurit ke dalam tabel personel.</w:t></w:r></w:p><w:p><w:pPr><w:spacing w:after="20"/></w:pPr><w:r><w:rPr><w:rFonts w:ascii="Times New Roman" w:hAnsi="Times New Roman" w:eastAsia="Times New Roman" w:cs="Times New Roman"/><w:sz w:val="19"/><w:szCs w:val="19"/></w:rPr><w:t xml:space="preserve">• Membuatkan akun login otomatis pada tabel users dengan ketentuan: username = NRP, password = hash(NRP), status = "pending", role = "personel".</w:t></w:r></w:p><w:p><w:pPr><w:spacing w:after="20"/></w:pPr><w:r><w:rPr><w:rFonts w:ascii="Times New Roman" w:hAnsi="Times New Roman" w:eastAsia="Times New Roman" w:cs="Times New Roman"/><w:sz w:val="19"/><w:szCs w:val="19"/></w:rPr><w:t xml:space="preserve">• Commit transaksi basis data, mencatat log pendaftaran pada activity_log, dan menampilkan notifikasi sukses registrasi menunggu approval admin.</w:t></w:r></w:p></w:tc></w:tr></w:tbl><w:p/><w:p><w:r><w:br w:type="page"/></w:r></w:p><w:tbl><w:tblGrid><w:gridCol w:w="4600" w:type="dxa"/><w:gridCol w:w="4600" w:type="dxa"/></w:tblGrid><w:tblPr><w:tblStyle w:val="BoxTable"/></w:tblPr><w:tr><w:trPr/><w:tc><w:tcPr><w:tcW w:w="4600" w:type="dxa"/><w:noWrap/></w:tcPr><w:p><w:pPr/><w:r><w:rPr><w:rFonts w:ascii="Times New Roman" w:hAnsi="Times New Roman" w:eastAsia="Times New Roman" w:cs="Times New Roman"/><w:sz w:val="19"/><w:szCs w:val="19"/><w:b w:val="1"/><w:bCs w:val="1"/></w:rPr><w:t xml:space="preserve">SISTEM : APLIKASI TRISULA TNI AD</w:t></w:r></w:p></w:tc><w:tc><w:tcPr><w:tcW w:w="4600" w:type="dxa"/><w:noWrap/></w:tcPr><w:p><w:pPr/><w:r><w:rPr><w:rFonts w:ascii="Times New Roman" w:hAnsi="Times New Roman" w:eastAsia="Times New Roman" w:cs="Times New Roman"/><w:sz w:val="19"/><w:szCs w:val="19"/><w:b w:val="1"/><w:bCs w:val="1"/></w:rPr><w:t xml:space="preserve">NAMA PROGRAM : DOSIR_UPLOAD.PHP</w:t></w:r></w:p><w:p><w:pPr/><w:r><w:rPr><w:rFonts w:ascii="Times New Roman" w:hAnsi="Times New Roman" w:eastAsia="Times New Roman" w:cs="Times New Roman"/><w:sz w:val="19"/><w:szCs w:val="19"/><w:b w:val="1"/><w:bCs w:val="1"/></w:rPr><w:t xml:space="preserve">NAMA FORM    : FO_UNGGAH_SCAN_DOSIR</w:t></w:r></w:p></w:tc></w:tr><w:tr><w:trPr/><w:tc><w:tcPr><w:tcW w:w="4600" w:type="dxa"/><w:noWrap/></w:tcPr><w:p><w:pPr/><w:r><w:rPr><w:rFonts w:ascii="Times New Roman" w:hAnsi="Times New Roman" w:eastAsia="Times New Roman" w:cs="Times New Roman"/><w:sz w:val="19"/><w:szCs w:val="19"/><w:b w:val="1"/><w:bCs w:val="1"/></w:rPr><w:t xml:space="preserve">FUNGSI PROGRAM :</w:t></w:r></w:p><w:p><w:pPr/><w:r><w:rPr><w:rFonts w:ascii="Times New Roman" w:hAnsi="Times New Roman" w:eastAsia="Times New Roman" w:cs="Times New Roman"/><w:sz w:val="19"/><w:szCs w:val="19"/></w:rPr><w:t xml:space="preserve">Digitalisasi 33 Dosir Baku, Penamaan File Otomatis Indeks Abjad, & Penataan Folder Fisik Terisolasi</w:t></w:r></w:p></w:tc><w:tc><w:tcPr><w:tcW w:w="4600" w:type="dxa"/><w:noWrap/></w:tcPr><w:p><w:pPr/><w:r><w:rPr><w:rFonts w:ascii="Times New Roman" w:hAnsi="Times New Roman" w:eastAsia="Times New Roman" w:cs="Times New Roman"/><w:sz w:val="19"/><w:szCs w:val="19"/><w:b w:val="1"/><w:bCs w:val="1"/></w:rPr><w:t xml:space="preserve">BAHASA     : PHP 8.3 PDO + jsPDF Library</w:t></w:r></w:p><w:p><w:pPr/><w:r><w:rPr><w:rFonts w:ascii="Times New Roman" w:hAnsi="Times New Roman" w:eastAsia="Times New Roman" w:cs="Times New Roman"/><w:sz w:val="19"/><w:szCs w:val="19"/><w:b w:val="1"/><w:bCs w:val="1"/></w:rPr><w:t xml:space="preserve">DIBUAT OLEH: Letda Czi Fris Wardani</w:t></w:r></w:p></w:tc></w:tr><w:tr><w:trPr/><w:tc><w:tcPr><w:tcW w:w="9200" w:type="dxa"/><w:gridSpan w:val="2"/><w:noWrap/></w:tcPr><w:p><w:pPr><w:spacing w:after="40"/></w:pPr><w:r><w:rPr><w:rFonts w:ascii="Times New Roman" w:hAnsi="Times New Roman" w:eastAsia="Times New Roman" w:cs="Times New Roman"/><w:sz w:val="19"/><w:szCs w:val="19"/><w:b w:val="1"/><w:bCs w:val="1"/></w:rPr><w:t xml:space="preserve">PROSEDUR PENGOLAHAN :</w:t></w:r></w:p><w:p><w:pPr><w:spacing w:after="20"/></w:pPr><w:r><w:rPr><w:rFonts w:ascii="Times New Roman" w:hAnsi="Times New Roman" w:eastAsia="Times New Roman" w:cs="Times New Roman"/><w:sz w:val="19"/><w:szCs w:val="19"/></w:rPr><w:t xml:space="preserve">• Personel memilih kode jenis dosir (01 s.d. 33) yang akan diunggah.</w:t></w:r></w:p><w:p><w:pPr><w:spacing w:after="20"/></w:pPr><w:r><w:rPr><w:rFonts w:ascii="Times New Roman" w:hAnsi="Times New Roman" w:eastAsia="Times New Roman" w:cs="Times New Roman"/><w:sz w:val="19"/><w:szCs w:val="19"/></w:rPr><w:t xml:space="preserve">• Menerima masukan berkas PDF baik melalui pengunggahan file konvensional maupun konversi hasil scan kamera (jsPDF client-side).</w:t></w:r></w:p><w:p><w:pPr><w:spacing w:after="20"/></w:pPr><w:r><w:rPr><w:rFonts w:ascii="Times New Roman" w:hAnsi="Times New Roman" w:eastAsia="Times New Roman" w:cs="Times New Roman"/><w:sz w:val="19"/><w:szCs w:val="19"/></w:rPr><w:t xml:space="preserve">• Validasi file: ekstensi wajib .pdf, validasi tipe MIME via finfo_file(), dan batas ukuran maks 10 MB.</w:t></w:r></w:p><w:p><w:pPr><w:spacing w:after="20"/></w:pPr><w:r><w:rPr><w:rFonts w:ascii="Times New Roman" w:hAnsi="Times New Roman" w:eastAsia="Times New Roman" w:cs="Times New Roman"/><w:sz w:val="19"/><w:szCs w:val="19"/></w:rPr><w:t xml:space="preserve">• Memeriksa apakah berkas pada slot dosir tersebut sudah ada pada tabel dosir_files.</w:t></w:r></w:p><w:p><w:pPr><w:spacing w:after="20"/></w:pPr><w:r><w:rPr><w:rFonts w:ascii="Times New Roman" w:hAnsi="Times New Roman" w:eastAsia="Times New Roman" w:cs="Times New Roman"/><w:sz w:val="19"/><w:szCs w:val="19"/></w:rPr><w:t xml:space="preserve">• Jika berkas pertama: abjad bernilai NULL, nama file = "{NRP}_{KODE}.pdf".</w:t></w:r></w:p><w:p><w:pPr><w:spacing w:after="20"/></w:pPr><w:r><w:rPr><w:rFonts w:ascii="Times New Roman" w:hAnsi="Times New Roman" w:eastAsia="Times New Roman" w:cs="Times New Roman"/><w:sz w:val="19"/><w:szCs w:val="19"/></w:rPr><w:t xml:space="preserve">• Jika berkas kedua dst: sistem menghitung urutan abjad otomatis ('a', 'b', 'c', ...) dan membentuk nama file "{NRP}_{KODE}{abjad}.pdf".</w:t></w:r></w:p><w:p><w:pPr><w:spacing w:after="20"/></w:pPr><w:r><w:rPr><w:rFonts w:ascii="Times New Roman" w:hAnsi="Times New Roman" w:eastAsia="Times New Roman" w:cs="Times New Roman"/><w:sz w:val="19"/><w:szCs w:val="19"/></w:rPr><w:t xml:space="preserve">• Memastikan direktori tujuan uploads/FOLDER {kode}/ telah tercipta (jika belum, dibuat otomatis dengan izin 0755).</w:t></w:r></w:p><w:p><w:pPr><w:spacing w:after="20"/></w:pPr><w:r><w:rPr><w:rFonts w:ascii="Times New Roman" w:hAnsi="Times New Roman" w:eastAsia="Times New Roman" w:cs="Times New Roman"/><w:sz w:val="19"/><w:szCs w:val="19"/></w:rPr><w:t xml:space="preserve">• Memindahkan berkas fisik ke direktori tujuan dan menyimpan berkas master bersih ke raw_file_path.</w:t></w:r></w:p><w:p><w:pPr><w:spacing w:after="20"/></w:pPr><w:r><w:rPr><w:rFonts w:ascii="Times New Roman" w:hAnsi="Times New Roman" w:eastAsia="Times New Roman" w:cs="Times New Roman"/><w:sz w:val="19"/><w:szCs w:val="19"/></w:rPr><w:t xml:space="preserve">• Membubuhkan tanda air sementara (Pending Approval) dan mencatat metadata pada tabel dosir_files dengan status "pending".</w:t></w:r></w:p></w:tc></w:tr></w:tbl><w:p/><w:tbl><w:tblGrid><w:gridCol w:w="4600" w:type="dxa"/><w:gridCol w:w="4600" w:type="dxa"/></w:tblGrid><w:tblPr><w:tblStyle w:val="BoxTable"/></w:tblPr><w:tr><w:trPr/><w:tc><w:tcPr><w:tcW w:w="4600" w:type="dxa"/><w:noWrap/></w:tcPr><w:p><w:pPr/><w:r><w:rPr><w:rFonts w:ascii="Times New Roman" w:hAnsi="Times New Roman" w:eastAsia="Times New Roman" w:cs="Times New Roman"/><w:sz w:val="19"/><w:szCs w:val="19"/><w:b w:val="1"/><w:bCs w:val="1"/></w:rPr><w:t xml:space="preserve">SISTEM : APLIKASI TRISULA TNI AD</w:t></w:r></w:p></w:tc><w:tc><w:tcPr><w:tcW w:w="4600" w:type="dxa"/><w:noWrap/></w:tcPr><w:p><w:pPr/><w:r><w:rPr><w:rFonts w:ascii="Times New Roman" w:hAnsi="Times New Roman" w:eastAsia="Times New Roman" w:cs="Times New Roman"/><w:sz w:val="19"/><w:szCs w:val="19"/><w:b w:val="1"/><w:bCs w:val="1"/></w:rPr><w:t xml:space="preserve">NAMA PROGRAM : DOSIR_VERIFY_PROCESS.PHP</w:t></w:r></w:p><w:p><w:pPr/><w:r><w:rPr><w:rFonts w:ascii="Times New Roman" w:hAnsi="Times New Roman" w:eastAsia="Times New Roman" w:cs="Times New Roman"/><w:sz w:val="19"/><w:szCs w:val="19"/><w:b w:val="1"/><w:bCs w:val="1"/></w:rPr><w:t xml:space="preserve">NAMA FORM    : FO_VERIFIKASI_TTE_DOSIR</w:t></w:r></w:p></w:tc></w:tr><w:tr><w:trPr/><w:tc><w:tcPr><w:tcW w:w="4600" w:type="dxa"/><w:noWrap/></w:tcPr><w:p><w:pPr/><w:r><w:rPr><w:rFonts w:ascii="Times New Roman" w:hAnsi="Times New Roman" w:eastAsia="Times New Roman" w:cs="Times New Roman"/><w:sz w:val="19"/><w:szCs w:val="19"/><w:b w:val="1"/><w:bCs w:val="1"/></w:rPr><w:t xml:space="preserve">FUNGSI PROGRAM :</w:t></w:r></w:p><w:p><w:pPr/><w:r><w:rPr><w:rFonts w:ascii="Times New Roman" w:hAnsi="Times New Roman" w:eastAsia="Times New Roman" w:cs="Times New Roman"/><w:sz w:val="19"/><w:szCs w:val="19"/></w:rPr><w:t xml:space="preserve">Verifikasi Berkas, Perhitungan Checksum SHA-256, & Penerbitan Sertifikasi TTE Resmi Ber-QR Code</w:t></w:r></w:p></w:tc><w:tc><w:tcPr><w:tcW w:w="4600" w:type="dxa"/><w:noWrap/></w:tcPr><w:p><w:pPr/><w:r><w:rPr><w:rFonts w:ascii="Times New Roman" w:hAnsi="Times New Roman" w:eastAsia="Times New Roman" w:cs="Times New Roman"/><w:sz w:val="19"/><w:szCs w:val="19"/><w:b w:val="1"/><w:bCs w:val="1"/></w:rPr><w:t xml:space="preserve">BAHASA     : PHP 8.3 PDO + FPDI + TCPDF</w:t></w:r></w:p><w:p><w:pPr/><w:r><w:rPr><w:rFonts w:ascii="Times New Roman" w:hAnsi="Times New Roman" w:eastAsia="Times New Roman" w:cs="Times New Roman"/><w:sz w:val="19"/><w:szCs w:val="19"/><w:b w:val="1"/><w:bCs w:val="1"/></w:rPr><w:t xml:space="preserve">DIBUAT OLEH: Letda Czi Fris Wardani</w:t></w:r></w:p></w:tc></w:tr><w:tr><w:trPr/><w:tc><w:tcPr><w:tcW w:w="9200" w:type="dxa"/><w:gridSpan w:val="2"/><w:noWrap/></w:tcPr><w:p><w:pPr><w:spacing w:after="40"/></w:pPr><w:r><w:rPr><w:rFonts w:ascii="Times New Roman" w:hAnsi="Times New Roman" w:eastAsia="Times New Roman" w:cs="Times New Roman"/><w:sz w:val="19"/><w:szCs w:val="19"/><w:b w:val="1"/><w:bCs w:val="1"/></w:rPr><w:t xml:space="preserve">PROSEDUR PENGOLAHAN :</w:t></w:r></w:p><w:p><w:pPr><w:spacing w:after="20"/></w:pPr><w:r><w:rPr><w:rFonts w:ascii="Times New Roman" w:hAnsi="Times New Roman" w:eastAsia="Times New Roman" w:cs="Times New Roman"/><w:sz w:val="19"/><w:szCs w:val="19"/></w:rPr><w:t xml:space="preserve">• Administrator membuka antrean berkas dosir pending pada halaman dosir_verify.php.</w:t></w:r></w:p><w:p><w:pPr><w:spacing w:after="20"/></w:pPr><w:r><w:rPr><w:rFonts w:ascii="Times New Roman" w:hAnsi="Times New Roman" w:eastAsia="Times New Roman" w:cs="Times New Roman"/><w:sz w:val="19"/><w:szCs w:val="19"/></w:rPr><w:t xml:space="preserve">• Admin meninjau kelayakan dan keaslian fisik warkat digital melalui pratinjau dokumen terintegrasi.</w:t></w:r></w:p><w:p><w:pPr><w:spacing w:after="20"/></w:pPr><w:r><w:rPr><w:rFonts w:ascii="Times New Roman" w:hAnsi="Times New Roman" w:eastAsia="Times New Roman" w:cs="Times New Roman"/><w:sz w:val="19"/><w:szCs w:val="19"/></w:rPr><w:t xml:space="preserve">• Jika Admin memilih opsi REJECT: status berkas diubah menjadi "rejected", catatan evaluasi verifikasi disimpan, dan personel diberikan akses unggah ulang berkas perbaikan.</w:t></w:r></w:p><w:p><w:pPr><w:spacing w:after="20"/></w:pPr><w:r><w:rPr><w:rFonts w:ascii="Times New Roman" w:hAnsi="Times New Roman" w:eastAsia="Times New Roman" w:cs="Times New Roman"/><w:sz w:val="19"/><w:szCs w:val="19"/></w:rPr><w:t xml:space="preserve">• Jika Admin memilih opsi APPROVE: sistem memproses sertifikasi digital resmi :</w:t></w:r></w:p><w:p><w:pPr><w:spacing w:after="20"/></w:pPr><w:r><w:rPr><w:rFonts w:ascii="Times New Roman" w:hAnsi="Times New Roman" w:eastAsia="Times New Roman" w:cs="Times New Roman"/><w:sz w:val="19"/><w:szCs w:val="19"/></w:rPr><w:t xml:space="preserve">•    a) Mengambil berkas master asli bersih dari kolom raw_file_path (menghilangkan watermark pending secara permanen).</w:t></w:r></w:p><w:p><w:pPr><w:spacing w:after="20"/></w:pPr><w:r><w:rPr><w:rFonts w:ascii="Times New Roman" w:hAnsi="Times New Roman" w:eastAsia="Times New Roman" w:cs="Times New Roman"/><w:sz w:val="19"/><w:szCs w:val="19"/></w:rPr><w:t xml:space="preserve">•    b) Menghitung nilai cryptographic checksum SHA-256 berkas master sebagai segel integritas anti-pemalsuan.</w:t></w:r></w:p><w:p><w:pPr><w:spacing w:after="20"/></w:pPr><w:r><w:rPr><w:rFonts w:ascii="Times New Roman" w:hAnsi="Times New Roman" w:eastAsia="Times New Roman" w:cs="Times New Roman"/><w:sz w:val="19"/><w:szCs w:val="19"/></w:rPr><w:t xml:space="preserve">•    c) Meng-generate kode unik TTE resmi: "TTE-TRISULA-{YYYYMM}-{ID}-{TOKEN6}".</w:t></w:r></w:p><w:p><w:pPr><w:spacing w:after="20"/></w:pPr><w:r><w:rPr><w:rFonts w:ascii="Times New Roman" w:hAnsi="Times New Roman" w:eastAsia="Times New Roman" w:cs="Times New Roman"/><w:sz w:val="19"/><w:szCs w:val="19"/></w:rPr><w:t xml:space="preserve">•    d) Membentuk URL verifikasi publik ber-QR Code: "https://domain/verify.php?code=...".</w:t></w:r></w:p><w:p><w:pPr><w:spacing w:after="20"/></w:pPr><w:r><w:rPr><w:rFonts w:ascii="Times New Roman" w:hAnsi="Times New Roman" w:eastAsia="Times New Roman" w:cs="Times New Roman"/><w:sz w:val="19"/><w:szCs w:val="19"/></w:rPr><w:t xml:space="preserve">•    e) Mengambil data profil pejabat penandatangan (Nama Admin, Pangkat, NRP, Satuan).</w:t></w:r></w:p><w:p><w:pPr><w:spacing w:after="20"/></w:pPr><w:r><w:rPr><w:rFonts w:ascii="Times New Roman" w:hAnsi="Times New Roman" w:eastAsia="Times New Roman" w:cs="Times New Roman"/><w:sz w:val="19"/><w:szCs w:val="19"/></w:rPr><w:t xml:space="preserve">•    f) Membuka berkas menggunakan pustaka FPDI + TCPDF; menyematkan Running Line Otentikasi pada seluruh halaman dan membubuhkan Kotak Stempel TTE Resmi ber-QR Code pada sudut kanan bawah halaman terakhir.</w:t></w:r></w:p><w:p><w:pPr><w:spacing w:after="20"/></w:pPr><w:r><w:rPr><w:rFonts w:ascii="Times New Roman" w:hAnsi="Times New Roman" w:eastAsia="Times New Roman" w:cs="Times New Roman"/><w:sz w:val="19"/><w:szCs w:val="19"/></w:rPr><w:t xml:space="preserve">•    g) Menyimpan berkas hasil TTE, memperbarui status dosir_files menjadi "approved", mengisi signature_code dan signature_hash, serta mencatat log audit pada activity_log.</w:t></w:r></w:p></w:tc></w:tr></w:tbl><w:p/><w:p><w:r><w:br w:type="page"/></w:r></w:p><w:p><w:pPr><w:jc w:val="start"/><w:spacing w:after="60"/></w:pPr><w:r><w:rPr><w:rFonts w:ascii="Times New Roman" w:hAnsi="Times New Roman" w:eastAsia="Times New Roman" w:cs="Times New Roman"/><w:sz w:val="24"/><w:szCs w:val="24"/><w:b w:val="1"/><w:bCs w:val="1"/></w:rPr><w:t xml:space="preserve">15.  Bentuk Tampilan Dan Cetakan.</w:t></w:r></w:p><w:p><w:pPr><w:jc w:val="both"/><w:spacing w:after="80" w:line="276" w:lineRule="auto"/></w:pPr><w:r><w:rPr><w:rFonts w:ascii="Times New Roman" w:hAnsi="Times New Roman" w:eastAsia="Times New Roman" w:cs="Times New Roman"/><w:sz w:val="23"/><w:szCs w:val="23"/></w:rPr><w:t xml:space="preserve">Bentuk tampilan dan cetakan memuat rancangan antarmuka visual pada layar monitor (display) serta tata letak dokumen keluaran siap cetak melalui printer berformat kedinasan TNI Angkatan Darat.</w:t></w:r></w:p><w:p/><w:p><w:pPr><w:jc w:val="start"/><w:spacing w:after="60"/></w:pPr><w:r><w:rPr><w:rFonts w:ascii="Times New Roman" w:hAnsi="Times New Roman" w:eastAsia="Times New Roman" w:cs="Times New Roman"/><w:sz w:val="24"/><w:szCs w:val="24"/><w:b w:val="1"/><w:bCs w:val="1"/></w:rPr><w:t xml:space="preserve">a.   Bentuk Tampilan Layar (Display Interfaces).</w:t></w:r></w:p><w:p><w:pPr><w:jc w:val="start"/><w:spacing w:after="60"/></w:pPr><w:r><w:rPr><w:rFonts w:ascii="Times New Roman" w:hAnsi="Times New Roman" w:eastAsia="Times New Roman" w:cs="Times New Roman"/><w:sz w:val="23"/><w:szCs w:val="23"/><w:b w:val="1"/><w:bCs w:val="1"/></w:rPr><w:t xml:space="preserve">1)   Bentuk Tampilan Antarmuka Halaman Masuk (Login Display) :</w:t></w:r></w:p><w:tbl><w:tblGrid><w:gridCol w:w="9200" w:type="dxa"/></w:tblGrid><w:tblPr><w:tblStyle w:val="BoxTable"/></w:tblPr><w:tr><w:trPr/><w:tc><w:tcPr><w:tcW w:w="9200" w:type="dxa"/><w:shd w:val="clear" w:fill="F2F6F2"/><w:noWrap/></w:tcPr><w:p><w:pPr><w:jc w:val="center"/><w:spacing w:after="60"/></w:pPr><w:r><w:rPr><w:rFonts w:ascii="Consolas" w:hAnsi="Consolas" w:eastAsia="Consolas" w:cs="Consolas"/><w:sz w:val="17"/><w:szCs w:val="17"/></w:rPr><w:t xml:space="preserve">┌────────────────────────────────────────────────────────────────────────┐</w:t></w:r></w:p><w:p><w:pPr><w:jc w:val="center"/><w:spacing w:after="60"/></w:pPr><w:r><w:rPr><w:rFonts w:ascii="Consolas" w:hAnsi="Consolas" w:eastAsia="Consolas" w:cs="Consolas"/><w:sz w:val="17"/><w:szCs w:val="17"/></w:rPr><w:t xml:space="preserve">│                               ★ ★ ★                                    │</w:t></w:r></w:p><w:p><w:pPr><w:jc w:val="center"/><w:spacing w:after="60"/></w:pPr><w:r><w:rPr><w:rFonts w:ascii="Consolas" w:hAnsi="Consolas" w:eastAsia="Consolas" w:cs="Consolas"/><w:sz w:val="17"/><w:szCs w:val="17"/></w:rPr><w:t xml:space="preserve">│                           TRISULA TNI AD                               │</w:t></w:r></w:p><w:p><w:pPr><w:jc w:val="center"/><w:spacing w:after="60"/></w:pPr><w:r><w:rPr><w:rFonts w:ascii="Consolas" w:hAnsi="Consolas" w:eastAsia="Consolas" w:cs="Consolas"/><w:sz w:val="17"/><w:szCs w:val="17"/></w:rPr><w:t xml:space="preserve">│     Tata Kelola Rekam Informasi, Sistematika, & Unduhan Lengkap Arsip  │</w:t></w:r></w:p><w:p><w:pPr><w:jc w:val="center"/><w:spacing w:after="60"/></w:pPr><w:r><w:rPr><w:rFonts w:ascii="Consolas" w:hAnsi="Consolas" w:eastAsia="Consolas" w:cs="Consolas"/><w:sz w:val="17"/><w:szCs w:val="17"/></w:rPr><w:t xml:space="preserve">├────────────────────────────────────────────────────────────────────────┤</w:t></w:r></w:p><w:p><w:pPr><w:jc w:val="center"/><w:spacing w:after="60"/></w:pPr><w:r><w:rPr><w:rFonts w:ascii="Consolas" w:hAnsi="Consolas" w:eastAsia="Consolas" w:cs="Consolas"/><w:sz w:val="17"/><w:szCs w:val="17"/></w:rPr><w:t xml:space="preserve">│  Username / NRP   : [                                                ] │</w:t></w:r></w:p><w:p><w:pPr><w:jc w:val="center"/><w:spacing w:after="60"/></w:pPr><w:r><w:rPr><w:rFonts w:ascii="Consolas" w:hAnsi="Consolas" w:eastAsia="Consolas" w:cs="Consolas"/><w:sz w:val="17"/><w:szCs w:val="17"/></w:rPr><w:t xml:space="preserve">│  Kata Sandi       : [                                                ] │</w:t></w:r></w:p><w:p><w:pPr><w:jc w:val="center"/><w:spacing w:after="60"/></w:pPr><w:r><w:rPr><w:rFonts w:ascii="Consolas" w:hAnsi="Consolas" w:eastAsia="Consolas" w:cs="Consolas"/><w:sz w:val="17"/><w:szCs w:val="17"/></w:rPr><w:t xml:space="preserve">│                     [          TOMBOL MASUK SISTEM         ]           │</w:t></w:r></w:p><w:p><w:pPr><w:jc w:val="center"/><w:spacing w:after="60"/></w:pPr><w:r><w:rPr><w:rFonts w:ascii="Consolas" w:hAnsi="Consolas" w:eastAsia="Consolas" w:cs="Consolas"/><w:sz w:val="17"/><w:szCs w:val="17"/></w:rPr><w:t xml:space="preserve">│                                                                        │</w:t></w:r></w:p><w:p><w:pPr><w:jc w:val="center"/><w:spacing w:after="60"/></w:pPr><w:r><w:rPr><w:rFonts w:ascii="Consolas" w:hAnsi="Consolas" w:eastAsia="Consolas" w:cs="Consolas"/><w:sz w:val="17"/><w:szCs w:val="17"/></w:rPr><w:t xml:space="preserve">│  Belum memiliki akun? Registrasi Personel Baru                         │</w:t></w:r></w:p><w:p><w:pPr><w:jc w:val="center"/><w:spacing w:after="60"/></w:pPr><w:r><w:rPr><w:rFonts w:ascii="Consolas" w:hAnsi="Consolas" w:eastAsia="Consolas" w:cs="Consolas"/><w:sz w:val="17"/><w:szCs w:val="17"/></w:rPr><w:t xml:space="preserve">└────────────────────────────────────────────────────────────────────────┘</w:t></w:r></w:p></w:tc></w:tr></w:tbl><w:p/><w:p><w:pPr><w:jc w:val="start"/><w:spacing w:after="60"/></w:pPr><w:r><w:rPr><w:rFonts w:ascii="Times New Roman" w:hAnsi="Times New Roman" w:eastAsia="Times New Roman" w:cs="Times New Roman"/><w:sz w:val="23"/><w:szCs w:val="23"/><w:b w:val="1"/><w:bCs w:val="1"/></w:rPr><w:t xml:space="preserve">2)   Bentuk Tampilan Dashboard Monitoring 33 Dosir Personel :</w:t></w:r></w:p><w:tbl><w:tblGrid><w:gridCol w:w="9200" w:type="dxa"/></w:tblGrid><w:tblPr><w:tblStyle w:val="BoxTable"/></w:tblPr><w:tr><w:trPr/><w:tc><w:tcPr><w:tcW w:w="9200" w:type="dxa"/><w:shd w:val="clear" w:fill="F2F6F2"/><w:noWrap/></w:tcPr><w:p><w:pPr><w:jc w:val="center"/><w:spacing w:after="60"/></w:pPr><w:r><w:rPr><w:rFonts w:ascii="Consolas" w:hAnsi="Consolas" w:eastAsia="Consolas" w:cs="Consolas"/><w:sz w:val="17"/><w:szCs w:val="17"/></w:rPr><w:t xml:space="preserve">┌────────────────────────────────────────────────────────────────────────┐</w:t></w:r></w:p><w:p><w:pPr><w:jc w:val="center"/><w:spacing w:after="60"/></w:pPr><w:r><w:rPr><w:rFonts w:ascii="Consolas" w:hAnsi="Consolas" w:eastAsia="Consolas" w:cs="Consolas"/><w:sz w:val="17"/><w:szCs w:val="17"/></w:rPr><w:t xml:space="preserve">│ TRISULA TNI AD │ Dashboard | Unggah Dosir | Scan Kamera | Profil Saya   │</w:t></w:r></w:p><w:p><w:pPr><w:jc w:val="center"/><w:spacing w:after="60"/></w:pPr><w:r><w:rPr><w:rFonts w:ascii="Consolas" w:hAnsi="Consolas" w:eastAsia="Consolas" w:cs="Consolas"/><w:sz w:val="17"/><w:szCs w:val="17"/></w:rPr><w:t xml:space="preserve">├────────────────────────────────────────────────────────────────────────┤</w:t></w:r></w:p><w:p><w:pPr><w:jc w:val="center"/><w:spacing w:after="60"/></w:pPr><w:r><w:rPr><w:rFonts w:ascii="Consolas" w:hAnsi="Consolas" w:eastAsia="Consolas" w:cs="Consolas"/><w:sz w:val="17"/><w:szCs w:val="17"/></w:rPr><w:t xml:space="preserve">│ PROFIL PRAJURIT: Letda Czi Fris Wardani | NRP 2118... | Denzibang...   │</w:t></w:r></w:p><w:p><w:pPr><w:jc w:val="center"/><w:spacing w:after="60"/></w:pPr><w:r><w:rPr><w:rFonts w:ascii="Consolas" w:hAnsi="Consolas" w:eastAsia="Consolas" w:cs="Consolas"/><w:sz w:val="17"/><w:szCs w:val="17"/></w:rPr><w:t xml:space="preserve">│ STATUS KELENGKAPAN DOSIR : [██████████████████░░░░░░░░░░] 64% (21/33)  │</w:t></w:r></w:p><w:p><w:pPr><w:jc w:val="center"/><w:spacing w:after="60"/></w:pPr><w:r><w:rPr><w:rFonts w:ascii="Consolas" w:hAnsi="Consolas" w:eastAsia="Consolas" w:cs="Consolas"/><w:sz w:val="17"/><w:szCs w:val="17"/></w:rPr><w:t xml:space="preserve">├──────┬───────────────────────────────┬──────────────┬──────────────────┤</w:t></w:r></w:p><w:p><w:pPr><w:jc w:val="center"/><w:spacing w:after="60"/></w:pPr><w:r><w:rPr><w:rFonts w:ascii="Consolas" w:hAnsi="Consolas" w:eastAsia="Consolas" w:cs="Consolas"/><w:sz w:val="17"/><w:szCs w:val="17"/></w:rPr><w:t xml:space="preserve">│ KODE │ NAMA JENIS DOSIR (33 BAKU)    │ STATUS       │ AKSI DOKUMEN     │</w:t></w:r></w:p><w:p><w:pPr><w:jc w:val="center"/><w:spacing w:after="60"/></w:pPr><w:r><w:rPr><w:rFonts w:ascii="Consolas" w:hAnsi="Consolas" w:eastAsia="Consolas" w:cs="Consolas"/><w:sz w:val="17"/><w:szCs w:val="17"/></w:rPr><w:t xml:space="preserve">├──────┼───────────────────────────────┼──────────────┼──────────────────┤</w:t></w:r></w:p><w:p><w:pPr><w:jc w:val="center"/><w:spacing w:after="60"/></w:pPr><w:r><w:rPr><w:rFonts w:ascii="Consolas" w:hAnsi="Consolas" w:eastAsia="Consolas" w:cs="Consolas"/><w:sz w:val="17"/><w:szCs w:val="17"/></w:rPr><w:t xml:space="preserve">│  01  │ SURAT LAMARAN                 │ APPROVED     │ [Lihat PDF TTE]  │</w:t></w:r></w:p><w:p><w:pPr><w:jc w:val="center"/><w:spacing w:after="60"/></w:pPr><w:r><w:rPr><w:rFonts w:ascii="Consolas" w:hAnsi="Consolas" w:eastAsia="Consolas" w:cs="Consolas"/><w:sz w:val="17"/><w:szCs w:val="17"/></w:rPr><w:t xml:space="preserve">│  02  │ AKTE KELAHIRAN YBS            │ APPROVED     │ [Lihat PDF TTE]  │</w:t></w:r></w:p><w:p><w:pPr><w:jc w:val="center"/><w:spacing w:after="60"/></w:pPr><w:r><w:rPr><w:rFonts w:ascii="Consolas" w:hAnsi="Consolas" w:eastAsia="Consolas" w:cs="Consolas"/><w:sz w:val="17"/><w:szCs w:val="17"/></w:rPr><w:t xml:space="preserve">│  05  │ IJASAH STTB (DIKUM)           │ PENDING      │ [Menunggu Admin] │</w:t></w:r></w:p><w:p><w:pPr><w:jc w:val="center"/><w:spacing w:after="60"/></w:pPr><w:r><w:rPr><w:rFonts w:ascii="Consolas" w:hAnsi="Consolas" w:eastAsia="Consolas" w:cs="Consolas"/><w:sz w:val="17"/><w:szCs w:val="17"/></w:rPr><w:t xml:space="preserve">│  16  │ IJASAH DIKMIL (DIKPAPROG)     │ KOSONG       │ [Unggah / Scan]  │</w:t></w:r></w:p><w:p><w:pPr><w:jc w:val="center"/><w:spacing w:after="60"/></w:pPr><w:r><w:rPr><w:rFonts w:ascii="Consolas" w:hAnsi="Consolas" w:eastAsia="Consolas" w:cs="Consolas"/><w:sz w:val="17"/><w:szCs w:val="17"/></w:rPr><w:t xml:space="preserve">└──────┴───────────────────────────────┴──────────────┴──────────────────┘</w:t></w:r></w:p></w:tc></w:tr></w:tbl><w:p/><w:p><w:pPr><w:jc w:val="start"/><w:spacing w:after="60"/></w:pPr><w:r><w:rPr><w:rFonts w:ascii="Times New Roman" w:hAnsi="Times New Roman" w:eastAsia="Times New Roman" w:cs="Times New Roman"/><w:sz w:val="23"/><w:szCs w:val="23"/><w:b w:val="1"/><w:bCs w:val="1"/></w:rPr><w:t xml:space="preserve">3)   Bentuk Tampilan Verifikasi Keabsahan TTE Publik (verify.php) :</w:t></w:r></w:p><w:tbl><w:tblGrid><w:gridCol w:w="9200" w:type="dxa"/></w:tblGrid><w:tblPr><w:tblStyle w:val="BoxTable"/></w:tblPr><w:tr><w:trPr/><w:tc><w:tcPr><w:tcW w:w="9200" w:type="dxa"/><w:shd w:val="clear" w:fill="F2F6F2"/><w:noWrap/></w:tcPr><w:p><w:pPr><w:jc w:val="center"/><w:spacing w:after="60"/></w:pPr><w:r><w:rPr><w:rFonts w:ascii="Consolas" w:hAnsi="Consolas" w:eastAsia="Consolas" w:cs="Consolas"/><w:sz w:val="17"/><w:szCs w:val="17"/></w:rPr><w:t xml:space="preserve">┌────────────────────────────────────────────────────────────────────────┐</w:t></w:r></w:p><w:p><w:pPr><w:jc w:val="center"/><w:spacing w:after="60"/></w:pPr><w:r><w:rPr><w:rFonts w:ascii="Consolas" w:hAnsi="Consolas" w:eastAsia="Consolas" w:cs="Consolas"/><w:sz w:val="17"/><w:szCs w:val="17"/></w:rPr><w:t xml:space="preserve">│              ✓ DOKUMEN SAH & TERVERIFIKASI SECARA ELEKTRONIK           │</w:t></w:r></w:p><w:p><w:pPr><w:jc w:val="center"/><w:spacing w:after="60"/></w:pPr><w:r><w:rPr><w:rFonts w:ascii="Consolas" w:hAnsi="Consolas" w:eastAsia="Consolas" w:cs="Consolas"/><w:sz w:val="17"/><w:szCs w:val="17"/></w:rPr><w:t xml:space="preserve">│                  KODE REGISTRASI: TTE-TRISULA-202609-12-8A9F           │</w:t></w:r></w:p><w:p><w:pPr><w:jc w:val="center"/><w:spacing w:after="60"/></w:pPr><w:r><w:rPr><w:rFonts w:ascii="Consolas" w:hAnsi="Consolas" w:eastAsia="Consolas" w:cs="Consolas"/><w:sz w:val="17"/><w:szCs w:val="17"/></w:rPr><w:t xml:space="preserve">├────────────────────────────────────────────────────────────────────────┤</w:t></w:r></w:p><w:p><w:pPr><w:jc w:val="center"/><w:spacing w:after="60"/></w:pPr><w:r><w:rPr><w:rFonts w:ascii="Consolas" w:hAnsi="Consolas" w:eastAsia="Consolas" w:cs="Consolas"/><w:sz w:val="17"/><w:szCs w:val="17"/></w:rPr><w:t xml:space="preserve">│ Jenis Dosir    : DOSIR 16 — IJASAH DIKMIL / SAR / TUK / CAB            │</w:t></w:r></w:p><w:p><w:pPr><w:jc w:val="center"/><w:spacing w:after="60"/></w:pPr><w:r><w:rPr><w:rFonts w:ascii="Consolas" w:hAnsi="Consolas" w:eastAsia="Consolas" w:cs="Consolas"/><w:sz w:val="17"/><w:szCs w:val="17"/></w:rPr><w:t xml:space="preserve">│ Nama Personel  : Letda Czi Fris Wardani (NRP 2118...)                  │</w:t></w:r></w:p><w:p><w:pPr><w:jc w:val="center"/><w:spacing w:after="60"/></w:pPr><w:r><w:rPr><w:rFonts w:ascii="Consolas" w:hAnsi="Consolas" w:eastAsia="Consolas" w:cs="Consolas"/><w:sz w:val="17"/><w:szCs w:val="17"/></w:rPr><w:t xml:space="preserve">│ Pangkat/Satuan : Letda Czi / Denzibang 3/I Jaya                        │</w:t></w:r></w:p><w:p><w:pPr><w:jc w:val="center"/><w:spacing w:after="60"/></w:pPr><w:r><w:rPr><w:rFonts w:ascii="Consolas" w:hAnsi="Consolas" w:eastAsia="Consolas" w:cs="Consolas"/><w:sz w:val="17"/><w:szCs w:val="17"/></w:rPr><w:t xml:space="preserve">│ Pejabat TTE    : Mayor Inf Hendra Pratama (Kasi Pers)                  │</w:t></w:r></w:p><w:p><w:pPr><w:jc w:val="center"/><w:spacing w:after="60"/></w:pPr><w:r><w:rPr><w:rFonts w:ascii="Consolas" w:hAnsi="Consolas" w:eastAsia="Consolas" w:cs="Consolas"/><w:sz w:val="17"/><w:szCs w:val="17"/></w:rPr><w:t xml:space="preserve">│ Waktu Pengesahan: 21 September 2026 14:15:30 WIB                       │</w:t></w:r></w:p><w:p><w:pPr><w:jc w:val="center"/><w:spacing w:after="60"/></w:pPr><w:r><w:rPr><w:rFonts w:ascii="Consolas" w:hAnsi="Consolas" w:eastAsia="Consolas" w:cs="Consolas"/><w:sz w:val="17"/><w:szCs w:val="17"/></w:rPr><w:t xml:space="preserve">│ Integritas Dok : SHA256: 7d8f6b2c9a1e4d3f5a8b7c9e0d1f2a3b4c5d6e7f8a9b │</w:t></w:r></w:p><w:p><w:pPr><w:jc w:val="center"/><w:spacing w:after="60"/></w:pPr><w:r><w:rPr><w:rFonts w:ascii="Consolas" w:hAnsi="Consolas" w:eastAsia="Consolas" w:cs="Consolas"/><w:sz w:val="17"/><w:szCs w:val="17"/></w:rPr><w:t xml:space="preserve">│ Jaminan Mutu   : Dokumen terdaftar sah dalam pangkalan data TRISULA.   │</w:t></w:r></w:p><w:p><w:pPr><w:jc w:val="center"/><w:spacing w:after="60"/></w:pPr><w:r><w:rPr><w:rFonts w:ascii="Consolas" w:hAnsi="Consolas" w:eastAsia="Consolas" w:cs="Consolas"/><w:sz w:val="17"/><w:szCs w:val="17"/></w:rPr><w:t xml:space="preserve">└────────────────────────────────────────────────────────────────────────┘</w:t></w:r></w:p></w:tc></w:tr></w:tbl><w:p><w:r><w:br w:type="page"/></w:r></w:p><w:p><w:pPr><w:jc w:val="start"/><w:spacing w:after="60"/></w:pPr><w:r><w:rPr><w:rFonts w:ascii="Times New Roman" w:hAnsi="Times New Roman" w:eastAsia="Times New Roman" w:cs="Times New Roman"/><w:sz w:val="24"/><w:szCs w:val="24"/><w:b w:val="1"/><w:bCs w:val="1"/></w:rPr><w:t xml:space="preserve">b.   Bentuk Cetakan Laporan Kedinasan (Printed Reports).</w:t></w:r></w:p><w:p><w:pPr><w:jc w:val="both"/><w:spacing w:after="80" w:line="276" w:lineRule="auto"/></w:pPr><w:r><w:rPr><w:rFonts w:ascii="Times New Roman" w:hAnsi="Times New Roman" w:eastAsia="Times New Roman" w:cs="Times New Roman"/><w:sz w:val="23"/><w:szCs w:val="23"/></w:rPr><w:t xml:space="preserve">Format laporan kedinasan dirancang dengan kepatuhan penuh terhadap Buku Petunjuk Teknis Tulisan Dinas TNI Angkatan Darat, memuat KOP Staf Personel, Nomor Register Rahasia, Isi Rekapitulasi Data, Tempat Tanggal Pembuatan, serta Tajuk Tanda Tangan Perwira Penanggung Jawab :</w:t></w:r></w:p><w:p/><w:tbl><w:tblGrid><w:gridCol w:w="9200" w:type="dxa"/></w:tblGrid><w:tblPr><w:tblStyle w:val="BoxTable"/></w:tblPr><w:tr><w:trPr/><w:tc><w:tcPr><w:tcW w:w="9200" w:type="dxa"/><w:noWrap/></w:tcPr><w:p><w:pPr><w:jc w:val="start"/><w:spacing w:after="60"/></w:pPr><w:r><w:rPr><w:rFonts w:ascii="Times New Roman" w:hAnsi="Times New Roman" w:eastAsia="Times New Roman" w:cs="Times New Roman"/><w:sz w:val="19"/><w:szCs w:val="19"/><w:b w:val="1"/><w:bCs w:val="1"/></w:rPr><w:t xml:space="preserve">MARKAS BESAR TNI ANGKATAN DARAT</w:t></w:r></w:p><w:p><w:pPr><w:jc w:val="start"/><w:spacing w:after="60"/></w:pPr><w:r><w:rPr><w:rFonts w:ascii="Times New Roman" w:hAnsi="Times New Roman" w:eastAsia="Times New Roman" w:cs="Times New Roman"/><w:sz w:val="19"/><w:szCs w:val="19"/><w:b w:val="1"/><w:bCs w:val="1"/></w:rPr><w:t xml:space="preserve">STAF PERSONEL</w:t></w:r></w:p><w:p><w:pPr><w:jc w:val="start"/><w:spacing w:after="60"/></w:pPr><w:r><w:rPr><w:rFonts w:ascii="Consolas" w:hAnsi="Consolas" w:eastAsia="Consolas" w:cs="Consolas"/><w:sz w:val="17"/><w:szCs w:val="17"/></w:rPr><w:t xml:space="preserve">─────────────────────────────────</w:t></w:r></w:p><w:p/><w:p><w:pPr><w:jc w:val="center"/><w:spacing w:after="60"/></w:pPr><w:r><w:rPr><w:rFonts w:ascii="Times New Roman" w:hAnsi="Times New Roman" w:eastAsia="Times New Roman" w:cs="Times New Roman"/><w:sz w:val="22"/><w:szCs w:val="22"/><w:b w:val="1"/><w:bCs w:val="1"/></w:rPr><w:t xml:space="preserve">LAPORAN REKAPITULASI KELENGKAPAN DOSIR DIGITAL PRAJURIT</w:t></w:r></w:p><w:p><w:pPr><w:jc w:val="center"/><w:spacing w:after="60"/></w:pPr><w:r><w:rPr><w:rFonts w:ascii="Times New Roman" w:hAnsi="Times New Roman" w:eastAsia="Times New Roman" w:cs="Times New Roman"/><w:sz w:val="20"/><w:szCs w:val="20"/><w:b w:val="1"/><w:bCs w:val="1"/></w:rPr><w:t xml:space="preserve">SISTEM TRISULA TNI ANGKATAN DARAT</w:t></w:r></w:p><w:p><w:pPr><w:jc w:val="center"/><w:spacing w:after="60"/></w:pPr><w:r><w:rPr><w:rFonts w:ascii="Times New Roman" w:hAnsi="Times New Roman" w:eastAsia="Times New Roman" w:cs="Times New Roman"/><w:sz w:val="19"/><w:szCs w:val="19"/><w:i w:val="1"/><w:iCs w:val="1"/></w:rPr><w:t xml:space="preserve">Periode : Triwulan III Tahun Anggaran 2026</w:t></w:r></w:p><w:p/><w:p><w:pPr><w:jc w:val="center"/><w:spacing w:after="60"/></w:pPr><w:r><w:rPr><w:rFonts w:ascii="Consolas" w:hAnsi="Consolas" w:eastAsia="Consolas" w:cs="Consolas"/><w:sz w:val="17"/><w:szCs w:val="17"/></w:rPr><w:t xml:space="preserve">┌────┬──────────────┬────────────────────────┬─────────┬───────────┬─────────┬────────────┐</w:t></w:r></w:p><w:p><w:pPr><w:jc w:val="center"/><w:spacing w:after="60"/></w:pPr><w:r><w:rPr><w:rFonts w:ascii="Consolas" w:hAnsi="Consolas" w:eastAsia="Consolas" w:cs="Consolas"/><w:sz w:val="17"/><w:szCs w:val="17"/></w:rPr><w:t xml:space="preserve">│ NO │     NRP      │ NAMA PRAJURIT / PNS    │ PANGKAT │  SATUAN   │ LENGKAP │ PERSENTASE │</w:t></w:r></w:p><w:p><w:pPr><w:jc w:val="center"/><w:spacing w:after="60"/></w:pPr><w:r><w:rPr><w:rFonts w:ascii="Consolas" w:hAnsi="Consolas" w:eastAsia="Consolas" w:cs="Consolas"/><w:sz w:val="17"/><w:szCs w:val="17"/></w:rPr><w:t xml:space="preserve">├────┼──────────────┼────────────────────────┼─────────┼───────────┼─────────┼────────────┤</w:t></w:r></w:p><w:p><w:pPr><w:jc w:val="center"/><w:spacing w:after="60"/></w:pPr><w:r><w:rPr><w:rFonts w:ascii="Consolas" w:hAnsi="Consolas" w:eastAsia="Consolas" w:cs="Consolas"/><w:sz w:val="17"/><w:szCs w:val="17"/></w:rPr><w:t xml:space="preserve">│ 1. │ 211801234509 │ Letda Czi Fris Wardani │ Letda   │ Denzibang │  33/33  │   100 %    │</w:t></w:r></w:p><w:p><w:pPr><w:jc w:val="center"/><w:spacing w:after="60"/></w:pPr><w:r><w:rPr><w:rFonts w:ascii="Consolas" w:hAnsi="Consolas" w:eastAsia="Consolas" w:cs="Consolas"/><w:sz w:val="17"/><w:szCs w:val="17"/></w:rPr><w:t xml:space="preserve">│ 2. │ 211902345610 │ Lettu Inf Danu Wijaya  │ Lettu   │ Yonif 201 │  31/33  │    94 %    │</w:t></w:r></w:p><w:p><w:pPr><w:jc w:val="center"/><w:spacing w:after="60"/></w:pPr><w:r><w:rPr><w:rFonts w:ascii="Consolas" w:hAnsi="Consolas" w:eastAsia="Consolas" w:cs="Consolas"/><w:sz w:val="17"/><w:szCs w:val="17"/></w:rPr><w:t xml:space="preserve">│ 3. │ 310503456711 │ Serma Agus Priyanto    │ Serma   │ Kodim 0501│  28/33  │    85 %    │</w:t></w:r></w:p><w:p><w:pPr><w:jc w:val="center"/><w:spacing w:after="60"/></w:pPr><w:r><w:rPr><w:rFonts w:ascii="Consolas" w:hAnsi="Consolas" w:eastAsia="Consolas" w:cs="Consolas"/><w:sz w:val="17"/><w:szCs w:val="17"/></w:rPr><w:t xml:space="preserve">│ 4. │ 311204567812 │ Koptu Bambang Sutrisno │ Koptu   │ Brigif 1  │  25/33  │    76 %    │</w:t></w:r></w:p><w:p><w:pPr><w:jc w:val="center"/><w:spacing w:after="60"/></w:pPr><w:r><w:rPr><w:rFonts w:ascii="Consolas" w:hAnsi="Consolas" w:eastAsia="Consolas" w:cs="Consolas"/><w:sz w:val="17"/><w:szCs w:val="17"/></w:rPr><w:t xml:space="preserve">└────┴──────────────┴────────────────────────┴─────────┴───────────┴─────────┴────────────┘</w:t></w:r></w:p><w:p/><w:p><w:pPr><w:jc w:val="end"/><w:spacing w:after="60"/></w:pPr><w:r><w:rPr><w:rFonts w:ascii="Times New Roman" w:hAnsi="Times New Roman" w:eastAsia="Times New Roman" w:cs="Times New Roman"/><w:sz w:val="19"/><w:szCs w:val="19"/></w:rPr><w:t xml:space="preserve">                                                    Jakarta,   21 September 2026</w:t></w:r></w:p><w:p><w:pPr><w:jc w:val="end"/><w:spacing w:after="60"/></w:pPr><w:r><w:rPr><w:rFonts w:ascii="Times New Roman" w:hAnsi="Times New Roman" w:eastAsia="Times New Roman" w:cs="Times New Roman"/><w:sz w:val="19"/><w:szCs w:val="19"/></w:rPr><w:t xml:space="preserve">                                                    Perwira Personel / Verifikator,</w:t></w:r></w:p><w:p/><w:p/><w:p><w:pPr><w:jc w:val="end"/><w:spacing w:after="60"/></w:pPr><w:r><w:rPr><w:rFonts w:ascii="Times New Roman" w:hAnsi="Times New Roman" w:eastAsia="Times New Roman" w:cs="Times New Roman"/><w:sz w:val="19"/><w:szCs w:val="19"/><w:b w:val="1"/><w:bCs w:val="1"/></w:rPr><w:t xml:space="preserve">                                                    HENDRA PRATAMA, S.I.P.        </w:t></w:r></w:p><w:p><w:pPr><w:jc w:val="end"/><w:spacing w:after="60"/></w:pPr><w:r><w:rPr><w:rFonts w:ascii="Times New Roman" w:hAnsi="Times New Roman" w:eastAsia="Times New Roman" w:cs="Times New Roman"/><w:sz w:val="19"/><w:szCs w:val="19"/></w:rPr><w:t xml:space="preserve">                                                    MAYOR INF NRP 11040023450682  </w:t></w:r></w:p></w:tc></w:tr></w:tbl><w:p><w:r><w:br w:type="page"/></w:r></w:p><w:p><w:pPr><w:jc w:val="start"/><w:spacing w:after="60"/></w:pPr><w:r><w:rPr><w:rFonts w:ascii="Times New Roman" w:hAnsi="Times New Roman" w:eastAsia="Times New Roman" w:cs="Times New Roman"/><w:sz w:val="24"/><w:szCs w:val="24"/><w:b w:val="1"/><w:bCs w:val="1"/></w:rPr><w:t xml:space="preserve">16.  Listing Program.</w:t></w:r></w:p><w:p><w:pPr><w:jc w:val="both"/><w:spacing w:after="80" w:line="276" w:lineRule="auto"/></w:pPr><w:r><w:rPr><w:rFonts w:ascii="Times New Roman" w:hAnsi="Times New Roman" w:eastAsia="Times New Roman" w:cs="Times New Roman"/><w:sz w:val="23"/><w:szCs w:val="23"/></w:rPr><w:t xml:space="preserve">Listing program menyajikan kode sumber inti (core source code) yang merepresentasikan logika algoritma otentikasi TTE, pembubuhan watermark keabsahan ber-QR Code, penataan berkas 33 dosir baku, serta rumus proyeksi masa pensiun dan rotasi jabatan.</w:t></w:r></w:p><w:p/><w:p><w:pPr><w:jc w:val="start"/><w:spacing w:after="60"/></w:pPr><w:r><w:rPr><w:rFonts w:ascii="Times New Roman" w:hAnsi="Times New Roman" w:eastAsia="Times New Roman" w:cs="Times New Roman"/><w:sz w:val="23"/><w:szCs w:val="23"/><w:b w:val="1"/><w:bCs w:val="1"/></w:rPr><w:t xml:space="preserve">a.   Listing Modul Pembubuhan Tanda Tangan Elektronik (TTE) & QR Code (includes/watermark.php) :</w:t></w:r></w:p><w:tbl><w:tblGrid><w:gridCol w:w="9200" w:type="dxa"/></w:tblGrid><w:tblPr><w:tblStyle w:val="BoxTable"/></w:tblPr><w:tr><w:trPr/><w:tc><w:tcPr><w:tcW w:w="9200" w:type="dxa"/><w:shd w:val="clear" w:fill="F2F6F2"/><w:noWrap/></w:tcPr><w:p><w:pPr/><w:r><w:rPr><w:rFonts w:ascii="Consolas" w:hAnsi="Consolas" w:eastAsia="Consolas" w:cs="Consolas"/><w:color w:val="1B3B1B"/><w:sz w:val="17"/><w:szCs w:val="17"/></w:rPr><w:t xml:space="preserve">function apply_digital_signature_pdf($rawMasterPath, $outputPath, array $signData) {
+<w:document xmlns:ve="http://schemas.openxmlformats.org/markup-compatibility/2006" xmlns:o="urn:schemas-microsoft-com:office:office" xmlns:r="http://schemas.openxmlformats.org/officeDocument/2006/relationships" xmlns:m="http://schemas.openxmlformats.org/officeDocument/2006/math" xmlns:v="urn:schemas-microsoft-com:vml" xmlns:wp="http://schemas.openxmlformats.org/drawingml/2006/wordprocessingDrawing" xmlns:w10="urn:schemas-microsoft-com:office:word" xmlns:w="http://schemas.openxmlformats.org/wordprocessingml/2006/main" xmlns:wne="http://schemas.microsoft.com/office/word/2006/wordml"><w:body><w:p><w:pPr><w:jc w:val="center"/><w:spacing w:after="60"/></w:pPr><w:r><w:rPr><w:rFonts w:ascii="Times New Roman" w:hAnsi="Times New Roman" w:eastAsia="Times New Roman" w:cs="Times New Roman"/><w:sz w:val="24"/><w:szCs w:val="24"/><w:b w:val="1"/><w:bCs w:val="1"/></w:rPr><w:t xml:space="preserve">MARKAS BESAR TNI ANGKATAN DARAT</w:t></w:r></w:p><w:p><w:pPr><w:jc w:val="center"/><w:spacing w:after="60"/></w:pPr><w:r><w:rPr><w:rFonts w:ascii="Times New Roman" w:hAnsi="Times New Roman" w:eastAsia="Times New Roman" w:cs="Times New Roman"/><w:sz w:val="24"/><w:szCs w:val="24"/><w:b w:val="1"/><w:bCs w:val="1"/></w:rPr><w:t xml:space="preserve">DINAS INFORMASI DAN PENGOLAHAN DATA</w:t></w:r></w:p><w:p/><w:p/><w:p><w:pPr><w:jc w:val="center"/></w:pPr><w:r><w:pict><v:shape type="#_x0000_t75" stroked="f" style="width:110pt; height:110pt; margin-left:0pt; margin-top:10pt; mso-position-horizontal:left; mso-position-vertical:top; mso-position-horizontal-relative:char; mso-position-vertical-relative:line;"><w10:wrap type="inline"/><v:imagedata r:id="rId7" o:title=""/></v:shape></w:pict></w:r></w:p><w:p/><w:p/><w:p><w:pPr><w:jc w:val="center"/><w:spacing w:after="60"/></w:pPr><w:r><w:rPr><w:rFonts w:ascii="Times New Roman" w:hAnsi="Times New Roman" w:eastAsia="Times New Roman" w:cs="Times New Roman"/><w:sz w:val="30"/><w:szCs w:val="30"/><w:b w:val="1"/><w:bCs w:val="1"/></w:rPr><w:t xml:space="preserve">DOKUMENTASI SISTEM PROGRAM APLIKASI</w:t></w:r></w:p><w:p/><w:p><w:pPr><w:jc w:val="center"/><w:spacing w:after="60"/></w:pPr><w:r><w:rPr><w:rFonts w:ascii="Times New Roman" w:hAnsi="Times New Roman" w:eastAsia="Times New Roman" w:cs="Times New Roman"/><w:color w:val="224222"/><w:sz w:val="40"/><w:szCs w:val="40"/><w:b w:val="1"/><w:bCs w:val="1"/></w:rPr><w:t xml:space="preserve">TRISULA TNI AD</w:t></w:r></w:p><w:p><w:pPr><w:jc w:val="center"/><w:spacing w:after="60"/></w:pPr><w:r><w:rPr><w:rFonts w:ascii="Times New Roman" w:hAnsi="Times New Roman" w:eastAsia="Times New Roman" w:cs="Times New Roman"/><w:sz w:val="24"/><w:szCs w:val="24"/><w:b w:val="1"/><w:bCs w:val="1"/><w:i w:val="1"/><w:iCs w:val="1"/></w:rPr><w:t xml:space="preserve">(TATA KELOLA REKAM INFORMASI, SISTEMATIKA, & UNDUHAN LENGKAP ARSIP)</w:t></w:r></w:p><w:p/><w:p><w:pPr><w:jc w:val="center"/><w:spacing w:after="60"/></w:pPr><w:r><w:rPr><w:rFonts w:ascii="Times New Roman" w:hAnsi="Times New Roman" w:eastAsia="Times New Roman" w:cs="Times New Roman"/><w:sz w:val="22"/><w:szCs w:val="22"/><w:i w:val="1"/><w:iCs w:val="1"/></w:rPr><w:t xml:space="preserve">Sistem Dosir Elektronik, Digitalisasi 33 Berkas Baku Induk, Verifikasi Berjenjang, dan Autentikasi Tanda Tangan Elektronik (TTE) Personel Militer & PNS TNI AD</w:t></w:r></w:p><w:p/><w:p/><w:p/><w:p/><w:p><w:pPr><w:jc w:val="center"/><w:spacing w:after="60"/></w:pPr><w:r><w:rPr><w:rFonts w:ascii="Times New Roman" w:hAnsi="Times New Roman" w:eastAsia="Times New Roman" w:cs="Times New Roman"/><w:sz w:val="22"/><w:szCs w:val="22"/></w:rPr><w:t xml:space="preserve">Disusun Sebagai Dokumentasi Teknis dan Operasional Pembinaan Sistem Informasi TNI AD</w:t></w:r></w:p><w:p><w:pPr><w:jc w:val="center"/><w:spacing w:after="60"/></w:pPr><w:r><w:rPr><w:rFonts w:ascii="Times New Roman" w:hAnsi="Times New Roman" w:eastAsia="Times New Roman" w:cs="Times New Roman"/><w:sz w:val="21"/><w:szCs w:val="21"/><w:b w:val="1"/><w:bCs w:val="1"/></w:rPr><w:t xml:space="preserve">Berdasarkan Naskah Sekolah Kadisinfolahtad Nomor: 61 - A – 009 (KEP/23/IV/2022)</w:t></w:r></w:p><w:p/><w:p/><w:p/><w:p><w:pPr><w:jc w:val="center"/><w:spacing w:after="60"/></w:pPr><w:r><w:rPr><w:rFonts w:ascii="Times New Roman" w:hAnsi="Times New Roman" w:eastAsia="Times New Roman" w:cs="Times New Roman"/><w:sz w:val="23"/><w:szCs w:val="23"/><w:b w:val="1"/><w:bCs w:val="1"/></w:rPr><w:t xml:space="preserve">Disusun Oleh :</w:t></w:r></w:p><w:p><w:pPr><w:jc w:val="center"/><w:spacing w:after="60"/></w:pPr><w:r><w:rPr><w:rFonts w:ascii="Times New Roman" w:hAnsi="Times New Roman" w:eastAsia="Times New Roman" w:cs="Times New Roman"/><w:sz w:val="24"/><w:szCs w:val="24"/><w:b w:val="1"/><w:bCs w:val="1"/></w:rPr><w:t xml:space="preserve">LETDA CZI FRIS WARDANI</w:t></w:r></w:p><w:p><w:pPr><w:jc w:val="center"/><w:spacing w:after="60"/></w:pPr><w:r><w:rPr><w:rFonts w:ascii="Times New Roman" w:hAnsi="Times New Roman" w:eastAsia="Times New Roman" w:cs="Times New Roman"/><w:sz w:val="23"/><w:szCs w:val="23"/><w:i w:val="1"/><w:iCs w:val="1"/></w:rPr><w:t xml:space="preserve">Perwira Pertama Korps Zeni TNI Angkatan Darat</w:t></w:r></w:p><w:p/><w:p/><w:p><w:pPr><w:jc w:val="center"/><w:spacing w:after="60"/></w:pPr><w:r><w:rPr><w:rFonts w:ascii="Times New Roman" w:hAnsi="Times New Roman" w:eastAsia="Times New Roman" w:cs="Times New Roman"/><w:sz w:val="23"/><w:szCs w:val="23"/><w:b w:val="1"/><w:bCs w:val="1"/></w:rPr><w:t xml:space="preserve">JAKARTA</w:t></w:r></w:p><w:p><w:pPr><w:jc w:val="center"/><w:spacing w:after="60"/></w:pPr><w:r><w:rPr><w:rFonts w:ascii="Times New Roman" w:hAnsi="Times New Roman" w:eastAsia="Times New Roman" w:cs="Times New Roman"/><w:sz w:val="23"/><w:szCs w:val="23"/><w:b w:val="1"/><w:bCs w:val="1"/></w:rPr><w:t xml:space="preserve">2026</w:t></w:r></w:p><w:p><w:pPr><w:sectPr><w:headerReference w:type="default" r:id="rId8"/><w:footerReference w:type="default" r:id="rId9"/><w:pgSz w:orient="portrait" w:w="11905.511811023622" w:h="16837.79527559055"/><w:pgMar w:top="1133.8582677165352" w:right="1133.8582677165352" w:bottom="1133.8582677165352" w:left="1700.787401574803" w:header="720" w:footer="720" w:gutter="0"/><w:cols w:num="1" w:space="720"/></w:sectPr></w:pPr></w:p><w:p><w:pPr><w:jc w:val="center"/><w:spacing w:after="60"/></w:pPr><w:r><w:rPr><w:rFonts w:ascii="Times New Roman" w:hAnsi="Times New Roman" w:eastAsia="Times New Roman" w:cs="Times New Roman"/><w:sz w:val="26"/><w:szCs w:val="26"/><w:b w:val="1"/><w:bCs w:val="1"/></w:rPr><w:t xml:space="preserve">LEMBAR DOKUMENTASI PROGRAM</w:t></w:r></w:p><w:p><w:pPr><w:jc w:val="center"/><w:spacing w:after="60"/></w:pPr><w:r><w:rPr><w:rFonts w:ascii="Times New Roman" w:hAnsi="Times New Roman" w:eastAsia="Times New Roman" w:cs="Times New Roman"/><w:sz w:val="23"/><w:szCs w:val="23"/><w:i w:val="1"/><w:iCs w:val="1"/></w:rPr><w:t xml:space="preserve">Format Standar Naskah Sekolah Disinfolahtad (Gambar - 1)</w:t></w:r></w:p><w:p/><w:tbl><w:tblGrid><w:gridCol w:w="9200" w:type="dxa"/></w:tblGrid><w:tblPr><w:tblStyle w:val="BoxTable"/></w:tblPr><w:tr><w:trPr/><w:tc><w:tcPr><w:tcW w:w="9200" w:type="dxa"/><w:noWrap/></w:tcPr><w:p><w:pPr><w:jc w:val="center"/><w:spacing w:after="60"/></w:pPr><w:r><w:rPr><w:rFonts w:ascii="Times New Roman" w:hAnsi="Times New Roman" w:eastAsia="Times New Roman" w:cs="Times New Roman"/><w:sz w:val="26"/><w:szCs w:val="26"/><w:b w:val="1"/><w:bCs w:val="1"/></w:rPr><w:t xml:space="preserve">DOKUMENTASI PROGRAM</w:t></w:r></w:p><w:p/><w:tbl><w:tblGrid><w:gridCol w:w="2200" w:type="dxa"/><w:gridCol w:w="250" w:type="dxa"/><w:gridCol w:w="6400" w:type="dxa"/></w:tblGrid><w:tblPr><w:jc w:val="center"/><w:tblW w:w="0" w:type="auto"/><w:tblLayout w:type="autofit"/></w:tblPr><w:tr><w:trPr/><w:tc><w:tcPr><w:tcW w:w="2200" w:type="dxa"/><w:noWrap/></w:tcPr><w:p><w:pPr><w:jc w:val="start"/><w:spacing w:after="60"/></w:pPr><w:r><w:rPr><w:rFonts w:ascii="Times New Roman" w:hAnsi="Times New Roman" w:eastAsia="Times New Roman" w:cs="Times New Roman"/><w:sz w:val="23"/><w:szCs w:val="23"/><w:b w:val="1"/><w:bCs w:val="1"/></w:rPr><w:t xml:space="preserve">NAMA APLIKASI</w:t></w:r></w:p></w:tc><w:tc><w:tcPr><w:tcW w:w="250" w:type="dxa"/><w:noWrap/></w:tcPr><w:p><w:pPr><w:jc w:val="center"/><w:spacing w:after="60"/></w:pPr><w:r><w:rPr><w:rFonts w:ascii="Times New Roman" w:hAnsi="Times New Roman" w:eastAsia="Times New Roman" w:cs="Times New Roman"/><w:sz w:val="23"/><w:szCs w:val="23"/><w:b w:val="1"/><w:bCs w:val="1"/></w:rPr><w:t xml:space="preserve">:</w:t></w:r></w:p></w:tc><w:tc><w:tcPr><w:tcW w:w="6400" w:type="dxa"/><w:noWrap/></w:tcPr><w:p><w:pPr><w:jc w:val="both"/><w:spacing w:after="80" w:line="276" w:lineRule="auto"/></w:pPr><w:r><w:rPr><w:rFonts w:ascii="Times New Roman" w:hAnsi="Times New Roman" w:eastAsia="Times New Roman" w:cs="Times New Roman"/><w:sz w:val="23"/><w:szCs w:val="23"/></w:rPr><w:t xml:space="preserve">TRISULA TNI AD</w:t></w:r></w:p></w:tc></w:tr><w:tr><w:trPr/><w:tc><w:tcPr><w:tcW w:w="2200" w:type="dxa"/><w:noWrap/></w:tcPr><w:p><w:pPr><w:jc w:val="start"/><w:spacing w:after="60"/></w:pPr><w:r><w:rPr><w:rFonts w:ascii="Times New Roman" w:hAnsi="Times New Roman" w:eastAsia="Times New Roman" w:cs="Times New Roman"/><w:sz w:val="23"/><w:szCs w:val="23"/><w:b w:val="1"/><w:bCs w:val="1"/></w:rPr><w:t xml:space="preserve">NAMA PROGRAM</w:t></w:r></w:p></w:tc><w:tc><w:tcPr><w:tcW w:w="250" w:type="dxa"/><w:noWrap/></w:tcPr><w:p><w:pPr><w:jc w:val="center"/><w:spacing w:after="60"/></w:pPr><w:r><w:rPr><w:rFonts w:ascii="Times New Roman" w:hAnsi="Times New Roman" w:eastAsia="Times New Roman" w:cs="Times New Roman"/><w:sz w:val="23"/><w:szCs w:val="23"/><w:b w:val="1"/><w:bCs w:val="1"/></w:rPr><w:t xml:space="preserve">:</w:t></w:r></w:p></w:tc><w:tc><w:tcPr><w:tcW w:w="6400" w:type="dxa"/><w:noWrap/></w:tcPr><w:p><w:pPr><w:jc w:val="both"/><w:spacing w:after="80" w:line="276" w:lineRule="auto"/></w:pPr><w:r><w:rPr><w:rFonts w:ascii="Times New Roman" w:hAnsi="Times New Roman" w:eastAsia="Times New Roman" w:cs="Times New Roman"/><w:sz w:val="23"/><w:szCs w:val="23"/></w:rPr><w:t xml:space="preserve">SISTEM DOSIR ELEKTRONIK & VERIFIKASI TTE PERSONEL</w:t></w:r></w:p></w:tc></w:tr><w:tr><w:trPr/><w:tc><w:tcPr><w:tcW w:w="2200" w:type="dxa"/><w:noWrap/></w:tcPr><w:p><w:pPr><w:jc w:val="start"/><w:spacing w:after="60"/></w:pPr><w:r><w:rPr><w:rFonts w:ascii="Times New Roman" w:hAnsi="Times New Roman" w:eastAsia="Times New Roman" w:cs="Times New Roman"/><w:sz w:val="23"/><w:szCs w:val="23"/><w:b w:val="1"/><w:bCs w:val="1"/></w:rPr><w:t xml:space="preserve">FUNGSI PROGRAM</w:t></w:r></w:p></w:tc><w:tc><w:tcPr><w:tcW w:w="250" w:type="dxa"/><w:noWrap/></w:tcPr><w:p><w:pPr><w:jc w:val="center"/><w:spacing w:after="60"/></w:pPr><w:r><w:rPr><w:rFonts w:ascii="Times New Roman" w:hAnsi="Times New Roman" w:eastAsia="Times New Roman" w:cs="Times New Roman"/><w:sz w:val="23"/><w:szCs w:val="23"/><w:b w:val="1"/><w:bCs w:val="1"/></w:rPr><w:t xml:space="preserve">:</w:t></w:r></w:p></w:tc><w:tc><w:tcPr><w:tcW w:w="6400" w:type="dxa"/><w:noWrap/></w:tcPr><w:p><w:pPr><w:jc w:val="both"/><w:spacing w:after="80" w:line="276" w:lineRule="auto"/></w:pPr><w:r><w:rPr><w:rFonts w:ascii="Times New Roman" w:hAnsi="Times New Roman" w:eastAsia="Times New Roman" w:cs="Times New Roman"/><w:sz w:val="23"/><w:szCs w:val="23"/></w:rPr><w:t xml:space="preserve">Tata Kelola dan Digitalisasi 33 Jenis Dosir Baku, Verifikasi Dokumen Berjenjang, Pengesahan Tanda Tangan Elektronik (TTE) Ber-QR Code, Pemantauan Kelengkapan Dosir, Deteksi Masa Jabatan > 2 Tahun, dan Proyeksi Batas Usia Pensiun Prajurit & PNS TNI AD.</w:t></w:r></w:p></w:tc></w:tr><w:tr><w:trPr/><w:tc><w:tcPr><w:tcW w:w="2200" w:type="dxa"/><w:noWrap/></w:tcPr><w:p><w:pPr><w:jc w:val="start"/><w:spacing w:after="60"/></w:pPr><w:r><w:rPr><w:rFonts w:ascii="Times New Roman" w:hAnsi="Times New Roman" w:eastAsia="Times New Roman" w:cs="Times New Roman"/><w:sz w:val="23"/><w:szCs w:val="23"/><w:b w:val="1"/><w:bCs w:val="1"/></w:rPr><w:t xml:space="preserve">NAMA PEMROGRAM</w:t></w:r></w:p></w:tc><w:tc><w:tcPr><w:tcW w:w="250" w:type="dxa"/><w:noWrap/></w:tcPr><w:p><w:pPr><w:jc w:val="center"/><w:spacing w:after="60"/></w:pPr><w:r><w:rPr><w:rFonts w:ascii="Times New Roman" w:hAnsi="Times New Roman" w:eastAsia="Times New Roman" w:cs="Times New Roman"/><w:sz w:val="23"/><w:szCs w:val="23"/><w:b w:val="1"/><w:bCs w:val="1"/></w:rPr><w:t xml:space="preserve">:</w:t></w:r></w:p></w:tc><w:tc><w:tcPr><w:tcW w:w="6400" w:type="dxa"/><w:noWrap/></w:tcPr><w:p><w:pPr><w:jc w:val="both"/><w:spacing w:after="80" w:line="276" w:lineRule="auto"/></w:pPr><w:r><w:rPr><w:rFonts w:ascii="Times New Roman" w:hAnsi="Times New Roman" w:eastAsia="Times New Roman" w:cs="Times New Roman"/><w:sz w:val="23"/><w:szCs w:val="23"/></w:rPr><w:t xml:space="preserve">Letda Czi Fris Wardani</w:t></w:r></w:p></w:tc></w:tr><w:tr><w:trPr/><w:tc><w:tcPr><w:tcW w:w="2200" w:type="dxa"/><w:noWrap/></w:tcPr><w:p><w:pPr><w:jc w:val="start"/><w:spacing w:after="60"/></w:pPr><w:r><w:rPr><w:rFonts w:ascii="Times New Roman" w:hAnsi="Times New Roman" w:eastAsia="Times New Roman" w:cs="Times New Roman"/><w:sz w:val="23"/><w:szCs w:val="23"/><w:b w:val="1"/><w:bCs w:val="1"/></w:rPr><w:t xml:space="preserve">BAHASA PROGRAM</w:t></w:r></w:p></w:tc><w:tc><w:tcPr><w:tcW w:w="250" w:type="dxa"/><w:noWrap/></w:tcPr><w:p><w:pPr><w:jc w:val="center"/><w:spacing w:after="60"/></w:pPr><w:r><w:rPr><w:rFonts w:ascii="Times New Roman" w:hAnsi="Times New Roman" w:eastAsia="Times New Roman" w:cs="Times New Roman"/><w:sz w:val="23"/><w:szCs w:val="23"/><w:b w:val="1"/><w:bCs w:val="1"/></w:rPr><w:t xml:space="preserve">:</w:t></w:r></w:p></w:tc><w:tc><w:tcPr><w:tcW w:w="6400" w:type="dxa"/><w:noWrap/></w:tcPr><w:p><w:pPr><w:jc w:val="both"/><w:spacing w:after="80" w:line="276" w:lineRule="auto"/></w:pPr><w:r><w:rPr><w:rFonts w:ascii="Times New Roman" w:hAnsi="Times New Roman" w:eastAsia="Times New Roman" w:cs="Times New Roman"/><w:sz w:val="23"/><w:szCs w:val="23"/></w:rPr><w:t xml:space="preserve">PHP 8.3 (Native PDO), JavaScript (ES6 / jsPDF), HTML5, CSS3, MySQL</w:t></w:r></w:p></w:tc></w:tr><w:tr><w:trPr/><w:tc><w:tcPr><w:tcW w:w="2200" w:type="dxa"/><w:noWrap/></w:tcPr><w:p><w:pPr><w:jc w:val="start"/><w:spacing w:after="60"/></w:pPr><w:r><w:rPr><w:rFonts w:ascii="Times New Roman" w:hAnsi="Times New Roman" w:eastAsia="Times New Roman" w:cs="Times New Roman"/><w:sz w:val="23"/><w:szCs w:val="23"/><w:b w:val="1"/><w:bCs w:val="1"/></w:rPr><w:t xml:space="preserve">LOKASI PROGRAM</w:t></w:r></w:p></w:tc><w:tc><w:tcPr><w:tcW w:w="250" w:type="dxa"/><w:noWrap/></w:tcPr><w:p><w:pPr><w:jc w:val="center"/><w:spacing w:after="60"/></w:pPr><w:r><w:rPr><w:rFonts w:ascii="Times New Roman" w:hAnsi="Times New Roman" w:eastAsia="Times New Roman" w:cs="Times New Roman"/><w:sz w:val="23"/><w:szCs w:val="23"/><w:b w:val="1"/><w:bCs w:val="1"/></w:rPr><w:t xml:space="preserve">:</w:t></w:r></w:p></w:tc><w:tc><w:tcPr><w:tcW w:w="6400" w:type="dxa"/><w:noWrap/></w:tcPr><w:p><w:pPr><w:jc w:val="both"/><w:spacing w:after="80" w:line="276" w:lineRule="auto"/></w:pPr><w:r><w:rPr><w:rFonts w:ascii="Times New Roman" w:hAnsi="Times New Roman" w:eastAsia="Times New Roman" w:cs="Times New Roman"/><w:sz w:val="23"/><w:szCs w:val="23"/></w:rPr><w:t xml:space="preserve">d:\xampp\htdocs\edosir-tni</w:t></w:r></w:p></w:tc></w:tr><w:tr><w:trPr/><w:tc><w:tcPr><w:tcW w:w="2200" w:type="dxa"/><w:noWrap/></w:tcPr><w:p><w:pPr><w:jc w:val="start"/><w:spacing w:after="60"/></w:pPr><w:r><w:rPr><w:rFonts w:ascii="Times New Roman" w:hAnsi="Times New Roman" w:eastAsia="Times New Roman" w:cs="Times New Roman"/><w:sz w:val="23"/><w:szCs w:val="23"/><w:b w:val="1"/><w:bCs w:val="1"/></w:rPr><w:t xml:space="preserve">TANGGAL SELESAI</w:t></w:r></w:p></w:tc><w:tc><w:tcPr><w:tcW w:w="250" w:type="dxa"/><w:noWrap/></w:tcPr><w:p><w:pPr><w:jc w:val="center"/><w:spacing w:after="60"/></w:pPr><w:r><w:rPr><w:rFonts w:ascii="Times New Roman" w:hAnsi="Times New Roman" w:eastAsia="Times New Roman" w:cs="Times New Roman"/><w:sz w:val="23"/><w:szCs w:val="23"/><w:b w:val="1"/><w:bCs w:val="1"/></w:rPr><w:t xml:space="preserve">:</w:t></w:r></w:p></w:tc><w:tc><w:tcPr><w:tcW w:w="6400" w:type="dxa"/><w:noWrap/></w:tcPr><w:p><w:pPr><w:jc w:val="both"/><w:spacing w:after="80" w:line="276" w:lineRule="auto"/></w:pPr><w:r><w:rPr><w:rFonts w:ascii="Times New Roman" w:hAnsi="Times New Roman" w:eastAsia="Times New Roman" w:cs="Times New Roman"/><w:sz w:val="23"/><w:szCs w:val="23"/></w:rPr><w:t xml:space="preserve">21 September 2026</w:t></w:r></w:p></w:tc></w:tr></w:tbl><w:p/><w:p><w:pPr><w:jc w:val="start"/><w:spacing w:after="60"/></w:pPr><w:r><w:rPr><w:rFonts w:ascii="Times New Roman" w:hAnsi="Times New Roman" w:eastAsia="Times New Roman" w:cs="Times New Roman"/><w:sz w:val="23"/><w:szCs w:val="23"/><w:b w:val="1"/><w:bCs w:val="1"/></w:rPr><w:t xml:space="preserve">ISI DOKUMENTASI :</w:t></w:r></w:p><w:p><w:pPr><w:jc w:val="start"/><w:spacing w:after="60"/></w:pPr><w:r><w:rPr><w:rFonts w:ascii="Times New Roman" w:hAnsi="Times New Roman" w:eastAsia="Times New Roman" w:cs="Times New Roman"/><w:sz w:val="23"/><w:szCs w:val="23"/><w:b w:val="1"/><w:bCs w:val="1"/></w:rPr><w:t xml:space="preserve">   1. NARASI PROGRAM</w:t></w:r></w:p><w:p><w:pPr><w:jc w:val="start"/><w:spacing w:after="60"/></w:pPr><w:r><w:rPr><w:rFonts w:ascii="Times New Roman" w:hAnsi="Times New Roman" w:eastAsia="Times New Roman" w:cs="Times New Roman"/><w:sz w:val="23"/><w:szCs w:val="23"/><w:b w:val="1"/><w:bCs w:val="1"/></w:rPr><w:t xml:space="preserve">   2. DIAGRAM ARUS DATA (DFD)</w:t></w:r></w:p><w:p><w:pPr><w:jc w:val="start"/><w:spacing w:after="60"/></w:pPr><w:r><w:rPr><w:rFonts w:ascii="Times New Roman" w:hAnsi="Times New Roman" w:eastAsia="Times New Roman" w:cs="Times New Roman"/><w:sz w:val="23"/><w:szCs w:val="23"/><w:b w:val="1"/><w:bCs w:val="1"/></w:rPr><w:t xml:space="preserve">   3. DIAGRAM HUBUNGAN ENTITY (ERD)</w:t></w:r></w:p><w:p><w:pPr><w:jc w:val="start"/><w:spacing w:after="60"/></w:pPr><w:r><w:rPr><w:rFonts w:ascii="Times New Roman" w:hAnsi="Times New Roman" w:eastAsia="Times New Roman" w:cs="Times New Roman"/><w:sz w:val="23"/><w:szCs w:val="23"/><w:b w:val="1"/><w:bCs w:val="1"/></w:rPr><w:t xml:space="preserve">   4. KAMUS DATA / STRUKTUR FILE</w:t></w:r></w:p><w:p><w:pPr><w:jc w:val="start"/><w:spacing w:after="60"/></w:pPr><w:r><w:rPr><w:rFonts w:ascii="Times New Roman" w:hAnsi="Times New Roman" w:eastAsia="Times New Roman" w:cs="Times New Roman"/><w:sz w:val="23"/><w:szCs w:val="23"/><w:b w:val="1"/><w:bCs w:val="1"/></w:rPr><w:t xml:space="preserve">   5. SPESIFIKASI PROGRAM</w:t></w:r></w:p><w:p><w:pPr><w:jc w:val="start"/><w:spacing w:after="60"/></w:pPr><w:r><w:rPr><w:rFonts w:ascii="Times New Roman" w:hAnsi="Times New Roman" w:eastAsia="Times New Roman" w:cs="Times New Roman"/><w:sz w:val="23"/><w:szCs w:val="23"/><w:b w:val="1"/><w:bCs w:val="1"/></w:rPr><w:t xml:space="preserve">   6. BENTUK TAMPILAN DAN CETAKAN</w:t></w:r></w:p><w:p><w:pPr><w:jc w:val="start"/><w:spacing w:after="60"/></w:pPr><w:r><w:rPr><w:rFonts w:ascii="Times New Roman" w:hAnsi="Times New Roman" w:eastAsia="Times New Roman" w:cs="Times New Roman"/><w:sz w:val="23"/><w:szCs w:val="23"/><w:b w:val="1"/><w:bCs w:val="1"/></w:rPr><w:t xml:space="preserve">   7. LISTING PROGRAM</w:t></w:r></w:p></w:tc></w:tr></w:tbl><w:p><w:r><w:br w:type="page"/></w:r></w:p><w:p><w:pPr><w:jc w:val="center"/><w:spacing w:after="60"/></w:pPr><w:r><w:rPr><w:rFonts w:ascii="Times New Roman" w:hAnsi="Times New Roman" w:eastAsia="Times New Roman" w:cs="Times New Roman"/><w:sz w:val="26"/><w:szCs w:val="26"/><w:b w:val="1"/><w:bCs w:val="1"/></w:rPr><w:t xml:space="preserve">DAFTAR ISI</w:t></w:r></w:p><w:p/><w:tbl><w:tblGrid><w:gridCol w:w="1200" w:type="dxa"/><w:gridCol w:w="7000" w:type="dxa"/><w:gridCol w:w="1000" w:type="dxa"/></w:tblGrid><w:tblPr><w:jc w:val="center"/><w:tblW w:w="9200" w:type="auto"/><w:tblLayout w:type="autofit"/></w:tblPr><w:tr><w:trPr/><w:tc><w:tcPr><w:tcW w:w="1200" w:type="dxa"/><w:noWrap/></w:tcPr><w:p><w:pPr><w:jc w:val="start"/><w:spacing w:after="60"/></w:pPr><w:r><w:rPr><w:rFonts w:ascii="Times New Roman" w:hAnsi="Times New Roman" w:eastAsia="Times New Roman" w:cs="Times New Roman"/><w:sz w:val="23"/><w:szCs w:val="23"/><w:b w:val="1"/><w:bCs w:val="1"/></w:rPr><w:t xml:space="preserve">BAB I</w:t></w:r></w:p></w:tc><w:tc><w:tcPr><w:tcW w:w="7000" w:type="dxa"/><w:noWrap/></w:tcPr><w:p><w:pPr><w:jc w:val="start"/><w:spacing w:after="60"/></w:pPr><w:r><w:rPr><w:rFonts w:ascii="Times New Roman" w:hAnsi="Times New Roman" w:eastAsia="Times New Roman" w:cs="Times New Roman"/><w:sz w:val="23"/><w:szCs w:val="23"/><w:b w:val="1"/><w:bCs w:val="1"/></w:rPr><w:t xml:space="preserve">PENDAHULUAN</w:t></w:r></w:p></w:tc><w:tc><w:tcPr><w:tcW w:w="1000" w:type="dxa"/><w:noWrap/></w:tcPr><w:p><w:pPr><w:jc w:val="end"/><w:spacing w:after="60"/></w:pPr><w:r><w:rPr><w:rFonts w:ascii="Times New Roman" w:hAnsi="Times New Roman" w:eastAsia="Times New Roman" w:cs="Times New Roman"/><w:sz w:val="23"/><w:szCs w:val="23"/><w:b w:val="1"/><w:bCs w:val="1"/></w:rPr><w:t xml:space="preserve">1</w:t></w:r></w:p></w:tc></w:tr><w:tr><w:trPr/><w:tc><w:tcPr><w:tcW w:w="1200" w:type="dxa"/><w:noWrap/></w:tcPr><w:p><w:pPr><w:jc w:val="start"/><w:spacing w:after="60"/></w:pPr><w:r><w:rPr><w:rFonts w:ascii="Times New Roman" w:hAnsi="Times New Roman" w:eastAsia="Times New Roman" w:cs="Times New Roman"/><w:sz w:val="23"/><w:szCs w:val="23"/></w:rPr><w:t xml:space="preserve"></w:t></w:r></w:p></w:tc><w:tc><w:tcPr><w:tcW w:w="7000" w:type="dxa"/><w:noWrap/></w:tcPr><w:p><w:pPr><w:jc w:val="start"/><w:spacing w:after="60"/></w:pPr><w:r><w:rPr><w:rFonts w:ascii="Times New Roman" w:hAnsi="Times New Roman" w:eastAsia="Times New Roman" w:cs="Times New Roman"/><w:sz w:val="23"/><w:szCs w:val="23"/></w:rPr><w:t xml:space="preserve">1. Umum</w:t></w:r></w:p></w:tc><w:tc><w:tcPr><w:tcW w:w="1000" w:type="dxa"/><w:noWrap/></w:tcPr><w:p><w:pPr><w:jc w:val="end"/><w:spacing w:after="60"/></w:pPr><w:r><w:rPr><w:rFonts w:ascii="Times New Roman" w:hAnsi="Times New Roman" w:eastAsia="Times New Roman" w:cs="Times New Roman"/><w:sz w:val="23"/><w:szCs w:val="23"/></w:rPr><w:t xml:space="preserve">1</w:t></w:r></w:p></w:tc></w:tr><w:tr><w:trPr/><w:tc><w:tcPr><w:tcW w:w="1200" w:type="dxa"/><w:noWrap/></w:tcPr><w:p><w:pPr><w:jc w:val="start"/><w:spacing w:after="60"/></w:pPr><w:r><w:rPr><w:rFonts w:ascii="Times New Roman" w:hAnsi="Times New Roman" w:eastAsia="Times New Roman" w:cs="Times New Roman"/><w:sz w:val="23"/><w:szCs w:val="23"/></w:rPr><w:t xml:space="preserve"></w:t></w:r></w:p></w:tc><w:tc><w:tcPr><w:tcW w:w="7000" w:type="dxa"/><w:noWrap/></w:tcPr><w:p><w:pPr><w:jc w:val="start"/><w:spacing w:after="60"/></w:pPr><w:r><w:rPr><w:rFonts w:ascii="Times New Roman" w:hAnsi="Times New Roman" w:eastAsia="Times New Roman" w:cs="Times New Roman"/><w:sz w:val="23"/><w:szCs w:val="23"/></w:rPr><w:t xml:space="preserve">2. Maksud dan Tujuan</w:t></w:r></w:p></w:tc><w:tc><w:tcPr><w:tcW w:w="1000" w:type="dxa"/><w:noWrap/></w:tcPr><w:p><w:pPr><w:jc w:val="end"/><w:spacing w:after="60"/></w:pPr><w:r><w:rPr><w:rFonts w:ascii="Times New Roman" w:hAnsi="Times New Roman" w:eastAsia="Times New Roman" w:cs="Times New Roman"/><w:sz w:val="23"/><w:szCs w:val="23"/></w:rPr><w:t xml:space="preserve">1</w:t></w:r></w:p></w:tc></w:tr><w:tr><w:trPr/><w:tc><w:tcPr><w:tcW w:w="1200" w:type="dxa"/><w:noWrap/></w:tcPr><w:p><w:pPr><w:jc w:val="start"/><w:spacing w:after="60"/></w:pPr><w:r><w:rPr><w:rFonts w:ascii="Times New Roman" w:hAnsi="Times New Roman" w:eastAsia="Times New Roman" w:cs="Times New Roman"/><w:sz w:val="23"/><w:szCs w:val="23"/></w:rPr><w:t xml:space="preserve"></w:t></w:r></w:p></w:tc><w:tc><w:tcPr><w:tcW w:w="7000" w:type="dxa"/><w:noWrap/></w:tcPr><w:p><w:pPr><w:jc w:val="start"/><w:spacing w:after="60"/></w:pPr><w:r><w:rPr><w:rFonts w:ascii="Times New Roman" w:hAnsi="Times New Roman" w:eastAsia="Times New Roman" w:cs="Times New Roman"/><w:sz w:val="23"/><w:szCs w:val="23"/></w:rPr><w:t xml:space="preserve">3. Ruang Lingkup dan Tata Urut</w:t></w:r></w:p></w:tc><w:tc><w:tcPr><w:tcW w:w="1000" w:type="dxa"/><w:noWrap/></w:tcPr><w:p><w:pPr><w:jc w:val="end"/><w:spacing w:after="60"/></w:pPr><w:r><w:rPr><w:rFonts w:ascii="Times New Roman" w:hAnsi="Times New Roman" w:eastAsia="Times New Roman" w:cs="Times New Roman"/><w:sz w:val="23"/><w:szCs w:val="23"/></w:rPr><w:t xml:space="preserve">2</w:t></w:r></w:p></w:tc></w:tr><w:tr><w:trPr/><w:tc><w:tcPr><w:tcW w:w="1200" w:type="dxa"/><w:noWrap/></w:tcPr><w:p><w:pPr><w:jc w:val="start"/><w:spacing w:after="60"/></w:pPr><w:r><w:rPr><w:rFonts w:ascii="Times New Roman" w:hAnsi="Times New Roman" w:eastAsia="Times New Roman" w:cs="Times New Roman"/><w:sz w:val="23"/><w:szCs w:val="23"/></w:rPr><w:t xml:space="preserve"></w:t></w:r></w:p></w:tc><w:tc><w:tcPr><w:tcW w:w="7000" w:type="dxa"/><w:noWrap/></w:tcPr><w:p><w:pPr><w:jc w:val="start"/><w:spacing w:after="60"/></w:pPr><w:r><w:rPr><w:rFonts w:ascii="Times New Roman" w:hAnsi="Times New Roman" w:eastAsia="Times New Roman" w:cs="Times New Roman"/><w:sz w:val="23"/><w:szCs w:val="23"/></w:rPr><w:t xml:space="preserve">4. Referensi</w:t></w:r></w:p></w:tc><w:tc><w:tcPr><w:tcW w:w="1000" w:type="dxa"/><w:noWrap/></w:tcPr><w:p><w:pPr><w:jc w:val="end"/><w:spacing w:after="60"/></w:pPr><w:r><w:rPr><w:rFonts w:ascii="Times New Roman" w:hAnsi="Times New Roman" w:eastAsia="Times New Roman" w:cs="Times New Roman"/><w:sz w:val="23"/><w:szCs w:val="23"/></w:rPr><w:t xml:space="preserve">2</w:t></w:r></w:p></w:tc></w:tr><w:tr><w:trPr/><w:tc><w:tcPr><w:tcW w:w="1200" w:type="dxa"/><w:noWrap/></w:tcPr><w:p><w:pPr><w:jc w:val="start"/><w:spacing w:after="60"/></w:pPr><w:r><w:rPr><w:rFonts w:ascii="Times New Roman" w:hAnsi="Times New Roman" w:eastAsia="Times New Roman" w:cs="Times New Roman"/><w:sz w:val="23"/><w:szCs w:val="23"/></w:rPr><w:t xml:space="preserve"></w:t></w:r></w:p></w:tc><w:tc><w:tcPr><w:tcW w:w="7000" w:type="dxa"/><w:noWrap/></w:tcPr><w:p><w:pPr><w:jc w:val="start"/><w:spacing w:after="60"/></w:pPr><w:r><w:rPr><w:rFonts w:ascii="Times New Roman" w:hAnsi="Times New Roman" w:eastAsia="Times New Roman" w:cs="Times New Roman"/><w:sz w:val="23"/><w:szCs w:val="23"/></w:rPr><w:t xml:space="preserve">5. Pengertian</w:t></w:r></w:p></w:tc><w:tc><w:tcPr><w:tcW w:w="1000" w:type="dxa"/><w:noWrap/></w:tcPr><w:p><w:pPr><w:jc w:val="end"/><w:spacing w:after="60"/></w:pPr><w:r><w:rPr><w:rFonts w:ascii="Times New Roman" w:hAnsi="Times New Roman" w:eastAsia="Times New Roman" w:cs="Times New Roman"/><w:sz w:val="23"/><w:szCs w:val="23"/></w:rPr><w:t xml:space="preserve">2</w:t></w:r></w:p></w:tc></w:tr><w:tr><w:trPr/><w:tc><w:tcPr><w:tcW w:w="1200" w:type="dxa"/><w:noWrap/></w:tcPr><w:p><w:pPr><w:jc w:val="start"/><w:spacing w:after="60"/></w:pPr><w:r><w:rPr><w:rFonts w:ascii="Times New Roman" w:hAnsi="Times New Roman" w:eastAsia="Times New Roman" w:cs="Times New Roman"/><w:sz w:val="23"/><w:szCs w:val="23"/><w:b w:val="1"/><w:bCs w:val="1"/></w:rPr><w:t xml:space="preserve">BAB II</w:t></w:r></w:p></w:tc><w:tc><w:tcPr><w:tcW w:w="7000" w:type="dxa"/><w:noWrap/></w:tcPr><w:p><w:pPr><w:jc w:val="start"/><w:spacing w:after="60"/></w:pPr><w:r><w:rPr><w:rFonts w:ascii="Times New Roman" w:hAnsi="Times New Roman" w:eastAsia="Times New Roman" w:cs="Times New Roman"/><w:sz w:val="23"/><w:szCs w:val="23"/><w:b w:val="1"/><w:bCs w:val="1"/></w:rPr><w:t xml:space="preserve">MATERI DOKUMENTASI</w:t></w:r></w:p></w:tc><w:tc><w:tcPr><w:tcW w:w="1000" w:type="dxa"/><w:noWrap/></w:tcPr><w:p><w:pPr><w:jc w:val="end"/><w:spacing w:after="60"/></w:pPr><w:r><w:rPr><w:rFonts w:ascii="Times New Roman" w:hAnsi="Times New Roman" w:eastAsia="Times New Roman" w:cs="Times New Roman"/><w:sz w:val="23"/><w:szCs w:val="23"/><w:b w:val="1"/><w:bCs w:val="1"/></w:rPr><w:t xml:space="preserve">3</w:t></w:r></w:p></w:tc></w:tr><w:tr><w:trPr/><w:tc><w:tcPr><w:tcW w:w="1200" w:type="dxa"/><w:noWrap/></w:tcPr><w:p><w:pPr><w:jc w:val="start"/><w:spacing w:after="60"/></w:pPr><w:r><w:rPr><w:rFonts w:ascii="Times New Roman" w:hAnsi="Times New Roman" w:eastAsia="Times New Roman" w:cs="Times New Roman"/><w:sz w:val="23"/><w:szCs w:val="23"/></w:rPr><w:t xml:space="preserve"></w:t></w:r></w:p></w:tc><w:tc><w:tcPr><w:tcW w:w="7000" w:type="dxa"/><w:noWrap/></w:tcPr><w:p><w:pPr><w:jc w:val="start"/><w:spacing w:after="60"/></w:pPr><w:r><w:rPr><w:rFonts w:ascii="Times New Roman" w:hAnsi="Times New Roman" w:eastAsia="Times New Roman" w:cs="Times New Roman"/><w:sz w:val="23"/><w:szCs w:val="23"/></w:rPr><w:t xml:space="preserve">6. Umum</w:t></w:r></w:p></w:tc><w:tc><w:tcPr><w:tcW w:w="1000" w:type="dxa"/><w:noWrap/></w:tcPr><w:p><w:pPr><w:jc w:val="end"/><w:spacing w:after="60"/></w:pPr><w:r><w:rPr><w:rFonts w:ascii="Times New Roman" w:hAnsi="Times New Roman" w:eastAsia="Times New Roman" w:cs="Times New Roman"/><w:sz w:val="23"/><w:szCs w:val="23"/></w:rPr><w:t xml:space="preserve">3</w:t></w:r></w:p></w:tc></w:tr><w:tr><w:trPr/><w:tc><w:tcPr><w:tcW w:w="1200" w:type="dxa"/><w:noWrap/></w:tcPr><w:p><w:pPr><w:jc w:val="start"/><w:spacing w:after="60"/></w:pPr><w:r><w:rPr><w:rFonts w:ascii="Times New Roman" w:hAnsi="Times New Roman" w:eastAsia="Times New Roman" w:cs="Times New Roman"/><w:sz w:val="23"/><w:szCs w:val="23"/></w:rPr><w:t xml:space="preserve"></w:t></w:r></w:p></w:tc><w:tc><w:tcPr><w:tcW w:w="7000" w:type="dxa"/><w:noWrap/></w:tcPr><w:p><w:pPr><w:jc w:val="start"/><w:spacing w:after="60"/></w:pPr><w:r><w:rPr><w:rFonts w:ascii="Times New Roman" w:hAnsi="Times New Roman" w:eastAsia="Times New Roman" w:cs="Times New Roman"/><w:sz w:val="23"/><w:szCs w:val="23"/></w:rPr><w:t xml:space="preserve">7. Tujuan Pembuatan Dokumentasi Sistem</w:t></w:r></w:p></w:tc><w:tc><w:tcPr><w:tcW w:w="1000" w:type="dxa"/><w:noWrap/></w:tcPr><w:p><w:pPr><w:jc w:val="end"/><w:spacing w:after="60"/></w:pPr><w:r><w:rPr><w:rFonts w:ascii="Times New Roman" w:hAnsi="Times New Roman" w:eastAsia="Times New Roman" w:cs="Times New Roman"/><w:sz w:val="23"/><w:szCs w:val="23"/></w:rPr><w:t xml:space="preserve">3</w:t></w:r></w:p></w:tc></w:tr><w:tr><w:trPr/><w:tc><w:tcPr><w:tcW w:w="1200" w:type="dxa"/><w:noWrap/></w:tcPr><w:p><w:pPr><w:jc w:val="start"/><w:spacing w:after="60"/></w:pPr><w:r><w:rPr><w:rFonts w:ascii="Times New Roman" w:hAnsi="Times New Roman" w:eastAsia="Times New Roman" w:cs="Times New Roman"/><w:sz w:val="23"/><w:szCs w:val="23"/></w:rPr><w:t xml:space="preserve"></w:t></w:r></w:p></w:tc><w:tc><w:tcPr><w:tcW w:w="7000" w:type="dxa"/><w:noWrap/></w:tcPr><w:p><w:pPr><w:jc w:val="start"/><w:spacing w:after="60"/></w:pPr><w:r><w:rPr><w:rFonts w:ascii="Times New Roman" w:hAnsi="Times New Roman" w:eastAsia="Times New Roman" w:cs="Times New Roman"/><w:sz w:val="23"/><w:szCs w:val="23"/></w:rPr><w:t xml:space="preserve">8. Cara Pengisian</w:t></w:r></w:p></w:tc><w:tc><w:tcPr><w:tcW w:w="1000" w:type="dxa"/><w:noWrap/></w:tcPr><w:p><w:pPr><w:jc w:val="end"/><w:spacing w:after="60"/></w:pPr><w:r><w:rPr><w:rFonts w:ascii="Times New Roman" w:hAnsi="Times New Roman" w:eastAsia="Times New Roman" w:cs="Times New Roman"/><w:sz w:val="23"/><w:szCs w:val="23"/></w:rPr><w:t xml:space="preserve">3</w:t></w:r></w:p></w:tc></w:tr><w:tr><w:trPr/><w:tc><w:tcPr><w:tcW w:w="1200" w:type="dxa"/><w:noWrap/></w:tcPr><w:p><w:pPr><w:jc w:val="start"/><w:spacing w:after="60"/></w:pPr><w:r><w:rPr><w:rFonts w:ascii="Times New Roman" w:hAnsi="Times New Roman" w:eastAsia="Times New Roman" w:cs="Times New Roman"/><w:sz w:val="23"/><w:szCs w:val="23"/><w:b w:val="1"/><w:bCs w:val="1"/></w:rPr><w:t xml:space="preserve">BAB III</w:t></w:r></w:p></w:tc><w:tc><w:tcPr><w:tcW w:w="7000" w:type="dxa"/><w:noWrap/></w:tcPr><w:p><w:pPr><w:jc w:val="start"/><w:spacing w:after="60"/></w:pPr><w:r><w:rPr><w:rFonts w:ascii="Times New Roman" w:hAnsi="Times New Roman" w:eastAsia="Times New Roman" w:cs="Times New Roman"/><w:sz w:val="23"/><w:szCs w:val="23"/><w:b w:val="1"/><w:bCs w:val="1"/></w:rPr><w:t xml:space="preserve">PERILAKU TERHADAP DOKUMEN / KETENTUAN DOKUMEN</w:t></w:r></w:p></w:tc><w:tc><w:tcPr><w:tcW w:w="1000" w:type="dxa"/><w:noWrap/></w:tcPr><w:p><w:pPr><w:jc w:val="end"/><w:spacing w:after="60"/></w:pPr><w:r><w:rPr><w:rFonts w:ascii="Times New Roman" w:hAnsi="Times New Roman" w:eastAsia="Times New Roman" w:cs="Times New Roman"/><w:sz w:val="23"/><w:szCs w:val="23"/><w:b w:val="1"/><w:bCs w:val="1"/></w:rPr><w:t xml:space="preserve">4</w:t></w:r></w:p></w:tc></w:tr><w:tr><w:trPr/><w:tc><w:tcPr><w:tcW w:w="1200" w:type="dxa"/><w:noWrap/></w:tcPr><w:p><w:pPr><w:jc w:val="start"/><w:spacing w:after="60"/></w:pPr><w:r><w:rPr><w:rFonts w:ascii="Times New Roman" w:hAnsi="Times New Roman" w:eastAsia="Times New Roman" w:cs="Times New Roman"/><w:sz w:val="23"/><w:szCs w:val="23"/></w:rPr><w:t xml:space="preserve"></w:t></w:r></w:p></w:tc><w:tc><w:tcPr><w:tcW w:w="7000" w:type="dxa"/><w:noWrap/></w:tcPr><w:p><w:pPr><w:jc w:val="start"/><w:spacing w:after="60"/></w:pPr><w:r><w:rPr><w:rFonts w:ascii="Times New Roman" w:hAnsi="Times New Roman" w:eastAsia="Times New Roman" w:cs="Times New Roman"/><w:sz w:val="23"/><w:szCs w:val="23"/></w:rPr><w:t xml:space="preserve">9. Umum</w:t></w:r></w:p></w:tc><w:tc><w:tcPr><w:tcW w:w="1000" w:type="dxa"/><w:noWrap/></w:tcPr><w:p><w:pPr><w:jc w:val="end"/><w:spacing w:after="60"/></w:pPr><w:r><w:rPr><w:rFonts w:ascii="Times New Roman" w:hAnsi="Times New Roman" w:eastAsia="Times New Roman" w:cs="Times New Roman"/><w:sz w:val="23"/><w:szCs w:val="23"/></w:rPr><w:t xml:space="preserve">4</w:t></w:r></w:p></w:tc></w:tr><w:tr><w:trPr/><w:tc><w:tcPr><w:tcW w:w="1200" w:type="dxa"/><w:noWrap/></w:tcPr><w:p><w:pPr><w:jc w:val="start"/><w:spacing w:after="60"/></w:pPr><w:r><w:rPr><w:rFonts w:ascii="Times New Roman" w:hAnsi="Times New Roman" w:eastAsia="Times New Roman" w:cs="Times New Roman"/><w:sz w:val="23"/><w:szCs w:val="23"/></w:rPr><w:t xml:space="preserve"></w:t></w:r></w:p></w:tc><w:tc><w:tcPr><w:tcW w:w="7000" w:type="dxa"/><w:noWrap/></w:tcPr><w:p><w:pPr><w:jc w:val="start"/><w:spacing w:after="60"/></w:pPr><w:r><w:rPr><w:rFonts w:ascii="Times New Roman" w:hAnsi="Times New Roman" w:eastAsia="Times New Roman" w:cs="Times New Roman"/><w:sz w:val="23"/><w:szCs w:val="23"/></w:rPr><w:t xml:space="preserve">10. Narasi Program</w:t></w:r></w:p></w:tc><w:tc><w:tcPr><w:tcW w:w="1000" w:type="dxa"/><w:noWrap/></w:tcPr><w:p><w:pPr><w:jc w:val="end"/><w:spacing w:after="60"/></w:pPr><w:r><w:rPr><w:rFonts w:ascii="Times New Roman" w:hAnsi="Times New Roman" w:eastAsia="Times New Roman" w:cs="Times New Roman"/><w:sz w:val="23"/><w:szCs w:val="23"/></w:rPr><w:t xml:space="preserve">4</w:t></w:r></w:p></w:tc></w:tr><w:tr><w:trPr/><w:tc><w:tcPr><w:tcW w:w="1200" w:type="dxa"/><w:noWrap/></w:tcPr><w:p><w:pPr><w:jc w:val="start"/><w:spacing w:after="60"/></w:pPr><w:r><w:rPr><w:rFonts w:ascii="Times New Roman" w:hAnsi="Times New Roman" w:eastAsia="Times New Roman" w:cs="Times New Roman"/><w:sz w:val="23"/><w:szCs w:val="23"/></w:rPr><w:t xml:space="preserve"></w:t></w:r></w:p></w:tc><w:tc><w:tcPr><w:tcW w:w="7000" w:type="dxa"/><w:noWrap/></w:tcPr><w:p><w:pPr><w:jc w:val="start"/><w:spacing w:after="60"/></w:pPr><w:r><w:rPr><w:rFonts w:ascii="Times New Roman" w:hAnsi="Times New Roman" w:eastAsia="Times New Roman" w:cs="Times New Roman"/><w:sz w:val="23"/><w:szCs w:val="23"/></w:rPr><w:t xml:space="preserve">11. Diagram Arus Data (Data Flow Diagram)</w:t></w:r></w:p></w:tc><w:tc><w:tcPr><w:tcW w:w="1000" w:type="dxa"/><w:noWrap/></w:tcPr><w:p><w:pPr><w:jc w:val="end"/><w:spacing w:after="60"/></w:pPr><w:r><w:rPr><w:rFonts w:ascii="Times New Roman" w:hAnsi="Times New Roman" w:eastAsia="Times New Roman" w:cs="Times New Roman"/><w:sz w:val="23"/><w:szCs w:val="23"/></w:rPr><w:t xml:space="preserve">6</w:t></w:r></w:p></w:tc></w:tr><w:tr><w:trPr/><w:tc><w:tcPr><w:tcW w:w="1200" w:type="dxa"/><w:noWrap/></w:tcPr><w:p><w:pPr><w:jc w:val="start"/><w:spacing w:after="60"/></w:pPr><w:r><w:rPr><w:rFonts w:ascii="Times New Roman" w:hAnsi="Times New Roman" w:eastAsia="Times New Roman" w:cs="Times New Roman"/><w:sz w:val="23"/><w:szCs w:val="23"/></w:rPr><w:t xml:space="preserve"></w:t></w:r></w:p></w:tc><w:tc><w:tcPr><w:tcW w:w="7000" w:type="dxa"/><w:noWrap/></w:tcPr><w:p><w:pPr><w:jc w:val="start"/><w:spacing w:after="60"/></w:pPr><w:r><w:rPr><w:rFonts w:ascii="Times New Roman" w:hAnsi="Times New Roman" w:eastAsia="Times New Roman" w:cs="Times New Roman"/><w:sz w:val="23"/><w:szCs w:val="23"/></w:rPr><w:t xml:space="preserve">12. Diagram Hubungan Entity (ERD)</w:t></w:r></w:p></w:tc><w:tc><w:tcPr><w:tcW w:w="1000" w:type="dxa"/><w:noWrap/></w:tcPr><w:p><w:pPr><w:jc w:val="end"/><w:spacing w:after="60"/></w:pPr><w:r><w:rPr><w:rFonts w:ascii="Times New Roman" w:hAnsi="Times New Roman" w:eastAsia="Times New Roman" w:cs="Times New Roman"/><w:sz w:val="23"/><w:szCs w:val="23"/></w:rPr><w:t xml:space="preserve">8</w:t></w:r></w:p></w:tc></w:tr><w:tr><w:trPr/><w:tc><w:tcPr><w:tcW w:w="1200" w:type="dxa"/><w:noWrap/></w:tcPr><w:p><w:pPr><w:jc w:val="start"/><w:spacing w:after="60"/></w:pPr><w:r><w:rPr><w:rFonts w:ascii="Times New Roman" w:hAnsi="Times New Roman" w:eastAsia="Times New Roman" w:cs="Times New Roman"/><w:sz w:val="23"/><w:szCs w:val="23"/></w:rPr><w:t xml:space="preserve"></w:t></w:r></w:p></w:tc><w:tc><w:tcPr><w:tcW w:w="7000" w:type="dxa"/><w:noWrap/></w:tcPr><w:p><w:pPr><w:jc w:val="start"/><w:spacing w:after="60"/></w:pPr><w:r><w:rPr><w:rFonts w:ascii="Times New Roman" w:hAnsi="Times New Roman" w:eastAsia="Times New Roman" w:cs="Times New Roman"/><w:sz w:val="23"/><w:szCs w:val="23"/></w:rPr><w:t xml:space="preserve">13. Kamus Data / Struktur File</w:t></w:r></w:p></w:tc><w:tc><w:tcPr><w:tcW w:w="1000" w:type="dxa"/><w:noWrap/></w:tcPr><w:p><w:pPr><w:jc w:val="end"/><w:spacing w:after="60"/></w:pPr><w:r><w:rPr><w:rFonts w:ascii="Times New Roman" w:hAnsi="Times New Roman" w:eastAsia="Times New Roman" w:cs="Times New Roman"/><w:sz w:val="23"/><w:szCs w:val="23"/></w:rPr><w:t xml:space="preserve">9</w:t></w:r></w:p></w:tc></w:tr><w:tr><w:trPr/><w:tc><w:tcPr><w:tcW w:w="1200" w:type="dxa"/><w:noWrap/></w:tcPr><w:p><w:pPr><w:jc w:val="start"/><w:spacing w:after="60"/></w:pPr><w:r><w:rPr><w:rFonts w:ascii="Times New Roman" w:hAnsi="Times New Roman" w:eastAsia="Times New Roman" w:cs="Times New Roman"/><w:sz w:val="23"/><w:szCs w:val="23"/></w:rPr><w:t xml:space="preserve"></w:t></w:r></w:p></w:tc><w:tc><w:tcPr><w:tcW w:w="7000" w:type="dxa"/><w:noWrap/></w:tcPr><w:p><w:pPr><w:jc w:val="start"/><w:spacing w:after="60"/></w:pPr><w:r><w:rPr><w:rFonts w:ascii="Times New Roman" w:hAnsi="Times New Roman" w:eastAsia="Times New Roman" w:cs="Times New Roman"/><w:sz w:val="23"/><w:szCs w:val="23"/></w:rPr><w:t xml:space="preserve">14. Spesifikasi Program</w:t></w:r></w:p></w:tc><w:tc><w:tcPr><w:tcW w:w="1000" w:type="dxa"/><w:noWrap/></w:tcPr><w:p><w:pPr><w:jc w:val="end"/><w:spacing w:after="60"/></w:pPr><w:r><w:rPr><w:rFonts w:ascii="Times New Roman" w:hAnsi="Times New Roman" w:eastAsia="Times New Roman" w:cs="Times New Roman"/><w:sz w:val="23"/><w:szCs w:val="23"/></w:rPr><w:t xml:space="preserve">14</w:t></w:r></w:p></w:tc></w:tr><w:tr><w:trPr/><w:tc><w:tcPr><w:tcW w:w="1200" w:type="dxa"/><w:noWrap/></w:tcPr><w:p><w:pPr><w:jc w:val="start"/><w:spacing w:after="60"/></w:pPr><w:r><w:rPr><w:rFonts w:ascii="Times New Roman" w:hAnsi="Times New Roman" w:eastAsia="Times New Roman" w:cs="Times New Roman"/><w:sz w:val="23"/><w:szCs w:val="23"/></w:rPr><w:t xml:space="preserve"></w:t></w:r></w:p></w:tc><w:tc><w:tcPr><w:tcW w:w="7000" w:type="dxa"/><w:noWrap/></w:tcPr><w:p><w:pPr><w:jc w:val="start"/><w:spacing w:after="60"/></w:pPr><w:r><w:rPr><w:rFonts w:ascii="Times New Roman" w:hAnsi="Times New Roman" w:eastAsia="Times New Roman" w:cs="Times New Roman"/><w:sz w:val="23"/><w:szCs w:val="23"/></w:rPr><w:t xml:space="preserve">15. Bentuk Tampilan dan Cetakan</w:t></w:r></w:p></w:tc><w:tc><w:tcPr><w:tcW w:w="1000" w:type="dxa"/><w:noWrap/></w:tcPr><w:p><w:pPr><w:jc w:val="end"/><w:spacing w:after="60"/></w:pPr><w:r><w:rPr><w:rFonts w:ascii="Times New Roman" w:hAnsi="Times New Roman" w:eastAsia="Times New Roman" w:cs="Times New Roman"/><w:sz w:val="23"/><w:szCs w:val="23"/></w:rPr><w:t xml:space="preserve">19</w:t></w:r></w:p></w:tc></w:tr><w:tr><w:trPr/><w:tc><w:tcPr><w:tcW w:w="1200" w:type="dxa"/><w:noWrap/></w:tcPr><w:p><w:pPr><w:jc w:val="start"/><w:spacing w:after="60"/></w:pPr><w:r><w:rPr><w:rFonts w:ascii="Times New Roman" w:hAnsi="Times New Roman" w:eastAsia="Times New Roman" w:cs="Times New Roman"/><w:sz w:val="23"/><w:szCs w:val="23"/></w:rPr><w:t xml:space="preserve"></w:t></w:r></w:p></w:tc><w:tc><w:tcPr><w:tcW w:w="7000" w:type="dxa"/><w:noWrap/></w:tcPr><w:p><w:pPr><w:jc w:val="start"/><w:spacing w:after="60"/></w:pPr><w:r><w:rPr><w:rFonts w:ascii="Times New Roman" w:hAnsi="Times New Roman" w:eastAsia="Times New Roman" w:cs="Times New Roman"/><w:sz w:val="23"/><w:szCs w:val="23"/></w:rPr><w:t xml:space="preserve">16. Listing Program</w:t></w:r></w:p></w:tc><w:tc><w:tcPr><w:tcW w:w="1000" w:type="dxa"/><w:noWrap/></w:tcPr><w:p><w:pPr><w:jc w:val="end"/><w:spacing w:after="60"/></w:pPr><w:r><w:rPr><w:rFonts w:ascii="Times New Roman" w:hAnsi="Times New Roman" w:eastAsia="Times New Roman" w:cs="Times New Roman"/><w:sz w:val="23"/><w:szCs w:val="23"/></w:rPr><w:t xml:space="preserve">23</w:t></w:r></w:p></w:tc></w:tr><w:tr><w:trPr/><w:tc><w:tcPr><w:tcW w:w="1200" w:type="dxa"/><w:noWrap/></w:tcPr><w:p><w:pPr><w:jc w:val="start"/><w:spacing w:after="60"/></w:pPr><w:r><w:rPr><w:rFonts w:ascii="Times New Roman" w:hAnsi="Times New Roman" w:eastAsia="Times New Roman" w:cs="Times New Roman"/><w:sz w:val="23"/><w:szCs w:val="23"/><w:b w:val="1"/><w:bCs w:val="1"/></w:rPr><w:t xml:space="preserve">BAB IV</w:t></w:r></w:p></w:tc><w:tc><w:tcPr><w:tcW w:w="7000" w:type="dxa"/><w:noWrap/></w:tcPr><w:p><w:pPr><w:jc w:val="start"/><w:spacing w:after="60"/></w:pPr><w:r><w:rPr><w:rFonts w:ascii="Times New Roman" w:hAnsi="Times New Roman" w:eastAsia="Times New Roman" w:cs="Times New Roman"/><w:sz w:val="23"/><w:szCs w:val="23"/><w:b w:val="1"/><w:bCs w:val="1"/></w:rPr><w:t xml:space="preserve">PENUTUP</w:t></w:r></w:p></w:tc><w:tc><w:tcPr><w:tcW w:w="1000" w:type="dxa"/><w:noWrap/></w:tcPr><w:p><w:pPr><w:jc w:val="end"/><w:spacing w:after="60"/></w:pPr><w:r><w:rPr><w:rFonts w:ascii="Times New Roman" w:hAnsi="Times New Roman" w:eastAsia="Times New Roman" w:cs="Times New Roman"/><w:sz w:val="23"/><w:szCs w:val="23"/><w:b w:val="1"/><w:bCs w:val="1"/></w:rPr><w:t xml:space="preserve">28</w:t></w:r></w:p></w:tc></w:tr><w:tr><w:trPr/><w:tc><w:tcPr><w:tcW w:w="1200" w:type="dxa"/><w:noWrap/></w:tcPr><w:p><w:pPr><w:jc w:val="start"/><w:spacing w:after="60"/></w:pPr><w:r><w:rPr><w:rFonts w:ascii="Times New Roman" w:hAnsi="Times New Roman" w:eastAsia="Times New Roman" w:cs="Times New Roman"/><w:sz w:val="23"/><w:szCs w:val="23"/></w:rPr><w:t xml:space="preserve"></w:t></w:r></w:p></w:tc><w:tc><w:tcPr><w:tcW w:w="7000" w:type="dxa"/><w:noWrap/></w:tcPr><w:p><w:pPr><w:jc w:val="start"/><w:spacing w:after="60"/></w:pPr><w:r><w:rPr><w:rFonts w:ascii="Times New Roman" w:hAnsi="Times New Roman" w:eastAsia="Times New Roman" w:cs="Times New Roman"/><w:sz w:val="23"/><w:szCs w:val="23"/></w:rPr><w:t xml:space="preserve">17. Penutup</w:t></w:r></w:p></w:tc><w:tc><w:tcPr><w:tcW w:w="1000" w:type="dxa"/><w:noWrap/></w:tcPr><w:p><w:pPr><w:jc w:val="end"/><w:spacing w:after="60"/></w:pPr><w:r><w:rPr><w:rFonts w:ascii="Times New Roman" w:hAnsi="Times New Roman" w:eastAsia="Times New Roman" w:cs="Times New Roman"/><w:sz w:val="23"/><w:szCs w:val="23"/></w:rPr><w:t xml:space="preserve">28</w:t></w:r></w:p></w:tc></w:tr></w:tbl><w:p><w:r><w:br w:type="page"/></w:r></w:p><w:p><w:pPr><w:jc w:val="center"/><w:spacing w:after="60"/></w:pPr><w:r><w:rPr><w:rFonts w:ascii="Times New Roman" w:hAnsi="Times New Roman" w:eastAsia="Times New Roman" w:cs="Times New Roman"/><w:sz w:val="26"/><w:szCs w:val="26"/><w:b w:val="1"/><w:bCs w:val="1"/></w:rPr><w:t xml:space="preserve">BAB I</w:t></w:r></w:p><w:p><w:pPr><w:jc w:val="center"/><w:spacing w:after="60"/></w:pPr><w:r><w:rPr><w:rFonts w:ascii="Times New Roman" w:hAnsi="Times New Roman" w:eastAsia="Times New Roman" w:cs="Times New Roman"/><w:sz w:val="26"/><w:szCs w:val="26"/><w:b w:val="1"/><w:bCs w:val="1"/></w:rPr><w:t xml:space="preserve">PENDAHULUAN</w:t></w:r></w:p><w:p/><w:p><w:pPr><w:jc w:val="start"/><w:spacing w:after="60"/></w:pPr><w:r><w:rPr><w:rFonts w:ascii="Times New Roman" w:hAnsi="Times New Roman" w:eastAsia="Times New Roman" w:cs="Times New Roman"/><w:sz w:val="24"/><w:szCs w:val="24"/><w:b w:val="1"/><w:bCs w:val="1"/></w:rPr><w:t xml:space="preserve">1.   Umum.</w:t></w:r></w:p><w:p><w:pPr><w:jc w:val="both"/><w:spacing w:after="80" w:line="276" w:lineRule="auto"/></w:pPr><w:r><w:rPr><w:rFonts w:ascii="Times New Roman" w:hAnsi="Times New Roman" w:eastAsia="Times New Roman" w:cs="Times New Roman"/><w:sz w:val="23"/><w:szCs w:val="23"/></w:rPr><w:t xml:space="preserve">a.   Dokumentasi sistem merupakan salah satu kegiatan fundamental dalam penyelenggaraan pembinaan sistem informasi di lingkungan TNI AD pada setiap tahapan daur hidup pengembangan perangkat lunak (System Development Life Cycle). Dokumentasi sistem dirancang secara kolaboratif oleh Analis Sistem (Nalsis) dan Pemrogram, selanjutnya dihimpun menjadi satu berkas terstruktur yang menjadi tanggung jawab resmi Pemrogram guna menjamin transparansi, akuntabilitas, dan keterpeliharaan sistem.</w:t></w:r></w:p><w:p><w:pPr><w:jc w:val="both"/><w:spacing w:after="80" w:line="276" w:lineRule="auto"/></w:pPr><w:r><w:rPr><w:rFonts w:ascii="Times New Roman" w:hAnsi="Times New Roman" w:eastAsia="Times New Roman" w:cs="Times New Roman"/><w:sz w:val="23"/><w:szCs w:val="23"/></w:rPr><w:t xml:space="preserve">b.   Prajurit dan Pegawai Negeri Sipil (PNS) TNI Angkatan Darat dalam pelaksanaan dinas keprajuritan memiliki 33 (tiga puluh tiga) jenis dokumen induk administrasi atau dosir wajib. Selama ini, tata kelola dosir fisik menghadapi kerentanan risiko kerusakan fisik akibat lapuk, kelembapan, bencana alam, serta lambatnya proses pencarian berkas saat pengusulan kenaikan pangkat (UKP), penugasan operasi, maupun persiapan masa purna tugas.</w:t></w:r></w:p><w:p><w:pPr><w:jc w:val="both"/><w:spacing w:after="80" w:line="276" w:lineRule="auto"/></w:pPr><w:r><w:rPr><w:rFonts w:ascii="Times New Roman" w:hAnsi="Times New Roman" w:eastAsia="Times New Roman" w:cs="Times New Roman"/><w:sz w:val="23"/><w:szCs w:val="23"/></w:rPr><w:t xml:space="preserve">c.   Untuk mengatasi tantangan tersebut, dibangun sistem TRISULA TNI AD (Tata Kelola Rekam Informasi, Sistematika, & Unduhan Lengkap Arsip). Sistem ini mendigitalisasi seluruh 33 dosir prajurit, memfasilitasi pemindaian langsung melalui kamera perangkat bergerak, menerapkan verifikasi administratif bertingkat oleh Staf Personel, serta mengesahkan dokumen melalui Tanda Tangan Elektronik (TTE) ber-QR Code dengan verifikasi integritas cryptographic hash SHA-256.</w:t></w:r></w:p><w:p><w:pPr><w:jc w:val="both"/><w:spacing w:after="80" w:line="276" w:lineRule="auto"/></w:pPr><w:r><w:rPr><w:rFonts w:ascii="Times New Roman" w:hAnsi="Times New Roman" w:eastAsia="Times New Roman" w:cs="Times New Roman"/><w:sz w:val="23"/><w:szCs w:val="23"/></w:rPr><w:t xml:space="preserve">d.   Agar operasional, pengawasan, pemeliharaan (*har*), dan pengembangan aplikasi TRISULA TNI AD dapat berjalan secara berkelanjutan dan berdaya guna, maka disusunlah Buku Dokumentasi Sistem ini dengan berpedoman pada kaidah resmi pembinaan sistem informasi TNI Angkatan Darat.</w:t></w:r></w:p><w:p/><w:p><w:pPr><w:jc w:val="start"/><w:spacing w:after="60"/></w:pPr><w:r><w:rPr><w:rFonts w:ascii="Times New Roman" w:hAnsi="Times New Roman" w:eastAsia="Times New Roman" w:cs="Times New Roman"/><w:sz w:val="24"/><w:szCs w:val="24"/><w:b w:val="1"/><w:bCs w:val="1"/></w:rPr><w:t xml:space="preserve">2.   Maksud dan Tujuan.</w:t></w:r></w:p><w:p><w:pPr><w:jc w:val="both"/><w:spacing w:after="80" w:line="276" w:lineRule="auto"/></w:pPr><w:r><w:rPr><w:rFonts w:ascii="Times New Roman" w:hAnsi="Times New Roman" w:eastAsia="Times New Roman" w:cs="Times New Roman"/><w:sz w:val="23"/><w:szCs w:val="23"/></w:rPr><w:t xml:space="preserve">a.   Maksud. Dokumentasi Sistem Program Aplikasi TRISULA TNI AD ini disusun dengan maksud untuk memberikan gambaran, uraian teknis, logika pemrograman, arsitektur basis data, serta spesifikasi modul sistem secara utuh dan transparan.</w:t></w:r></w:p><w:p><w:pPr><w:jc w:val="both"/><w:spacing w:after="80" w:line="276" w:lineRule="auto"/></w:pPr><w:r><w:rPr><w:rFonts w:ascii="Times New Roman" w:hAnsi="Times New Roman" w:eastAsia="Times New Roman" w:cs="Times New Roman"/><w:sz w:val="23"/><w:szCs w:val="23"/></w:rPr><w:t xml:space="preserve">b.   Tujuan. Dokumentasi ini disusun dengan tujuan sebagai pedoman baku bagi Analis Sistem, Pemrogram, Administrator Satuan (Staf Personel/Infolahta), Teknisi Komputer, Auditor Inspektorat, serta pimpinan satuan dalam mengoperasikan, mengevaluasi, memelihara, dan mengembangkan aplikasi TRISULA TNI AD di masa depan.</w:t></w:r></w:p><w:p/><w:p><w:pPr><w:jc w:val="start"/><w:spacing w:after="60"/></w:pPr><w:r><w:rPr><w:rFonts w:ascii="Times New Roman" w:hAnsi="Times New Roman" w:eastAsia="Times New Roman" w:cs="Times New Roman"/><w:sz w:val="24"/><w:szCs w:val="24"/><w:b w:val="1"/><w:bCs w:val="1"/></w:rPr><w:t xml:space="preserve">3.   Ruang Lingkup dan Tata Urut.</w:t></w:r></w:p><w:p><w:pPr><w:jc w:val="both"/><w:spacing w:after="80" w:line="276" w:lineRule="auto"/></w:pPr><w:r><w:rPr><w:rFonts w:ascii="Times New Roman" w:hAnsi="Times New Roman" w:eastAsia="Times New Roman" w:cs="Times New Roman"/><w:sz w:val="23"/><w:szCs w:val="23"/></w:rPr><w:t xml:space="preserve">a.   Ruang Lingkup. Dokumentasi ini mencakup keseluruhan daur rancang bangun aplikasi TRISULA TNI AD, meliputi narasi logika fungsional, diagram arus data (DFD), model hubungan entitas (ERD), kamus data terinci, spesifikasi form dan prosedur pengolahan, bentuk tampilan visual dan cetakan laporan kedinasan, serta potongan kode program inti (core source code).</w:t></w:r></w:p><w:p><w:pPr><w:jc w:val="both"/><w:spacing w:after="80" w:line="276" w:lineRule="auto"/></w:pPr><w:r><w:rPr><w:rFonts w:ascii="Times New Roman" w:hAnsi="Times New Roman" w:eastAsia="Times New Roman" w:cs="Times New Roman"/><w:sz w:val="23"/><w:szCs w:val="23"/></w:rPr><w:t xml:space="preserve">b.   Tata Urut. Naskah dokumentasi sistem ini disusun dengan tata urut sebagai berikut :</w:t></w:r></w:p><w:p><w:pPr><w:jc w:val="start"/><w:spacing w:after="60"/></w:pPr><w:r><w:rPr><w:rFonts w:ascii="Times New Roman" w:hAnsi="Times New Roman" w:eastAsia="Times New Roman" w:cs="Times New Roman"/><w:sz w:val="23"/><w:szCs w:val="23"/><w:b w:val="1"/><w:bCs w:val="1"/></w:rPr><w:t xml:space="preserve">     1)   BAB I     PENDAHULUAN</w:t></w:r></w:p><w:p><w:pPr><w:jc w:val="start"/><w:spacing w:after="60"/></w:pPr><w:r><w:rPr><w:rFonts w:ascii="Times New Roman" w:hAnsi="Times New Roman" w:eastAsia="Times New Roman" w:cs="Times New Roman"/><w:sz w:val="23"/><w:szCs w:val="23"/><w:b w:val="1"/><w:bCs w:val="1"/></w:rPr><w:t xml:space="preserve">     2)   BAB II    MATERI DOKUMENTASI</w:t></w:r></w:p><w:p><w:pPr><w:jc w:val="start"/><w:spacing w:after="60"/></w:pPr><w:r><w:rPr><w:rFonts w:ascii="Times New Roman" w:hAnsi="Times New Roman" w:eastAsia="Times New Roman" w:cs="Times New Roman"/><w:sz w:val="23"/><w:szCs w:val="23"/><w:b w:val="1"/><w:bCs w:val="1"/></w:rPr><w:t xml:space="preserve">     3)   BAB III   PERILAKU TERHADAP DOKUMEN / KETENTUAN DOKUMEN</w:t></w:r></w:p><w:p><w:pPr><w:jc w:val="start"/><w:spacing w:after="60"/></w:pPr><w:r><w:rPr><w:rFonts w:ascii="Times New Roman" w:hAnsi="Times New Roman" w:eastAsia="Times New Roman" w:cs="Times New Roman"/><w:sz w:val="23"/><w:szCs w:val="23"/><w:b w:val="1"/><w:bCs w:val="1"/></w:rPr><w:t xml:space="preserve">     4)   BAB IV    PENUTUP</w:t></w:r></w:p><w:p/><w:p><w:pPr><w:jc w:val="start"/><w:spacing w:after="60"/></w:pPr><w:r><w:rPr><w:rFonts w:ascii="Times New Roman" w:hAnsi="Times New Roman" w:eastAsia="Times New Roman" w:cs="Times New Roman"/><w:sz w:val="24"/><w:szCs w:val="24"/><w:b w:val="1"/><w:bCs w:val="1"/></w:rPr><w:t xml:space="preserve">4.   Referensi.</w:t></w:r></w:p><w:p><w:pPr><w:jc w:val="both"/><w:spacing w:after="80" w:line="276" w:lineRule="auto"/></w:pPr><w:r><w:rPr><w:rFonts w:ascii="Times New Roman" w:hAnsi="Times New Roman" w:eastAsia="Times New Roman" w:cs="Times New Roman"/><w:sz w:val="23"/><w:szCs w:val="23"/></w:rPr><w:t xml:space="preserve">Penyusunan dokumentasi sistem ini didasarkan pada rujukan resmi kedinasan :</w:t></w:r></w:p><w:p><w:pPr><w:jc w:val="both"/><w:spacing w:after="80" w:line="276" w:lineRule="auto"/></w:pPr><w:r><w:rPr><w:rFonts w:ascii="Times New Roman" w:hAnsi="Times New Roman" w:eastAsia="Times New Roman" w:cs="Times New Roman"/><w:sz w:val="23"/><w:szCs w:val="23"/></w:rPr><w:t xml:space="preserve">a.   Surat Keputusan Kasad Nomor Skep/45/II/2005 tanggal 14 Maret 2005 tentang Buku Petunjuk Teknik Penyusunan Dokumentasi Sistem.</w:t></w:r></w:p><w:p><w:pPr><w:jc w:val="both"/><w:spacing w:after="80" w:line="276" w:lineRule="auto"/></w:pPr><w:r><w:rPr><w:rFonts w:ascii="Times New Roman" w:hAnsi="Times New Roman" w:eastAsia="Times New Roman" w:cs="Times New Roman"/><w:sz w:val="23"/><w:szCs w:val="23"/></w:rPr><w:t xml:space="preserve">b.   Keputusan Kadisinfolahtad Nomor Kep/23/IV/2022 tanggal 4 April 2022 tentang Naskah Sekolah Pengetahuan Dokumentasi Program Aplikasi untuk Pendidikan Perwira TNI AD Nomor Kode: 61 - A – 009.</w:t></w:r></w:p><w:p><w:pPr><w:jc w:val="both"/><w:spacing w:after="80" w:line="276" w:lineRule="auto"/></w:pPr><w:r><w:rPr><w:rFonts w:ascii="Times New Roman" w:hAnsi="Times New Roman" w:eastAsia="Times New Roman" w:cs="Times New Roman"/><w:sz w:val="23"/><w:szCs w:val="23"/></w:rPr><w:t xml:space="preserve">c.   Keputusan Kasad Nomor Kep/548/VI/2016 tanggal 24 Juni 2016 tentang Buku Petunjuk Teknis Tulisan Dinas di Lingkungan TNI Angkatan Darat.</w:t></w:r></w:p><w:p><w:pPr><w:jc w:val="both"/><w:spacing w:after="80" w:line="276" w:lineRule="auto"/></w:pPr><w:r><w:rPr><w:rFonts w:ascii="Times New Roman" w:hAnsi="Times New Roman" w:eastAsia="Times New Roman" w:cs="Times New Roman"/><w:sz w:val="23"/><w:szCs w:val="23"/></w:rPr><w:t xml:space="preserve">d.   Buku Petunjuk Teknis TNI AD tentang Pembinaan Karier dan Administrasi Dosir Prajurit Angkatan Darat.</w:t></w:r></w:p><w:p/><w:p><w:pPr><w:jc w:val="start"/><w:spacing w:after="60"/></w:pPr><w:r><w:rPr><w:rFonts w:ascii="Times New Roman" w:hAnsi="Times New Roman" w:eastAsia="Times New Roman" w:cs="Times New Roman"/><w:sz w:val="24"/><w:szCs w:val="24"/><w:b w:val="1"/><w:bCs w:val="1"/></w:rPr><w:t xml:space="preserve">5.   Pengertian.</w:t></w:r></w:p><w:p><w:pPr><w:jc w:val="both"/><w:spacing w:after="80" w:line="276" w:lineRule="auto"/></w:pPr><w:r><w:rPr><w:rFonts w:ascii="Times New Roman" w:hAnsi="Times New Roman" w:eastAsia="Times New Roman" w:cs="Times New Roman"/><w:sz w:val="23"/><w:szCs w:val="23"/></w:rPr><w:t xml:space="preserve">a.   Narasi Program adalah penjelasan terstruktur mengenai fungsi program, file input, urutan proses pengolahan, algoritma perhitungan, dan keluaran yang dihasilkan sistem.</w:t></w:r></w:p><w:p><w:pPr><w:jc w:val="both"/><w:spacing w:after="80" w:line="276" w:lineRule="auto"/></w:pPr><w:r><w:rPr><w:rFonts w:ascii="Times New Roman" w:hAnsi="Times New Roman" w:eastAsia="Times New Roman" w:cs="Times New Roman"/><w:sz w:val="23"/><w:szCs w:val="23"/></w:rPr><w:t xml:space="preserve">b.   Input adalah data atau berkas yang dimasukkan ke dalam sistem, baik berupa data identitas pokok prajurit maupun berkas digital PDF 33 jenis dosir.</w:t></w:r></w:p><w:p><w:pPr><w:jc w:val="both"/><w:spacing w:after="80" w:line="276" w:lineRule="auto"/></w:pPr><w:r><w:rPr><w:rFonts w:ascii="Times New Roman" w:hAnsi="Times New Roman" w:eastAsia="Times New Roman" w:cs="Times New Roman"/><w:sz w:val="23"/><w:szCs w:val="23"/></w:rPr><w:t xml:space="preserve">c.   Output adalah keluaran hasil olahan sistem, baik berupa tampilan antarmuka visual (display), berkas PDF ber-TTE resmi, maupun lembar laporan siap cetak berkop dinas.</w:t></w:r></w:p><w:p><w:pPr><w:jc w:val="both"/><w:spacing w:after="80" w:line="276" w:lineRule="auto"/></w:pPr><w:r><w:rPr><w:rFonts w:ascii="Times New Roman" w:hAnsi="Times New Roman" w:eastAsia="Times New Roman" w:cs="Times New Roman"/><w:sz w:val="23"/><w:szCs w:val="23"/></w:rPr><w:t xml:space="preserve">d.   Dosir Elektronik adalah kumpulan naskah/dokumen digital autentik riwayat hidup prajurit yang dihimpun secara sistematis dari awal pengangkatan hingga purna tugas.</w:t></w:r></w:p><w:p><w:pPr><w:jc w:val="both"/><w:spacing w:after="80" w:line="276" w:lineRule="auto"/></w:pPr><w:r><w:rPr><w:rFonts w:ascii="Times New Roman" w:hAnsi="Times New Roman" w:eastAsia="Times New Roman" w:cs="Times New Roman"/><w:sz w:val="23"/><w:szCs w:val="23"/></w:rPr><w:t xml:space="preserve">e.   Tanda Tangan Elektronik (TTE) adalah tanda tangan yang terdiri atas informasi elektronik yang dilekatkan, terasosiasi atau terkait dengan informasi elektronik lainnya sebagai alat verifikasi dan autentikasi keabsahan dokumen dinas.</w:t></w:r></w:p><w:p><w:r><w:br w:type="page"/></w:r></w:p><w:p><w:pPr><w:jc w:val="center"/><w:spacing w:after="60"/></w:pPr><w:r><w:rPr><w:rFonts w:ascii="Times New Roman" w:hAnsi="Times New Roman" w:eastAsia="Times New Roman" w:cs="Times New Roman"/><w:sz w:val="26"/><w:szCs w:val="26"/><w:b w:val="1"/><w:bCs w:val="1"/></w:rPr><w:t xml:space="preserve">BAB II</w:t></w:r></w:p><w:p><w:pPr><w:jc w:val="center"/><w:spacing w:after="60"/></w:pPr><w:r><w:rPr><w:rFonts w:ascii="Times New Roman" w:hAnsi="Times New Roman" w:eastAsia="Times New Roman" w:cs="Times New Roman"/><w:sz w:val="26"/><w:szCs w:val="26"/><w:b w:val="1"/><w:bCs w:val="1"/></w:rPr><w:t xml:space="preserve">MATERI DOKUMENTASI</w:t></w:r></w:p><w:p/><w:p><w:pPr><w:jc w:val="start"/><w:spacing w:after="60"/></w:pPr><w:r><w:rPr><w:rFonts w:ascii="Times New Roman" w:hAnsi="Times New Roman" w:eastAsia="Times New Roman" w:cs="Times New Roman"/><w:sz w:val="24"/><w:szCs w:val="24"/><w:b w:val="1"/><w:bCs w:val="1"/></w:rPr><w:t xml:space="preserve">6.   Umum.</w:t></w:r></w:p><w:p><w:pPr><w:jc w:val="both"/><w:spacing w:after="80" w:line="276" w:lineRule="auto"/></w:pPr><w:r><w:rPr><w:rFonts w:ascii="Times New Roman" w:hAnsi="Times New Roman" w:eastAsia="Times New Roman" w:cs="Times New Roman"/><w:sz w:val="23"/><w:szCs w:val="23"/></w:rPr><w:t xml:space="preserve">Materi dokumentasi diberi judul resmi "DOKUMENTASI PROGRAM", yang terdiri atas 2 (dua) bagian utama terpadu :</w:t></w:r></w:p><w:p><w:pPr><w:jc w:val="both"/><w:spacing w:after="80" w:line="276" w:lineRule="auto"/></w:pPr><w:r><w:rPr><w:rFonts w:ascii="Times New Roman" w:hAnsi="Times New Roman" w:eastAsia="Times New Roman" w:cs="Times New Roman"/><w:sz w:val="23"/><w:szCs w:val="23"/></w:rPr><w:t xml:space="preserve">a.   Bagian 1 : Keterangan-Keterangan tentang Program. Berisi ringkasan identitas manajerial sistem informasi meliputi nama aplikasi, nama modul program, fungsi ringkas, penanggung jawab/pemrogram, bahasa dan lingkungan pemrograman, direktori instalasi, dan tanggal selesai pengembangan.</w:t></w:r></w:p><w:p><w:pPr><w:jc w:val="both"/><w:spacing w:after="80" w:line="276" w:lineRule="auto"/></w:pPr><w:r><w:rPr><w:rFonts w:ascii="Times New Roman" w:hAnsi="Times New Roman" w:eastAsia="Times New Roman" w:cs="Times New Roman"/><w:sz w:val="23"/><w:szCs w:val="23"/></w:rPr><w:t xml:space="preserve">b.   Bagian 2 : Ketentuan Dokumen / Isi Dokumen. Merupakan inti materi teknis yang memuat narasi program, diagram arus data, diagram hubungan entitas, kamus data struktur tabel, formulir spesifikasi program, bentuk tampilan dan cetakan, serta listing program.</w:t></w:r></w:p><w:p/><w:p><w:pPr><w:jc w:val="start"/><w:spacing w:after="60"/></w:pPr><w:r><w:rPr><w:rFonts w:ascii="Times New Roman" w:hAnsi="Times New Roman" w:eastAsia="Times New Roman" w:cs="Times New Roman"/><w:sz w:val="24"/><w:szCs w:val="24"/><w:b w:val="1"/><w:bCs w:val="1"/></w:rPr><w:t xml:space="preserve">7.   Tujuan Pembuatan Dokumentasi Sistem.</w:t></w:r></w:p><w:p><w:pPr><w:jc w:val="both"/><w:spacing w:after="80" w:line="276" w:lineRule="auto"/></w:pPr><w:r><w:rPr><w:rFonts w:ascii="Times New Roman" w:hAnsi="Times New Roman" w:eastAsia="Times New Roman" w:cs="Times New Roman"/><w:sz w:val="23"/><w:szCs w:val="23"/></w:rPr><w:t xml:space="preserve">Berdasarkan doktrin pembinaan sistem informasi TNI AD, ada 3 (tiga) tujuan strategis pembuatan dokumentasi sistem :</w:t></w:r></w:p><w:p><w:pPr><w:jc w:val="both"/><w:spacing w:after="80" w:line="276" w:lineRule="auto"/></w:pPr><w:r><w:rPr><w:rFonts w:ascii="Times New Roman" w:hAnsi="Times New Roman" w:eastAsia="Times New Roman" w:cs="Times New Roman"/><w:sz w:val="23"/><w:szCs w:val="23"/></w:rPr><w:t xml:space="preserve">a.   Untuk Menjelaskan Cara Kerja Sistem. Dokumentasi menyederhanakan sistem pengolahan data dosir yang kompleks (melibatkan penomoran otomatis 33 berkas, cryptographic hashing, dan watermarking) menjadi uraian yang mudah dipahami dalam waktu singkat oleh staf manajerial maupun teknisi baru.</w:t></w:r></w:p><w:p><w:pPr><w:jc w:val="both"/><w:spacing w:after="80" w:line="276" w:lineRule="auto"/></w:pPr><w:r><w:rPr><w:rFonts w:ascii="Times New Roman" w:hAnsi="Times New Roman" w:eastAsia="Times New Roman" w:cs="Times New Roman"/><w:sz w:val="23"/><w:szCs w:val="23"/></w:rPr><w:t xml:space="preserve">b.   Sebagai Alat dalam Merancang dan Mengembangkan Sistem. Rancangan arsitektur dan relasi basis data yang terdokumentasi rapi mencegah hilangnya memori institusional, mempermudah koordinasi antar pemrogram militer, serta menjamin kelancaran modifikasi sistem di masa mendatang.</w:t></w:r></w:p><w:p><w:pPr><w:jc w:val="both"/><w:spacing w:after="80" w:line="276" w:lineRule="auto"/></w:pPr><w:r><w:rPr><w:rFonts w:ascii="Times New Roman" w:hAnsi="Times New Roman" w:eastAsia="Times New Roman" w:cs="Times New Roman"/><w:sz w:val="23"/><w:szCs w:val="23"/></w:rPr><w:t xml:space="preserve">c.   Sebagai Alat bagi Auditor dan Pengawas Internal. Memberikan dasar pijakan bagi Inspektorat (Itjenad/Itdam) dan Staf Intelijen/Sandi dalam mengevaluasi kepatuhan sistem terhadap prosedur pengendalian internal (internal control), keamanan data personel, dan integritas legalitas TTE.</w:t></w:r></w:p><w:p/><w:p><w:pPr><w:jc w:val="start"/><w:spacing w:after="60"/></w:pPr><w:r><w:rPr><w:rFonts w:ascii="Times New Roman" w:hAnsi="Times New Roman" w:eastAsia="Times New Roman" w:cs="Times New Roman"/><w:sz w:val="24"/><w:szCs w:val="24"/><w:b w:val="1"/><w:bCs w:val="1"/></w:rPr><w:t xml:space="preserve">8.   Cara Pengisian.</w:t></w:r></w:p><w:p><w:pPr><w:jc w:val="both"/><w:spacing w:after="80" w:line="276" w:lineRule="auto"/></w:pPr><w:r><w:rPr><w:rFonts w:ascii="Times New Roman" w:hAnsi="Times New Roman" w:eastAsia="Times New Roman" w:cs="Times New Roman"/><w:sz w:val="23"/><w:szCs w:val="23"/></w:rPr><w:t xml:space="preserve">Ketentuan pengisian formulir dokumentasi Bagian 1 dilaksanakan sebagai berikut :</w:t></w:r></w:p><w:p><w:pPr><w:jc w:val="both"/><w:spacing w:after="80" w:line="276" w:lineRule="auto"/></w:pPr><w:r><w:rPr><w:rFonts w:ascii="Times New Roman" w:hAnsi="Times New Roman" w:eastAsia="Times New Roman" w:cs="Times New Roman"/><w:sz w:val="23"/><w:szCs w:val="23"/></w:rPr><w:t xml:space="preserve">a.   Nama Aplikasi : Diisi dengan nama resmi aplikasi, yaitu "TRISULA TNI AD" (Tata Kelola Rekam Informasi, Sistematika, & Unduhan Lengkap Arsip).</w:t></w:r></w:p><w:p><w:pPr><w:jc w:val="both"/><w:spacing w:after="80" w:line="276" w:lineRule="auto"/></w:pPr><w:r><w:rPr><w:rFonts w:ascii="Times New Roman" w:hAnsi="Times New Roman" w:eastAsia="Times New Roman" w:cs="Times New Roman"/><w:sz w:val="23"/><w:szCs w:val="23"/></w:rPr><w:t xml:space="preserve">b.   Nama Program : Diisi nama komponen fungsional yang dibangun, yaitu "SISTEM DOSIR ELEKTRONIK & VERIFIKASI TTE PERSONEL".</w:t></w:r></w:p><w:p><w:pPr><w:jc w:val="both"/><w:spacing w:after="80" w:line="276" w:lineRule="auto"/></w:pPr><w:r><w:rPr><w:rFonts w:ascii="Times New Roman" w:hAnsi="Times New Roman" w:eastAsia="Times New Roman" w:cs="Times New Roman"/><w:sz w:val="23"/><w:szCs w:val="23"/></w:rPr><w:t xml:space="preserve">c.   Fungsi Program : Menguraikan secara komprehensif kemampuan sistem dalam digitalisasi 33 dosir, verifikasi bertingkat, penandatanganan elektronik, deteksi pensiun, serta rotasi jabatan.</w:t></w:r></w:p><w:p><w:pPr><w:jc w:val="both"/><w:spacing w:after="80" w:line="276" w:lineRule="auto"/></w:pPr><w:r><w:rPr><w:rFonts w:ascii="Times New Roman" w:hAnsi="Times New Roman" w:eastAsia="Times New Roman" w:cs="Times New Roman"/><w:sz w:val="23"/><w:szCs w:val="23"/></w:rPr><w:t xml:space="preserve">d.   Nama Pemrogram : Diisi personel yang ditunjuk dan bertanggung jawab dalam perancangan kode, yaitu Letda Czi Fris Wardani.</w:t></w:r></w:p><w:p><w:pPr><w:jc w:val="both"/><w:spacing w:after="80" w:line="276" w:lineRule="auto"/></w:pPr><w:r><w:rPr><w:rFonts w:ascii="Times New Roman" w:hAnsi="Times New Roman" w:eastAsia="Times New Roman" w:cs="Times New Roman"/><w:sz w:val="23"/><w:szCs w:val="23"/></w:rPr><w:t xml:space="preserve">e.   Bahasa Program : Diisi lingkungan teknologi yang digunakan, yaitu PHP 8.3 Native PDO, JavaScript, HTML5, CSS3, dan MySQL.</w:t></w:r></w:p><w:p><w:pPr><w:jc w:val="both"/><w:spacing w:after="80" w:line="276" w:lineRule="auto"/></w:pPr><w:r><w:rPr><w:rFonts w:ascii="Times New Roman" w:hAnsi="Times New Roman" w:eastAsia="Times New Roman" w:cs="Times New Roman"/><w:sz w:val="23"/><w:szCs w:val="23"/></w:rPr><w:t xml:space="preserve">f.   Lokasi Program : Diisi direktori penyimpanan aplikasi di peladen (web server), yaitu "d:\xampp\htdocs\edosir-tni".</w:t></w:r></w:p><w:p><w:pPr><w:jc w:val="both"/><w:spacing w:after="80" w:line="276" w:lineRule="auto"/></w:pPr><w:r><w:rPr><w:rFonts w:ascii="Times New Roman" w:hAnsi="Times New Roman" w:eastAsia="Times New Roman" w:cs="Times New Roman"/><w:sz w:val="23"/><w:szCs w:val="23"/></w:rPr><w:t xml:space="preserve">g.   Tanggal Selesai : Diisi tanggal finalisasi uji fungsi dan penerbitan sistem, yaitu 21 September 2026.</w:t></w:r></w:p><w:p><w:r><w:br w:type="page"/></w:r></w:p><w:p><w:pPr><w:jc w:val="center"/><w:spacing w:after="60"/></w:pPr><w:r><w:rPr><w:rFonts w:ascii="Times New Roman" w:hAnsi="Times New Roman" w:eastAsia="Times New Roman" w:cs="Times New Roman"/><w:sz w:val="26"/><w:szCs w:val="26"/><w:b w:val="1"/><w:bCs w:val="1"/></w:rPr><w:t xml:space="preserve">BAB III</w:t></w:r></w:p><w:p><w:pPr><w:jc w:val="center"/><w:spacing w:after="60"/></w:pPr><w:r><w:rPr><w:rFonts w:ascii="Times New Roman" w:hAnsi="Times New Roman" w:eastAsia="Times New Roman" w:cs="Times New Roman"/><w:sz w:val="26"/><w:szCs w:val="26"/><w:b w:val="1"/><w:bCs w:val="1"/></w:rPr><w:t xml:space="preserve">PERILAKU TERHADAP DOKUMEN / KETENTUAN DOKUMEN</w:t></w:r></w:p><w:p/><w:p><w:pPr><w:jc w:val="start"/><w:spacing w:after="60"/></w:pPr><w:r><w:rPr><w:rFonts w:ascii="Times New Roman" w:hAnsi="Times New Roman" w:eastAsia="Times New Roman" w:cs="Times New Roman"/><w:sz w:val="24"/><w:szCs w:val="24"/><w:b w:val="1"/><w:bCs w:val="1"/></w:rPr><w:t xml:space="preserve">9.   Umum.</w:t></w:r></w:p><w:p><w:pPr><w:jc w:val="both"/><w:spacing w:after="80" w:line="276" w:lineRule="auto"/></w:pPr><w:r><w:rPr><w:rFonts w:ascii="Times New Roman" w:hAnsi="Times New Roman" w:eastAsia="Times New Roman" w:cs="Times New Roman"/><w:sz w:val="23"/><w:szCs w:val="23"/></w:rPr><w:t xml:space="preserve">Isi dokumentasi program TRISULA TNI AD merupakan kumpulan dokumen teknis terpadu yang memuat 7 (tujuh) instrumen pokok rancang bangun perangkat lunak, yang diuraikan secara mendalam pada pasal-pasal berikut.</w:t></w:r></w:p><w:p/><w:p><w:pPr><w:jc w:val="start"/><w:spacing w:after="60"/></w:pPr><w:r><w:rPr><w:rFonts w:ascii="Times New Roman" w:hAnsi="Times New Roman" w:eastAsia="Times New Roman" w:cs="Times New Roman"/><w:sz w:val="24"/><w:szCs w:val="24"/><w:b w:val="1"/><w:bCs w:val="1"/></w:rPr><w:t xml:space="preserve">10.  Narasi Program.</w:t></w:r></w:p><w:p><w:pPr><w:jc w:val="both"/><w:spacing w:after="80" w:line="276" w:lineRule="auto"/></w:pPr><w:r><w:rPr><w:rFonts w:ascii="Times New Roman" w:hAnsi="Times New Roman" w:eastAsia="Times New Roman" w:cs="Times New Roman"/><w:sz w:val="23"/><w:szCs w:val="23"/></w:rPr><w:t xml:space="preserve">Narasi program memberikan gambaran menyeluruh tentang fungsi, file input, rincian proses, dan keluaran sistem aplikasi TRISULA TNI AD :</w:t></w:r></w:p><w:p><w:pPr><w:jc w:val="start"/><w:spacing w:after="60"/></w:pPr><w:r><w:rPr><w:rFonts w:ascii="Times New Roman" w:hAnsi="Times New Roman" w:eastAsia="Times New Roman" w:cs="Times New Roman"/><w:sz w:val="24"/><w:szCs w:val="24"/><w:b w:val="1"/><w:bCs w:val="1"/></w:rPr><w:t xml:space="preserve">a.   Fungsi Program.</w:t></w:r></w:p><w:p><w:pPr><w:jc w:val="both"/><w:spacing w:after="80" w:line="276" w:lineRule="auto"/></w:pPr><w:r><w:rPr><w:rFonts w:ascii="Times New Roman" w:hAnsi="Times New Roman" w:eastAsia="Times New Roman" w:cs="Times New Roman"/><w:sz w:val="23"/><w:szCs w:val="23"/></w:rPr><w:t xml:space="preserve">Program aplikasi TRISULA TNI AD berfungsi sebagai sarana terpadu pembinaan administrasi personel militer dan PNS di jajaran TNI Angkatan Darat melalui mekanisme digitalisasi warkat induk dosir. Fungsi utama sistem mencakup :</w:t></w:r></w:p><w:p><w:pPr><w:jc w:val="both"/><w:spacing w:after="80" w:line="276" w:lineRule="auto"/></w:pPr><w:r><w:rPr><w:rFonts w:ascii="Times New Roman" w:hAnsi="Times New Roman" w:eastAsia="Times New Roman" w:cs="Times New Roman"/><w:sz w:val="23"/><w:szCs w:val="23"/></w:rPr><w:t xml:space="preserve">     1)   Pendaftaran akun personel secara mandiri berbasis NRP/NIP dengan kontrol persetujuan bertingkat oleh Administrator Satuan.</w:t></w:r></w:p><w:p><w:pPr><w:jc w:val="both"/><w:spacing w:after="80" w:line="276" w:lineRule="auto"/></w:pPr><w:r><w:rPr><w:rFonts w:ascii="Times New Roman" w:hAnsi="Times New Roman" w:eastAsia="Times New Roman" w:cs="Times New Roman"/><w:sz w:val="23"/><w:szCs w:val="23"/></w:rPr><w:t xml:space="preserve">     2)   Pengelolaan 33 jenis dosir baku personel TNI AD dari Dosir 01 (Surat Lamaran) hingga Dosir 33 (Foto dinas terbaru).</w:t></w:r></w:p><w:p><w:pPr><w:jc w:val="both"/><w:spacing w:after="80" w:line="276" w:lineRule="auto"/></w:pPr><w:r><w:rPr><w:rFonts w:ascii="Times New Roman" w:hAnsi="Times New Roman" w:eastAsia="Times New Roman" w:cs="Times New Roman"/><w:sz w:val="23"/><w:szCs w:val="23"/></w:rPr><w:t xml:space="preserve">     3)   Standarisasi penamaan berkas fisik otomatis berformat "{NRP}_{KODE}[abjad].pdf" yang tersimpan pada struktur folder terisolasi "uploads/FOLDER 01" s.d. "FOLDER 33".</w:t></w:r></w:p><w:p><w:pPr><w:jc w:val="both"/><w:spacing w:after="80" w:line="276" w:lineRule="auto"/></w:pPr><w:r><w:rPr><w:rFonts w:ascii="Times New Roman" w:hAnsi="Times New Roman" w:eastAsia="Times New Roman" w:cs="Times New Roman"/><w:sz w:val="23"/><w:szCs w:val="23"/></w:rPr><w:t xml:space="preserve">     4)   Pemindaian dokumen langsung menggunakan kamera gawai/komputer (camera scan) dengan konversi otomatis citra multi-halaman menjadi satu file PDF standar.</w:t></w:r></w:p><w:p><w:pPr><w:jc w:val="both"/><w:spacing w:after="80" w:line="276" w:lineRule="auto"/></w:pPr><w:r><w:rPr><w:rFonts w:ascii="Times New Roman" w:hAnsi="Times New Roman" w:eastAsia="Times New Roman" w:cs="Times New Roman"/><w:sz w:val="23"/><w:szCs w:val="23"/></w:rPr><w:t xml:space="preserve">     5)   Verifikasi berkas oleh Administrator dengan pembubuhan Sertifikasi Tanda Tangan Elektronik (TTE) ber-QR Code dan tanda air (watermark) dinamis.</w:t></w:r></w:p><w:p><w:pPr><w:jc w:val="both"/><w:spacing w:after="80" w:line="276" w:lineRule="auto"/></w:pPr><w:r><w:rPr><w:rFonts w:ascii="Times New Roman" w:hAnsi="Times New Roman" w:eastAsia="Times New Roman" w:cs="Times New Roman"/><w:sz w:val="23"/><w:szCs w:val="23"/></w:rPr><w:t xml:space="preserve">     6)   Layanan publik pemeriksaan keaslian dokumen secara cepat melalui pemindaian QR Code pada portal publik (verify.php).</w:t></w:r></w:p><w:p><w:pPr><w:jc w:val="both"/><w:spacing w:after="80" w:line="276" w:lineRule="auto"/></w:pPr><w:r><w:rPr><w:rFonts w:ascii="Times New Roman" w:hAnsi="Times New Roman" w:eastAsia="Times New Roman" w:cs="Times New Roman"/><w:sz w:val="23"/><w:szCs w:val="23"/></w:rPr><w:t xml:space="preserve">     7)   Pemantauan persentase kelengkapan dosir personel secara real-time dan rekapitulasi rata-rata satuan.</w:t></w:r></w:p><w:p><w:pPr><w:jc w:val="both"/><w:spacing w:after="80" w:line="276" w:lineRule="auto"/></w:pPr><w:r><w:rPr><w:rFonts w:ascii="Times New Roman" w:hAnsi="Times New Roman" w:eastAsia="Times New Roman" w:cs="Times New Roman"/><w:sz w:val="23"/><w:szCs w:val="23"/></w:rPr><w:t xml:space="preserve">     8)   Kalkulasi cerdas batas usia pensiun (BUP) otomatis berdasarkan golongan kepangkatan (Perwira 58 th, Bintara/Tamtama 56 th, PNS 60 th).</w:t></w:r></w:p><w:p><w:pPr><w:jc w:val="both"/><w:spacing w:after="80" w:line="276" w:lineRule="auto"/></w:pPr><w:r><w:rPr><w:rFonts w:ascii="Times New Roman" w:hAnsi="Times New Roman" w:eastAsia="Times New Roman" w:cs="Times New Roman"/><w:sz w:val="23"/><w:szCs w:val="23"/></w:rPr><w:t xml:space="preserve">     9)   Deteksi dini prajurit yang telah menduduki jabatan lebih dari 2 (dua) tahun guna mendukung perencanaan Tour of Duty dan Tour of Area (TOD/TOA).</w:t></w:r></w:p><w:p><w:pPr><w:jc w:val="both"/><w:spacing w:after="80" w:line="276" w:lineRule="auto"/></w:pPr><w:r><w:rPr><w:rFonts w:ascii="Times New Roman" w:hAnsi="Times New Roman" w:eastAsia="Times New Roman" w:cs="Times New Roman"/><w:sz w:val="23"/><w:szCs w:val="23"/></w:rPr><w:t xml:space="preserve">     10)  Pengunduhan massal (bulk download) berkas dosir per satuan/personel dalam satu arsip terkompresi ZIP berstruktur rapi.</w:t></w:r></w:p><w:p><w:pPr><w:jc w:val="both"/><w:spacing w:after="80" w:line="276" w:lineRule="auto"/></w:pPr><w:r><w:rPr><w:rFonts w:ascii="Times New Roman" w:hAnsi="Times New Roman" w:eastAsia="Times New Roman" w:cs="Times New Roman"/><w:sz w:val="23"/><w:szCs w:val="23"/></w:rPr><w:t xml:space="preserve">     11)  Penerbitan laporan resmi siap cetak berkop dinas staf personel lengkap dengan kolom tanda tangan komando.</w:t></w:r></w:p><w:p><w:pPr><w:jc w:val="both"/><w:spacing w:after="80" w:line="276" w:lineRule="auto"/></w:pPr><w:r><w:rPr><w:rFonts w:ascii="Times New Roman" w:hAnsi="Times New Roman" w:eastAsia="Times New Roman" w:cs="Times New Roman"/><w:sz w:val="23"/><w:szCs w:val="23"/></w:rPr><w:t xml:space="preserve">     12)  Pencadangan pangkalan data (mysqldump) dan berkas digital secara mandiri disertai pencatatan riwayat audit (audit trail log).</w:t></w:r></w:p><w:p/><w:p><w:pPr><w:jc w:val="start"/><w:spacing w:after="60"/></w:pPr><w:r><w:rPr><w:rFonts w:ascii="Times New Roman" w:hAnsi="Times New Roman" w:eastAsia="Times New Roman" w:cs="Times New Roman"/><w:sz w:val="24"/><w:szCs w:val="24"/><w:b w:val="1"/><w:bCs w:val="1"/></w:rPr><w:t xml:space="preserve">b.   Input Program.</w:t></w:r></w:p><w:p><w:pPr><w:jc w:val="both"/><w:spacing w:after="80" w:line="276" w:lineRule="auto"/></w:pPr><w:r><w:rPr><w:rFonts w:ascii="Times New Roman" w:hAnsi="Times New Roman" w:eastAsia="Times New Roman" w:cs="Times New Roman"/><w:sz w:val="23"/><w:szCs w:val="23"/></w:rPr><w:t xml:space="preserve">File dan tabel basis data yang menjadi masukan bagi sistem TRISULA TNI AD meliputi :</w:t></w:r></w:p><w:tbl><w:tblGrid><w:gridCol w:w="500" w:type="dxa"/><w:gridCol w:w="2200" w:type="dxa"/><w:gridCol w:w="2000" w:type="dxa"/><w:gridCol w:w="1500" w:type="dxa"/><w:gridCol w:w="3000" w:type="dxa"/></w:tblGrid><w:tblPr><w:tblStyle w:val="MilitaryTable"/></w:tblPr><w:tr><w:trPr/><w:tc><w:tcPr><w:tcW w:w="500" w:type="dxa"/><w:shd w:val="clear" w:fill="EAEAEA"/><w:noWrap/></w:tcPr><w:p><w:pPr><w:jc w:val="center"/><w:spacing w:after="60"/></w:pPr><w:r><w:rPr><w:rFonts w:ascii="Times New Roman" w:hAnsi="Times New Roman" w:eastAsia="Times New Roman" w:cs="Times New Roman"/><w:sz w:val="20"/><w:szCs w:val="20"/><w:b w:val="1"/><w:bCs w:val="1"/></w:rPr><w:t xml:space="preserve">No</w:t></w:r></w:p></w:tc><w:tc><w:tcPr><w:tcW w:w="2200" w:type="dxa"/><w:shd w:val="clear" w:fill="EAEAEA"/><w:noWrap/></w:tcPr><w:p><w:pPr><w:jc w:val="center"/><w:spacing w:after="60"/></w:pPr><w:r><w:rPr><w:rFonts w:ascii="Times New Roman" w:hAnsi="Times New Roman" w:eastAsia="Times New Roman" w:cs="Times New Roman"/><w:sz w:val="20"/><w:szCs w:val="20"/><w:b w:val="1"/><w:bCs w:val="1"/></w:rPr><w:t xml:space="preserve">Nama File / Tabel</w:t></w:r></w:p></w:tc><w:tc><w:tcPr><w:tcW w:w="2000" w:type="dxa"/><w:shd w:val="clear" w:fill="EAEAEA"/><w:noWrap/></w:tcPr><w:p><w:pPr><w:jc w:val="center"/><w:spacing w:after="60"/></w:pPr><w:r><w:rPr><w:rFonts w:ascii="Times New Roman" w:hAnsi="Times New Roman" w:eastAsia="Times New Roman" w:cs="Times New Roman"/><w:sz w:val="20"/><w:szCs w:val="20"/><w:b w:val="1"/><w:bCs w:val="1"/></w:rPr><w:t xml:space="preserve">Media Simpan</w:t></w:r></w:p></w:tc><w:tc><w:tcPr><w:tcW w:w="1500" w:type="dxa"/><w:shd w:val="clear" w:fill="EAEAEA"/><w:noWrap/></w:tcPr><w:p><w:pPr><w:jc w:val="center"/><w:spacing w:after="60"/></w:pPr><w:r><w:rPr><w:rFonts w:ascii="Times New Roman" w:hAnsi="Times New Roman" w:eastAsia="Times New Roman" w:cs="Times New Roman"/><w:sz w:val="20"/><w:szCs w:val="20"/><w:b w:val="1"/><w:bCs w:val="1"/></w:rPr><w:t xml:space="preserve">Panjang Record</w:t></w:r></w:p></w:tc><w:tc><w:tcPr><w:tcW w:w="3000" w:type="dxa"/><w:shd w:val="clear" w:fill="EAEAEA"/><w:noWrap/></w:tcPr><w:p><w:pPr><w:jc w:val="center"/><w:spacing w:after="60"/></w:pPr><w:r><w:rPr><w:rFonts w:ascii="Times New Roman" w:hAnsi="Times New Roman" w:eastAsia="Times New Roman" w:cs="Times New Roman"/><w:sz w:val="20"/><w:szCs w:val="20"/><w:b w:val="1"/><w:bCs w:val="1"/></w:rPr><w:t xml:space="preserve">Keterangan / Fungsi Masukan</w:t></w:r></w:p></w:tc></w:tr><w:tr><w:trPr/><w:tc><w:tcPr><w:tcW w:w="500" w:type="dxa"/><w:noWrap/></w:tcPr><w:p><w:pPr><w:jc w:val="center"/><w:spacing w:after="60"/></w:pPr><w:r><w:rPr><w:rFonts w:ascii="Times New Roman" w:hAnsi="Times New Roman" w:eastAsia="Times New Roman" w:cs="Times New Roman"/><w:sz w:val="19"/><w:szCs w:val="19"/></w:rPr><w:t xml:space="preserve">1</w:t></w:r></w:p></w:tc><w:tc><w:tcPr><w:tcW w:w="2200" w:type="dxa"/><w:noWrap/></w:tcPr><w:p><w:pPr><w:jc w:val="start"/><w:spacing w:after="60"/></w:pPr><w:r><w:rPr><w:rFonts w:ascii="Times New Roman" w:hAnsi="Times New Roman" w:eastAsia="Times New Roman" w:cs="Times New Roman"/><w:sz w:val="19"/><w:szCs w:val="19"/><w:b w:val="1"/><w:bCs w:val="1"/></w:rPr><w:t xml:space="preserve">personel</w:t></w:r></w:p></w:tc><w:tc><w:tcPr><w:tcW w:w="2000" w:type="dxa"/><w:noWrap/></w:tcPr><w:p><w:pPr><w:jc w:val="start"/><w:spacing w:after="60"/></w:pPr><w:r><w:rPr><w:rFonts w:ascii="Times New Roman" w:hAnsi="Times New Roman" w:eastAsia="Times New Roman" w:cs="Times New Roman"/><w:sz w:val="19"/><w:szCs w:val="19"/></w:rPr><w:t xml:space="preserve">Harddisk (MySQL DB)</w:t></w:r></w:p></w:tc><w:tc><w:tcPr><w:tcW w:w="1500" w:type="dxa"/><w:noWrap/></w:tcPr><w:p><w:pPr><w:jc w:val="center"/><w:spacing w:after="60"/></w:pPr><w:r><w:rPr><w:rFonts w:ascii="Times New Roman" w:hAnsi="Times New Roman" w:eastAsia="Times New Roman" w:cs="Times New Roman"/><w:sz w:val="19"/><w:szCs w:val="19"/></w:rPr><w:t xml:space="preserve">1.250 Byte</w:t></w:r></w:p></w:tc><w:tc><w:tcPr><w:tcW w:w="3000" w:type="dxa"/><w:noWrap/></w:tcPr><w:p><w:pPr><w:jc w:val="start"/><w:spacing w:after="60"/></w:pPr><w:r><w:rPr><w:rFonts w:ascii="Times New Roman" w:hAnsi="Times New Roman" w:eastAsia="Times New Roman" w:cs="Times New Roman"/><w:sz w:val="19"/><w:szCs w:val="19"/></w:rPr><w:t xml:space="preserve">Data induk identitas prajurit/PNS (NRP, Nama, Pangkat, Korps, Satuan, Jabatan, TMT, Tgl Lahir)</w:t></w:r></w:p></w:tc></w:tr><w:tr><w:trPr/><w:tc><w:tcPr><w:tcW w:w="500" w:type="dxa"/><w:noWrap/></w:tcPr><w:p><w:pPr><w:jc w:val="center"/><w:spacing w:after="60"/></w:pPr><w:r><w:rPr><w:rFonts w:ascii="Times New Roman" w:hAnsi="Times New Roman" w:eastAsia="Times New Roman" w:cs="Times New Roman"/><w:sz w:val="19"/><w:szCs w:val="19"/></w:rPr><w:t xml:space="preserve">2</w:t></w:r></w:p></w:tc><w:tc><w:tcPr><w:tcW w:w="2200" w:type="dxa"/><w:noWrap/></w:tcPr><w:p><w:pPr><w:jc w:val="start"/><w:spacing w:after="60"/></w:pPr><w:r><w:rPr><w:rFonts w:ascii="Times New Roman" w:hAnsi="Times New Roman" w:eastAsia="Times New Roman" w:cs="Times New Roman"/><w:sz w:val="19"/><w:szCs w:val="19"/><w:b w:val="1"/><w:bCs w:val="1"/></w:rPr><w:t xml:space="preserve">users</w:t></w:r></w:p></w:tc><w:tc><w:tcPr><w:tcW w:w="2000" w:type="dxa"/><w:noWrap/></w:tcPr><w:p><w:pPr><w:jc w:val="start"/><w:spacing w:after="60"/></w:pPr><w:r><w:rPr><w:rFonts w:ascii="Times New Roman" w:hAnsi="Times New Roman" w:eastAsia="Times New Roman" w:cs="Times New Roman"/><w:sz w:val="19"/><w:szCs w:val="19"/></w:rPr><w:t xml:space="preserve">Harddisk (MySQL DB)</w:t></w:r></w:p></w:tc><w:tc><w:tcPr><w:tcW w:w="1500" w:type="dxa"/><w:noWrap/></w:tcPr><w:p><w:pPr><w:jc w:val="center"/><w:spacing w:after="60"/></w:pPr><w:r><w:rPr><w:rFonts w:ascii="Times New Roman" w:hAnsi="Times New Roman" w:eastAsia="Times New Roman" w:cs="Times New Roman"/><w:sz w:val="19"/><w:szCs w:val="19"/></w:rPr><w:t xml:space="preserve">420 Byte</w:t></w:r></w:p></w:tc><w:tc><w:tcPr><w:tcW w:w="3000" w:type="dxa"/><w:noWrap/></w:tcPr><w:p><w:pPr><w:jc w:val="start"/><w:spacing w:after="60"/></w:pPr><w:r><w:rPr><w:rFonts w:ascii="Times New Roman" w:hAnsi="Times New Roman" w:eastAsia="Times New Roman" w:cs="Times New Roman"/><w:sz w:val="19"/><w:szCs w:val="19"/></w:rPr><w:t xml:space="preserve">Data kredensial akun, hash password bcrypt, role (admin/personel), status approval</w:t></w:r></w:p></w:tc></w:tr><w:tr><w:trPr/><w:tc><w:tcPr><w:tcW w:w="500" w:type="dxa"/><w:noWrap/></w:tcPr><w:p><w:pPr><w:jc w:val="center"/><w:spacing w:after="60"/></w:pPr><w:r><w:rPr><w:rFonts w:ascii="Times New Roman" w:hAnsi="Times New Roman" w:eastAsia="Times New Roman" w:cs="Times New Roman"/><w:sz w:val="19"/><w:szCs w:val="19"/></w:rPr><w:t xml:space="preserve">3</w:t></w:r></w:p></w:tc><w:tc><w:tcPr><w:tcW w:w="2200" w:type="dxa"/><w:noWrap/></w:tcPr><w:p><w:pPr><w:jc w:val="start"/><w:spacing w:after="60"/></w:pPr><w:r><w:rPr><w:rFonts w:ascii="Times New Roman" w:hAnsi="Times New Roman" w:eastAsia="Times New Roman" w:cs="Times New Roman"/><w:sz w:val="19"/><w:szCs w:val="19"/><w:b w:val="1"/><w:bCs w:val="1"/></w:rPr><w:t xml:space="preserve">dosir_master</w:t></w:r></w:p></w:tc><w:tc><w:tcPr><w:tcW w:w="2000" w:type="dxa"/><w:noWrap/></w:tcPr><w:p><w:pPr><w:jc w:val="start"/><w:spacing w:after="60"/></w:pPr><w:r><w:rPr><w:rFonts w:ascii="Times New Roman" w:hAnsi="Times New Roman" w:eastAsia="Times New Roman" w:cs="Times New Roman"/><w:sz w:val="19"/><w:szCs w:val="19"/></w:rPr><w:t xml:space="preserve">Harddisk (MySQL DB)</w:t></w:r></w:p></w:tc><w:tc><w:tcPr><w:tcW w:w="1500" w:type="dxa"/><w:noWrap/></w:tcPr><w:p><w:pPr><w:jc w:val="center"/><w:spacing w:after="60"/></w:pPr><w:r><w:rPr><w:rFonts w:ascii="Times New Roman" w:hAnsi="Times New Roman" w:eastAsia="Times New Roman" w:cs="Times New Roman"/><w:sz w:val="19"/><w:szCs w:val="19"/></w:rPr><w:t xml:space="preserve">240 Byte</w:t></w:r></w:p></w:tc><w:tc><w:tcPr><w:tcW w:w="3000" w:type="dxa"/><w:noWrap/></w:tcPr><w:p><w:pPr><w:jc w:val="start"/><w:spacing w:after="60"/></w:pPr><w:r><w:rPr><w:rFonts w:ascii="Times New Roman" w:hAnsi="Times New Roman" w:eastAsia="Times New Roman" w:cs="Times New Roman"/><w:sz w:val="19"/><w:szCs w:val="19"/></w:rPr><w:t xml:space="preserve">Tabel referensi baku 33 jenis dosir (Kode 01 s.d. 33, nama berkas, status wajib)</w:t></w:r></w:p></w:tc></w:tr><w:tr><w:trPr/><w:tc><w:tcPr><w:tcW w:w="500" w:type="dxa"/><w:noWrap/></w:tcPr><w:p><w:pPr><w:jc w:val="center"/><w:spacing w:after="60"/></w:pPr><w:r><w:rPr><w:rFonts w:ascii="Times New Roman" w:hAnsi="Times New Roman" w:eastAsia="Times New Roman" w:cs="Times New Roman"/><w:sz w:val="19"/><w:szCs w:val="19"/></w:rPr><w:t xml:space="preserve">4</w:t></w:r></w:p></w:tc><w:tc><w:tcPr><w:tcW w:w="2200" w:type="dxa"/><w:noWrap/></w:tcPr><w:p><w:pPr><w:jc w:val="start"/><w:spacing w:after="60"/></w:pPr><w:r><w:rPr><w:rFonts w:ascii="Times New Roman" w:hAnsi="Times New Roman" w:eastAsia="Times New Roman" w:cs="Times New Roman"/><w:sz w:val="19"/><w:szCs w:val="19"/><w:b w:val="1"/><w:bCs w:val="1"/></w:rPr><w:t xml:space="preserve">dosir_files</w:t></w:r></w:p></w:tc><w:tc><w:tcPr><w:tcW w:w="2000" w:type="dxa"/><w:noWrap/></w:tcPr><w:p><w:pPr><w:jc w:val="start"/><w:spacing w:after="60"/></w:pPr><w:r><w:rPr><w:rFonts w:ascii="Times New Roman" w:hAnsi="Times New Roman" w:eastAsia="Times New Roman" w:cs="Times New Roman"/><w:sz w:val="19"/><w:szCs w:val="19"/></w:rPr><w:t xml:space="preserve">Harddisk (MySQL DB)</w:t></w:r></w:p></w:tc><w:tc><w:tcPr><w:tcW w:w="1500" w:type="dxa"/><w:noWrap/></w:tcPr><w:p><w:pPr><w:jc w:val="center"/><w:spacing w:after="60"/></w:pPr><w:r><w:rPr><w:rFonts w:ascii="Times New Roman" w:hAnsi="Times New Roman" w:eastAsia="Times New Roman" w:cs="Times New Roman"/><w:sz w:val="19"/><w:szCs w:val="19"/></w:rPr><w:t xml:space="preserve">980 Byte</w:t></w:r></w:p></w:tc><w:tc><w:tcPr><w:tcW w:w="3000" w:type="dxa"/><w:noWrap/></w:tcPr><w:p><w:pPr><w:jc w:val="start"/><w:spacing w:after="60"/></w:pPr><w:r><w:rPr><w:rFonts w:ascii="Times New Roman" w:hAnsi="Times New Roman" w:eastAsia="Times New Roman" w:cs="Times New Roman"/><w:sz w:val="19"/><w:szCs w:val="19"/></w:rPr><w:t xml:space="preserve">Metadata berkas terunggah, status verifikasi, hash SHA-256, kode TTE, catatan verifikasi</w:t></w:r></w:p></w:tc></w:tr><w:tr><w:trPr/><w:tc><w:tcPr><w:tcW w:w="500" w:type="dxa"/><w:noWrap/></w:tcPr><w:p><w:pPr><w:jc w:val="center"/><w:spacing w:after="60"/></w:pPr><w:r><w:rPr><w:rFonts w:ascii="Times New Roman" w:hAnsi="Times New Roman" w:eastAsia="Times New Roman" w:cs="Times New Roman"/><w:sz w:val="19"/><w:szCs w:val="19"/></w:rPr><w:t xml:space="preserve">5</w:t></w:r></w:p></w:tc><w:tc><w:tcPr><w:tcW w:w="2200" w:type="dxa"/><w:noWrap/></w:tcPr><w:p><w:pPr><w:jc w:val="start"/><w:spacing w:after="60"/></w:pPr><w:r><w:rPr><w:rFonts w:ascii="Times New Roman" w:hAnsi="Times New Roman" w:eastAsia="Times New Roman" w:cs="Times New Roman"/><w:sz w:val="19"/><w:szCs w:val="19"/><w:b w:val="1"/><w:bCs w:val="1"/></w:rPr><w:t xml:space="preserve">uploads/FOLDER 01..33</w:t></w:r></w:p></w:tc><w:tc><w:tcPr><w:tcW w:w="2000" w:type="dxa"/><w:noWrap/></w:tcPr><w:p><w:pPr><w:jc w:val="start"/><w:spacing w:after="60"/></w:pPr><w:r><w:rPr><w:rFonts w:ascii="Times New Roman" w:hAnsi="Times New Roman" w:eastAsia="Times New Roman" w:cs="Times New Roman"/><w:sz w:val="19"/><w:szCs w:val="19"/></w:rPr><w:t xml:space="preserve">Harddisk (Storage PDF)</w:t></w:r></w:p></w:tc><w:tc><w:tcPr><w:tcW w:w="1500" w:type="dxa"/><w:noWrap/></w:tcPr><w:p><w:pPr><w:jc w:val="center"/><w:spacing w:after="60"/></w:pPr><w:r><w:rPr><w:rFonts w:ascii="Times New Roman" w:hAnsi="Times New Roman" w:eastAsia="Times New Roman" w:cs="Times New Roman"/><w:sz w:val="19"/><w:szCs w:val="19"/></w:rPr><w:t xml:space="preserve">Variabel (s.d. 10 MB)</w:t></w:r></w:p></w:tc><w:tc><w:tcPr><w:tcW w:w="3000" w:type="dxa"/><w:noWrap/></w:tcPr><w:p><w:pPr><w:jc w:val="start"/><w:spacing w:after="60"/></w:pPr><w:r><w:rPr><w:rFonts w:ascii="Times New Roman" w:hAnsi="Times New Roman" w:eastAsia="Times New Roman" w:cs="Times New Roman"/><w:sz w:val="19"/><w:szCs w:val="19"/></w:rPr><w:t xml:space="preserve">File fisik digital PDF dokumen 33 dosir hasil unggahan/scan kamera prajurit</w:t></w:r></w:p></w:tc></w:tr><w:tr><w:trPr/><w:tc><w:tcPr><w:tcW w:w="500" w:type="dxa"/><w:noWrap/></w:tcPr><w:p><w:pPr><w:jc w:val="center"/><w:spacing w:after="60"/></w:pPr><w:r><w:rPr><w:rFonts w:ascii="Times New Roman" w:hAnsi="Times New Roman" w:eastAsia="Times New Roman" w:cs="Times New Roman"/><w:sz w:val="19"/><w:szCs w:val="19"/></w:rPr><w:t xml:space="preserve">6</w:t></w:r></w:p></w:tc><w:tc><w:tcPr><w:tcW w:w="2200" w:type="dxa"/><w:noWrap/></w:tcPr><w:p><w:pPr><w:jc w:val="start"/><w:spacing w:after="60"/></w:pPr><w:r><w:rPr><w:rFonts w:ascii="Times New Roman" w:hAnsi="Times New Roman" w:eastAsia="Times New Roman" w:cs="Times New Roman"/><w:sz w:val="19"/><w:szCs w:val="19"/><w:b w:val="1"/><w:bCs w:val="1"/></w:rPr><w:t xml:space="preserve">settings</w:t></w:r></w:p></w:tc><w:tc><w:tcPr><w:tcW w:w="2000" w:type="dxa"/><w:noWrap/></w:tcPr><w:p><w:pPr><w:jc w:val="start"/><w:spacing w:after="60"/></w:pPr><w:r><w:rPr><w:rFonts w:ascii="Times New Roman" w:hAnsi="Times New Roman" w:eastAsia="Times New Roman" w:cs="Times New Roman"/><w:sz w:val="19"/><w:szCs w:val="19"/></w:rPr><w:t xml:space="preserve">Harddisk (MySQL DB)</w:t></w:r></w:p></w:tc><w:tc><w:tcPr><w:tcW w:w="1500" w:type="dxa"/><w:noWrap/></w:tcPr><w:p><w:pPr><w:jc w:val="center"/><w:spacing w:after="60"/></w:pPr><w:r><w:rPr><w:rFonts w:ascii="Times New Roman" w:hAnsi="Times New Roman" w:eastAsia="Times New Roman" w:cs="Times New Roman"/><w:sz w:val="19"/><w:szCs w:val="19"/></w:rPr><w:t xml:space="preserve">280 Byte</w:t></w:r></w:p></w:tc><w:tc><w:tcPr><w:tcW w:w="3000" w:type="dxa"/><w:noWrap/></w:tcPr><w:p><w:pPr><w:jc w:val="start"/><w:spacing w:after="60"/></w:pPr><w:r><w:rPr><w:rFonts w:ascii="Times New Roman" w:hAnsi="Times New Roman" w:eastAsia="Times New Roman" w:cs="Times New Roman"/><w:sz w:val="19"/><w:szCs w:val="19"/></w:rPr><w:t xml:space="preserve">Pengaturan dinamis identitas aplikasi, brand, watermark, logo, dan batas tahun jabatan</w:t></w:r></w:p></w:tc></w:tr><w:tr><w:trPr/><w:tc><w:tcPr><w:tcW w:w="500" w:type="dxa"/><w:noWrap/></w:tcPr><w:p><w:pPr><w:jc w:val="center"/><w:spacing w:after="60"/></w:pPr><w:r><w:rPr><w:rFonts w:ascii="Times New Roman" w:hAnsi="Times New Roman" w:eastAsia="Times New Roman" w:cs="Times New Roman"/><w:sz w:val="19"/><w:szCs w:val="19"/></w:rPr><w:t xml:space="preserve">7</w:t></w:r></w:p></w:tc><w:tc><w:tcPr><w:tcW w:w="2200" w:type="dxa"/><w:noWrap/></w:tcPr><w:p><w:pPr><w:jc w:val="start"/><w:spacing w:after="60"/></w:pPr><w:r><w:rPr><w:rFonts w:ascii="Times New Roman" w:hAnsi="Times New Roman" w:eastAsia="Times New Roman" w:cs="Times New Roman"/><w:sz w:val="19"/><w:szCs w:val="19"/><w:b w:val="1"/><w:bCs w:val="1"/></w:rPr><w:t xml:space="preserve">activity_log</w:t></w:r></w:p></w:tc><w:tc><w:tcPr><w:tcW w:w="2000" w:type="dxa"/><w:noWrap/></w:tcPr><w:p><w:pPr><w:jc w:val="start"/><w:spacing w:after="60"/></w:pPr><w:r><w:rPr><w:rFonts w:ascii="Times New Roman" w:hAnsi="Times New Roman" w:eastAsia="Times New Roman" w:cs="Times New Roman"/><w:sz w:val="19"/><w:szCs w:val="19"/></w:rPr><w:t xml:space="preserve">Harddisk (MySQL DB)</w:t></w:r></w:p></w:tc><w:tc><w:tcPr><w:tcW w:w="1500" w:type="dxa"/><w:noWrap/></w:tcPr><w:p><w:pPr><w:jc w:val="center"/><w:spacing w:after="60"/></w:pPr><w:r><w:rPr><w:rFonts w:ascii="Times New Roman" w:hAnsi="Times New Roman" w:eastAsia="Times New Roman" w:cs="Times New Roman"/><w:sz w:val="19"/><w:szCs w:val="19"/></w:rPr><w:t xml:space="preserve">360 Byte</w:t></w:r></w:p></w:tc><w:tc><w:tcPr><w:tcW w:w="3000" w:type="dxa"/><w:noWrap/></w:tcPr><w:p><w:pPr><w:jc w:val="start"/><w:spacing w:after="60"/></w:pPr><w:r><w:rPr><w:rFonts w:ascii="Times New Roman" w:hAnsi="Times New Roman" w:eastAsia="Times New Roman" w:cs="Times New Roman"/><w:sz w:val="19"/><w:szCs w:val="19"/></w:rPr><w:t xml:space="preserve">Perekaman log audit seluruh aksi mutasi data, login, approval, dan verifikasi berkas</w:t></w:r></w:p></w:tc></w:tr><w:tr><w:trPr/><w:tc><w:tcPr><w:tcW w:w="500" w:type="dxa"/><w:noWrap/></w:tcPr><w:p><w:pPr><w:jc w:val="center"/><w:spacing w:after="60"/></w:pPr><w:r><w:rPr><w:rFonts w:ascii="Times New Roman" w:hAnsi="Times New Roman" w:eastAsia="Times New Roman" w:cs="Times New Roman"/><w:sz w:val="19"/><w:szCs w:val="19"/></w:rPr><w:t xml:space="preserve">8</w:t></w:r></w:p></w:tc><w:tc><w:tcPr><w:tcW w:w="2200" w:type="dxa"/><w:noWrap/></w:tcPr><w:p><w:pPr><w:jc w:val="start"/><w:spacing w:after="60"/></w:pPr><w:r><w:rPr><w:rFonts w:ascii="Times New Roman" w:hAnsi="Times New Roman" w:eastAsia="Times New Roman" w:cs="Times New Roman"/><w:sz w:val="19"/><w:szCs w:val="19"/><w:b w:val="1"/><w:bCs w:val="1"/></w:rPr><w:t xml:space="preserve">login_attempts</w:t></w:r></w:p></w:tc><w:tc><w:tcPr><w:tcW w:w="2000" w:type="dxa"/><w:noWrap/></w:tcPr><w:p><w:pPr><w:jc w:val="start"/><w:spacing w:after="60"/></w:pPr><w:r><w:rPr><w:rFonts w:ascii="Times New Roman" w:hAnsi="Times New Roman" w:eastAsia="Times New Roman" w:cs="Times New Roman"/><w:sz w:val="19"/><w:szCs w:val="19"/></w:rPr><w:t xml:space="preserve">Harddisk (MySQL DB)</w:t></w:r></w:p></w:tc><w:tc><w:tcPr><w:tcW w:w="1500" w:type="dxa"/><w:noWrap/></w:tcPr><w:p><w:pPr><w:jc w:val="center"/><w:spacing w:after="60"/></w:pPr><w:r><w:rPr><w:rFonts w:ascii="Times New Roman" w:hAnsi="Times New Roman" w:eastAsia="Times New Roman" w:cs="Times New Roman"/><w:sz w:val="19"/><w:szCs w:val="19"/></w:rPr><w:t xml:space="preserve">160 Byte</w:t></w:r></w:p></w:tc><w:tc><w:tcPr><w:tcW w:w="3000" w:type="dxa"/><w:noWrap/></w:tcPr><w:p><w:pPr><w:jc w:val="start"/><w:spacing w:after="60"/></w:pPr><w:r><w:rPr><w:rFonts w:ascii="Times New Roman" w:hAnsi="Times New Roman" w:eastAsia="Times New Roman" w:cs="Times New Roman"/><w:sz w:val="19"/><w:szCs w:val="19"/></w:rPr><w:t xml:space="preserve">Perekaman log percobaan login untuk proteksi keamanan brute-force attack</w:t></w:r></w:p></w:tc></w:tr></w:tbl><w:p/><w:p><w:pPr><w:jc w:val="start"/><w:spacing w:after="60"/></w:pPr><w:r><w:rPr><w:rFonts w:ascii="Times New Roman" w:hAnsi="Times New Roman" w:eastAsia="Times New Roman" w:cs="Times New Roman"/><w:sz w:val="24"/><w:szCs w:val="24"/><w:b w:val="1"/><w:bCs w:val="1"/></w:rPr><w:t xml:space="preserve">c.   Proses Pengolahan.</w:t></w:r></w:p><w:p><w:pPr><w:jc w:val="both"/><w:spacing w:after="80" w:line="276" w:lineRule="auto"/></w:pPr><w:r><w:rPr><w:rFonts w:ascii="Times New Roman" w:hAnsi="Times New Roman" w:eastAsia="Times New Roman" w:cs="Times New Roman"/><w:sz w:val="23"/><w:szCs w:val="23"/></w:rPr><w:t xml:space="preserve">Rangkaian tahapan pengolahan data yang diselenggarakan oleh aplikasi TRISULA TNI AD dijabarkan sebagai berikut :</w:t></w:r></w:p><w:p><w:pPr><w:jc w:val="both"/><w:spacing w:after="80" w:line="276" w:lineRule="auto"/></w:pPr><w:r><w:rPr><w:rFonts w:ascii="Times New Roman" w:hAnsi="Times New Roman" w:eastAsia="Times New Roman" w:cs="Times New Roman"/><w:sz w:val="23"/><w:szCs w:val="23"/></w:rPr><w:t xml:space="preserve">     1)   Tahap Registrasi & Approval : Personel mengisi formulir pendaftaran. Sistem memvalidasi format NRP dan mencegah duplikasi data. Rekord personel tersimpan dan akun pengguna otomatis dibuat dengan status "pending". Administrator melakukan telaah dan persetujuan (approval) sehingga akun aktif.</w:t></w:r></w:p><w:p><w:pPr><w:jc w:val="both"/><w:spacing w:after="80" w:line="276" w:lineRule="auto"/></w:pPr><w:r><w:rPr><w:rFonts w:ascii="Times New Roman" w:hAnsi="Times New Roman" w:eastAsia="Times New Roman" w:cs="Times New Roman"/><w:sz w:val="23"/><w:szCs w:val="23"/></w:rPr><w:t xml:space="preserve">     2)   Tahap Pengunggahan / Pemindaian Dosir : Personel memilih jenis dosir dari 33 pilihan baku. Berkas diunggah dalam format PDF atau dipindai langsung lewat kamera. Sistem memeriksa ekstensi file, MIME type (application/pdf), serta batas ukuran maksimal (10 MB). File master bersih disimpan pada raw_file_path.</w:t></w:r></w:p><w:p><w:pPr><w:jc w:val="both"/><w:spacing w:after="80" w:line="276" w:lineRule="auto"/></w:pPr><w:r><w:rPr><w:rFonts w:ascii="Times New Roman" w:hAnsi="Times New Roman" w:eastAsia="Times New Roman" w:cs="Times New Roman"/><w:sz w:val="23"/><w:szCs w:val="23"/></w:rPr><w:t xml:space="preserve">     3)   Tahap Penamaan File & Struktur Direktori Otomatis : Sistem membentuk nama file baku "{NRP}_{KODE}.pdf". Apabila personel mengunggah lebih dari satu berkas pada jenis dosir yang sama (misalnya sertifikat dikmil lanjutan), sistem secara otomatis memberikan indeks abjad "{NRP}_{KODE}a.pdf", "{NRP}_{KODE}b.pdf", dst., dan menempatkannya ke dalam folder fisik "uploads/FOLDER {kode}/".</w:t></w:r></w:p><w:p><w:pPr><w:jc w:val="both"/><w:spacing w:after="80" w:line="276" w:lineRule="auto"/></w:pPr><w:r><w:rPr><w:rFonts w:ascii="Times New Roman" w:hAnsi="Times New Roman" w:eastAsia="Times New Roman" w:cs="Times New Roman"/><w:sz w:val="23"/><w:szCs w:val="23"/></w:rPr><w:t xml:space="preserve">     4)   Tahap Watermarking Pra-Verifikasi : Sebelum berkas disetujui, sistem membubuhkan tanda air visual status "PENDING APPROVAL" dan catatan kaki peninjauan agar dokumen belum memiliki kekuatan hukum sebelum divalidasi.</w:t></w:r></w:p><w:p><w:pPr><w:jc w:val="both"/><w:spacing w:after="80" w:line="276" w:lineRule="auto"/></w:pPr><w:r><w:rPr><w:rFonts w:ascii="Times New Roman" w:hAnsi="Times New Roman" w:eastAsia="Times New Roman" w:cs="Times New Roman"/><w:sz w:val="23"/><w:szCs w:val="23"/></w:rPr><w:t xml:space="preserve">     5)   Tahap Verifikasi & Penerbitan TTE : Administrator meneliti keabsahan isi berkas. Jika disetujui (Approved), sistem mengambil berkas master bersih, mengkalkulasi cryptographic hash SHA-256 dokumen, men-generate kode unik TTE resmi ("TTE-TRISULA-YYYYMM-ID-TOKEN"), menyusun tautan QR Code verifikasi publik, serta menyematkan running header dan stempel digital TTE pada halaman terakhir PDF menggunakan pustaka FPDI dan TCPDF.</w:t></w:r></w:p><w:p><w:pPr><w:jc w:val="both"/><w:spacing w:after="80" w:line="276" w:lineRule="auto"/></w:pPr><w:r><w:rPr><w:rFonts w:ascii="Times New Roman" w:hAnsi="Times New Roman" w:eastAsia="Times New Roman" w:cs="Times New Roman"/><w:sz w:val="23"/><w:szCs w:val="23"/></w:rPr><w:t xml:space="preserve">     6)   Tahap Analitik & Monitoring : Sistem menghitung rasio kelengkapan berkas personel (Approved / 33 * 100%). Menghitung selisih tahun antara TMT Jabatan dengan tanggal sekarang; jika > 2 tahun, ditandai sebagai kandidat rotasi jabatan. Menghitung tanggal lahir terhadap batas usia pensiun sesuai golongan guna memproyeksikan TMT Pensiun.</w:t></w:r></w:p><w:p><w:pPr><w:jc w:val="both"/><w:spacing w:after="80" w:line="276" w:lineRule="auto"/></w:pPr><w:r><w:rPr><w:rFonts w:ascii="Times New Roman" w:hAnsi="Times New Roman" w:eastAsia="Times New Roman" w:cs="Times New Roman"/><w:sz w:val="23"/><w:szCs w:val="23"/></w:rPr><w:t xml:space="preserve">     7)   Tahap Pelaporan & Ekspor : Mengompilasi data dalam format cetak standar militer berkop dinas Staf Personel serta menyediakan layanan pengemasan bulk download ZIP per prajurit.</w:t></w:r></w:p><w:p/><w:p><w:pPr><w:jc w:val="start"/><w:spacing w:after="60"/></w:pPr><w:r><w:rPr><w:rFonts w:ascii="Times New Roman" w:hAnsi="Times New Roman" w:eastAsia="Times New Roman" w:cs="Times New Roman"/><w:sz w:val="24"/><w:szCs w:val="24"/><w:b w:val="1"/><w:bCs w:val="1"/></w:rPr><w:t xml:space="preserve">d.   Output Program.</w:t></w:r></w:p><w:p><w:pPr><w:jc w:val="both"/><w:spacing w:after="80" w:line="276" w:lineRule="auto"/></w:pPr><w:r><w:rPr><w:rFonts w:ascii="Times New Roman" w:hAnsi="Times New Roman" w:eastAsia="Times New Roman" w:cs="Times New Roman"/><w:sz w:val="23"/><w:szCs w:val="23"/></w:rPr><w:t xml:space="preserve">Keluaran yang diproduksi oleh program aplikasi TRISULA TNI AD terdiri atas :</w:t></w:r></w:p><w:p><w:pPr><w:jc w:val="start"/><w:spacing w:after="60"/></w:pPr><w:r><w:rPr><w:rFonts w:ascii="Times New Roman" w:hAnsi="Times New Roman" w:eastAsia="Times New Roman" w:cs="Times New Roman"/><w:sz w:val="23"/><w:szCs w:val="23"/><w:b w:val="1"/><w:bCs w:val="1"/></w:rPr><w:t xml:space="preserve">     1)   Keluaran Tampilan Layar (Display) :</w:t></w:r></w:p><w:p><w:pPr><w:jc w:val="both"/><w:spacing w:after="80" w:line="276" w:lineRule="auto"/></w:pPr><w:r><w:rPr><w:rFonts w:ascii="Times New Roman" w:hAnsi="Times New Roman" w:eastAsia="Times New Roman" w:cs="Times New Roman"/><w:sz w:val="23"/><w:szCs w:val="23"/></w:rPr><w:t xml:space="preserve">          a)   Dashboard Personel : Visualisasi progress bar kelengkapan 33 dosir, status verifikasi tiap berkas (Pending, Approved, Rejected), dan rincian data prajurit.</w:t></w:r></w:p><w:p><w:pPr><w:jc w:val="both"/><w:spacing w:after="80" w:line="276" w:lineRule="auto"/></w:pPr><w:r><w:rPr><w:rFonts w:ascii="Times New Roman" w:hAnsi="Times New Roman" w:eastAsia="Times New Roman" w:cs="Times New Roman"/><w:sz w:val="23"/><w:szCs w:val="23"/></w:rPr><w:t xml:space="preserve">          b)   Dashboard Administrator : Statistik rekapitulasi total personel, rata-rata persentase kelengkapan satuan, daftar tunggu approval akun, daftar berkas pending verifikasi, daftar prajurit siap rotasi (> 2 tahun), dan proyeksi pensiun tahun berjalan.</w:t></w:r></w:p><w:p><w:pPr><w:jc w:val="both"/><w:spacing w:after="80" w:line="276" w:lineRule="auto"/></w:pPr><w:r><w:rPr><w:rFonts w:ascii="Times New Roman" w:hAnsi="Times New Roman" w:eastAsia="Times New Roman" w:cs="Times New Roman"/><w:sz w:val="23"/><w:szCs w:val="23"/></w:rPr><w:t xml:space="preserve">          c)   Halaman Verifikasi Publik (verify.php) : Tampilan sertifikasi keabsahan dokumen digital saat QR Code dipindai, memuat rincian nama pemilik berkas, jenis dosir, nama dan pangkat pejabat verifikator, waktu pengesahan, dan hash integritas SHA-256.</w:t></w:r></w:p><w:p><w:pPr><w:jc w:val="start"/><w:spacing w:after="60"/></w:pPr><w:r><w:rPr><w:rFonts w:ascii="Times New Roman" w:hAnsi="Times New Roman" w:eastAsia="Times New Roman" w:cs="Times New Roman"/><w:sz w:val="23"/><w:szCs w:val="23"/><w:b w:val="1"/><w:bCs w:val="1"/></w:rPr><w:t xml:space="preserve">     2)   Keluaran Cetakan (Print Out) & Berkas Digital :</w:t></w:r></w:p><w:p><w:pPr><w:jc w:val="both"/><w:spacing w:after="80" w:line="276" w:lineRule="auto"/></w:pPr><w:r><w:rPr><w:rFonts w:ascii="Times New Roman" w:hAnsi="Times New Roman" w:eastAsia="Times New Roman" w:cs="Times New Roman"/><w:sz w:val="23"/><w:szCs w:val="23"/></w:rPr><w:t xml:space="preserve">          a)   Berkas Dokumen PDF Ber-TTE Resmi : File PDF asli yang telah dibubuhi stempel digital dinas, running header pengesahan, kode registrasi TTE, dan QR Code keabsahan.</w:t></w:r></w:p><w:p><w:pPr><w:jc w:val="both"/><w:spacing w:after="80" w:line="276" w:lineRule="auto"/></w:pPr><w:r><w:rPr><w:rFonts w:ascii="Times New Roman" w:hAnsi="Times New Roman" w:eastAsia="Times New Roman" w:cs="Times New Roman"/><w:sz w:val="23"/><w:szCs w:val="23"/></w:rPr><w:t xml:space="preserve">          b)   Laporan Resmi Rekapitulasi Kelengkapan Dosir Satuan siap cetak (Kop Staf Personel & Kolom Tanda Tangan Komandan).</w:t></w:r></w:p><w:p><w:pPr><w:jc w:val="both"/><w:spacing w:after="80" w:line="276" w:lineRule="auto"/></w:pPr><w:r><w:rPr><w:rFonts w:ascii="Times New Roman" w:hAnsi="Times New Roman" w:eastAsia="Times New Roman" w:cs="Times New Roman"/><w:sz w:val="23"/><w:szCs w:val="23"/></w:rPr><w:t xml:space="preserve">          c)   Laporan Proyeksi Pensiun Prajurit & PNS TNI AD siap cetak.</w:t></w:r></w:p><w:p><w:pPr><w:jc w:val="both"/><w:spacing w:after="80" w:line="276" w:lineRule="auto"/></w:pPr><w:r><w:rPr><w:rFonts w:ascii="Times New Roman" w:hAnsi="Times New Roman" w:eastAsia="Times New Roman" w:cs="Times New Roman"/><w:sz w:val="23"/><w:szCs w:val="23"/></w:rPr><w:t xml:space="preserve">          d)   Laporan Masa Jabatan Personel (> 2 Tahun) siap cetak.</w:t></w:r></w:p><w:p><w:pPr><w:jc w:val="both"/><w:spacing w:after="80" w:line="276" w:lineRule="auto"/></w:pPr><w:r><w:rPr><w:rFonts w:ascii="Times New Roman" w:hAnsi="Times New Roman" w:eastAsia="Times New Roman" w:cs="Times New Roman"/><w:sz w:val="23"/><w:szCs w:val="23"/></w:rPr><w:t xml:space="preserve">          e)   Berkas Arsip ZIP Hasil Unduh Massal (Bulk Download) berisi folder-folder terstruktur dosir per prajurit.</w:t></w:r></w:p><w:p><w:r><w:br w:type="page"/></w:r></w:p><w:p><w:pPr><w:jc w:val="start"/><w:spacing w:after="60"/></w:pPr><w:r><w:rPr><w:rFonts w:ascii="Times New Roman" w:hAnsi="Times New Roman" w:eastAsia="Times New Roman" w:cs="Times New Roman"/><w:sz w:val="24"/><w:szCs w:val="24"/><w:b w:val="1"/><w:bCs w:val="1"/></w:rPr><w:t xml:space="preserve">11.  Diagram Arus Data (Data Flow Diagram).</w:t></w:r></w:p><w:p><w:pPr><w:jc w:val="both"/><w:spacing w:after="80" w:line="276" w:lineRule="auto"/></w:pPr><w:r><w:rPr><w:rFonts w:ascii="Times New Roman" w:hAnsi="Times New Roman" w:eastAsia="Times New Roman" w:cs="Times New Roman"/><w:sz w:val="23"/><w:szCs w:val="23"/></w:rPr><w:t xml:space="preserve">Diagram arus data menggambarkan asal sumber perolehan data, proses transformasi komputasi, penyimpanan pada tabel basis data, serta distribusi informasi kepada para pengguna yang berhak.</w:t></w:r></w:p><w:p/><w:p><w:pPr><w:jc w:val="start"/><w:spacing w:after="60"/></w:pPr><w:r><w:rPr><w:rFonts w:ascii="Times New Roman" w:hAnsi="Times New Roman" w:eastAsia="Times New Roman" w:cs="Times New Roman"/><w:sz w:val="24"/><w:szCs w:val="24"/><w:b w:val="1"/><w:bCs w:val="1"/></w:rPr><w:t xml:space="preserve">a.   Diagram Konteks (Context Diagram / DFD Level 0).</w:t></w:r></w:p><w:p><w:pPr><w:jc w:val="both"/><w:spacing w:after="80" w:line="276" w:lineRule="auto"/></w:pPr><w:r><w:rPr><w:rFonts w:ascii="Times New Roman" w:hAnsi="Times New Roman" w:eastAsia="Times New Roman" w:cs="Times New Roman"/><w:sz w:val="23"/><w:szCs w:val="23"/></w:rPr><w:t xml:space="preserve">Pada tingkat konteks, sistem TRISULA TNI AD berinteraksi dengan 4 (empat) entitas eksternal :</w:t></w:r></w:p><w:tbl><w:tblGrid><w:gridCol w:w="2200" w:type="dxa"/><w:gridCol w:w="3500" w:type="dxa"/><w:gridCol w:w="3500" w:type="dxa"/></w:tblGrid><w:tblPr><w:tblStyle w:val="MilitaryTable"/></w:tblPr><w:tr><w:trPr/><w:tc><w:tcPr><w:tcW w:w="2200" w:type="dxa"/><w:shd w:val="clear" w:fill="EAEAEA"/><w:noWrap/></w:tcPr><w:p><w:pPr><w:jc w:val="center"/><w:spacing w:after="60"/></w:pPr><w:r><w:rPr><w:rFonts w:ascii="Times New Roman" w:hAnsi="Times New Roman" w:eastAsia="Times New Roman" w:cs="Times New Roman"/><w:sz w:val="20"/><w:szCs w:val="20"/><w:b w:val="1"/><w:bCs w:val="1"/></w:rPr><w:t xml:space="preserve">Entitas Luar</w:t></w:r></w:p></w:tc><w:tc><w:tcPr><w:tcW w:w="3500" w:type="dxa"/><w:shd w:val="clear" w:fill="EAEAEA"/><w:noWrap/></w:tcPr><w:p><w:pPr><w:jc w:val="center"/><w:spacing w:after="60"/></w:pPr><w:r><w:rPr><w:rFonts w:ascii="Times New Roman" w:hAnsi="Times New Roman" w:eastAsia="Times New Roman" w:cs="Times New Roman"/><w:sz w:val="20"/><w:szCs w:val="20"/><w:b w:val="1"/><w:bCs w:val="1"/></w:rPr><w:t xml:space="preserve">Arus Data Masukan (Input)</w:t></w:r></w:p></w:tc><w:tc><w:tcPr><w:tcW w:w="3500" w:type="dxa"/><w:shd w:val="clear" w:fill="EAEAEA"/><w:noWrap/></w:tcPr><w:p><w:pPr><w:jc w:val="center"/><w:spacing w:after="60"/></w:pPr><w:r><w:rPr><w:rFonts w:ascii="Times New Roman" w:hAnsi="Times New Roman" w:eastAsia="Times New Roman" w:cs="Times New Roman"/><w:sz w:val="20"/><w:szCs w:val="20"/><w:b w:val="1"/><w:bCs w:val="1"/></w:rPr><w:t xml:space="preserve">Arus Data Keluaran (Output)</w:t></w:r></w:p></w:tc></w:tr><w:tr><w:trPr/><w:tc><w:tcPr><w:tcW w:w="2200" w:type="dxa"/><w:noWrap/></w:tcPr><w:p><w:pPr><w:jc w:val="start"/><w:spacing w:after="60"/></w:pPr><w:r><w:rPr><w:rFonts w:ascii="Times New Roman" w:hAnsi="Times New Roman" w:eastAsia="Times New Roman" w:cs="Times New Roman"/><w:sz w:val="19"/><w:szCs w:val="19"/><w:b w:val="1"/><w:bCs w:val="1"/></w:rPr><w:t xml:space="preserve">Personel Prajurit / PNS TNI AD</w:t></w:r></w:p></w:tc><w:tc><w:tcPr><w:tcW w:w="3500" w:type="dxa"/><w:noWrap/></w:tcPr><w:p><w:pPr><w:jc w:val="start"/><w:spacing w:after="60"/></w:pPr><w:r><w:rPr><w:rFonts w:ascii="Times New Roman" w:hAnsi="Times New Roman" w:eastAsia="Times New Roman" w:cs="Times New Roman"/><w:sz w:val="19"/><w:szCs w:val="19"/></w:rPr><w:t xml:space="preserve">Data diri registrasi, Berkas 33 dosir PDF, Hasil foto scan kamera, Kredensial login, Pembaruan profil</w:t></w:r></w:p></w:tc><w:tc><w:tcPr><w:tcW w:w="3500" w:type="dxa"/><w:noWrap/></w:tcPr><w:p><w:pPr><w:jc w:val="start"/><w:spacing w:after="60"/></w:pPr><w:r><w:rPr><w:rFonts w:ascii="Times New Roman" w:hAnsi="Times New Roman" w:eastAsia="Times New Roman" w:cs="Times New Roman"/><w:sz w:val="19"/><w:szCs w:val="19"/></w:rPr><w:t xml:space="preserve">Status persetujuan akun, Dashboard progres 33 dosir, Catatan revisi verifikasi, Dokumen PDF sah ber-TTE</w:t></w:r></w:p></w:tc></w:tr><w:tr><w:trPr/><w:tc><w:tcPr><w:tcW w:w="2200" w:type="dxa"/><w:noWrap/></w:tcPr><w:p><w:pPr><w:jc w:val="start"/><w:spacing w:after="60"/></w:pPr><w:r><w:rPr><w:rFonts w:ascii="Times New Roman" w:hAnsi="Times New Roman" w:eastAsia="Times New Roman" w:cs="Times New Roman"/><w:sz w:val="19"/><w:szCs w:val="19"/><w:b w:val="1"/><w:bCs w:val="1"/></w:rPr><w:t xml:space="preserve">Administrator Satuan (Spers / Infolahta)</w:t></w:r></w:p></w:tc><w:tc><w:tcPr><w:tcW w:w="3500" w:type="dxa"/><w:noWrap/></w:tcPr><w:p><w:pPr><w:jc w:val="start"/><w:spacing w:after="60"/></w:pPr><w:r><w:rPr><w:rFonts w:ascii="Times New Roman" w:hAnsi="Times New Roman" w:eastAsia="Times New Roman" w:cs="Times New Roman"/><w:sz w:val="19"/><w:szCs w:val="19"/></w:rPr><w:t xml:space="preserve">Persetujuan akun pengguna, Keputusan verifikasi berkas (Approve/Reject), Catatan verifikasi, Parameter setting sistem</w:t></w:r></w:p></w:tc><w:tc><w:tcPr><w:tcW w:w="3500" w:type="dxa"/><w:noWrap/></w:tcPr><w:p><w:pPr><w:jc w:val="start"/><w:spacing w:after="60"/></w:pPr><w:r><w:rPr><w:rFonts w:ascii="Times New Roman" w:hAnsi="Times New Roman" w:eastAsia="Times New Roman" w:cs="Times New Roman"/><w:sz w:val="19"/><w:szCs w:val="19"/></w:rPr><w:t xml:space="preserve">Statistik satuan, Berkas antrean verifikasi, Notifikasi masa jabatan > 2 th & pensiun, Laporan resmi cetak, File backup ZIP</w:t></w:r></w:p></w:tc></w:tr><w:tr><w:trPr/><w:tc><w:tcPr><w:tcW w:w="2200" w:type="dxa"/><w:noWrap/></w:tcPr><w:p><w:pPr><w:jc w:val="start"/><w:spacing w:after="60"/></w:pPr><w:r><w:rPr><w:rFonts w:ascii="Times New Roman" w:hAnsi="Times New Roman" w:eastAsia="Times New Roman" w:cs="Times New Roman"/><w:sz w:val="19"/><w:szCs w:val="19"/><w:b w:val="1"/><w:bCs w:val="1"/></w:rPr><w:t xml:space="preserve">Pimpinan Satuan / Komandan</w:t></w:r></w:p></w:tc><w:tc><w:tcPr><w:tcW w:w="3500" w:type="dxa"/><w:noWrap/></w:tcPr><w:p><w:pPr><w:jc w:val="start"/><w:spacing w:after="60"/></w:pPr><w:r><w:rPr><w:rFonts w:ascii="Times New Roman" w:hAnsi="Times New Roman" w:eastAsia="Times New Roman" w:cs="Times New Roman"/><w:sz w:val="19"/><w:szCs w:val="19"/></w:rPr><w:t xml:space="preserve">Permintaan laporan analisis kelengkapan dosir dan perencanaan personel</w:t></w:r></w:p></w:tc><w:tc><w:tcPr><w:tcW w:w="3500" w:type="dxa"/><w:noWrap/></w:tcPr><w:p><w:pPr><w:jc w:val="start"/><w:spacing w:after="60"/></w:pPr><w:r><w:rPr><w:rFonts w:ascii="Times New Roman" w:hAnsi="Times New Roman" w:eastAsia="Times New Roman" w:cs="Times New Roman"/><w:sz w:val="19"/><w:szCs w:val="19"/></w:rPr><w:t xml:space="preserve">Laporan kelengkapan dosir satuan siap cetak, Daftar nominatif pensiun, Daftar proyeksi mutasi jabatan (TOD/TOA)</w:t></w:r></w:p></w:tc></w:tr><w:tr><w:trPr/><w:tc><w:tcPr><w:tcW w:w="2200" w:type="dxa"/><w:noWrap/></w:tcPr><w:p><w:pPr><w:jc w:val="start"/><w:spacing w:after="60"/></w:pPr><w:r><w:rPr><w:rFonts w:ascii="Times New Roman" w:hAnsi="Times New Roman" w:eastAsia="Times New Roman" w:cs="Times New Roman"/><w:sz w:val="19"/><w:szCs w:val="19"/><w:b w:val="1"/><w:bCs w:val="1"/></w:rPr><w:t xml:space="preserve">Publik / Pemeriksa Dokumen</w:t></w:r></w:p></w:tc><w:tc><w:tcPr><w:tcW w:w="3500" w:type="dxa"/><w:noWrap/></w:tcPr><w:p><w:pPr><w:jc w:val="start"/><w:spacing w:after="60"/></w:pPr><w:r><w:rPr><w:rFonts w:ascii="Times New Roman" w:hAnsi="Times New Roman" w:eastAsia="Times New Roman" w:cs="Times New Roman"/><w:sz w:val="19"/><w:szCs w:val="19"/></w:rPr><w:t xml:space="preserve">Pemindaian QR Code dokumen melalui kamera gawai (HTTP Request GET kode TTE)</w:t></w:r></w:p></w:tc><w:tc><w:tcPr><w:tcW w:w="3500" w:type="dxa"/><w:noWrap/></w:tcPr><w:p><w:pPr><w:jc w:val="start"/><w:spacing w:after="60"/></w:pPr><w:r><w:rPr><w:rFonts w:ascii="Times New Roman" w:hAnsi="Times New Roman" w:eastAsia="Times New Roman" w:cs="Times New Roman"/><w:sz w:val="19"/><w:szCs w:val="19"/></w:rPr><w:t xml:space="preserve">Informasi sertifikasi digital keabsahan dokumen, Nama personel, Pejabat penandatangan, Waktu pengesahan, Hash SHA-256</w:t></w:r></w:p></w:tc></w:tr></w:tbl><w:p/><w:p><w:pPr><w:jc w:val="start"/><w:spacing w:after="60"/></w:pPr><w:r><w:rPr><w:rFonts w:ascii="Times New Roman" w:hAnsi="Times New Roman" w:eastAsia="Times New Roman" w:cs="Times New Roman"/><w:sz w:val="23"/><w:szCs w:val="23"/><w:i w:val="1"/><w:iCs w:val="1"/></w:rPr><w:t xml:space="preserve">Bagan Konseptual Aliran Arus Data (DFD Level 0) :</w:t></w:r></w:p><w:tbl><w:tblGrid><w:gridCol w:w="9200" w:type="dxa"/></w:tblGrid><w:tblPr><w:tblStyle w:val="BoxTable"/></w:tblPr><w:tr><w:trPr/><w:tc><w:tcPr><w:tcW w:w="9200" w:type="dxa"/><w:shd w:val="clear" w:fill="F2F6F2"/><w:noWrap/></w:tcPr><w:p><w:pPr><w:jc w:val="center"/><w:spacing w:after="60"/></w:pPr><w:r><w:rPr><w:rFonts w:ascii="Consolas" w:hAnsi="Consolas" w:eastAsia="Consolas" w:cs="Consolas"/><w:sz w:val="17"/><w:szCs w:val="17"/></w:rPr><w:t xml:space="preserve">┌───────────────────────────┐                     ┌───────────────────────────┐</w:t></w:r></w:p><w:p><w:pPr><w:jc w:val="center"/><w:spacing w:after="60"/></w:pPr><w:r><w:rPr><w:rFonts w:ascii="Consolas" w:hAnsi="Consolas" w:eastAsia="Consolas" w:cs="Consolas"/><w:sz w:val="17"/><w:szCs w:val="17"/></w:rPr><w:t xml:space="preserve">│      PERSONEL TNI AD      │──(Data Registrasi/──>│                           │</w:t></w:r></w:p><w:p><w:pPr><w:jc w:val="center"/><w:spacing w:after="60"/></w:pPr><w:r><w:rPr><w:rFonts w:ascii="Consolas" w:hAnsi="Consolas" w:eastAsia="Consolas" w:cs="Consolas"/><w:sz w:val="17"/><w:szCs w:val="17"/></w:rPr><w:t xml:space="preserve">│  (Prajurit & PNS Militer) │   Unggah 33 Dosir)   │                           │</w:t></w:r></w:p><w:p><w:pPr><w:jc w:val="center"/><w:spacing w:after="60"/></w:pPr><w:r><w:rPr><w:rFonts w:ascii="Consolas" w:hAnsi="Consolas" w:eastAsia="Consolas" w:cs="Consolas"/><w:sz w:val="17"/><w:szCs w:val="17"/></w:rPr><w:t xml:space="preserve">│                           │<─(Status/Progress/───│                           │</w:t></w:r></w:p><w:p><w:pPr><w:jc w:val="center"/><w:spacing w:after="60"/></w:pPr><w:r><w:rPr><w:rFonts w:ascii="Consolas" w:hAnsi="Consolas" w:eastAsia="Consolas" w:cs="Consolas"/><w:sz w:val="17"/><w:szCs w:val="17"/></w:rPr><w:t xml:space="preserve">└───────────────────────────┘   Dokumen Ber-TTE)   │       SISTEM UTAMA        │</w:t></w:r></w:p><w:p><w:pPr><w:jc w:val="center"/><w:spacing w:after="60"/></w:pPr><w:r><w:rPr><w:rFonts w:ascii="Consolas" w:hAnsi="Consolas" w:eastAsia="Consolas" w:cs="Consolas"/><w:sz w:val="17"/><w:szCs w:val="17"/></w:rPr><w:t xml:space="preserve">                                                   │      TRISULA TNI AD       │</w:t></w:r></w:p><w:p><w:pPr><w:jc w:val="center"/><w:spacing w:after="60"/></w:pPr><w:r><w:rPr><w:rFonts w:ascii="Consolas" w:hAnsi="Consolas" w:eastAsia="Consolas" w:cs="Consolas"/><w:sz w:val="17"/><w:szCs w:val="17"/></w:rPr><w:t xml:space="preserve">┌───────────────────────────┐                      │                           │</w:t></w:r></w:p><w:p><w:pPr><w:jc w:val="center"/><w:spacing w:after="60"/></w:pPr><w:r><w:rPr><w:rFonts w:ascii="Consolas" w:hAnsi="Consolas" w:eastAsia="Consolas" w:cs="Consolas"/><w:sz w:val="17"/><w:szCs w:val="17"/></w:rPr><w:t xml:space="preserve">│    ADMINISTRATOR PERS     │──(Approval/Verifikasi│  Tata Kelola Rekam        │</w:t></w:r></w:p><w:p><w:pPr><w:jc w:val="center"/><w:spacing w:after="60"/></w:pPr><w:r><w:rPr><w:rFonts w:ascii="Consolas" w:hAnsi="Consolas" w:eastAsia="Consolas" w:cs="Consolas"/><w:sz w:val="17"/><w:szCs w:val="17"/></w:rPr><w:t xml:space="preserve">│   (Spers / Infolahtad)    │   Parameter Setting)─>  Informasi, Sistematika,  │</w:t></w:r></w:p><w:p><w:pPr><w:jc w:val="center"/><w:spacing w:after="60"/></w:pPr><w:r><w:rPr><w:rFonts w:ascii="Consolas" w:hAnsi="Consolas" w:eastAsia="Consolas" w:cs="Consolas"/><w:sz w:val="17"/><w:szCs w:val="17"/></w:rPr><w:t xml:space="preserve">│                           │<─(Laporan/Bulk ZIP/──│  & Unduhan Lengkap Arsip  │</w:t></w:r></w:p><w:p><w:pPr><w:jc w:val="center"/><w:spacing w:after="60"/></w:pPr><w:r><w:rPr><w:rFonts w:ascii="Consolas" w:hAnsi="Consolas" w:eastAsia="Consolas" w:cs="Consolas"/><w:sz w:val="17"/><w:szCs w:val="17"/></w:rPr><w:t xml:space="preserve">└───────────────────────────┘   Monitoring Satuan) │                           │</w:t></w:r></w:p><w:p><w:pPr><w:jc w:val="center"/><w:spacing w:after="60"/></w:pPr><w:r><w:rPr><w:rFonts w:ascii="Consolas" w:hAnsi="Consolas" w:eastAsia="Consolas" w:cs="Consolas"/><w:sz w:val="17"/><w:szCs w:val="17"/></w:rPr><w:t xml:space="preserve">                                                   │                           │</w:t></w:r></w:p><w:p><w:pPr><w:jc w:val="center"/><w:spacing w:after="60"/></w:pPr><w:r><w:rPr><w:rFonts w:ascii="Consolas" w:hAnsi="Consolas" w:eastAsia="Consolas" w:cs="Consolas"/><w:sz w:val="17"/><w:szCs w:val="17"/></w:rPr><w:t xml:space="preserve">┌───────────────────────────┐                      │                           │</w:t></w:r></w:p><w:p><w:pPr><w:jc w:val="center"/><w:spacing w:after="60"/></w:pPr><w:r><w:rPr><w:rFonts w:ascii="Consolas" w:hAnsi="Consolas" w:eastAsia="Consolas" w:cs="Consolas"/><w:sz w:val="17"/><w:szCs w:val="17"/></w:rPr><w:t xml:space="preserve">│   PUBLIK / PEMERIKSA QR   │──(Scan QR Code TTE)─>│                           │</w:t></w:r></w:p><w:p><w:pPr><w:jc w:val="center"/><w:spacing w:after="60"/></w:pPr><w:r><w:rPr><w:rFonts w:ascii="Consolas" w:hAnsi="Consolas" w:eastAsia="Consolas" w:cs="Consolas"/><w:sz w:val="17"/><w:szCs w:val="17"/></w:rPr><w:t xml:space="preserve">│                           │<─(Sertifikasi Sah)───│                           │</w:t></w:r></w:p><w:p><w:pPr><w:jc w:val="center"/><w:spacing w:after="60"/></w:pPr><w:r><w:rPr><w:rFonts w:ascii="Consolas" w:hAnsi="Consolas" w:eastAsia="Consolas" w:cs="Consolas"/><w:sz w:val="17"/><w:szCs w:val="17"/></w:rPr><w:t xml:space="preserve">└───────────────────────────┘                     └───────────────────────────┘</w:t></w:r></w:p></w:tc></w:tr></w:tbl><w:p/><w:p><w:pPr><w:jc w:val="start"/><w:spacing w:after="60"/></w:pPr><w:r><w:rPr><w:rFonts w:ascii="Times New Roman" w:hAnsi="Times New Roman" w:eastAsia="Times New Roman" w:cs="Times New Roman"/><w:sz w:val="24"/><w:szCs w:val="24"/><w:b w:val="1"/><w:bCs w:val="1"/></w:rPr><w:t xml:space="preserve">b.   Diagram Arus Data Rinci (DFD Level 1).</w:t></w:r></w:p><w:p><w:pPr><w:jc w:val="both"/><w:spacing w:after="80" w:line="276" w:lineRule="auto"/></w:pPr><w:r><w:rPr><w:rFonts w:ascii="Times New Roman" w:hAnsi="Times New Roman" w:eastAsia="Times New Roman" w:cs="Times New Roman"/><w:sz w:val="23"/><w:szCs w:val="23"/></w:rPr><w:t xml:space="preserve">Proses utama dipecah menjadi 7 (tujuh) sub-proses fungsional terintegrasi :</w:t></w:r></w:p><w:p><w:pPr><w:jc w:val="both"/><w:spacing w:after="80" w:line="276" w:lineRule="auto"/></w:pPr><w:r><w:rPr><w:rFonts w:ascii="Times New Roman" w:hAnsi="Times New Roman" w:eastAsia="Times New Roman" w:cs="Times New Roman"/><w:sz w:val="23"/><w:szCs w:val="23"/></w:rPr><w:t xml:space="preserve">     1)   Proses 1.0 : Autentikasi Pengguna & Sesi Keamanan (Validasi NRP/Password, Rate Limiting, Pengendalian Hak Akses Role).</w:t></w:r></w:p><w:p><w:pPr><w:jc w:val="both"/><w:spacing w:after="80" w:line="276" w:lineRule="auto"/></w:pPr><w:r><w:rPr><w:rFonts w:ascii="Times New Roman" w:hAnsi="Times New Roman" w:eastAsia="Times New Roman" w:cs="Times New Roman"/><w:sz w:val="23"/><w:szCs w:val="23"/></w:rPr><w:t xml:space="preserve">     2)   Proses 2.0 : Pengelolaan Pendaftaran & Persetujuan Akun (Pencatatan data personel, validasi NRP unik, otorisasi Admin).</w:t></w:r></w:p><w:p><w:pPr><w:jc w:val="both"/><w:spacing w:after="80" w:line="276" w:lineRule="auto"/></w:pPr><w:r><w:rPr><w:rFonts w:ascii="Times New Roman" w:hAnsi="Times New Roman" w:eastAsia="Times New Roman" w:cs="Times New Roman"/><w:sz w:val="23"/><w:szCs w:val="23"/></w:rPr><w:t xml:space="preserve">     3)   Proses 3.0 : Unggah & Pemindaian 33 Dosir (Validasi PDF, pembagian sub-folder fisik, penamaan otomatis indeks abjad).</w:t></w:r></w:p><w:p><w:pPr><w:jc w:val="both"/><w:spacing w:after="80" w:line="276" w:lineRule="auto"/></w:pPr><w:r><w:rPr><w:rFonts w:ascii="Times New Roman" w:hAnsi="Times New Roman" w:eastAsia="Times New Roman" w:cs="Times New Roman"/><w:sz w:val="23"/><w:szCs w:val="23"/></w:rPr><w:t xml:space="preserve">     4)   Proses 4.0 : Verifikasi Berkas & Pembubuhan TTE (Pemeriksaan admin, kalkulasi SHA-256, penerbitan QR Code, watermarking).</w:t></w:r></w:p><w:p><w:pPr><w:jc w:val="both"/><w:spacing w:after="80" w:line="276" w:lineRule="auto"/></w:pPr><w:r><w:rPr><w:rFonts w:ascii="Times New Roman" w:hAnsi="Times New Roman" w:eastAsia="Times New Roman" w:cs="Times New Roman"/><w:sz w:val="23"/><w:szCs w:val="23"/></w:rPr><w:t xml:space="preserve">     5)   Proses 5.0 : Layanan Verifikasi Dokumen Publik (Pencarian kode TTE, validasi integritas hash, penampilan sertifikat keabsahan).</w:t></w:r></w:p><w:p><w:pPr><w:jc w:val="both"/><w:spacing w:after="80" w:line="276" w:lineRule="auto"/></w:pPr><w:r><w:rPr><w:rFonts w:ascii="Times New Roman" w:hAnsi="Times New Roman" w:eastAsia="Times New Roman" w:cs="Times New Roman"/><w:sz w:val="23"/><w:szCs w:val="23"/></w:rPr><w:t xml:space="preserve">     6)   Proses 6.0 : Analitik Monitoring Personel (Perhitungan rasio kelengkapan, deteksi masa jabatan > 2 th, proyeksi pensiun).</w:t></w:r></w:p><w:p><w:pPr><w:jc w:val="both"/><w:spacing w:after="80" w:line="276" w:lineRule="auto"/></w:pPr><w:r><w:rPr><w:rFonts w:ascii="Times New Roman" w:hAnsi="Times New Roman" w:eastAsia="Times New Roman" w:cs="Times New Roman"/><w:sz w:val="23"/><w:szCs w:val="23"/></w:rPr><w:t xml:space="preserve">     7)   Proses 7.0 : Pelaporan & Pemeliharaan Sistem (Ekspor print out dinas, kompresi bulk ZIP, pencadangan basis data, audit log).</w:t></w:r></w:p><w:p><w:r><w:br w:type="page"/></w:r></w:p><w:p><w:pPr><w:jc w:val="start"/><w:spacing w:after="60"/></w:pPr><w:r><w:rPr><w:rFonts w:ascii="Times New Roman" w:hAnsi="Times New Roman" w:eastAsia="Times New Roman" w:cs="Times New Roman"/><w:sz w:val="24"/><w:szCs w:val="24"/><w:b w:val="1"/><w:bCs w:val="1"/></w:rPr><w:t xml:space="preserve">12.  Diagram Hubungan Entity (Entity Relationship Diagram - ERD).</w:t></w:r></w:p><w:p><w:pPr><w:jc w:val="both"/><w:spacing w:after="80" w:line="276" w:lineRule="auto"/></w:pPr><w:r><w:rPr><w:rFonts w:ascii="Times New Roman" w:hAnsi="Times New Roman" w:eastAsia="Times New Roman" w:cs="Times New Roman"/><w:sz w:val="23"/><w:szCs w:val="23"/></w:rPr><w:t xml:space="preserve">Diagram hubungan entitas memetakan arsitektur relasional pangkalan data (database) sistem TRISULA TNI AD, yang mengikat entitas personel, akun sistem, berkas dosir, master referensi, serta log audit keamanan.</w:t></w:r></w:p><w:p/><w:tbl><w:tblGrid><w:gridCol w:w="9200" w:type="dxa"/></w:tblGrid><w:tblPr><w:tblStyle w:val="BoxTable"/></w:tblPr><w:tr><w:trPr/><w:tc><w:tcPr><w:tcW w:w="9200" w:type="dxa"/><w:shd w:val="clear" w:fill="F2F6F2"/><w:noWrap/></w:tcPr><w:p><w:pPr><w:jc w:val="center"/><w:spacing w:after="60"/></w:pPr><w:r><w:rPr><w:rFonts w:ascii="Consolas" w:hAnsi="Consolas" w:eastAsia="Consolas" w:cs="Consolas"/><w:sz w:val="17"/><w:szCs w:val="17"/></w:rPr><w:t xml:space="preserve">┌────────────────────────┐          1:1          ┌────────────────────────┐</w:t></w:r></w:p><w:p><w:pPr><w:jc w:val="center"/><w:spacing w:after="60"/></w:pPr><w:r><w:rPr><w:rFonts w:ascii="Consolas" w:hAnsi="Consolas" w:eastAsia="Consolas" w:cs="Consolas"/><w:sz w:val="17"/><w:szCs w:val="17"/></w:rPr><w:t xml:space="preserve">│        PERSONEL        │◄─────────────────────►│         USERS          │</w:t></w:r></w:p><w:p><w:pPr><w:jc w:val="center"/><w:spacing w:after="60"/></w:pPr><w:r><w:rPr><w:rFonts w:ascii="Consolas" w:hAnsi="Consolas" w:eastAsia="Consolas" w:cs="Consolas"/><w:sz w:val="17"/><w:szCs w:val="17"/></w:rPr><w:t xml:space="preserve">│────────────────────────│                       │────────────────────────│</w:t></w:r></w:p><w:p><w:pPr><w:jc w:val="center"/><w:spacing w:after="60"/></w:pPr><w:r><w:rPr><w:rFonts w:ascii="Consolas" w:hAnsi="Consolas" w:eastAsia="Consolas" w:cs="Consolas"/><w:sz w:val="17"/><w:szCs w:val="17"/></w:rPr><w:t xml:space="preserve">│ PK : id                │                       │ PK : id                │</w:t></w:r></w:p><w:p><w:pPr><w:jc w:val="center"/><w:spacing w:after="60"/></w:pPr><w:r><w:rPr><w:rFonts w:ascii="Consolas" w:hAnsi="Consolas" w:eastAsia="Consolas" w:cs="Consolas"/><w:sz w:val="17"/><w:szCs w:val="17"/></w:rPr><w:t xml:space="preserve">│      nrp (UNIQUE)      │                       │      username (UNIQUE) │</w:t></w:r></w:p><w:p><w:pPr><w:jc w:val="center"/><w:spacing w:after="60"/></w:pPr><w:r><w:rPr><w:rFonts w:ascii="Consolas" w:hAnsi="Consolas" w:eastAsia="Consolas" w:cs="Consolas"/><w:sz w:val="17"/><w:szCs w:val="17"/></w:rPr><w:t xml:space="preserve">│      nama              │                       │      password (HASH)   │</w:t></w:r></w:p><w:p><w:pPr><w:jc w:val="center"/><w:spacing w:after="60"/></w:pPr><w:r><w:rPr><w:rFonts w:ascii="Consolas" w:hAnsi="Consolas" w:eastAsia="Consolas" w:cs="Consolas"/><w:sz w:val="17"/><w:szCs w:val="17"/></w:rPr><w:t xml:space="preserve">│      golongan          │                       │      role (admin/pers) │</w:t></w:r></w:p><w:p><w:pPr><w:jc w:val="center"/><w:spacing w:after="60"/></w:pPr><w:r><w:rPr><w:rFonts w:ascii="Consolas" w:hAnsi="Consolas" w:eastAsia="Consolas" w:cs="Consolas"/><w:sz w:val="17"/><w:szCs w:val="17"/></w:rPr><w:t xml:space="preserve">│      pangkat, korp     │                       │ FK : personel_id (UNIQ)│</w:t></w:r></w:p><w:p><w:pPr><w:jc w:val="center"/><w:spacing w:after="60"/></w:pPr><w:r><w:rPr><w:rFonts w:ascii="Consolas" w:hAnsi="Consolas" w:eastAsia="Consolas" w:cs="Consolas"/><w:sz w:val="17"/><w:szCs w:val="17"/></w:rPr><w:t xml:space="preserve">│      satuan, jabatan   │                       │      status (approval) │</w:t></w:r></w:p><w:p><w:pPr><w:jc w:val="center"/><w:spacing w:after="60"/></w:pPr><w:r><w:rPr><w:rFonts w:ascii="Consolas" w:hAnsi="Consolas" w:eastAsia="Consolas" w:cs="Consolas"/><w:sz w:val="17"/><w:szCs w:val="17"/></w:rPr><w:t xml:space="preserve">│      tmt_jabatan       │                       └───────────┬────────────┘</w:t></w:r></w:p><w:p><w:pPr><w:jc w:val="center"/><w:spacing w:after="60"/></w:pPr><w:r><w:rPr><w:rFonts w:ascii="Consolas" w:hAnsi="Consolas" w:eastAsia="Consolas" w:cs="Consolas"/><w:sz w:val="17"/><w:szCs w:val="17"/></w:rPr><w:t xml:space="preserve">│      tanggal_lahir     │                                   │             </w:t></w:r></w:p><w:p><w:pPr><w:jc w:val="center"/><w:spacing w:after="60"/></w:pPr><w:r><w:rPr><w:rFonts w:ascii="Consolas" w:hAnsi="Consolas" w:eastAsia="Consolas" w:cs="Consolas"/><w:sz w:val="17"/><w:szCs w:val="17"/></w:rPr><w:t xml:space="preserve">└───────────┬────────────┘                                   │ 1:N         </w:t></w:r></w:p><w:p><w:pPr><w:jc w:val="center"/><w:spacing w:after="60"/></w:pPr><w:r><w:rPr><w:rFonts w:ascii="Consolas" w:hAnsi="Consolas" w:eastAsia="Consolas" w:cs="Consolas"/><w:sz w:val="17"/><w:szCs w:val="17"/></w:rPr><w:t xml:space="preserve">            │                                                +────────────┐</w:t></w:r></w:p><w:p><w:pPr><w:jc w:val="center"/><w:spacing w:after="60"/></w:pPr><w:r><w:rPr><w:rFonts w:ascii="Consolas" w:hAnsi="Consolas" w:eastAsia="Consolas" w:cs="Consolas"/><w:sz w:val="17"/><w:szCs w:val="17"/></w:rPr><w:t xml:space="preserve">            │ 1:N                                            │            │</w:t></w:r></w:p><w:p><w:pPr><w:jc w:val="center"/><w:spacing w:after="60"/></w:pPr><w:r><w:rPr><w:rFonts w:ascii="Consolas" w:hAnsi="Consolas" w:eastAsia="Consolas" w:cs="Consolas"/><w:sz w:val="17"/><w:szCs w:val="17"/></w:rPr><w:t xml:space="preserve">            ▼                                                ▼            ▼</w:t></w:r></w:p><w:p><w:pPr><w:jc w:val="center"/><w:spacing w:after="60"/></w:pPr><w:r><w:rPr><w:rFonts w:ascii="Consolas" w:hAnsi="Consolas" w:eastAsia="Consolas" w:cs="Consolas"/><w:sz w:val="17"/><w:szCs w:val="17"/></w:rPr><w:t xml:space="preserve">┌────────────────────────┐                           ┌──────────────┐ ┌──────────────┐</w:t></w:r></w:p><w:p><w:pPr><w:jc w:val="center"/><w:spacing w:after="60"/></w:pPr><w:r><w:rPr><w:rFonts w:ascii="Consolas" w:hAnsi="Consolas" w:eastAsia="Consolas" w:cs="Consolas"/><w:sz w:val="17"/><w:szCs w:val="17"/></w:rPr><w:t xml:space="preserve">│      DOSIR_FILES       │                           │ ACTIVITY_LOG │ │  BACKUP_LOG  │</w:t></w:r></w:p><w:p><w:pPr><w:jc w:val="center"/><w:spacing w:after="60"/></w:pPr><w:r><w:rPr><w:rFonts w:ascii="Consolas" w:hAnsi="Consolas" w:eastAsia="Consolas" w:cs="Consolas"/><w:sz w:val="17"/><w:szCs w:val="17"/></w:rPr><w:t xml:space="preserve">│────────────────────────│                           │──────────────│ │──────────────│</w:t></w:r></w:p><w:p><w:pPr><w:jc w:val="center"/><w:spacing w:after="60"/></w:pPr><w:r><w:rPr><w:rFonts w:ascii="Consolas" w:hAnsi="Consolas" w:eastAsia="Consolas" w:cs="Consolas"/><w:sz w:val="17"/><w:szCs w:val="17"/></w:rPr><w:t xml:space="preserve">│ PK : id                │                           │ PK : id      │ │ PK : id      │</w:t></w:r></w:p><w:p><w:pPr><w:jc w:val="center"/><w:spacing w:after="60"/></w:pPr><w:r><w:rPr><w:rFonts w:ascii="Consolas" w:hAnsi="Consolas" w:eastAsia="Consolas" w:cs="Consolas"/><w:sz w:val="17"/><w:szCs w:val="17"/></w:rPr><w:t xml:space="preserve">│ FK : personel_id       │                           │ FK : user_id │ │ FK:created_by│</w:t></w:r></w:p><w:p><w:pPr><w:jc w:val="center"/><w:spacing w:after="60"/></w:pPr><w:r><w:rPr><w:rFonts w:ascii="Consolas" w:hAnsi="Consolas" w:eastAsia="Consolas" w:cs="Consolas"/><w:sz w:val="17"/><w:szCs w:val="17"/></w:rPr><w:t xml:space="preserve">│ FK : dosir_kode ───────┼───────────┐               │    aktivitas │ │    file_name │</w:t></w:r></w:p><w:p><w:pPr><w:jc w:val="center"/><w:spacing w:after="60"/></w:pPr><w:r><w:rPr><w:rFonts w:ascii="Consolas" w:hAnsi="Consolas" w:eastAsia="Consolas" w:cs="Consolas"/><w:sz w:val="17"/><w:szCs w:val="17"/></w:rPr><w:t xml:space="preserve">│      abjad             │           │               │    ip_address│ │    size_bytes│</w:t></w:r></w:p><w:p><w:pPr><w:jc w:val="center"/><w:spacing w:after="60"/></w:pPr><w:r><w:rPr><w:rFonts w:ascii="Consolas" w:hAnsi="Consolas" w:eastAsia="Consolas" w:cs="Consolas"/><w:sz w:val="17"/><w:szCs w:val="17"/></w:rPr><w:t xml:space="preserve">│      file_name         │           │ N:1           │    created_at│ │    created_at│</w:t></w:r></w:p><w:p><w:pPr><w:jc w:val="center"/><w:spacing w:after="60"/></w:pPr><w:r><w:rPr><w:rFonts w:ascii="Consolas" w:hAnsi="Consolas" w:eastAsia="Consolas" w:cs="Consolas"/><w:sz w:val="17"/><w:szCs w:val="17"/></w:rPr><w:t xml:space="preserve">│      file_path         │           ▼               └──────────────┘ └──────────────┘</w:t></w:r></w:p><w:p><w:pPr><w:jc w:val="center"/><w:spacing w:after="60"/></w:pPr><w:r><w:rPr><w:rFonts w:ascii="Consolas" w:hAnsi="Consolas" w:eastAsia="Consolas" w:cs="Consolas"/><w:sz w:val="17"/><w:szCs w:val="17"/></w:rPr><w:t xml:space="preserve">│      raw_file_path     │ ┌───────────────────┐     ┌──────────────┐</w:t></w:r></w:p><w:p><w:pPr><w:jc w:val="center"/><w:spacing w:after="60"/></w:pPr><w:r><w:rPr><w:rFonts w:ascii="Consolas" w:hAnsi="Consolas" w:eastAsia="Consolas" w:cs="Consolas"/><w:sz w:val="17"/><w:szCs w:val="17"/></w:rPr><w:t xml:space="preserve">│      status            │ │   DOSIR_MASTER    │     │LOGIN_ATTEMPTS│</w:t></w:r></w:p><w:p><w:pPr><w:jc w:val="center"/><w:spacing w:after="60"/></w:pPr><w:r><w:rPr><w:rFonts w:ascii="Consolas" w:hAnsi="Consolas" w:eastAsia="Consolas" w:cs="Consolas"/><w:sz w:val="17"/><w:szCs w:val="17"/></w:rPr><w:t xml:space="preserve">│      signature_code    │ │───────────────────│     │──────────────│</w:t></w:r></w:p><w:p><w:pPr><w:jc w:val="center"/><w:spacing w:after="60"/></w:pPr><w:r><w:rPr><w:rFonts w:ascii="Consolas" w:hAnsi="Consolas" w:eastAsia="Consolas" w:cs="Consolas"/><w:sz w:val="17"/><w:szCs w:val="17"/></w:rPr><w:t xml:space="preserve">│      signature_hash    │ │ PK : kode (01..33)│     │ PK : id      │</w:t></w:r></w:p><w:p><w:pPr><w:jc w:val="center"/><w:spacing w:after="60"/></w:pPr><w:r><w:rPr><w:rFonts w:ascii="Consolas" w:hAnsi="Consolas" w:eastAsia="Consolas" w:cs="Consolas"/><w:sz w:val="17"/><w:szCs w:val="17"/></w:rPr><w:t xml:space="preserve">│ FK : uploaded_by ──────┼─┼────────────────────────►│    ip_address│</w:t></w:r></w:p><w:p><w:pPr><w:jc w:val="center"/><w:spacing w:after="60"/></w:pPr><w:r><w:rPr><w:rFonts w:ascii="Consolas" w:hAnsi="Consolas" w:eastAsia="Consolas" w:cs="Consolas"/><w:sz w:val="17"/><w:szCs w:val="17"/></w:rPr><w:t xml:space="preserve">│ FK : verified_by ──────┼─┼────────────────────────►│    username  │</w:t></w:r></w:p><w:p><w:pPr><w:jc w:val="center"/><w:spacing w:after="60"/></w:pPr><w:r><w:rPr><w:rFonts w:ascii="Consolas" w:hAnsi="Consolas" w:eastAsia="Consolas" w:cs="Consolas"/><w:sz w:val="17"/><w:szCs w:val="17"/></w:rPr><w:t xml:space="preserve">│      verified_at       │ │      nama_dosir   │     │    attempt   │</w:t></w:r></w:p><w:p><w:pPr><w:jc w:val="center"/><w:spacing w:after="60"/></w:pPr><w:r><w:rPr><w:rFonts w:ascii="Consolas" w:hAnsi="Consolas" w:eastAsia="Consolas" w:cs="Consolas"/><w:sz w:val="17"/><w:szCs w:val="17"/></w:rPr><w:t xml:space="preserve">└────────────────────────┘ │      urutan, wajib│     └──────────────┘</w:t></w:r></w:p><w:p><w:pPr><w:jc w:val="center"/><w:spacing w:after="60"/></w:pPr><w:r><w:rPr><w:rFonts w:ascii="Consolas" w:hAnsi="Consolas" w:eastAsia="Consolas" w:cs="Consolas"/><w:sz w:val="17"/><w:szCs w:val="17"/></w:rPr><w:t xml:space="preserve">                           └───────────────────┘                     </w:t></w:r></w:p></w:tc></w:tr></w:tbl><w:p/><w:p><w:pPr><w:jc w:val="start"/><w:spacing w:after="60"/></w:pPr><w:r><w:rPr><w:rFonts w:ascii="Times New Roman" w:hAnsi="Times New Roman" w:eastAsia="Times New Roman" w:cs="Times New Roman"/><w:sz w:val="24"/><w:szCs w:val="24"/><w:b w:val="1"/><w:bCs w:val="1"/></w:rPr><w:t xml:space="preserve">Penjelasan Kardinalitas Relasi Antar Tabel :</w:t></w:r></w:p><w:p><w:pPr><w:jc w:val="both"/><w:spacing w:after="80" w:line="276" w:lineRule="auto"/></w:pPr><w:r><w:rPr><w:rFonts w:ascii="Times New Roman" w:hAnsi="Times New Roman" w:eastAsia="Times New Roman" w:cs="Times New Roman"/><w:sz w:val="23"/><w:szCs w:val="23"/></w:rPr><w:t xml:space="preserve">1.   Tabel "personel" berelasi Satu ke Satu (1:1) dengan tabel "users" melalui foreign key `users.personel_id` dengan konstrain UNIQUE. Setiap personel memiliki satu akun login resmi.</w:t></w:r></w:p><w:p><w:pPr><w:jc w:val="both"/><w:spacing w:after="80" w:line="276" w:lineRule="auto"/></w:pPr><w:r><w:rPr><w:rFonts w:ascii="Times New Roman" w:hAnsi="Times New Roman" w:eastAsia="Times New Roman" w:cs="Times New Roman"/><w:sz w:val="23"/><w:szCs w:val="23"/></w:rPr><w:t xml:space="preserve">2.   Tabel "personel" berelasi Satu ke Banyak (1:N) dengan tabel "dosir_files" melalui foreign key `dosir_files.personel_id` dengan kaskade ON DELETE CASCADE.</w:t></w:r></w:p><w:p><w:pPr><w:jc w:val="both"/><w:spacing w:after="80" w:line="276" w:lineRule="auto"/></w:pPr><w:r><w:rPr><w:rFonts w:ascii="Times New Roman" w:hAnsi="Times New Roman" w:eastAsia="Times New Roman" w:cs="Times New Roman"/><w:sz w:val="23"/><w:szCs w:val="23"/></w:rPr><w:t xml:space="preserve">3.   Tabel "dosir_master" berelasi Satu ke Banyak (1:N) dengan tabel "dosir_files" melalui foreign key `dosir_files.dosir_kode` dengan ON UPDATE CASCADE ON DELETE RESTRICT.</w:t></w:r></w:p><w:p><w:pPr><w:jc w:val="both"/><w:spacing w:after="80" w:line="276" w:lineRule="auto"/></w:pPr><w:r><w:rPr><w:rFonts w:ascii="Times New Roman" w:hAnsi="Times New Roman" w:eastAsia="Times New Roman" w:cs="Times New Roman"/><w:sz w:val="23"/><w:szCs w:val="23"/></w:rPr><w:t xml:space="preserve">4.   Tabel "users" berelasi Satu ke Banyak (1:N) dengan tabel "dosir_files" sebagai pengunggah (`dosir_files.uploaded_by`) dan sebagai verifikator TTE (`dosir_files.verified_by`).</w:t></w:r></w:p><w:p><w:pPr><w:jc w:val="both"/><w:spacing w:after="80" w:line="276" w:lineRule="auto"/></w:pPr><w:r><w:rPr><w:rFonts w:ascii="Times New Roman" w:hAnsi="Times New Roman" w:eastAsia="Times New Roman" w:cs="Times New Roman"/><w:sz w:val="23"/><w:szCs w:val="23"/></w:rPr><w:t xml:space="preserve">5.   Tabel "users" berelasi Satu ke Banyak (1:N) dengan tabel "activity_log" (`activity_log.user_id`) untuk merekam seluruh tindakan audit trail pengguna.</w:t></w:r></w:p><w:p><w:pPr><w:jc w:val="both"/><w:spacing w:after="80" w:line="276" w:lineRule="auto"/></w:pPr><w:r><w:rPr><w:rFonts w:ascii="Times New Roman" w:hAnsi="Times New Roman" w:eastAsia="Times New Roman" w:cs="Times New Roman"/><w:sz w:val="23"/><w:szCs w:val="23"/></w:rPr><w:t xml:space="preserve">6.   Tabel "users" berelasi Satu ke Banyak (1:N) dengan tabel "backup_log" (`backup_log.created_by`) untuk mencatat pembuat cadangan data.</w:t></w:r></w:p><w:p><w:pPr><w:jc w:val="both"/><w:spacing w:after="80" w:line="276" w:lineRule="auto"/></w:pPr><w:r><w:rPr><w:rFonts w:ascii="Times New Roman" w:hAnsi="Times New Roman" w:eastAsia="Times New Roman" w:cs="Times New Roman"/><w:sz w:val="23"/><w:szCs w:val="23"/></w:rPr><w:t xml:space="preserve">7.   Tabel "settings" dan "login_attempts" beroperasi sebagai tabel penunjang sistem keamanan dan parameter operasional global.</w:t></w:r></w:p><w:p><w:r><w:br w:type="page"/></w:r></w:p><w:p><w:pPr><w:jc w:val="start"/><w:spacing w:after="60"/></w:pPr><w:r><w:rPr><w:rFonts w:ascii="Times New Roman" w:hAnsi="Times New Roman" w:eastAsia="Times New Roman" w:cs="Times New Roman"/><w:sz w:val="24"/><w:szCs w:val="24"/><w:b w:val="1"/><w:bCs w:val="1"/></w:rPr><w:t xml:space="preserve">13.  Kamus Data / Struktur File.</w:t></w:r></w:p><w:p><w:pPr><w:jc w:val="both"/><w:spacing w:after="80" w:line="276" w:lineRule="auto"/></w:pPr><w:r><w:rPr><w:rFonts w:ascii="Times New Roman" w:hAnsi="Times New Roman" w:eastAsia="Times New Roman" w:cs="Times New Roman"/><w:sz w:val="23"/><w:szCs w:val="23"/></w:rPr><w:t xml:space="preserve">Kamus data memberikan spesifikasi teknis terperinci mengenai struktur tabel pangkalan data (MySQL), meliputi nama medan (field), uraian sebutan, tipe data, lebar/panjang memori, serta keterangan integritas kunci (Primary Key / Foreign Key).</w:t></w:r></w:p><w:p/><w:p><w:pPr><w:spacing w:after="40"/></w:pPr><w:r><w:rPr><w:rFonts w:ascii="Times New Roman" w:hAnsi="Times New Roman" w:eastAsia="Times New Roman" w:cs="Times New Roman"/><w:sz w:val="22"/><w:szCs w:val="22"/><w:b w:val="1"/><w:bCs w:val="1"/></w:rPr><w:t xml:space="preserve">a.   Struktur File / Tabel: PERSONEL (Data Induk Prajurit & PNS)</w:t></w:r></w:p><w:tbl><w:tblGrid><w:gridCol w:w="500" w:type="dxa"/><w:gridCol w:w="2200" w:type="dxa"/><w:gridCol w:w="3000" w:type="dxa"/><w:gridCol w:w="1300" w:type="dxa"/><w:gridCol w:w="1100" w:type="dxa"/><w:gridCol w:w="1100" w:type="dxa"/></w:tblGrid><w:tblPr><w:tblStyle w:val="MilitaryTable"/></w:tblPr><w:tr><w:trPr/><w:tc><w:tcPr><w:tcW w:w="500" w:type="dxa"/><w:shd w:val="clear" w:fill="EAEAEA"/><w:noWrap/></w:tcPr><w:p><w:pPr><w:jc w:val="center"/></w:pPr><w:r><w:rPr><w:rFonts w:ascii="Times New Roman" w:hAnsi="Times New Roman" w:eastAsia="Times New Roman" w:cs="Times New Roman"/><w:sz w:val="20"/><w:szCs w:val="20"/><w:b w:val="1"/><w:bCs w:val="1"/></w:rPr><w:t xml:space="preserve">No</w:t></w:r></w:p></w:tc><w:tc><w:tcPr><w:tcW w:w="2200" w:type="dxa"/><w:shd w:val="clear" w:fill="EAEAEA"/><w:noWrap/></w:tcPr><w:p><w:pPr><w:jc w:val="center"/></w:pPr><w:r><w:rPr><w:rFonts w:ascii="Times New Roman" w:hAnsi="Times New Roman" w:eastAsia="Times New Roman" w:cs="Times New Roman"/><w:sz w:val="20"/><w:szCs w:val="20"/><w:b w:val="1"/><w:bCs w:val="1"/></w:rPr><w:t xml:space="preserve">Nama Field</w:t></w:r></w:p></w:tc><w:tc><w:tcPr><w:tcW w:w="3000" w:type="dxa"/><w:shd w:val="clear" w:fill="EAEAEA"/><w:noWrap/></w:tcPr><w:p><w:pPr><w:jc w:val="center"/></w:pPr><w:r><w:rPr><w:rFonts w:ascii="Times New Roman" w:hAnsi="Times New Roman" w:eastAsia="Times New Roman" w:cs="Times New Roman"/><w:sz w:val="20"/><w:szCs w:val="20"/><w:b w:val="1"/><w:bCs w:val="1"/></w:rPr><w:t xml:space="preserve">Uraian / Sebutan</w:t></w:r></w:p></w:tc><w:tc><w:tcPr><w:tcW w:w="1300" w:type="dxa"/><w:shd w:val="clear" w:fill="EAEAEA"/><w:noWrap/></w:tcPr><w:p><w:pPr><w:jc w:val="center"/></w:pPr><w:r><w:rPr><w:rFonts w:ascii="Times New Roman" w:hAnsi="Times New Roman" w:eastAsia="Times New Roman" w:cs="Times New Roman"/><w:sz w:val="20"/><w:szCs w:val="20"/><w:b w:val="1"/><w:bCs w:val="1"/></w:rPr><w:t xml:space="preserve">Type</w:t></w:r></w:p></w:tc><w:tc><w:tcPr><w:tcW w:w="1100" w:type="dxa"/><w:shd w:val="clear" w:fill="EAEAEA"/><w:noWrap/></w:tcPr><w:p><w:pPr><w:jc w:val="center"/></w:pPr><w:r><w:rPr><w:rFonts w:ascii="Times New Roman" w:hAnsi="Times New Roman" w:eastAsia="Times New Roman" w:cs="Times New Roman"/><w:sz w:val="20"/><w:szCs w:val="20"/><w:b w:val="1"/><w:bCs w:val="1"/></w:rPr><w:t xml:space="preserve">Lebar</w:t></w:r></w:p></w:tc><w:tc><w:tcPr><w:tcW w:w="1100" w:type="dxa"/><w:shd w:val="clear" w:fill="EAEAEA"/><w:noWrap/></w:tcPr><w:p><w:pPr><w:jc w:val="center"/></w:pPr><w:r><w:rPr><w:rFonts w:ascii="Times New Roman" w:hAnsi="Times New Roman" w:eastAsia="Times New Roman" w:cs="Times New Roman"/><w:sz w:val="20"/><w:szCs w:val="20"/><w:b w:val="1"/><w:bCs w:val="1"/></w:rPr><w:t xml:space="preserve">Ket</w:t></w:r></w:p></w:tc></w:tr><w:tr><w:trPr/><w:tc><w:tcPr><w:tcW w:w="500" w:type="dxa"/><w:noWrap/></w:tcPr><w:p><w:pPr><w:jc w:val="center"/></w:pPr><w:r><w:rPr><w:rFonts w:ascii="Times New Roman" w:hAnsi="Times New Roman" w:eastAsia="Times New Roman" w:cs="Times New Roman"/><w:sz w:val="19"/><w:szCs w:val="19"/></w:rPr><w:t xml:space="preserve">1</w:t></w:r></w:p></w:tc><w:tc><w:tcPr><w:tcW w:w="2200" w:type="dxa"/><w:noWrap/></w:tcPr><w:p><w:pPr><w:jc w:val="start"/></w:pPr><w:r><w:rPr><w:rFonts w:ascii="Times New Roman" w:hAnsi="Times New Roman" w:eastAsia="Times New Roman" w:cs="Times New Roman"/><w:sz w:val="19"/><w:szCs w:val="19"/><w:b w:val="1"/><w:bCs w:val="1"/></w:rPr><w:t xml:space="preserve">id</w:t></w:r></w:p></w:tc><w:tc><w:tcPr><w:tcW w:w="3000" w:type="dxa"/><w:noWrap/></w:tcPr><w:p><w:pPr><w:jc w:val="start"/></w:pPr><w:r><w:rPr><w:rFonts w:ascii="Times New Roman" w:hAnsi="Times New Roman" w:eastAsia="Times New Roman" w:cs="Times New Roman"/><w:sz w:val="19"/><w:szCs w:val="19"/></w:rPr><w:t xml:space="preserve">Nomor Urut Indeks Unik</w:t></w:r></w:p></w:tc><w:tc><w:tcPr><w:tcW w:w="1300" w:type="dxa"/><w:noWrap/></w:tcPr><w:p><w:pPr><w:jc w:val="center"/></w:pPr><w:r><w:rPr><w:rFonts w:ascii="Times New Roman" w:hAnsi="Times New Roman" w:eastAsia="Times New Roman" w:cs="Times New Roman"/><w:sz w:val="19"/><w:szCs w:val="19"/></w:rPr><w:t xml:space="preserve">INT</w:t></w:r></w:p></w:tc><w:tc><w:tcPr><w:tcW w:w="1100" w:type="dxa"/><w:noWrap/></w:tcPr><w:p><w:pPr><w:jc w:val="center"/></w:pPr><w:r><w:rPr><w:rFonts w:ascii="Times New Roman" w:hAnsi="Times New Roman" w:eastAsia="Times New Roman" w:cs="Times New Roman"/><w:sz w:val="19"/><w:szCs w:val="19"/></w:rPr><w:t xml:space="preserve">11</w:t></w:r></w:p></w:tc><w:tc><w:tcPr><w:tcW w:w="1100" w:type="dxa"/><w:noWrap/></w:tcPr><w:p><w:pPr><w:jc w:val="center"/></w:pPr><w:r><w:rPr><w:rFonts w:ascii="Times New Roman" w:hAnsi="Times New Roman" w:eastAsia="Times New Roman" w:cs="Times New Roman"/><w:sz w:val="19"/><w:szCs w:val="19"/></w:rPr><w:t xml:space="preserve">PK, Auto</w:t></w:r></w:p></w:tc></w:tr><w:tr><w:trPr/><w:tc><w:tcPr><w:tcW w:w="500" w:type="dxa"/><w:noWrap/></w:tcPr><w:p><w:pPr><w:jc w:val="center"/></w:pPr><w:r><w:rPr><w:rFonts w:ascii="Times New Roman" w:hAnsi="Times New Roman" w:eastAsia="Times New Roman" w:cs="Times New Roman"/><w:sz w:val="19"/><w:szCs w:val="19"/></w:rPr><w:t xml:space="preserve">2</w:t></w:r></w:p></w:tc><w:tc><w:tcPr><w:tcW w:w="2200" w:type="dxa"/><w:noWrap/></w:tcPr><w:p><w:pPr><w:jc w:val="start"/></w:pPr><w:r><w:rPr><w:rFonts w:ascii="Times New Roman" w:hAnsi="Times New Roman" w:eastAsia="Times New Roman" w:cs="Times New Roman"/><w:sz w:val="19"/><w:szCs w:val="19"/><w:b w:val="1"/><w:bCs w:val="1"/></w:rPr><w:t xml:space="preserve">nrp</w:t></w:r></w:p></w:tc><w:tc><w:tcPr><w:tcW w:w="3000" w:type="dxa"/><w:noWrap/></w:tcPr><w:p><w:pPr><w:jc w:val="start"/></w:pPr><w:r><w:rPr><w:rFonts w:ascii="Times New Roman" w:hAnsi="Times New Roman" w:eastAsia="Times New Roman" w:cs="Times New Roman"/><w:sz w:val="19"/><w:szCs w:val="19"/></w:rPr><w:t xml:space="preserve">Nomor Registrasi Pokok / NIP</w:t></w:r></w:p></w:tc><w:tc><w:tcPr><w:tcW w:w="1300" w:type="dxa"/><w:noWrap/></w:tcPr><w:p><w:pPr><w:jc w:val="center"/></w:pPr><w:r><w:rPr><w:rFonts w:ascii="Times New Roman" w:hAnsi="Times New Roman" w:eastAsia="Times New Roman" w:cs="Times New Roman"/><w:sz w:val="19"/><w:szCs w:val="19"/></w:rPr><w:t xml:space="preserve">VARCHAR</w:t></w:r></w:p></w:tc><w:tc><w:tcPr><w:tcW w:w="1100" w:type="dxa"/><w:noWrap/></w:tcPr><w:p><w:pPr><w:jc w:val="center"/></w:pPr><w:r><w:rPr><w:rFonts w:ascii="Times New Roman" w:hAnsi="Times New Roman" w:eastAsia="Times New Roman" w:cs="Times New Roman"/><w:sz w:val="19"/><w:szCs w:val="19"/></w:rPr><w:t xml:space="preserve">20</w:t></w:r></w:p></w:tc><w:tc><w:tcPr><w:tcW w:w="1100" w:type="dxa"/><w:noWrap/></w:tcPr><w:p><w:pPr><w:jc w:val="center"/></w:pPr><w:r><w:rPr><w:rFonts w:ascii="Times New Roman" w:hAnsi="Times New Roman" w:eastAsia="Times New Roman" w:cs="Times New Roman"/><w:sz w:val="19"/><w:szCs w:val="19"/></w:rPr><w:t xml:space="preserve">UNIQUE</w:t></w:r></w:p></w:tc></w:tr><w:tr><w:trPr/><w:tc><w:tcPr><w:tcW w:w="500" w:type="dxa"/><w:noWrap/></w:tcPr><w:p><w:pPr><w:jc w:val="center"/></w:pPr><w:r><w:rPr><w:rFonts w:ascii="Times New Roman" w:hAnsi="Times New Roman" w:eastAsia="Times New Roman" w:cs="Times New Roman"/><w:sz w:val="19"/><w:szCs w:val="19"/></w:rPr><w:t xml:space="preserve">3</w:t></w:r></w:p></w:tc><w:tc><w:tcPr><w:tcW w:w="2200" w:type="dxa"/><w:noWrap/></w:tcPr><w:p><w:pPr><w:jc w:val="start"/></w:pPr><w:r><w:rPr><w:rFonts w:ascii="Times New Roman" w:hAnsi="Times New Roman" w:eastAsia="Times New Roman" w:cs="Times New Roman"/><w:sz w:val="19"/><w:szCs w:val="19"/><w:b w:val="1"/><w:bCs w:val="1"/></w:rPr><w:t xml:space="preserve">nama</w:t></w:r></w:p></w:tc><w:tc><w:tcPr><w:tcW w:w="3000" w:type="dxa"/><w:noWrap/></w:tcPr><w:p><w:pPr><w:jc w:val="start"/></w:pPr><w:r><w:rPr><w:rFonts w:ascii="Times New Roman" w:hAnsi="Times New Roman" w:eastAsia="Times New Roman" w:cs="Times New Roman"/><w:sz w:val="19"/><w:szCs w:val="19"/></w:rPr><w:t xml:space="preserve">Nama Lengkap Prajurit / PNS</w:t></w:r></w:p></w:tc><w:tc><w:tcPr><w:tcW w:w="1300" w:type="dxa"/><w:noWrap/></w:tcPr><w:p><w:pPr><w:jc w:val="center"/></w:pPr><w:r><w:rPr><w:rFonts w:ascii="Times New Roman" w:hAnsi="Times New Roman" w:eastAsia="Times New Roman" w:cs="Times New Roman"/><w:sz w:val="19"/><w:szCs w:val="19"/></w:rPr><w:t xml:space="preserve">VARCHAR</w:t></w:r></w:p></w:tc><w:tc><w:tcPr><w:tcW w:w="1100" w:type="dxa"/><w:noWrap/></w:tcPr><w:p><w:pPr><w:jc w:val="center"/></w:pPr><w:r><w:rPr><w:rFonts w:ascii="Times New Roman" w:hAnsi="Times New Roman" w:eastAsia="Times New Roman" w:cs="Times New Roman"/><w:sz w:val="19"/><w:szCs w:val="19"/></w:rPr><w:t xml:space="preserve">120</w:t></w:r></w:p></w:tc><w:tc><w:tcPr><w:tcW w:w="1100" w:type="dxa"/><w:noWrap/></w:tcPr><w:p><w:pPr><w:jc w:val="center"/></w:pPr><w:r><w:rPr><w:rFonts w:ascii="Times New Roman" w:hAnsi="Times New Roman" w:eastAsia="Times New Roman" w:cs="Times New Roman"/><w:sz w:val="19"/><w:szCs w:val="19"/></w:rPr><w:t xml:space="preserve">Not Null</w:t></w:r></w:p></w:tc></w:tr><w:tr><w:trPr/><w:tc><w:tcPr><w:tcW w:w="500" w:type="dxa"/><w:noWrap/></w:tcPr><w:p><w:pPr><w:jc w:val="center"/></w:pPr><w:r><w:rPr><w:rFonts w:ascii="Times New Roman" w:hAnsi="Times New Roman" w:eastAsia="Times New Roman" w:cs="Times New Roman"/><w:sz w:val="19"/><w:szCs w:val="19"/></w:rPr><w:t xml:space="preserve">4</w:t></w:r></w:p></w:tc><w:tc><w:tcPr><w:tcW w:w="2200" w:type="dxa"/><w:noWrap/></w:tcPr><w:p><w:pPr><w:jc w:val="start"/></w:pPr><w:r><w:rPr><w:rFonts w:ascii="Times New Roman" w:hAnsi="Times New Roman" w:eastAsia="Times New Roman" w:cs="Times New Roman"/><w:sz w:val="19"/><w:szCs w:val="19"/><w:b w:val="1"/><w:bCs w:val="1"/></w:rPr><w:t xml:space="preserve">golongan</w:t></w:r></w:p></w:tc><w:tc><w:tcPr><w:tcW w:w="3000" w:type="dxa"/><w:noWrap/></w:tcPr><w:p><w:pPr><w:jc w:val="start"/></w:pPr><w:r><w:rPr><w:rFonts w:ascii="Times New Roman" w:hAnsi="Times New Roman" w:eastAsia="Times New Roman" w:cs="Times New Roman"/><w:sz w:val="19"/><w:szCs w:val="19"/></w:rPr><w:t xml:space="preserve">Golongan (Perwira/Bintara/Tamtama/PNS)</w:t></w:r></w:p></w:tc><w:tc><w:tcPr><w:tcW w:w="1300" w:type="dxa"/><w:noWrap/></w:tcPr><w:p><w:pPr><w:jc w:val="center"/></w:pPr><w:r><w:rPr><w:rFonts w:ascii="Times New Roman" w:hAnsi="Times New Roman" w:eastAsia="Times New Roman" w:cs="Times New Roman"/><w:sz w:val="19"/><w:szCs w:val="19"/></w:rPr><w:t xml:space="preserve">ENUM</w:t></w:r></w:p></w:tc><w:tc><w:tcPr><w:tcW w:w="1100" w:type="dxa"/><w:noWrap/></w:tcPr><w:p><w:pPr><w:jc w:val="center"/></w:pPr><w:r><w:rPr><w:rFonts w:ascii="Times New Roman" w:hAnsi="Times New Roman" w:eastAsia="Times New Roman" w:cs="Times New Roman"/><w:sz w:val="19"/><w:szCs w:val="19"/></w:rPr><w:t xml:space="preserve">15</w:t></w:r></w:p></w:tc><w:tc><w:tcPr><w:tcW w:w="1100" w:type="dxa"/><w:noWrap/></w:tcPr><w:p><w:pPr><w:jc w:val="center"/></w:pPr><w:r><w:rPr><w:rFonts w:ascii="Times New Roman" w:hAnsi="Times New Roman" w:eastAsia="Times New Roman" w:cs="Times New Roman"/><w:sz w:val="19"/><w:szCs w:val="19"/></w:rPr><w:t xml:space="preserve">Not Null</w:t></w:r></w:p></w:tc></w:tr><w:tr><w:trPr/><w:tc><w:tcPr><w:tcW w:w="500" w:type="dxa"/><w:noWrap/></w:tcPr><w:p><w:pPr><w:jc w:val="center"/></w:pPr><w:r><w:rPr><w:rFonts w:ascii="Times New Roman" w:hAnsi="Times New Roman" w:eastAsia="Times New Roman" w:cs="Times New Roman"/><w:sz w:val="19"/><w:szCs w:val="19"/></w:rPr><w:t xml:space="preserve">5</w:t></w:r></w:p></w:tc><w:tc><w:tcPr><w:tcW w:w="2200" w:type="dxa"/><w:noWrap/></w:tcPr><w:p><w:pPr><w:jc w:val="start"/></w:pPr><w:r><w:rPr><w:rFonts w:ascii="Times New Roman" w:hAnsi="Times New Roman" w:eastAsia="Times New Roman" w:cs="Times New Roman"/><w:sz w:val="19"/><w:szCs w:val="19"/><w:b w:val="1"/><w:bCs w:val="1"/></w:rPr><w:t xml:space="preserve">pangkat</w:t></w:r></w:p></w:tc><w:tc><w:tcPr><w:tcW w:w="3000" w:type="dxa"/><w:noWrap/></w:tcPr><w:p><w:pPr><w:jc w:val="start"/></w:pPr><w:r><w:rPr><w:rFonts w:ascii="Times New Roman" w:hAnsi="Times New Roman" w:eastAsia="Times New Roman" w:cs="Times New Roman"/><w:sz w:val="19"/><w:szCs w:val="19"/></w:rPr><w:t xml:space="preserve">Pangkat Terkini</w:t></w:r></w:p></w:tc><w:tc><w:tcPr><w:tcW w:w="1300" w:type="dxa"/><w:noWrap/></w:tcPr><w:p><w:pPr><w:jc w:val="center"/></w:pPr><w:r><w:rPr><w:rFonts w:ascii="Times New Roman" w:hAnsi="Times New Roman" w:eastAsia="Times New Roman" w:cs="Times New Roman"/><w:sz w:val="19"/><w:szCs w:val="19"/></w:rPr><w:t xml:space="preserve">VARCHAR</w:t></w:r></w:p></w:tc><w:tc><w:tcPr><w:tcW w:w="1100" w:type="dxa"/><w:noWrap/></w:tcPr><w:p><w:pPr><w:jc w:val="center"/></w:pPr><w:r><w:rPr><w:rFonts w:ascii="Times New Roman" w:hAnsi="Times New Roman" w:eastAsia="Times New Roman" w:cs="Times New Roman"/><w:sz w:val="19"/><w:szCs w:val="19"/></w:rPr><w:t xml:space="preserve">50</w:t></w:r></w:p></w:tc><w:tc><w:tcPr><w:tcW w:w="1100" w:type="dxa"/><w:noWrap/></w:tcPr><w:p><w:pPr><w:jc w:val="center"/></w:pPr><w:r><w:rPr><w:rFonts w:ascii="Times New Roman" w:hAnsi="Times New Roman" w:eastAsia="Times New Roman" w:cs="Times New Roman"/><w:sz w:val="19"/><w:szCs w:val="19"/></w:rPr><w:t xml:space="preserve">Nullable</w:t></w:r></w:p></w:tc></w:tr><w:tr><w:trPr/><w:tc><w:tcPr><w:tcW w:w="500" w:type="dxa"/><w:noWrap/></w:tcPr><w:p><w:pPr><w:jc w:val="center"/></w:pPr><w:r><w:rPr><w:rFonts w:ascii="Times New Roman" w:hAnsi="Times New Roman" w:eastAsia="Times New Roman" w:cs="Times New Roman"/><w:sz w:val="19"/><w:szCs w:val="19"/></w:rPr><w:t xml:space="preserve">6</w:t></w:r></w:p></w:tc><w:tc><w:tcPr><w:tcW w:w="2200" w:type="dxa"/><w:noWrap/></w:tcPr><w:p><w:pPr><w:jc w:val="start"/></w:pPr><w:r><w:rPr><w:rFonts w:ascii="Times New Roman" w:hAnsi="Times New Roman" w:eastAsia="Times New Roman" w:cs="Times New Roman"/><w:sz w:val="19"/><w:szCs w:val="19"/><w:b w:val="1"/><w:bCs w:val="1"/></w:rPr><w:t xml:space="preserve">korp</w:t></w:r></w:p></w:tc><w:tc><w:tcPr><w:tcW w:w="3000" w:type="dxa"/><w:noWrap/></w:tcPr><w:p><w:pPr><w:jc w:val="start"/></w:pPr><w:r><w:rPr><w:rFonts w:ascii="Times New Roman" w:hAnsi="Times New Roman" w:eastAsia="Times New Roman" w:cs="Times New Roman"/><w:sz w:val="19"/><w:szCs w:val="19"/></w:rPr><w:t xml:space="preserve">Korps Kecabangan (Czi, Inf, Kav, dll)</w:t></w:r></w:p></w:tc><w:tc><w:tcPr><w:tcW w:w="1300" w:type="dxa"/><w:noWrap/></w:tcPr><w:p><w:pPr><w:jc w:val="center"/></w:pPr><w:r><w:rPr><w:rFonts w:ascii="Times New Roman" w:hAnsi="Times New Roman" w:eastAsia="Times New Roman" w:cs="Times New Roman"/><w:sz w:val="19"/><w:szCs w:val="19"/></w:rPr><w:t xml:space="preserve">VARCHAR</w:t></w:r></w:p></w:tc><w:tc><w:tcPr><w:tcW w:w="1100" w:type="dxa"/><w:noWrap/></w:tcPr><w:p><w:pPr><w:jc w:val="center"/></w:pPr><w:r><w:rPr><w:rFonts w:ascii="Times New Roman" w:hAnsi="Times New Roman" w:eastAsia="Times New Roman" w:cs="Times New Roman"/><w:sz w:val="19"/><w:szCs w:val="19"/></w:rPr><w:t xml:space="preserve">50</w:t></w:r></w:p></w:tc><w:tc><w:tcPr><w:tcW w:w="1100" w:type="dxa"/><w:noWrap/></w:tcPr><w:p><w:pPr><w:jc w:val="center"/></w:pPr><w:r><w:rPr><w:rFonts w:ascii="Times New Roman" w:hAnsi="Times New Roman" w:eastAsia="Times New Roman" w:cs="Times New Roman"/><w:sz w:val="19"/><w:szCs w:val="19"/></w:rPr><w:t xml:space="preserve">Nullable</w:t></w:r></w:p></w:tc></w:tr><w:tr><w:trPr/><w:tc><w:tcPr><w:tcW w:w="500" w:type="dxa"/><w:noWrap/></w:tcPr><w:p><w:pPr><w:jc w:val="center"/></w:pPr><w:r><w:rPr><w:rFonts w:ascii="Times New Roman" w:hAnsi="Times New Roman" w:eastAsia="Times New Roman" w:cs="Times New Roman"/><w:sz w:val="19"/><w:szCs w:val="19"/></w:rPr><w:t xml:space="preserve">7</w:t></w:r></w:p></w:tc><w:tc><w:tcPr><w:tcW w:w="2200" w:type="dxa"/><w:noWrap/></w:tcPr><w:p><w:pPr><w:jc w:val="start"/></w:pPr><w:r><w:rPr><w:rFonts w:ascii="Times New Roman" w:hAnsi="Times New Roman" w:eastAsia="Times New Roman" w:cs="Times New Roman"/><w:sz w:val="19"/><w:szCs w:val="19"/><w:b w:val="1"/><w:bCs w:val="1"/></w:rPr><w:t xml:space="preserve">satuan</w:t></w:r></w:p></w:tc><w:tc><w:tcPr><w:tcW w:w="3000" w:type="dxa"/><w:noWrap/></w:tcPr><w:p><w:pPr><w:jc w:val="start"/></w:pPr><w:r><w:rPr><w:rFonts w:ascii="Times New Roman" w:hAnsi="Times New Roman" w:eastAsia="Times New Roman" w:cs="Times New Roman"/><w:sz w:val="19"/><w:szCs w:val="19"/></w:rPr><w:t xml:space="preserve">Nama Satuan Kerja Saat Ini</w:t></w:r></w:p></w:tc><w:tc><w:tcPr><w:tcW w:w="1300" w:type="dxa"/><w:noWrap/></w:tcPr><w:p><w:pPr><w:jc w:val="center"/></w:pPr><w:r><w:rPr><w:rFonts w:ascii="Times New Roman" w:hAnsi="Times New Roman" w:eastAsia="Times New Roman" w:cs="Times New Roman"/><w:sz w:val="19"/><w:szCs w:val="19"/></w:rPr><w:t xml:space="preserve">VARCHAR</w:t></w:r></w:p></w:tc><w:tc><w:tcPr><w:tcW w:w="1100" w:type="dxa"/><w:noWrap/></w:tcPr><w:p><w:pPr><w:jc w:val="center"/></w:pPr><w:r><w:rPr><w:rFonts w:ascii="Times New Roman" w:hAnsi="Times New Roman" w:eastAsia="Times New Roman" w:cs="Times New Roman"/><w:sz w:val="19"/><w:szCs w:val="19"/></w:rPr><w:t xml:space="preserve">150</w:t></w:r></w:p></w:tc><w:tc><w:tcPr><w:tcW w:w="1100" w:type="dxa"/><w:noWrap/></w:tcPr><w:p><w:pPr><w:jc w:val="center"/></w:pPr><w:r><w:rPr><w:rFonts w:ascii="Times New Roman" w:hAnsi="Times New Roman" w:eastAsia="Times New Roman" w:cs="Times New Roman"/><w:sz w:val="19"/><w:szCs w:val="19"/></w:rPr><w:t xml:space="preserve">Nullable</w:t></w:r></w:p></w:tc></w:tr><w:tr><w:trPr/><w:tc><w:tcPr><w:tcW w:w="500" w:type="dxa"/><w:noWrap/></w:tcPr><w:p><w:pPr><w:jc w:val="center"/></w:pPr><w:r><w:rPr><w:rFonts w:ascii="Times New Roman" w:hAnsi="Times New Roman" w:eastAsia="Times New Roman" w:cs="Times New Roman"/><w:sz w:val="19"/><w:szCs w:val="19"/></w:rPr><w:t xml:space="preserve">8</w:t></w:r></w:p></w:tc><w:tc><w:tcPr><w:tcW w:w="2200" w:type="dxa"/><w:noWrap/></w:tcPr><w:p><w:pPr><w:jc w:val="start"/></w:pPr><w:r><w:rPr><w:rFonts w:ascii="Times New Roman" w:hAnsi="Times New Roman" w:eastAsia="Times New Roman" w:cs="Times New Roman"/><w:sz w:val="19"/><w:szCs w:val="19"/><w:b w:val="1"/><w:bCs w:val="1"/></w:rPr><w:t xml:space="preserve">kotama</w:t></w:r></w:p></w:tc><w:tc><w:tcPr><w:tcW w:w="3000" w:type="dxa"/><w:noWrap/></w:tcPr><w:p><w:pPr><w:jc w:val="start"/></w:pPr><w:r><w:rPr><w:rFonts w:ascii="Times New Roman" w:hAnsi="Times New Roman" w:eastAsia="Times New Roman" w:cs="Times New Roman"/><w:sz w:val="19"/><w:szCs w:val="19"/></w:rPr><w:t xml:space="preserve">Komando Utama Pembina (Kodam/Korp)</w:t></w:r></w:p></w:tc><w:tc><w:tcPr><w:tcW w:w="1300" w:type="dxa"/><w:noWrap/></w:tcPr><w:p><w:pPr><w:jc w:val="center"/></w:pPr><w:r><w:rPr><w:rFonts w:ascii="Times New Roman" w:hAnsi="Times New Roman" w:eastAsia="Times New Roman" w:cs="Times New Roman"/><w:sz w:val="19"/><w:szCs w:val="19"/></w:rPr><w:t xml:space="preserve">VARCHAR</w:t></w:r></w:p></w:tc><w:tc><w:tcPr><w:tcW w:w="1100" w:type="dxa"/><w:noWrap/></w:tcPr><w:p><w:pPr><w:jc w:val="center"/></w:pPr><w:r><w:rPr><w:rFonts w:ascii="Times New Roman" w:hAnsi="Times New Roman" w:eastAsia="Times New Roman" w:cs="Times New Roman"/><w:sz w:val="19"/><w:szCs w:val="19"/></w:rPr><w:t xml:space="preserve">150</w:t></w:r></w:p></w:tc><w:tc><w:tcPr><w:tcW w:w="1100" w:type="dxa"/><w:noWrap/></w:tcPr><w:p><w:pPr><w:jc w:val="center"/></w:pPr><w:r><w:rPr><w:rFonts w:ascii="Times New Roman" w:hAnsi="Times New Roman" w:eastAsia="Times New Roman" w:cs="Times New Roman"/><w:sz w:val="19"/><w:szCs w:val="19"/></w:rPr><w:t xml:space="preserve">Nullable</w:t></w:r></w:p></w:tc></w:tr><w:tr><w:trPr/><w:tc><w:tcPr><w:tcW w:w="500" w:type="dxa"/><w:noWrap/></w:tcPr><w:p><w:pPr><w:jc w:val="center"/></w:pPr><w:r><w:rPr><w:rFonts w:ascii="Times New Roman" w:hAnsi="Times New Roman" w:eastAsia="Times New Roman" w:cs="Times New Roman"/><w:sz w:val="19"/><w:szCs w:val="19"/></w:rPr><w:t xml:space="preserve">9</w:t></w:r></w:p></w:tc><w:tc><w:tcPr><w:tcW w:w="2200" w:type="dxa"/><w:noWrap/></w:tcPr><w:p><w:pPr><w:jc w:val="start"/></w:pPr><w:r><w:rPr><w:rFonts w:ascii="Times New Roman" w:hAnsi="Times New Roman" w:eastAsia="Times New Roman" w:cs="Times New Roman"/><w:sz w:val="19"/><w:szCs w:val="19"/><w:b w:val="1"/><w:bCs w:val="1"/></w:rPr><w:t xml:space="preserve">jabatan</w:t></w:r></w:p></w:tc><w:tc><w:tcPr><w:tcW w:w="3000" w:type="dxa"/><w:noWrap/></w:tcPr><w:p><w:pPr><w:jc w:val="start"/></w:pPr><w:r><w:rPr><w:rFonts w:ascii="Times New Roman" w:hAnsi="Times New Roman" w:eastAsia="Times New Roman" w:cs="Times New Roman"/><w:sz w:val="19"/><w:szCs w:val="19"/></w:rPr><w:t xml:space="preserve">Jabatan Dinas yang Diduduki</w:t></w:r></w:p></w:tc><w:tc><w:tcPr><w:tcW w:w="1300" w:type="dxa"/><w:noWrap/></w:tcPr><w:p><w:pPr><w:jc w:val="center"/></w:pPr><w:r><w:rPr><w:rFonts w:ascii="Times New Roman" w:hAnsi="Times New Roman" w:eastAsia="Times New Roman" w:cs="Times New Roman"/><w:sz w:val="19"/><w:szCs w:val="19"/></w:rPr><w:t xml:space="preserve">VARCHAR</w:t></w:r></w:p></w:tc><w:tc><w:tcPr><w:tcW w:w="1100" w:type="dxa"/><w:noWrap/></w:tcPr><w:p><w:pPr><w:jc w:val="center"/></w:pPr><w:r><w:rPr><w:rFonts w:ascii="Times New Roman" w:hAnsi="Times New Roman" w:eastAsia="Times New Roman" w:cs="Times New Roman"/><w:sz w:val="19"/><w:szCs w:val="19"/></w:rPr><w:t xml:space="preserve">150</w:t></w:r></w:p></w:tc><w:tc><w:tcPr><w:tcW w:w="1100" w:type="dxa"/><w:noWrap/></w:tcPr><w:p><w:pPr><w:jc w:val="center"/></w:pPr><w:r><w:rPr><w:rFonts w:ascii="Times New Roman" w:hAnsi="Times New Roman" w:eastAsia="Times New Roman" w:cs="Times New Roman"/><w:sz w:val="19"/><w:szCs w:val="19"/></w:rPr><w:t xml:space="preserve">Nullable</w:t></w:r></w:p></w:tc></w:tr><w:tr><w:trPr/><w:tc><w:tcPr><w:tcW w:w="500" w:type="dxa"/><w:noWrap/></w:tcPr><w:p><w:pPr><w:jc w:val="center"/></w:pPr><w:r><w:rPr><w:rFonts w:ascii="Times New Roman" w:hAnsi="Times New Roman" w:eastAsia="Times New Roman" w:cs="Times New Roman"/><w:sz w:val="19"/><w:szCs w:val="19"/></w:rPr><w:t xml:space="preserve">10</w:t></w:r></w:p></w:tc><w:tc><w:tcPr><w:tcW w:w="2200" w:type="dxa"/><w:noWrap/></w:tcPr><w:p><w:pPr><w:jc w:val="start"/></w:pPr><w:r><w:rPr><w:rFonts w:ascii="Times New Roman" w:hAnsi="Times New Roman" w:eastAsia="Times New Roman" w:cs="Times New Roman"/><w:sz w:val="19"/><w:szCs w:val="19"/><w:b w:val="1"/><w:bCs w:val="1"/></w:rPr><w:t xml:space="preserve">tmt_jabatan</w:t></w:r></w:p></w:tc><w:tc><w:tcPr><w:tcW w:w="3000" w:type="dxa"/><w:noWrap/></w:tcPr><w:p><w:pPr><w:jc w:val="start"/></w:pPr><w:r><w:rPr><w:rFonts w:ascii="Times New Roman" w:hAnsi="Times New Roman" w:eastAsia="Times New Roman" w:cs="Times New Roman"/><w:sz w:val="19"/><w:szCs w:val="19"/></w:rPr><w:t xml:space="preserve">TMT Mulai Menjabat</w:t></w:r></w:p></w:tc><w:tc><w:tcPr><w:tcW w:w="1300" w:type="dxa"/><w:noWrap/></w:tcPr><w:p><w:pPr><w:jc w:val="center"/></w:pPr><w:r><w:rPr><w:rFonts w:ascii="Times New Roman" w:hAnsi="Times New Roman" w:eastAsia="Times New Roman" w:cs="Times New Roman"/><w:sz w:val="19"/><w:szCs w:val="19"/></w:rPr><w:t xml:space="preserve">DATE</w:t></w:r></w:p></w:tc><w:tc><w:tcPr><w:tcW w:w="1100" w:type="dxa"/><w:noWrap/></w:tcPr><w:p><w:pPr><w:jc w:val="center"/></w:pPr><w:r><w:rPr><w:rFonts w:ascii="Times New Roman" w:hAnsi="Times New Roman" w:eastAsia="Times New Roman" w:cs="Times New Roman"/><w:sz w:val="19"/><w:szCs w:val="19"/></w:rPr><w:t xml:space="preserve">10</w:t></w:r></w:p></w:tc><w:tc><w:tcPr><w:tcW w:w="1100" w:type="dxa"/><w:noWrap/></w:tcPr><w:p><w:pPr><w:jc w:val="center"/></w:pPr><w:r><w:rPr><w:rFonts w:ascii="Times New Roman" w:hAnsi="Times New Roman" w:eastAsia="Times New Roman" w:cs="Times New Roman"/><w:sz w:val="19"/><w:szCs w:val="19"/></w:rPr><w:t xml:space="preserve">Nullable</w:t></w:r></w:p></w:tc></w:tr><w:tr><w:trPr/><w:tc><w:tcPr><w:tcW w:w="500" w:type="dxa"/><w:noWrap/></w:tcPr><w:p><w:pPr><w:jc w:val="center"/></w:pPr><w:r><w:rPr><w:rFonts w:ascii="Times New Roman" w:hAnsi="Times New Roman" w:eastAsia="Times New Roman" w:cs="Times New Roman"/><w:sz w:val="19"/><w:szCs w:val="19"/></w:rPr><w:t xml:space="preserve">11</w:t></w:r></w:p></w:tc><w:tc><w:tcPr><w:tcW w:w="2200" w:type="dxa"/><w:noWrap/></w:tcPr><w:p><w:pPr><w:jc w:val="start"/></w:pPr><w:r><w:rPr><w:rFonts w:ascii="Times New Roman" w:hAnsi="Times New Roman" w:eastAsia="Times New Roman" w:cs="Times New Roman"/><w:sz w:val="19"/><w:szCs w:val="19"/><w:b w:val="1"/><w:bCs w:val="1"/></w:rPr><w:t xml:space="preserve">tmt_pangkat</w:t></w:r></w:p></w:tc><w:tc><w:tcPr><w:tcW w:w="3000" w:type="dxa"/><w:noWrap/></w:tcPr><w:p><w:pPr><w:jc w:val="start"/></w:pPr><w:r><w:rPr><w:rFonts w:ascii="Times New Roman" w:hAnsi="Times New Roman" w:eastAsia="Times New Roman" w:cs="Times New Roman"/><w:sz w:val="19"/><w:szCs w:val="19"/></w:rPr><w:t xml:space="preserve">TMT Pangkat Terkini</w:t></w:r></w:p></w:tc><w:tc><w:tcPr><w:tcW w:w="1300" w:type="dxa"/><w:noWrap/></w:tcPr><w:p><w:pPr><w:jc w:val="center"/></w:pPr><w:r><w:rPr><w:rFonts w:ascii="Times New Roman" w:hAnsi="Times New Roman" w:eastAsia="Times New Roman" w:cs="Times New Roman"/><w:sz w:val="19"/><w:szCs w:val="19"/></w:rPr><w:t xml:space="preserve">DATE</w:t></w:r></w:p></w:tc><w:tc><w:tcPr><w:tcW w:w="1100" w:type="dxa"/><w:noWrap/></w:tcPr><w:p><w:pPr><w:jc w:val="center"/></w:pPr><w:r><w:rPr><w:rFonts w:ascii="Times New Roman" w:hAnsi="Times New Roman" w:eastAsia="Times New Roman" w:cs="Times New Roman"/><w:sz w:val="19"/><w:szCs w:val="19"/></w:rPr><w:t xml:space="preserve">10</w:t></w:r></w:p></w:tc><w:tc><w:tcPr><w:tcW w:w="1100" w:type="dxa"/><w:noWrap/></w:tcPr><w:p><w:pPr><w:jc w:val="center"/></w:pPr><w:r><w:rPr><w:rFonts w:ascii="Times New Roman" w:hAnsi="Times New Roman" w:eastAsia="Times New Roman" w:cs="Times New Roman"/><w:sz w:val="19"/><w:szCs w:val="19"/></w:rPr><w:t xml:space="preserve">Nullable</w:t></w:r></w:p></w:tc></w:tr><w:tr><w:trPr/><w:tc><w:tcPr><w:tcW w:w="500" w:type="dxa"/><w:noWrap/></w:tcPr><w:p><w:pPr><w:jc w:val="center"/></w:pPr><w:r><w:rPr><w:rFonts w:ascii="Times New Roman" w:hAnsi="Times New Roman" w:eastAsia="Times New Roman" w:cs="Times New Roman"/><w:sz w:val="19"/><w:szCs w:val="19"/></w:rPr><w:t xml:space="preserve">12</w:t></w:r></w:p></w:tc><w:tc><w:tcPr><w:tcW w:w="2200" w:type="dxa"/><w:noWrap/></w:tcPr><w:p><w:pPr><w:jc w:val="start"/></w:pPr><w:r><w:rPr><w:rFonts w:ascii="Times New Roman" w:hAnsi="Times New Roman" w:eastAsia="Times New Roman" w:cs="Times New Roman"/><w:sz w:val="19"/><w:szCs w:val="19"/><w:b w:val="1"/><w:bCs w:val="1"/></w:rPr><w:t xml:space="preserve">tanggal_lahir</w:t></w:r></w:p></w:tc><w:tc><w:tcPr><w:tcW w:w="3000" w:type="dxa"/><w:noWrap/></w:tcPr><w:p><w:pPr><w:jc w:val="start"/></w:pPr><w:r><w:rPr><w:rFonts w:ascii="Times New Roman" w:hAnsi="Times New Roman" w:eastAsia="Times New Roman" w:cs="Times New Roman"/><w:sz w:val="19"/><w:szCs w:val="19"/></w:rPr><w:t xml:space="preserve">Tanggal Lahir Prajurit</w:t></w:r></w:p></w:tc><w:tc><w:tcPr><w:tcW w:w="1300" w:type="dxa"/><w:noWrap/></w:tcPr><w:p><w:pPr><w:jc w:val="center"/></w:pPr><w:r><w:rPr><w:rFonts w:ascii="Times New Roman" w:hAnsi="Times New Roman" w:eastAsia="Times New Roman" w:cs="Times New Roman"/><w:sz w:val="19"/><w:szCs w:val="19"/></w:rPr><w:t xml:space="preserve">DATE</w:t></w:r></w:p></w:tc><w:tc><w:tcPr><w:tcW w:w="1100" w:type="dxa"/><w:noWrap/></w:tcPr><w:p><w:pPr><w:jc w:val="center"/></w:pPr><w:r><w:rPr><w:rFonts w:ascii="Times New Roman" w:hAnsi="Times New Roman" w:eastAsia="Times New Roman" w:cs="Times New Roman"/><w:sz w:val="19"/><w:szCs w:val="19"/></w:rPr><w:t xml:space="preserve">10</w:t></w:r></w:p></w:tc><w:tc><w:tcPr><w:tcW w:w="1100" w:type="dxa"/><w:noWrap/></w:tcPr><w:p><w:pPr><w:jc w:val="center"/></w:pPr><w:r><w:rPr><w:rFonts w:ascii="Times New Roman" w:hAnsi="Times New Roman" w:eastAsia="Times New Roman" w:cs="Times New Roman"/><w:sz w:val="19"/><w:szCs w:val="19"/></w:rPr><w:t xml:space="preserve">Nullable</w:t></w:r></w:p></w:tc></w:tr><w:tr><w:trPr/><w:tc><w:tcPr><w:tcW w:w="500" w:type="dxa"/><w:noWrap/></w:tcPr><w:p><w:pPr><w:jc w:val="center"/></w:pPr><w:r><w:rPr><w:rFonts w:ascii="Times New Roman" w:hAnsi="Times New Roman" w:eastAsia="Times New Roman" w:cs="Times New Roman"/><w:sz w:val="19"/><w:szCs w:val="19"/></w:rPr><w:t xml:space="preserve">13</w:t></w:r></w:p></w:tc><w:tc><w:tcPr><w:tcW w:w="2200" w:type="dxa"/><w:noWrap/></w:tcPr><w:p><w:pPr><w:jc w:val="start"/></w:pPr><w:r><w:rPr><w:rFonts w:ascii="Times New Roman" w:hAnsi="Times New Roman" w:eastAsia="Times New Roman" w:cs="Times New Roman"/><w:sz w:val="19"/><w:szCs w:val="19"/><w:b w:val="1"/><w:bCs w:val="1"/></w:rPr><w:t xml:space="preserve">tempat_lahir</w:t></w:r></w:p></w:tc><w:tc><w:tcPr><w:tcW w:w="3000" w:type="dxa"/><w:noWrap/></w:tcPr><w:p><w:pPr><w:jc w:val="start"/></w:pPr><w:r><w:rPr><w:rFonts w:ascii="Times New Roman" w:hAnsi="Times New Roman" w:eastAsia="Times New Roman" w:cs="Times New Roman"/><w:sz w:val="19"/><w:szCs w:val="19"/></w:rPr><w:t xml:space="preserve">Tempat / Kota Kelahiran</w:t></w:r></w:p></w:tc><w:tc><w:tcPr><w:tcW w:w="1300" w:type="dxa"/><w:noWrap/></w:tcPr><w:p><w:pPr><w:jc w:val="center"/></w:pPr><w:r><w:rPr><w:rFonts w:ascii="Times New Roman" w:hAnsi="Times New Roman" w:eastAsia="Times New Roman" w:cs="Times New Roman"/><w:sz w:val="19"/><w:szCs w:val="19"/></w:rPr><w:t xml:space="preserve">VARCHAR</w:t></w:r></w:p></w:tc><w:tc><w:tcPr><w:tcW w:w="1100" w:type="dxa"/><w:noWrap/></w:tcPr><w:p><w:pPr><w:jc w:val="center"/></w:pPr><w:r><w:rPr><w:rFonts w:ascii="Times New Roman" w:hAnsi="Times New Roman" w:eastAsia="Times New Roman" w:cs="Times New Roman"/><w:sz w:val="19"/><w:szCs w:val="19"/></w:rPr><w:t xml:space="preserve">100</w:t></w:r></w:p></w:tc><w:tc><w:tcPr><w:tcW w:w="1100" w:type="dxa"/><w:noWrap/></w:tcPr><w:p><w:pPr><w:jc w:val="center"/></w:pPr><w:r><w:rPr><w:rFonts w:ascii="Times New Roman" w:hAnsi="Times New Roman" w:eastAsia="Times New Roman" w:cs="Times New Roman"/><w:sz w:val="19"/><w:szCs w:val="19"/></w:rPr><w:t xml:space="preserve">Nullable</w:t></w:r></w:p></w:tc></w:tr><w:tr><w:trPr/><w:tc><w:tcPr><w:tcW w:w="500" w:type="dxa"/><w:noWrap/></w:tcPr><w:p><w:pPr><w:jc w:val="center"/></w:pPr><w:r><w:rPr><w:rFonts w:ascii="Times New Roman" w:hAnsi="Times New Roman" w:eastAsia="Times New Roman" w:cs="Times New Roman"/><w:sz w:val="19"/><w:szCs w:val="19"/></w:rPr><w:t xml:space="preserve">14</w:t></w:r></w:p></w:tc><w:tc><w:tcPr><w:tcW w:w="2200" w:type="dxa"/><w:noWrap/></w:tcPr><w:p><w:pPr><w:jc w:val="start"/></w:pPr><w:r><w:rPr><w:rFonts w:ascii="Times New Roman" w:hAnsi="Times New Roman" w:eastAsia="Times New Roman" w:cs="Times New Roman"/><w:sz w:val="19"/><w:szCs w:val="19"/><w:b w:val="1"/><w:bCs w:val="1"/></w:rPr><w:t xml:space="preserve">jenis_kelamin</w:t></w:r></w:p></w:tc><w:tc><w:tcPr><w:tcW w:w="3000" w:type="dxa"/><w:noWrap/></w:tcPr><w:p><w:pPr><w:jc w:val="start"/></w:pPr><w:r><w:rPr><w:rFonts w:ascii="Times New Roman" w:hAnsi="Times New Roman" w:eastAsia="Times New Roman" w:cs="Times New Roman"/><w:sz w:val="19"/><w:szCs w:val="19"/></w:rPr><w:t xml:space="preserve">Jenis Kelamin (L / P)</w:t></w:r></w:p></w:tc><w:tc><w:tcPr><w:tcW w:w="1300" w:type="dxa"/><w:noWrap/></w:tcPr><w:p><w:pPr><w:jc w:val="center"/></w:pPr><w:r><w:rPr><w:rFonts w:ascii="Times New Roman" w:hAnsi="Times New Roman" w:eastAsia="Times New Roman" w:cs="Times New Roman"/><w:sz w:val="19"/><w:szCs w:val="19"/></w:rPr><w:t xml:space="preserve">ENUM</w:t></w:r></w:p></w:tc><w:tc><w:tcPr><w:tcW w:w="1100" w:type="dxa"/><w:noWrap/></w:tcPr><w:p><w:pPr><w:jc w:val="center"/></w:pPr><w:r><w:rPr><w:rFonts w:ascii="Times New Roman" w:hAnsi="Times New Roman" w:eastAsia="Times New Roman" w:cs="Times New Roman"/><w:sz w:val="19"/><w:szCs w:val="19"/></w:rPr><w:t xml:space="preserve">1</w:t></w:r></w:p></w:tc><w:tc><w:tcPr><w:tcW w:w="1100" w:type="dxa"/><w:noWrap/></w:tcPr><w:p><w:pPr><w:jc w:val="center"/></w:pPr><w:r><w:rPr><w:rFonts w:ascii="Times New Roman" w:hAnsi="Times New Roman" w:eastAsia="Times New Roman" w:cs="Times New Roman"/><w:sz w:val="19"/><w:szCs w:val="19"/></w:rPr><w:t xml:space="preserve">Default L</w:t></w:r></w:p></w:tc></w:tr><w:tr><w:trPr/><w:tc><w:tcPr><w:tcW w:w="500" w:type="dxa"/><w:noWrap/></w:tcPr><w:p><w:pPr><w:jc w:val="center"/></w:pPr><w:r><w:rPr><w:rFonts w:ascii="Times New Roman" w:hAnsi="Times New Roman" w:eastAsia="Times New Roman" w:cs="Times New Roman"/><w:sz w:val="19"/><w:szCs w:val="19"/></w:rPr><w:t xml:space="preserve">15</w:t></w:r></w:p></w:tc><w:tc><w:tcPr><w:tcW w:w="2200" w:type="dxa"/><w:noWrap/></w:tcPr><w:p><w:pPr><w:jc w:val="start"/></w:pPr><w:r><w:rPr><w:rFonts w:ascii="Times New Roman" w:hAnsi="Times New Roman" w:eastAsia="Times New Roman" w:cs="Times New Roman"/><w:sz w:val="19"/><w:szCs w:val="19"/><w:b w:val="1"/><w:bCs w:val="1"/></w:rPr><w:t xml:space="preserve">agama</w:t></w:r></w:p></w:tc><w:tc><w:tcPr><w:tcW w:w="3000" w:type="dxa"/><w:noWrap/></w:tcPr><w:p><w:pPr><w:jc w:val="start"/></w:pPr><w:r><w:rPr><w:rFonts w:ascii="Times New Roman" w:hAnsi="Times New Roman" w:eastAsia="Times New Roman" w:cs="Times New Roman"/><w:sz w:val="19"/><w:szCs w:val="19"/></w:rPr><w:t xml:space="preserve">Agama yang Dianut</w:t></w:r></w:p></w:tc><w:tc><w:tcPr><w:tcW w:w="1300" w:type="dxa"/><w:noWrap/></w:tcPr><w:p><w:pPr><w:jc w:val="center"/></w:pPr><w:r><w:rPr><w:rFonts w:ascii="Times New Roman" w:hAnsi="Times New Roman" w:eastAsia="Times New Roman" w:cs="Times New Roman"/><w:sz w:val="19"/><w:szCs w:val="19"/></w:rPr><w:t xml:space="preserve">VARCHAR</w:t></w:r></w:p></w:tc><w:tc><w:tcPr><w:tcW w:w="1100" w:type="dxa"/><w:noWrap/></w:tcPr><w:p><w:pPr><w:jc w:val="center"/></w:pPr><w:r><w:rPr><w:rFonts w:ascii="Times New Roman" w:hAnsi="Times New Roman" w:eastAsia="Times New Roman" w:cs="Times New Roman"/><w:sz w:val="19"/><w:szCs w:val="19"/></w:rPr><w:t xml:space="preserve">30</w:t></w:r></w:p></w:tc><w:tc><w:tcPr><w:tcW w:w="1100" w:type="dxa"/><w:noWrap/></w:tcPr><w:p><w:pPr><w:jc w:val="center"/></w:pPr><w:r><w:rPr><w:rFonts w:ascii="Times New Roman" w:hAnsi="Times New Roman" w:eastAsia="Times New Roman" w:cs="Times New Roman"/><w:sz w:val="19"/><w:szCs w:val="19"/></w:rPr><w:t xml:space="preserve">Nullable</w:t></w:r></w:p></w:tc></w:tr><w:tr><w:trPr/><w:tc><w:tcPr><w:tcW w:w="500" w:type="dxa"/><w:noWrap/></w:tcPr><w:p><w:pPr><w:jc w:val="center"/></w:pPr><w:r><w:rPr><w:rFonts w:ascii="Times New Roman" w:hAnsi="Times New Roman" w:eastAsia="Times New Roman" w:cs="Times New Roman"/><w:sz w:val="19"/><w:szCs w:val="19"/></w:rPr><w:t xml:space="preserve">16</w:t></w:r></w:p></w:tc><w:tc><w:tcPr><w:tcW w:w="2200" w:type="dxa"/><w:noWrap/></w:tcPr><w:p><w:pPr><w:jc w:val="start"/></w:pPr><w:r><w:rPr><w:rFonts w:ascii="Times New Roman" w:hAnsi="Times New Roman" w:eastAsia="Times New Roman" w:cs="Times New Roman"/><w:sz w:val="19"/><w:szCs w:val="19"/><w:b w:val="1"/><w:bCs w:val="1"/></w:rPr><w:t xml:space="preserve">status_kawin</w:t></w:r></w:p></w:tc><w:tc><w:tcPr><w:tcW w:w="3000" w:type="dxa"/><w:noWrap/></w:tcPr><w:p><w:pPr><w:jc w:val="start"/></w:pPr><w:r><w:rPr><w:rFonts w:ascii="Times New Roman" w:hAnsi="Times New Roman" w:eastAsia="Times New Roman" w:cs="Times New Roman"/><w:sz w:val="19"/><w:szCs w:val="19"/></w:rPr><w:t xml:space="preserve">Status Pernikahan</w:t></w:r></w:p></w:tc><w:tc><w:tcPr><w:tcW w:w="1300" w:type="dxa"/><w:noWrap/></w:tcPr><w:p><w:pPr><w:jc w:val="center"/></w:pPr><w:r><w:rPr><w:rFonts w:ascii="Times New Roman" w:hAnsi="Times New Roman" w:eastAsia="Times New Roman" w:cs="Times New Roman"/><w:sz w:val="19"/><w:szCs w:val="19"/></w:rPr><w:t xml:space="preserve">VARCHAR</w:t></w:r></w:p></w:tc><w:tc><w:tcPr><w:tcW w:w="1100" w:type="dxa"/><w:noWrap/></w:tcPr><w:p><w:pPr><w:jc w:val="center"/></w:pPr><w:r><w:rPr><w:rFonts w:ascii="Times New Roman" w:hAnsi="Times New Roman" w:eastAsia="Times New Roman" w:cs="Times New Roman"/><w:sz w:val="19"/><w:szCs w:val="19"/></w:rPr><w:t xml:space="preserve">30</w:t></w:r></w:p></w:tc><w:tc><w:tcPr><w:tcW w:w="1100" w:type="dxa"/><w:noWrap/></w:tcPr><w:p><w:pPr><w:jc w:val="center"/></w:pPr><w:r><w:rPr><w:rFonts w:ascii="Times New Roman" w:hAnsi="Times New Roman" w:eastAsia="Times New Roman" w:cs="Times New Roman"/><w:sz w:val="19"/><w:szCs w:val="19"/></w:rPr><w:t xml:space="preserve">Nullable</w:t></w:r></w:p></w:tc></w:tr><w:tr><w:trPr/><w:tc><w:tcPr><w:tcW w:w="500" w:type="dxa"/><w:noWrap/></w:tcPr><w:p><w:pPr><w:jc w:val="center"/></w:pPr><w:r><w:rPr><w:rFonts w:ascii="Times New Roman" w:hAnsi="Times New Roman" w:eastAsia="Times New Roman" w:cs="Times New Roman"/><w:sz w:val="19"/><w:szCs w:val="19"/></w:rPr><w:t xml:space="preserve">17</w:t></w:r></w:p></w:tc><w:tc><w:tcPr><w:tcW w:w="2200" w:type="dxa"/><w:noWrap/></w:tcPr><w:p><w:pPr><w:jc w:val="start"/></w:pPr><w:r><w:rPr><w:rFonts w:ascii="Times New Roman" w:hAnsi="Times New Roman" w:eastAsia="Times New Roman" w:cs="Times New Roman"/><w:sz w:val="19"/><w:szCs w:val="19"/><w:b w:val="1"/><w:bCs w:val="1"/></w:rPr><w:t xml:space="preserve">alamat</w:t></w:r></w:p></w:tc><w:tc><w:tcPr><w:tcW w:w="3000" w:type="dxa"/><w:noWrap/></w:tcPr><w:p><w:pPr><w:jc w:val="start"/></w:pPr><w:r><w:rPr><w:rFonts w:ascii="Times New Roman" w:hAnsi="Times New Roman" w:eastAsia="Times New Roman" w:cs="Times New Roman"/><w:sz w:val="19"/><w:szCs w:val="19"/></w:rPr><w:t xml:space="preserve">Alamat Tempat Tinggal Resmi</w:t></w:r></w:p></w:tc><w:tc><w:tcPr><w:tcW w:w="1300" w:type="dxa"/><w:noWrap/></w:tcPr><w:p><w:pPr><w:jc w:val="center"/></w:pPr><w:r><w:rPr><w:rFonts w:ascii="Times New Roman" w:hAnsi="Times New Roman" w:eastAsia="Times New Roman" w:cs="Times New Roman"/><w:sz w:val="19"/><w:szCs w:val="19"/></w:rPr><w:t xml:space="preserve">TEXT</w:t></w:r></w:p></w:tc><w:tc><w:tcPr><w:tcW w:w="1100" w:type="dxa"/><w:noWrap/></w:tcPr><w:p><w:pPr><w:jc w:val="center"/></w:pPr><w:r><w:rPr><w:rFonts w:ascii="Times New Roman" w:hAnsi="Times New Roman" w:eastAsia="Times New Roman" w:cs="Times New Roman"/><w:sz w:val="19"/><w:szCs w:val="19"/></w:rPr><w:t xml:space="preserve">-</w:t></w:r></w:p></w:tc><w:tc><w:tcPr><w:tcW w:w="1100" w:type="dxa"/><w:noWrap/></w:tcPr><w:p><w:pPr><w:jc w:val="center"/></w:pPr><w:r><w:rPr><w:rFonts w:ascii="Times New Roman" w:hAnsi="Times New Roman" w:eastAsia="Times New Roman" w:cs="Times New Roman"/><w:sz w:val="19"/><w:szCs w:val="19"/></w:rPr><w:t xml:space="preserve">Nullable</w:t></w:r></w:p></w:tc></w:tr><w:tr><w:trPr/><w:tc><w:tcPr><w:tcW w:w="500" w:type="dxa"/><w:noWrap/></w:tcPr><w:p><w:pPr><w:jc w:val="center"/></w:pPr><w:r><w:rPr><w:rFonts w:ascii="Times New Roman" w:hAnsi="Times New Roman" w:eastAsia="Times New Roman" w:cs="Times New Roman"/><w:sz w:val="19"/><w:szCs w:val="19"/></w:rPr><w:t xml:space="preserve">18</w:t></w:r></w:p></w:tc><w:tc><w:tcPr><w:tcW w:w="2200" w:type="dxa"/><w:noWrap/></w:tcPr><w:p><w:pPr><w:jc w:val="start"/></w:pPr><w:r><w:rPr><w:rFonts w:ascii="Times New Roman" w:hAnsi="Times New Roman" w:eastAsia="Times New Roman" w:cs="Times New Roman"/><w:sz w:val="19"/><w:szCs w:val="19"/><w:b w:val="1"/><w:bCs w:val="1"/></w:rPr><w:t xml:space="preserve">no_hp</w:t></w:r></w:p></w:tc><w:tc><w:tcPr><w:tcW w:w="3000" w:type="dxa"/><w:noWrap/></w:tcPr><w:p><w:pPr><w:jc w:val="start"/></w:pPr><w:r><w:rPr><w:rFonts w:ascii="Times New Roman" w:hAnsi="Times New Roman" w:eastAsia="Times New Roman" w:cs="Times New Roman"/><w:sz w:val="19"/><w:szCs w:val="19"/></w:rPr><w:t xml:space="preserve">Nomor Kontak Telepon / WA</w:t></w:r></w:p></w:tc><w:tc><w:tcPr><w:tcW w:w="1300" w:type="dxa"/><w:noWrap/></w:tcPr><w:p><w:pPr><w:jc w:val="center"/></w:pPr><w:r><w:rPr><w:rFonts w:ascii="Times New Roman" w:hAnsi="Times New Roman" w:eastAsia="Times New Roman" w:cs="Times New Roman"/><w:sz w:val="19"/><w:szCs w:val="19"/></w:rPr><w:t xml:space="preserve">VARCHAR</w:t></w:r></w:p></w:tc><w:tc><w:tcPr><w:tcW w:w="1100" w:type="dxa"/><w:noWrap/></w:tcPr><w:p><w:pPr><w:jc w:val="center"/></w:pPr><w:r><w:rPr><w:rFonts w:ascii="Times New Roman" w:hAnsi="Times New Roman" w:eastAsia="Times New Roman" w:cs="Times New Roman"/><w:sz w:val="19"/><w:szCs w:val="19"/></w:rPr><w:t xml:space="preserve">20</w:t></w:r></w:p></w:tc><w:tc><w:tcPr><w:tcW w:w="1100" w:type="dxa"/><w:noWrap/></w:tcPr><w:p><w:pPr><w:jc w:val="center"/></w:pPr><w:r><w:rPr><w:rFonts w:ascii="Times New Roman" w:hAnsi="Times New Roman" w:eastAsia="Times New Roman" w:cs="Times New Roman"/><w:sz w:val="19"/><w:szCs w:val="19"/></w:rPr><w:t xml:space="preserve">Nullable</w:t></w:r></w:p></w:tc></w:tr><w:tr><w:trPr/><w:tc><w:tcPr><w:tcW w:w="500" w:type="dxa"/><w:noWrap/></w:tcPr><w:p><w:pPr><w:jc w:val="center"/></w:pPr><w:r><w:rPr><w:rFonts w:ascii="Times New Roman" w:hAnsi="Times New Roman" w:eastAsia="Times New Roman" w:cs="Times New Roman"/><w:sz w:val="19"/><w:szCs w:val="19"/></w:rPr><w:t xml:space="preserve">19</w:t></w:r></w:p></w:tc><w:tc><w:tcPr><w:tcW w:w="2200" w:type="dxa"/><w:noWrap/></w:tcPr><w:p><w:pPr><w:jc w:val="start"/></w:pPr><w:r><w:rPr><w:rFonts w:ascii="Times New Roman" w:hAnsi="Times New Roman" w:eastAsia="Times New Roman" w:cs="Times New Roman"/><w:sz w:val="19"/><w:szCs w:val="19"/><w:b w:val="1"/><w:bCs w:val="1"/></w:rPr><w:t xml:space="preserve">email</w:t></w:r></w:p></w:tc><w:tc><w:tcPr><w:tcW w:w="3000" w:type="dxa"/><w:noWrap/></w:tcPr><w:p><w:pPr><w:jc w:val="start"/></w:pPr><w:r><w:rPr><w:rFonts w:ascii="Times New Roman" w:hAnsi="Times New Roman" w:eastAsia="Times New Roman" w:cs="Times New Roman"/><w:sz w:val="19"/><w:szCs w:val="19"/></w:rPr><w:t xml:space="preserve">Alamat Surel Resmi</w:t></w:r></w:p></w:tc><w:tc><w:tcPr><w:tcW w:w="1300" w:type="dxa"/><w:noWrap/></w:tcPr><w:p><w:pPr><w:jc w:val="center"/></w:pPr><w:r><w:rPr><w:rFonts w:ascii="Times New Roman" w:hAnsi="Times New Roman" w:eastAsia="Times New Roman" w:cs="Times New Roman"/><w:sz w:val="19"/><w:szCs w:val="19"/></w:rPr><w:t xml:space="preserve">VARCHAR</w:t></w:r></w:p></w:tc><w:tc><w:tcPr><w:tcW w:w="1100" w:type="dxa"/><w:noWrap/></w:tcPr><w:p><w:pPr><w:jc w:val="center"/></w:pPr><w:r><w:rPr><w:rFonts w:ascii="Times New Roman" w:hAnsi="Times New Roman" w:eastAsia="Times New Roman" w:cs="Times New Roman"/><w:sz w:val="19"/><w:szCs w:val="19"/></w:rPr><w:t xml:space="preserve">100</w:t></w:r></w:p></w:tc><w:tc><w:tcPr><w:tcW w:w="1100" w:type="dxa"/><w:noWrap/></w:tcPr><w:p><w:pPr><w:jc w:val="center"/></w:pPr><w:r><w:rPr><w:rFonts w:ascii="Times New Roman" w:hAnsi="Times New Roman" w:eastAsia="Times New Roman" w:cs="Times New Roman"/><w:sz w:val="19"/><w:szCs w:val="19"/></w:rPr><w:t xml:space="preserve">Nullable</w:t></w:r></w:p></w:tc></w:tr><w:tr><w:trPr/><w:tc><w:tcPr><w:tcW w:w="500" w:type="dxa"/><w:noWrap/></w:tcPr><w:p><w:pPr><w:jc w:val="center"/></w:pPr><w:r><w:rPr><w:rFonts w:ascii="Times New Roman" w:hAnsi="Times New Roman" w:eastAsia="Times New Roman" w:cs="Times New Roman"/><w:sz w:val="19"/><w:szCs w:val="19"/></w:rPr><w:t xml:space="preserve">20</w:t></w:r></w:p></w:tc><w:tc><w:tcPr><w:tcW w:w="2200" w:type="dxa"/><w:noWrap/></w:tcPr><w:p><w:pPr><w:jc w:val="start"/></w:pPr><w:r><w:rPr><w:rFonts w:ascii="Times New Roman" w:hAnsi="Times New Roman" w:eastAsia="Times New Roman" w:cs="Times New Roman"/><w:sz w:val="19"/><w:szCs w:val="19"/><w:b w:val="1"/><w:bCs w:val="1"/></w:rPr><w:t xml:space="preserve">foto</w:t></w:r></w:p></w:tc><w:tc><w:tcPr><w:tcW w:w="3000" w:type="dxa"/><w:noWrap/></w:tcPr><w:p><w:pPr><w:jc w:val="start"/></w:pPr><w:r><w:rPr><w:rFonts w:ascii="Times New Roman" w:hAnsi="Times New Roman" w:eastAsia="Times New Roman" w:cs="Times New Roman"/><w:sz w:val="19"/><w:szCs w:val="19"/></w:rPr><w:t xml:space="preserve">Path File Foto Personel</w:t></w:r></w:p></w:tc><w:tc><w:tcPr><w:tcW w:w="1300" w:type="dxa"/><w:noWrap/></w:tcPr><w:p><w:pPr><w:jc w:val="center"/></w:pPr><w:r><w:rPr><w:rFonts w:ascii="Times New Roman" w:hAnsi="Times New Roman" w:eastAsia="Times New Roman" w:cs="Times New Roman"/><w:sz w:val="19"/><w:szCs w:val="19"/></w:rPr><w:t xml:space="preserve">VARCHAR</w:t></w:r></w:p></w:tc><w:tc><w:tcPr><w:tcW w:w="1100" w:type="dxa"/><w:noWrap/></w:tcPr><w:p><w:pPr><w:jc w:val="center"/></w:pPr><w:r><w:rPr><w:rFonts w:ascii="Times New Roman" w:hAnsi="Times New Roman" w:eastAsia="Times New Roman" w:cs="Times New Roman"/><w:sz w:val="19"/><w:szCs w:val="19"/></w:rPr><w:t xml:space="preserve">255</w:t></w:r></w:p></w:tc><w:tc><w:tcPr><w:tcW w:w="1100" w:type="dxa"/><w:noWrap/></w:tcPr><w:p><w:pPr><w:jc w:val="center"/></w:pPr><w:r><w:rPr><w:rFonts w:ascii="Times New Roman" w:hAnsi="Times New Roman" w:eastAsia="Times New Roman" w:cs="Times New Roman"/><w:sz w:val="19"/><w:szCs w:val="19"/></w:rPr><w:t xml:space="preserve">Nullable</w:t></w:r></w:p></w:tc></w:tr><w:tr><w:trPr/><w:tc><w:tcPr><w:tcW w:w="500" w:type="dxa"/><w:noWrap/></w:tcPr><w:p><w:pPr><w:jc w:val="center"/></w:pPr><w:r><w:rPr><w:rFonts w:ascii="Times New Roman" w:hAnsi="Times New Roman" w:eastAsia="Times New Roman" w:cs="Times New Roman"/><w:sz w:val="19"/><w:szCs w:val="19"/></w:rPr><w:t xml:space="preserve">21</w:t></w:r></w:p></w:tc><w:tc><w:tcPr><w:tcW w:w="2200" w:type="dxa"/><w:noWrap/></w:tcPr><w:p><w:pPr><w:jc w:val="start"/></w:pPr><w:r><w:rPr><w:rFonts w:ascii="Times New Roman" w:hAnsi="Times New Roman" w:eastAsia="Times New Roman" w:cs="Times New Roman"/><w:sz w:val="19"/><w:szCs w:val="19"/><w:b w:val="1"/><w:bCs w:val="1"/></w:rPr><w:t xml:space="preserve">status_dinas</w:t></w:r></w:p></w:tc><w:tc><w:tcPr><w:tcW w:w="3000" w:type="dxa"/><w:noWrap/></w:tcPr><w:p><w:pPr><w:jc w:val="start"/></w:pPr><w:r><w:rPr><w:rFonts w:ascii="Times New Roman" w:hAnsi="Times New Roman" w:eastAsia="Times New Roman" w:cs="Times New Roman"/><w:sz w:val="19"/><w:szCs w:val="19"/></w:rPr><w:t xml:space="preserve">Status Dinas (Aktif/Pensiun/Pindah)</w:t></w:r></w:p></w:tc><w:tc><w:tcPr><w:tcW w:w="1300" w:type="dxa"/><w:noWrap/></w:tcPr><w:p><w:pPr><w:jc w:val="center"/></w:pPr><w:r><w:rPr><w:rFonts w:ascii="Times New Roman" w:hAnsi="Times New Roman" w:eastAsia="Times New Roman" w:cs="Times New Roman"/><w:sz w:val="19"/><w:szCs w:val="19"/></w:rPr><w:t xml:space="preserve">ENUM</w:t></w:r></w:p></w:tc><w:tc><w:tcPr><w:tcW w:w="1100" w:type="dxa"/><w:noWrap/></w:tcPr><w:p><w:pPr><w:jc w:val="center"/></w:pPr><w:r><w:rPr><w:rFonts w:ascii="Times New Roman" w:hAnsi="Times New Roman" w:eastAsia="Times New Roman" w:cs="Times New Roman"/><w:sz w:val="19"/><w:szCs w:val="19"/></w:rPr><w:t xml:space="preserve">15</w:t></w:r></w:p></w:tc><w:tc><w:tcPr><w:tcW w:w="1100" w:type="dxa"/><w:noWrap/></w:tcPr><w:p><w:pPr><w:jc w:val="center"/></w:pPr><w:r><w:rPr><w:rFonts w:ascii="Times New Roman" w:hAnsi="Times New Roman" w:eastAsia="Times New Roman" w:cs="Times New Roman"/><w:sz w:val="19"/><w:szCs w:val="19"/></w:rPr><w:t xml:space="preserve">Default Aktif</w:t></w:r></w:p></w:tc></w:tr><w:tr><w:trPr/><w:tc><w:tcPr><w:tcW w:w="500" w:type="dxa"/><w:noWrap/></w:tcPr><w:p><w:pPr><w:jc w:val="center"/></w:pPr><w:r><w:rPr><w:rFonts w:ascii="Times New Roman" w:hAnsi="Times New Roman" w:eastAsia="Times New Roman" w:cs="Times New Roman"/><w:sz w:val="19"/><w:szCs w:val="19"/></w:rPr><w:t xml:space="preserve">22</w:t></w:r></w:p></w:tc><w:tc><w:tcPr><w:tcW w:w="2200" w:type="dxa"/><w:noWrap/></w:tcPr><w:p><w:pPr><w:jc w:val="start"/></w:pPr><w:r><w:rPr><w:rFonts w:ascii="Times New Roman" w:hAnsi="Times New Roman" w:eastAsia="Times New Roman" w:cs="Times New Roman"/><w:sz w:val="19"/><w:szCs w:val="19"/><w:b w:val="1"/><w:bCs w:val="1"/></w:rPr><w:t xml:space="preserve">tmt_pensiun_proyeksi</w:t></w:r></w:p></w:tc><w:tc><w:tcPr><w:tcW w:w="3000" w:type="dxa"/><w:noWrap/></w:tcPr><w:p><w:pPr><w:jc w:val="start"/></w:pPr><w:r><w:rPr><w:rFonts w:ascii="Times New Roman" w:hAnsi="Times New Roman" w:eastAsia="Times New Roman" w:cs="Times New Roman"/><w:sz w:val="19"/><w:szCs w:val="19"/></w:rPr><w:t xml:space="preserve">Proyeksi TMT Pensiun Otomatis</w:t></w:r></w:p></w:tc><w:tc><w:tcPr><w:tcW w:w="1300" w:type="dxa"/><w:noWrap/></w:tcPr><w:p><w:pPr><w:jc w:val="center"/></w:pPr><w:r><w:rPr><w:rFonts w:ascii="Times New Roman" w:hAnsi="Times New Roman" w:eastAsia="Times New Roman" w:cs="Times New Roman"/><w:sz w:val="19"/><w:szCs w:val="19"/></w:rPr><w:t xml:space="preserve">DATE</w:t></w:r></w:p></w:tc><w:tc><w:tcPr><w:tcW w:w="1100" w:type="dxa"/><w:noWrap/></w:tcPr><w:p><w:pPr><w:jc w:val="center"/></w:pPr><w:r><w:rPr><w:rFonts w:ascii="Times New Roman" w:hAnsi="Times New Roman" w:eastAsia="Times New Roman" w:cs="Times New Roman"/><w:sz w:val="19"/><w:szCs w:val="19"/></w:rPr><w:t xml:space="preserve">10</w:t></w:r></w:p></w:tc><w:tc><w:tcPr><w:tcW w:w="1100" w:type="dxa"/><w:noWrap/></w:tcPr><w:p><w:pPr><w:jc w:val="center"/></w:pPr><w:r><w:rPr><w:rFonts w:ascii="Times New Roman" w:hAnsi="Times New Roman" w:eastAsia="Times New Roman" w:cs="Times New Roman"/><w:sz w:val="19"/><w:szCs w:val="19"/></w:rPr><w:t xml:space="preserve">Nullable</w:t></w:r></w:p></w:tc></w:tr><w:tr><w:trPr/><w:tc><w:tcPr><w:tcW w:w="500" w:type="dxa"/><w:noWrap/></w:tcPr><w:p><w:pPr><w:jc w:val="center"/></w:pPr><w:r><w:rPr><w:rFonts w:ascii="Times New Roman" w:hAnsi="Times New Roman" w:eastAsia="Times New Roman" w:cs="Times New Roman"/><w:sz w:val="19"/><w:szCs w:val="19"/></w:rPr><w:t xml:space="preserve">23</w:t></w:r></w:p></w:tc><w:tc><w:tcPr><w:tcW w:w="2200" w:type="dxa"/><w:noWrap/></w:tcPr><w:p><w:pPr><w:jc w:val="start"/></w:pPr><w:r><w:rPr><w:rFonts w:ascii="Times New Roman" w:hAnsi="Times New Roman" w:eastAsia="Times New Roman" w:cs="Times New Roman"/><w:sz w:val="19"/><w:szCs w:val="19"/><w:b w:val="1"/><w:bCs w:val="1"/></w:rPr><w:t xml:space="preserve">created_at</w:t></w:r></w:p></w:tc><w:tc><w:tcPr><w:tcW w:w="3000" w:type="dxa"/><w:noWrap/></w:tcPr><w:p><w:pPr><w:jc w:val="start"/></w:pPr><w:r><w:rPr><w:rFonts w:ascii="Times New Roman" w:hAnsi="Times New Roman" w:eastAsia="Times New Roman" w:cs="Times New Roman"/><w:sz w:val="19"/><w:szCs w:val="19"/></w:rPr><w:t xml:space="preserve">Waktu Perekaman Data Pertama</w:t></w:r></w:p></w:tc><w:tc><w:tcPr><w:tcW w:w="1300" w:type="dxa"/><w:noWrap/></w:tcPr><w:p><w:pPr><w:jc w:val="center"/></w:pPr><w:r><w:rPr><w:rFonts w:ascii="Times New Roman" w:hAnsi="Times New Roman" w:eastAsia="Times New Roman" w:cs="Times New Roman"/><w:sz w:val="19"/><w:szCs w:val="19"/></w:rPr><w:t xml:space="preserve">TIMESTAMP</w:t></w:r></w:p></w:tc><w:tc><w:tcPr><w:tcW w:w="1100" w:type="dxa"/><w:noWrap/></w:tcPr><w:p><w:pPr><w:jc w:val="center"/></w:pPr><w:r><w:rPr><w:rFonts w:ascii="Times New Roman" w:hAnsi="Times New Roman" w:eastAsia="Times New Roman" w:cs="Times New Roman"/><w:sz w:val="19"/><w:szCs w:val="19"/></w:rPr><w:t xml:space="preserve">19</w:t></w:r></w:p></w:tc><w:tc><w:tcPr><w:tcW w:w="1100" w:type="dxa"/><w:noWrap/></w:tcPr><w:p><w:pPr><w:jc w:val="center"/></w:pPr><w:r><w:rPr><w:rFonts w:ascii="Times New Roman" w:hAnsi="Times New Roman" w:eastAsia="Times New Roman" w:cs="Times New Roman"/><w:sz w:val="19"/><w:szCs w:val="19"/></w:rPr><w:t xml:space="preserve">Auto Stamp</w:t></w:r></w:p></w:tc></w:tr><w:tr><w:trPr/><w:tc><w:tcPr><w:tcW w:w="500" w:type="dxa"/><w:noWrap/></w:tcPr><w:p><w:pPr><w:jc w:val="center"/></w:pPr><w:r><w:rPr><w:rFonts w:ascii="Times New Roman" w:hAnsi="Times New Roman" w:eastAsia="Times New Roman" w:cs="Times New Roman"/><w:sz w:val="19"/><w:szCs w:val="19"/></w:rPr><w:t xml:space="preserve">24</w:t></w:r></w:p></w:tc><w:tc><w:tcPr><w:tcW w:w="2200" w:type="dxa"/><w:noWrap/></w:tcPr><w:p><w:pPr><w:jc w:val="start"/></w:pPr><w:r><w:rPr><w:rFonts w:ascii="Times New Roman" w:hAnsi="Times New Roman" w:eastAsia="Times New Roman" w:cs="Times New Roman"/><w:sz w:val="19"/><w:szCs w:val="19"/><w:b w:val="1"/><w:bCs w:val="1"/></w:rPr><w:t xml:space="preserve">updated_at</w:t></w:r></w:p></w:tc><w:tc><w:tcPr><w:tcW w:w="3000" w:type="dxa"/><w:noWrap/></w:tcPr><w:p><w:pPr><w:jc w:val="start"/></w:pPr><w:r><w:rPr><w:rFonts w:ascii="Times New Roman" w:hAnsi="Times New Roman" w:eastAsia="Times New Roman" w:cs="Times New Roman"/><w:sz w:val="19"/><w:szCs w:val="19"/></w:rPr><w:t xml:space="preserve">Waktu Pembaruan Data Terakhir</w:t></w:r></w:p></w:tc><w:tc><w:tcPr><w:tcW w:w="1300" w:type="dxa"/><w:noWrap/></w:tcPr><w:p><w:pPr><w:jc w:val="center"/></w:pPr><w:r><w:rPr><w:rFonts w:ascii="Times New Roman" w:hAnsi="Times New Roman" w:eastAsia="Times New Roman" w:cs="Times New Roman"/><w:sz w:val="19"/><w:szCs w:val="19"/></w:rPr><w:t xml:space="preserve">TIMESTAMP</w:t></w:r></w:p></w:tc><w:tc><w:tcPr><w:tcW w:w="1100" w:type="dxa"/><w:noWrap/></w:tcPr><w:p><w:pPr><w:jc w:val="center"/></w:pPr><w:r><w:rPr><w:rFonts w:ascii="Times New Roman" w:hAnsi="Times New Roman" w:eastAsia="Times New Roman" w:cs="Times New Roman"/><w:sz w:val="19"/><w:szCs w:val="19"/></w:rPr><w:t xml:space="preserve">19</w:t></w:r></w:p></w:tc><w:tc><w:tcPr><w:tcW w:w="1100" w:type="dxa"/><w:noWrap/></w:tcPr><w:p><w:pPr><w:jc w:val="center"/></w:pPr><w:r><w:rPr><w:rFonts w:ascii="Times New Roman" w:hAnsi="Times New Roman" w:eastAsia="Times New Roman" w:cs="Times New Roman"/><w:sz w:val="19"/><w:szCs w:val="19"/></w:rPr><w:t xml:space="preserve">Auto Update</w:t></w:r></w:p></w:tc></w:tr></w:tbl><w:p/><w:p><w:pPr><w:spacing w:after="40"/></w:pPr><w:r><w:rPr><w:rFonts w:ascii="Times New Roman" w:hAnsi="Times New Roman" w:eastAsia="Times New Roman" w:cs="Times New Roman"/><w:sz w:val="22"/><w:szCs w:val="22"/><w:b w:val="1"/><w:bCs w:val="1"/></w:rPr><w:t xml:space="preserve">b.   Struktur File / Tabel: USERS (Kredensial dan Otorisasi Akun)</w:t></w:r></w:p><w:tbl><w:tblGrid><w:gridCol w:w="500" w:type="dxa"/><w:gridCol w:w="2200" w:type="dxa"/><w:gridCol w:w="3000" w:type="dxa"/><w:gridCol w:w="1300" w:type="dxa"/><w:gridCol w:w="1100" w:type="dxa"/><w:gridCol w:w="1100" w:type="dxa"/></w:tblGrid><w:tblPr><w:tblStyle w:val="MilitaryTable"/></w:tblPr><w:tr><w:trPr/><w:tc><w:tcPr><w:tcW w:w="500" w:type="dxa"/><w:shd w:val="clear" w:fill="EAEAEA"/><w:noWrap/></w:tcPr><w:p><w:pPr><w:jc w:val="center"/></w:pPr><w:r><w:rPr><w:rFonts w:ascii="Times New Roman" w:hAnsi="Times New Roman" w:eastAsia="Times New Roman" w:cs="Times New Roman"/><w:sz w:val="20"/><w:szCs w:val="20"/><w:b w:val="1"/><w:bCs w:val="1"/></w:rPr><w:t xml:space="preserve">No</w:t></w:r></w:p></w:tc><w:tc><w:tcPr><w:tcW w:w="2200" w:type="dxa"/><w:shd w:val="clear" w:fill="EAEAEA"/><w:noWrap/></w:tcPr><w:p><w:pPr><w:jc w:val="center"/></w:pPr><w:r><w:rPr><w:rFonts w:ascii="Times New Roman" w:hAnsi="Times New Roman" w:eastAsia="Times New Roman" w:cs="Times New Roman"/><w:sz w:val="20"/><w:szCs w:val="20"/><w:b w:val="1"/><w:bCs w:val="1"/></w:rPr><w:t xml:space="preserve">Nama Field</w:t></w:r></w:p></w:tc><w:tc><w:tcPr><w:tcW w:w="3000" w:type="dxa"/><w:shd w:val="clear" w:fill="EAEAEA"/><w:noWrap/></w:tcPr><w:p><w:pPr><w:jc w:val="center"/></w:pPr><w:r><w:rPr><w:rFonts w:ascii="Times New Roman" w:hAnsi="Times New Roman" w:eastAsia="Times New Roman" w:cs="Times New Roman"/><w:sz w:val="20"/><w:szCs w:val="20"/><w:b w:val="1"/><w:bCs w:val="1"/></w:rPr><w:t xml:space="preserve">Uraian / Sebutan</w:t></w:r></w:p></w:tc><w:tc><w:tcPr><w:tcW w:w="1300" w:type="dxa"/><w:shd w:val="clear" w:fill="EAEAEA"/><w:noWrap/></w:tcPr><w:p><w:pPr><w:jc w:val="center"/></w:pPr><w:r><w:rPr><w:rFonts w:ascii="Times New Roman" w:hAnsi="Times New Roman" w:eastAsia="Times New Roman" w:cs="Times New Roman"/><w:sz w:val="20"/><w:szCs w:val="20"/><w:b w:val="1"/><w:bCs w:val="1"/></w:rPr><w:t xml:space="preserve">Type</w:t></w:r></w:p></w:tc><w:tc><w:tcPr><w:tcW w:w="1100" w:type="dxa"/><w:shd w:val="clear" w:fill="EAEAEA"/><w:noWrap/></w:tcPr><w:p><w:pPr><w:jc w:val="center"/></w:pPr><w:r><w:rPr><w:rFonts w:ascii="Times New Roman" w:hAnsi="Times New Roman" w:eastAsia="Times New Roman" w:cs="Times New Roman"/><w:sz w:val="20"/><w:szCs w:val="20"/><w:b w:val="1"/><w:bCs w:val="1"/></w:rPr><w:t xml:space="preserve">Lebar</w:t></w:r></w:p></w:tc><w:tc><w:tcPr><w:tcW w:w="1100" w:type="dxa"/><w:shd w:val="clear" w:fill="EAEAEA"/><w:noWrap/></w:tcPr><w:p><w:pPr><w:jc w:val="center"/></w:pPr><w:r><w:rPr><w:rFonts w:ascii="Times New Roman" w:hAnsi="Times New Roman" w:eastAsia="Times New Roman" w:cs="Times New Roman"/><w:sz w:val="20"/><w:szCs w:val="20"/><w:b w:val="1"/><w:bCs w:val="1"/></w:rPr><w:t xml:space="preserve">Ket</w:t></w:r></w:p></w:tc></w:tr><w:tr><w:trPr/><w:tc><w:tcPr><w:tcW w:w="500" w:type="dxa"/><w:noWrap/></w:tcPr><w:p><w:pPr><w:jc w:val="center"/></w:pPr><w:r><w:rPr><w:rFonts w:ascii="Times New Roman" w:hAnsi="Times New Roman" w:eastAsia="Times New Roman" w:cs="Times New Roman"/><w:sz w:val="19"/><w:szCs w:val="19"/></w:rPr><w:t xml:space="preserve">1</w:t></w:r></w:p></w:tc><w:tc><w:tcPr><w:tcW w:w="2200" w:type="dxa"/><w:noWrap/></w:tcPr><w:p><w:pPr><w:jc w:val="start"/></w:pPr><w:r><w:rPr><w:rFonts w:ascii="Times New Roman" w:hAnsi="Times New Roman" w:eastAsia="Times New Roman" w:cs="Times New Roman"/><w:sz w:val="19"/><w:szCs w:val="19"/><w:b w:val="1"/><w:bCs w:val="1"/></w:rPr><w:t xml:space="preserve">id</w:t></w:r></w:p></w:tc><w:tc><w:tcPr><w:tcW w:w="3000" w:type="dxa"/><w:noWrap/></w:tcPr><w:p><w:pPr><w:jc w:val="start"/></w:pPr><w:r><w:rPr><w:rFonts w:ascii="Times New Roman" w:hAnsi="Times New Roman" w:eastAsia="Times New Roman" w:cs="Times New Roman"/><w:sz w:val="19"/><w:szCs w:val="19"/></w:rPr><w:t xml:space="preserve">Identitas Unik Pengguna</w:t></w:r></w:p></w:tc><w:tc><w:tcPr><w:tcW w:w="1300" w:type="dxa"/><w:noWrap/></w:tcPr><w:p><w:pPr><w:jc w:val="center"/></w:pPr><w:r><w:rPr><w:rFonts w:ascii="Times New Roman" w:hAnsi="Times New Roman" w:eastAsia="Times New Roman" w:cs="Times New Roman"/><w:sz w:val="19"/><w:szCs w:val="19"/></w:rPr><w:t xml:space="preserve">INT</w:t></w:r></w:p></w:tc><w:tc><w:tcPr><w:tcW w:w="1100" w:type="dxa"/><w:noWrap/></w:tcPr><w:p><w:pPr><w:jc w:val="center"/></w:pPr><w:r><w:rPr><w:rFonts w:ascii="Times New Roman" w:hAnsi="Times New Roman" w:eastAsia="Times New Roman" w:cs="Times New Roman"/><w:sz w:val="19"/><w:szCs w:val="19"/></w:rPr><w:t xml:space="preserve">11</w:t></w:r></w:p></w:tc><w:tc><w:tcPr><w:tcW w:w="1100" w:type="dxa"/><w:noWrap/></w:tcPr><w:p><w:pPr><w:jc w:val="center"/></w:pPr><w:r><w:rPr><w:rFonts w:ascii="Times New Roman" w:hAnsi="Times New Roman" w:eastAsia="Times New Roman" w:cs="Times New Roman"/><w:sz w:val="19"/><w:szCs w:val="19"/></w:rPr><w:t xml:space="preserve">PK, Auto</w:t></w:r></w:p></w:tc></w:tr><w:tr><w:trPr/><w:tc><w:tcPr><w:tcW w:w="500" w:type="dxa"/><w:noWrap/></w:tcPr><w:p><w:pPr><w:jc w:val="center"/></w:pPr><w:r><w:rPr><w:rFonts w:ascii="Times New Roman" w:hAnsi="Times New Roman" w:eastAsia="Times New Roman" w:cs="Times New Roman"/><w:sz w:val="19"/><w:szCs w:val="19"/></w:rPr><w:t xml:space="preserve">2</w:t></w:r></w:p></w:tc><w:tc><w:tcPr><w:tcW w:w="2200" w:type="dxa"/><w:noWrap/></w:tcPr><w:p><w:pPr><w:jc w:val="start"/></w:pPr><w:r><w:rPr><w:rFonts w:ascii="Times New Roman" w:hAnsi="Times New Roman" w:eastAsia="Times New Roman" w:cs="Times New Roman"/><w:sz w:val="19"/><w:szCs w:val="19"/><w:b w:val="1"/><w:bCs w:val="1"/></w:rPr><w:t xml:space="preserve">username</w:t></w:r></w:p></w:tc><w:tc><w:tcPr><w:tcW w:w="3000" w:type="dxa"/><w:noWrap/></w:tcPr><w:p><w:pPr><w:jc w:val="start"/></w:pPr><w:r><w:rPr><w:rFonts w:ascii="Times New Roman" w:hAnsi="Times New Roman" w:eastAsia="Times New Roman" w:cs="Times New Roman"/><w:sz w:val="19"/><w:szCs w:val="19"/></w:rPr><w:t xml:space="preserve">Nama Pengguna Login (NRP / Admin)</w:t></w:r></w:p></w:tc><w:tc><w:tcPr><w:tcW w:w="1300" w:type="dxa"/><w:noWrap/></w:tcPr><w:p><w:pPr><w:jc w:val="center"/></w:pPr><w:r><w:rPr><w:rFonts w:ascii="Times New Roman" w:hAnsi="Times New Roman" w:eastAsia="Times New Roman" w:cs="Times New Roman"/><w:sz w:val="19"/><w:szCs w:val="19"/></w:rPr><w:t xml:space="preserve">VARCHAR</w:t></w:r></w:p></w:tc><w:tc><w:tcPr><w:tcW w:w="1100" w:type="dxa"/><w:noWrap/></w:tcPr><w:p><w:pPr><w:jc w:val="center"/></w:pPr><w:r><w:rPr><w:rFonts w:ascii="Times New Roman" w:hAnsi="Times New Roman" w:eastAsia="Times New Roman" w:cs="Times New Roman"/><w:sz w:val="19"/><w:szCs w:val="19"/></w:rPr><w:t xml:space="preserve">50</w:t></w:r></w:p></w:tc><w:tc><w:tcPr><w:tcW w:w="1100" w:type="dxa"/><w:noWrap/></w:tcPr><w:p><w:pPr><w:jc w:val="center"/></w:pPr><w:r><w:rPr><w:rFonts w:ascii="Times New Roman" w:hAnsi="Times New Roman" w:eastAsia="Times New Roman" w:cs="Times New Roman"/><w:sz w:val="19"/><w:szCs w:val="19"/></w:rPr><w:t xml:space="preserve">UNIQUE</w:t></w:r></w:p></w:tc></w:tr><w:tr><w:trPr/><w:tc><w:tcPr><w:tcW w:w="500" w:type="dxa"/><w:noWrap/></w:tcPr><w:p><w:pPr><w:jc w:val="center"/></w:pPr><w:r><w:rPr><w:rFonts w:ascii="Times New Roman" w:hAnsi="Times New Roman" w:eastAsia="Times New Roman" w:cs="Times New Roman"/><w:sz w:val="19"/><w:szCs w:val="19"/></w:rPr><w:t xml:space="preserve">3</w:t></w:r></w:p></w:tc><w:tc><w:tcPr><w:tcW w:w="2200" w:type="dxa"/><w:noWrap/></w:tcPr><w:p><w:pPr><w:jc w:val="start"/></w:pPr><w:r><w:rPr><w:rFonts w:ascii="Times New Roman" w:hAnsi="Times New Roman" w:eastAsia="Times New Roman" w:cs="Times New Roman"/><w:sz w:val="19"/><w:szCs w:val="19"/><w:b w:val="1"/><w:bCs w:val="1"/></w:rPr><w:t xml:space="preserve">password</w:t></w:r></w:p></w:tc><w:tc><w:tcPr><w:tcW w:w="3000" w:type="dxa"/><w:noWrap/></w:tcPr><w:p><w:pPr><w:jc w:val="start"/></w:pPr><w:r><w:rPr><w:rFonts w:ascii="Times New Roman" w:hAnsi="Times New Roman" w:eastAsia="Times New Roman" w:cs="Times New Roman"/><w:sz w:val="19"/><w:szCs w:val="19"/></w:rPr><w:t xml:space="preserve">Kata Sandi Terenkripsi (bcrypt)</w:t></w:r></w:p></w:tc><w:tc><w:tcPr><w:tcW w:w="1300" w:type="dxa"/><w:noWrap/></w:tcPr><w:p><w:pPr><w:jc w:val="center"/></w:pPr><w:r><w:rPr><w:rFonts w:ascii="Times New Roman" w:hAnsi="Times New Roman" w:eastAsia="Times New Roman" w:cs="Times New Roman"/><w:sz w:val="19"/><w:szCs w:val="19"/></w:rPr><w:t xml:space="preserve">VARCHAR</w:t></w:r></w:p></w:tc><w:tc><w:tcPr><w:tcW w:w="1100" w:type="dxa"/><w:noWrap/></w:tcPr><w:p><w:pPr><w:jc w:val="center"/></w:pPr><w:r><w:rPr><w:rFonts w:ascii="Times New Roman" w:hAnsi="Times New Roman" w:eastAsia="Times New Roman" w:cs="Times New Roman"/><w:sz w:val="19"/><w:szCs w:val="19"/></w:rPr><w:t xml:space="preserve">255</w:t></w:r></w:p></w:tc><w:tc><w:tcPr><w:tcW w:w="1100" w:type="dxa"/><w:noWrap/></w:tcPr><w:p><w:pPr><w:jc w:val="center"/></w:pPr><w:r><w:rPr><w:rFonts w:ascii="Times New Roman" w:hAnsi="Times New Roman" w:eastAsia="Times New Roman" w:cs="Times New Roman"/><w:sz w:val="19"/><w:szCs w:val="19"/></w:rPr><w:t xml:space="preserve">Not Null</w:t></w:r></w:p></w:tc></w:tr><w:tr><w:trPr/><w:tc><w:tcPr><w:tcW w:w="500" w:type="dxa"/><w:noWrap/></w:tcPr><w:p><w:pPr><w:jc w:val="center"/></w:pPr><w:r><w:rPr><w:rFonts w:ascii="Times New Roman" w:hAnsi="Times New Roman" w:eastAsia="Times New Roman" w:cs="Times New Roman"/><w:sz w:val="19"/><w:szCs w:val="19"/></w:rPr><w:t xml:space="preserve">4</w:t></w:r></w:p></w:tc><w:tc><w:tcPr><w:tcW w:w="2200" w:type="dxa"/><w:noWrap/></w:tcPr><w:p><w:pPr><w:jc w:val="start"/></w:pPr><w:r><w:rPr><w:rFonts w:ascii="Times New Roman" w:hAnsi="Times New Roman" w:eastAsia="Times New Roman" w:cs="Times New Roman"/><w:sz w:val="19"/><w:szCs w:val="19"/><w:b w:val="1"/><w:bCs w:val="1"/></w:rPr><w:t xml:space="preserve">role</w:t></w:r></w:p></w:tc><w:tc><w:tcPr><w:tcW w:w="3000" w:type="dxa"/><w:noWrap/></w:tcPr><w:p><w:pPr><w:jc w:val="start"/></w:pPr><w:r><w:rPr><w:rFonts w:ascii="Times New Roman" w:hAnsi="Times New Roman" w:eastAsia="Times New Roman" w:cs="Times New Roman"/><w:sz w:val="19"/><w:szCs w:val="19"/></w:rPr><w:t xml:space="preserve">Peran Otoritas (admin / personel)</w:t></w:r></w:p></w:tc><w:tc><w:tcPr><w:tcW w:w="1300" w:type="dxa"/><w:noWrap/></w:tcPr><w:p><w:pPr><w:jc w:val="center"/></w:pPr><w:r><w:rPr><w:rFonts w:ascii="Times New Roman" w:hAnsi="Times New Roman" w:eastAsia="Times New Roman" w:cs="Times New Roman"/><w:sz w:val="19"/><w:szCs w:val="19"/></w:rPr><w:t xml:space="preserve">ENUM</w:t></w:r></w:p></w:tc><w:tc><w:tcPr><w:tcW w:w="1100" w:type="dxa"/><w:noWrap/></w:tcPr><w:p><w:pPr><w:jc w:val="center"/></w:pPr><w:r><w:rPr><w:rFonts w:ascii="Times New Roman" w:hAnsi="Times New Roman" w:eastAsia="Times New Roman" w:cs="Times New Roman"/><w:sz w:val="19"/><w:szCs w:val="19"/></w:rPr><w:t xml:space="preserve">10</w:t></w:r></w:p></w:tc><w:tc><w:tcPr><w:tcW w:w="1100" w:type="dxa"/><w:noWrap/></w:tcPr><w:p><w:pPr><w:jc w:val="center"/></w:pPr><w:r><w:rPr><w:rFonts w:ascii="Times New Roman" w:hAnsi="Times New Roman" w:eastAsia="Times New Roman" w:cs="Times New Roman"/><w:sz w:val="19"/><w:szCs w:val="19"/></w:rPr><w:t xml:space="preserve">Not Null</w:t></w:r></w:p></w:tc></w:tr><w:tr><w:trPr/><w:tc><w:tcPr><w:tcW w:w="500" w:type="dxa"/><w:noWrap/></w:tcPr><w:p><w:pPr><w:jc w:val="center"/></w:pPr><w:r><w:rPr><w:rFonts w:ascii="Times New Roman" w:hAnsi="Times New Roman" w:eastAsia="Times New Roman" w:cs="Times New Roman"/><w:sz w:val="19"/><w:szCs w:val="19"/></w:rPr><w:t xml:space="preserve">5</w:t></w:r></w:p></w:tc><w:tc><w:tcPr><w:tcW w:w="2200" w:type="dxa"/><w:noWrap/></w:tcPr><w:p><w:pPr><w:jc w:val="start"/></w:pPr><w:r><w:rPr><w:rFonts w:ascii="Times New Roman" w:hAnsi="Times New Roman" w:eastAsia="Times New Roman" w:cs="Times New Roman"/><w:sz w:val="19"/><w:szCs w:val="19"/><w:b w:val="1"/><w:bCs w:val="1"/></w:rPr><w:t xml:space="preserve">personel_id</w:t></w:r></w:p></w:tc><w:tc><w:tcPr><w:tcW w:w="3000" w:type="dxa"/><w:noWrap/></w:tcPr><w:p><w:pPr><w:jc w:val="start"/></w:pPr><w:r><w:rPr><w:rFonts w:ascii="Times New Roman" w:hAnsi="Times New Roman" w:eastAsia="Times New Roman" w:cs="Times New Roman"/><w:sz w:val="19"/><w:szCs w:val="19"/></w:rPr><w:t xml:space="preserve">Relasi ke Tabel Personel</w:t></w:r></w:p></w:tc><w:tc><w:tcPr><w:tcW w:w="1300" w:type="dxa"/><w:noWrap/></w:tcPr><w:p><w:pPr><w:jc w:val="center"/></w:pPr><w:r><w:rPr><w:rFonts w:ascii="Times New Roman" w:hAnsi="Times New Roman" w:eastAsia="Times New Roman" w:cs="Times New Roman"/><w:sz w:val="19"/><w:szCs w:val="19"/></w:rPr><w:t xml:space="preserve">INT</w:t></w:r></w:p></w:tc><w:tc><w:tcPr><w:tcW w:w="1100" w:type="dxa"/><w:noWrap/></w:tcPr><w:p><w:pPr><w:jc w:val="center"/></w:pPr><w:r><w:rPr><w:rFonts w:ascii="Times New Roman" w:hAnsi="Times New Roman" w:eastAsia="Times New Roman" w:cs="Times New Roman"/><w:sz w:val="19"/><w:szCs w:val="19"/></w:rPr><w:t xml:space="preserve">11</w:t></w:r></w:p></w:tc><w:tc><w:tcPr><w:tcW w:w="1100" w:type="dxa"/><w:noWrap/></w:tcPr><w:p><w:pPr><w:jc w:val="center"/></w:pPr><w:r><w:rPr><w:rFonts w:ascii="Times New Roman" w:hAnsi="Times New Roman" w:eastAsia="Times New Roman" w:cs="Times New Roman"/><w:sz w:val="19"/><w:szCs w:val="19"/></w:rPr><w:t xml:space="preserve">FK, UNIQUE</w:t></w:r></w:p></w:tc></w:tr><w:tr><w:trPr/><w:tc><w:tcPr><w:tcW w:w="500" w:type="dxa"/><w:noWrap/></w:tcPr><w:p><w:pPr><w:jc w:val="center"/></w:pPr><w:r><w:rPr><w:rFonts w:ascii="Times New Roman" w:hAnsi="Times New Roman" w:eastAsia="Times New Roman" w:cs="Times New Roman"/><w:sz w:val="19"/><w:szCs w:val="19"/></w:rPr><w:t xml:space="preserve">6</w:t></w:r></w:p></w:tc><w:tc><w:tcPr><w:tcW w:w="2200" w:type="dxa"/><w:noWrap/></w:tcPr><w:p><w:pPr><w:jc w:val="start"/></w:pPr><w:r><w:rPr><w:rFonts w:ascii="Times New Roman" w:hAnsi="Times New Roman" w:eastAsia="Times New Roman" w:cs="Times New Roman"/><w:sz w:val="19"/><w:szCs w:val="19"/><w:b w:val="1"/><w:bCs w:val="1"/></w:rPr><w:t xml:space="preserve">status</w:t></w:r></w:p></w:tc><w:tc><w:tcPr><w:tcW w:w="3000" w:type="dxa"/><w:noWrap/></w:tcPr><w:p><w:pPr><w:jc w:val="start"/></w:pPr><w:r><w:rPr><w:rFonts w:ascii="Times New Roman" w:hAnsi="Times New Roman" w:eastAsia="Times New Roman" w:cs="Times New Roman"/><w:sz w:val="19"/><w:szCs w:val="19"/></w:rPr><w:t xml:space="preserve">Status Akun (pending/approved)</w:t></w:r></w:p></w:tc><w:tc><w:tcPr><w:tcW w:w="1300" w:type="dxa"/><w:noWrap/></w:tcPr><w:p><w:pPr><w:jc w:val="center"/></w:pPr><w:r><w:rPr><w:rFonts w:ascii="Times New Roman" w:hAnsi="Times New Roman" w:eastAsia="Times New Roman" w:cs="Times New Roman"/><w:sz w:val="19"/><w:szCs w:val="19"/></w:rPr><w:t xml:space="preserve">ENUM</w:t></w:r></w:p></w:tc><w:tc><w:tcPr><w:tcW w:w="1100" w:type="dxa"/><w:noWrap/></w:tcPr><w:p><w:pPr><w:jc w:val="center"/></w:pPr><w:r><w:rPr><w:rFonts w:ascii="Times New Roman" w:hAnsi="Times New Roman" w:eastAsia="Times New Roman" w:cs="Times New Roman"/><w:sz w:val="19"/><w:szCs w:val="19"/></w:rPr><w:t xml:space="preserve">15</w:t></w:r></w:p></w:tc><w:tc><w:tcPr><w:tcW w:w="1100" w:type="dxa"/><w:noWrap/></w:tcPr><w:p><w:pPr><w:jc w:val="center"/></w:pPr><w:r><w:rPr><w:rFonts w:ascii="Times New Roman" w:hAnsi="Times New Roman" w:eastAsia="Times New Roman" w:cs="Times New Roman"/><w:sz w:val="19"/><w:szCs w:val="19"/></w:rPr><w:t xml:space="preserve">Def 'pending'</w:t></w:r></w:p></w:tc></w:tr><w:tr><w:trPr/><w:tc><w:tcPr><w:tcW w:w="500" w:type="dxa"/><w:noWrap/></w:tcPr><w:p><w:pPr><w:jc w:val="center"/></w:pPr><w:r><w:rPr><w:rFonts w:ascii="Times New Roman" w:hAnsi="Times New Roman" w:eastAsia="Times New Roman" w:cs="Times New Roman"/><w:sz w:val="19"/><w:szCs w:val="19"/></w:rPr><w:t xml:space="preserve">7</w:t></w:r></w:p></w:tc><w:tc><w:tcPr><w:tcW w:w="2200" w:type="dxa"/><w:noWrap/></w:tcPr><w:p><w:pPr><w:jc w:val="start"/></w:pPr><w:r><w:rPr><w:rFonts w:ascii="Times New Roman" w:hAnsi="Times New Roman" w:eastAsia="Times New Roman" w:cs="Times New Roman"/><w:sz w:val="19"/><w:szCs w:val="19"/><w:b w:val="1"/><w:bCs w:val="1"/></w:rPr><w:t xml:space="preserve">catatan_approval</w:t></w:r></w:p></w:tc><w:tc><w:tcPr><w:tcW w:w="3000" w:type="dxa"/><w:noWrap/></w:tcPr><w:p><w:pPr><w:jc w:val="start"/></w:pPr><w:r><w:rPr><w:rFonts w:ascii="Times New Roman" w:hAnsi="Times New Roman" w:eastAsia="Times New Roman" w:cs="Times New Roman"/><w:sz w:val="19"/><w:szCs w:val="19"/></w:rPr><w:t xml:space="preserve">Catatan Evaluasi Admin</w:t></w:r></w:p></w:tc><w:tc><w:tcPr><w:tcW w:w="1300" w:type="dxa"/><w:noWrap/></w:tcPr><w:p><w:pPr><w:jc w:val="center"/></w:pPr><w:r><w:rPr><w:rFonts w:ascii="Times New Roman" w:hAnsi="Times New Roman" w:eastAsia="Times New Roman" w:cs="Times New Roman"/><w:sz w:val="19"/><w:szCs w:val="19"/></w:rPr><w:t xml:space="preserve">TEXT</w:t></w:r></w:p></w:tc><w:tc><w:tcPr><w:tcW w:w="1100" w:type="dxa"/><w:noWrap/></w:tcPr><w:p><w:pPr><w:jc w:val="center"/></w:pPr><w:r><w:rPr><w:rFonts w:ascii="Times New Roman" w:hAnsi="Times New Roman" w:eastAsia="Times New Roman" w:cs="Times New Roman"/><w:sz w:val="19"/><w:szCs w:val="19"/></w:rPr><w:t xml:space="preserve">-</w:t></w:r></w:p></w:tc><w:tc><w:tcPr><w:tcW w:w="1100" w:type="dxa"/><w:noWrap/></w:tcPr><w:p><w:pPr><w:jc w:val="center"/></w:pPr><w:r><w:rPr><w:rFonts w:ascii="Times New Roman" w:hAnsi="Times New Roman" w:eastAsia="Times New Roman" w:cs="Times New Roman"/><w:sz w:val="19"/><w:szCs w:val="19"/></w:rPr><w:t xml:space="preserve">Nullable</w:t></w:r></w:p></w:tc></w:tr><w:tr><w:trPr/><w:tc><w:tcPr><w:tcW w:w="500" w:type="dxa"/><w:noWrap/></w:tcPr><w:p><w:pPr><w:jc w:val="center"/></w:pPr><w:r><w:rPr><w:rFonts w:ascii="Times New Roman" w:hAnsi="Times New Roman" w:eastAsia="Times New Roman" w:cs="Times New Roman"/><w:sz w:val="19"/><w:szCs w:val="19"/></w:rPr><w:t xml:space="preserve">8</w:t></w:r></w:p></w:tc><w:tc><w:tcPr><w:tcW w:w="2200" w:type="dxa"/><w:noWrap/></w:tcPr><w:p><w:pPr><w:jc w:val="start"/></w:pPr><w:r><w:rPr><w:rFonts w:ascii="Times New Roman" w:hAnsi="Times New Roman" w:eastAsia="Times New Roman" w:cs="Times New Roman"/><w:sz w:val="19"/><w:szCs w:val="19"/><w:b w:val="1"/><w:bCs w:val="1"/></w:rPr><w:t xml:space="preserve">last_login</w:t></w:r></w:p></w:tc><w:tc><w:tcPr><w:tcW w:w="3000" w:type="dxa"/><w:noWrap/></w:tcPr><w:p><w:pPr><w:jc w:val="start"/></w:pPr><w:r><w:rPr><w:rFonts w:ascii="Times New Roman" w:hAnsi="Times New Roman" w:eastAsia="Times New Roman" w:cs="Times New Roman"/><w:sz w:val="19"/><w:szCs w:val="19"/></w:rPr><w:t xml:space="preserve">Waktu Akses Terakhir</w:t></w:r></w:p></w:tc><w:tc><w:tcPr><w:tcW w:w="1300" w:type="dxa"/><w:noWrap/></w:tcPr><w:p><w:pPr><w:jc w:val="center"/></w:pPr><w:r><w:rPr><w:rFonts w:ascii="Times New Roman" w:hAnsi="Times New Roman" w:eastAsia="Times New Roman" w:cs="Times New Roman"/><w:sz w:val="19"/><w:szCs w:val="19"/></w:rPr><w:t xml:space="preserve">DATETIME</w:t></w:r></w:p></w:tc><w:tc><w:tcPr><w:tcW w:w="1100" w:type="dxa"/><w:noWrap/></w:tcPr><w:p><w:pPr><w:jc w:val="center"/></w:pPr><w:r><w:rPr><w:rFonts w:ascii="Times New Roman" w:hAnsi="Times New Roman" w:eastAsia="Times New Roman" w:cs="Times New Roman"/><w:sz w:val="19"/><w:szCs w:val="19"/></w:rPr><w:t xml:space="preserve">19</w:t></w:r></w:p></w:tc><w:tc><w:tcPr><w:tcW w:w="1100" w:type="dxa"/><w:noWrap/></w:tcPr><w:p><w:pPr><w:jc w:val="center"/></w:pPr><w:r><w:rPr><w:rFonts w:ascii="Times New Roman" w:hAnsi="Times New Roman" w:eastAsia="Times New Roman" w:cs="Times New Roman"/><w:sz w:val="19"/><w:szCs w:val="19"/></w:rPr><w:t xml:space="preserve">Nullable</w:t></w:r></w:p></w:tc></w:tr><w:tr><w:trPr/><w:tc><w:tcPr><w:tcW w:w="500" w:type="dxa"/><w:noWrap/></w:tcPr><w:p><w:pPr><w:jc w:val="center"/></w:pPr><w:r><w:rPr><w:rFonts w:ascii="Times New Roman" w:hAnsi="Times New Roman" w:eastAsia="Times New Roman" w:cs="Times New Roman"/><w:sz w:val="19"/><w:szCs w:val="19"/></w:rPr><w:t xml:space="preserve">9</w:t></w:r></w:p></w:tc><w:tc><w:tcPr><w:tcW w:w="2200" w:type="dxa"/><w:noWrap/></w:tcPr><w:p><w:pPr><w:jc w:val="start"/></w:pPr><w:r><w:rPr><w:rFonts w:ascii="Times New Roman" w:hAnsi="Times New Roman" w:eastAsia="Times New Roman" w:cs="Times New Roman"/><w:sz w:val="19"/><w:szCs w:val="19"/><w:b w:val="1"/><w:bCs w:val="1"/></w:rPr><w:t xml:space="preserve">theme_pref</w:t></w:r></w:p></w:tc><w:tc><w:tcPr><w:tcW w:w="3000" w:type="dxa"/><w:noWrap/></w:tcPr><w:p><w:pPr><w:jc w:val="start"/></w:pPr><w:r><w:rPr><w:rFonts w:ascii="Times New Roman" w:hAnsi="Times New Roman" w:eastAsia="Times New Roman" w:cs="Times New Roman"/><w:sz w:val="19"/><w:szCs w:val="19"/></w:rPr><w:t xml:space="preserve">Preferensi Tema (dark/light)</w:t></w:r></w:p></w:tc><w:tc><w:tcPr><w:tcW w:w="1300" w:type="dxa"/><w:noWrap/></w:tcPr><w:p><w:pPr><w:jc w:val="center"/></w:pPr><w:r><w:rPr><w:rFonts w:ascii="Times New Roman" w:hAnsi="Times New Roman" w:eastAsia="Times New Roman" w:cs="Times New Roman"/><w:sz w:val="19"/><w:szCs w:val="19"/></w:rPr><w:t xml:space="preserve">ENUM</w:t></w:r></w:p></w:tc><w:tc><w:tcPr><w:tcW w:w="1100" w:type="dxa"/><w:noWrap/></w:tcPr><w:p><w:pPr><w:jc w:val="center"/></w:pPr><w:r><w:rPr><w:rFonts w:ascii="Times New Roman" w:hAnsi="Times New Roman" w:eastAsia="Times New Roman" w:cs="Times New Roman"/><w:sz w:val="19"/><w:szCs w:val="19"/></w:rPr><w:t xml:space="preserve">5</w:t></w:r></w:p></w:tc><w:tc><w:tcPr><w:tcW w:w="1100" w:type="dxa"/><w:noWrap/></w:tcPr><w:p><w:pPr><w:jc w:val="center"/></w:pPr><w:r><w:rPr><w:rFonts w:ascii="Times New Roman" w:hAnsi="Times New Roman" w:eastAsia="Times New Roman" w:cs="Times New Roman"/><w:sz w:val="19"/><w:szCs w:val="19"/></w:rPr><w:t xml:space="preserve">Def 'dark'</w:t></w:r></w:p></w:tc></w:tr><w:tr><w:trPr/><w:tc><w:tcPr><w:tcW w:w="500" w:type="dxa"/><w:noWrap/></w:tcPr><w:p><w:pPr><w:jc w:val="center"/></w:pPr><w:r><w:rPr><w:rFonts w:ascii="Times New Roman" w:hAnsi="Times New Roman" w:eastAsia="Times New Roman" w:cs="Times New Roman"/><w:sz w:val="19"/><w:szCs w:val="19"/></w:rPr><w:t xml:space="preserve">10</w:t></w:r></w:p></w:tc><w:tc><w:tcPr><w:tcW w:w="2200" w:type="dxa"/><w:noWrap/></w:tcPr><w:p><w:pPr><w:jc w:val="start"/></w:pPr><w:r><w:rPr><w:rFonts w:ascii="Times New Roman" w:hAnsi="Times New Roman" w:eastAsia="Times New Roman" w:cs="Times New Roman"/><w:sz w:val="19"/><w:szCs w:val="19"/><w:b w:val="1"/><w:bCs w:val="1"/></w:rPr><w:t xml:space="preserve">created_at</w:t></w:r></w:p></w:tc><w:tc><w:tcPr><w:tcW w:w="3000" w:type="dxa"/><w:noWrap/></w:tcPr><w:p><w:pPr><w:jc w:val="start"/></w:pPr><w:r><w:rPr><w:rFonts w:ascii="Times New Roman" w:hAnsi="Times New Roman" w:eastAsia="Times New Roman" w:cs="Times New Roman"/><w:sz w:val="19"/><w:szCs w:val="19"/></w:rPr><w:t xml:space="preserve">Waktu Pendaftaran Akun</w:t></w:r></w:p></w:tc><w:tc><w:tcPr><w:tcW w:w="1300" w:type="dxa"/><w:noWrap/></w:tcPr><w:p><w:pPr><w:jc w:val="center"/></w:pPr><w:r><w:rPr><w:rFonts w:ascii="Times New Roman" w:hAnsi="Times New Roman" w:eastAsia="Times New Roman" w:cs="Times New Roman"/><w:sz w:val="19"/><w:szCs w:val="19"/></w:rPr><w:t xml:space="preserve">TIMESTAMP</w:t></w:r></w:p></w:tc><w:tc><w:tcPr><w:tcW w:w="1100" w:type="dxa"/><w:noWrap/></w:tcPr><w:p><w:pPr><w:jc w:val="center"/></w:pPr><w:r><w:rPr><w:rFonts w:ascii="Times New Roman" w:hAnsi="Times New Roman" w:eastAsia="Times New Roman" w:cs="Times New Roman"/><w:sz w:val="19"/><w:szCs w:val="19"/></w:rPr><w:t xml:space="preserve">19</w:t></w:r></w:p></w:tc><w:tc><w:tcPr><w:tcW w:w="1100" w:type="dxa"/><w:noWrap/></w:tcPr><w:p><w:pPr><w:jc w:val="center"/></w:pPr><w:r><w:rPr><w:rFonts w:ascii="Times New Roman" w:hAnsi="Times New Roman" w:eastAsia="Times New Roman" w:cs="Times New Roman"/><w:sz w:val="19"/><w:szCs w:val="19"/></w:rPr><w:t xml:space="preserve">Auto Stamp</w:t></w:r></w:p></w:tc></w:tr></w:tbl><w:p/><w:p><w:r><w:br w:type="page"/></w:r></w:p><w:p><w:pPr><w:spacing w:after="40"/></w:pPr><w:r><w:rPr><w:rFonts w:ascii="Times New Roman" w:hAnsi="Times New Roman" w:eastAsia="Times New Roman" w:cs="Times New Roman"/><w:sz w:val="22"/><w:szCs w:val="22"/><w:b w:val="1"/><w:bCs w:val="1"/></w:rPr><w:t xml:space="preserve">c.   Struktur File / Tabel: DOSIR_MASTER (Master 33 Jenis Dosir Baku TNI AD)</w:t></w:r></w:p><w:tbl><w:tblGrid><w:gridCol w:w="500" w:type="dxa"/><w:gridCol w:w="2200" w:type="dxa"/><w:gridCol w:w="3000" w:type="dxa"/><w:gridCol w:w="1300" w:type="dxa"/><w:gridCol w:w="1100" w:type="dxa"/><w:gridCol w:w="1100" w:type="dxa"/></w:tblGrid><w:tblPr><w:tblStyle w:val="MilitaryTable"/></w:tblPr><w:tr><w:trPr/><w:tc><w:tcPr><w:tcW w:w="500" w:type="dxa"/><w:shd w:val="clear" w:fill="EAEAEA"/><w:noWrap/></w:tcPr><w:p><w:pPr><w:jc w:val="center"/></w:pPr><w:r><w:rPr><w:rFonts w:ascii="Times New Roman" w:hAnsi="Times New Roman" w:eastAsia="Times New Roman" w:cs="Times New Roman"/><w:sz w:val="20"/><w:szCs w:val="20"/><w:b w:val="1"/><w:bCs w:val="1"/></w:rPr><w:t xml:space="preserve">No</w:t></w:r></w:p></w:tc><w:tc><w:tcPr><w:tcW w:w="2200" w:type="dxa"/><w:shd w:val="clear" w:fill="EAEAEA"/><w:noWrap/></w:tcPr><w:p><w:pPr><w:jc w:val="center"/></w:pPr><w:r><w:rPr><w:rFonts w:ascii="Times New Roman" w:hAnsi="Times New Roman" w:eastAsia="Times New Roman" w:cs="Times New Roman"/><w:sz w:val="20"/><w:szCs w:val="20"/><w:b w:val="1"/><w:bCs w:val="1"/></w:rPr><w:t xml:space="preserve">Nama Field</w:t></w:r></w:p></w:tc><w:tc><w:tcPr><w:tcW w:w="3000" w:type="dxa"/><w:shd w:val="clear" w:fill="EAEAEA"/><w:noWrap/></w:tcPr><w:p><w:pPr><w:jc w:val="center"/></w:pPr><w:r><w:rPr><w:rFonts w:ascii="Times New Roman" w:hAnsi="Times New Roman" w:eastAsia="Times New Roman" w:cs="Times New Roman"/><w:sz w:val="20"/><w:szCs w:val="20"/><w:b w:val="1"/><w:bCs w:val="1"/></w:rPr><w:t xml:space="preserve">Uraian / Sebutan</w:t></w:r></w:p></w:tc><w:tc><w:tcPr><w:tcW w:w="1300" w:type="dxa"/><w:shd w:val="clear" w:fill="EAEAEA"/><w:noWrap/></w:tcPr><w:p><w:pPr><w:jc w:val="center"/></w:pPr><w:r><w:rPr><w:rFonts w:ascii="Times New Roman" w:hAnsi="Times New Roman" w:eastAsia="Times New Roman" w:cs="Times New Roman"/><w:sz w:val="20"/><w:szCs w:val="20"/><w:b w:val="1"/><w:bCs w:val="1"/></w:rPr><w:t xml:space="preserve">Type</w:t></w:r></w:p></w:tc><w:tc><w:tcPr><w:tcW w:w="1100" w:type="dxa"/><w:shd w:val="clear" w:fill="EAEAEA"/><w:noWrap/></w:tcPr><w:p><w:pPr><w:jc w:val="center"/></w:pPr><w:r><w:rPr><w:rFonts w:ascii="Times New Roman" w:hAnsi="Times New Roman" w:eastAsia="Times New Roman" w:cs="Times New Roman"/><w:sz w:val="20"/><w:szCs w:val="20"/><w:b w:val="1"/><w:bCs w:val="1"/></w:rPr><w:t xml:space="preserve">Lebar</w:t></w:r></w:p></w:tc><w:tc><w:tcPr><w:tcW w:w="1100" w:type="dxa"/><w:shd w:val="clear" w:fill="EAEAEA"/><w:noWrap/></w:tcPr><w:p><w:pPr><w:jc w:val="center"/></w:pPr><w:r><w:rPr><w:rFonts w:ascii="Times New Roman" w:hAnsi="Times New Roman" w:eastAsia="Times New Roman" w:cs="Times New Roman"/><w:sz w:val="20"/><w:szCs w:val="20"/><w:b w:val="1"/><w:bCs w:val="1"/></w:rPr><w:t xml:space="preserve">Ket</w:t></w:r></w:p></w:tc></w:tr><w:tr><w:trPr/><w:tc><w:tcPr><w:tcW w:w="500" w:type="dxa"/><w:noWrap/></w:tcPr><w:p><w:pPr><w:jc w:val="center"/></w:pPr><w:r><w:rPr><w:rFonts w:ascii="Times New Roman" w:hAnsi="Times New Roman" w:eastAsia="Times New Roman" w:cs="Times New Roman"/><w:sz w:val="19"/><w:szCs w:val="19"/></w:rPr><w:t xml:space="preserve">1</w:t></w:r></w:p></w:tc><w:tc><w:tcPr><w:tcW w:w="2200" w:type="dxa"/><w:noWrap/></w:tcPr><w:p><w:pPr><w:jc w:val="start"/></w:pPr><w:r><w:rPr><w:rFonts w:ascii="Times New Roman" w:hAnsi="Times New Roman" w:eastAsia="Times New Roman" w:cs="Times New Roman"/><w:sz w:val="19"/><w:szCs w:val="19"/><w:b w:val="1"/><w:bCs w:val="1"/></w:rPr><w:t xml:space="preserve">kode</w:t></w:r></w:p></w:tc><w:tc><w:tcPr><w:tcW w:w="3000" w:type="dxa"/><w:noWrap/></w:tcPr><w:p><w:pPr><w:jc w:val="start"/></w:pPr><w:r><w:rPr><w:rFonts w:ascii="Times New Roman" w:hAnsi="Times New Roman" w:eastAsia="Times New Roman" w:cs="Times New Roman"/><w:sz w:val="19"/><w:szCs w:val="19"/></w:rPr><w:t xml:space="preserve">Kode Baku 2 Digit Dosir ('01'..'33')</w:t></w:r></w:p></w:tc><w:tc><w:tcPr><w:tcW w:w="1300" w:type="dxa"/><w:noWrap/></w:tcPr><w:p><w:pPr><w:jc w:val="center"/></w:pPr><w:r><w:rPr><w:rFonts w:ascii="Times New Roman" w:hAnsi="Times New Roman" w:eastAsia="Times New Roman" w:cs="Times New Roman"/><w:sz w:val="19"/><w:szCs w:val="19"/></w:rPr><w:t xml:space="preserve">VARCHAR</w:t></w:r></w:p></w:tc><w:tc><w:tcPr><w:tcW w:w="1100" w:type="dxa"/><w:noWrap/></w:tcPr><w:p><w:pPr><w:jc w:val="center"/></w:pPr><w:r><w:rPr><w:rFonts w:ascii="Times New Roman" w:hAnsi="Times New Roman" w:eastAsia="Times New Roman" w:cs="Times New Roman"/><w:sz w:val="19"/><w:szCs w:val="19"/></w:rPr><w:t xml:space="preserve">2</w:t></w:r></w:p></w:tc><w:tc><w:tcPr><w:tcW w:w="1100" w:type="dxa"/><w:noWrap/></w:tcPr><w:p><w:pPr><w:jc w:val="center"/></w:pPr><w:r><w:rPr><w:rFonts w:ascii="Times New Roman" w:hAnsi="Times New Roman" w:eastAsia="Times New Roman" w:cs="Times New Roman"/><w:sz w:val="19"/><w:szCs w:val="19"/></w:rPr><w:t xml:space="preserve">PK</w:t></w:r></w:p></w:tc></w:tr><w:tr><w:trPr/><w:tc><w:tcPr><w:tcW w:w="500" w:type="dxa"/><w:noWrap/></w:tcPr><w:p><w:pPr><w:jc w:val="center"/></w:pPr><w:r><w:rPr><w:rFonts w:ascii="Times New Roman" w:hAnsi="Times New Roman" w:eastAsia="Times New Roman" w:cs="Times New Roman"/><w:sz w:val="19"/><w:szCs w:val="19"/></w:rPr><w:t xml:space="preserve">2</w:t></w:r></w:p></w:tc><w:tc><w:tcPr><w:tcW w:w="2200" w:type="dxa"/><w:noWrap/></w:tcPr><w:p><w:pPr><w:jc w:val="start"/></w:pPr><w:r><w:rPr><w:rFonts w:ascii="Times New Roman" w:hAnsi="Times New Roman" w:eastAsia="Times New Roman" w:cs="Times New Roman"/><w:sz w:val="19"/><w:szCs w:val="19"/><w:b w:val="1"/><w:bCs w:val="1"/></w:rPr><w:t xml:space="preserve">nama_dosir</w:t></w:r></w:p></w:tc><w:tc><w:tcPr><w:tcW w:w="3000" w:type="dxa"/><w:noWrap/></w:tcPr><w:p><w:pPr><w:jc w:val="start"/></w:pPr><w:r><w:rPr><w:rFonts w:ascii="Times New Roman" w:hAnsi="Times New Roman" w:eastAsia="Times New Roman" w:cs="Times New Roman"/><w:sz w:val="19"/><w:szCs w:val="19"/></w:rPr><w:t xml:space="preserve">Nomenklatur Resmi Jenis Dokumen</w:t></w:r></w:p></w:tc><w:tc><w:tcPr><w:tcW w:w="1300" w:type="dxa"/><w:noWrap/></w:tcPr><w:p><w:pPr><w:jc w:val="center"/></w:pPr><w:r><w:rPr><w:rFonts w:ascii="Times New Roman" w:hAnsi="Times New Roman" w:eastAsia="Times New Roman" w:cs="Times New Roman"/><w:sz w:val="19"/><w:szCs w:val="19"/></w:rPr><w:t xml:space="preserve">VARCHAR</w:t></w:r></w:p></w:tc><w:tc><w:tcPr><w:tcW w:w="1100" w:type="dxa"/><w:noWrap/></w:tcPr><w:p><w:pPr><w:jc w:val="center"/></w:pPr><w:r><w:rPr><w:rFonts w:ascii="Times New Roman" w:hAnsi="Times New Roman" w:eastAsia="Times New Roman" w:cs="Times New Roman"/><w:sz w:val="19"/><w:szCs w:val="19"/></w:rPr><w:t xml:space="preserve">180</w:t></w:r></w:p></w:tc><w:tc><w:tcPr><w:tcW w:w="1100" w:type="dxa"/><w:noWrap/></w:tcPr><w:p><w:pPr><w:jc w:val="center"/></w:pPr><w:r><w:rPr><w:rFonts w:ascii="Times New Roman" w:hAnsi="Times New Roman" w:eastAsia="Times New Roman" w:cs="Times New Roman"/><w:sz w:val="19"/><w:szCs w:val="19"/></w:rPr><w:t xml:space="preserve">Not Null</w:t></w:r></w:p></w:tc></w:tr><w:tr><w:trPr/><w:tc><w:tcPr><w:tcW w:w="500" w:type="dxa"/><w:noWrap/></w:tcPr><w:p><w:pPr><w:jc w:val="center"/></w:pPr><w:r><w:rPr><w:rFonts w:ascii="Times New Roman" w:hAnsi="Times New Roman" w:eastAsia="Times New Roman" w:cs="Times New Roman"/><w:sz w:val="19"/><w:szCs w:val="19"/></w:rPr><w:t xml:space="preserve">3</w:t></w:r></w:p></w:tc><w:tc><w:tcPr><w:tcW w:w="2200" w:type="dxa"/><w:noWrap/></w:tcPr><w:p><w:pPr><w:jc w:val="start"/></w:pPr><w:r><w:rPr><w:rFonts w:ascii="Times New Roman" w:hAnsi="Times New Roman" w:eastAsia="Times New Roman" w:cs="Times New Roman"/><w:sz w:val="19"/><w:szCs w:val="19"/><w:b w:val="1"/><w:bCs w:val="1"/></w:rPr><w:t xml:space="preserve">urutan</w:t></w:r></w:p></w:tc><w:tc><w:tcPr><w:tcW w:w="3000" w:type="dxa"/><w:noWrap/></w:tcPr><w:p><w:pPr><w:jc w:val="start"/></w:pPr><w:r><w:rPr><w:rFonts w:ascii="Times New Roman" w:hAnsi="Times New Roman" w:eastAsia="Times New Roman" w:cs="Times New Roman"/><w:sz w:val="19"/><w:szCs w:val="19"/></w:rPr><w:t xml:space="preserve">Urutan Penyusunan Berkas (1 s.d. 33)</w:t></w:r></w:p></w:tc><w:tc><w:tcPr><w:tcW w:w="1300" w:type="dxa"/><w:noWrap/></w:tcPr><w:p><w:pPr><w:jc w:val="center"/></w:pPr><w:r><w:rPr><w:rFonts w:ascii="Times New Roman" w:hAnsi="Times New Roman" w:eastAsia="Times New Roman" w:cs="Times New Roman"/><w:sz w:val="19"/><w:szCs w:val="19"/></w:rPr><w:t xml:space="preserve">INT</w:t></w:r></w:p></w:tc><w:tc><w:tcPr><w:tcW w:w="1100" w:type="dxa"/><w:noWrap/></w:tcPr><w:p><w:pPr><w:jc w:val="center"/></w:pPr><w:r><w:rPr><w:rFonts w:ascii="Times New Roman" w:hAnsi="Times New Roman" w:eastAsia="Times New Roman" w:cs="Times New Roman"/><w:sz w:val="19"/><w:szCs w:val="19"/></w:rPr><w:t xml:space="preserve">3</w:t></w:r></w:p></w:tc><w:tc><w:tcPr><w:tcW w:w="1100" w:type="dxa"/><w:noWrap/></w:tcPr><w:p><w:pPr><w:jc w:val="center"/></w:pPr><w:r><w:rPr><w:rFonts w:ascii="Times New Roman" w:hAnsi="Times New Roman" w:eastAsia="Times New Roman" w:cs="Times New Roman"/><w:sz w:val="19"/><w:szCs w:val="19"/></w:rPr><w:t xml:space="preserve">Not Null</w:t></w:r></w:p></w:tc></w:tr><w:tr><w:trPr/><w:tc><w:tcPr><w:tcW w:w="500" w:type="dxa"/><w:noWrap/></w:tcPr><w:p><w:pPr><w:jc w:val="center"/></w:pPr><w:r><w:rPr><w:rFonts w:ascii="Times New Roman" w:hAnsi="Times New Roman" w:eastAsia="Times New Roman" w:cs="Times New Roman"/><w:sz w:val="19"/><w:szCs w:val="19"/></w:rPr><w:t xml:space="preserve">4</w:t></w:r></w:p></w:tc><w:tc><w:tcPr><w:tcW w:w="2200" w:type="dxa"/><w:noWrap/></w:tcPr><w:p><w:pPr><w:jc w:val="start"/></w:pPr><w:r><w:rPr><w:rFonts w:ascii="Times New Roman" w:hAnsi="Times New Roman" w:eastAsia="Times New Roman" w:cs="Times New Roman"/><w:sz w:val="19"/><w:szCs w:val="19"/><w:b w:val="1"/><w:bCs w:val="1"/></w:rPr><w:t xml:space="preserve">wajib</w:t></w:r></w:p></w:tc><w:tc><w:tcPr><w:tcW w:w="3000" w:type="dxa"/><w:noWrap/></w:tcPr><w:p><w:pPr><w:jc w:val="start"/></w:pPr><w:r><w:rPr><w:rFonts w:ascii="Times New Roman" w:hAnsi="Times New Roman" w:eastAsia="Times New Roman" w:cs="Times New Roman"/><w:sz w:val="19"/><w:szCs w:val="19"/></w:rPr><w:t xml:space="preserve">Status Wajib Administrasi (1 = Ya)</w:t></w:r></w:p></w:tc><w:tc><w:tcPr><w:tcW w:w="1300" w:type="dxa"/><w:noWrap/></w:tcPr><w:p><w:pPr><w:jc w:val="center"/></w:pPr><w:r><w:rPr><w:rFonts w:ascii="Times New Roman" w:hAnsi="Times New Roman" w:eastAsia="Times New Roman" w:cs="Times New Roman"/><w:sz w:val="19"/><w:szCs w:val="19"/></w:rPr><w:t xml:space="preserve">TINYINT</w:t></w:r></w:p></w:tc><w:tc><w:tcPr><w:tcW w:w="1100" w:type="dxa"/><w:noWrap/></w:tcPr><w:p><w:pPr><w:jc w:val="center"/></w:pPr><w:r><w:rPr><w:rFonts w:ascii="Times New Roman" w:hAnsi="Times New Roman" w:eastAsia="Times New Roman" w:cs="Times New Roman"/><w:sz w:val="19"/><w:szCs w:val="19"/></w:rPr><w:t xml:space="preserve">1</w:t></w:r></w:p></w:tc><w:tc><w:tcPr><w:tcW w:w="1100" w:type="dxa"/><w:noWrap/></w:tcPr><w:p><w:pPr><w:jc w:val="center"/></w:pPr><w:r><w:rPr><w:rFonts w:ascii="Times New Roman" w:hAnsi="Times New Roman" w:eastAsia="Times New Roman" w:cs="Times New Roman"/><w:sz w:val="19"/><w:szCs w:val="19"/></w:rPr><w:t xml:space="preserve">Default 1</w:t></w:r></w:p></w:tc></w:tr></w:tbl><w:p/><w:p><w:pPr><w:spacing w:after="40"/></w:pPr><w:r><w:rPr><w:rFonts w:ascii="Times New Roman" w:hAnsi="Times New Roman" w:eastAsia="Times New Roman" w:cs="Times New Roman"/><w:sz w:val="22"/><w:szCs w:val="22"/><w:b w:val="1"/><w:bCs w:val="1"/></w:rPr><w:t xml:space="preserve">d.   Struktur File / Tabel: DOSIR_FILES (Metadata Arsip & Sertifikasi TTE)</w:t></w:r></w:p><w:tbl><w:tblGrid><w:gridCol w:w="500" w:type="dxa"/><w:gridCol w:w="2200" w:type="dxa"/><w:gridCol w:w="3000" w:type="dxa"/><w:gridCol w:w="1300" w:type="dxa"/><w:gridCol w:w="1100" w:type="dxa"/><w:gridCol w:w="1100" w:type="dxa"/></w:tblGrid><w:tblPr><w:tblStyle w:val="MilitaryTable"/></w:tblPr><w:tr><w:trPr/><w:tc><w:tcPr><w:tcW w:w="500" w:type="dxa"/><w:shd w:val="clear" w:fill="EAEAEA"/><w:noWrap/></w:tcPr><w:p><w:pPr><w:jc w:val="center"/></w:pPr><w:r><w:rPr><w:rFonts w:ascii="Times New Roman" w:hAnsi="Times New Roman" w:eastAsia="Times New Roman" w:cs="Times New Roman"/><w:sz w:val="20"/><w:szCs w:val="20"/><w:b w:val="1"/><w:bCs w:val="1"/></w:rPr><w:t xml:space="preserve">No</w:t></w:r></w:p></w:tc><w:tc><w:tcPr><w:tcW w:w="2200" w:type="dxa"/><w:shd w:val="clear" w:fill="EAEAEA"/><w:noWrap/></w:tcPr><w:p><w:pPr><w:jc w:val="center"/></w:pPr><w:r><w:rPr><w:rFonts w:ascii="Times New Roman" w:hAnsi="Times New Roman" w:eastAsia="Times New Roman" w:cs="Times New Roman"/><w:sz w:val="20"/><w:szCs w:val="20"/><w:b w:val="1"/><w:bCs w:val="1"/></w:rPr><w:t xml:space="preserve">Nama Field</w:t></w:r></w:p></w:tc><w:tc><w:tcPr><w:tcW w:w="3000" w:type="dxa"/><w:shd w:val="clear" w:fill="EAEAEA"/><w:noWrap/></w:tcPr><w:p><w:pPr><w:jc w:val="center"/></w:pPr><w:r><w:rPr><w:rFonts w:ascii="Times New Roman" w:hAnsi="Times New Roman" w:eastAsia="Times New Roman" w:cs="Times New Roman"/><w:sz w:val="20"/><w:szCs w:val="20"/><w:b w:val="1"/><w:bCs w:val="1"/></w:rPr><w:t xml:space="preserve">Uraian / Sebutan</w:t></w:r></w:p></w:tc><w:tc><w:tcPr><w:tcW w:w="1300" w:type="dxa"/><w:shd w:val="clear" w:fill="EAEAEA"/><w:noWrap/></w:tcPr><w:p><w:pPr><w:jc w:val="center"/></w:pPr><w:r><w:rPr><w:rFonts w:ascii="Times New Roman" w:hAnsi="Times New Roman" w:eastAsia="Times New Roman" w:cs="Times New Roman"/><w:sz w:val="20"/><w:szCs w:val="20"/><w:b w:val="1"/><w:bCs w:val="1"/></w:rPr><w:t xml:space="preserve">Type</w:t></w:r></w:p></w:tc><w:tc><w:tcPr><w:tcW w:w="1100" w:type="dxa"/><w:shd w:val="clear" w:fill="EAEAEA"/><w:noWrap/></w:tcPr><w:p><w:pPr><w:jc w:val="center"/></w:pPr><w:r><w:rPr><w:rFonts w:ascii="Times New Roman" w:hAnsi="Times New Roman" w:eastAsia="Times New Roman" w:cs="Times New Roman"/><w:sz w:val="20"/><w:szCs w:val="20"/><w:b w:val="1"/><w:bCs w:val="1"/></w:rPr><w:t xml:space="preserve">Lebar</w:t></w:r></w:p></w:tc><w:tc><w:tcPr><w:tcW w:w="1100" w:type="dxa"/><w:shd w:val="clear" w:fill="EAEAEA"/><w:noWrap/></w:tcPr><w:p><w:pPr><w:jc w:val="center"/></w:pPr><w:r><w:rPr><w:rFonts w:ascii="Times New Roman" w:hAnsi="Times New Roman" w:eastAsia="Times New Roman" w:cs="Times New Roman"/><w:sz w:val="20"/><w:szCs w:val="20"/><w:b w:val="1"/><w:bCs w:val="1"/></w:rPr><w:t xml:space="preserve">Ket</w:t></w:r></w:p></w:tc></w:tr><w:tr><w:trPr/><w:tc><w:tcPr><w:tcW w:w="500" w:type="dxa"/><w:noWrap/></w:tcPr><w:p><w:pPr><w:jc w:val="center"/></w:pPr><w:r><w:rPr><w:rFonts w:ascii="Times New Roman" w:hAnsi="Times New Roman" w:eastAsia="Times New Roman" w:cs="Times New Roman"/><w:sz w:val="19"/><w:szCs w:val="19"/></w:rPr><w:t xml:space="preserve">1</w:t></w:r></w:p></w:tc><w:tc><w:tcPr><w:tcW w:w="2200" w:type="dxa"/><w:noWrap/></w:tcPr><w:p><w:pPr><w:jc w:val="start"/></w:pPr><w:r><w:rPr><w:rFonts w:ascii="Times New Roman" w:hAnsi="Times New Roman" w:eastAsia="Times New Roman" w:cs="Times New Roman"/><w:sz w:val="19"/><w:szCs w:val="19"/><w:b w:val="1"/><w:bCs w:val="1"/></w:rPr><w:t xml:space="preserve">id</w:t></w:r></w:p></w:tc><w:tc><w:tcPr><w:tcW w:w="3000" w:type="dxa"/><w:noWrap/></w:tcPr><w:p><w:pPr><w:jc w:val="start"/></w:pPr><w:r><w:rPr><w:rFonts w:ascii="Times New Roman" w:hAnsi="Times New Roman" w:eastAsia="Times New Roman" w:cs="Times New Roman"/><w:sz w:val="19"/><w:szCs w:val="19"/></w:rPr><w:t xml:space="preserve">Nomor Unik Berkas Dosir</w:t></w:r></w:p></w:tc><w:tc><w:tcPr><w:tcW w:w="1300" w:type="dxa"/><w:noWrap/></w:tcPr><w:p><w:pPr><w:jc w:val="center"/></w:pPr><w:r><w:rPr><w:rFonts w:ascii="Times New Roman" w:hAnsi="Times New Roman" w:eastAsia="Times New Roman" w:cs="Times New Roman"/><w:sz w:val="19"/><w:szCs w:val="19"/></w:rPr><w:t xml:space="preserve">INT</w:t></w:r></w:p></w:tc><w:tc><w:tcPr><w:tcW w:w="1100" w:type="dxa"/><w:noWrap/></w:tcPr><w:p><w:pPr><w:jc w:val="center"/></w:pPr><w:r><w:rPr><w:rFonts w:ascii="Times New Roman" w:hAnsi="Times New Roman" w:eastAsia="Times New Roman" w:cs="Times New Roman"/><w:sz w:val="19"/><w:szCs w:val="19"/></w:rPr><w:t xml:space="preserve">11</w:t></w:r></w:p></w:tc><w:tc><w:tcPr><w:tcW w:w="1100" w:type="dxa"/><w:noWrap/></w:tcPr><w:p><w:pPr><w:jc w:val="center"/></w:pPr><w:r><w:rPr><w:rFonts w:ascii="Times New Roman" w:hAnsi="Times New Roman" w:eastAsia="Times New Roman" w:cs="Times New Roman"/><w:sz w:val="19"/><w:szCs w:val="19"/></w:rPr><w:t xml:space="preserve">PK, Auto</w:t></w:r></w:p></w:tc></w:tr><w:tr><w:trPr/><w:tc><w:tcPr><w:tcW w:w="500" w:type="dxa"/><w:noWrap/></w:tcPr><w:p><w:pPr><w:jc w:val="center"/></w:pPr><w:r><w:rPr><w:rFonts w:ascii="Times New Roman" w:hAnsi="Times New Roman" w:eastAsia="Times New Roman" w:cs="Times New Roman"/><w:sz w:val="19"/><w:szCs w:val="19"/></w:rPr><w:t xml:space="preserve">2</w:t></w:r></w:p></w:tc><w:tc><w:tcPr><w:tcW w:w="2200" w:type="dxa"/><w:noWrap/></w:tcPr><w:p><w:pPr><w:jc w:val="start"/></w:pPr><w:r><w:rPr><w:rFonts w:ascii="Times New Roman" w:hAnsi="Times New Roman" w:eastAsia="Times New Roman" w:cs="Times New Roman"/><w:sz w:val="19"/><w:szCs w:val="19"/><w:b w:val="1"/><w:bCs w:val="1"/></w:rPr><w:t xml:space="preserve">personel_id</w:t></w:r></w:p></w:tc><w:tc><w:tcPr><w:tcW w:w="3000" w:type="dxa"/><w:noWrap/></w:tcPr><w:p><w:pPr><w:jc w:val="start"/></w:pPr><w:r><w:rPr><w:rFonts w:ascii="Times New Roman" w:hAnsi="Times New Roman" w:eastAsia="Times New Roman" w:cs="Times New Roman"/><w:sz w:val="19"/><w:szCs w:val="19"/></w:rPr><w:t xml:space="preserve">Pemilik Berkas (Relasi ke Personel)</w:t></w:r></w:p></w:tc><w:tc><w:tcPr><w:tcW w:w="1300" w:type="dxa"/><w:noWrap/></w:tcPr><w:p><w:pPr><w:jc w:val="center"/></w:pPr><w:r><w:rPr><w:rFonts w:ascii="Times New Roman" w:hAnsi="Times New Roman" w:eastAsia="Times New Roman" w:cs="Times New Roman"/><w:sz w:val="19"/><w:szCs w:val="19"/></w:rPr><w:t xml:space="preserve">INT</w:t></w:r></w:p></w:tc><w:tc><w:tcPr><w:tcW w:w="1100" w:type="dxa"/><w:noWrap/></w:tcPr><w:p><w:pPr><w:jc w:val="center"/></w:pPr><w:r><w:rPr><w:rFonts w:ascii="Times New Roman" w:hAnsi="Times New Roman" w:eastAsia="Times New Roman" w:cs="Times New Roman"/><w:sz w:val="19"/><w:szCs w:val="19"/></w:rPr><w:t xml:space="preserve">11</w:t></w:r></w:p></w:tc><w:tc><w:tcPr><w:tcW w:w="1100" w:type="dxa"/><w:noWrap/></w:tcPr><w:p><w:pPr><w:jc w:val="center"/></w:pPr><w:r><w:rPr><w:rFonts w:ascii="Times New Roman" w:hAnsi="Times New Roman" w:eastAsia="Times New Roman" w:cs="Times New Roman"/><w:sz w:val="19"/><w:szCs w:val="19"/></w:rPr><w:t xml:space="preserve">FK, Not Null</w:t></w:r></w:p></w:tc></w:tr><w:tr><w:trPr/><w:tc><w:tcPr><w:tcW w:w="500" w:type="dxa"/><w:noWrap/></w:tcPr><w:p><w:pPr><w:jc w:val="center"/></w:pPr><w:r><w:rPr><w:rFonts w:ascii="Times New Roman" w:hAnsi="Times New Roman" w:eastAsia="Times New Roman" w:cs="Times New Roman"/><w:sz w:val="19"/><w:szCs w:val="19"/></w:rPr><w:t xml:space="preserve">3</w:t></w:r></w:p></w:tc><w:tc><w:tcPr><w:tcW w:w="2200" w:type="dxa"/><w:noWrap/></w:tcPr><w:p><w:pPr><w:jc w:val="start"/></w:pPr><w:r><w:rPr><w:rFonts w:ascii="Times New Roman" w:hAnsi="Times New Roman" w:eastAsia="Times New Roman" w:cs="Times New Roman"/><w:sz w:val="19"/><w:szCs w:val="19"/><w:b w:val="1"/><w:bCs w:val="1"/></w:rPr><w:t xml:space="preserve">dosir_kode</w:t></w:r></w:p></w:tc><w:tc><w:tcPr><w:tcW w:w="3000" w:type="dxa"/><w:noWrap/></w:tcPr><w:p><w:pPr><w:jc w:val="start"/></w:pPr><w:r><w:rPr><w:rFonts w:ascii="Times New Roman" w:hAnsi="Times New Roman" w:eastAsia="Times New Roman" w:cs="Times New Roman"/><w:sz w:val="19"/><w:szCs w:val="19"/></w:rPr><w:t xml:space="preserve">Kode Jenis Dosir (Relasi Master)</w:t></w:r></w:p></w:tc><w:tc><w:tcPr><w:tcW w:w="1300" w:type="dxa"/><w:noWrap/></w:tcPr><w:p><w:pPr><w:jc w:val="center"/></w:pPr><w:r><w:rPr><w:rFonts w:ascii="Times New Roman" w:hAnsi="Times New Roman" w:eastAsia="Times New Roman" w:cs="Times New Roman"/><w:sz w:val="19"/><w:szCs w:val="19"/></w:rPr><w:t xml:space="preserve">VARCHAR</w:t></w:r></w:p></w:tc><w:tc><w:tcPr><w:tcW w:w="1100" w:type="dxa"/><w:noWrap/></w:tcPr><w:p><w:pPr><w:jc w:val="center"/></w:pPr><w:r><w:rPr><w:rFonts w:ascii="Times New Roman" w:hAnsi="Times New Roman" w:eastAsia="Times New Roman" w:cs="Times New Roman"/><w:sz w:val="19"/><w:szCs w:val="19"/></w:rPr><w:t xml:space="preserve">2</w:t></w:r></w:p></w:tc><w:tc><w:tcPr><w:tcW w:w="1100" w:type="dxa"/><w:noWrap/></w:tcPr><w:p><w:pPr><w:jc w:val="center"/></w:pPr><w:r><w:rPr><w:rFonts w:ascii="Times New Roman" w:hAnsi="Times New Roman" w:eastAsia="Times New Roman" w:cs="Times New Roman"/><w:sz w:val="19"/><w:szCs w:val="19"/></w:rPr><w:t xml:space="preserve">FK, Not Null</w:t></w:r></w:p></w:tc></w:tr><w:tr><w:trPr/><w:tc><w:tcPr><w:tcW w:w="500" w:type="dxa"/><w:noWrap/></w:tcPr><w:p><w:pPr><w:jc w:val="center"/></w:pPr><w:r><w:rPr><w:rFonts w:ascii="Times New Roman" w:hAnsi="Times New Roman" w:eastAsia="Times New Roman" w:cs="Times New Roman"/><w:sz w:val="19"/><w:szCs w:val="19"/></w:rPr><w:t xml:space="preserve">4</w:t></w:r></w:p></w:tc><w:tc><w:tcPr><w:tcW w:w="2200" w:type="dxa"/><w:noWrap/></w:tcPr><w:p><w:pPr><w:jc w:val="start"/></w:pPr><w:r><w:rPr><w:rFonts w:ascii="Times New Roman" w:hAnsi="Times New Roman" w:eastAsia="Times New Roman" w:cs="Times New Roman"/><w:sz w:val="19"/><w:szCs w:val="19"/><w:b w:val="1"/><w:bCs w:val="1"/></w:rPr><w:t xml:space="preserve">abjad</w:t></w:r></w:p></w:tc><w:tc><w:tcPr><w:tcW w:w="3000" w:type="dxa"/><w:noWrap/></w:tcPr><w:p><w:pPr><w:jc w:val="start"/></w:pPr><w:r><w:rPr><w:rFonts w:ascii="Times New Roman" w:hAnsi="Times New Roman" w:eastAsia="Times New Roman" w:cs="Times New Roman"/><w:sz w:val="19"/><w:szCs w:val="19"/></w:rPr><w:t xml:space="preserve">Indeks Berkas Lanjutan (NULL, 'a', 'b')</w:t></w:r></w:p></w:tc><w:tc><w:tcPr><w:tcW w:w="1300" w:type="dxa"/><w:noWrap/></w:tcPr><w:p><w:pPr><w:jc w:val="center"/></w:pPr><w:r><w:rPr><w:rFonts w:ascii="Times New Roman" w:hAnsi="Times New Roman" w:eastAsia="Times New Roman" w:cs="Times New Roman"/><w:sz w:val="19"/><w:szCs w:val="19"/></w:rPr><w:t xml:space="preserve">VARCHAR</w:t></w:r></w:p></w:tc><w:tc><w:tcPr><w:tcW w:w="1100" w:type="dxa"/><w:noWrap/></w:tcPr><w:p><w:pPr><w:jc w:val="center"/></w:pPr><w:r><w:rPr><w:rFonts w:ascii="Times New Roman" w:hAnsi="Times New Roman" w:eastAsia="Times New Roman" w:cs="Times New Roman"/><w:sz w:val="19"/><w:szCs w:val="19"/></w:rPr><w:t xml:space="preserve">1</w:t></w:r></w:p></w:tc><w:tc><w:tcPr><w:tcW w:w="1100" w:type="dxa"/><w:noWrap/></w:tcPr><w:p><w:pPr><w:jc w:val="center"/></w:pPr><w:r><w:rPr><w:rFonts w:ascii="Times New Roman" w:hAnsi="Times New Roman" w:eastAsia="Times New Roman" w:cs="Times New Roman"/><w:sz w:val="19"/><w:szCs w:val="19"/></w:rPr><w:t xml:space="preserve">Nullable</w:t></w:r></w:p></w:tc></w:tr><w:tr><w:trPr/><w:tc><w:tcPr><w:tcW w:w="500" w:type="dxa"/><w:noWrap/></w:tcPr><w:p><w:pPr><w:jc w:val="center"/></w:pPr><w:r><w:rPr><w:rFonts w:ascii="Times New Roman" w:hAnsi="Times New Roman" w:eastAsia="Times New Roman" w:cs="Times New Roman"/><w:sz w:val="19"/><w:szCs w:val="19"/></w:rPr><w:t xml:space="preserve">5</w:t></w:r></w:p></w:tc><w:tc><w:tcPr><w:tcW w:w="2200" w:type="dxa"/><w:noWrap/></w:tcPr><w:p><w:pPr><w:jc w:val="start"/></w:pPr><w:r><w:rPr><w:rFonts w:ascii="Times New Roman" w:hAnsi="Times New Roman" w:eastAsia="Times New Roman" w:cs="Times New Roman"/><w:sz w:val="19"/><w:szCs w:val="19"/><w:b w:val="1"/><w:bCs w:val="1"/></w:rPr><w:t xml:space="preserve">file_name</w:t></w:r></w:p></w:tc><w:tc><w:tcPr><w:tcW w:w="3000" w:type="dxa"/><w:noWrap/></w:tcPr><w:p><w:pPr><w:jc w:val="start"/></w:pPr><w:r><w:rPr><w:rFonts w:ascii="Times New Roman" w:hAnsi="Times New Roman" w:eastAsia="Times New Roman" w:cs="Times New Roman"/><w:sz w:val="19"/><w:szCs w:val="19"/></w:rPr><w:t xml:space="preserve">Nama File Fisik (NRP_KODE[abjad].pdf)</w:t></w:r></w:p></w:tc><w:tc><w:tcPr><w:tcW w:w="1300" w:type="dxa"/><w:noWrap/></w:tcPr><w:p><w:pPr><w:jc w:val="center"/></w:pPr><w:r><w:rPr><w:rFonts w:ascii="Times New Roman" w:hAnsi="Times New Roman" w:eastAsia="Times New Roman" w:cs="Times New Roman"/><w:sz w:val="19"/><w:szCs w:val="19"/></w:rPr><w:t xml:space="preserve">VARCHAR</w:t></w:r></w:p></w:tc><w:tc><w:tcPr><w:tcW w:w="1100" w:type="dxa"/><w:noWrap/></w:tcPr><w:p><w:pPr><w:jc w:val="center"/></w:pPr><w:r><w:rPr><w:rFonts w:ascii="Times New Roman" w:hAnsi="Times New Roman" w:eastAsia="Times New Roman" w:cs="Times New Roman"/><w:sz w:val="19"/><w:szCs w:val="19"/></w:rPr><w:t xml:space="preserve">150</w:t></w:r></w:p></w:tc><w:tc><w:tcPr><w:tcW w:w="1100" w:type="dxa"/><w:noWrap/></w:tcPr><w:p><w:pPr><w:jc w:val="center"/></w:pPr><w:r><w:rPr><w:rFonts w:ascii="Times New Roman" w:hAnsi="Times New Roman" w:eastAsia="Times New Roman" w:cs="Times New Roman"/><w:sz w:val="19"/><w:szCs w:val="19"/></w:rPr><w:t xml:space="preserve">Not Null</w:t></w:r></w:p></w:tc></w:tr><w:tr><w:trPr/><w:tc><w:tcPr><w:tcW w:w="500" w:type="dxa"/><w:noWrap/></w:tcPr><w:p><w:pPr><w:jc w:val="center"/></w:pPr><w:r><w:rPr><w:rFonts w:ascii="Times New Roman" w:hAnsi="Times New Roman" w:eastAsia="Times New Roman" w:cs="Times New Roman"/><w:sz w:val="19"/><w:szCs w:val="19"/></w:rPr><w:t xml:space="preserve">6</w:t></w:r></w:p></w:tc><w:tc><w:tcPr><w:tcW w:w="2200" w:type="dxa"/><w:noWrap/></w:tcPr><w:p><w:pPr><w:jc w:val="start"/></w:pPr><w:r><w:rPr><w:rFonts w:ascii="Times New Roman" w:hAnsi="Times New Roman" w:eastAsia="Times New Roman" w:cs="Times New Roman"/><w:sz w:val="19"/><w:szCs w:val="19"/><w:b w:val="1"/><w:bCs w:val="1"/></w:rPr><w:t xml:space="preserve">file_path</w:t></w:r></w:p></w:tc><w:tc><w:tcPr><w:tcW w:w="3000" w:type="dxa"/><w:noWrap/></w:tcPr><w:p><w:pPr><w:jc w:val="start"/></w:pPr><w:r><w:rPr><w:rFonts w:ascii="Times New Roman" w:hAnsi="Times New Roman" w:eastAsia="Times New Roman" w:cs="Times New Roman"/><w:sz w:val="19"/><w:szCs w:val="19"/></w:rPr><w:t xml:space="preserve">Path File Aktif Terverifikasi TTE</w:t></w:r></w:p></w:tc><w:tc><w:tcPr><w:tcW w:w="1300" w:type="dxa"/><w:noWrap/></w:tcPr><w:p><w:pPr><w:jc w:val="center"/></w:pPr><w:r><w:rPr><w:rFonts w:ascii="Times New Roman" w:hAnsi="Times New Roman" w:eastAsia="Times New Roman" w:cs="Times New Roman"/><w:sz w:val="19"/><w:szCs w:val="19"/></w:rPr><w:t xml:space="preserve">VARCHAR</w:t></w:r></w:p></w:tc><w:tc><w:tcPr><w:tcW w:w="1100" w:type="dxa"/><w:noWrap/></w:tcPr><w:p><w:pPr><w:jc w:val="center"/></w:pPr><w:r><w:rPr><w:rFonts w:ascii="Times New Roman" w:hAnsi="Times New Roman" w:eastAsia="Times New Roman" w:cs="Times New Roman"/><w:sz w:val="19"/><w:szCs w:val="19"/></w:rPr><w:t xml:space="preserve">255</w:t></w:r></w:p></w:tc><w:tc><w:tcPr><w:tcW w:w="1100" w:type="dxa"/><w:noWrap/></w:tcPr><w:p><w:pPr><w:jc w:val="center"/></w:pPr><w:r><w:rPr><w:rFonts w:ascii="Times New Roman" w:hAnsi="Times New Roman" w:eastAsia="Times New Roman" w:cs="Times New Roman"/><w:sz w:val="19"/><w:szCs w:val="19"/></w:rPr><w:t xml:space="preserve">Not Null</w:t></w:r></w:p></w:tc></w:tr><w:tr><w:trPr/><w:tc><w:tcPr><w:tcW w:w="500" w:type="dxa"/><w:noWrap/></w:tcPr><w:p><w:pPr><w:jc w:val="center"/></w:pPr><w:r><w:rPr><w:rFonts w:ascii="Times New Roman" w:hAnsi="Times New Roman" w:eastAsia="Times New Roman" w:cs="Times New Roman"/><w:sz w:val="19"/><w:szCs w:val="19"/></w:rPr><w:t xml:space="preserve">7</w:t></w:r></w:p></w:tc><w:tc><w:tcPr><w:tcW w:w="2200" w:type="dxa"/><w:noWrap/></w:tcPr><w:p><w:pPr><w:jc w:val="start"/></w:pPr><w:r><w:rPr><w:rFonts w:ascii="Times New Roman" w:hAnsi="Times New Roman" w:eastAsia="Times New Roman" w:cs="Times New Roman"/><w:sz w:val="19"/><w:szCs w:val="19"/><w:b w:val="1"/><w:bCs w:val="1"/></w:rPr><w:t xml:space="preserve">raw_file_path</w:t></w:r></w:p></w:tc><w:tc><w:tcPr><w:tcW w:w="3000" w:type="dxa"/><w:noWrap/></w:tcPr><w:p><w:pPr><w:jc w:val="start"/></w:pPr><w:r><w:rPr><w:rFonts w:ascii="Times New Roman" w:hAnsi="Times New Roman" w:eastAsia="Times New Roman" w:cs="Times New Roman"/><w:sz w:val="19"/><w:szCs w:val="19"/></w:rPr><w:t xml:space="preserve">Path File Master Asli Bersih</w:t></w:r></w:p></w:tc><w:tc><w:tcPr><w:tcW w:w="1300" w:type="dxa"/><w:noWrap/></w:tcPr><w:p><w:pPr><w:jc w:val="center"/></w:pPr><w:r><w:rPr><w:rFonts w:ascii="Times New Roman" w:hAnsi="Times New Roman" w:eastAsia="Times New Roman" w:cs="Times New Roman"/><w:sz w:val="19"/><w:szCs w:val="19"/></w:rPr><w:t xml:space="preserve">VARCHAR</w:t></w:r></w:p></w:tc><w:tc><w:tcPr><w:tcW w:w="1100" w:type="dxa"/><w:noWrap/></w:tcPr><w:p><w:pPr><w:jc w:val="center"/></w:pPr><w:r><w:rPr><w:rFonts w:ascii="Times New Roman" w:hAnsi="Times New Roman" w:eastAsia="Times New Roman" w:cs="Times New Roman"/><w:sz w:val="19"/><w:szCs w:val="19"/></w:rPr><w:t xml:space="preserve">255</w:t></w:r></w:p></w:tc><w:tc><w:tcPr><w:tcW w:w="1100" w:type="dxa"/><w:noWrap/></w:tcPr><w:p><w:pPr><w:jc w:val="center"/></w:pPr><w:r><w:rPr><w:rFonts w:ascii="Times New Roman" w:hAnsi="Times New Roman" w:eastAsia="Times New Roman" w:cs="Times New Roman"/><w:sz w:val="19"/><w:szCs w:val="19"/></w:rPr><w:t xml:space="preserve">Nullable</w:t></w:r></w:p></w:tc></w:tr><w:tr><w:trPr/><w:tc><w:tcPr><w:tcW w:w="500" w:type="dxa"/><w:noWrap/></w:tcPr><w:p><w:pPr><w:jc w:val="center"/></w:pPr><w:r><w:rPr><w:rFonts w:ascii="Times New Roman" w:hAnsi="Times New Roman" w:eastAsia="Times New Roman" w:cs="Times New Roman"/><w:sz w:val="19"/><w:szCs w:val="19"/></w:rPr><w:t xml:space="preserve">8</w:t></w:r></w:p></w:tc><w:tc><w:tcPr><w:tcW w:w="2200" w:type="dxa"/><w:noWrap/></w:tcPr><w:p><w:pPr><w:jc w:val="start"/></w:pPr><w:r><w:rPr><w:rFonts w:ascii="Times New Roman" w:hAnsi="Times New Roman" w:eastAsia="Times New Roman" w:cs="Times New Roman"/><w:sz w:val="19"/><w:szCs w:val="19"/><w:b w:val="1"/><w:bCs w:val="1"/></w:rPr><w:t xml:space="preserve">original_name</w:t></w:r></w:p></w:tc><w:tc><w:tcPr><w:tcW w:w="3000" w:type="dxa"/><w:noWrap/></w:tcPr><w:p><w:pPr><w:jc w:val="start"/></w:pPr><w:r><w:rPr><w:rFonts w:ascii="Times New Roman" w:hAnsi="Times New Roman" w:eastAsia="Times New Roman" w:cs="Times New Roman"/><w:sz w:val="19"/><w:szCs w:val="19"/></w:rPr><w:t xml:space="preserve">Nama Asli Berkas Saat Diunggah</w:t></w:r></w:p></w:tc><w:tc><w:tcPr><w:tcW w:w="1300" w:type="dxa"/><w:noWrap/></w:tcPr><w:p><w:pPr><w:jc w:val="center"/></w:pPr><w:r><w:rPr><w:rFonts w:ascii="Times New Roman" w:hAnsi="Times New Roman" w:eastAsia="Times New Roman" w:cs="Times New Roman"/><w:sz w:val="19"/><w:szCs w:val="19"/></w:rPr><w:t xml:space="preserve">VARCHAR</w:t></w:r></w:p></w:tc><w:tc><w:tcPr><w:tcW w:w="1100" w:type="dxa"/><w:noWrap/></w:tcPr><w:p><w:pPr><w:jc w:val="center"/></w:pPr><w:r><w:rPr><w:rFonts w:ascii="Times New Roman" w:hAnsi="Times New Roman" w:eastAsia="Times New Roman" w:cs="Times New Roman"/><w:sz w:val="19"/><w:szCs w:val="19"/></w:rPr><w:t xml:space="preserve">255</w:t></w:r></w:p></w:tc><w:tc><w:tcPr><w:tcW w:w="1100" w:type="dxa"/><w:noWrap/></w:tcPr><w:p><w:pPr><w:jc w:val="center"/></w:pPr><w:r><w:rPr><w:rFonts w:ascii="Times New Roman" w:hAnsi="Times New Roman" w:eastAsia="Times New Roman" w:cs="Times New Roman"/><w:sz w:val="19"/><w:szCs w:val="19"/></w:rPr><w:t xml:space="preserve">Nullable</w:t></w:r></w:p></w:tc></w:tr><w:tr><w:trPr/><w:tc><w:tcPr><w:tcW w:w="500" w:type="dxa"/><w:noWrap/></w:tcPr><w:p><w:pPr><w:jc w:val="center"/></w:pPr><w:r><w:rPr><w:rFonts w:ascii="Times New Roman" w:hAnsi="Times New Roman" w:eastAsia="Times New Roman" w:cs="Times New Roman"/><w:sz w:val="19"/><w:szCs w:val="19"/></w:rPr><w:t xml:space="preserve">9</w:t></w:r></w:p></w:tc><w:tc><w:tcPr><w:tcW w:w="2200" w:type="dxa"/><w:noWrap/></w:tcPr><w:p><w:pPr><w:jc w:val="start"/></w:pPr><w:r><w:rPr><w:rFonts w:ascii="Times New Roman" w:hAnsi="Times New Roman" w:eastAsia="Times New Roman" w:cs="Times New Roman"/><w:sz w:val="19"/><w:szCs w:val="19"/><w:b w:val="1"/><w:bCs w:val="1"/></w:rPr><w:t xml:space="preserve">keterangan</w:t></w:r></w:p></w:tc><w:tc><w:tcPr><w:tcW w:w="3000" w:type="dxa"/><w:noWrap/></w:tcPr><w:p><w:pPr><w:jc w:val="start"/></w:pPr><w:r><w:rPr><w:rFonts w:ascii="Times New Roman" w:hAnsi="Times New Roman" w:eastAsia="Times New Roman" w:cs="Times New Roman"/><w:sz w:val="19"/><w:szCs w:val="19"/></w:rPr><w:t xml:space="preserve">Keterangan Tambahan dari Personel</w:t></w:r></w:p></w:tc><w:tc><w:tcPr><w:tcW w:w="1300" w:type="dxa"/><w:noWrap/></w:tcPr><w:p><w:pPr><w:jc w:val="center"/></w:pPr><w:r><w:rPr><w:rFonts w:ascii="Times New Roman" w:hAnsi="Times New Roman" w:eastAsia="Times New Roman" w:cs="Times New Roman"/><w:sz w:val="19"/><w:szCs w:val="19"/></w:rPr><w:t xml:space="preserve">VARCHAR</w:t></w:r></w:p></w:tc><w:tc><w:tcPr><w:tcW w:w="1100" w:type="dxa"/><w:noWrap/></w:tcPr><w:p><w:pPr><w:jc w:val="center"/></w:pPr><w:r><w:rPr><w:rFonts w:ascii="Times New Roman" w:hAnsi="Times New Roman" w:eastAsia="Times New Roman" w:cs="Times New Roman"/><w:sz w:val="19"/><w:szCs w:val="19"/></w:rPr><w:t xml:space="preserve">255</w:t></w:r></w:p></w:tc><w:tc><w:tcPr><w:tcW w:w="1100" w:type="dxa"/><w:noWrap/></w:tcPr><w:p><w:pPr><w:jc w:val="center"/></w:pPr><w:r><w:rPr><w:rFonts w:ascii="Times New Roman" w:hAnsi="Times New Roman" w:eastAsia="Times New Roman" w:cs="Times New Roman"/><w:sz w:val="19"/><w:szCs w:val="19"/></w:rPr><w:t xml:space="preserve">Nullable</w:t></w:r></w:p></w:tc></w:tr><w:tr><w:trPr/><w:tc><w:tcPr><w:tcW w:w="500" w:type="dxa"/><w:noWrap/></w:tcPr><w:p><w:pPr><w:jc w:val="center"/></w:pPr><w:r><w:rPr><w:rFonts w:ascii="Times New Roman" w:hAnsi="Times New Roman" w:eastAsia="Times New Roman" w:cs="Times New Roman"/><w:sz w:val="19"/><w:szCs w:val="19"/></w:rPr><w:t xml:space="preserve">10</w:t></w:r></w:p></w:tc><w:tc><w:tcPr><w:tcW w:w="2200" w:type="dxa"/><w:noWrap/></w:tcPr><w:p><w:pPr><w:jc w:val="start"/></w:pPr><w:r><w:rPr><w:rFonts w:ascii="Times New Roman" w:hAnsi="Times New Roman" w:eastAsia="Times New Roman" w:cs="Times New Roman"/><w:sz w:val="19"/><w:szCs w:val="19"/><w:b w:val="1"/><w:bCs w:val="1"/></w:rPr><w:t xml:space="preserve">status</w:t></w:r></w:p></w:tc><w:tc><w:tcPr><w:tcW w:w="3000" w:type="dxa"/><w:noWrap/></w:tcPr><w:p><w:pPr><w:jc w:val="start"/></w:pPr><w:r><w:rPr><w:rFonts w:ascii="Times New Roman" w:hAnsi="Times New Roman" w:eastAsia="Times New Roman" w:cs="Times New Roman"/><w:sz w:val="19"/><w:szCs w:val="19"/></w:rPr><w:t xml:space="preserve">Status Verifikasi (pending/approved/rejected)</w:t></w:r></w:p></w:tc><w:tc><w:tcPr><w:tcW w:w="1300" w:type="dxa"/><w:noWrap/></w:tcPr><w:p><w:pPr><w:jc w:val="center"/></w:pPr><w:r><w:rPr><w:rFonts w:ascii="Times New Roman" w:hAnsi="Times New Roman" w:eastAsia="Times New Roman" w:cs="Times New Roman"/><w:sz w:val="19"/><w:szCs w:val="19"/></w:rPr><w:t xml:space="preserve">ENUM</w:t></w:r></w:p></w:tc><w:tc><w:tcPr><w:tcW w:w="1100" w:type="dxa"/><w:noWrap/></w:tcPr><w:p><w:pPr><w:jc w:val="center"/></w:pPr><w:r><w:rPr><w:rFonts w:ascii="Times New Roman" w:hAnsi="Times New Roman" w:eastAsia="Times New Roman" w:cs="Times New Roman"/><w:sz w:val="19"/><w:szCs w:val="19"/></w:rPr><w:t xml:space="preserve">10</w:t></w:r></w:p></w:tc><w:tc><w:tcPr><w:tcW w:w="1100" w:type="dxa"/><w:noWrap/></w:tcPr><w:p><w:pPr><w:jc w:val="center"/></w:pPr><w:r><w:rPr><w:rFonts w:ascii="Times New Roman" w:hAnsi="Times New Roman" w:eastAsia="Times New Roman" w:cs="Times New Roman"/><w:sz w:val="19"/><w:szCs w:val="19"/></w:rPr><w:t xml:space="preserve">INDEX</w:t></w:r></w:p></w:tc></w:tr><w:tr><w:trPr/><w:tc><w:tcPr><w:tcW w:w="500" w:type="dxa"/><w:noWrap/></w:tcPr><w:p><w:pPr><w:jc w:val="center"/></w:pPr><w:r><w:rPr><w:rFonts w:ascii="Times New Roman" w:hAnsi="Times New Roman" w:eastAsia="Times New Roman" w:cs="Times New Roman"/><w:sz w:val="19"/><w:szCs w:val="19"/></w:rPr><w:t xml:space="preserve">11</w:t></w:r></w:p></w:tc><w:tc><w:tcPr><w:tcW w:w="2200" w:type="dxa"/><w:noWrap/></w:tcPr><w:p><w:pPr><w:jc w:val="start"/></w:pPr><w:r><w:rPr><w:rFonts w:ascii="Times New Roman" w:hAnsi="Times New Roman" w:eastAsia="Times New Roman" w:cs="Times New Roman"/><w:sz w:val="19"/><w:szCs w:val="19"/><w:b w:val="1"/><w:bCs w:val="1"/></w:rPr><w:t xml:space="preserve">catatan_verifikasi</w:t></w:r></w:p></w:tc><w:tc><w:tcPr><w:tcW w:w="3000" w:type="dxa"/><w:noWrap/></w:tcPr><w:p><w:pPr><w:jc w:val="start"/></w:pPr><w:r><w:rPr><w:rFonts w:ascii="Times New Roman" w:hAnsi="Times New Roman" w:eastAsia="Times New Roman" w:cs="Times New Roman"/><w:sz w:val="19"/><w:szCs w:val="19"/></w:rPr><w:t xml:space="preserve">Catatan Evaluasi Verifikator</w:t></w:r></w:p></w:tc><w:tc><w:tcPr><w:tcW w:w="1300" w:type="dxa"/><w:noWrap/></w:tcPr><w:p><w:pPr><w:jc w:val="center"/></w:pPr><w:r><w:rPr><w:rFonts w:ascii="Times New Roman" w:hAnsi="Times New Roman" w:eastAsia="Times New Roman" w:cs="Times New Roman"/><w:sz w:val="19"/><w:szCs w:val="19"/></w:rPr><w:t xml:space="preserve">TEXT</w:t></w:r></w:p></w:tc><w:tc><w:tcPr><w:tcW w:w="1100" w:type="dxa"/><w:noWrap/></w:tcPr><w:p><w:pPr><w:jc w:val="center"/></w:pPr><w:r><w:rPr><w:rFonts w:ascii="Times New Roman" w:hAnsi="Times New Roman" w:eastAsia="Times New Roman" w:cs="Times New Roman"/><w:sz w:val="19"/><w:szCs w:val="19"/></w:rPr><w:t xml:space="preserve">-</w:t></w:r></w:p></w:tc><w:tc><w:tcPr><w:tcW w:w="1100" w:type="dxa"/><w:noWrap/></w:tcPr><w:p><w:pPr><w:jc w:val="center"/></w:pPr><w:r><w:rPr><w:rFonts w:ascii="Times New Roman" w:hAnsi="Times New Roman" w:eastAsia="Times New Roman" w:cs="Times New Roman"/><w:sz w:val="19"/><w:szCs w:val="19"/></w:rPr><w:t xml:space="preserve">Nullable</w:t></w:r></w:p></w:tc></w:tr><w:tr><w:trPr/><w:tc><w:tcPr><w:tcW w:w="500" w:type="dxa"/><w:noWrap/></w:tcPr><w:p><w:pPr><w:jc w:val="center"/></w:pPr><w:r><w:rPr><w:rFonts w:ascii="Times New Roman" w:hAnsi="Times New Roman" w:eastAsia="Times New Roman" w:cs="Times New Roman"/><w:sz w:val="19"/><w:szCs w:val="19"/></w:rPr><w:t xml:space="preserve">12</w:t></w:r></w:p></w:tc><w:tc><w:tcPr><w:tcW w:w="2200" w:type="dxa"/><w:noWrap/></w:tcPr><w:p><w:pPr><w:jc w:val="start"/></w:pPr><w:r><w:rPr><w:rFonts w:ascii="Times New Roman" w:hAnsi="Times New Roman" w:eastAsia="Times New Roman" w:cs="Times New Roman"/><w:sz w:val="19"/><w:szCs w:val="19"/><w:b w:val="1"/><w:bCs w:val="1"/></w:rPr><w:t xml:space="preserve">is_watermarked</w:t></w:r></w:p></w:tc><w:tc><w:tcPr><w:tcW w:w="3000" w:type="dxa"/><w:noWrap/></w:tcPr><w:p><w:pPr><w:jc w:val="start"/></w:pPr><w:r><w:rPr><w:rFonts w:ascii="Times New Roman" w:hAnsi="Times New Roman" w:eastAsia="Times New Roman" w:cs="Times New Roman"/><w:sz w:val="19"/><w:szCs w:val="19"/></w:rPr><w:t xml:space="preserve">Penanda Status Watermark Sementara</w:t></w:r></w:p></w:tc><w:tc><w:tcPr><w:tcW w:w="1300" w:type="dxa"/><w:noWrap/></w:tcPr><w:p><w:pPr><w:jc w:val="center"/></w:pPr><w:r><w:rPr><w:rFonts w:ascii="Times New Roman" w:hAnsi="Times New Roman" w:eastAsia="Times New Roman" w:cs="Times New Roman"/><w:sz w:val="19"/><w:szCs w:val="19"/></w:rPr><w:t xml:space="preserve">TINYINT</w:t></w:r></w:p></w:tc><w:tc><w:tcPr><w:tcW w:w="1100" w:type="dxa"/><w:noWrap/></w:tcPr><w:p><w:pPr><w:jc w:val="center"/></w:pPr><w:r><w:rPr><w:rFonts w:ascii="Times New Roman" w:hAnsi="Times New Roman" w:eastAsia="Times New Roman" w:cs="Times New Roman"/><w:sz w:val="19"/><w:szCs w:val="19"/></w:rPr><w:t xml:space="preserve">1</w:t></w:r></w:p></w:tc><w:tc><w:tcPr><w:tcW w:w="1100" w:type="dxa"/><w:noWrap/></w:tcPr><w:p><w:pPr><w:jc w:val="center"/></w:pPr><w:r><w:rPr><w:rFonts w:ascii="Times New Roman" w:hAnsi="Times New Roman" w:eastAsia="Times New Roman" w:cs="Times New Roman"/><w:sz w:val="19"/><w:szCs w:val="19"/></w:rPr><w:t xml:space="preserve">Default 0</w:t></w:r></w:p></w:tc></w:tr><w:tr><w:trPr/><w:tc><w:tcPr><w:tcW w:w="500" w:type="dxa"/><w:noWrap/></w:tcPr><w:p><w:pPr><w:jc w:val="center"/></w:pPr><w:r><w:rPr><w:rFonts w:ascii="Times New Roman" w:hAnsi="Times New Roman" w:eastAsia="Times New Roman" w:cs="Times New Roman"/><w:sz w:val="19"/><w:szCs w:val="19"/></w:rPr><w:t xml:space="preserve">13</w:t></w:r></w:p></w:tc><w:tc><w:tcPr><w:tcW w:w="2200" w:type="dxa"/><w:noWrap/></w:tcPr><w:p><w:pPr><w:jc w:val="start"/></w:pPr><w:r><w:rPr><w:rFonts w:ascii="Times New Roman" w:hAnsi="Times New Roman" w:eastAsia="Times New Roman" w:cs="Times New Roman"/><w:sz w:val="19"/><w:szCs w:val="19"/><w:b w:val="1"/><w:bCs w:val="1"/></w:rPr><w:t xml:space="preserve">signature_code</w:t></w:r></w:p></w:tc><w:tc><w:tcPr><w:tcW w:w="3000" w:type="dxa"/><w:noWrap/></w:tcPr><w:p><w:pPr><w:jc w:val="start"/></w:pPr><w:r><w:rPr><w:rFonts w:ascii="Times New Roman" w:hAnsi="Times New Roman" w:eastAsia="Times New Roman" w:cs="Times New Roman"/><w:sz w:val="19"/><w:szCs w:val="19"/></w:rPr><w:t xml:space="preserve">Kode Registrasi TTE (TTE-TRISULA-...)</w:t></w:r></w:p></w:tc><w:tc><w:tcPr><w:tcW w:w="1300" w:type="dxa"/><w:noWrap/></w:tcPr><w:p><w:pPr><w:jc w:val="center"/></w:pPr><w:r><w:rPr><w:rFonts w:ascii="Times New Roman" w:hAnsi="Times New Roman" w:eastAsia="Times New Roman" w:cs="Times New Roman"/><w:sz w:val="19"/><w:szCs w:val="19"/></w:rPr><w:t xml:space="preserve">VARCHAR</w:t></w:r></w:p></w:tc><w:tc><w:tcPr><w:tcW w:w="1100" w:type="dxa"/><w:noWrap/></w:tcPr><w:p><w:pPr><w:jc w:val="center"/></w:pPr><w:r><w:rPr><w:rFonts w:ascii="Times New Roman" w:hAnsi="Times New Roman" w:eastAsia="Times New Roman" w:cs="Times New Roman"/><w:sz w:val="19"/><w:szCs w:val="19"/></w:rPr><w:t xml:space="preserve">60</w:t></w:r></w:p></w:tc><w:tc><w:tcPr><w:tcW w:w="1100" w:type="dxa"/><w:noWrap/></w:tcPr><w:p><w:pPr><w:jc w:val="center"/></w:pPr><w:r><w:rPr><w:rFonts w:ascii="Times New Roman" w:hAnsi="Times New Roman" w:eastAsia="Times New Roman" w:cs="Times New Roman"/><w:sz w:val="19"/><w:szCs w:val="19"/></w:rPr><w:t xml:space="preserve">INDEX</w:t></w:r></w:p></w:tc></w:tr><w:tr><w:trPr/><w:tc><w:tcPr><w:tcW w:w="500" w:type="dxa"/><w:noWrap/></w:tcPr><w:p><w:pPr><w:jc w:val="center"/></w:pPr><w:r><w:rPr><w:rFonts w:ascii="Times New Roman" w:hAnsi="Times New Roman" w:eastAsia="Times New Roman" w:cs="Times New Roman"/><w:sz w:val="19"/><w:szCs w:val="19"/></w:rPr><w:t xml:space="preserve">14</w:t></w:r></w:p></w:tc><w:tc><w:tcPr><w:tcW w:w="2200" w:type="dxa"/><w:noWrap/></w:tcPr><w:p><w:pPr><w:jc w:val="start"/></w:pPr><w:r><w:rPr><w:rFonts w:ascii="Times New Roman" w:hAnsi="Times New Roman" w:eastAsia="Times New Roman" w:cs="Times New Roman"/><w:sz w:val="19"/><w:szCs w:val="19"/><w:b w:val="1"/><w:bCs w:val="1"/></w:rPr><w:t xml:space="preserve">signature_hash</w:t></w:r></w:p></w:tc><w:tc><w:tcPr><w:tcW w:w="3000" w:type="dxa"/><w:noWrap/></w:tcPr><w:p><w:pPr><w:jc w:val="start"/></w:pPr><w:r><w:rPr><w:rFonts w:ascii="Times New Roman" w:hAnsi="Times New Roman" w:eastAsia="Times New Roman" w:cs="Times New Roman"/><w:sz w:val="19"/><w:szCs w:val="19"/></w:rPr><w:t xml:space="preserve">Enkripsi Hash SHA-256 Integritas Berkas</w:t></w:r></w:p></w:tc><w:tc><w:tcPr><w:tcW w:w="1300" w:type="dxa"/><w:noWrap/></w:tcPr><w:p><w:pPr><w:jc w:val="center"/></w:pPr><w:r><w:rPr><w:rFonts w:ascii="Times New Roman" w:hAnsi="Times New Roman" w:eastAsia="Times New Roman" w:cs="Times New Roman"/><w:sz w:val="19"/><w:szCs w:val="19"/></w:rPr><w:t xml:space="preserve">VARCHAR</w:t></w:r></w:p></w:tc><w:tc><w:tcPr><w:tcW w:w="1100" w:type="dxa"/><w:noWrap/></w:tcPr><w:p><w:pPr><w:jc w:val="center"/></w:pPr><w:r><w:rPr><w:rFonts w:ascii="Times New Roman" w:hAnsi="Times New Roman" w:eastAsia="Times New Roman" w:cs="Times New Roman"/><w:sz w:val="19"/><w:szCs w:val="19"/></w:rPr><w:t xml:space="preserve">64</w:t></w:r></w:p></w:tc><w:tc><w:tcPr><w:tcW w:w="1100" w:type="dxa"/><w:noWrap/></w:tcPr><w:p><w:pPr><w:jc w:val="center"/></w:pPr><w:r><w:rPr><w:rFonts w:ascii="Times New Roman" w:hAnsi="Times New Roman" w:eastAsia="Times New Roman" w:cs="Times New Roman"/><w:sz w:val="19"/><w:szCs w:val="19"/></w:rPr><w:t xml:space="preserve">Nullable</w:t></w:r></w:p></w:tc></w:tr><w:tr><w:trPr/><w:tc><w:tcPr><w:tcW w:w="500" w:type="dxa"/><w:noWrap/></w:tcPr><w:p><w:pPr><w:jc w:val="center"/></w:pPr><w:r><w:rPr><w:rFonts w:ascii="Times New Roman" w:hAnsi="Times New Roman" w:eastAsia="Times New Roman" w:cs="Times New Roman"/><w:sz w:val="19"/><w:szCs w:val="19"/></w:rPr><w:t xml:space="preserve">15</w:t></w:r></w:p></w:tc><w:tc><w:tcPr><w:tcW w:w="2200" w:type="dxa"/><w:noWrap/></w:tcPr><w:p><w:pPr><w:jc w:val="start"/></w:pPr><w:r><w:rPr><w:rFonts w:ascii="Times New Roman" w:hAnsi="Times New Roman" w:eastAsia="Times New Roman" w:cs="Times New Roman"/><w:sz w:val="19"/><w:szCs w:val="19"/><w:b w:val="1"/><w:bCs w:val="1"/></w:rPr><w:t xml:space="preserve">uploaded_by</w:t></w:r></w:p></w:tc><w:tc><w:tcPr><w:tcW w:w="3000" w:type="dxa"/><w:noWrap/></w:tcPr><w:p><w:pPr><w:jc w:val="start"/></w:pPr><w:r><w:rPr><w:rFonts w:ascii="Times New Roman" w:hAnsi="Times New Roman" w:eastAsia="Times New Roman" w:cs="Times New Roman"/><w:sz w:val="19"/><w:szCs w:val="19"/></w:rPr><w:t xml:space="preserve">Relasi ke Akun Pengunggah Berkas</w:t></w:r></w:p></w:tc><w:tc><w:tcPr><w:tcW w:w="1300" w:type="dxa"/><w:noWrap/></w:tcPr><w:p><w:pPr><w:jc w:val="center"/></w:pPr><w:r><w:rPr><w:rFonts w:ascii="Times New Roman" w:hAnsi="Times New Roman" w:eastAsia="Times New Roman" w:cs="Times New Roman"/><w:sz w:val="19"/><w:szCs w:val="19"/></w:rPr><w:t xml:space="preserve">INT</w:t></w:r></w:p></w:tc><w:tc><w:tcPr><w:tcW w:w="1100" w:type="dxa"/><w:noWrap/></w:tcPr><w:p><w:pPr><w:jc w:val="center"/></w:pPr><w:r><w:rPr><w:rFonts w:ascii="Times New Roman" w:hAnsi="Times New Roman" w:eastAsia="Times New Roman" w:cs="Times New Roman"/><w:sz w:val="19"/><w:szCs w:val="19"/></w:rPr><w:t xml:space="preserve">11</w:t></w:r></w:p></w:tc><w:tc><w:tcPr><w:tcW w:w="1100" w:type="dxa"/><w:noWrap/></w:tcPr><w:p><w:pPr><w:jc w:val="center"/></w:pPr><w:r><w:rPr><w:rFonts w:ascii="Times New Roman" w:hAnsi="Times New Roman" w:eastAsia="Times New Roman" w:cs="Times New Roman"/><w:sz w:val="19"/><w:szCs w:val="19"/></w:rPr><w:t xml:space="preserve">FK, Nullable</w:t></w:r></w:p></w:tc></w:tr><w:tr><w:trPr/><w:tc><w:tcPr><w:tcW w:w="500" w:type="dxa"/><w:noWrap/></w:tcPr><w:p><w:pPr><w:jc w:val="center"/></w:pPr><w:r><w:rPr><w:rFonts w:ascii="Times New Roman" w:hAnsi="Times New Roman" w:eastAsia="Times New Roman" w:cs="Times New Roman"/><w:sz w:val="19"/><w:szCs w:val="19"/></w:rPr><w:t xml:space="preserve">16</w:t></w:r></w:p></w:tc><w:tc><w:tcPr><w:tcW w:w="2200" w:type="dxa"/><w:noWrap/></w:tcPr><w:p><w:pPr><w:jc w:val="start"/></w:pPr><w:r><w:rPr><w:rFonts w:ascii="Times New Roman" w:hAnsi="Times New Roman" w:eastAsia="Times New Roman" w:cs="Times New Roman"/><w:sz w:val="19"/><w:szCs w:val="19"/><w:b w:val="1"/><w:bCs w:val="1"/></w:rPr><w:t xml:space="preserve">uploaded_at</w:t></w:r></w:p></w:tc><w:tc><w:tcPr><w:tcW w:w="3000" w:type="dxa"/><w:noWrap/></w:tcPr><w:p><w:pPr><w:jc w:val="start"/></w:pPr><w:r><w:rPr><w:rFonts w:ascii="Times New Roman" w:hAnsi="Times New Roman" w:eastAsia="Times New Roman" w:cs="Times New Roman"/><w:sz w:val="19"/><w:szCs w:val="19"/></w:rPr><w:t xml:space="preserve">Waktu Berkas Diunggah</w:t></w:r></w:p></w:tc><w:tc><w:tcPr><w:tcW w:w="1300" w:type="dxa"/><w:noWrap/></w:tcPr><w:p><w:pPr><w:jc w:val="center"/></w:pPr><w:r><w:rPr><w:rFonts w:ascii="Times New Roman" w:hAnsi="Times New Roman" w:eastAsia="Times New Roman" w:cs="Times New Roman"/><w:sz w:val="19"/><w:szCs w:val="19"/></w:rPr><w:t xml:space="preserve">TIMESTAMP</w:t></w:r></w:p></w:tc><w:tc><w:tcPr><w:tcW w:w="1100" w:type="dxa"/><w:noWrap/></w:tcPr><w:p><w:pPr><w:jc w:val="center"/></w:pPr><w:r><w:rPr><w:rFonts w:ascii="Times New Roman" w:hAnsi="Times New Roman" w:eastAsia="Times New Roman" w:cs="Times New Roman"/><w:sz w:val="19"/><w:szCs w:val="19"/></w:rPr><w:t xml:space="preserve">19</w:t></w:r></w:p></w:tc><w:tc><w:tcPr><w:tcW w:w="1100" w:type="dxa"/><w:noWrap/></w:tcPr><w:p><w:pPr><w:jc w:val="center"/></w:pPr><w:r><w:rPr><w:rFonts w:ascii="Times New Roman" w:hAnsi="Times New Roman" w:eastAsia="Times New Roman" w:cs="Times New Roman"/><w:sz w:val="19"/><w:szCs w:val="19"/></w:rPr><w:t xml:space="preserve">Auto Stamp</w:t></w:r></w:p></w:tc></w:tr><w:tr><w:trPr/><w:tc><w:tcPr><w:tcW w:w="500" w:type="dxa"/><w:noWrap/></w:tcPr><w:p><w:pPr><w:jc w:val="center"/></w:pPr><w:r><w:rPr><w:rFonts w:ascii="Times New Roman" w:hAnsi="Times New Roman" w:eastAsia="Times New Roman" w:cs="Times New Roman"/><w:sz w:val="19"/><w:szCs w:val="19"/></w:rPr><w:t xml:space="preserve">17</w:t></w:r></w:p></w:tc><w:tc><w:tcPr><w:tcW w:w="2200" w:type="dxa"/><w:noWrap/></w:tcPr><w:p><w:pPr><w:jc w:val="start"/></w:pPr><w:r><w:rPr><w:rFonts w:ascii="Times New Roman" w:hAnsi="Times New Roman" w:eastAsia="Times New Roman" w:cs="Times New Roman"/><w:sz w:val="19"/><w:szCs w:val="19"/><w:b w:val="1"/><w:bCs w:val="1"/></w:rPr><w:t xml:space="preserve">verified_by</w:t></w:r></w:p></w:tc><w:tc><w:tcPr><w:tcW w:w="3000" w:type="dxa"/><w:noWrap/></w:tcPr><w:p><w:pPr><w:jc w:val="start"/></w:pPr><w:r><w:rPr><w:rFonts w:ascii="Times New Roman" w:hAnsi="Times New Roman" w:eastAsia="Times New Roman" w:cs="Times New Roman"/><w:sz w:val="19"/><w:szCs w:val="19"/></w:rPr><w:t xml:space="preserve">Relasi ke Akun Verifikator TTE</w:t></w:r></w:p></w:tc><w:tc><w:tcPr><w:tcW w:w="1300" w:type="dxa"/><w:noWrap/></w:tcPr><w:p><w:pPr><w:jc w:val="center"/></w:pPr><w:r><w:rPr><w:rFonts w:ascii="Times New Roman" w:hAnsi="Times New Roman" w:eastAsia="Times New Roman" w:cs="Times New Roman"/><w:sz w:val="19"/><w:szCs w:val="19"/></w:rPr><w:t xml:space="preserve">INT</w:t></w:r></w:p></w:tc><w:tc><w:tcPr><w:tcW w:w="1100" w:type="dxa"/><w:noWrap/></w:tcPr><w:p><w:pPr><w:jc w:val="center"/></w:pPr><w:r><w:rPr><w:rFonts w:ascii="Times New Roman" w:hAnsi="Times New Roman" w:eastAsia="Times New Roman" w:cs="Times New Roman"/><w:sz w:val="19"/><w:szCs w:val="19"/></w:rPr><w:t xml:space="preserve">11</w:t></w:r></w:p></w:tc><w:tc><w:tcPr><w:tcW w:w="1100" w:type="dxa"/><w:noWrap/></w:tcPr><w:p><w:pPr><w:jc w:val="center"/></w:pPr><w:r><w:rPr><w:rFonts w:ascii="Times New Roman" w:hAnsi="Times New Roman" w:eastAsia="Times New Roman" w:cs="Times New Roman"/><w:sz w:val="19"/><w:szCs w:val="19"/></w:rPr><w:t xml:space="preserve">FK, Nullable</w:t></w:r></w:p></w:tc></w:tr><w:tr><w:trPr/><w:tc><w:tcPr><w:tcW w:w="500" w:type="dxa"/><w:noWrap/></w:tcPr><w:p><w:pPr><w:jc w:val="center"/></w:pPr><w:r><w:rPr><w:rFonts w:ascii="Times New Roman" w:hAnsi="Times New Roman" w:eastAsia="Times New Roman" w:cs="Times New Roman"/><w:sz w:val="19"/><w:szCs w:val="19"/></w:rPr><w:t xml:space="preserve">18</w:t></w:r></w:p></w:tc><w:tc><w:tcPr><w:tcW w:w="2200" w:type="dxa"/><w:noWrap/></w:tcPr><w:p><w:pPr><w:jc w:val="start"/></w:pPr><w:r><w:rPr><w:rFonts w:ascii="Times New Roman" w:hAnsi="Times New Roman" w:eastAsia="Times New Roman" w:cs="Times New Roman"/><w:sz w:val="19"/><w:szCs w:val="19"/><w:b w:val="1"/><w:bCs w:val="1"/></w:rPr><w:t xml:space="preserve">verified_at</w:t></w:r></w:p></w:tc><w:tc><w:tcPr><w:tcW w:w="3000" w:type="dxa"/><w:noWrap/></w:tcPr><w:p><w:pPr><w:jc w:val="start"/></w:pPr><w:r><w:rPr><w:rFonts w:ascii="Times New Roman" w:hAnsi="Times New Roman" w:eastAsia="Times New Roman" w:cs="Times New Roman"/><w:sz w:val="19"/><w:szCs w:val="19"/></w:rPr><w:t xml:space="preserve">Waktu Pengesahan TTE Resmi</w:t></w:r></w:p></w:tc><w:tc><w:tcPr><w:tcW w:w="1300" w:type="dxa"/><w:noWrap/></w:tcPr><w:p><w:pPr><w:jc w:val="center"/></w:pPr><w:r><w:rPr><w:rFonts w:ascii="Times New Roman" w:hAnsi="Times New Roman" w:eastAsia="Times New Roman" w:cs="Times New Roman"/><w:sz w:val="19"/><w:szCs w:val="19"/></w:rPr><w:t xml:space="preserve">DATETIME</w:t></w:r></w:p></w:tc><w:tc><w:tcPr><w:tcW w:w="1100" w:type="dxa"/><w:noWrap/></w:tcPr><w:p><w:pPr><w:jc w:val="center"/></w:pPr><w:r><w:rPr><w:rFonts w:ascii="Times New Roman" w:hAnsi="Times New Roman" w:eastAsia="Times New Roman" w:cs="Times New Roman"/><w:sz w:val="19"/><w:szCs w:val="19"/></w:rPr><w:t xml:space="preserve">19</w:t></w:r></w:p></w:tc><w:tc><w:tcPr><w:tcW w:w="1100" w:type="dxa"/><w:noWrap/></w:tcPr><w:p><w:pPr><w:jc w:val="center"/></w:pPr><w:r><w:rPr><w:rFonts w:ascii="Times New Roman" w:hAnsi="Times New Roman" w:eastAsia="Times New Roman" w:cs="Times New Roman"/><w:sz w:val="19"/><w:szCs w:val="19"/></w:rPr><w:t xml:space="preserve">Nullable</w:t></w:r></w:p></w:tc></w:tr></w:tbl><w:p/><w:p><w:pPr><w:spacing w:after="40"/></w:pPr><w:r><w:rPr><w:rFonts w:ascii="Times New Roman" w:hAnsi="Times New Roman" w:eastAsia="Times New Roman" w:cs="Times New Roman"/><w:sz w:val="22"/><w:szCs w:val="22"/><w:b w:val="1"/><w:bCs w:val="1"/></w:rPr><w:t xml:space="preserve">e.   Struktur File / Tabel: SETTINGS (Parameter Operasional & Brand Aplikasi)</w:t></w:r></w:p><w:tbl><w:tblGrid><w:gridCol w:w="500" w:type="dxa"/><w:gridCol w:w="2200" w:type="dxa"/><w:gridCol w:w="3000" w:type="dxa"/><w:gridCol w:w="1300" w:type="dxa"/><w:gridCol w:w="1100" w:type="dxa"/><w:gridCol w:w="1100" w:type="dxa"/></w:tblGrid><w:tblPr><w:tblStyle w:val="MilitaryTable"/></w:tblPr><w:tr><w:trPr/><w:tc><w:tcPr><w:tcW w:w="500" w:type="dxa"/><w:shd w:val="clear" w:fill="EAEAEA"/><w:noWrap/></w:tcPr><w:p><w:pPr><w:jc w:val="center"/></w:pPr><w:r><w:rPr><w:rFonts w:ascii="Times New Roman" w:hAnsi="Times New Roman" w:eastAsia="Times New Roman" w:cs="Times New Roman"/><w:sz w:val="20"/><w:szCs w:val="20"/><w:b w:val="1"/><w:bCs w:val="1"/></w:rPr><w:t xml:space="preserve">No</w:t></w:r></w:p></w:tc><w:tc><w:tcPr><w:tcW w:w="2200" w:type="dxa"/><w:shd w:val="clear" w:fill="EAEAEA"/><w:noWrap/></w:tcPr><w:p><w:pPr><w:jc w:val="center"/></w:pPr><w:r><w:rPr><w:rFonts w:ascii="Times New Roman" w:hAnsi="Times New Roman" w:eastAsia="Times New Roman" w:cs="Times New Roman"/><w:sz w:val="20"/><w:szCs w:val="20"/><w:b w:val="1"/><w:bCs w:val="1"/></w:rPr><w:t xml:space="preserve">Nama Field</w:t></w:r></w:p></w:tc><w:tc><w:tcPr><w:tcW w:w="3000" w:type="dxa"/><w:shd w:val="clear" w:fill="EAEAEA"/><w:noWrap/></w:tcPr><w:p><w:pPr><w:jc w:val="center"/></w:pPr><w:r><w:rPr><w:rFonts w:ascii="Times New Roman" w:hAnsi="Times New Roman" w:eastAsia="Times New Roman" w:cs="Times New Roman"/><w:sz w:val="20"/><w:szCs w:val="20"/><w:b w:val="1"/><w:bCs w:val="1"/></w:rPr><w:t xml:space="preserve">Uraian / Sebutan</w:t></w:r></w:p></w:tc><w:tc><w:tcPr><w:tcW w:w="1300" w:type="dxa"/><w:shd w:val="clear" w:fill="EAEAEA"/><w:noWrap/></w:tcPr><w:p><w:pPr><w:jc w:val="center"/></w:pPr><w:r><w:rPr><w:rFonts w:ascii="Times New Roman" w:hAnsi="Times New Roman" w:eastAsia="Times New Roman" w:cs="Times New Roman"/><w:sz w:val="20"/><w:szCs w:val="20"/><w:b w:val="1"/><w:bCs w:val="1"/></w:rPr><w:t xml:space="preserve">Type</w:t></w:r></w:p></w:tc><w:tc><w:tcPr><w:tcW w:w="1100" w:type="dxa"/><w:shd w:val="clear" w:fill="EAEAEA"/><w:noWrap/></w:tcPr><w:p><w:pPr><w:jc w:val="center"/></w:pPr><w:r><w:rPr><w:rFonts w:ascii="Times New Roman" w:hAnsi="Times New Roman" w:eastAsia="Times New Roman" w:cs="Times New Roman"/><w:sz w:val="20"/><w:szCs w:val="20"/><w:b w:val="1"/><w:bCs w:val="1"/></w:rPr><w:t xml:space="preserve">Lebar</w:t></w:r></w:p></w:tc><w:tc><w:tcPr><w:tcW w:w="1100" w:type="dxa"/><w:shd w:val="clear" w:fill="EAEAEA"/><w:noWrap/></w:tcPr><w:p><w:pPr><w:jc w:val="center"/></w:pPr><w:r><w:rPr><w:rFonts w:ascii="Times New Roman" w:hAnsi="Times New Roman" w:eastAsia="Times New Roman" w:cs="Times New Roman"/><w:sz w:val="20"/><w:szCs w:val="20"/><w:b w:val="1"/><w:bCs w:val="1"/></w:rPr><w:t xml:space="preserve">Ket</w:t></w:r></w:p></w:tc></w:tr><w:tr><w:trPr/><w:tc><w:tcPr><w:tcW w:w="500" w:type="dxa"/><w:noWrap/></w:tcPr><w:p><w:pPr><w:jc w:val="center"/></w:pPr><w:r><w:rPr><w:rFonts w:ascii="Times New Roman" w:hAnsi="Times New Roman" w:eastAsia="Times New Roman" w:cs="Times New Roman"/><w:sz w:val="19"/><w:szCs w:val="19"/></w:rPr><w:t xml:space="preserve">1</w:t></w:r></w:p></w:tc><w:tc><w:tcPr><w:tcW w:w="2200" w:type="dxa"/><w:noWrap/></w:tcPr><w:p><w:pPr><w:jc w:val="start"/></w:pPr><w:r><w:rPr><w:rFonts w:ascii="Times New Roman" w:hAnsi="Times New Roman" w:eastAsia="Times New Roman" w:cs="Times New Roman"/><w:sz w:val="19"/><w:szCs w:val="19"/><w:b w:val="1"/><w:bCs w:val="1"/></w:rPr><w:t xml:space="preserve">setting_key</w:t></w:r></w:p></w:tc><w:tc><w:tcPr><w:tcW w:w="3000" w:type="dxa"/><w:noWrap/></w:tcPr><w:p><w:pPr><w:jc w:val="start"/></w:pPr><w:r><w:rPr><w:rFonts w:ascii="Times New Roman" w:hAnsi="Times New Roman" w:eastAsia="Times New Roman" w:cs="Times New Roman"/><w:sz w:val="19"/><w:szCs w:val="19"/></w:rPr><w:t xml:space="preserve">Kata Kunci Pengaturan Parameter</w:t></w:r></w:p></w:tc><w:tc><w:tcPr><w:tcW w:w="1300" w:type="dxa"/><w:noWrap/></w:tcPr><w:p><w:pPr><w:jc w:val="center"/></w:pPr><w:r><w:rPr><w:rFonts w:ascii="Times New Roman" w:hAnsi="Times New Roman" w:eastAsia="Times New Roman" w:cs="Times New Roman"/><w:sz w:val="19"/><w:szCs w:val="19"/></w:rPr><w:t xml:space="preserve">VARCHAR</w:t></w:r></w:p></w:tc><w:tc><w:tcPr><w:tcW w:w="1100" w:type="dxa"/><w:noWrap/></w:tcPr><w:p><w:pPr><w:jc w:val="center"/></w:pPr><w:r><w:rPr><w:rFonts w:ascii="Times New Roman" w:hAnsi="Times New Roman" w:eastAsia="Times New Roman" w:cs="Times New Roman"/><w:sz w:val="19"/><w:szCs w:val="19"/></w:rPr><w:t xml:space="preserve">50</w:t></w:r></w:p></w:tc><w:tc><w:tcPr><w:tcW w:w="1100" w:type="dxa"/><w:noWrap/></w:tcPr><w:p><w:pPr><w:jc w:val="center"/></w:pPr><w:r><w:rPr><w:rFonts w:ascii="Times New Roman" w:hAnsi="Times New Roman" w:eastAsia="Times New Roman" w:cs="Times New Roman"/><w:sz w:val="19"/><w:szCs w:val="19"/></w:rPr><w:t xml:space="preserve">PK</w:t></w:r></w:p></w:tc></w:tr><w:tr><w:trPr/><w:tc><w:tcPr><w:tcW w:w="500" w:type="dxa"/><w:noWrap/></w:tcPr><w:p><w:pPr><w:jc w:val="center"/></w:pPr><w:r><w:rPr><w:rFonts w:ascii="Times New Roman" w:hAnsi="Times New Roman" w:eastAsia="Times New Roman" w:cs="Times New Roman"/><w:sz w:val="19"/><w:szCs w:val="19"/></w:rPr><w:t xml:space="preserve">2</w:t></w:r></w:p></w:tc><w:tc><w:tcPr><w:tcW w:w="2200" w:type="dxa"/><w:noWrap/></w:tcPr><w:p><w:pPr><w:jc w:val="start"/></w:pPr><w:r><w:rPr><w:rFonts w:ascii="Times New Roman" w:hAnsi="Times New Roman" w:eastAsia="Times New Roman" w:cs="Times New Roman"/><w:sz w:val="19"/><w:szCs w:val="19"/><w:b w:val="1"/><w:bCs w:val="1"/></w:rPr><w:t xml:space="preserve">setting_value</w:t></w:r></w:p></w:tc><w:tc><w:tcPr><w:tcW w:w="3000" w:type="dxa"/><w:noWrap/></w:tcPr><w:p><w:pPr><w:jc w:val="start"/></w:pPr><w:r><w:rPr><w:rFonts w:ascii="Times New Roman" w:hAnsi="Times New Roman" w:eastAsia="Times New Roman" w:cs="Times New Roman"/><w:sz w:val="19"/><w:szCs w:val="19"/></w:rPr><w:t xml:space="preserve">Nilai Parameter Pengaturan</w:t></w:r></w:p></w:tc><w:tc><w:tcPr><w:tcW w:w="1300" w:type="dxa"/><w:noWrap/></w:tcPr><w:p><w:pPr><w:jc w:val="center"/></w:pPr><w:r><w:rPr><w:rFonts w:ascii="Times New Roman" w:hAnsi="Times New Roman" w:eastAsia="Times New Roman" w:cs="Times New Roman"/><w:sz w:val="19"/><w:szCs w:val="19"/></w:rPr><w:t xml:space="preserve">TEXT</w:t></w:r></w:p></w:tc><w:tc><w:tcPr><w:tcW w:w="1100" w:type="dxa"/><w:noWrap/></w:tcPr><w:p><w:pPr><w:jc w:val="center"/></w:pPr><w:r><w:rPr><w:rFonts w:ascii="Times New Roman" w:hAnsi="Times New Roman" w:eastAsia="Times New Roman" w:cs="Times New Roman"/><w:sz w:val="19"/><w:szCs w:val="19"/></w:rPr><w:t xml:space="preserve">-</w:t></w:r></w:p></w:tc><w:tc><w:tcPr><w:tcW w:w="1100" w:type="dxa"/><w:noWrap/></w:tcPr><w:p><w:pPr><w:jc w:val="center"/></w:pPr><w:r><w:rPr><w:rFonts w:ascii="Times New Roman" w:hAnsi="Times New Roman" w:eastAsia="Times New Roman" w:cs="Times New Roman"/><w:sz w:val="19"/><w:szCs w:val="19"/></w:rPr><w:t xml:space="preserve">Nullable</w:t></w:r></w:p></w:tc></w:tr><w:tr><w:trPr/><w:tc><w:tcPr><w:tcW w:w="500" w:type="dxa"/><w:noWrap/></w:tcPr><w:p><w:pPr><w:jc w:val="center"/></w:pPr><w:r><w:rPr><w:rFonts w:ascii="Times New Roman" w:hAnsi="Times New Roman" w:eastAsia="Times New Roman" w:cs="Times New Roman"/><w:sz w:val="19"/><w:szCs w:val="19"/></w:rPr><w:t xml:space="preserve">3</w:t></w:r></w:p></w:tc><w:tc><w:tcPr><w:tcW w:w="2200" w:type="dxa"/><w:noWrap/></w:tcPr><w:p><w:pPr><w:jc w:val="start"/></w:pPr><w:r><w:rPr><w:rFonts w:ascii="Times New Roman" w:hAnsi="Times New Roman" w:eastAsia="Times New Roman" w:cs="Times New Roman"/><w:sz w:val="19"/><w:szCs w:val="19"/><w:b w:val="1"/><w:bCs w:val="1"/></w:rPr><w:t xml:space="preserve">setting_group</w:t></w:r></w:p></w:tc><w:tc><w:tcPr><w:tcW w:w="3000" w:type="dxa"/><w:noWrap/></w:tcPr><w:p><w:pPr><w:jc w:val="start"/></w:pPr><w:r><w:rPr><w:rFonts w:ascii="Times New Roman" w:hAnsi="Times New Roman" w:eastAsia="Times New Roman" w:cs="Times New Roman"/><w:sz w:val="19"/><w:szCs w:val="19"/></w:rPr><w:t xml:space="preserve">Kelompok Setting (general / dosir)</w:t></w:r></w:p></w:tc><w:tc><w:tcPr><w:tcW w:w="1300" w:type="dxa"/><w:noWrap/></w:tcPr><w:p><w:pPr><w:jc w:val="center"/></w:pPr><w:r><w:rPr><w:rFonts w:ascii="Times New Roman" w:hAnsi="Times New Roman" w:eastAsia="Times New Roman" w:cs="Times New Roman"/><w:sz w:val="19"/><w:szCs w:val="19"/></w:rPr><w:t xml:space="preserve">VARCHAR</w:t></w:r></w:p></w:tc><w:tc><w:tcPr><w:tcW w:w="1100" w:type="dxa"/><w:noWrap/></w:tcPr><w:p><w:pPr><w:jc w:val="center"/></w:pPr><w:r><w:rPr><w:rFonts w:ascii="Times New Roman" w:hAnsi="Times New Roman" w:eastAsia="Times New Roman" w:cs="Times New Roman"/><w:sz w:val="19"/><w:szCs w:val="19"/></w:rPr><w:t xml:space="preserve">50</w:t></w:r></w:p></w:tc><w:tc><w:tcPr><w:tcW w:w="1100" w:type="dxa"/><w:noWrap/></w:tcPr><w:p><w:pPr><w:jc w:val="center"/></w:pPr><w:r><w:rPr><w:rFonts w:ascii="Times New Roman" w:hAnsi="Times New Roman" w:eastAsia="Times New Roman" w:cs="Times New Roman"/><w:sz w:val="19"/><w:szCs w:val="19"/></w:rPr><w:t xml:space="preserve">Default general</w:t></w:r></w:p></w:tc></w:tr><w:tr><w:trPr/><w:tc><w:tcPr><w:tcW w:w="500" w:type="dxa"/><w:noWrap/></w:tcPr><w:p><w:pPr><w:jc w:val="center"/></w:pPr><w:r><w:rPr><w:rFonts w:ascii="Times New Roman" w:hAnsi="Times New Roman" w:eastAsia="Times New Roman" w:cs="Times New Roman"/><w:sz w:val="19"/><w:szCs w:val="19"/></w:rPr><w:t xml:space="preserve">4</w:t></w:r></w:p></w:tc><w:tc><w:tcPr><w:tcW w:w="2200" w:type="dxa"/><w:noWrap/></w:tcPr><w:p><w:pPr><w:jc w:val="start"/></w:pPr><w:r><w:rPr><w:rFonts w:ascii="Times New Roman" w:hAnsi="Times New Roman" w:eastAsia="Times New Roman" w:cs="Times New Roman"/><w:sz w:val="19"/><w:szCs w:val="19"/><w:b w:val="1"/><w:bCs w:val="1"/></w:rPr><w:t xml:space="preserve">updated_at</w:t></w:r></w:p></w:tc><w:tc><w:tcPr><w:tcW w:w="3000" w:type="dxa"/><w:noWrap/></w:tcPr><w:p><w:pPr><w:jc w:val="start"/></w:pPr><w:r><w:rPr><w:rFonts w:ascii="Times New Roman" w:hAnsi="Times New Roman" w:eastAsia="Times New Roman" w:cs="Times New Roman"/><w:sz w:val="19"/><w:szCs w:val="19"/></w:rPr><w:t xml:space="preserve">Waktu Pembaruan Terakhir</w:t></w:r></w:p></w:tc><w:tc><w:tcPr><w:tcW w:w="1300" w:type="dxa"/><w:noWrap/></w:tcPr><w:p><w:pPr><w:jc w:val="center"/></w:pPr><w:r><w:rPr><w:rFonts w:ascii="Times New Roman" w:hAnsi="Times New Roman" w:eastAsia="Times New Roman" w:cs="Times New Roman"/><w:sz w:val="19"/><w:szCs w:val="19"/></w:rPr><w:t xml:space="preserve">TIMESTAMP</w:t></w:r></w:p></w:tc><w:tc><w:tcPr><w:tcW w:w="1100" w:type="dxa"/><w:noWrap/></w:tcPr><w:p><w:pPr><w:jc w:val="center"/></w:pPr><w:r><w:rPr><w:rFonts w:ascii="Times New Roman" w:hAnsi="Times New Roman" w:eastAsia="Times New Roman" w:cs="Times New Roman"/><w:sz w:val="19"/><w:szCs w:val="19"/></w:rPr><w:t xml:space="preserve">19</w:t></w:r></w:p></w:tc><w:tc><w:tcPr><w:tcW w:w="1100" w:type="dxa"/><w:noWrap/></w:tcPr><w:p><w:pPr><w:jc w:val="center"/></w:pPr><w:r><w:rPr><w:rFonts w:ascii="Times New Roman" w:hAnsi="Times New Roman" w:eastAsia="Times New Roman" w:cs="Times New Roman"/><w:sz w:val="19"/><w:szCs w:val="19"/></w:rPr><w:t xml:space="preserve">Auto Update</w:t></w:r></w:p></w:tc></w:tr></w:tbl><w:p/><w:p><w:pPr><w:spacing w:after="40"/></w:pPr><w:r><w:rPr><w:rFonts w:ascii="Times New Roman" w:hAnsi="Times New Roman" w:eastAsia="Times New Roman" w:cs="Times New Roman"/><w:sz w:val="22"/><w:szCs w:val="22"/><w:b w:val="1"/><w:bCs w:val="1"/></w:rPr><w:t xml:space="preserve">f.   Struktur File / Tabel: ACTIVITY_LOG (Jejak Rekam / Audit Trail Sistem)</w:t></w:r></w:p><w:tbl><w:tblGrid><w:gridCol w:w="500" w:type="dxa"/><w:gridCol w:w="2200" w:type="dxa"/><w:gridCol w:w="3000" w:type="dxa"/><w:gridCol w:w="1300" w:type="dxa"/><w:gridCol w:w="1100" w:type="dxa"/><w:gridCol w:w="1100" w:type="dxa"/></w:tblGrid><w:tblPr><w:tblStyle w:val="MilitaryTable"/></w:tblPr><w:tr><w:trPr/><w:tc><w:tcPr><w:tcW w:w="500" w:type="dxa"/><w:shd w:val="clear" w:fill="EAEAEA"/><w:noWrap/></w:tcPr><w:p><w:pPr><w:jc w:val="center"/></w:pPr><w:r><w:rPr><w:rFonts w:ascii="Times New Roman" w:hAnsi="Times New Roman" w:eastAsia="Times New Roman" w:cs="Times New Roman"/><w:sz w:val="20"/><w:szCs w:val="20"/><w:b w:val="1"/><w:bCs w:val="1"/></w:rPr><w:t xml:space="preserve">No</w:t></w:r></w:p></w:tc><w:tc><w:tcPr><w:tcW w:w="2200" w:type="dxa"/><w:shd w:val="clear" w:fill="EAEAEA"/><w:noWrap/></w:tcPr><w:p><w:pPr><w:jc w:val="center"/></w:pPr><w:r><w:rPr><w:rFonts w:ascii="Times New Roman" w:hAnsi="Times New Roman" w:eastAsia="Times New Roman" w:cs="Times New Roman"/><w:sz w:val="20"/><w:szCs w:val="20"/><w:b w:val="1"/><w:bCs w:val="1"/></w:rPr><w:t xml:space="preserve">Nama Field</w:t></w:r></w:p></w:tc><w:tc><w:tcPr><w:tcW w:w="3000" w:type="dxa"/><w:shd w:val="clear" w:fill="EAEAEA"/><w:noWrap/></w:tcPr><w:p><w:pPr><w:jc w:val="center"/></w:pPr><w:r><w:rPr><w:rFonts w:ascii="Times New Roman" w:hAnsi="Times New Roman" w:eastAsia="Times New Roman" w:cs="Times New Roman"/><w:sz w:val="20"/><w:szCs w:val="20"/><w:b w:val="1"/><w:bCs w:val="1"/></w:rPr><w:t xml:space="preserve">Uraian / Sebutan</w:t></w:r></w:p></w:tc><w:tc><w:tcPr><w:tcW w:w="1300" w:type="dxa"/><w:shd w:val="clear" w:fill="EAEAEA"/><w:noWrap/></w:tcPr><w:p><w:pPr><w:jc w:val="center"/></w:pPr><w:r><w:rPr><w:rFonts w:ascii="Times New Roman" w:hAnsi="Times New Roman" w:eastAsia="Times New Roman" w:cs="Times New Roman"/><w:sz w:val="20"/><w:szCs w:val="20"/><w:b w:val="1"/><w:bCs w:val="1"/></w:rPr><w:t xml:space="preserve">Type</w:t></w:r></w:p></w:tc><w:tc><w:tcPr><w:tcW w:w="1100" w:type="dxa"/><w:shd w:val="clear" w:fill="EAEAEA"/><w:noWrap/></w:tcPr><w:p><w:pPr><w:jc w:val="center"/></w:pPr><w:r><w:rPr><w:rFonts w:ascii="Times New Roman" w:hAnsi="Times New Roman" w:eastAsia="Times New Roman" w:cs="Times New Roman"/><w:sz w:val="20"/><w:szCs w:val="20"/><w:b w:val="1"/><w:bCs w:val="1"/></w:rPr><w:t xml:space="preserve">Lebar</w:t></w:r></w:p></w:tc><w:tc><w:tcPr><w:tcW w:w="1100" w:type="dxa"/><w:shd w:val="clear" w:fill="EAEAEA"/><w:noWrap/></w:tcPr><w:p><w:pPr><w:jc w:val="center"/></w:pPr><w:r><w:rPr><w:rFonts w:ascii="Times New Roman" w:hAnsi="Times New Roman" w:eastAsia="Times New Roman" w:cs="Times New Roman"/><w:sz w:val="20"/><w:szCs w:val="20"/><w:b w:val="1"/><w:bCs w:val="1"/></w:rPr><w:t xml:space="preserve">Ket</w:t></w:r></w:p></w:tc></w:tr><w:tr><w:trPr/><w:tc><w:tcPr><w:tcW w:w="500" w:type="dxa"/><w:noWrap/></w:tcPr><w:p><w:pPr><w:jc w:val="center"/></w:pPr><w:r><w:rPr><w:rFonts w:ascii="Times New Roman" w:hAnsi="Times New Roman" w:eastAsia="Times New Roman" w:cs="Times New Roman"/><w:sz w:val="19"/><w:szCs w:val="19"/></w:rPr><w:t xml:space="preserve">1</w:t></w:r></w:p></w:tc><w:tc><w:tcPr><w:tcW w:w="2200" w:type="dxa"/><w:noWrap/></w:tcPr><w:p><w:pPr><w:jc w:val="start"/></w:pPr><w:r><w:rPr><w:rFonts w:ascii="Times New Roman" w:hAnsi="Times New Roman" w:eastAsia="Times New Roman" w:cs="Times New Roman"/><w:sz w:val="19"/><w:szCs w:val="19"/><w:b w:val="1"/><w:bCs w:val="1"/></w:rPr><w:t xml:space="preserve">id</w:t></w:r></w:p></w:tc><w:tc><w:tcPr><w:tcW w:w="3000" w:type="dxa"/><w:noWrap/></w:tcPr><w:p><w:pPr><w:jc w:val="start"/></w:pPr><w:r><w:rPr><w:rFonts w:ascii="Times New Roman" w:hAnsi="Times New Roman" w:eastAsia="Times New Roman" w:cs="Times New Roman"/><w:sz w:val="19"/><w:szCs w:val="19"/></w:rPr><w:t xml:space="preserve">Nomor Unik Catatan Audit</w:t></w:r></w:p></w:tc><w:tc><w:tcPr><w:tcW w:w="1300" w:type="dxa"/><w:noWrap/></w:tcPr><w:p><w:pPr><w:jc w:val="center"/></w:pPr><w:r><w:rPr><w:rFonts w:ascii="Times New Roman" w:hAnsi="Times New Roman" w:eastAsia="Times New Roman" w:cs="Times New Roman"/><w:sz w:val="19"/><w:szCs w:val="19"/></w:rPr><w:t xml:space="preserve">INT</w:t></w:r></w:p></w:tc><w:tc><w:tcPr><w:tcW w:w="1100" w:type="dxa"/><w:noWrap/></w:tcPr><w:p><w:pPr><w:jc w:val="center"/></w:pPr><w:r><w:rPr><w:rFonts w:ascii="Times New Roman" w:hAnsi="Times New Roman" w:eastAsia="Times New Roman" w:cs="Times New Roman"/><w:sz w:val="19"/><w:szCs w:val="19"/></w:rPr><w:t xml:space="preserve">11</w:t></w:r></w:p></w:tc><w:tc><w:tcPr><w:tcW w:w="1100" w:type="dxa"/><w:noWrap/></w:tcPr><w:p><w:pPr><w:jc w:val="center"/></w:pPr><w:r><w:rPr><w:rFonts w:ascii="Times New Roman" w:hAnsi="Times New Roman" w:eastAsia="Times New Roman" w:cs="Times New Roman"/><w:sz w:val="19"/><w:szCs w:val="19"/></w:rPr><w:t xml:space="preserve">PK, Auto</w:t></w:r></w:p></w:tc></w:tr><w:tr><w:trPr/><w:tc><w:tcPr><w:tcW w:w="500" w:type="dxa"/><w:noWrap/></w:tcPr><w:p><w:pPr><w:jc w:val="center"/></w:pPr><w:r><w:rPr><w:rFonts w:ascii="Times New Roman" w:hAnsi="Times New Roman" w:eastAsia="Times New Roman" w:cs="Times New Roman"/><w:sz w:val="19"/><w:szCs w:val="19"/></w:rPr><w:t xml:space="preserve">2</w:t></w:r></w:p></w:tc><w:tc><w:tcPr><w:tcW w:w="2200" w:type="dxa"/><w:noWrap/></w:tcPr><w:p><w:pPr><w:jc w:val="start"/></w:pPr><w:r><w:rPr><w:rFonts w:ascii="Times New Roman" w:hAnsi="Times New Roman" w:eastAsia="Times New Roman" w:cs="Times New Roman"/><w:sz w:val="19"/><w:szCs w:val="19"/><w:b w:val="1"/><w:bCs w:val="1"/></w:rPr><w:t xml:space="preserve">user_id</w:t></w:r></w:p></w:tc><w:tc><w:tcPr><w:tcW w:w="3000" w:type="dxa"/><w:noWrap/></w:tcPr><w:p><w:pPr><w:jc w:val="start"/></w:pPr><w:r><w:rPr><w:rFonts w:ascii="Times New Roman" w:hAnsi="Times New Roman" w:eastAsia="Times New Roman" w:cs="Times New Roman"/><w:sz w:val="19"/><w:szCs w:val="19"/></w:rPr><w:t xml:space="preserve">Relasi ke Akun Pelaku Aksi</w:t></w:r></w:p></w:tc><w:tc><w:tcPr><w:tcW w:w="1300" w:type="dxa"/><w:noWrap/></w:tcPr><w:p><w:pPr><w:jc w:val="center"/></w:pPr><w:r><w:rPr><w:rFonts w:ascii="Times New Roman" w:hAnsi="Times New Roman" w:eastAsia="Times New Roman" w:cs="Times New Roman"/><w:sz w:val="19"/><w:szCs w:val="19"/></w:rPr><w:t xml:space="preserve">INT</w:t></w:r></w:p></w:tc><w:tc><w:tcPr><w:tcW w:w="1100" w:type="dxa"/><w:noWrap/></w:tcPr><w:p><w:pPr><w:jc w:val="center"/></w:pPr><w:r><w:rPr><w:rFonts w:ascii="Times New Roman" w:hAnsi="Times New Roman" w:eastAsia="Times New Roman" w:cs="Times New Roman"/><w:sz w:val="19"/><w:szCs w:val="19"/></w:rPr><w:t xml:space="preserve">11</w:t></w:r></w:p></w:tc><w:tc><w:tcPr><w:tcW w:w="1100" w:type="dxa"/><w:noWrap/></w:tcPr><w:p><w:pPr><w:jc w:val="center"/></w:pPr><w:r><w:rPr><w:rFonts w:ascii="Times New Roman" w:hAnsi="Times New Roman" w:eastAsia="Times New Roman" w:cs="Times New Roman"/><w:sz w:val="19"/><w:szCs w:val="19"/></w:rPr><w:t xml:space="preserve">FK, Nullable</w:t></w:r></w:p></w:tc></w:tr><w:tr><w:trPr/><w:tc><w:tcPr><w:tcW w:w="500" w:type="dxa"/><w:noWrap/></w:tcPr><w:p><w:pPr><w:jc w:val="center"/></w:pPr><w:r><w:rPr><w:rFonts w:ascii="Times New Roman" w:hAnsi="Times New Roman" w:eastAsia="Times New Roman" w:cs="Times New Roman"/><w:sz w:val="19"/><w:szCs w:val="19"/></w:rPr><w:t xml:space="preserve">3</w:t></w:r></w:p></w:tc><w:tc><w:tcPr><w:tcW w:w="2200" w:type="dxa"/><w:noWrap/></w:tcPr><w:p><w:pPr><w:jc w:val="start"/></w:pPr><w:r><w:rPr><w:rFonts w:ascii="Times New Roman" w:hAnsi="Times New Roman" w:eastAsia="Times New Roman" w:cs="Times New Roman"/><w:sz w:val="19"/><w:szCs w:val="19"/><w:b w:val="1"/><w:bCs w:val="1"/></w:rPr><w:t xml:space="preserve">aktivitas</w:t></w:r></w:p></w:tc><w:tc><w:tcPr><w:tcW w:w="3000" w:type="dxa"/><w:noWrap/></w:tcPr><w:p><w:pPr><w:jc w:val="start"/></w:pPr><w:r><w:rPr><w:rFonts w:ascii="Times New Roman" w:hAnsi="Times New Roman" w:eastAsia="Times New Roman" w:cs="Times New Roman"/><w:sz w:val="19"/><w:szCs w:val="19"/></w:rPr><w:t xml:space="preserve">Nama Tindakan (LOGIN, VERIFY, DLL)</w:t></w:r></w:p></w:tc><w:tc><w:tcPr><w:tcW w:w="1300" w:type="dxa"/><w:noWrap/></w:tcPr><w:p><w:pPr><w:jc w:val="center"/></w:pPr><w:r><w:rPr><w:rFonts w:ascii="Times New Roman" w:hAnsi="Times New Roman" w:eastAsia="Times New Roman" w:cs="Times New Roman"/><w:sz w:val="19"/><w:szCs w:val="19"/></w:rPr><w:t xml:space="preserve">VARCHAR</w:t></w:r></w:p></w:tc><w:tc><w:tcPr><w:tcW w:w="1100" w:type="dxa"/><w:noWrap/></w:tcPr><w:p><w:pPr><w:jc w:val="center"/></w:pPr><w:r><w:rPr><w:rFonts w:ascii="Times New Roman" w:hAnsi="Times New Roman" w:eastAsia="Times New Roman" w:cs="Times New Roman"/><w:sz w:val="19"/><w:szCs w:val="19"/></w:rPr><w:t xml:space="preserve">150</w:t></w:r></w:p></w:tc><w:tc><w:tcPr><w:tcW w:w="1100" w:type="dxa"/><w:noWrap/></w:tcPr><w:p><w:pPr><w:jc w:val="center"/></w:pPr><w:r><w:rPr><w:rFonts w:ascii="Times New Roman" w:hAnsi="Times New Roman" w:eastAsia="Times New Roman" w:cs="Times New Roman"/><w:sz w:val="19"/><w:szCs w:val="19"/></w:rPr><w:t xml:space="preserve">INDEX</w:t></w:r></w:p></w:tc></w:tr><w:tr><w:trPr/><w:tc><w:tcPr><w:tcW w:w="500" w:type="dxa"/><w:noWrap/></w:tcPr><w:p><w:pPr><w:jc w:val="center"/></w:pPr><w:r><w:rPr><w:rFonts w:ascii="Times New Roman" w:hAnsi="Times New Roman" w:eastAsia="Times New Roman" w:cs="Times New Roman"/><w:sz w:val="19"/><w:szCs w:val="19"/></w:rPr><w:t xml:space="preserve">4</w:t></w:r></w:p></w:tc><w:tc><w:tcPr><w:tcW w:w="2200" w:type="dxa"/><w:noWrap/></w:tcPr><w:p><w:pPr><w:jc w:val="start"/></w:pPr><w:r><w:rPr><w:rFonts w:ascii="Times New Roman" w:hAnsi="Times New Roman" w:eastAsia="Times New Roman" w:cs="Times New Roman"/><w:sz w:val="19"/><w:szCs w:val="19"/><w:b w:val="1"/><w:bCs w:val="1"/></w:rPr><w:t xml:space="preserve">keterangan</w:t></w:r></w:p></w:tc><w:tc><w:tcPr><w:tcW w:w="3000" w:type="dxa"/><w:noWrap/></w:tcPr><w:p><w:pPr><w:jc w:val="start"/></w:pPr><w:r><w:rPr><w:rFonts w:ascii="Times New Roman" w:hAnsi="Times New Roman" w:eastAsia="Times New Roman" w:cs="Times New Roman"/><w:sz w:val="19"/><w:szCs w:val="19"/></w:rPr><w:t xml:space="preserve">Rincian Catatan / Konteks Aksi</w:t></w:r></w:p></w:tc><w:tc><w:tcPr><w:tcW w:w="1300" w:type="dxa"/><w:noWrap/></w:tcPr><w:p><w:pPr><w:jc w:val="center"/></w:pPr><w:r><w:rPr><w:rFonts w:ascii="Times New Roman" w:hAnsi="Times New Roman" w:eastAsia="Times New Roman" w:cs="Times New Roman"/><w:sz w:val="19"/><w:szCs w:val="19"/></w:rPr><w:t xml:space="preserve">TEXT</w:t></w:r></w:p></w:tc><w:tc><w:tcPr><w:tcW w:w="1100" w:type="dxa"/><w:noWrap/></w:tcPr><w:p><w:pPr><w:jc w:val="center"/></w:pPr><w:r><w:rPr><w:rFonts w:ascii="Times New Roman" w:hAnsi="Times New Roman" w:eastAsia="Times New Roman" w:cs="Times New Roman"/><w:sz w:val="19"/><w:szCs w:val="19"/></w:rPr><w:t xml:space="preserve">-</w:t></w:r></w:p></w:tc><w:tc><w:tcPr><w:tcW w:w="1100" w:type="dxa"/><w:noWrap/></w:tcPr><w:p><w:pPr><w:jc w:val="center"/></w:pPr><w:r><w:rPr><w:rFonts w:ascii="Times New Roman" w:hAnsi="Times New Roman" w:eastAsia="Times New Roman" w:cs="Times New Roman"/><w:sz w:val="19"/><w:szCs w:val="19"/></w:rPr><w:t xml:space="preserve">Nullable</w:t></w:r></w:p></w:tc></w:tr><w:tr><w:trPr/><w:tc><w:tcPr><w:tcW w:w="500" w:type="dxa"/><w:noWrap/></w:tcPr><w:p><w:pPr><w:jc w:val="center"/></w:pPr><w:r><w:rPr><w:rFonts w:ascii="Times New Roman" w:hAnsi="Times New Roman" w:eastAsia="Times New Roman" w:cs="Times New Roman"/><w:sz w:val="19"/><w:szCs w:val="19"/></w:rPr><w:t xml:space="preserve">5</w:t></w:r></w:p></w:tc><w:tc><w:tcPr><w:tcW w:w="2200" w:type="dxa"/><w:noWrap/></w:tcPr><w:p><w:pPr><w:jc w:val="start"/></w:pPr><w:r><w:rPr><w:rFonts w:ascii="Times New Roman" w:hAnsi="Times New Roman" w:eastAsia="Times New Roman" w:cs="Times New Roman"/><w:sz w:val="19"/><w:szCs w:val="19"/><w:b w:val="1"/><w:bCs w:val="1"/></w:rPr><w:t xml:space="preserve">ip_address</w:t></w:r></w:p></w:tc><w:tc><w:tcPr><w:tcW w:w="3000" w:type="dxa"/><w:noWrap/></w:tcPr><w:p><w:pPr><w:jc w:val="start"/></w:pPr><w:r><w:rPr><w:rFonts w:ascii="Times New Roman" w:hAnsi="Times New Roman" w:eastAsia="Times New Roman" w:cs="Times New Roman"/><w:sz w:val="19"/><w:szCs w:val="19"/></w:rPr><w:t xml:space="preserve">Alamat IP Komputer Pengakses</w:t></w:r></w:p></w:tc><w:tc><w:tcPr><w:tcW w:w="1300" w:type="dxa"/><w:noWrap/></w:tcPr><w:p><w:pPr><w:jc w:val="center"/></w:pPr><w:r><w:rPr><w:rFonts w:ascii="Times New Roman" w:hAnsi="Times New Roman" w:eastAsia="Times New Roman" w:cs="Times New Roman"/><w:sz w:val="19"/><w:szCs w:val="19"/></w:rPr><w:t xml:space="preserve">VARCHAR</w:t></w:r></w:p></w:tc><w:tc><w:tcPr><w:tcW w:w="1100" w:type="dxa"/><w:noWrap/></w:tcPr><w:p><w:pPr><w:jc w:val="center"/></w:pPr><w:r><w:rPr><w:rFonts w:ascii="Times New Roman" w:hAnsi="Times New Roman" w:eastAsia="Times New Roman" w:cs="Times New Roman"/><w:sz w:val="19"/><w:szCs w:val="19"/></w:rPr><w:t xml:space="preserve">45</w:t></w:r></w:p></w:tc><w:tc><w:tcPr><w:tcW w:w="1100" w:type="dxa"/><w:noWrap/></w:tcPr><w:p><w:pPr><w:jc w:val="center"/></w:pPr><w:r><w:rPr><w:rFonts w:ascii="Times New Roman" w:hAnsi="Times New Roman" w:eastAsia="Times New Roman" w:cs="Times New Roman"/><w:sz w:val="19"/><w:szCs w:val="19"/></w:rPr><w:t xml:space="preserve">Nullable</w:t></w:r></w:p></w:tc></w:tr><w:tr><w:trPr/><w:tc><w:tcPr><w:tcW w:w="500" w:type="dxa"/><w:noWrap/></w:tcPr><w:p><w:pPr><w:jc w:val="center"/></w:pPr><w:r><w:rPr><w:rFonts w:ascii="Times New Roman" w:hAnsi="Times New Roman" w:eastAsia="Times New Roman" w:cs="Times New Roman"/><w:sz w:val="19"/><w:szCs w:val="19"/></w:rPr><w:t xml:space="preserve">6</w:t></w:r></w:p></w:tc><w:tc><w:tcPr><w:tcW w:w="2200" w:type="dxa"/><w:noWrap/></w:tcPr><w:p><w:pPr><w:jc w:val="start"/></w:pPr><w:r><w:rPr><w:rFonts w:ascii="Times New Roman" w:hAnsi="Times New Roman" w:eastAsia="Times New Roman" w:cs="Times New Roman"/><w:sz w:val="19"/><w:szCs w:val="19"/><w:b w:val="1"/><w:bCs w:val="1"/></w:rPr><w:t xml:space="preserve">created_at</w:t></w:r></w:p></w:tc><w:tc><w:tcPr><w:tcW w:w="3000" w:type="dxa"/><w:noWrap/></w:tcPr><w:p><w:pPr><w:jc w:val="start"/></w:pPr><w:r><w:rPr><w:rFonts w:ascii="Times New Roman" w:hAnsi="Times New Roman" w:eastAsia="Times New Roman" w:cs="Times New Roman"/><w:sz w:val="19"/><w:szCs w:val="19"/></w:rPr><w:t xml:space="preserve">Waktu Kejadian Aktivitas</w:t></w:r></w:p></w:tc><w:tc><w:tcPr><w:tcW w:w="1300" w:type="dxa"/><w:noWrap/></w:tcPr><w:p><w:pPr><w:jc w:val="center"/></w:pPr><w:r><w:rPr><w:rFonts w:ascii="Times New Roman" w:hAnsi="Times New Roman" w:eastAsia="Times New Roman" w:cs="Times New Roman"/><w:sz w:val="19"/><w:szCs w:val="19"/></w:rPr><w:t xml:space="preserve">TIMESTAMP</w:t></w:r></w:p></w:tc><w:tc><w:tcPr><w:tcW w:w="1100" w:type="dxa"/><w:noWrap/></w:tcPr><w:p><w:pPr><w:jc w:val="center"/></w:pPr><w:r><w:rPr><w:rFonts w:ascii="Times New Roman" w:hAnsi="Times New Roman" w:eastAsia="Times New Roman" w:cs="Times New Roman"/><w:sz w:val="19"/><w:szCs w:val="19"/></w:rPr><w:t xml:space="preserve">19</w:t></w:r></w:p></w:tc><w:tc><w:tcPr><w:tcW w:w="1100" w:type="dxa"/><w:noWrap/></w:tcPr><w:p><w:pPr><w:jc w:val="center"/></w:pPr><w:r><w:rPr><w:rFonts w:ascii="Times New Roman" w:hAnsi="Times New Roman" w:eastAsia="Times New Roman" w:cs="Times New Roman"/><w:sz w:val="19"/><w:szCs w:val="19"/></w:rPr><w:t xml:space="preserve">INDEX</w:t></w:r></w:p></w:tc></w:tr></w:tbl><w:p/><w:p><w:pPr><w:spacing w:after="40"/></w:pPr><w:r><w:rPr><w:rFonts w:ascii="Times New Roman" w:hAnsi="Times New Roman" w:eastAsia="Times New Roman" w:cs="Times New Roman"/><w:sz w:val="22"/><w:szCs w:val="22"/><w:b w:val="1"/><w:bCs w:val="1"/></w:rPr><w:t xml:space="preserve">g.   Struktur File / Tabel: BACKUP_LOG (Riwayat Pencadangan Pangkalan Data)</w:t></w:r></w:p><w:tbl><w:tblGrid><w:gridCol w:w="500" w:type="dxa"/><w:gridCol w:w="2200" w:type="dxa"/><w:gridCol w:w="3000" w:type="dxa"/><w:gridCol w:w="1300" w:type="dxa"/><w:gridCol w:w="1100" w:type="dxa"/><w:gridCol w:w="1100" w:type="dxa"/></w:tblGrid><w:tblPr><w:tblStyle w:val="MilitaryTable"/></w:tblPr><w:tr><w:trPr/><w:tc><w:tcPr><w:tcW w:w="500" w:type="dxa"/><w:shd w:val="clear" w:fill="EAEAEA"/><w:noWrap/></w:tcPr><w:p><w:pPr><w:jc w:val="center"/></w:pPr><w:r><w:rPr><w:rFonts w:ascii="Times New Roman" w:hAnsi="Times New Roman" w:eastAsia="Times New Roman" w:cs="Times New Roman"/><w:sz w:val="20"/><w:szCs w:val="20"/><w:b w:val="1"/><w:bCs w:val="1"/></w:rPr><w:t xml:space="preserve">No</w:t></w:r></w:p></w:tc><w:tc><w:tcPr><w:tcW w:w="2200" w:type="dxa"/><w:shd w:val="clear" w:fill="EAEAEA"/><w:noWrap/></w:tcPr><w:p><w:pPr><w:jc w:val="center"/></w:pPr><w:r><w:rPr><w:rFonts w:ascii="Times New Roman" w:hAnsi="Times New Roman" w:eastAsia="Times New Roman" w:cs="Times New Roman"/><w:sz w:val="20"/><w:szCs w:val="20"/><w:b w:val="1"/><w:bCs w:val="1"/></w:rPr><w:t xml:space="preserve">Nama Field</w:t></w:r></w:p></w:tc><w:tc><w:tcPr><w:tcW w:w="3000" w:type="dxa"/><w:shd w:val="clear" w:fill="EAEAEA"/><w:noWrap/></w:tcPr><w:p><w:pPr><w:jc w:val="center"/></w:pPr><w:r><w:rPr><w:rFonts w:ascii="Times New Roman" w:hAnsi="Times New Roman" w:eastAsia="Times New Roman" w:cs="Times New Roman"/><w:sz w:val="20"/><w:szCs w:val="20"/><w:b w:val="1"/><w:bCs w:val="1"/></w:rPr><w:t xml:space="preserve">Uraian / Sebutan</w:t></w:r></w:p></w:tc><w:tc><w:tcPr><w:tcW w:w="1300" w:type="dxa"/><w:shd w:val="clear" w:fill="EAEAEA"/><w:noWrap/></w:tcPr><w:p><w:pPr><w:jc w:val="center"/></w:pPr><w:r><w:rPr><w:rFonts w:ascii="Times New Roman" w:hAnsi="Times New Roman" w:eastAsia="Times New Roman" w:cs="Times New Roman"/><w:sz w:val="20"/><w:szCs w:val="20"/><w:b w:val="1"/><w:bCs w:val="1"/></w:rPr><w:t xml:space="preserve">Type</w:t></w:r></w:p></w:tc><w:tc><w:tcPr><w:tcW w:w="1100" w:type="dxa"/><w:shd w:val="clear" w:fill="EAEAEA"/><w:noWrap/></w:tcPr><w:p><w:pPr><w:jc w:val="center"/></w:pPr><w:r><w:rPr><w:rFonts w:ascii="Times New Roman" w:hAnsi="Times New Roman" w:eastAsia="Times New Roman" w:cs="Times New Roman"/><w:sz w:val="20"/><w:szCs w:val="20"/><w:b w:val="1"/><w:bCs w:val="1"/></w:rPr><w:t xml:space="preserve">Lebar</w:t></w:r></w:p></w:tc><w:tc><w:tcPr><w:tcW w:w="1100" w:type="dxa"/><w:shd w:val="clear" w:fill="EAEAEA"/><w:noWrap/></w:tcPr><w:p><w:pPr><w:jc w:val="center"/></w:pPr><w:r><w:rPr><w:rFonts w:ascii="Times New Roman" w:hAnsi="Times New Roman" w:eastAsia="Times New Roman" w:cs="Times New Roman"/><w:sz w:val="20"/><w:szCs w:val="20"/><w:b w:val="1"/><w:bCs w:val="1"/></w:rPr><w:t xml:space="preserve">Ket</w:t></w:r></w:p></w:tc></w:tr><w:tr><w:trPr/><w:tc><w:tcPr><w:tcW w:w="500" w:type="dxa"/><w:noWrap/></w:tcPr><w:p><w:pPr><w:jc w:val="center"/></w:pPr><w:r><w:rPr><w:rFonts w:ascii="Times New Roman" w:hAnsi="Times New Roman" w:eastAsia="Times New Roman" w:cs="Times New Roman"/><w:sz w:val="19"/><w:szCs w:val="19"/></w:rPr><w:t xml:space="preserve">1</w:t></w:r></w:p></w:tc><w:tc><w:tcPr><w:tcW w:w="2200" w:type="dxa"/><w:noWrap/></w:tcPr><w:p><w:pPr><w:jc w:val="start"/></w:pPr><w:r><w:rPr><w:rFonts w:ascii="Times New Roman" w:hAnsi="Times New Roman" w:eastAsia="Times New Roman" w:cs="Times New Roman"/><w:sz w:val="19"/><w:szCs w:val="19"/><w:b w:val="1"/><w:bCs w:val="1"/></w:rPr><w:t xml:space="preserve">id</w:t></w:r></w:p></w:tc><w:tc><w:tcPr><w:tcW w:w="3000" w:type="dxa"/><w:noWrap/></w:tcPr><w:p><w:pPr><w:jc w:val="start"/></w:pPr><w:r><w:rPr><w:rFonts w:ascii="Times New Roman" w:hAnsi="Times New Roman" w:eastAsia="Times New Roman" w:cs="Times New Roman"/><w:sz w:val="19"/><w:szCs w:val="19"/></w:rPr><w:t xml:space="preserve">Nomor Unik Log Backup</w:t></w:r></w:p></w:tc><w:tc><w:tcPr><w:tcW w:w="1300" w:type="dxa"/><w:noWrap/></w:tcPr><w:p><w:pPr><w:jc w:val="center"/></w:pPr><w:r><w:rPr><w:rFonts w:ascii="Times New Roman" w:hAnsi="Times New Roman" w:eastAsia="Times New Roman" w:cs="Times New Roman"/><w:sz w:val="19"/><w:szCs w:val="19"/></w:rPr><w:t xml:space="preserve">INT</w:t></w:r></w:p></w:tc><w:tc><w:tcPr><w:tcW w:w="1100" w:type="dxa"/><w:noWrap/></w:tcPr><w:p><w:pPr><w:jc w:val="center"/></w:pPr><w:r><w:rPr><w:rFonts w:ascii="Times New Roman" w:hAnsi="Times New Roman" w:eastAsia="Times New Roman" w:cs="Times New Roman"/><w:sz w:val="19"/><w:szCs w:val="19"/></w:rPr><w:t xml:space="preserve">11</w:t></w:r></w:p></w:tc><w:tc><w:tcPr><w:tcW w:w="1100" w:type="dxa"/><w:noWrap/></w:tcPr><w:p><w:pPr><w:jc w:val="center"/></w:pPr><w:r><w:rPr><w:rFonts w:ascii="Times New Roman" w:hAnsi="Times New Roman" w:eastAsia="Times New Roman" w:cs="Times New Roman"/><w:sz w:val="19"/><w:szCs w:val="19"/></w:rPr><w:t xml:space="preserve">PK, Auto</w:t></w:r></w:p></w:tc></w:tr><w:tr><w:trPr/><w:tc><w:tcPr><w:tcW w:w="500" w:type="dxa"/><w:noWrap/></w:tcPr><w:p><w:pPr><w:jc w:val="center"/></w:pPr><w:r><w:rPr><w:rFonts w:ascii="Times New Roman" w:hAnsi="Times New Roman" w:eastAsia="Times New Roman" w:cs="Times New Roman"/><w:sz w:val="19"/><w:szCs w:val="19"/></w:rPr><w:t xml:space="preserve">2</w:t></w:r></w:p></w:tc><w:tc><w:tcPr><w:tcW w:w="2200" w:type="dxa"/><w:noWrap/></w:tcPr><w:p><w:pPr><w:jc w:val="start"/></w:pPr><w:r><w:rPr><w:rFonts w:ascii="Times New Roman" w:hAnsi="Times New Roman" w:eastAsia="Times New Roman" w:cs="Times New Roman"/><w:sz w:val="19"/><w:szCs w:val="19"/><w:b w:val="1"/><w:bCs w:val="1"/></w:rPr><w:t xml:space="preserve">file_name</w:t></w:r></w:p></w:tc><w:tc><w:tcPr><w:tcW w:w="3000" w:type="dxa"/><w:noWrap/></w:tcPr><w:p><w:pPr><w:jc w:val="start"/></w:pPr><w:r><w:rPr><w:rFonts w:ascii="Times New Roman" w:hAnsi="Times New Roman" w:eastAsia="Times New Roman" w:cs="Times New Roman"/><w:sz w:val="19"/><w:szCs w:val="19"/></w:rPr><w:t xml:space="preserve">Nama Berkas Cadangan (.sql/.zip)</w:t></w:r></w:p></w:tc><w:tc><w:tcPr><w:tcW w:w="1300" w:type="dxa"/><w:noWrap/></w:tcPr><w:p><w:pPr><w:jc w:val="center"/></w:pPr><w:r><w:rPr><w:rFonts w:ascii="Times New Roman" w:hAnsi="Times New Roman" w:eastAsia="Times New Roman" w:cs="Times New Roman"/><w:sz w:val="19"/><w:szCs w:val="19"/></w:rPr><w:t xml:space="preserve">VARCHAR</w:t></w:r></w:p></w:tc><w:tc><w:tcPr><w:tcW w:w="1100" w:type="dxa"/><w:noWrap/></w:tcPr><w:p><w:pPr><w:jc w:val="center"/></w:pPr><w:r><w:rPr><w:rFonts w:ascii="Times New Roman" w:hAnsi="Times New Roman" w:eastAsia="Times New Roman" w:cs="Times New Roman"/><w:sz w:val="19"/><w:szCs w:val="19"/></w:rPr><w:t xml:space="preserve">255</w:t></w:r></w:p></w:tc><w:tc><w:tcPr><w:tcW w:w="1100" w:type="dxa"/><w:noWrap/></w:tcPr><w:p><w:pPr><w:jc w:val="center"/></w:pPr><w:r><w:rPr><w:rFonts w:ascii="Times New Roman" w:hAnsi="Times New Roman" w:eastAsia="Times New Roman" w:cs="Times New Roman"/><w:sz w:val="19"/><w:szCs w:val="19"/></w:rPr><w:t xml:space="preserve">Not Null</w:t></w:r></w:p></w:tc></w:tr><w:tr><w:trPr/><w:tc><w:tcPr><w:tcW w:w="500" w:type="dxa"/><w:noWrap/></w:tcPr><w:p><w:pPr><w:jc w:val="center"/></w:pPr><w:r><w:rPr><w:rFonts w:ascii="Times New Roman" w:hAnsi="Times New Roman" w:eastAsia="Times New Roman" w:cs="Times New Roman"/><w:sz w:val="19"/><w:szCs w:val="19"/></w:rPr><w:t xml:space="preserve">3</w:t></w:r></w:p></w:tc><w:tc><w:tcPr><w:tcW w:w="2200" w:type="dxa"/><w:noWrap/></w:tcPr><w:p><w:pPr><w:jc w:val="start"/></w:pPr><w:r><w:rPr><w:rFonts w:ascii="Times New Roman" w:hAnsi="Times New Roman" w:eastAsia="Times New Roman" w:cs="Times New Roman"/><w:sz w:val="19"/><w:szCs w:val="19"/><w:b w:val="1"/><w:bCs w:val="1"/></w:rPr><w:t xml:space="preserve">size_bytes</w:t></w:r></w:p></w:tc><w:tc><w:tcPr><w:tcW w:w="3000" w:type="dxa"/><w:noWrap/></w:tcPr><w:p><w:pPr><w:jc w:val="start"/></w:pPr><w:r><w:rPr><w:rFonts w:ascii="Times New Roman" w:hAnsi="Times New Roman" w:eastAsia="Times New Roman" w:cs="Times New Roman"/><w:sz w:val="19"/><w:szCs w:val="19"/></w:rPr><w:t xml:space="preserve">Ukuran Berkas Cadangan (Byte)</w:t></w:r></w:p></w:tc><w:tc><w:tcPr><w:tcW w:w="1300" w:type="dxa"/><w:noWrap/></w:tcPr><w:p><w:pPr><w:jc w:val="center"/></w:pPr><w:r><w:rPr><w:rFonts w:ascii="Times New Roman" w:hAnsi="Times New Roman" w:eastAsia="Times New Roman" w:cs="Times New Roman"/><w:sz w:val="19"/><w:szCs w:val="19"/></w:rPr><w:t xml:space="preserve">BIGINT</w:t></w:r></w:p></w:tc><w:tc><w:tcPr><w:tcW w:w="1100" w:type="dxa"/><w:noWrap/></w:tcPr><w:p><w:pPr><w:jc w:val="center"/></w:pPr><w:r><w:rPr><w:rFonts w:ascii="Times New Roman" w:hAnsi="Times New Roman" w:eastAsia="Times New Roman" w:cs="Times New Roman"/><w:sz w:val="19"/><w:szCs w:val="19"/></w:rPr><w:t xml:space="preserve">20</w:t></w:r></w:p></w:tc><w:tc><w:tcPr><w:tcW w:w="1100" w:type="dxa"/><w:noWrap/></w:tcPr><w:p><w:pPr><w:jc w:val="center"/></w:pPr><w:r><w:rPr><w:rFonts w:ascii="Times New Roman" w:hAnsi="Times New Roman" w:eastAsia="Times New Roman" w:cs="Times New Roman"/><w:sz w:val="19"/><w:szCs w:val="19"/></w:rPr><w:t xml:space="preserve">Default 0</w:t></w:r></w:p></w:tc></w:tr><w:tr><w:trPr/><w:tc><w:tcPr><w:tcW w:w="500" w:type="dxa"/><w:noWrap/></w:tcPr><w:p><w:pPr><w:jc w:val="center"/></w:pPr><w:r><w:rPr><w:rFonts w:ascii="Times New Roman" w:hAnsi="Times New Roman" w:eastAsia="Times New Roman" w:cs="Times New Roman"/><w:sz w:val="19"/><w:szCs w:val="19"/></w:rPr><w:t xml:space="preserve">4</w:t></w:r></w:p></w:tc><w:tc><w:tcPr><w:tcW w:w="2200" w:type="dxa"/><w:noWrap/></w:tcPr><w:p><w:pPr><w:jc w:val="start"/></w:pPr><w:r><w:rPr><w:rFonts w:ascii="Times New Roman" w:hAnsi="Times New Roman" w:eastAsia="Times New Roman" w:cs="Times New Roman"/><w:sz w:val="19"/><w:szCs w:val="19"/><w:b w:val="1"/><w:bCs w:val="1"/></w:rPr><w:t xml:space="preserve">jenis</w:t></w:r></w:p></w:tc><w:tc><w:tcPr><w:tcW w:w="3000" w:type="dxa"/><w:noWrap/></w:tcPr><w:p><w:pPr><w:jc w:val="start"/></w:pPr><w:r><w:rPr><w:rFonts w:ascii="Times New Roman" w:hAnsi="Times New Roman" w:eastAsia="Times New Roman" w:cs="Times New Roman"/><w:sz w:val="19"/><w:szCs w:val="19"/></w:rPr><w:t xml:space="preserve">Jenis (database/files/full)</w:t></w:r></w:p></w:tc><w:tc><w:tcPr><w:tcW w:w="1300" w:type="dxa"/><w:noWrap/></w:tcPr><w:p><w:pPr><w:jc w:val="center"/></w:pPr><w:r><w:rPr><w:rFonts w:ascii="Times New Roman" w:hAnsi="Times New Roman" w:eastAsia="Times New Roman" w:cs="Times New Roman"/><w:sz w:val="19"/><w:szCs w:val="19"/></w:rPr><w:t xml:space="preserve">ENUM</w:t></w:r></w:p></w:tc><w:tc><w:tcPr><w:tcW w:w="1100" w:type="dxa"/><w:noWrap/></w:tcPr><w:p><w:pPr><w:jc w:val="center"/></w:pPr><w:r><w:rPr><w:rFonts w:ascii="Times New Roman" w:hAnsi="Times New Roman" w:eastAsia="Times New Roman" w:cs="Times New Roman"/><w:sz w:val="19"/><w:szCs w:val="19"/></w:rPr><w:t xml:space="preserve">10</w:t></w:r></w:p></w:tc><w:tc><w:tcPr><w:tcW w:w="1100" w:type="dxa"/><w:noWrap/></w:tcPr><w:p><w:pPr><w:jc w:val="center"/></w:pPr><w:r><w:rPr><w:rFonts w:ascii="Times New Roman" w:hAnsi="Times New Roman" w:eastAsia="Times New Roman" w:cs="Times New Roman"/><w:sz w:val="19"/><w:szCs w:val="19"/></w:rPr><w:t xml:space="preserve">Def 'full'</w:t></w:r></w:p></w:tc></w:tr><w:tr><w:trPr/><w:tc><w:tcPr><w:tcW w:w="500" w:type="dxa"/><w:noWrap/></w:tcPr><w:p><w:pPr><w:jc w:val="center"/></w:pPr><w:r><w:rPr><w:rFonts w:ascii="Times New Roman" w:hAnsi="Times New Roman" w:eastAsia="Times New Roman" w:cs="Times New Roman"/><w:sz w:val="19"/><w:szCs w:val="19"/></w:rPr><w:t xml:space="preserve">5</w:t></w:r></w:p></w:tc><w:tc><w:tcPr><w:tcW w:w="2200" w:type="dxa"/><w:noWrap/></w:tcPr><w:p><w:pPr><w:jc w:val="start"/></w:pPr><w:r><w:rPr><w:rFonts w:ascii="Times New Roman" w:hAnsi="Times New Roman" w:eastAsia="Times New Roman" w:cs="Times New Roman"/><w:sz w:val="19"/><w:szCs w:val="19"/><w:b w:val="1"/><w:bCs w:val="1"/></w:rPr><w:t xml:space="preserve">created_by</w:t></w:r></w:p></w:tc><w:tc><w:tcPr><w:tcW w:w="3000" w:type="dxa"/><w:noWrap/></w:tcPr><w:p><w:pPr><w:jc w:val="start"/></w:pPr><w:r><w:rPr><w:rFonts w:ascii="Times New Roman" w:hAnsi="Times New Roman" w:eastAsia="Times New Roman" w:cs="Times New Roman"/><w:sz w:val="19"/><w:szCs w:val="19"/></w:rPr><w:t xml:space="preserve">Relasi ke Akun Pembuat Backup</w:t></w:r></w:p></w:tc><w:tc><w:tcPr><w:tcW w:w="1300" w:type="dxa"/><w:noWrap/></w:tcPr><w:p><w:pPr><w:jc w:val="center"/></w:pPr><w:r><w:rPr><w:rFonts w:ascii="Times New Roman" w:hAnsi="Times New Roman" w:eastAsia="Times New Roman" w:cs="Times New Roman"/><w:sz w:val="19"/><w:szCs w:val="19"/></w:rPr><w:t xml:space="preserve">INT</w:t></w:r></w:p></w:tc><w:tc><w:tcPr><w:tcW w:w="1100" w:type="dxa"/><w:noWrap/></w:tcPr><w:p><w:pPr><w:jc w:val="center"/></w:pPr><w:r><w:rPr><w:rFonts w:ascii="Times New Roman" w:hAnsi="Times New Roman" w:eastAsia="Times New Roman" w:cs="Times New Roman"/><w:sz w:val="19"/><w:szCs w:val="19"/></w:rPr><w:t xml:space="preserve">11</w:t></w:r></w:p></w:tc><w:tc><w:tcPr><w:tcW w:w="1100" w:type="dxa"/><w:noWrap/></w:tcPr><w:p><w:pPr><w:jc w:val="center"/></w:pPr><w:r><w:rPr><w:rFonts w:ascii="Times New Roman" w:hAnsi="Times New Roman" w:eastAsia="Times New Roman" w:cs="Times New Roman"/><w:sz w:val="19"/><w:szCs w:val="19"/></w:rPr><w:t xml:space="preserve">FK, Nullable</w:t></w:r></w:p></w:tc></w:tr><w:tr><w:trPr/><w:tc><w:tcPr><w:tcW w:w="500" w:type="dxa"/><w:noWrap/></w:tcPr><w:p><w:pPr><w:jc w:val="center"/></w:pPr><w:r><w:rPr><w:rFonts w:ascii="Times New Roman" w:hAnsi="Times New Roman" w:eastAsia="Times New Roman" w:cs="Times New Roman"/><w:sz w:val="19"/><w:szCs w:val="19"/></w:rPr><w:t xml:space="preserve">6</w:t></w:r></w:p></w:tc><w:tc><w:tcPr><w:tcW w:w="2200" w:type="dxa"/><w:noWrap/></w:tcPr><w:p><w:pPr><w:jc w:val="start"/></w:pPr><w:r><w:rPr><w:rFonts w:ascii="Times New Roman" w:hAnsi="Times New Roman" w:eastAsia="Times New Roman" w:cs="Times New Roman"/><w:sz w:val="19"/><w:szCs w:val="19"/><w:b w:val="1"/><w:bCs w:val="1"/></w:rPr><w:t xml:space="preserve">created_at</w:t></w:r></w:p></w:tc><w:tc><w:tcPr><w:tcW w:w="3000" w:type="dxa"/><w:noWrap/></w:tcPr><w:p><w:pPr><w:jc w:val="start"/></w:pPr><w:r><w:rPr><w:rFonts w:ascii="Times New Roman" w:hAnsi="Times New Roman" w:eastAsia="Times New Roman" w:cs="Times New Roman"/><w:sz w:val="19"/><w:szCs w:val="19"/></w:rPr><w:t xml:space="preserve">Waktu Pencadangan</w:t></w:r></w:p></w:tc><w:tc><w:tcPr><w:tcW w:w="1300" w:type="dxa"/><w:noWrap/></w:tcPr><w:p><w:pPr><w:jc w:val="center"/></w:pPr><w:r><w:rPr><w:rFonts w:ascii="Times New Roman" w:hAnsi="Times New Roman" w:eastAsia="Times New Roman" w:cs="Times New Roman"/><w:sz w:val="19"/><w:szCs w:val="19"/></w:rPr><w:t xml:space="preserve">TIMESTAMP</w:t></w:r></w:p></w:tc><w:tc><w:tcPr><w:tcW w:w="1100" w:type="dxa"/><w:noWrap/></w:tcPr><w:p><w:pPr><w:jc w:val="center"/></w:pPr><w:r><w:rPr><w:rFonts w:ascii="Times New Roman" w:hAnsi="Times New Roman" w:eastAsia="Times New Roman" w:cs="Times New Roman"/><w:sz w:val="19"/><w:szCs w:val="19"/></w:rPr><w:t xml:space="preserve">19</w:t></w:r></w:p></w:tc><w:tc><w:tcPr><w:tcW w:w="1100" w:type="dxa"/><w:noWrap/></w:tcPr><w:p><w:pPr><w:jc w:val="center"/></w:pPr><w:r><w:rPr><w:rFonts w:ascii="Times New Roman" w:hAnsi="Times New Roman" w:eastAsia="Times New Roman" w:cs="Times New Roman"/><w:sz w:val="19"/><w:szCs w:val="19"/></w:rPr><w:t xml:space="preserve">Auto Stamp</w:t></w:r></w:p></w:tc></w:tr></w:tbl><w:p/><w:p><w:r><w:br w:type="page"/></w:r></w:p><w:p><w:pPr><w:jc w:val="start"/><w:spacing w:after="60"/></w:pPr><w:r><w:rPr><w:rFonts w:ascii="Times New Roman" w:hAnsi="Times New Roman" w:eastAsia="Times New Roman" w:cs="Times New Roman"/><w:sz w:val="24"/><w:szCs w:val="24"/><w:b w:val="1"/><w:bCs w:val="1"/></w:rPr><w:t xml:space="preserve">14.  Spesifikasi Program.</w:t></w:r></w:p><w:p><w:pPr><w:jc w:val="both"/><w:spacing w:after="80" w:line="276" w:lineRule="auto"/></w:pPr><w:r><w:rPr><w:rFonts w:ascii="Times New Roman" w:hAnsi="Times New Roman" w:eastAsia="Times New Roman" w:cs="Times New Roman"/><w:sz w:val="23"/><w:szCs w:val="23"/></w:rPr><w:t xml:space="preserve">Spesifikasi program memuat rincian logika, masukan, form, lingkungan bahasa, serta urutan prosedur pengolahan dari masing-masing modul aplikasi TRISULA TNI AD berdasarkan standar Naskah Sekolah Gambar - 3.</w:t></w:r></w:p><w:p/><w:tbl><w:tblGrid><w:gridCol w:w="4600" w:type="dxa"/><w:gridCol w:w="4600" w:type="dxa"/></w:tblGrid><w:tblPr><w:tblStyle w:val="BoxTable"/></w:tblPr><w:tr><w:trPr/><w:tc><w:tcPr><w:tcW w:w="4600" w:type="dxa"/><w:noWrap/></w:tcPr><w:p><w:pPr/><w:r><w:rPr><w:rFonts w:ascii="Times New Roman" w:hAnsi="Times New Roman" w:eastAsia="Times New Roman" w:cs="Times New Roman"/><w:sz w:val="19"/><w:szCs w:val="19"/><w:b w:val="1"/><w:bCs w:val="1"/></w:rPr><w:t xml:space="preserve">SISTEM : APLIKASI TRISULA TNI AD</w:t></w:r></w:p></w:tc><w:tc><w:tcPr><w:tcW w:w="4600" w:type="dxa"/><w:noWrap/></w:tcPr><w:p><w:pPr/><w:r><w:rPr><w:rFonts w:ascii="Times New Roman" w:hAnsi="Times New Roman" w:eastAsia="Times New Roman" w:cs="Times New Roman"/><w:sz w:val="19"/><w:szCs w:val="19"/><w:b w:val="1"/><w:bCs w:val="1"/></w:rPr><w:t xml:space="preserve">NAMA PROGRAM : AUTH_LOGIN.PHP</w:t></w:r></w:p><w:p><w:pPr/><w:r><w:rPr><w:rFonts w:ascii="Times New Roman" w:hAnsi="Times New Roman" w:eastAsia="Times New Roman" w:cs="Times New Roman"/><w:sz w:val="19"/><w:szCs w:val="19"/><w:b w:val="1"/><w:bCs w:val="1"/></w:rPr><w:t xml:space="preserve">NAMA FORM    : FO_LOGIN_USER</w:t></w:r></w:p></w:tc></w:tr><w:tr><w:trPr/><w:tc><w:tcPr><w:tcW w:w="4600" w:type="dxa"/><w:noWrap/></w:tcPr><w:p><w:pPr/><w:r><w:rPr><w:rFonts w:ascii="Times New Roman" w:hAnsi="Times New Roman" w:eastAsia="Times New Roman" w:cs="Times New Roman"/><w:sz w:val="19"/><w:szCs w:val="19"/><w:b w:val="1"/><w:bCs w:val="1"/></w:rPr><w:t xml:space="preserve">FUNGSI PROGRAM :</w:t></w:r></w:p><w:p><w:pPr/><w:r><w:rPr><w:rFonts w:ascii="Times New Roman" w:hAnsi="Times New Roman" w:eastAsia="Times New Roman" w:cs="Times New Roman"/><w:sz w:val="19"/><w:szCs w:val="19"/></w:rPr><w:t xml:space="preserve">Autentikasi Hak Akses, Proteksi Serangan Brute Force, & Pengendalian Sesi Sesuai Role Pengguna</w:t></w:r></w:p></w:tc><w:tc><w:tcPr><w:tcW w:w="4600" w:type="dxa"/><w:noWrap/></w:tcPr><w:p><w:pPr/><w:r><w:rPr><w:rFonts w:ascii="Times New Roman" w:hAnsi="Times New Roman" w:eastAsia="Times New Roman" w:cs="Times New Roman"/><w:sz w:val="19"/><w:szCs w:val="19"/><w:b w:val="1"/><w:bCs w:val="1"/></w:rPr><w:t xml:space="preserve">BAHASA     : PHP 8.3 PDO + BCrypt</w:t></w:r></w:p><w:p><w:pPr/><w:r><w:rPr><w:rFonts w:ascii="Times New Roman" w:hAnsi="Times New Roman" w:eastAsia="Times New Roman" w:cs="Times New Roman"/><w:sz w:val="19"/><w:szCs w:val="19"/><w:b w:val="1"/><w:bCs w:val="1"/></w:rPr><w:t xml:space="preserve">DIBUAT OLEH: Letda Czi Fris Wardani</w:t></w:r></w:p></w:tc></w:tr><w:tr><w:trPr/><w:tc><w:tcPr><w:tcW w:w="9200" w:type="dxa"/><w:gridSpan w:val="2"/><w:noWrap/></w:tcPr><w:p><w:pPr><w:spacing w:after="40"/></w:pPr><w:r><w:rPr><w:rFonts w:ascii="Times New Roman" w:hAnsi="Times New Roman" w:eastAsia="Times New Roman" w:cs="Times New Roman"/><w:sz w:val="19"/><w:szCs w:val="19"/><w:b w:val="1"/><w:bCs w:val="1"/></w:rPr><w:t xml:space="preserve">PROSEDUR PENGOLAHAN :</w:t></w:r></w:p><w:p><w:pPr><w:spacing w:after="20"/></w:pPr><w:r><w:rPr><w:rFonts w:ascii="Times New Roman" w:hAnsi="Times New Roman" w:eastAsia="Times New Roman" w:cs="Times New Roman"/><w:sz w:val="19"/><w:szCs w:val="19"/></w:rPr><w:t xml:space="preserve">• Menerima masukan Username (NRP / Admin) dan Kata Sandi via POST Request.</w:t></w:r></w:p><w:p><w:pPr><w:spacing w:after="20"/></w:pPr><w:r><w:rPr><w:rFonts w:ascii="Times New Roman" w:hAnsi="Times New Roman" w:eastAsia="Times New Roman" w:cs="Times New Roman"/><w:sz w:val="19"/><w:szCs w:val="19"/></w:rPr><w:t xml:space="preserve">• Memeriksa token keamanan Cross-Site Request Forgery (CSRF).</w:t></w:r></w:p><w:p><w:pPr><w:spacing w:after="20"/></w:pPr><w:r><w:rPr><w:rFonts w:ascii="Times New Roman" w:hAnsi="Times New Roman" w:eastAsia="Times New Roman" w:cs="Times New Roman"/><w:sz w:val="19"/><w:szCs w:val="19"/></w:rPr><w:t xml:space="preserve">• Memeriksa tabel login_attempts guna mendeteksi serangan brute force (maksimal 5x gagal dalam 15 menit).</w:t></w:r></w:p><w:p><w:pPr><w:spacing w:after="20"/></w:pPr><w:r><w:rPr><w:rFonts w:ascii="Times New Roman" w:hAnsi="Times New Roman" w:eastAsia="Times New Roman" w:cs="Times New Roman"/><w:sz w:val="19"/><w:szCs w:val="19"/></w:rPr><w:t xml:space="preserve">• Melakukan pencocokan akun pada tabel users berdasarkan username yang aktif.</w:t></w:r></w:p><w:p><w:pPr><w:spacing w:after="20"/></w:pPr><w:r><w:rPr><w:rFonts w:ascii="Times New Roman" w:hAnsi="Times New Roman" w:eastAsia="Times New Roman" w:cs="Times New Roman"/><w:sz w:val="19"/><w:szCs w:val="19"/></w:rPr><w:t xml:space="preserve">• Memverifikasi hash kata sandi menggunakan fungsi password_verify() (algoritma bcrypt).</w:t></w:r></w:p><w:p><w:pPr><w:spacing w:after="20"/></w:pPr><w:r><w:rPr><w:rFonts w:ascii="Times New Roman" w:hAnsi="Times New Roman" w:eastAsia="Times New Roman" w:cs="Times New Roman"/><w:sz w:val="19"/><w:szCs w:val="19"/></w:rPr><w:t xml:space="preserve">• Memeriksa status akun; apabila berstatus "pending" atau "rejected", sistem menolak login dan menampilkan pesan edukatif.</w:t></w:r></w:p><w:p><w:pPr><w:spacing w:after="20"/></w:pPr><w:r><w:rPr><w:rFonts w:ascii="Times New Roman" w:hAnsi="Times New Roman" w:eastAsia="Times New Roman" w:cs="Times New Roman"/><w:sz w:val="19"/><w:szCs w:val="19"/></w:rPr><w:t xml:space="preserve">• Jika autentikasi berhasil: regenerasi session_id() baru, menetapkan variabel $_SESSION user, memperbarui last_login, dan mencatat log audit pada activity_log.</w:t></w:r></w:p><w:p><w:pPr><w:spacing w:after="20"/></w:pPr><w:r><w:rPr><w:rFonts w:ascii="Times New Roman" w:hAnsi="Times New Roman" w:eastAsia="Times New Roman" w:cs="Times New Roman"/><w:sz w:val="19"/><w:szCs w:val="19"/></w:rPr><w:t xml:space="preserve">• Mengarahkan (redirect) pengguna sesuai perannya: role admin ke /admin/dashboard.php, role personel ke /personel/dashboard.php.</w:t></w:r></w:p></w:tc></w:tr></w:tbl><w:p/><w:tbl><w:tblGrid><w:gridCol w:w="4600" w:type="dxa"/><w:gridCol w:w="4600" w:type="dxa"/></w:tblGrid><w:tblPr><w:tblStyle w:val="BoxTable"/></w:tblPr><w:tr><w:trPr/><w:tc><w:tcPr><w:tcW w:w="4600" w:type="dxa"/><w:noWrap/></w:tcPr><w:p><w:pPr/><w:r><w:rPr><w:rFonts w:ascii="Times New Roman" w:hAnsi="Times New Roman" w:eastAsia="Times New Roman" w:cs="Times New Roman"/><w:sz w:val="19"/><w:szCs w:val="19"/><w:b w:val="1"/><w:bCs w:val="1"/></w:rPr><w:t xml:space="preserve">SISTEM : APLIKASI TRISULA TNI AD</w:t></w:r></w:p></w:tc><w:tc><w:tcPr><w:tcW w:w="4600" w:type="dxa"/><w:noWrap/></w:tcPr><w:p><w:pPr/><w:r><w:rPr><w:rFonts w:ascii="Times New Roman" w:hAnsi="Times New Roman" w:eastAsia="Times New Roman" w:cs="Times New Roman"/><w:sz w:val="19"/><w:szCs w:val="19"/><w:b w:val="1"/><w:bCs w:val="1"/></w:rPr><w:t xml:space="preserve">NAMA PROGRAM : REGISTER_PROCESS.PHP</w:t></w:r></w:p><w:p><w:pPr/><w:r><w:rPr><w:rFonts w:ascii="Times New Roman" w:hAnsi="Times New Roman" w:eastAsia="Times New Roman" w:cs="Times New Roman"/><w:sz w:val="19"/><w:szCs w:val="19"/><w:b w:val="1"/><w:bCs w:val="1"/></w:rPr><w:t xml:space="preserve">NAMA FORM    : FO_REGISTRASI_PERSONEL</w:t></w:r></w:p></w:tc></w:tr><w:tr><w:trPr/><w:tc><w:tcPr><w:tcW w:w="4600" w:type="dxa"/><w:noWrap/></w:tcPr><w:p><w:pPr/><w:r><w:rPr><w:rFonts w:ascii="Times New Roman" w:hAnsi="Times New Roman" w:eastAsia="Times New Roman" w:cs="Times New Roman"/><w:sz w:val="19"/><w:szCs w:val="19"/><w:b w:val="1"/><w:bCs w:val="1"/></w:rPr><w:t xml:space="preserve">FUNGSI PROGRAM :</w:t></w:r></w:p><w:p><w:pPr/><w:r><w:rPr><w:rFonts w:ascii="Times New Roman" w:hAnsi="Times New Roman" w:eastAsia="Times New Roman" w:cs="Times New Roman"/><w:sz w:val="19"/><w:szCs w:val="19"/></w:rPr><w:t xml:space="preserve">Pendaftaran Mandiri Prajurit, Pembuatan Akun Otomatis Berbasis NRP, & Validasi Integritas Data</w:t></w:r></w:p></w:tc><w:tc><w:tcPr><w:tcW w:w="4600" w:type="dxa"/><w:noWrap/></w:tcPr><w:p><w:pPr/><w:r><w:rPr><w:rFonts w:ascii="Times New Roman" w:hAnsi="Times New Roman" w:eastAsia="Times New Roman" w:cs="Times New Roman"/><w:sz w:val="19"/><w:szCs w:val="19"/><w:b w:val="1"/><w:bCs w:val="1"/></w:rPr><w:t xml:space="preserve">BAHASA     : PHP 8.3 PDO + MySQL Transaction</w:t></w:r></w:p><w:p><w:pPr/><w:r><w:rPr><w:rFonts w:ascii="Times New Roman" w:hAnsi="Times New Roman" w:eastAsia="Times New Roman" w:cs="Times New Roman"/><w:sz w:val="19"/><w:szCs w:val="19"/><w:b w:val="1"/><w:bCs w:val="1"/></w:rPr><w:t xml:space="preserve">DIBUAT OLEH: Letda Czi Fris Wardani</w:t></w:r></w:p></w:tc></w:tr><w:tr><w:trPr/><w:tc><w:tcPr><w:tcW w:w="9200" w:type="dxa"/><w:gridSpan w:val="2"/><w:noWrap/></w:tcPr><w:p><w:pPr><w:spacing w:after="40"/></w:pPr><w:r><w:rPr><w:rFonts w:ascii="Times New Roman" w:hAnsi="Times New Roman" w:eastAsia="Times New Roman" w:cs="Times New Roman"/><w:sz w:val="19"/><w:szCs w:val="19"/><w:b w:val="1"/><w:bCs w:val="1"/></w:rPr><w:t xml:space="preserve">PROSEDUR PENGOLAHAN :</w:t></w:r></w:p><w:p><w:pPr><w:spacing w:after="20"/></w:pPr><w:r><w:rPr><w:rFonts w:ascii="Times New Roman" w:hAnsi="Times New Roman" w:eastAsia="Times New Roman" w:cs="Times New Roman"/><w:sz w:val="19"/><w:szCs w:val="19"/></w:rPr><w:t xml:space="preserve">• Menerima data masukan pendaftaran: NRP, Nama Lengkap, Golongan, Pangkat, Korps, Satuan, Kotama, Jabatan, TMT Jabatan, Tgl Lahir, dan Jenis Kelamin.</w:t></w:r></w:p><w:p><w:pPr><w:spacing w:after="20"/></w:pPr><w:r><w:rPr><w:rFonts w:ascii="Times New Roman" w:hAnsi="Times New Roman" w:eastAsia="Times New Roman" w:cs="Times New Roman"/><w:sz w:val="19"/><w:szCs w:val="19"/></w:rPr><w:t xml:space="preserve">• Validasi format regex NRP: hanya memperbolehkan kombinasi alfanumerik (4-30 karakter).</w:t></w:r></w:p><w:p><w:pPr><w:spacing w:after="20"/></w:pPr><w:r><w:rPr><w:rFonts w:ascii="Times New Roman" w:hAnsi="Times New Roman" w:eastAsia="Times New Roman" w:cs="Times New Roman"/><w:sz w:val="19"/><w:szCs w:val="19"/></w:rPr><w:t xml:space="preserve">• Memeriksa tabel personel dan tabel users untuk memastikan NRP belum pernah terdaftar sebelumnya.</w:t></w:r></w:p><w:p><w:pPr><w:spacing w:after="20"/></w:pPr><w:r><w:rPr><w:rFonts w:ascii="Times New Roman" w:hAnsi="Times New Roman" w:eastAsia="Times New Roman" w:cs="Times New Roman"/><w:sz w:val="19"/><w:szCs w:val="19"/></w:rPr><w:t xml:space="preserve">• Membuka transaksi basis data (PDO beginTransaction).</w:t></w:r></w:p><w:p><w:pPr><w:spacing w:after="20"/></w:pPr><w:r><w:rPr><w:rFonts w:ascii="Times New Roman" w:hAnsi="Times New Roman" w:eastAsia="Times New Roman" w:cs="Times New Roman"/><w:sz w:val="19"/><w:szCs w:val="19"/></w:rPr><w:t xml:space="preserve">• Menyimpan data identitas induk prajurit ke dalam tabel personel.</w:t></w:r></w:p><w:p><w:pPr><w:spacing w:after="20"/></w:pPr><w:r><w:rPr><w:rFonts w:ascii="Times New Roman" w:hAnsi="Times New Roman" w:eastAsia="Times New Roman" w:cs="Times New Roman"/><w:sz w:val="19"/><w:szCs w:val="19"/></w:rPr><w:t xml:space="preserve">• Membuatkan akun login otomatis pada tabel users dengan ketentuan: username = NRP, password = hash(NRP), status = "pending", role = "personel".</w:t></w:r></w:p><w:p><w:pPr><w:spacing w:after="20"/></w:pPr><w:r><w:rPr><w:rFonts w:ascii="Times New Roman" w:hAnsi="Times New Roman" w:eastAsia="Times New Roman" w:cs="Times New Roman"/><w:sz w:val="19"/><w:szCs w:val="19"/></w:rPr><w:t xml:space="preserve">• Commit transaksi basis data, mencatat log pendaftaran pada activity_log, dan menampilkan notifikasi sukses registrasi menunggu approval admin.</w:t></w:r></w:p></w:tc></w:tr></w:tbl><w:p/><w:p><w:r><w:br w:type="page"/></w:r></w:p><w:tbl><w:tblGrid><w:gridCol w:w="4600" w:type="dxa"/><w:gridCol w:w="4600" w:type="dxa"/></w:tblGrid><w:tblPr><w:tblStyle w:val="BoxTable"/></w:tblPr><w:tr><w:trPr/><w:tc><w:tcPr><w:tcW w:w="4600" w:type="dxa"/><w:noWrap/></w:tcPr><w:p><w:pPr/><w:r><w:rPr><w:rFonts w:ascii="Times New Roman" w:hAnsi="Times New Roman" w:eastAsia="Times New Roman" w:cs="Times New Roman"/><w:sz w:val="19"/><w:szCs w:val="19"/><w:b w:val="1"/><w:bCs w:val="1"/></w:rPr><w:t xml:space="preserve">SISTEM : APLIKASI TRISULA TNI AD</w:t></w:r></w:p></w:tc><w:tc><w:tcPr><w:tcW w:w="4600" w:type="dxa"/><w:noWrap/></w:tcPr><w:p><w:pPr/><w:r><w:rPr><w:rFonts w:ascii="Times New Roman" w:hAnsi="Times New Roman" w:eastAsia="Times New Roman" w:cs="Times New Roman"/><w:sz w:val="19"/><w:szCs w:val="19"/><w:b w:val="1"/><w:bCs w:val="1"/></w:rPr><w:t xml:space="preserve">NAMA PROGRAM : DOSIR_UPLOAD.PHP</w:t></w:r></w:p><w:p><w:pPr/><w:r><w:rPr><w:rFonts w:ascii="Times New Roman" w:hAnsi="Times New Roman" w:eastAsia="Times New Roman" w:cs="Times New Roman"/><w:sz w:val="19"/><w:szCs w:val="19"/><w:b w:val="1"/><w:bCs w:val="1"/></w:rPr><w:t xml:space="preserve">NAMA FORM    : FO_UNGGAH_SCAN_DOSIR</w:t></w:r></w:p></w:tc></w:tr><w:tr><w:trPr/><w:tc><w:tcPr><w:tcW w:w="4600" w:type="dxa"/><w:noWrap/></w:tcPr><w:p><w:pPr/><w:r><w:rPr><w:rFonts w:ascii="Times New Roman" w:hAnsi="Times New Roman" w:eastAsia="Times New Roman" w:cs="Times New Roman"/><w:sz w:val="19"/><w:szCs w:val="19"/><w:b w:val="1"/><w:bCs w:val="1"/></w:rPr><w:t xml:space="preserve">FUNGSI PROGRAM :</w:t></w:r></w:p><w:p><w:pPr/><w:r><w:rPr><w:rFonts w:ascii="Times New Roman" w:hAnsi="Times New Roman" w:eastAsia="Times New Roman" w:cs="Times New Roman"/><w:sz w:val="19"/><w:szCs w:val="19"/></w:rPr><w:t xml:space="preserve">Digitalisasi 33 Dosir Baku, Penamaan File Otomatis Indeks Abjad, & Penataan Folder Fisik Terisolasi</w:t></w:r></w:p></w:tc><w:tc><w:tcPr><w:tcW w:w="4600" w:type="dxa"/><w:noWrap/></w:tcPr><w:p><w:pPr/><w:r><w:rPr><w:rFonts w:ascii="Times New Roman" w:hAnsi="Times New Roman" w:eastAsia="Times New Roman" w:cs="Times New Roman"/><w:sz w:val="19"/><w:szCs w:val="19"/><w:b w:val="1"/><w:bCs w:val="1"/></w:rPr><w:t xml:space="preserve">BAHASA     : PHP 8.3 PDO + jsPDF Library</w:t></w:r></w:p><w:p><w:pPr/><w:r><w:rPr><w:rFonts w:ascii="Times New Roman" w:hAnsi="Times New Roman" w:eastAsia="Times New Roman" w:cs="Times New Roman"/><w:sz w:val="19"/><w:szCs w:val="19"/><w:b w:val="1"/><w:bCs w:val="1"/></w:rPr><w:t xml:space="preserve">DIBUAT OLEH: Letda Czi Fris Wardani</w:t></w:r></w:p></w:tc></w:tr><w:tr><w:trPr/><w:tc><w:tcPr><w:tcW w:w="9200" w:type="dxa"/><w:gridSpan w:val="2"/><w:noWrap/></w:tcPr><w:p><w:pPr><w:spacing w:after="40"/></w:pPr><w:r><w:rPr><w:rFonts w:ascii="Times New Roman" w:hAnsi="Times New Roman" w:eastAsia="Times New Roman" w:cs="Times New Roman"/><w:sz w:val="19"/><w:szCs w:val="19"/><w:b w:val="1"/><w:bCs w:val="1"/></w:rPr><w:t xml:space="preserve">PROSEDUR PENGOLAHAN :</w:t></w:r></w:p><w:p><w:pPr><w:spacing w:after="20"/></w:pPr><w:r><w:rPr><w:rFonts w:ascii="Times New Roman" w:hAnsi="Times New Roman" w:eastAsia="Times New Roman" w:cs="Times New Roman"/><w:sz w:val="19"/><w:szCs w:val="19"/></w:rPr><w:t xml:space="preserve">• Personel memilih kode jenis dosir (01 s.d. 33) yang akan diunggah.</w:t></w:r></w:p><w:p><w:pPr><w:spacing w:after="20"/></w:pPr><w:r><w:rPr><w:rFonts w:ascii="Times New Roman" w:hAnsi="Times New Roman" w:eastAsia="Times New Roman" w:cs="Times New Roman"/><w:sz w:val="19"/><w:szCs w:val="19"/></w:rPr><w:t xml:space="preserve">• Menerima masukan berkas PDF baik melalui pengunggahan file konvensional maupun konversi hasil scan kamera (jsPDF client-side).</w:t></w:r></w:p><w:p><w:pPr><w:spacing w:after="20"/></w:pPr><w:r><w:rPr><w:rFonts w:ascii="Times New Roman" w:hAnsi="Times New Roman" w:eastAsia="Times New Roman" w:cs="Times New Roman"/><w:sz w:val="19"/><w:szCs w:val="19"/></w:rPr><w:t xml:space="preserve">• Validasi file: ekstensi wajib .pdf, validasi tipe MIME via finfo_file(), dan batas ukuran maks 10 MB.</w:t></w:r></w:p><w:p><w:pPr><w:spacing w:after="20"/></w:pPr><w:r><w:rPr><w:rFonts w:ascii="Times New Roman" w:hAnsi="Times New Roman" w:eastAsia="Times New Roman" w:cs="Times New Roman"/><w:sz w:val="19"/><w:szCs w:val="19"/></w:rPr><w:t xml:space="preserve">• Memeriksa apakah berkas pada slot dosir tersebut sudah ada pada tabel dosir_files.</w:t></w:r></w:p><w:p><w:pPr><w:spacing w:after="20"/></w:pPr><w:r><w:rPr><w:rFonts w:ascii="Times New Roman" w:hAnsi="Times New Roman" w:eastAsia="Times New Roman" w:cs="Times New Roman"/><w:sz w:val="19"/><w:szCs w:val="19"/></w:rPr><w:t xml:space="preserve">• Jika berkas pertama: abjad bernilai NULL, nama file = "{NRP}_{KODE}.pdf".</w:t></w:r></w:p><w:p><w:pPr><w:spacing w:after="20"/></w:pPr><w:r><w:rPr><w:rFonts w:ascii="Times New Roman" w:hAnsi="Times New Roman" w:eastAsia="Times New Roman" w:cs="Times New Roman"/><w:sz w:val="19"/><w:szCs w:val="19"/></w:rPr><w:t xml:space="preserve">• Jika berkas kedua dst: sistem menghitung urutan abjad otomatis ('a', 'b', 'c', ...) dan membentuk nama file "{NRP}_{KODE}{abjad}.pdf".</w:t></w:r></w:p><w:p><w:pPr><w:spacing w:after="20"/></w:pPr><w:r><w:rPr><w:rFonts w:ascii="Times New Roman" w:hAnsi="Times New Roman" w:eastAsia="Times New Roman" w:cs="Times New Roman"/><w:sz w:val="19"/><w:szCs w:val="19"/></w:rPr><w:t xml:space="preserve">• Memastikan direktori tujuan uploads/FOLDER {kode}/ telah tercipta (jika belum, dibuat otomatis dengan izin 0755).</w:t></w:r></w:p><w:p><w:pPr><w:spacing w:after="20"/></w:pPr><w:r><w:rPr><w:rFonts w:ascii="Times New Roman" w:hAnsi="Times New Roman" w:eastAsia="Times New Roman" w:cs="Times New Roman"/><w:sz w:val="19"/><w:szCs w:val="19"/></w:rPr><w:t xml:space="preserve">• Memindahkan berkas fisik ke direktori tujuan dan menyimpan berkas master bersih ke raw_file_path.</w:t></w:r></w:p><w:p><w:pPr><w:spacing w:after="20"/></w:pPr><w:r><w:rPr><w:rFonts w:ascii="Times New Roman" w:hAnsi="Times New Roman" w:eastAsia="Times New Roman" w:cs="Times New Roman"/><w:sz w:val="19"/><w:szCs w:val="19"/></w:rPr><w:t xml:space="preserve">• Membubuhkan tanda air sementara (Pending Approval) dan mencatat metadata pada tabel dosir_files dengan status "pending".</w:t></w:r></w:p></w:tc></w:tr></w:tbl><w:p/><w:tbl><w:tblGrid><w:gridCol w:w="4600" w:type="dxa"/><w:gridCol w:w="4600" w:type="dxa"/></w:tblGrid><w:tblPr><w:tblStyle w:val="BoxTable"/></w:tblPr><w:tr><w:trPr/><w:tc><w:tcPr><w:tcW w:w="4600" w:type="dxa"/><w:noWrap/></w:tcPr><w:p><w:pPr/><w:r><w:rPr><w:rFonts w:ascii="Times New Roman" w:hAnsi="Times New Roman" w:eastAsia="Times New Roman" w:cs="Times New Roman"/><w:sz w:val="19"/><w:szCs w:val="19"/><w:b w:val="1"/><w:bCs w:val="1"/></w:rPr><w:t xml:space="preserve">SISTEM : APLIKASI TRISULA TNI AD</w:t></w:r></w:p></w:tc><w:tc><w:tcPr><w:tcW w:w="4600" w:type="dxa"/><w:noWrap/></w:tcPr><w:p><w:pPr/><w:r><w:rPr><w:rFonts w:ascii="Times New Roman" w:hAnsi="Times New Roman" w:eastAsia="Times New Roman" w:cs="Times New Roman"/><w:sz w:val="19"/><w:szCs w:val="19"/><w:b w:val="1"/><w:bCs w:val="1"/></w:rPr><w:t xml:space="preserve">NAMA PROGRAM : DOSIR_VERIFY_PROCESS.PHP</w:t></w:r></w:p><w:p><w:pPr/><w:r><w:rPr><w:rFonts w:ascii="Times New Roman" w:hAnsi="Times New Roman" w:eastAsia="Times New Roman" w:cs="Times New Roman"/><w:sz w:val="19"/><w:szCs w:val="19"/><w:b w:val="1"/><w:bCs w:val="1"/></w:rPr><w:t xml:space="preserve">NAMA FORM    : FO_VERIFIKASI_TTE_DOSIR</w:t></w:r></w:p></w:tc></w:tr><w:tr><w:trPr/><w:tc><w:tcPr><w:tcW w:w="4600" w:type="dxa"/><w:noWrap/></w:tcPr><w:p><w:pPr/><w:r><w:rPr><w:rFonts w:ascii="Times New Roman" w:hAnsi="Times New Roman" w:eastAsia="Times New Roman" w:cs="Times New Roman"/><w:sz w:val="19"/><w:szCs w:val="19"/><w:b w:val="1"/><w:bCs w:val="1"/></w:rPr><w:t xml:space="preserve">FUNGSI PROGRAM :</w:t></w:r></w:p><w:p><w:pPr/><w:r><w:rPr><w:rFonts w:ascii="Times New Roman" w:hAnsi="Times New Roman" w:eastAsia="Times New Roman" w:cs="Times New Roman"/><w:sz w:val="19"/><w:szCs w:val="19"/></w:rPr><w:t xml:space="preserve">Verifikasi Berkas, Perhitungan Checksum SHA-256, & Penerbitan Sertifikasi TTE Resmi Ber-QR Code</w:t></w:r></w:p></w:tc><w:tc><w:tcPr><w:tcW w:w="4600" w:type="dxa"/><w:noWrap/></w:tcPr><w:p><w:pPr/><w:r><w:rPr><w:rFonts w:ascii="Times New Roman" w:hAnsi="Times New Roman" w:eastAsia="Times New Roman" w:cs="Times New Roman"/><w:sz w:val="19"/><w:szCs w:val="19"/><w:b w:val="1"/><w:bCs w:val="1"/></w:rPr><w:t xml:space="preserve">BAHASA     : PHP 8.3 PDO + FPDI + TCPDF</w:t></w:r></w:p><w:p><w:pPr/><w:r><w:rPr><w:rFonts w:ascii="Times New Roman" w:hAnsi="Times New Roman" w:eastAsia="Times New Roman" w:cs="Times New Roman"/><w:sz w:val="19"/><w:szCs w:val="19"/><w:b w:val="1"/><w:bCs w:val="1"/></w:rPr><w:t xml:space="preserve">DIBUAT OLEH: Letda Czi Fris Wardani</w:t></w:r></w:p></w:tc></w:tr><w:tr><w:trPr/><w:tc><w:tcPr><w:tcW w:w="9200" w:type="dxa"/><w:gridSpan w:val="2"/><w:noWrap/></w:tcPr><w:p><w:pPr><w:spacing w:after="40"/></w:pPr><w:r><w:rPr><w:rFonts w:ascii="Times New Roman" w:hAnsi="Times New Roman" w:eastAsia="Times New Roman" w:cs="Times New Roman"/><w:sz w:val="19"/><w:szCs w:val="19"/><w:b w:val="1"/><w:bCs w:val="1"/></w:rPr><w:t xml:space="preserve">PROSEDUR PENGOLAHAN :</w:t></w:r></w:p><w:p><w:pPr><w:spacing w:after="20"/></w:pPr><w:r><w:rPr><w:rFonts w:ascii="Times New Roman" w:hAnsi="Times New Roman" w:eastAsia="Times New Roman" w:cs="Times New Roman"/><w:sz w:val="19"/><w:szCs w:val="19"/></w:rPr><w:t xml:space="preserve">• Administrator membuka antrean berkas dosir pending pada halaman dosir_verify.php.</w:t></w:r></w:p><w:p><w:pPr><w:spacing w:after="20"/></w:pPr><w:r><w:rPr><w:rFonts w:ascii="Times New Roman" w:hAnsi="Times New Roman" w:eastAsia="Times New Roman" w:cs="Times New Roman"/><w:sz w:val="19"/><w:szCs w:val="19"/></w:rPr><w:t xml:space="preserve">• Admin meninjau kelayakan dan keaslian fisik warkat digital melalui pratinjau dokumen terintegrasi.</w:t></w:r></w:p><w:p><w:pPr><w:spacing w:after="20"/></w:pPr><w:r><w:rPr><w:rFonts w:ascii="Times New Roman" w:hAnsi="Times New Roman" w:eastAsia="Times New Roman" w:cs="Times New Roman"/><w:sz w:val="19"/><w:szCs w:val="19"/></w:rPr><w:t xml:space="preserve">• Jika Admin memilih opsi REJECT: status berkas diubah menjadi "rejected", catatan evaluasi verifikasi disimpan, dan personel diberikan akses unggah ulang berkas perbaikan.</w:t></w:r></w:p><w:p><w:pPr><w:spacing w:after="20"/></w:pPr><w:r><w:rPr><w:rFonts w:ascii="Times New Roman" w:hAnsi="Times New Roman" w:eastAsia="Times New Roman" w:cs="Times New Roman"/><w:sz w:val="19"/><w:szCs w:val="19"/></w:rPr><w:t xml:space="preserve">• Jika Admin memilih opsi APPROVE: sistem memproses sertifikasi digital resmi :</w:t></w:r></w:p><w:p><w:pPr><w:spacing w:after="20"/></w:pPr><w:r><w:rPr><w:rFonts w:ascii="Times New Roman" w:hAnsi="Times New Roman" w:eastAsia="Times New Roman" w:cs="Times New Roman"/><w:sz w:val="19"/><w:szCs w:val="19"/></w:rPr><w:t xml:space="preserve">•    a) Mengambil berkas master asli bersih dari kolom raw_file_path (menghilangkan watermark pending secara permanen).</w:t></w:r></w:p><w:p><w:pPr><w:spacing w:after="20"/></w:pPr><w:r><w:rPr><w:rFonts w:ascii="Times New Roman" w:hAnsi="Times New Roman" w:eastAsia="Times New Roman" w:cs="Times New Roman"/><w:sz w:val="19"/><w:szCs w:val="19"/></w:rPr><w:t xml:space="preserve">•    b) Menghitung nilai cryptographic checksum SHA-256 berkas master sebagai segel integritas anti-pemalsuan.</w:t></w:r></w:p><w:p><w:pPr><w:spacing w:after="20"/></w:pPr><w:r><w:rPr><w:rFonts w:ascii="Times New Roman" w:hAnsi="Times New Roman" w:eastAsia="Times New Roman" w:cs="Times New Roman"/><w:sz w:val="19"/><w:szCs w:val="19"/></w:rPr><w:t xml:space="preserve">•    c) Meng-generate kode unik TTE resmi: "TTE-TRISULA-{YYYYMM}-{ID}-{TOKEN6}".</w:t></w:r></w:p><w:p><w:pPr><w:spacing w:after="20"/></w:pPr><w:r><w:rPr><w:rFonts w:ascii="Times New Roman" w:hAnsi="Times New Roman" w:eastAsia="Times New Roman" w:cs="Times New Roman"/><w:sz w:val="19"/><w:szCs w:val="19"/></w:rPr><w:t xml:space="preserve">•    d) Membentuk URL verifikasi publik ber-QR Code: "https://domain/verify.php?code=...".</w:t></w:r></w:p><w:p><w:pPr><w:spacing w:after="20"/></w:pPr><w:r><w:rPr><w:rFonts w:ascii="Times New Roman" w:hAnsi="Times New Roman" w:eastAsia="Times New Roman" w:cs="Times New Roman"/><w:sz w:val="19"/><w:szCs w:val="19"/></w:rPr><w:t xml:space="preserve">•    e) Mengambil data profil pejabat penandatangan (Nama Admin, Pangkat, NRP, Satuan).</w:t></w:r></w:p><w:p><w:pPr><w:spacing w:after="20"/></w:pPr><w:r><w:rPr><w:rFonts w:ascii="Times New Roman" w:hAnsi="Times New Roman" w:eastAsia="Times New Roman" w:cs="Times New Roman"/><w:sz w:val="19"/><w:szCs w:val="19"/></w:rPr><w:t xml:space="preserve">•    f) Membuka berkas menggunakan pustaka FPDI + TCPDF; menyematkan Running Line Autentikasi pada seluruh halaman dan membubuhkan Kotak Stempel TTE Resmi ber-QR Code pada sudut kanan bawah halaman terakhir.</w:t></w:r></w:p><w:p><w:pPr><w:spacing w:after="20"/></w:pPr><w:r><w:rPr><w:rFonts w:ascii="Times New Roman" w:hAnsi="Times New Roman" w:eastAsia="Times New Roman" w:cs="Times New Roman"/><w:sz w:val="19"/><w:szCs w:val="19"/></w:rPr><w:t xml:space="preserve">•    g) Menyimpan berkas hasil TTE, memperbarui status dosir_files menjadi "approved", mengisi signature_code dan signature_hash, serta mencatat log audit pada activity_log.</w:t></w:r></w:p></w:tc></w:tr></w:tbl><w:p/><w:p><w:r><w:br w:type="page"/></w:r></w:p><w:p><w:pPr><w:jc w:val="start"/><w:spacing w:after="60"/></w:pPr><w:r><w:rPr><w:rFonts w:ascii="Times New Roman" w:hAnsi="Times New Roman" w:eastAsia="Times New Roman" w:cs="Times New Roman"/><w:sz w:val="24"/><w:szCs w:val="24"/><w:b w:val="1"/><w:bCs w:val="1"/></w:rPr><w:t xml:space="preserve">15.  Bentuk Tampilan Dan Cetakan.</w:t></w:r></w:p><w:p><w:pPr><w:jc w:val="both"/><w:spacing w:after="80" w:line="276" w:lineRule="auto"/></w:pPr><w:r><w:rPr><w:rFonts w:ascii="Times New Roman" w:hAnsi="Times New Roman" w:eastAsia="Times New Roman" w:cs="Times New Roman"/><w:sz w:val="23"/><w:szCs w:val="23"/></w:rPr><w:t xml:space="preserve">Bentuk tampilan dan cetakan memuat rancangan antarmuka visual pada layar monitor (display) serta tata letak dokumen keluaran siap cetak melalui printer berformat kedinasan TNI Angkatan Darat.</w:t></w:r></w:p><w:p/><w:p><w:pPr><w:jc w:val="start"/><w:spacing w:after="60"/></w:pPr><w:r><w:rPr><w:rFonts w:ascii="Times New Roman" w:hAnsi="Times New Roman" w:eastAsia="Times New Roman" w:cs="Times New Roman"/><w:sz w:val="24"/><w:szCs w:val="24"/><w:b w:val="1"/><w:bCs w:val="1"/></w:rPr><w:t xml:space="preserve">a.   Bentuk Tampilan Layar (Display Interfaces).</w:t></w:r></w:p><w:p><w:pPr><w:jc w:val="start"/><w:spacing w:after="60"/></w:pPr><w:r><w:rPr><w:rFonts w:ascii="Times New Roman" w:hAnsi="Times New Roman" w:eastAsia="Times New Roman" w:cs="Times New Roman"/><w:sz w:val="23"/><w:szCs w:val="23"/><w:b w:val="1"/><w:bCs w:val="1"/></w:rPr><w:t xml:space="preserve">1)   Bentuk Tampilan Antarmuka Halaman Masuk (Login Display) :</w:t></w:r></w:p><w:tbl><w:tblGrid><w:gridCol w:w="9200" w:type="dxa"/></w:tblGrid><w:tblPr><w:tblStyle w:val="BoxTable"/></w:tblPr><w:tr><w:trPr/><w:tc><w:tcPr><w:tcW w:w="9200" w:type="dxa"/><w:shd w:val="clear" w:fill="F2F6F2"/><w:noWrap/></w:tcPr><w:p><w:pPr><w:jc w:val="center"/><w:spacing w:after="60"/></w:pPr><w:r><w:rPr><w:rFonts w:ascii="Consolas" w:hAnsi="Consolas" w:eastAsia="Consolas" w:cs="Consolas"/><w:sz w:val="17"/><w:szCs w:val="17"/></w:rPr><w:t xml:space="preserve">┌────────────────────────────────────────────────────────────────────────┐</w:t></w:r></w:p><w:p><w:pPr><w:jc w:val="center"/><w:spacing w:after="60"/></w:pPr><w:r><w:rPr><w:rFonts w:ascii="Consolas" w:hAnsi="Consolas" w:eastAsia="Consolas" w:cs="Consolas"/><w:sz w:val="17"/><w:szCs w:val="17"/></w:rPr><w:t xml:space="preserve">│                               ★ ★ ★                                    │</w:t></w:r></w:p><w:p><w:pPr><w:jc w:val="center"/><w:spacing w:after="60"/></w:pPr><w:r><w:rPr><w:rFonts w:ascii="Consolas" w:hAnsi="Consolas" w:eastAsia="Consolas" w:cs="Consolas"/><w:sz w:val="17"/><w:szCs w:val="17"/></w:rPr><w:t xml:space="preserve">│                           TRISULA TNI AD                               │</w:t></w:r></w:p><w:p><w:pPr><w:jc w:val="center"/><w:spacing w:after="60"/></w:pPr><w:r><w:rPr><w:rFonts w:ascii="Consolas" w:hAnsi="Consolas" w:eastAsia="Consolas" w:cs="Consolas"/><w:sz w:val="17"/><w:szCs w:val="17"/></w:rPr><w:t xml:space="preserve">│     Tata Kelola Rekam Informasi, Sistematika, & Unduhan Lengkap Arsip  │</w:t></w:r></w:p><w:p><w:pPr><w:jc w:val="center"/><w:spacing w:after="60"/></w:pPr><w:r><w:rPr><w:rFonts w:ascii="Consolas" w:hAnsi="Consolas" w:eastAsia="Consolas" w:cs="Consolas"/><w:sz w:val="17"/><w:szCs w:val="17"/></w:rPr><w:t xml:space="preserve">├────────────────────────────────────────────────────────────────────────┤</w:t></w:r></w:p><w:p><w:pPr><w:jc w:val="center"/><w:spacing w:after="60"/></w:pPr><w:r><w:rPr><w:rFonts w:ascii="Consolas" w:hAnsi="Consolas" w:eastAsia="Consolas" w:cs="Consolas"/><w:sz w:val="17"/><w:szCs w:val="17"/></w:rPr><w:t xml:space="preserve">│  Username / NRP   : [                                                ] │</w:t></w:r></w:p><w:p><w:pPr><w:jc w:val="center"/><w:spacing w:after="60"/></w:pPr><w:r><w:rPr><w:rFonts w:ascii="Consolas" w:hAnsi="Consolas" w:eastAsia="Consolas" w:cs="Consolas"/><w:sz w:val="17"/><w:szCs w:val="17"/></w:rPr><w:t xml:space="preserve">│  Kata Sandi       : [                                                ] │</w:t></w:r></w:p><w:p><w:pPr><w:jc w:val="center"/><w:spacing w:after="60"/></w:pPr><w:r><w:rPr><w:rFonts w:ascii="Consolas" w:hAnsi="Consolas" w:eastAsia="Consolas" w:cs="Consolas"/><w:sz w:val="17"/><w:szCs w:val="17"/></w:rPr><w:t xml:space="preserve">│                     [          TOMBOL MASUK SISTEM         ]           │</w:t></w:r></w:p><w:p><w:pPr><w:jc w:val="center"/><w:spacing w:after="60"/></w:pPr><w:r><w:rPr><w:rFonts w:ascii="Consolas" w:hAnsi="Consolas" w:eastAsia="Consolas" w:cs="Consolas"/><w:sz w:val="17"/><w:szCs w:val="17"/></w:rPr><w:t xml:space="preserve">│                                                                        │</w:t></w:r></w:p><w:p><w:pPr><w:jc w:val="center"/><w:spacing w:after="60"/></w:pPr><w:r><w:rPr><w:rFonts w:ascii="Consolas" w:hAnsi="Consolas" w:eastAsia="Consolas" w:cs="Consolas"/><w:sz w:val="17"/><w:szCs w:val="17"/></w:rPr><w:t xml:space="preserve">│  Belum memiliki akun? Registrasi Personel Baru                         │</w:t></w:r></w:p><w:p><w:pPr><w:jc w:val="center"/><w:spacing w:after="60"/></w:pPr><w:r><w:rPr><w:rFonts w:ascii="Consolas" w:hAnsi="Consolas" w:eastAsia="Consolas" w:cs="Consolas"/><w:sz w:val="17"/><w:szCs w:val="17"/></w:rPr><w:t xml:space="preserve">└────────────────────────────────────────────────────────────────────────┘</w:t></w:r></w:p></w:tc></w:tr></w:tbl><w:p/><w:p><w:pPr><w:jc w:val="start"/><w:spacing w:after="60"/></w:pPr><w:r><w:rPr><w:rFonts w:ascii="Times New Roman" w:hAnsi="Times New Roman" w:eastAsia="Times New Roman" w:cs="Times New Roman"/><w:sz w:val="23"/><w:szCs w:val="23"/><w:b w:val="1"/><w:bCs w:val="1"/></w:rPr><w:t xml:space="preserve">2)   Bentuk Tampilan Dashboard Monitoring 33 Dosir Personel :</w:t></w:r></w:p><w:tbl><w:tblGrid><w:gridCol w:w="9200" w:type="dxa"/></w:tblGrid><w:tblPr><w:tblStyle w:val="BoxTable"/></w:tblPr><w:tr><w:trPr/><w:tc><w:tcPr><w:tcW w:w="9200" w:type="dxa"/><w:shd w:val="clear" w:fill="F2F6F2"/><w:noWrap/></w:tcPr><w:p><w:pPr><w:jc w:val="center"/><w:spacing w:after="60"/></w:pPr><w:r><w:rPr><w:rFonts w:ascii="Consolas" w:hAnsi="Consolas" w:eastAsia="Consolas" w:cs="Consolas"/><w:sz w:val="17"/><w:szCs w:val="17"/></w:rPr><w:t xml:space="preserve">┌────────────────────────────────────────────────────────────────────────┐</w:t></w:r></w:p><w:p><w:pPr><w:jc w:val="center"/><w:spacing w:after="60"/></w:pPr><w:r><w:rPr><w:rFonts w:ascii="Consolas" w:hAnsi="Consolas" w:eastAsia="Consolas" w:cs="Consolas"/><w:sz w:val="17"/><w:szCs w:val="17"/></w:rPr><w:t xml:space="preserve">│ TRISULA TNI AD │ Dashboard | Unggah Dosir | Scan Kamera | Profil Saya   │</w:t></w:r></w:p><w:p><w:pPr><w:jc w:val="center"/><w:spacing w:after="60"/></w:pPr><w:r><w:rPr><w:rFonts w:ascii="Consolas" w:hAnsi="Consolas" w:eastAsia="Consolas" w:cs="Consolas"/><w:sz w:val="17"/><w:szCs w:val="17"/></w:rPr><w:t xml:space="preserve">├────────────────────────────────────────────────────────────────────────┤</w:t></w:r></w:p><w:p><w:pPr><w:jc w:val="center"/><w:spacing w:after="60"/></w:pPr><w:r><w:rPr><w:rFonts w:ascii="Consolas" w:hAnsi="Consolas" w:eastAsia="Consolas" w:cs="Consolas"/><w:sz w:val="17"/><w:szCs w:val="17"/></w:rPr><w:t xml:space="preserve">│ PROFIL PRAJURIT: Letda Czi Fris Wardani | NRP 2118... | Denzibang...   │</w:t></w:r></w:p><w:p><w:pPr><w:jc w:val="center"/><w:spacing w:after="60"/></w:pPr><w:r><w:rPr><w:rFonts w:ascii="Consolas" w:hAnsi="Consolas" w:eastAsia="Consolas" w:cs="Consolas"/><w:sz w:val="17"/><w:szCs w:val="17"/></w:rPr><w:t xml:space="preserve">│ STATUS KELENGKAPAN DOSIR : [██████████████████░░░░░░░░░░] 64% (21/33)  │</w:t></w:r></w:p><w:p><w:pPr><w:jc w:val="center"/><w:spacing w:after="60"/></w:pPr><w:r><w:rPr><w:rFonts w:ascii="Consolas" w:hAnsi="Consolas" w:eastAsia="Consolas" w:cs="Consolas"/><w:sz w:val="17"/><w:szCs w:val="17"/></w:rPr><w:t xml:space="preserve">├──────┬───────────────────────────────┬──────────────┬──────────────────┤</w:t></w:r></w:p><w:p><w:pPr><w:jc w:val="center"/><w:spacing w:after="60"/></w:pPr><w:r><w:rPr><w:rFonts w:ascii="Consolas" w:hAnsi="Consolas" w:eastAsia="Consolas" w:cs="Consolas"/><w:sz w:val="17"/><w:szCs w:val="17"/></w:rPr><w:t xml:space="preserve">│ KODE │ NAMA JENIS DOSIR (33 BAKU)    │ STATUS       │ AKSI DOKUMEN     │</w:t></w:r></w:p><w:p><w:pPr><w:jc w:val="center"/><w:spacing w:after="60"/></w:pPr><w:r><w:rPr><w:rFonts w:ascii="Consolas" w:hAnsi="Consolas" w:eastAsia="Consolas" w:cs="Consolas"/><w:sz w:val="17"/><w:szCs w:val="17"/></w:rPr><w:t xml:space="preserve">├──────┼───────────────────────────────┼──────────────┼──────────────────┤</w:t></w:r></w:p><w:p><w:pPr><w:jc w:val="center"/><w:spacing w:after="60"/></w:pPr><w:r><w:rPr><w:rFonts w:ascii="Consolas" w:hAnsi="Consolas" w:eastAsia="Consolas" w:cs="Consolas"/><w:sz w:val="17"/><w:szCs w:val="17"/></w:rPr><w:t xml:space="preserve">│  01  │ SURAT LAMARAN                 │ APPROVED     │ [Lihat PDF TTE]  │</w:t></w:r></w:p><w:p><w:pPr><w:jc w:val="center"/><w:spacing w:after="60"/></w:pPr><w:r><w:rPr><w:rFonts w:ascii="Consolas" w:hAnsi="Consolas" w:eastAsia="Consolas" w:cs="Consolas"/><w:sz w:val="17"/><w:szCs w:val="17"/></w:rPr><w:t xml:space="preserve">│  02  │ AKTA KELAHIRAN YBS            │ APPROVED     │ [Lihat PDF TTE]  │</w:t></w:r></w:p><w:p><w:pPr><w:jc w:val="center"/><w:spacing w:after="60"/></w:pPr><w:r><w:rPr><w:rFonts w:ascii="Consolas" w:hAnsi="Consolas" w:eastAsia="Consolas" w:cs="Consolas"/><w:sz w:val="17"/><w:szCs w:val="17"/></w:rPr><w:t xml:space="preserve">│  05  │ IJAZAH STTB (DIKUM)           │ PENDING      │ [Menunggu Admin] │</w:t></w:r></w:p><w:p><w:pPr><w:jc w:val="center"/><w:spacing w:after="60"/></w:pPr><w:r><w:rPr><w:rFonts w:ascii="Consolas" w:hAnsi="Consolas" w:eastAsia="Consolas" w:cs="Consolas"/><w:sz w:val="17"/><w:szCs w:val="17"/></w:rPr><w:t xml:space="preserve">│  16  │ IJAZAH DIKMIL (DIKPAPROG)     │ KOSONG       │ [Unggah / Scan]  │</w:t></w:r></w:p><w:p><w:pPr><w:jc w:val="center"/><w:spacing w:after="60"/></w:pPr><w:r><w:rPr><w:rFonts w:ascii="Consolas" w:hAnsi="Consolas" w:eastAsia="Consolas" w:cs="Consolas"/><w:sz w:val="17"/><w:szCs w:val="17"/></w:rPr><w:t xml:space="preserve">└──────┴───────────────────────────────┴──────────────┴──────────────────┘</w:t></w:r></w:p></w:tc></w:tr></w:tbl><w:p/><w:p><w:pPr><w:jc w:val="start"/><w:spacing w:after="60"/></w:pPr><w:r><w:rPr><w:rFonts w:ascii="Times New Roman" w:hAnsi="Times New Roman" w:eastAsia="Times New Roman" w:cs="Times New Roman"/><w:sz w:val="23"/><w:szCs w:val="23"/><w:b w:val="1"/><w:bCs w:val="1"/></w:rPr><w:t xml:space="preserve">3)   Bentuk Tampilan Verifikasi Keabsahan TTE Publik (verify.php) :</w:t></w:r></w:p><w:tbl><w:tblGrid><w:gridCol w:w="9200" w:type="dxa"/></w:tblGrid><w:tblPr><w:tblStyle w:val="BoxTable"/></w:tblPr><w:tr><w:trPr/><w:tc><w:tcPr><w:tcW w:w="9200" w:type="dxa"/><w:shd w:val="clear" w:fill="F2F6F2"/><w:noWrap/></w:tcPr><w:p><w:pPr><w:jc w:val="center"/><w:spacing w:after="60"/></w:pPr><w:r><w:rPr><w:rFonts w:ascii="Consolas" w:hAnsi="Consolas" w:eastAsia="Consolas" w:cs="Consolas"/><w:sz w:val="17"/><w:szCs w:val="17"/></w:rPr><w:t xml:space="preserve">┌────────────────────────────────────────────────────────────────────────┐</w:t></w:r></w:p><w:p><w:pPr><w:jc w:val="center"/><w:spacing w:after="60"/></w:pPr><w:r><w:rPr><w:rFonts w:ascii="Consolas" w:hAnsi="Consolas" w:eastAsia="Consolas" w:cs="Consolas"/><w:sz w:val="17"/><w:szCs w:val="17"/></w:rPr><w:t xml:space="preserve">│              ✓ DOKUMEN SAH & TERVERIFIKASI SECARA ELEKTRONIK           │</w:t></w:r></w:p><w:p><w:pPr><w:jc w:val="center"/><w:spacing w:after="60"/></w:pPr><w:r><w:rPr><w:rFonts w:ascii="Consolas" w:hAnsi="Consolas" w:eastAsia="Consolas" w:cs="Consolas"/><w:sz w:val="17"/><w:szCs w:val="17"/></w:rPr><w:t xml:space="preserve">│                  KODE REGISTRASI: TTE-TRISULA-202609-12-8A9F           │</w:t></w:r></w:p><w:p><w:pPr><w:jc w:val="center"/><w:spacing w:after="60"/></w:pPr><w:r><w:rPr><w:rFonts w:ascii="Consolas" w:hAnsi="Consolas" w:eastAsia="Consolas" w:cs="Consolas"/><w:sz w:val="17"/><w:szCs w:val="17"/></w:rPr><w:t xml:space="preserve">├────────────────────────────────────────────────────────────────────────┤</w:t></w:r></w:p><w:p><w:pPr><w:jc w:val="center"/><w:spacing w:after="60"/></w:pPr><w:r><w:rPr><w:rFonts w:ascii="Consolas" w:hAnsi="Consolas" w:eastAsia="Consolas" w:cs="Consolas"/><w:sz w:val="17"/><w:szCs w:val="17"/></w:rPr><w:t xml:space="preserve">│ Jenis Dosir    : DOSIR 16 — IJAZAH DIKMIL / SAR / TUK / CAB            │</w:t></w:r></w:p><w:p><w:pPr><w:jc w:val="center"/><w:spacing w:after="60"/></w:pPr><w:r><w:rPr><w:rFonts w:ascii="Consolas" w:hAnsi="Consolas" w:eastAsia="Consolas" w:cs="Consolas"/><w:sz w:val="17"/><w:szCs w:val="17"/></w:rPr><w:t xml:space="preserve">│ Nama Personel  : Letda Czi Fris Wardani (NRP 2118...)                  │</w:t></w:r></w:p><w:p><w:pPr><w:jc w:val="center"/><w:spacing w:after="60"/></w:pPr><w:r><w:rPr><w:rFonts w:ascii="Consolas" w:hAnsi="Consolas" w:eastAsia="Consolas" w:cs="Consolas"/><w:sz w:val="17"/><w:szCs w:val="17"/></w:rPr><w:t xml:space="preserve">│ Pangkat/Satuan : Letda Czi / Denzibang 3/I Jaya                        │</w:t></w:r></w:p><w:p><w:pPr><w:jc w:val="center"/><w:spacing w:after="60"/></w:pPr><w:r><w:rPr><w:rFonts w:ascii="Consolas" w:hAnsi="Consolas" w:eastAsia="Consolas" w:cs="Consolas"/><w:sz w:val="17"/><w:szCs w:val="17"/></w:rPr><w:t xml:space="preserve">│ Pejabat TTE    : Mayor Inf Hendra Pratama (Kasi Pers)                  │</w:t></w:r></w:p><w:p><w:pPr><w:jc w:val="center"/><w:spacing w:after="60"/></w:pPr><w:r><w:rPr><w:rFonts w:ascii="Consolas" w:hAnsi="Consolas" w:eastAsia="Consolas" w:cs="Consolas"/><w:sz w:val="17"/><w:szCs w:val="17"/></w:rPr><w:t xml:space="preserve">│ Waktu Pengesahan: 21 September 2026 14:15:30 WIB                       │</w:t></w:r></w:p><w:p><w:pPr><w:jc w:val="center"/><w:spacing w:after="60"/></w:pPr><w:r><w:rPr><w:rFonts w:ascii="Consolas" w:hAnsi="Consolas" w:eastAsia="Consolas" w:cs="Consolas"/><w:sz w:val="17"/><w:szCs w:val="17"/></w:rPr><w:t xml:space="preserve">│ Integritas Dok : SHA256: 7d8f6b2c9a1e4d3f5a8b7c9e0d1f2a3b4c5d6e7f8a9b │</w:t></w:r></w:p><w:p><w:pPr><w:jc w:val="center"/><w:spacing w:after="60"/></w:pPr><w:r><w:rPr><w:rFonts w:ascii="Consolas" w:hAnsi="Consolas" w:eastAsia="Consolas" w:cs="Consolas"/><w:sz w:val="17"/><w:szCs w:val="17"/></w:rPr><w:t xml:space="preserve">│ Jaminan Mutu   : Dokumen terdaftar sah dalam pangkalan data TRISULA.   │</w:t></w:r></w:p><w:p><w:pPr><w:jc w:val="center"/><w:spacing w:after="60"/></w:pPr><w:r><w:rPr><w:rFonts w:ascii="Consolas" w:hAnsi="Consolas" w:eastAsia="Consolas" w:cs="Consolas"/><w:sz w:val="17"/><w:szCs w:val="17"/></w:rPr><w:t xml:space="preserve">└────────────────────────────────────────────────────────────────────────┘</w:t></w:r></w:p></w:tc></w:tr></w:tbl><w:p><w:r><w:br w:type="page"/></w:r></w:p><w:p><w:pPr><w:jc w:val="start"/><w:spacing w:after="60"/></w:pPr><w:r><w:rPr><w:rFonts w:ascii="Times New Roman" w:hAnsi="Times New Roman" w:eastAsia="Times New Roman" w:cs="Times New Roman"/><w:sz w:val="24"/><w:szCs w:val="24"/><w:b w:val="1"/><w:bCs w:val="1"/></w:rPr><w:t xml:space="preserve">b.   Bentuk Cetakan Laporan Kedinasan (Printed Reports).</w:t></w:r></w:p><w:p><w:pPr><w:jc w:val="both"/><w:spacing w:after="80" w:line="276" w:lineRule="auto"/></w:pPr><w:r><w:rPr><w:rFonts w:ascii="Times New Roman" w:hAnsi="Times New Roman" w:eastAsia="Times New Roman" w:cs="Times New Roman"/><w:sz w:val="23"/><w:szCs w:val="23"/></w:rPr><w:t xml:space="preserve">Format laporan kedinasan dirancang dengan kepatuhan penuh terhadap Buku Petunjuk Teknis Tulisan Dinas TNI Angkatan Darat, memuat KOP Staf Personel, Nomor Register Rahasia, Isi Rekapitulasi Data, Tempat Tanggal Pembuatan, serta Tajuk Tanda Tangan Perwira Penanggung Jawab :</w:t></w:r></w:p><w:p/><w:tbl><w:tblGrid><w:gridCol w:w="9200" w:type="dxa"/></w:tblGrid><w:tblPr><w:tblStyle w:val="BoxTable"/></w:tblPr><w:tr><w:trPr/><w:tc><w:tcPr><w:tcW w:w="9200" w:type="dxa"/><w:noWrap/></w:tcPr><w:p><w:pPr><w:jc w:val="start"/><w:spacing w:after="60"/></w:pPr><w:r><w:rPr><w:rFonts w:ascii="Times New Roman" w:hAnsi="Times New Roman" w:eastAsia="Times New Roman" w:cs="Times New Roman"/><w:sz w:val="19"/><w:szCs w:val="19"/><w:b w:val="1"/><w:bCs w:val="1"/></w:rPr><w:t xml:space="preserve">MARKAS BESAR TNI ANGKATAN DARAT</w:t></w:r></w:p><w:p><w:pPr><w:jc w:val="start"/><w:spacing w:after="60"/></w:pPr><w:r><w:rPr><w:rFonts w:ascii="Times New Roman" w:hAnsi="Times New Roman" w:eastAsia="Times New Roman" w:cs="Times New Roman"/><w:sz w:val="19"/><w:szCs w:val="19"/><w:b w:val="1"/><w:bCs w:val="1"/></w:rPr><w:t xml:space="preserve">STAF PERSONEL</w:t></w:r></w:p><w:p><w:pPr><w:jc w:val="start"/><w:spacing w:after="60"/></w:pPr><w:r><w:rPr><w:rFonts w:ascii="Consolas" w:hAnsi="Consolas" w:eastAsia="Consolas" w:cs="Consolas"/><w:sz w:val="17"/><w:szCs w:val="17"/></w:rPr><w:t xml:space="preserve">─────────────────────────────────</w:t></w:r></w:p><w:p/><w:p><w:pPr><w:jc w:val="center"/><w:spacing w:after="60"/></w:pPr><w:r><w:rPr><w:rFonts w:ascii="Times New Roman" w:hAnsi="Times New Roman" w:eastAsia="Times New Roman" w:cs="Times New Roman"/><w:sz w:val="22"/><w:szCs w:val="22"/><w:b w:val="1"/><w:bCs w:val="1"/></w:rPr><w:t xml:space="preserve">LAPORAN REKAPITULASI KELENGKAPAN DOSIR DIGITAL PRAJURIT</w:t></w:r></w:p><w:p><w:pPr><w:jc w:val="center"/><w:spacing w:after="60"/></w:pPr><w:r><w:rPr><w:rFonts w:ascii="Times New Roman" w:hAnsi="Times New Roman" w:eastAsia="Times New Roman" w:cs="Times New Roman"/><w:sz w:val="20"/><w:szCs w:val="20"/><w:b w:val="1"/><w:bCs w:val="1"/></w:rPr><w:t xml:space="preserve">SISTEM TRISULA TNI ANGKATAN DARAT</w:t></w:r></w:p><w:p><w:pPr><w:jc w:val="center"/><w:spacing w:after="60"/></w:pPr><w:r><w:rPr><w:rFonts w:ascii="Times New Roman" w:hAnsi="Times New Roman" w:eastAsia="Times New Roman" w:cs="Times New Roman"/><w:sz w:val="19"/><w:szCs w:val="19"/><w:i w:val="1"/><w:iCs w:val="1"/></w:rPr><w:t xml:space="preserve">Periode : Triwulan III Tahun Anggaran 2026</w:t></w:r></w:p><w:p/><w:p><w:pPr><w:jc w:val="center"/><w:spacing w:after="60"/></w:pPr><w:r><w:rPr><w:rFonts w:ascii="Consolas" w:hAnsi="Consolas" w:eastAsia="Consolas" w:cs="Consolas"/><w:sz w:val="17"/><w:szCs w:val="17"/></w:rPr><w:t xml:space="preserve">┌────┬──────────────┬────────────────────────┬─────────┬───────────┬─────────┬────────────┐</w:t></w:r></w:p><w:p><w:pPr><w:jc w:val="center"/><w:spacing w:after="60"/></w:pPr><w:r><w:rPr><w:rFonts w:ascii="Consolas" w:hAnsi="Consolas" w:eastAsia="Consolas" w:cs="Consolas"/><w:sz w:val="17"/><w:szCs w:val="17"/></w:rPr><w:t xml:space="preserve">│ NO │     NRP      │ NAMA PRAJURIT / PNS    │ PANGKAT │  SATUAN   │ LENGKAP │ PERSENTASE │</w:t></w:r></w:p><w:p><w:pPr><w:jc w:val="center"/><w:spacing w:after="60"/></w:pPr><w:r><w:rPr><w:rFonts w:ascii="Consolas" w:hAnsi="Consolas" w:eastAsia="Consolas" w:cs="Consolas"/><w:sz w:val="17"/><w:szCs w:val="17"/></w:rPr><w:t xml:space="preserve">├────┼──────────────┼────────────────────────┼─────────┼───────────┼─────────┼────────────┤</w:t></w:r></w:p><w:p><w:pPr><w:jc w:val="center"/><w:spacing w:after="60"/></w:pPr><w:r><w:rPr><w:rFonts w:ascii="Consolas" w:hAnsi="Consolas" w:eastAsia="Consolas" w:cs="Consolas"/><w:sz w:val="17"/><w:szCs w:val="17"/></w:rPr><w:t xml:space="preserve">│ 1. │ 211801234509 │ Letda Czi Fris Wardani │ Letda   │ Denzibang │  33/33  │   100 %    │</w:t></w:r></w:p><w:p><w:pPr><w:jc w:val="center"/><w:spacing w:after="60"/></w:pPr><w:r><w:rPr><w:rFonts w:ascii="Consolas" w:hAnsi="Consolas" w:eastAsia="Consolas" w:cs="Consolas"/><w:sz w:val="17"/><w:szCs w:val="17"/></w:rPr><w:t xml:space="preserve">│ 2. │ 211902345610 │ Lettu Inf Danu Wijaya  │ Lettu   │ Yonif 201 │  31/33  │    94 %    │</w:t></w:r></w:p><w:p><w:pPr><w:jc w:val="center"/><w:spacing w:after="60"/></w:pPr><w:r><w:rPr><w:rFonts w:ascii="Consolas" w:hAnsi="Consolas" w:eastAsia="Consolas" w:cs="Consolas"/><w:sz w:val="17"/><w:szCs w:val="17"/></w:rPr><w:t xml:space="preserve">│ 3. │ 310503456711 │ Serma Agus Priyanto    │ Serma   │ Kodim 0501│  28/33  │    85 %    │</w:t></w:r></w:p><w:p><w:pPr><w:jc w:val="center"/><w:spacing w:after="60"/></w:pPr><w:r><w:rPr><w:rFonts w:ascii="Consolas" w:hAnsi="Consolas" w:eastAsia="Consolas" w:cs="Consolas"/><w:sz w:val="17"/><w:szCs w:val="17"/></w:rPr><w:t xml:space="preserve">│ 4. │ 311204567812 │ Koptu Bambang Sutrisno │ Koptu   │ Brigif 1  │  25/33  │    76 %    │</w:t></w:r></w:p><w:p><w:pPr><w:jc w:val="center"/><w:spacing w:after="60"/></w:pPr><w:r><w:rPr><w:rFonts w:ascii="Consolas" w:hAnsi="Consolas" w:eastAsia="Consolas" w:cs="Consolas"/><w:sz w:val="17"/><w:szCs w:val="17"/></w:rPr><w:t xml:space="preserve">└────┴──────────────┴────────────────────────┴─────────┴───────────┴─────────┴────────────┘</w:t></w:r></w:p><w:p/><w:p><w:pPr><w:jc w:val="end"/><w:spacing w:after="60"/></w:pPr><w:r><w:rPr><w:rFonts w:ascii="Times New Roman" w:hAnsi="Times New Roman" w:eastAsia="Times New Roman" w:cs="Times New Roman"/><w:sz w:val="19"/><w:szCs w:val="19"/></w:rPr><w:t xml:space="preserve">                                                    Jakarta,   21 September 2026</w:t></w:r></w:p><w:p><w:pPr><w:jc w:val="end"/><w:spacing w:after="60"/></w:pPr><w:r><w:rPr><w:rFonts w:ascii="Times New Roman" w:hAnsi="Times New Roman" w:eastAsia="Times New Roman" w:cs="Times New Roman"/><w:sz w:val="19"/><w:szCs w:val="19"/></w:rPr><w:t xml:space="preserve">                                                    Perwira Personel / Verifikator,</w:t></w:r></w:p><w:p/><w:p/><w:p><w:pPr><w:jc w:val="end"/><w:spacing w:after="60"/></w:pPr><w:r><w:rPr><w:rFonts w:ascii="Times New Roman" w:hAnsi="Times New Roman" w:eastAsia="Times New Roman" w:cs="Times New Roman"/><w:sz w:val="19"/><w:szCs w:val="19"/><w:b w:val="1"/><w:bCs w:val="1"/></w:rPr><w:t xml:space="preserve">                                                    HENDRA PRATAMA, S.I.P.        </w:t></w:r></w:p><w:p><w:pPr><w:jc w:val="end"/><w:spacing w:after="60"/></w:pPr><w:r><w:rPr><w:rFonts w:ascii="Times New Roman" w:hAnsi="Times New Roman" w:eastAsia="Times New Roman" w:cs="Times New Roman"/><w:sz w:val="19"/><w:szCs w:val="19"/></w:rPr><w:t xml:space="preserve">                                                    MAYOR INF NRP 11040023450682  </w:t></w:r></w:p></w:tc></w:tr></w:tbl><w:p><w:r><w:br w:type="page"/></w:r></w:p><w:p><w:pPr><w:jc w:val="start"/><w:spacing w:after="60"/></w:pPr><w:r><w:rPr><w:rFonts w:ascii="Times New Roman" w:hAnsi="Times New Roman" w:eastAsia="Times New Roman" w:cs="Times New Roman"/><w:sz w:val="24"/><w:szCs w:val="24"/><w:b w:val="1"/><w:bCs w:val="1"/></w:rPr><w:t xml:space="preserve">16.  Listing Program.</w:t></w:r></w:p><w:p><w:pPr><w:jc w:val="both"/><w:spacing w:after="80" w:line="276" w:lineRule="auto"/></w:pPr><w:r><w:rPr><w:rFonts w:ascii="Times New Roman" w:hAnsi="Times New Roman" w:eastAsia="Times New Roman" w:cs="Times New Roman"/><w:sz w:val="23"/><w:szCs w:val="23"/></w:rPr><w:t xml:space="preserve">Listing program menyajikan kode sumber inti (core source code) yang merepresentasikan logika algoritma autentikasi TTE, pembubuhan watermark keabsahan ber-QR Code, penataan berkas 33 dosir baku, serta rumus proyeksi masa pensiun dan rotasi jabatan.</w:t></w:r></w:p><w:p/><w:p><w:pPr><w:jc w:val="start"/><w:spacing w:after="60"/></w:pPr><w:r><w:rPr><w:rFonts w:ascii="Times New Roman" w:hAnsi="Times New Roman" w:eastAsia="Times New Roman" w:cs="Times New Roman"/><w:sz w:val="23"/><w:szCs w:val="23"/><w:b w:val="1"/><w:bCs w:val="1"/></w:rPr><w:t xml:space="preserve">a.   Listing Modul Pembubuhan Tanda Tangan Elektronik (TTE) & QR Code (includes/watermark.php) :</w:t></w:r></w:p><w:tbl><w:tblGrid><w:gridCol w:w="9200" w:type="dxa"/></w:tblGrid><w:tblPr><w:tblStyle w:val="BoxTable"/></w:tblPr><w:tr><w:trPr/><w:tc><w:tcPr><w:tcW w:w="9200" w:type="dxa"/><w:shd w:val="clear" w:fill="F2F6F2"/><w:noWrap/></w:tcPr><w:p><w:pPr/><w:r><w:rPr><w:rFonts w:ascii="Consolas" w:hAnsi="Consolas" w:eastAsia="Consolas" w:cs="Consolas"/><w:color w:val="1B3B1B"/><w:sz w:val="17"/><w:szCs w:val="17"/></w:rPr><w:t xml:space="preserve">function apply_digital_signature_pdf($rawMasterPath, $outputPath, array $signData) {
     if (!class_exists('\setasign\Fpdi\Tcpdf\Fpdi')) return false;
     $source = file_exists($rawMasterPath) ? $rawMasterPath : $outputPath;
     if (!file_exists($source)) return false;
@@ -24,9 +24,9 @@
             $pdf->useTemplate($tplId);
             $w = $size['width']; $h = $size['height'];
 
-            // 1. Running Header Otentikasi Pada Seluruh Halaman
+            // 1. Running Header Autentikasi Pada Seluruh Halaman
             $pdf->SetAlpha(1.0); $pdf->SetFont('helvetica', '', 6.5); $pdf->SetTextColor(70, 95, 75);
-            $line = "★ TRISULA TNI AD — DITANDATANGANI SECARA ELEKTRONIK (TTE) | KODE: $code | HASH: $shortHash | $signDate WIB";
+            $line = "E-DOSIR TNI AD - DITANDATANGANI SECARA ELEKTRONIK (TTE) | KODE: $code | HASH: $shortHash | $signDate WIB";
             $pdf->SetXY(6, $h - 6.5); $pdf->Cell($w - 12, 4, $line, 0, 0, 'L');
 
             // 2. Kotak Pengesahan TTE Resmi Ber-QR Code Pada Halaman Terakhir

</xml_diff>